<commit_message>
Szczegolowe opisy zadan: rozbudowane akapity zamiast srodtytulow
Co-Authored-By: Claude Sonnet 5.5 <noreply@anthropic.com>
Claude-Session: https://claude.ai/code/session_01672WnJhixnEcarbb7uiwfx
</commit_message>
<xml_diff>
--- a/Opisy_zadan_z_kamieniami_milowymi.docx
+++ b/Opisy_zadan_z_kamieniami_milowymi.docx
@@ -260,7 +260,7 @@
           <w:color w:val="666666"/>
           <w:sz w:val="17"/>
         </w:rPr>
-        <w:t xml:space="preserve"> [3517 z 4000 znaków]</w:t>
+        <w:t xml:space="preserve"> [3876 z 4000 znaków]</w:t>
       </w:r>
     </w:p>
     <w:p>
@@ -271,7 +271,7 @@
         <w:rPr>
           <w:b w:val="0"/>
         </w:rPr>
-        <w:t>Problem badawczy. W zamkniętej, metalowej naczepie kamery ToF odbierają impulsy podczerwone innych kamer (MCI), a wielokrotne odbicia od ścian powodują błędy wielościeżkowe (MPI). Opublikowane metody ograniczania tych zakłóceń, takie jak multipleksowanie czasowe, rozdzielenie częstotliwości modulacji czy filtracja obwiedni amplitudy, były sprawdzane w laboratoriach lub w otwartych scenach, przy znanej i stałej geometrii. Nie wiadomo, czy ich wyniki można przenieść na przestrzeń z ładunkami o zmiennym kształcie i refleksyjności. Danych katalogowych producentów nie można w tym celu wykorzystać, ponieważ nie opisują one pracy kilku kamer w metalowej bryle.</w:t>
+        <w:t>Problem badawczy rozwiązywany w zadaniu został zdefiniowany w sekcji Cel projektu i dotyczy braku wiedzy o tym, jak w zamkniętej, metalowej przestrzeni naczepy kamery ToF* wzajemnie zakłócają swoją pracę. Kamery odbierają impulsy podczerwone innych kamer (MCI), a wielokrotne odbicia od metalowych ścian powodują błędy wielościeżkowe (MPI). Opublikowane metody ograniczania tych zakłóceń, takie jak multipleksowanie czasowe, rozdzielenie częstotliwości modulacji czy filtracja obwiedni amplitudy, były sprawdzane w laboratoriach lub w otwartych scenach, przy znanej i stałej geometrii. Nie wiadomo, czy ich wyniki można przenieść na przestrzeń z ładunkami o zmiennym kształcie i refleksyjności. Danych katalogowych producentów nie można w tym celu wykorzystać, ponieważ nie opisują one pracy kilku kamer w metalowej bryle, dlatego rozwiązanie problemu wymaga badań własnych.</w:t>
       </w:r>
     </w:p>
     <w:p>
@@ -282,7 +282,7 @@
         <w:rPr>
           <w:b w:val="0"/>
         </w:rPr>
-        <w:t>Hipotezy badawcze. H1: RMSE głębi rośnie wraz z liczbą równocześnie pracujących kamer i maleje wraz z odległością od ściany, a efekt jest większy niż opisywany dla scen otwartych. H2: istnieje konfiguracja do 4 kamer, w której błąd pozycji ładunku nie przekracza 0,30 m bez osobnego algorytmu mitygacji. Odrzucenie H2 uzasadnia prace nad algorytmem adaptacyjnym w zadaniu Z5.</w:t>
+        <w:t>W zadaniu zostaną zweryfikowane dwie hipotezy badawcze. Pierwsza (H1) zakłada, że RMSE głębi rośnie wraz z liczbą równocześnie pracujących kamer i maleje wraz z odległością od ściany, a efekt jest większy niż opisywany dla scen otwartych. Druga (H2) zakłada, że istnieje konfiguracja do 4 kamer, w której błąd pozycji ładunku nie przekracza 0,30 m bez osobnego algorytmu mitygacji. Odrzucenie H2 uzasadni prace nad algorytmem adaptacyjnym w zadaniu Z5.</w:t>
       </w:r>
     </w:p>
     <w:p>
@@ -293,7 +293,7 @@
         <w:rPr>
           <w:b w:val="0"/>
         </w:rPr>
-        <w:t xml:space="preserve">Metoda badawcza. Badania przemysłowe zostaną przeprowadzone w formie eksperymentu kontrolowanego. Czynniki: liczba kamer od 1 do 4, trzy odległości od ściany z zakresu od 0,3 do 5 m, co najmniej dwa tryby pracy kamery, cztery klasy optyczne ładunku oraz co najmniej pięć powtórzeń w każdym punkcie planu częściowo czynnikowego, łącznie </w:t>
+        <w:t xml:space="preserve">Metoda badawcza została dobrana wprost do tak zdefiniowanego problemu. Badania przemysłowe zostaną przeprowadzone w formie eksperymentu kontrolowanego, w którym zmienianymi czynnikami będą: liczba kamer od 1 do 4, trzy odległości od ściany z zakresu od 0,3 do 5 m, co najmniej dwa tryby pracy kamery, cztery klasy optyczne ładunku (folia, karton, stal, drewno) oraz co najmniej pięć powtórzeń w każdym punkcie planu częściowo czynnikowego, łącznie </w:t>
       </w:r>
       <w:r>
         <w:rPr>
@@ -306,7 +306,7 @@
         <w:rPr>
           <w:b w:val="0"/>
         </w:rPr>
-        <w:t>. Zmienne wynikowe: RMSE głębi względem referencji (płaski cel pomiarowy i dalmierz laserowy), udział pikseli odrzuconych oraz błąd MCI jako różnica względem pracy jednej kamery. Wyniki zostaną opracowane regresją i analizą wariancji z przedziałami ufności 95%. Brak wykrytego efektu również rozstrzyga niepewność badawczą. Ponadto zostaną wykonane badania porównawcze modalności (RMSE, wrażliwość na refleksy w podczerwieni, praca przy 0 lx) oraz symulacja geometryczna, z której wynikną udział pokrytej kubatury i stref martwych dla konfiguracji do 4 kamer.</w:t>
+        <w:t>. Zmiennymi wynikowymi będą RMSE głębi względem referencji (płaski cel pomiarowy i dalmierz laserowy), udział pikseli odrzuconych oraz błąd MCI jako różnica względem pracy jednej kamery. Wyniki zostaną opracowane regresją i analizą wariancji z przedziałami ufności 95%, przy czym brak wykrytego efektu również rozstrzyga niepewność badawczą. Ponadto zostaną wykonane badania porównawcze modalności w tych samych warunkach (RMSE, wrażliwość na refleksy w podczerwieni, praca przy 0 lx) oraz symulacja geometryczna, z której wynikną udział pokrytej kubatury i stref martwych dla konfiguracji do 4 kamer.</w:t>
       </w:r>
     </w:p>
     <w:p>
@@ -317,7 +317,7 @@
         <w:rPr>
           <w:b w:val="0"/>
         </w:rPr>
-        <w:t>Liczba kupowanego sprzętu wynika z planu badań. Cztery kamery ToF pierwszego typu* odtworzą konfigurację czterokamerową, trzy kamery drugiego typu* (klasa przemysłowa) pozwolą powtórzyć pomiary dla od 1 do 3 kamer, a po 3 egzemplarze kamer EO i radarów pozwolą ocenić rozrzut między egzemplarzami.</w:t>
+        <w:t>Zasoby zaplanowane w zadaniu wynikają z planu badań. Cztery kamery ToF pierwszego typu* odtworzą konfigurację czterokamerową, trzy kamery drugiego typu* (klasa przemysłowa) pozwolą powtórzyć pomiary dla od 1 do 3 kamer, a po 3 egzemplarze kamer EO i radarów pozwolą ocenić rozrzut między egzemplarzami.</w:t>
       </w:r>
     </w:p>
     <w:p>
@@ -328,7 +328,7 @@
         <w:rPr>
           <w:b w:val="0"/>
         </w:rPr>
-        <w:t>Uzasadnienie wyboru metody. Eksperyment kontrolowany z referencją i powtórzeniami jest jedynym sposobem rozdzielenia wpływu MCI, MPI i cech ładunku, dlatego metoda jest celowa i skuteczna. Przedziały ufności i powtórzenia pozwalają odtworzyć wynik, co zapewnia niezawodność. To samo stanowisko zostanie wykorzystane w zadaniach Z3 i Z5, a sprzęt kupowany jest w liczbie wynikającej z planu pomiarów, co zapewnia ekonomiczność.</w:t>
+        <w:t>Wybór metody jest uzasadniony czterema względami. Eksperyment kontrolowany z referencją i powtórzeniami jest jedynym sposobem rozdzielenia wpływu MCI, MPI i cech ładunku, dlatego metoda jest celowa i skuteczna. Przedziały ufności i powtórzenia pozwalają odtworzyć wynik, co zapewnia niezawodność. To samo stanowisko zostanie wykorzystane w zadaniach Z3 i Z5, a sprzęt jest kupowany w liczbie wynikającej z planu pomiarów, co zapewnia ekonomiczność.</w:t>
       </w:r>
     </w:p>
     <w:p>
@@ -339,7 +339,7 @@
         <w:rPr>
           <w:b w:val="0"/>
         </w:rPr>
-        <w:t>Charakter prac. Zadanie ma charakter badań przemysłowych, ponieważ dostarcza nowej wiedzy potrzebnej do opracowania produktu: modelu degradacji dokładności oraz rozstrzygnięcia hipotez H1 i H2. Stanowisko pomiarowe jest prototypem laboratoryjnym w rozumieniu art. 2 pkt 85 rozporządzenia 651/2014.</w:t>
+        <w:t>Zadanie ma charakter badań przemysłowych, ponieważ dostarcza nowej wiedzy potrzebnej do opracowania produktu, czyli modelu degradacji dokładności oraz rozstrzygnięcia hipotez H1 i H2. Stanowisko pomiarowe jest prototypem laboratoryjnym w rozumieniu art. 2 pkt 85 rozporządzenia 651/2014.</w:t>
       </w:r>
     </w:p>
     <w:p>
@@ -350,7 +350,7 @@
         <w:rPr>
           <w:b w:val="0"/>
         </w:rPr>
-        <w:t xml:space="preserve">Kolejność i powiązania. W miesiącach </w:t>
+        <w:t xml:space="preserve">Kolejność prac wynika z zależności między zadaniami. W miesiącach </w:t>
       </w:r>
       <w:r>
         <w:rPr>
@@ -389,7 +389,7 @@
         <w:rPr>
           <w:b w:val="0"/>
         </w:rPr>
-        <w:t xml:space="preserve"> pomiary uzupełniające, symulacja pokrycia i raport końcowy. Taka kolejność wynika z tego, że zadanie Z2 potrzebuje specyfikacji sensorów do M6, a pełny model degradacji jest potrzebny dopiero w zadaniu Z5, gdzie posłuży jako wartość bazowa dla redukcji RMSE o co najmniej 50%. Koszty zadania obejmują wynagrodzenia zespołu PRz oraz sprzęt pomiarowy wynikający z planu badań.</w:t>
+        <w:t xml:space="preserve"> pomiary uzupełniające, symulacja pokrycia i raport końcowy. Zadanie Z2 potrzebuje specyfikacji sensorów do M6, a pełny model degradacji jest potrzebny dopiero w zadaniu Z5, gdzie posłuży jako wartość bazowa dla redukcji RMSE o co najmniej 50%.</w:t>
       </w:r>
     </w:p>
     <w:p>
@@ -792,7 +792,7 @@
           <w:color w:val="666666"/>
           <w:sz w:val="17"/>
         </w:rPr>
-        <w:t xml:space="preserve"> [3570 z 4000 znaków]</w:t>
+        <w:t xml:space="preserve"> [3883 z 4000 znaków]</w:t>
       </w:r>
     </w:p>
     <w:p>
@@ -803,7 +803,7 @@
         <w:rPr>
           <w:b w:val="0"/>
         </w:rPr>
-        <w:t>Problem badawczy. Nie istnieje publiczny zbiór danych łączący sygnały środowiskowe z jazdy z potwierdzonymi inspekcją zdarzeniami ryzyka. Brakuje także metod synchronizacji strumieni o tak różnych częstotliwościach w drganiach naczepy oraz sposobu zebrania dostatecznej liczby rzadkich zdarzeń (1-3% przesyłek) bez utraty niezależności walidacji. Są to niepewności badawcze, a nie rutynowe gromadzenie danych.</w:t>
+        <w:t>Problem badawczy rozwiązywany w zadaniu został zdefiniowany w sekcji Cel projektu i dotyczy braku danych oraz metod niezbędnych do trenowania i walidacji modeli w warunkach jazdy. Nie istnieje publiczny zbiór danych łączący sygnały środowiskowe z jazdy z potwierdzonymi inspekcją zdarzeniami ryzyka. Brakuje także metod synchronizacji strumieni o tak różnych częstotliwościach w drganiach naczepy oraz sposobu zebrania dostatecznej liczby rzadkich zdarzeń (1-3% przesyłek) bez utraty niezależności walidacji.</w:t>
       </w:r>
     </w:p>
     <w:p>
@@ -814,7 +814,7 @@
         <w:rPr>
           <w:b w:val="0"/>
         </w:rPr>
-        <w:t>Metoda akwizycji. Tor pomiarowy zostanie zbudowany według specyfikacji z zadania Z1, a jakość synchronizacji zbadana w teście stacjonarnym trwającym co najmniej 24 h i w teście drogowym na dystansie co najmniej 500 km. Mierzone będą odchylenie znaczników czasu (cel: nie więcej niż 0,001 s) i udział poprawnie zarejestrowanych danych (cel: co najmniej 95% czasu rejestracji). Algorytm korekcji synchronizacji i metryki jakości zostaną opracowane iteracyjnie na danych z tych testów.</w:t>
+        <w:t>Metoda akwizycji zostanie opracowana i zbadana eksperymentalnie. Tor pomiarowy powstanie według specyfikacji z zadania Z1, a jakość synchronizacji zostanie sprawdzona w teście stacjonarnym trwającym co najmniej 24 h i w teście drogowym na dystansie co najmniej 500 km. Mierzone będą odchylenie znaczników czasu (cel: nie więcej niż 0,001 s) i udział poprawnie zarejestrowanych danych (cel: co najmniej 95% czasu rejestracji). Algorytm korekcji synchronizacji i metryki jakości zostaną opracowane iteracyjnie na danych z tych testów.</w:t>
       </w:r>
     </w:p>
     <w:p>
@@ -825,7 +825,7 @@
         <w:rPr>
           <w:b w:val="0"/>
         </w:rPr>
-        <w:t xml:space="preserve">Struktura zbioru. Jednostką analizy jest przesyłka, czyli ładunek jednego zlecenia na naczepie. Liczba zdarzeń wynika z liczby kursów, liczby przesyłek na kurs i częstości ZR. Przy 50 kursach, około </w:t>
+        <w:t xml:space="preserve">Struktura zbioru została zaprojektowana tak, aby umożliwić niezależną walidację modeli. Jednostką analizy jest przesyłka, czyli ładunek jednego zlecenia na naczepie, a liczba zdarzeń wynika z liczby kursów, liczby przesyłek na kurs i częstości ZR. Przy 50 kursach, około </w:t>
       </w:r>
       <w:r>
         <w:rPr>
@@ -864,7 +864,7 @@
         <w:rPr>
           <w:b w:val="0"/>
         </w:rPr>
-        <w:t xml:space="preserve"> ZR naturalnych. Pozostałe zdarzenia do progu 50 na klasę, czyli 250 łącznie, zostaną uzyskane ze scenariuszy kontrolowanych: celowego poluzowania zabezpieczeń, kontrolowanego przesunięcia i ekspozycji poniżej progu. Kursy zostaną podzielone na trening (co najmniej 80%) i test naturalny (co najmniej 20%, rozszerzany do 30 ZR naturalnych, w tym 10 w każdej z trzech klas). Dane kontrolowane i syntetyczne trafią wyłącznie do treningu i do osobnego testu kontrolowanego. Walidacja w zadaniu Z9 wykorzysta nowe kursy naturalne, co wyklucza przeciek danych.</w:t>
+        <w:t xml:space="preserve"> ZR naturalnych. Pozostałe zdarzenia do progu 50 na klasę, czyli 250 łącznie, zostaną uzyskane ze scenariuszy kontrolowanych: celowego poluzowania zabezpieczeń, kontrolowanego przesunięcia i ekspozycji poniżej progu. Kursy zostaną podzielone na trening (co najmniej 80%) i test naturalny (co najmniej 20%, rozszerzany do 30 ZR naturalnych, w tym 10 w każdej z trzech klas). Dane kontrolowane i syntetyczne trafią wyłącznie do treningu i do osobnego testu kontrolowanego, a walidacja w zadaniu Z9 wykorzysta nowe kursy naturalne, co wyklucza przeciek danych.</w:t>
       </w:r>
     </w:p>
     <w:p>
@@ -875,7 +875,7 @@
         <w:rPr>
           <w:b w:val="0"/>
         </w:rPr>
-        <w:t>Etykietowanie i zgodność anotacji. Specjalista ds. logistyki TSL będzie prowadził inspekcję ładunku przy załadunku i rozładunku według protokołu z zadania Z3, w trybie ślepym względem modelu, ze zdjęciami ze znacznikiem czasu. Trzech anotatorów niezależnie zaanotuje losową próbę co najmniej 10% klatek, wylosowaną warstwowo po klasach, z ziarnem losowania zapisanym w protokole. Rozbieżności rozstrzygnie konsensus anotatorów z udziałem specjalisty TSL, który zatwierdzi etykietę referencyjną. Jeżeli zgodność, mierzona współczynnikiem Cohena, będzie niższa niż 0,80, cała próba oraz klasy o skupionych rozbieżnościach zostaną zaanotowane ponownie, a kryteria klas doprecyzowane z PRz. Zgodność zostanie obliczona dwukrotnie: na próbie pilotażowej w M10 (wejście do kamienia milowego zadania Z3) i na pełnym zbiorze. Zgłoszenia przypadków niejednoznacznych od anotatorów będą materiałem do walidacji taksonomii w zadaniu Z3, dlatego ich praca stanowi element badań.</w:t>
+        <w:t>Etykietowanie i kontrola zgodności anotacji zostały zaplanowane tak, aby ground truth było wiarygodne. Specjalista ds. logistyki TSL będzie prowadził inspekcję ładunku przy załadunku i rozładunku według protokołu z zadania Z3, w trybie ślepym względem modelu, ze zdjęciami ze znacznikiem czasu. Trzech anotatorów niezależnie zaanotuje losową próbę co najmniej 10% klatek, wylosowaną warstwowo po klasach, z ziarnem losowania zapisanym w protokole. Rozbieżności rozstrzygnie konsensus anotatorów z udziałem specjalisty TSL, który zatwierdzi etykietę referencyjną. Jeżeli zgodność, mierzona współczynnikiem Cohena, będzie niższa niż 0,80, cała próba oraz klasy o skupionych rozbieżnościach zostaną zaanotowane ponownie, a kryteria klas doprecyzowane z PRz. Zgodność zostanie obliczona dwukrotnie: na próbie pilotażowej w M10 (wejście do kamienia milowego zadania Z3) i na pełnym zbiorze. Zgłoszenia przypadków niejednoznacznych od anotatorów będą materiałem do walidacji taksonomii w zadaniu Z3, dlatego ich praca stanowi element badań.</w:t>
       </w:r>
     </w:p>
     <w:p>
@@ -886,7 +886,7 @@
         <w:rPr>
           <w:b w:val="0"/>
         </w:rPr>
-        <w:t>Charakter prac. Zadanie ma charakter badań przemysłowych, ponieważ tworzy nową metodę akwizycji i zbiór referencyjny niezbędne do rozwiązania problemów badawczych od 1 do 3. Montaż i organizacja przejazdów są czynnościami pomocniczymi i nie stanowią wyniku badawczego.</w:t>
+        <w:t>Wybór metody jest uzasadniony czterema względami. Test drogowy i inspekcja ślepa dają wiarygodny pomiar, dlatego metoda jest celowa i skuteczna. Podział po kursach i sumy kontrolne zapewniają niezawodność. Liczba anotatorów wynika z wolumenu: około 15 000 klatek przy 11-12 minutach na klatkę w scenach gęstych oznacza 2750-3000 godzin pracy, do czego dochodzą próba zgodności i reanotacja, co zapewnia ekonomiczność.</w:t>
       </w:r>
     </w:p>
     <w:p>
@@ -897,7 +897,7 @@
         <w:rPr>
           <w:b w:val="0"/>
         </w:rPr>
-        <w:t>Uzasadnienie wyboru metody. Test drogowy i inspekcja ślepa dają wiarygodny pomiar, dlatego metoda jest celowa i skuteczna, a podział po kursach i sumy kontrolne zapewniają niezawodność. Liczba anotatorów wynika z wolumenu: około 15 000 klatek przy 11-12 minutach na klatkę w scenach gęstych oznacza 2750-3000 godzin pracy, do czego dochodzą próba zgodności i reanotacja, co zapewnia ekonomiczność.</w:t>
+        <w:t>Zadanie ma charakter badań przemysłowych, ponieważ tworzy nową metodę akwizycji i zbiór referencyjny niezbędne do rozwiązania problemów badawczych od 1 do 3. Montaż sensorów wykona podwykonawca, a projekt techniczny, konfigurację, kalibrację i odbiór techniczny personel Everest11.</w:t>
       </w:r>
     </w:p>
     <w:p>
@@ -908,7 +908,7 @@
         <w:rPr>
           <w:b w:val="0"/>
         </w:rPr>
-        <w:t>Kolejność prac. W miesiącach M1-M6 zostanie przygotowana infrastruktura i protokół bezpieczeństwa danych, w M7-M8 wykonany montaż, a w M9-M18 przeprowadzona kampania pomiarowa. Kolejność wynika z zależności od zadań Z1 i Z3.</w:t>
+        <w:t>Kolejność prac wynika z zależności od zadań Z1 i Z3. W miesiącach M1-M6 zostanie przygotowana infrastruktura i protokół bezpieczeństwa danych, w M7-M8 wykonany montaż, a w M9-M18 przeprowadzona kampania pomiarowa.</w:t>
       </w:r>
     </w:p>
     <w:p>
@@ -1276,7 +1276,7 @@
           <w:color w:val="666666"/>
           <w:sz w:val="17"/>
         </w:rPr>
-        <w:t xml:space="preserve"> [3189 z 4000 znaków]</w:t>
+        <w:t xml:space="preserve"> [3469 z 4000 znaków]</w:t>
       </w:r>
     </w:p>
     <w:p>
@@ -1287,7 +1287,7 @@
         <w:rPr>
           <w:b w:val="0"/>
         </w:rPr>
-        <w:t>Problem badawczy. Nie istnieje taksonomia klas zabezpieczeń transportowych, którą można wykorzystać jako ontologię do detekcji obiektów, ani wspólna metodyka uczenia przy niezbalansowaniu wynikającym z różnorodności klas ładunku (Neupane i in., 2025). Bez jednoznacznych etykiet i zasad podziału danych modele z zadań Z4 i Z8 byłyby trenowane i oceniane nierzetelnie.</w:t>
+        <w:t>Problem badawczy rozwiązywany w zadaniu został zdefiniowany w sekcji Cel projektu i dotyczy braku podstaw do jednoznacznego oznaczania i trenowania modeli na danych z naczep. Nie istnieje taksonomia klas zabezpieczeń transportowych, którą można wykorzystać jako ontologię do detekcji obiektów, ani wspólna metodyka uczenia przy niezbalansowaniu wynikającym z różnorodności klas ładunku (Neupane i in., 2025). Bez jednoznacznych etykiet i zasad podziału danych modele z zadań Z4 i Z8 byłyby trenowane i oceniane nierzetelnie.</w:t>
       </w:r>
     </w:p>
     <w:p>
@@ -1298,7 +1298,7 @@
         <w:rPr>
           <w:b w:val="0"/>
         </w:rPr>
-        <w:t>Nowa wiedza. Po pierwsze, taksonomia klas zabezpieczeń zgodna z EN 12195, zwalidowana ilościowo współczynnikiem kappa. Po drugie, protokół zbioru rozstrzygający definicję zdarzenia ryzyka, liczność i podział danych tak, aby walidacja w zadaniu Z9 pozostała niezależna. Po trzecie, wynik porównania architektur przy niezbalansowaniu 1:30-1:100 i okluzjach, będący podstawą wyboru modeli w zadaniach Z4 i Z8.</w:t>
+        <w:t>W wyniku badań powstanie nowa wiedza w trzech obszarach. Po pierwsze, taksonomia klas zabezpieczeń zgodna z EN 12195, zwalidowana ilościowo współczynnikiem kappa. Po drugie, protokół zbioru rozstrzygający definicję zdarzenia ryzyka, liczność i podział danych tak, aby walidacja w zadaniu Z9 pozostała niezależna. Po trzecie, wynik porównania architektur przy niezbalansowaniu 1:30-1:100 i okluzjach, będący podstawą wyboru modeli w zadaniach Z4 i Z8.</w:t>
       </w:r>
     </w:p>
     <w:p>
@@ -1309,7 +1309,7 @@
         <w:rPr>
           <w:b w:val="0"/>
         </w:rPr>
-        <w:t>Metoda badawcza. Taksonomia zostanie opracowana na podstawie analizy normy EN 12195 i konsultacji z ekspertami TSL, a następnie zapisana jako ontologia z kryteriami binarnymi (kąt pasa, napięcie, położenie klina, kompletność). Zostanie zwalidowana zgodnością anotatorów na próbie pilotażowej co najmniej 10% klatek z zadania Z2 w M10. Jeżeli współczynnik kappa będzie niższy niż 0,80, kryteria zostaną poprawione i zwalidowane ponownie, najwyżej dwukrotnie, w oknach po 4-6 tygodni. Protokół zostanie oparty na analizie statystycznej wymaganej liczności, a krzywa Wöhlera zostanie zoperacjonalizowana jako skumulowana suma amplitud poniżej progu dla każdej klasy. Porównanie architektur zostanie przeprowadzone na danych publicznych, syntetycznych, laboratoryjnych (stanowisko PRz z kontrolowanymi konfiguracjami zabezpieczeń i znanym ground truth, pomiar opóźnienia end-to-end) oraz pilotażowych z zadania Z2. Metryki: AUC-ROC, AUC-PR, mAP i opóźnienie. Przetestowane zostaną metody uczenia przy niezbalansowaniu: Borderline-SMOTE, ADASYN, funkcja straty zależna od kosztu błędu i zespoły modeli.</w:t>
+        <w:t>Metoda badawcza obejmuje trzy powiązane części. Taksonomia zostanie opracowana na podstawie analizy normy EN 12195 i konsultacji z ekspertami TSL, a następnie zapisana jako ontologia z kryteriami binarnymi (kąt pasa, napięcie, położenie klina, kompletność). Zostanie zwalidowana zgodnością anotatorów na próbie pilotażowej co najmniej 10% klatek z zadania Z2 w M10, a jeżeli współczynnik kappa będzie niższy niż 0,80, kryteria zostaną poprawione i zwalidowane ponownie, najwyżej dwukrotnie, w oknach po 4-6 tygodni. Protokół zostanie oparty na analizie statystycznej wymaganej liczności, a krzywa Wöhlera zostanie zoperacjonalizowana jako skumulowana suma amplitud poniżej progu dla każdej klasy. Porównanie architektur zostanie przeprowadzone na danych publicznych, syntetycznych, laboratoryjnych (stanowisko PRz z kontrolowanymi konfiguracjami zabezpieczeń i znanym ground truth, pomiar opóźnienia end-to-end) oraz pilotażowych z zadania Z2, według metryk AUC-ROC, AUC-PR, mAP i opóźnienia. Ponadto przetestowane zostaną metody uczenia przy niezbalansowaniu: Borderline-SMOTE, ADASYN, funkcja straty zależna od kosztu błędu i zespoły modeli.</w:t>
       </w:r>
     </w:p>
     <w:p>
@@ -1320,7 +1320,7 @@
         <w:rPr>
           <w:b w:val="0"/>
         </w:rPr>
-        <w:t>Potrzeba stanowiska. Stanowisko zapewnia powtarzalne warunki, których nie dają dane publiczne i pilotażowe: kontrolowaną ekspozycję, znany ground truth i pomiar opóźnienia na docelowej klasie sprzętu. Zakup komponentów nie jest wynikiem badawczym, lecz warunkiem przeprowadzenia badań.</w:t>
+        <w:t>Stanowisko laboratoryjne jest niezbędne do przeprowadzenia tych badań. Zapewnia powtarzalne warunki, których nie dają dane publiczne i pilotażowe: kontrolowaną ekspozycję, znany ground truth i pomiar opóźnienia na docelowej klasie sprzętu. Zakup komponentów nie jest wynikiem badawczym, lecz warunkiem ich przeprowadzenia, a koszty zadania obejmują wynagrodzenia zespołu PRz oraz te komponenty.</w:t>
       </w:r>
     </w:p>
     <w:p>
@@ -1331,7 +1331,7 @@
         <w:rPr>
           <w:b w:val="0"/>
         </w:rPr>
-        <w:t>Charakter prac. Zadanie ma charakter badań przemysłowych, ponieważ wytwarza nową wiedzę (taksonomia, protokół, wyniki porównawcze), a nie wdraża znanego rozwiązania. Punkt kontrolny M10 należy do kamienia milowego zadania Z3 i ma osobny protokół walidacji pilotażowej.</w:t>
+        <w:t>Wybór metody jest uzasadniony czterema względami. Zgodność anotatorów i porównanie architektur względem założonych metryk dają weryfikowalny wynik, dlatego metoda jest celowa i skuteczna. Protokół i pomiar zgodności zapewniają powtarzalność, czyli niezawodność. Jedno stanowisko służy w zadaniach Z3 i Z5, co zapewnia ekonomiczność.</w:t>
       </w:r>
     </w:p>
     <w:p>
@@ -1342,7 +1342,7 @@
         <w:rPr>
           <w:b w:val="0"/>
         </w:rPr>
-        <w:t>Uzasadnienie wyboru metody. Zgodność anotatorów i porównanie architektur względem założonych metryk dają weryfikowalny wynik, dlatego metoda jest celowa i skuteczna. Protokół i pomiar zgodności zapewniają powtarzalność, czyli niezawodność. Jedno stanowisko służy w zadaniach Z3 i Z5, co zapewnia ekonomiczność.</w:t>
+        <w:t>Zadanie ma charakter badań przemysłowych, ponieważ wytwarza nową wiedzę (taksonomia, protokół, wyniki porównawcze), a nie wdraża znanego rozwiązania. Punkt kontrolny M10 należy do kamienia milowego zadania Z3 i ma osobny protokół walidacji pilotażowej.</w:t>
       </w:r>
     </w:p>
     <w:p>
@@ -1353,7 +1353,7 @@
         <w:rPr>
           <w:b w:val="0"/>
         </w:rPr>
-        <w:t xml:space="preserve">Kolejność i powiązania. Protokół zbioru powstanie w </w:t>
+        <w:t xml:space="preserve">Kolejność prac wynika z potrzeb zadania Z2. Protokół zbioru powstanie w </w:t>
       </w:r>
       <w:r>
         <w:rPr>
@@ -1366,7 +1366,7 @@
         <w:rPr>
           <w:b w:val="0"/>
         </w:rPr>
-        <w:t xml:space="preserve">, ponieważ zadanie Z2 potrzebuje go przed pierwszymi przejazdami. Taksonomia 1.0 i walidacja pilotażowa przypadają na </w:t>
+        <w:t xml:space="preserve">, ponieważ Z2 potrzebuje go przed pierwszymi przejazdami, taksonomia 1.0 i walidacja pilotażowa przypadają na </w:t>
       </w:r>
       <w:r>
         <w:rPr>
@@ -1405,7 +1405,7 @@
         <w:rPr>
           <w:b w:val="0"/>
         </w:rPr>
-        <w:t>. Protokół i taksonomia 1.0 wiążą zadanie Z2, a wybrane architektury są wejściem dla zadań Z4 i Z8. Koszty zadania obejmują wynagrodzenia zespołu PRz oraz komponenty stanowiska laboratoryjnego.</w:t>
+        <w:t>. Protokół i taksonomia 1.0 wiążą zadanie Z2, a wybrane architektury są wejściem dla zadań Z4 i Z8.</w:t>
       </w:r>
     </w:p>
     <w:p>
@@ -1783,7 +1783,7 @@
           <w:color w:val="666666"/>
           <w:sz w:val="17"/>
         </w:rPr>
-        <w:t xml:space="preserve"> [2777 z 4000 znaków]</w:t>
+        <w:t xml:space="preserve"> [3260 z 4000 znaków]</w:t>
       </w:r>
     </w:p>
     <w:p>
@@ -1794,7 +1794,7 @@
         <w:rPr>
           <w:b w:val="0"/>
         </w:rPr>
-        <w:t>Problem technologiczny. Gotowe metody przewidywania uszkodzeń z sygnałów drgań dotyczą maszyn wirujących, gdzie zdarzenia stanowią 10-30% obserwacji. W transporcie zdarzenia występują w 1-3% przesyłek, klasy ładunku mają różne progi uszkodzeń, a narażenie się kumuluje. Nie wiadomo, jak znane techniki zachowają się przy takiej rzadkości, ani czy cechy fizyczne i klasa ładunku istotnie poprawiają rozróżnianie przypadków.</w:t>
+        <w:t>Problem technologiczny rozwiązywany w zadaniu został zdefiniowany w sekcji Cel projektu i dotyczy tego, czy z sygnałów drgań, temperatury i wilgotności można wiarygodnie przewidywać uszkodzenie ładunku. Gotowe metody przewidywania uszkodzeń z sygnałów drgań dotyczą maszyn wirujących, gdzie zdarzenia stanowią 10-30% obserwacji. W transporcie zdarzenia występują w 1-3% przesyłek, klasy ładunku mają różne progi uszkodzeń, a narażenie się kumuluje. Nie wiadomo, jak znane techniki zachowają się przy takiej rzadkości, ani czy cechy fizyczne i klasa ładunku istotnie poprawiają rozróżnianie przypadków.</w:t>
       </w:r>
     </w:p>
     <w:p>
@@ -1805,7 +1805,7 @@
         <w:rPr>
           <w:b w:val="0"/>
         </w:rPr>
-        <w:t>Charakter prac. Zadanie ma charakter prac rozwojowych i nie polega na wytrenowaniu gotowej sieci na danych. Reprezentacja skumulowanego narażenia z klasą ładunku jest nowa w tej dziedzinie. Skuteczność technik niezbalansowania przy rzadkości 1-3% i małej liczbie przypadków dodatnich nie jest znana. Dobór progu pod czułość 0,80 przy użytecznej precyzji wymaga kalibracji eksperymentalnej. Wynik nie jest przesądzony. Znane narzędzia (FFT, SHAP, SMOTE) zostaną wykorzystane do zbudowania nowego modelu, a nie do zmiany działającego produktu.</w:t>
+        <w:t>Zadanie ma charakter prac rozwojowych i nie polega na wytrenowaniu gotowej sieci na danych, co mogłoby zostać uznane za rutynową czynność informatyczną. Reprezentacja skumulowanego narażenia z klasą ładunku jest nowa w tej dziedzinie. Skuteczność technik niezbalansowania przy rzadkości 1-3% i małej liczbie przypadków dodatnich nie jest znana. Dobór progu pod czułość 0,80 przy użytecznej precyzji wymaga kalibracji eksperymentalnej, a wynik nie jest przesądzony. Znane narzędzia (FFT, SHAP, SMOTE) zostaną wykorzystane do zbudowania nowego modelu, a nie do zmiany działającego produktu.</w:t>
       </w:r>
     </w:p>
     <w:p>
@@ -1816,7 +1816,7 @@
         <w:rPr>
           <w:b w:val="0"/>
         </w:rPr>
-        <w:t>Metoda. Porównane zostaną warianty: baza bez technik niezbalansowania, SMOTE lub ADASYN, funkcja straty zależna od kosztu błędu oraz zespół modeli, każdy z trzema zestawami cech (bez klasy i miary zmęczeniowej, tylko klasa, pełny). Walidacja krzyżowa będzie stratyfikowana po kursach, aby uniknąć przecieku między oknami tego samego przejazdu. Oceniane będą AUC-ROC i AUC-PR dla każdej klasy (AUC-PR uzupełnia AUC-ROC, który przy 1:30-1:100 bywa zbyt optymistyczny), czułość w wybranym progu, macierz pomyłek i przedział ufności 95%. Jako wartość bazowa posłuży detektor progowy według EN 12195-1 oceniony na tym samym teście, a nie klasyfikator losowy (AUC 0,50). Wyjaśnialność SHAP i LIME jest warunkiem akceptacji przez dyspozytora i materiałem do zgłoszenia patentowego. Podział danych będzie zgodny z protokołem z zadania Z3: dane kontrolowane i syntetyczne tylko w treningu, test naturalny rozszerzany do 30 ZR naturalnych (10 w każdej z 3 klas), osobny test kontrolowany.</w:t>
+        <w:t>Metoda polega na kontrolowanym porównaniu wariantów rozwiązania. Zostaną porównane: baza bez technik niezbalansowania, SMOTE lub ADASYN, funkcja straty zależna od kosztu błędu oraz zespół modeli, każde z trzema zestawami cech (bez klasy i miary zmęczeniowej, tylko klasa, pełny). Walidacja krzyżowa będzie stratyfikowana po kursach, aby uniknąć przecieku między oknami tego samego przejazdu. Oceniane będą AUC-ROC i AUC-PR dla każdej klasy (AUC-PR uzupełnia AUC-ROC, który przy 1:30-1:100 bywa zbyt optymistyczny), czułość w wybranym progu, macierz pomyłek i przedział ufności 95%.</w:t>
       </w:r>
     </w:p>
     <w:p>
@@ -1827,7 +1827,7 @@
         <w:rPr>
           <w:b w:val="0"/>
         </w:rPr>
-        <w:t>Uzasadnienie wyboru metody. Walidacja po kursach i odrębny test dają obiektywny wynik, co zapewnia niezawodność. Badanie ablacyjne wskazuje, co faktycznie poprawia wynik, dlatego metoda jest celowa i skuteczna. Wykorzystanie zbioru z zadania Z2 i środowiska PRz zapewnia ekonomiczność.</w:t>
+        <w:t>Jako punkt odniesienia zostanie użyta metoda referencyjna. Wartością bazową będzie detektor progowy według EN 12195-1 oceniony na tym samym teście, a nie klasyfikator losowy (AUC 0,50), dzięki czemu wskaźnik innowacyjności pokaże rzeczywistą przewagę modelu. Wyjaśnialność SHAP i LIME jest warunkiem akceptacji przez dyspozytora i materiałem do planowanego zgłoszenia patentowego. Podział danych będzie zgodny z protokołem z zadania Z3: dane kontrolowane i syntetyczne tylko w treningu, test naturalny rozszerzany do 30 ZR naturalnych (10 w każdej z 3 klas), osobny test kontrolowany.</w:t>
       </w:r>
     </w:p>
     <w:p>
@@ -1838,7 +1838,18 @@
         <w:rPr>
           <w:b w:val="0"/>
         </w:rPr>
-        <w:t xml:space="preserve">Kolejność i powiązania. Inżynieria cech zostanie wykonana w </w:t>
+        <w:t>Wybór metody jest uzasadniony czterema względami. Walidacja po kursach i odrębny test dają obiektywny wynik, co zapewnia niezawodność. Badanie ablacyjne wskazuje, co faktycznie poprawia wynik, dlatego metoda jest celowa i skuteczna. Wykorzystanie zbioru z zadania Z2 i środowiska obliczeniowego PRz zapewnia ekonomiczność, a koszty zadania obejmują wynagrodzenia wymienionych osób PRz.</w:t>
+      </w:r>
+    </w:p>
+    <w:p>
+      <w:pPr>
+        <w:spacing w:after="60"/>
+      </w:pPr>
+      <w:r>
+        <w:rPr>
+          <w:b w:val="0"/>
+        </w:rPr>
+        <w:t xml:space="preserve">Kolejność prac wynika z logiki eksperymentu. Inżynieria cech zostanie wykonana w </w:t>
       </w:r>
       <w:r>
         <w:rPr>
@@ -1864,7 +1875,7 @@
         <w:rPr>
           <w:b w:val="0"/>
         </w:rPr>
-        <w:t xml:space="preserve">, walidacja i porównanie z metodą referencyjną w </w:t>
+        <w:t xml:space="preserve">, a walidacja i porównanie z metodą referencyjną w </w:t>
       </w:r>
       <w:r>
         <w:rPr>
@@ -1877,7 +1888,7 @@
         <w:rPr>
           <w:b w:val="0"/>
         </w:rPr>
-        <w:t>, a raport i przekazanie modelu nastąpią w M27, po oknie korekt. Cechy trzeba przygotować przed eksperymentami, a walidacja wymaga zamrożenia wariantu. Zadanie korzysta z architektury z zadania Z3 i danych z zadania Z2. Model FP32 jest wejściem do kompresji w zadaniu Z7, a jego skuteczność w ruchu sprawdzi zadanie Z9. Koszty zadania obejmują wynagrodzenia wymienionych osób PRz.</w:t>
+        <w:t>. Raport i przekazanie modelu nastąpią w M27, po oknie korekt, ponieważ cechy trzeba przygotować przed eksperymentami, a walidacja wymaga zamrożenia wariantu. Zadanie korzysta z architektury z zadania Z3 i danych z zadania Z2, model FP32 jest wejściem do kompresji w zadaniu Z7, a jego skuteczność w ruchu sprawdzi zadanie Z9.</w:t>
       </w:r>
     </w:p>
     <w:p>
@@ -2244,7 +2255,7 @@
           <w:color w:val="666666"/>
           <w:sz w:val="17"/>
         </w:rPr>
-        <w:t xml:space="preserve"> [2438 z 4000 znaków]</w:t>
+        <w:t xml:space="preserve"> [3170 z 4000 znaków]</w:t>
       </w:r>
     </w:p>
     <w:p>
@@ -2255,7 +2266,7 @@
         <w:rPr>
           <w:b w:val="0"/>
         </w:rPr>
-        <w:t>Charakter prac. Zadanie ma charakter prac rozwojowych: działający prototyp algorytmiczny będzie budowany iteracyjnie i walidowany w kontrolowanych eksperymentach w środowisku zbliżonym do docelowego, aby osiągnąć gotowość pozwalającą przekazać go do integracji embedded w zadaniu Z7. Niepewność dotyczy tego, czy znane metody dadzą wymagany błąd pozycji przy drganiach naczepy i zakłóceniach MCI bez założenia stałej geometrii.</w:t>
+        <w:t>Problem badawczy rozwiązywany w zadaniu został zdefiniowany w sekcji Cel projektu w części dotyczącej prac rozwojowych i dotyczy uzyskania wymaganego błędu pozycji ładunku w modelu 3D w warunkach rzeczywistej naczepy. Zakłócenia wielokamerowe MCI, zmienna refleksyjność ładunków i drgania powodują, że znane metody wizyjno-inercyjne, opracowane dla scen otwartych, dronów i robotów mobilnych, nie gwarantują wymaganej dokładności. Nie wiadomo, czy da się ją osiągnąć bez założenia stałej geometrii sceny, a rozwiązanie wymaga zbudowania i przetestowania działającego prototypu.</w:t>
       </w:r>
     </w:p>
     <w:p>
@@ -2266,7 +2277,7 @@
         <w:rPr>
           <w:b w:val="0"/>
         </w:rPr>
-        <w:t>Metoda. Prace zostaną oparte na trzech eksperymentach. Pierwszy to eksperyment kontrolowany MCI: stanowisko z metalowymi panelami odwzorowującymi ściany naczepy i ładunkami o różnych klasach optycznych (folia, karton, stal, drewno). Błąd głębi zostanie zmierzony z mitygacją i bez (badanie ablacyjne) na co najmniej 200 parach map, co wyodrębni wkład algorytmu i dowiedzie jego skuteczności. Drugi to eksperyment wibracyjny: rig odwzorowujący profil drgań naczepy według ISO 8608 klasy D z referencją fotogrametryczną, z fuzją danych ToF lub EO ze światłem strukturalnym oraz IMU i strojeniem filtra Kalmana. Trzeci to weryfikacja na wybranych rzeczywistych sekwencjach z zadania Z2, aby potwierdzić działanie poza laboratorium.</w:t>
+        <w:t>Zadanie ma charakter prac rozwojowych, ponieważ działający prototyp algorytmiczny będzie budowany iteracyjnie i walidowany w kontrolowanych eksperymentach w środowisku zbliżonym do docelowego. Osiągnie gotowość pozwalającą przekazać go do integracji embedded w zadaniu Z7. Niepewność dotyczy tego, czy znane metody dadzą wymagany błąd pozycji przy drganiach naczepy i zakłóceniach MCI.</w:t>
       </w:r>
     </w:p>
     <w:p>
@@ -2277,7 +2288,7 @@
         <w:rPr>
           <w:b w:val="0"/>
         </w:rPr>
-        <w:t>Walidacja statystyczna obejmie medianę i percentyl 95 błędu pozycji na co najmniej 100 sekwencjach, błąd względny przemieszczenia między kolejnymi klatkami (decyduje o wykrywaniu przemieszczeń od 0,10 m w zadaniu Z8) oraz częstotliwość aktualizacji modelu co najmniej 5 Hz.</w:t>
+        <w:t>Metoda opiera się na trzech eksperymentach. Pierwszym jest eksperyment kontrolowany MCI: stanowisko z metalowymi panelami odwzorowującymi ściany naczepy i ładunkami o różnych klasach optycznych (folia, karton, stal, drewno). Błąd głębi zostanie zmierzony z mitygacją i bez (badanie ablacyjne) na co najmniej 200 parach map, co wyodrębni wkład algorytmu i dowiedzie jego skuteczności. Drugim jest eksperyment wibracyjny: rig odwzorowujący profil drgań naczepy według ISO 8608 klasy D z referencją fotogrametryczną, z fuzją danych ToF lub EO ze światłem strukturalnym oraz IMU i strojeniem filtra Kalmana dla widma od 8 do 25 Hz. Trzecim jest weryfikacja na wybranych rzeczywistych sekwencjach z zadania Z2, aby potwierdzić działanie poza laboratorium.</w:t>
       </w:r>
     </w:p>
     <w:p>
@@ -2288,7 +2299,7 @@
         <w:rPr>
           <w:b w:val="0"/>
         </w:rPr>
-        <w:t>Uzasadnienie wyboru metody. Badanie ablacyjne jest jedynym sposobem rozdzielenia wkładu algorytmu od stanu bez mitygacji, dlatego metoda jest celowa i skuteczna. Rig z referencją fotogrametryczną daje obiektywny, powtarzalny pomiar, co zapewnia niezawodność. Wykorzystanie istniejącego stanowiska PRz i danych z zadania Z2 zapewnia ekonomiczność.</w:t>
+        <w:t>Walidacja statystyczna zostanie wykonana na wielkościach istotnych dla wskaźników projektu. Obejmie medianę i percentyl 95 błędu pozycji na co najmniej 100 sekwencjach, błąd względny przemieszczenia między kolejnymi klatkami (decyduje o wykrywaniu przemieszczeń od 0,10 m w zadaniu Z8) oraz częstotliwość aktualizacji modelu co najmniej 5 Hz, przy czym te same wielkości będą ponownie mierzone po kompresji w zadaniu Z7 i w terenie w zadaniu Z9.</w:t>
       </w:r>
     </w:p>
     <w:p>
@@ -2299,7 +2310,18 @@
         <w:rPr>
           <w:b w:val="0"/>
         </w:rPr>
-        <w:t xml:space="preserve">Kolejność i powiązania. Moduł MCI zostanie wdrożony w </w:t>
+        <w:t>Wybór metody jest uzasadniony czterema względami. Badanie ablacyjne jest jedynym sposobem rozdzielenia wkładu algorytmu od stanu bez mitygacji, dlatego metoda jest celowa i skuteczna. Rig z referencją fotogrametryczną daje obiektywny, powtarzalny pomiar, co zapewnia niezawodność. Wykorzystanie istniejącego stanowiska PRz i danych z zadania Z2 zapewnia ekonomiczność, a koszty zadania obejmują wynagrodzenia wymienionych osób PRz i eksploatację stanowisk zbudowanych w zadaniu Z3.</w:t>
+      </w:r>
+    </w:p>
+    <w:p>
+      <w:pPr>
+        <w:spacing w:after="60"/>
+      </w:pPr>
+      <w:r>
+        <w:rPr>
+          <w:b w:val="0"/>
+        </w:rPr>
+        <w:t xml:space="preserve">Kolejność prac wynika z zależności między modułami. Moduł MCI zostanie wdrożony w </w:t>
       </w:r>
       <w:r>
         <w:rPr>
@@ -2312,7 +2334,7 @@
         <w:rPr>
           <w:b w:val="0"/>
         </w:rPr>
-        <w:t xml:space="preserve">, moduł rejestracji z IMU i eksperymenty wibracyjne zostaną przeprowadzone w </w:t>
+        <w:t xml:space="preserve">, ponieważ jego wynik poprawia dane wejściowe modułu rejestracji, moduł rejestracji z IMU i eksperymenty wibracyjne zostaną przeprowadzone w </w:t>
       </w:r>
       <w:r>
         <w:rPr>
@@ -2338,7 +2360,7 @@
         <w:rPr>
           <w:b w:val="0"/>
         </w:rPr>
-        <w:t>. Moduł MCI powstaje jako pierwszy, ponieważ jego wynik poprawia dane wejściowe modułu rejestracji. Wynikowy moduł jest wejściem do optymalizacji w zadaniu Z7, podstawą wskaźnika błędu pozycji walidowanego w zadaniu Z9 i progu wykrywania przemieszczeń w module change detection z zadania Z8. Koszty zadania obejmują wynagrodzenia wymienionych osób PRz i eksploatację stanowisk laboratoryjnych zbudowanych w zadaniu Z3.</w:t>
+        <w:t>. Wynikowy moduł jest wejściem do optymalizacji w zadaniu Z7, podstawą wskaźnika błędu pozycji walidowanego w zadaniu Z9 i progu wykrywania przemieszczeń w module change detection z zadania Z8.</w:t>
       </w:r>
     </w:p>
     <w:p>
@@ -2731,7 +2753,7 @@
           <w:color w:val="666666"/>
           <w:sz w:val="17"/>
         </w:rPr>
-        <w:t xml:space="preserve"> [2786 z 4000 znaków]</w:t>
+        <w:t xml:space="preserve"> [3098 z 4000 znaków]</w:t>
       </w:r>
     </w:p>
     <w:p>
@@ -2742,7 +2764,7 @@
         <w:rPr>
           <w:b w:val="0"/>
         </w:rPr>
-        <w:t>Problem technologiczny. Istniejące systemy telematyczne rejestrują lokalizację i zdarzenia progowe, ale nie tworzą dokumentu stanu ładunku łączącego model 3D, wykrywanie zabezpieczeń, ocenę ryzyka z ML i historię narażenia, z podpisem i znacznikiem czasu. Nie wiadomo, czy da się to zrobić w 30 s na platformie embedded z zachowaniem spójności dowodowej przy przerywanej łączności.</w:t>
+        <w:t>Problem technologiczny rozwiązywany w zadaniu został zdefiniowany w sekcji Cel projektu i dotyczy braku dokumentu stanu ładunku generowanego automatycznie z danych sensorycznych. Istniejące systemy telematyczne rejestrują lokalizację i zdarzenia progowe, ale nie tworzą dokumentu łączącego model 3D, wykrywanie zabezpieczeń, ocenę ryzyka z ML i historię narażenia, z podpisem i znacznikiem czasu. Nie wiadomo, czy da się to zrobić w 30 s na platformie embedded z zachowaniem spójności dowodowej przy przerywanej łączności.</w:t>
       </w:r>
     </w:p>
     <w:p>
@@ -2753,7 +2775,7 @@
         <w:rPr>
           <w:b w:val="0"/>
         </w:rPr>
-        <w:t>Charakter prac. Zadanie ma charakter prac rozwojowych, a nie standardowej integracji IT, ponieważ dotyczy trzech niepewności technicznych. Pierwsza to czas generowania do 30 s przy fuzji snapshotu 3D, raportu CV, osi narażenia ML, historii sygnałów i wizualizacji 3D. Druga to pokrycie co najmniej 95% obligatoryjnych pól eFTI, gdy część pól wymaga danych spoza sensorów. Trzecia to zgodność treści dokumentu z rzeczywistym stanem ładunku. Czynności standardowe (API TMS, Trans.eu, TimoCom, e-CMR, produkcyjny dashboard, utrzymanie) nie są pracami B+R i nie są kosztem projektu.</w:t>
+        <w:t>Zadanie ma charakter prac rozwojowych, a nie standardowej integracji IT, ponieważ dotyczy trzech niepewności technicznych. Pierwsza to czas generowania do 30 s przy fuzji snapshotu 3D, raportu CV, osi narażenia ML, historii sygnałów i wizualizacji 3D. Druga to pokrycie co najmniej 95% obligatoryjnych pól eFTI, gdy część pól wymaga danych spoza sensorów. Trzecia to zgodność treści dokumentu z rzeczywistym stanem ładunku. Czynności standardowe (API TMS, Trans.eu, TimoCom, e-CMR, produkcyjny dashboard, utrzymanie) nie są pracami B+R i nie są kosztem projektu.</w:t>
       </w:r>
     </w:p>
     <w:p>
@@ -2764,7 +2786,18 @@
         <w:rPr>
           <w:b w:val="0"/>
         </w:rPr>
-        <w:t xml:space="preserve">Metoda. Dla pipeline'u zostaną sprofilowane wszystkie etapy, wskazane wąskie gardła i zastosowane przetwarzanie przyrostowe oraz bufor modelu 3D. Czas zostanie zmierzony na co najmniej 50 cyklach (mediana do 30 s, opóźnienie zdarzenia do interfejsu testowego TMS do 2 s). Łańcuch integralności to podpisany pakiet z hashem źródeł i znacznikiem czasu, badany testem odporności na utratę łączności. Dla eFTI zostaną przeanalizowane pola obligatoryjne, ustalona formalna reguła przekształcania zdarzeń w pola i przeprowadzona walidacja schematem XSD oraz implementacją referencyjną KE jako narzędziami testowymi. Mianownikiem wskaźnika pokrycia będą wszystkie pola obligatoryjne. Walidacja merytoryczna obejmie próbę co najmniej 10% dokumentów (nie mniej niż 50) porównaną z dokumentacją ground truth z zadania Z2, przy wymaganej zgodności kluczowych pól co najmniej </w:t>
+        <w:t>Metoda obejmuje trzy obszary prac. Dla pipeline'u zostaną sprofilowane wszystkie etapy, wskazane wąskie gardła i zastosowane przetwarzanie przyrostowe oraz bufor modelu 3D, a czas zostanie zmierzony na co najmniej 50 cyklach (mediana do 30 s, opóźnienie zdarzenia do interfejsu testowego TMS do 2 s). Łańcuch integralności będzie podpisanym pakietem z hashem źródeł i znacznikiem czasu, badanym testem odporności na utratę łączności. Dla eFTI zostaną przeanalizowane pola obligatoryjne, ustalona formalna reguła przekształcania zdarzeń w pola i przeprowadzona walidacja schematem XSD oraz implementacją referencyjną KE jako narzędziami testowymi, a mianownikiem wskaźnika pokrycia będą wszystkie pola obligatoryjne.</w:t>
+      </w:r>
+    </w:p>
+    <w:p>
+      <w:pPr>
+        <w:spacing w:after="60"/>
+      </w:pPr>
+      <w:r>
+        <w:rPr>
+          <w:b w:val="0"/>
+        </w:rPr>
+        <w:t xml:space="preserve">Walidacja merytoryczna sprawdzi, czy dokument odpowiada rzeczywistości. Próba co najmniej 10% dokumentów (nie mniej niż 50) zostanie porównana z dokumentacją ground truth z zadania Z2 (klasa uszkodzenia, lokalizacja 3D, czas zdarzenia), przy wymaganej zgodności kluczowych pól co najmniej </w:t>
       </w:r>
       <w:r>
         <w:rPr>
@@ -2788,7 +2821,7 @@
         <w:rPr>
           <w:b w:val="0"/>
         </w:rPr>
-        <w:t>Uzasadnienie wyboru metody. Test na rzeczywistych cyklach jest jedynym wiarygodnym sprawdzianem wykonalności, dlatego metoda jest celowa i skuteczna. Walidacja formalna i porównanie z ground truth zapewniają rzetelność, czyli niezawodność. Równoległość z zadaniem Z7 i interfejs testowy do istniejącego TMS zapewniają ekonomiczność.</w:t>
+        <w:t>Wybór metody jest uzasadniony czterema względami. Test na rzeczywistych cyklach jest jedynym wiarygodnym sprawdzianem wykonalności, dlatego metoda jest celowa i skuteczna. Walidacja formalna i porównanie z ground truth zapewniają rzetelność, czyli niezawodność. Równoległość z zadaniem Z7 i interfejs testowy do istniejącego TMS zapewniają ekonomiczność, a koszty zadania obejmują wynagrodzenia wymienionych osób Everest11, z Backend/Full-Stack Developerem na 9 miesięcy.</w:t>
       </w:r>
     </w:p>
     <w:p>
@@ -2799,7 +2832,7 @@
         <w:rPr>
           <w:b w:val="0"/>
         </w:rPr>
-        <w:t xml:space="preserve">Kolejność i powiązania. Architektura pipeline'u i reguły eFTI powstaną w </w:t>
+        <w:t xml:space="preserve">Kolejność prac wynika z dostępności modeli. Architektura pipeline'u i reguły eFTI powstaną w </w:t>
       </w:r>
       <w:r>
         <w:rPr>
@@ -2838,7 +2871,7 @@
         <w:rPr>
           <w:b w:val="0"/>
         </w:rPr>
-        <w:t>, po dostarczeniu tych wersji. Zadanie korzysta z modeli z zadań Z4, Z5 i Z8 w wersjach release candidate do M26 oraz z platformy z zadania Z7. Pełna walidacja terenowa PoC należy do zadania Z9. Koszty zadania obejmują wynagrodzenia wymienionych osób Everest11, z Backend/Full-Stack Developerem na 9 miesięcy.</w:t>
+        <w:t>, po dostarczeniu tych wersji. Zadanie korzysta z modeli z zadań Z4, Z5 i Z8 w wersjach release candidate do M26 oraz z platformy z zadania Z7, a pełna walidacja terenowa PoC należy do zadania Z9.</w:t>
       </w:r>
     </w:p>
     <w:p>
@@ -3219,7 +3252,7 @@
           <w:color w:val="666666"/>
           <w:sz w:val="17"/>
         </w:rPr>
-        <w:t xml:space="preserve"> [3015 z 4000 znaków]</w:t>
+        <w:t xml:space="preserve"> [3267 z 4000 znaków]</w:t>
       </w:r>
     </w:p>
     <w:p>
@@ -3230,7 +3263,7 @@
         <w:rPr>
           <w:b w:val="0"/>
         </w:rPr>
-        <w:t>Charakter prac. Zadanie ma charakter eksperymentalnych prac rozwojowych: modele badawcze PRz (3D z zadania Z5, ML z zadania Z4, CV z zadania Z8, rozwiązujące problemy badawcze 1-3) zostaną doprowadzone do działającego systemu wbudowanego, pracującego w czasie rzeczywistym w warunkach naczepy i walidowanego w środowisku modelującym rzeczywiste działanie. Niepewność dotyczy pogodzenia opóźnienia alertu do 1 s z degradacją dokładności modeli skompresowanych do 3 punktów procentowych. Przed realizacją nie wiadomo, czy ten kompromis jest osiągalny na docelowej platformie embedded.</w:t>
+        <w:t>Problem technologiczny rozwiązywany w zadaniu został zdefiniowany w sekcji Cel projektu i dotyczy uruchomienia modeli badawczych na wbudowanej platformie w czasie rzeczywistym, bez łączności z internetem. Modele z zadań Z4, Z5 i Z8 są budowane w pełnej precyzji FP32 i nie mieszczą się w ograniczeniach mocy, temperatury i drgań naczepy. Przed realizacją nie wiadomo, czy kompromis między opóźnieniem alertu do 1 s a degradacją dokładności modeli skompresowanych do 3 punktów procentowych jest osiągalny na docelowej platformie embedded.</w:t>
       </w:r>
     </w:p>
     <w:p>
@@ -3241,7 +3274,7 @@
         <w:rPr>
           <w:b w:val="0"/>
         </w:rPr>
-        <w:t>Kompresja. Techniki zostaną dobrane eksperymentalnie: kwantyzacja INT8 z profilowaniem warstw, QAT dla modeli wrażliwych, przycinanie według czułości (macierz informacji Fishera) i destylacja dla modeli CV. Po każdym etapie zostanie zmierzony kompromis rozmiar, opóźnienie i dokładność na zbiorach z zadań Z4 i Z8, w kolejności: kwantyzacja, przycinanie, destylacja. Dokładność zostanie porównana dla FP32 i INT8, osobno dla AUC-ROC i mAP. Granica 3 punktów procentowych jest twardym warunkiem. Jeżeli pojedyncze warstwy jej nie utrzymają, zostanie zastosowana mieszana precyzja warstw kosztem opóźnienia, co domyka przestrzeń decyzyjną kompromisu.</w:t>
+        <w:t>Zadanie ma charakter eksperymentalnych prac rozwojowych: modele badawcze PRz (3D, ML i CV, rozwiązujące problemy badawcze 1-3) zostaną doprowadzone do działającego systemu wbudowanego, pracującego w czasie rzeczywistym w warunkach naczepy i walidowanego w środowisku modelującym rzeczywiste działanie. Nie jest to wdrożenie znanego rozwiązania, ponieważ osiągalność założonych parametrów nie jest znana.</w:t>
       </w:r>
     </w:p>
     <w:p>
@@ -3252,7 +3285,7 @@
         <w:rPr>
           <w:b w:val="0"/>
         </w:rPr>
-        <w:t>Architektura sprzętowa. Zostanie zaprojektowana jednostka AI z interfejsami sensorów, zasilaniem z buforem UPS (czas pozwalający wygenerować PoC po wyłączeniu silnika) i obudowa IP67 odporna na drgania i temperaturę. Jest to element systemu złożonego, od którego zależy praca modeli w środowisku docelowym.</w:t>
+        <w:t>Kompresja modeli zostanie wykonana eksperymentalnie. Techniki zostaną dobrane z puli: kwantyzacja INT8 z profilowaniem warstw, QAT dla modeli wrażliwych, przycinanie według czułości (macierz informacji Fishera) i destylacja dla modeli CV. Po każdym etapie zostanie zmierzony kompromis rozmiar, opóźnienie i dokładność na zbiorach z zadań Z4 i Z8, w kolejności: kwantyzacja, przycinanie, destylacja, a dokładność zostanie porównana dla FP32 i INT8, osobno dla AUC-ROC i mAP. Granica 3 punktów procentowych jest twardym warunkiem, a jeżeli pojedyncze warstwy jej nie utrzymają, zostanie zastosowana mieszana precyzja kosztem opóźnienia.</w:t>
       </w:r>
     </w:p>
     <w:p>
@@ -3263,7 +3296,7 @@
         <w:rPr>
           <w:b w:val="0"/>
         </w:rPr>
-        <w:t>Potok edge. Skompresowane modele 3D, CV i ML zostaną połączone w jeden potok tworzący alert lokalnie, bez łączności, z buforowaniem do transmisji GSM do 72 h. Opóźnienie zostanie zoptymalizowane przez profilowanie modułów, batching i TensorRT oraz zmierzone (mediana, percentyl 95) na co najmniej 1000 przebiegach na docelowej platformie. Walidacja środowiskowa na infrastrukturze PRz obejmie rig wibracyjny, komorę termiczną i EMC. Trafność progów alertu i użyteczność powiadomienia w kabinie sprawdzi specjalista TSL.</w:t>
+        <w:t>Architektura sprzętowa i potok inferencji zostaną zaprojektowane jako jeden system. Jednostka AI z interfejsami sensorów, zasilaniem z buforem UPS (czas pozwalający wygenerować PoC po wyłączeniu silnika) i obudową IP67 odporną na drgania i temperaturę jest elementem, od którego zależy praca modeli w środowisku docelowym. Skompresowane modele 3D, CV i ML zostaną połączone w jeden potok tworzący alert lokalnie, z buforowaniem do transmisji GSM do 72 h, a opóźnienie zostanie zoptymalizowane przez profilowanie modułów, batching i TensorRT i zmierzone (mediana, percentyl 95) na co najmniej 1000 przebiegach.</w:t>
       </w:r>
     </w:p>
     <w:p>
@@ -3274,7 +3307,7 @@
         <w:rPr>
           <w:b w:val="0"/>
         </w:rPr>
-        <w:t>Uzasadnienie wyboru metody. Pomiar opóźnienia na docelowej platformie jest jedynym wiarygodnym testem wykonalności edge, dlatego metoda jest celowa i skuteczna. Testy w komorze i na rigu odwzorowują warunki docelowe, co zapewnia niezawodność. Korzystanie z infrastruktury PRz w ramach konsorcjum zapewnia ekonomiczność.</w:t>
+        <w:t>Walidacja środowiskowa potwierdzi pracę w warunkach docelowych. Zostanie wykonana na infrastrukturze PRz udostępnionej w ramach konsorcjum (rig wibracyjny, komora termiczna, EMC), a trafność progów alertu i użyteczność powiadomienia w kabinie sprawdzi specjalista TSL. Korzystanie z tej infrastruktury zapewnia ekonomiczność, a pomiar na docelowej platformie jest jedynym wiarygodnym testem wykonalności, dlatego metoda jest celowa i skuteczna. Testy w komorze i na rigu odwzorowują warunki docelowe, co zapewnia niezawodność.</w:t>
       </w:r>
     </w:p>
     <w:p>
@@ -3285,7 +3318,7 @@
         <w:rPr>
           <w:b w:val="0"/>
         </w:rPr>
-        <w:t xml:space="preserve">Kolejność i powiązania. Projekt sprzętu i wstępna kompresja na modelach pośrednich zostaną wykonane w </w:t>
+        <w:t xml:space="preserve">Kolejność prac wynika z dostępności modeli. Projekt sprzętu i wstępna kompresja na modelach pośrednich zostaną wykonane w </w:t>
       </w:r>
       <w:r>
         <w:rPr>
@@ -3324,7 +3357,7 @@
         <w:rPr>
           <w:b w:val="0"/>
         </w:rPr>
-        <w:t>. Zadanie przyjmie modele z zadań Z5, Z4 i Z8 w wersjach release candidate przed końcem tych zadań i przekaże zintegrowany system do instalacji i testów terenowych w zadaniu Z9. Bez zwalidowanego systemu testy terenowe nie mogą się rozpocząć, dlatego kamień milowy zadania Z7 jest krytyczny. Koszty zadania obejmują wynagrodzenia wymienionych osób Everest11 oraz platformę embedded i obudowy do prototypów.</w:t>
+        <w:t>. Zadanie przekaże zintegrowany system do instalacji i testów terenowych w zadaniu Z9, a bez zwalidowanego systemu testy te nie mogą się rozpocząć, dlatego kamień milowy zadania Z7 jest krytyczny. Koszty obejmują wynagrodzenia wymienionych osób Everest11 oraz platformę embedded i obudowy do prototypów.</w:t>
       </w:r>
     </w:p>
     <w:p>
@@ -3703,7 +3736,7 @@
           <w:color w:val="666666"/>
           <w:sz w:val="17"/>
         </w:rPr>
-        <w:t xml:space="preserve"> [2291 z 4000 znaków]</w:t>
+        <w:t xml:space="preserve"> [3075 z 4000 znaków]</w:t>
       </w:r>
     </w:p>
     <w:p>
@@ -3714,7 +3747,7 @@
         <w:rPr>
           <w:b w:val="0"/>
         </w:rPr>
-        <w:t>Charakter prac. Zadanie ma charakter prac rozwojowych: działające modele wizyjne i moduł change detection zostaną zbudowane, wytrenowane i zwalidowane na danych docelowych, w środowisku zbliżonym do docelowego. Komponenty trafią do integracji embedded w zadaniu Z7 i do pipeline'u PoC w zadaniu Z6. Nie są to badania poznawcze.</w:t>
+        <w:t>Problem badawczy rozwiązywany w zadaniu został zdefiniowany w sekcji Cel projektu jako trzeci i dotyczy wiarygodnej weryfikacji zabezpieczeń ładunku i wykrywania zmian jego położenia w metalowej naczepie. Modele wytrenowane na obrazach naturalnych nie uogólniają na okluzje ładunku zasłaniającego zabezpieczenia, rozmycie od drgań i oświetlenie podczerwone NIR w metalowej przestrzeni, a porównanie stanu ładunku między załadunkiem a rozładunkiem wymaga połączenia modelu 3D z wynikami detekcji.</w:t>
       </w:r>
     </w:p>
     <w:p>
@@ -3725,7 +3758,7 @@
         <w:rPr>
           <w:b w:val="0"/>
         </w:rPr>
-        <w:t>Metoda. Najpierw zostanie zrewidowana taksonomia 1.0 na podstawie obserwacji z zadania Z2 i konsultacji z ekspertem TSL. Zmiana kryteriów klasy oznacza jej ponowną anotację, aby etykiety pozostały spójne z modelem. Następnie modele zostaną wytrenowane metodą transfer learningu na zbiorze TSL z zadania Z2, z augmentacjami dla naczepy: rozmyciem od drgań, domeną NIR i okluzjami syntetycznymi, czyli wyzwaniem opisanym w analizie stanu techniki w zadaniu Z1. Moduł change detection połączy model 3D z zadania Z5 i detekcje CV w algorytm tworzący mapę anomalii. Walidacja obejmie mAP przy IoU 0,50 dla każdej klasy na zbiorze co najmniej 2000 obrazów oraz F1 change detection względem oceny eksperckiej na co najmniej 50 cyklach.</w:t>
+        <w:t>Zadanie ma charakter prac rozwojowych, ponieważ działające modele wizyjne i moduł change detection zostaną zbudowane, wytrenowane i zwalidowane na danych docelowych, w środowisku zbliżonym do docelowego. Komponenty trafią do integracji embedded w zadaniu Z7 i do pipeline'u PoC w zadaniu Z6. Nie są to badania poznawcze.</w:t>
       </w:r>
     </w:p>
     <w:p>
@@ -3736,7 +3769,7 @@
         <w:rPr>
           <w:b w:val="0"/>
         </w:rPr>
-        <w:t>Uzasadnienie wyboru metody. Augmentacje domenowe są konieczne, ponieważ modele wytrenowane na obrazach naturalnych nie uogólniają na okluzje i oświetlenie NIR w metalowej naczepie, dlatego metoda jest celowa i skuteczna. Osobny zbiór testowy i ocena ekspercka dają obiektywny wynik, czyli niezawodność. Transfer learning zmniejsza zapotrzebowanie na dane i koszty, co zapewnia ekonomiczność.</w:t>
+        <w:t>Metoda została podzielona na cztery etapy. Najpierw zostanie zrewidowana taksonomia 1.0 na podstawie obserwacji z zadania Z2 i konsultacji z ekspertem TSL, przy czym zmiana kryteriów klasy oznacza jej ponowną anotację, aby etykiety pozostały spójne z modelem. Następnie modele zostaną wytrenowane metodą transfer learningu na zbiorze TSL z zadania Z2, z augmentacjami dla naczepy: rozmyciem od drgań, domeną NIR i okluzjami syntetycznymi. Moduł change detection połączy model 3D z zadania Z5 i detekcje CV w algorytm tworzący mapę anomalii z prawdopodobieństwem uszkodzenia dla każdej pozycji ładunkowej. Na końcu walidacja obejmie mAP przy IoU 0,50 dla każdej klasy na zbiorze co najmniej 2000 obrazów oraz F1 change detection względem oceny eksperckiej na co najmniej 50 cyklach.</w:t>
       </w:r>
     </w:p>
     <w:p>
@@ -3747,7 +3780,7 @@
         <w:rPr>
           <w:b w:val="0"/>
         </w:rPr>
-        <w:t>Czas na korekty i ponowną walidację. Harmonogram przewiduje analizę wyników Fazy A z zadania Z9 (M22-M26), korektę modeli, rekalibrację progów i aktualizację taksonomii przed Fazą B (M27-M29) oraz jedną końcową iterację w M30. Zmiany architektury i reanotacje wykona PRz w zadaniu Z8 po dostarczeniu wersji RC w M26, a rekalibrację progów i douczanie wykona Everest11 w zadaniu Z9. Dzięki temu te same prace nie są wykazywane w dwóch zadaniach.</w:t>
+        <w:t>Wybór metody jest uzasadniony czterema względami. Augmentacje domenowe są konieczne, ponieważ modele wytrenowane na obrazach naturalnych nie uogólniają na warunki naczepy, dlatego metoda jest celowa i skuteczna. Osobny zbiór testowy i ocena ekspercka dają obiektywny wynik, czyli niezawodność. Transfer learning zmniejsza zapotrzebowanie na dane i koszty, co zapewnia ekonomiczność, a koszty zadania obejmują wynagrodzenia wymienionych osób PRz.</w:t>
       </w:r>
     </w:p>
     <w:p>
@@ -3758,19 +3791,30 @@
         <w:rPr>
           <w:b w:val="0"/>
         </w:rPr>
-        <w:t>Powiązania. Zadanie korzysta z taksonomii i architektury z zadania Z3, zbioru z zadania Z2 i modelu 3D z zadania Z5. Komponenty zasilają kompresję w zadaniu Z7, generację PoL i PoC w zadaniu Z6 i walidację terenową w zadaniu Z9. Metodykę walidacji i zamrożony skrypt ewaluacyjny dla zadania Z9 zatwierdza odbiór metodyczny w zadaniu Z8. Koszty zadania obejmują wynagrodzenia wymienionych osób PRz.</w:t>
+        <w:t>Harmonogram przewiduje czas na analizę wyników, korekty i ponowną walidację. Etapy 1 i 2 zostaną wykonane w M22-M26, a wersja release candidate trafi w M26 do zadań Z7 i Z6. Change detection wymaga modelu 3D z zadania Z5, gotowego w M27, dlatego zostanie sfinalizowany w M27-M29. Harmonogram obejmuje analizę wyników Fazy A z zadania Z9 (M22-M26), korektę modeli, rekalibrację progów i aktualizację taksonomii przed Fazą B (M27-M29) oraz jedną końcową iterację w M30.</w:t>
       </w:r>
     </w:p>
     <w:p>
       <w:pPr>
-        <w:pStyle w:val="Heading3"/>
-      </w:pPr>
-      <w:r>
-        <w:t>Kamień milowy zadania 8</w:t>
+        <w:spacing w:after="60"/>
+      </w:pPr>
+      <w:r>
+        <w:rPr>
+          <w:b w:val="0"/>
+        </w:rPr>
+        <w:t>Podział odpowiedzialności z zadaniem Z9 wyklucza podwójne wykazywanie prac. Zmiany architektury i reanotacje wykona PRz w zadaniu Z8 po dostarczeniu wersji RC w M26, a rekalibrację progów i douczanie wykona Everest11 w zadaniu Z9. Zadanie korzysta z taksonomii i architektury z zadania Z3, zbioru z zadania Z2 i modelu 3D z zadania Z5, a jego komponenty zasilają kompresję w zadaniu Z7, generację PoL i PoC w zadaniu Z6 i walidację terenową w zadaniu Z9. Metodykę walidacji i zamrożony skrypt ewaluacyjny dla zadania Z9 zatwierdza odbiór metodyczny w zadaniu Z8.</w:t>
       </w:r>
     </w:p>
     <w:p>
       <w:pPr>
+        <w:pStyle w:val="Heading3"/>
+      </w:pPr>
+      <w:r>
+        <w:t>Kamień milowy zadania 8</w:t>
+      </w:r>
+    </w:p>
+    <w:p>
+      <w:pPr>
         <w:keepNext/>
         <w:spacing w:before="160" w:after="40"/>
       </w:pPr>
@@ -4202,7 +4246,7 @@
           <w:color w:val="666666"/>
           <w:sz w:val="17"/>
         </w:rPr>
-        <w:t xml:space="preserve"> [3240 z 4000 znaków]</w:t>
+        <w:t xml:space="preserve"> [3555 z 4000 znaków]</w:t>
       </w:r>
     </w:p>
     <w:p>
@@ -4213,7 +4257,7 @@
         <w:rPr>
           <w:b w:val="0"/>
         </w:rPr>
-        <w:t>Problem technologiczny. Wskaźniki uzyskane w laboratorium mogą nie utrzymać się w ruchu z powodu drgań, zmiennej temperatury, odmiennych ładunków i rzadkości zdarzeń (domain shift). Rozstrzygnięcie wymaga rejestracji w rzeczywistej eksploatacji ze zweryfikowanym ground truth.</w:t>
+        <w:t>Problem technologiczny rozwiązywany w zadaniu został zdefiniowany w sekcji Cel projektu i dotyczy przeniesienia parametrów uzyskanych w laboratorium do rzeczywistej eksploatacji. Wskaźniki mogą nie utrzymać się w ruchu z powodu drgań, zmiennej temperatury, odmiennych ładunków i rzadkości zdarzeń (domain shift). Rozstrzygnięcie wymaga rejestracji w rzeczywistej eksploatacji ze zweryfikowanym ground truth, a wynik nie jest przesądzony.</w:t>
       </w:r>
     </w:p>
     <w:p>
@@ -4224,7 +4268,7 @@
         <w:rPr>
           <w:b w:val="0"/>
         </w:rPr>
-        <w:t>Metoda. Najpierw egzemplarze zostaną zainstalowane na różnych typach naczep (standardowa 13,6 m, mega, platforma), skalibrowane, a użytkownicy przeszkoleni, przy monitorowaniu niezawodności sprzętu. Następnie KPI zostaną zwalidowane na nowych kursach naturalnych, niezależnych od danych treningowych. AUC-ROC będzie raportowane z przedziałem ufności 95% (bootstrap po kursach). Klasa jest wskaźnikiem wiążącym, gdy ma co najmniej 10 ZR naturalnych. W pozostałych przypadkach zostanie podana informacyjnie i wyliczone zostanie zbiorcze AUC dla co najmniej 30 ZR. Jeżeli po M29 będzie mniej niż 30 ZR, rejestracja zostanie przedłużona do końca M30, a wynik zaraportowany z zastrzeżeniem, zgodnie z procedurą ryzyka R2. Na koniec zostanie przeanalizowany domain shift: wskazane scenariusze o niższej dokładności, zdiagnozowane przyczyny (nowe klasy ładunku, oświetlenie) i wdrożone korekty w oknie M30 z walidacją potwierdzającą.</w:t>
+        <w:t>Zadanie ma charakter prac rozwojowych, ponieważ obejmuje walidację i dostrajanie działającego prototypu w środowisku bliskim docelowemu, a przeniesienie wskaźników z laboratorium w teren jest niepewne. Rzadkie zdarzenia i domain shift nie pozwalają przesądzić wyniku, dlatego harmonogram obejmuje nie tylko rejestrację, ale także analizę, korekty i ponowną walidację.</w:t>
       </w:r>
     </w:p>
     <w:p>
@@ -4235,7 +4279,7 @@
         <w:rPr>
           <w:b w:val="0"/>
         </w:rPr>
-        <w:t>Niezależność wyników. Zadanie ma jednego wykonawcę, a jakość wyniku zabezpiecza procedura. Inspekcję ground truth poprowadzi specjalista TSL w trybie ślepym względem predykcji, według protokołu z zadania Z3, ze zdjęciami ze znacznikiem czasu. Nie będzie on oceniał trafności alertów ani podpisywał odbioru. Alerty i predykcje będą zapisywane automatycznie w logu niemodyfikowalnym (append-only, podpis kryptograficzny). Przed Fazą B wersje modeli i skrypt ewaluacyjny zostaną zamrożone protokołem z sumą kontrolną. Ewaluację uruchomi osoba bez powiązań z Natanek Logistics i bez udziału w modelowaniu, czyli specjalista ds. cyberbezpieczeństwa, a wyniki powstaną automatycznie ze skryptu. Co najmniej 10% inspekcji zostanie powtórnie zweryfikowane na podstawie zdjęć przez drugą osobę Everest11. Protokół odbioru podpiszą kierownik B+R i kierownik zarządzający, a nie pracownik odbiorcy wdrożenia. PRz zweryfikuje metodykę walidacji i zamrożony skrypt w zadaniu Z8 (odbiór metodyczny) i nie ma w zadaniu Z9 ani prac, ani kosztów.</w:t>
+        <w:t>Metoda zakłada walidację w trzech krokach. Najpierw egzemplarze zostaną zainstalowane na różnych typach naczep (standardowa 13,6 m, mega, platforma), skalibrowane, a użytkownicy przeszkoleni, przy monitorowaniu niezawodności sprzętu. Następnie KPI zostaną zwalidowane na nowych kursach naturalnych, niezależnych od danych treningowych, a AUC-ROC będzie raportowane z przedziałem ufności 95% (bootstrap po kursach). Klasa jest wskaźnikiem wiążącym, gdy ma co najmniej 10 ZR naturalnych; w pozostałych przypadkach zostanie podana informacyjnie i wyliczone zostanie zbiorcze AUC dla co najmniej 30 ZR. Jeżeli po M29 będzie mniej niż 30 ZR, rejestracja zostanie przedłużona do końca M30, a wynik zaraportowany z zastrzeżeniem, zgodnie z procedurą ryzyka R2. Na koniec zostanie przeanalizowany domain shift: wskazane scenariusze o niższej dokładności, zdiagnozowane przyczyny (nowe klasy ładunku, oświetlenie) i wdrożone korekty w oknie M30 z walidacją potwierdzającą.</w:t>
       </w:r>
     </w:p>
     <w:p>
@@ -4246,7 +4290,7 @@
         <w:rPr>
           <w:b w:val="0"/>
         </w:rPr>
-        <w:t>Charakter prac. Zadanie ma charakter prac rozwojowych, ponieważ obejmuje walidację i dostrajanie działającego prototypu w środowisku bliskim docelowemu, a przeniesienie wskaźników z laboratorium w teren jest niepewne. Rzadkie zdarzenia i domain shift nie pozwalają przesądzić wyniku.</w:t>
+        <w:t>Niezależność wyników zapewnia procedura, ponieważ zadanie ma jednego wykonawcę. Inspekcję ground truth poprowadzi specjalista TSL w trybie ślepym względem predykcji, według protokołu z zadania Z3, ze zdjęciami ze znacznikiem czasu; nie będzie on oceniał trafności alertów ani podpisywał odbioru. Alerty i predykcje będą zapisywane automatycznie w logu niemodyfikowalnym (append-only, podpis kryptograficzny), a przed Fazą B wersje modeli i skrypt ewaluacyjny zostaną zamrożone protokołem z sumą kontrolną. Ewaluację uruchomi osoba bez powiązań z Natanek Logistics i bez udziału w modelowaniu, czyli specjalista ds. cyberbezpieczeństwa, a wyniki powstaną automatycznie ze skryptu. Co najmniej 10% inspekcji zostanie powtórnie zweryfikowane na podstawie zdjęć przez drugą osobę Everest11. Protokół odbioru podpiszą kierownik B+R i kierownik zarządzający, a nie pracownik odbiorcy wdrożenia. PRz zweryfikuje metodykę walidacji i zamrożony skrypt w zadaniu Z8 (odbiór metodyczny) i nie ma w zadaniu Z9 ani prac, ani kosztów.</w:t>
       </w:r>
     </w:p>
     <w:p>
@@ -4257,7 +4301,7 @@
         <w:rPr>
           <w:b w:val="0"/>
         </w:rPr>
-        <w:t>Uzasadnienie wyboru metody. Nowe kursy naturalne, zamrożony skrypt i log niemodyfikowalny dają niezawodny wynik, a metoda jest celowa i skuteczna, ponieważ mierzy to, co ma być potwierdzone. Wykorzystanie floty testowej zapewnia ekonomiczność. Podwykonawca zainstaluje wyłącznie finalne zestawy prototypowe i je zdemontuje, a montaż toru pomiarowego z zadania Z2 ma odrębny zakres i termin, więc nie ma podwójnego finansowania.</w:t>
+        <w:t>Wybór metody jest uzasadniony czterema względami. Nowe kursy naturalne, zamrożony skrypt i log niemodyfikowalny dają niezawodny wynik, a metoda jest celowa i skuteczna, ponieważ mierzy to, co ma być potwierdzone. Wykorzystanie floty testowej zapewnia ekonomiczność. Podwykonawca zainstaluje wyłącznie finalne zestawy prototypowe i je zdemontuje, a montaż toru pomiarowego z zadania Z2 ma odrębny zakres i termin, więc nie ma podwójnego finansowania.</w:t>
       </w:r>
     </w:p>
     <w:p>
@@ -4268,7 +4312,7 @@
         <w:rPr>
           <w:b w:val="0"/>
         </w:rPr>
-        <w:t>Powiązania. Zadanie integruje wyniki zadań Z4, Z5, Z6, Z7 i Z8. Potwierdzone KPI stanowią podstawę wskaźników rezultatu, a raport techniczny z zadania Z9 jest wejściem do prac patentowych w zadaniu Z11. Koszty zadania obejmują wynagrodzenia wymienionych osób Everest11 oraz usługę podwykonawcy.</w:t>
+        <w:t>Zadanie zamyka łańcuch prac projektu. Integruje wyniki zadań Z4, Z5, Z6, Z7 i Z8, a potwierdzone KPI stanowią podstawę wskaźników rezultatu. Raport techniczny z zadania Z9 jest wejściem do prac patentowych w zadaniu Z11, a koszty zadania obejmują wynagrodzenia wymienionych osób Everest11 oraz usługę podwykonawcy.</w:t>
       </w:r>
     </w:p>
     <w:p>
@@ -12511,7 +12555,7 @@
                 <w:b w:val="0"/>
                 <w:sz w:val="17"/>
               </w:rPr>
-              <w:t>3517/4000</w:t>
+              <w:t>3876/4000</w:t>
             </w:r>
           </w:p>
         </w:tc>
@@ -12657,7 +12701,7 @@
                 <w:b w:val="0"/>
                 <w:sz w:val="17"/>
               </w:rPr>
-              <w:t>3570/4000</w:t>
+              <w:t>3883/4000</w:t>
             </w:r>
           </w:p>
         </w:tc>
@@ -12803,7 +12847,7 @@
                 <w:b w:val="0"/>
                 <w:sz w:val="17"/>
               </w:rPr>
-              <w:t>3189/4000</w:t>
+              <w:t>3469/4000</w:t>
             </w:r>
           </w:p>
         </w:tc>
@@ -12949,7 +12993,7 @@
                 <w:b w:val="0"/>
                 <w:sz w:val="17"/>
               </w:rPr>
-              <w:t>2777/4000</w:t>
+              <w:t>3260/4000</w:t>
             </w:r>
           </w:p>
         </w:tc>
@@ -13095,7 +13139,7 @@
                 <w:b w:val="0"/>
                 <w:sz w:val="17"/>
               </w:rPr>
-              <w:t>2438/4000</w:t>
+              <w:t>3170/4000</w:t>
             </w:r>
           </w:p>
         </w:tc>
@@ -13241,7 +13285,7 @@
                 <w:b w:val="0"/>
                 <w:sz w:val="17"/>
               </w:rPr>
-              <w:t>2786/4000</w:t>
+              <w:t>3098/4000</w:t>
             </w:r>
           </w:p>
         </w:tc>
@@ -13387,7 +13431,7 @@
                 <w:b w:val="0"/>
                 <w:sz w:val="17"/>
               </w:rPr>
-              <w:t>3015/4000</w:t>
+              <w:t>3267/4000</w:t>
             </w:r>
           </w:p>
         </w:tc>
@@ -13533,7 +13577,7 @@
                 <w:b w:val="0"/>
                 <w:sz w:val="17"/>
               </w:rPr>
-              <w:t>2291/4000</w:t>
+              <w:t>3075/4000</w:t>
             </w:r>
           </w:p>
         </w:tc>
@@ -13679,7 +13723,7 @@
                 <w:b w:val="0"/>
                 <w:sz w:val="17"/>
               </w:rPr>
-              <w:t>3240/4000</w:t>
+              <w:t>3555/4000</w:t>
             </w:r>
           </w:p>
         </w:tc>

</xml_diff>

<commit_message>
Ryzyka R1-R5, R9-R12 w nowym stylu, dolaczone do pliku z opisami zadan
Co-Authored-By: Claude Sonnet 5.5 <noreply@anthropic.com>
Claude-Session: https://claude.ai/code/session_01672WnJhixnEcarbb7uiwfx
</commit_message>
<xml_diff>
--- a/Opisy_zadan_z_kamieniami_milowymi.docx
+++ b/Opisy_zadan_z_kamieniami_milowymi.docx
@@ -4635,6 +4635,1454 @@
           <w:b w:val="0"/>
         </w:rPr>
         <w:t xml:space="preserve"> po oknie korekt. Wtedy ograniczamy zakres wdrożenia do klas i funkcji spełniających progi i aktualizujemy wskaźniki rezultatu.</w:t>
+      </w:r>
+    </w:p>
+    <w:p>
+      <w:r>
+        <w:br w:type="page"/>
+      </w:r>
+    </w:p>
+    <w:p>
+      <w:pPr>
+        <w:pStyle w:val="Heading1"/>
+      </w:pPr>
+      <w:r>
+        <w:t>Część druga. Ryzyka do wklejenia (R1-R5, R9-R12)</w:t>
+      </w:r>
+    </w:p>
+    <w:p>
+      <w:pPr>
+        <w:spacing w:after="60"/>
+      </w:pPr>
+      <w:r>
+        <w:rPr>
+          <w:b w:val="0"/>
+        </w:rPr>
+        <w:t>Pola ryzyk w kolejności z Instrukcji: nazwa, opis ryzyka (z prawdopodobieństwem i wpływem), sposoby zapobiegania i minimalizacji skutków. Ryzyka R6, R7 i R8 nie były przedmiotem tej wersji i pozostają bez zmian. R10, R11 i R12 są nowe i odpowiadają uwagom 25, 31 i 32.</w:t>
+      </w:r>
+    </w:p>
+    <w:p>
+      <w:pPr>
+        <w:pStyle w:val="Heading2"/>
+      </w:pPr>
+      <w:r>
+        <w:t>R1</w:t>
+      </w:r>
+    </w:p>
+    <w:p>
+      <w:r>
+        <w:rPr>
+          <w:color w:val="666666"/>
+        </w:rPr>
+        <w:t>Rodzaj ryzyka: badawcze/technologiczne</w:t>
+      </w:r>
+    </w:p>
+    <w:p>
+      <w:pPr>
+        <w:keepNext/>
+        <w:spacing w:before="160" w:after="40"/>
+      </w:pPr>
+      <w:r>
+        <w:rPr>
+          <w:b/>
+          <w:sz w:val="20"/>
+        </w:rPr>
+        <w:t>Nazwa ryzyka</w:t>
+      </w:r>
+      <w:r>
+        <w:rPr>
+          <w:color w:val="666666"/>
+          <w:sz w:val="17"/>
+        </w:rPr>
+        <w:t xml:space="preserve"> [139 z 200 znaków]</w:t>
+      </w:r>
+    </w:p>
+    <w:p>
+      <w:pPr>
+        <w:spacing w:after="60"/>
+        <w:shd w:val="clear" w:color="auto" w:fill="FBF3E6"/>
+      </w:pPr>
+      <w:r>
+        <w:rPr>
+          <w:b w:val="0"/>
+        </w:rPr>
+        <w:t>Niewystarczająca dokładność rekonstrukcji 3D przestrzeni ładunkowej z powodu interferencji kamer ToF i drgań naczepy (zadania Z1 i Z5) - R1</w:t>
+      </w:r>
+    </w:p>
+    <w:p>
+      <w:pPr>
+        <w:keepNext/>
+        <w:spacing w:before="160" w:after="40"/>
+      </w:pPr>
+      <w:r>
+        <w:rPr>
+          <w:b/>
+          <w:sz w:val="20"/>
+        </w:rPr>
+        <w:t>Opis ryzyka</w:t>
+      </w:r>
+      <w:r>
+        <w:rPr>
+          <w:color w:val="666666"/>
+          <w:sz w:val="17"/>
+        </w:rPr>
+        <w:t xml:space="preserve"> [1238 z 2000 znaków]</w:t>
+      </w:r>
+    </w:p>
+    <w:p>
+      <w:pPr>
+        <w:spacing w:after="60"/>
+        <w:shd w:val="clear" w:color="auto" w:fill="FBF3E6"/>
+      </w:pPr>
+      <w:r>
+        <w:rPr>
+          <w:b w:val="0"/>
+        </w:rPr>
+        <w:t xml:space="preserve">Ryzyko dotyczy badań przemysłowych w zadaniu Z1 i prac rozwojowych w zadaniu Z5, realizowanych przez PRz. Polega na możliwości nieosiągnięcia parametrów kamieni milowych KM-Z1 i KM-Z5: pokrycia co najmniej 95% objętości przestrzeni ładunkowej (83,7 m3 z 88,1 m3) przy nie więcej niż 4 kamerach, mediany błędu pozycji ładunku nie większej niż 0,30 m i percentyla 95 nie większego niż 0,35 m, mediany błędu przemieszczenia względnego nie większej niż </w:t>
+      </w:r>
+      <w:r>
+        <w:rPr>
+          <w:b w:val="0"/>
+          <w:highlight w:val="yellow"/>
+        </w:rPr>
+        <w:t>0,03 m</w:t>
+      </w:r>
+      <w:r>
+        <w:rPr>
+          <w:b w:val="0"/>
+        </w:rPr>
+        <w:t>, redukcji RMSE głębi o co najmniej 50% oraz częstotliwości aktualizacji modelu 3D co najmniej 5 Hz. Niepewność ma dwa źródła. Pierwszym są interferencje kamer ToF (MCI) i błędy wielościeżkowe (MPI) w zamkniętej, metalowej przestrzeni, których nie opisano w literaturze dla takiego środowiska. Drugim jest kompensacja drgań o częstotliwości od 8 do 25 Hz przy łączeniu map głębi, ponieważ metody ToF-IMU i Visual SLAM walidowano dla scen otwartych. Prawdopodobieństwo wystąpienia ryzyka jest średnie. Skutkiem byłaby niższa dokładność modelu 3D, czyli gorsza jakość rezultatu i danych wejściowych dla zadań Z4 i Z8, a także możliwe wydłużenie prac i zawężenie zakresu. Ryzyko dotyczy wprost cechy innowacyjnej „model 3D z wielu kamer w czasie rzeczywistym” i wskaźnika błędu pozycji.</w:t>
+      </w:r>
+    </w:p>
+    <w:p>
+      <w:pPr>
+        <w:keepNext/>
+        <w:spacing w:before="160" w:after="40"/>
+      </w:pPr>
+      <w:r>
+        <w:rPr>
+          <w:b/>
+          <w:sz w:val="20"/>
+        </w:rPr>
+        <w:t>Sposoby zapobiegania i minimalizacji skutków</w:t>
+      </w:r>
+      <w:r>
+        <w:rPr>
+          <w:color w:val="666666"/>
+          <w:sz w:val="17"/>
+        </w:rPr>
+        <w:t xml:space="preserve"> [1334 z 2000 znaków]</w:t>
+      </w:r>
+    </w:p>
+    <w:p>
+      <w:pPr>
+        <w:spacing w:after="60"/>
+        <w:shd w:val="clear" w:color="auto" w:fill="FBF3E6"/>
+      </w:pPr>
+      <w:r>
+        <w:rPr>
+          <w:b w:val="0"/>
+        </w:rPr>
+        <w:t>Ryzyku zapobiegają trzy działania. Eksperyment MCI i MPI w zadaniu Z1 wyznacza wartość bazową błędu głębi i konfigurację kamer, zanim zostaną zainstrumentowane pojazdy. Algorytm adaptacyjny MCI i kompensacja drgań strojona do widma od 8 do 25 Hz powstają w zadaniu Z5. Referencja fotogrametryczna jest stosowana na stanowisku wibracyjnym w zadaniu Z5 i w terenie co około 500 km w zadaniu Z9.</w:t>
+      </w:r>
+    </w:p>
+    <w:p>
+      <w:pPr>
+        <w:spacing w:after="60"/>
+        <w:shd w:val="clear" w:color="auto" w:fill="FBF3E6"/>
+      </w:pPr>
+      <w:r>
+        <w:rPr>
+          <w:b w:val="0"/>
+        </w:rPr>
+        <w:t>Skutki ryzyka ograniczamy w ustalonej kolejności. Pierwszym krokiem są nie więcej niż 2 iteracje korekcyjne, każda w oknie od 4 do 6 tygodni przed danym kamieniem milowym. Pokrycie od 85% do 95% oznacza wariant zawężony z wyłączeniem stref niekrytycznych (narożniki), a mediana błędu pozycji od 0,30 do 0,50 m daje lokalizację ładunku z dokładnością do strefy, z zachowaniem wykrywania przemieszczeń względnych od 0,10 m. Wariant zawężony zachowuje cechy innowacyjne, a wskaźnik błędu pozycji i pokrycia aktualizujemy w trybie zmiany projektu.</w:t>
+      </w:r>
+    </w:p>
+    <w:p>
+      <w:pPr>
+        <w:spacing w:after="60"/>
+        <w:shd w:val="clear" w:color="auto" w:fill="FBF3E6"/>
+      </w:pPr>
+      <w:r>
+        <w:rPr>
+          <w:b w:val="0"/>
+        </w:rPr>
+        <w:t xml:space="preserve">Warunki no-go po dwóch iteracjach: pokrycie mniejsze niż </w:t>
+      </w:r>
+      <w:r>
+        <w:rPr>
+          <w:b w:val="0"/>
+          <w:highlight w:val="yellow"/>
+        </w:rPr>
+        <w:t>85%</w:t>
+      </w:r>
+      <w:r>
+        <w:rPr>
+          <w:b w:val="0"/>
+        </w:rPr>
+        <w:t xml:space="preserve"> w każdym wariancie do 4 kamer albo mediana błędu pozycji większa niż </w:t>
+      </w:r>
+      <w:r>
+        <w:rPr>
+          <w:b w:val="0"/>
+          <w:highlight w:val="yellow"/>
+        </w:rPr>
+        <w:t>0,50 m</w:t>
+      </w:r>
+      <w:r>
+        <w:rPr>
+          <w:b w:val="0"/>
+        </w:rPr>
+        <w:t xml:space="preserve"> (ponad połowa szerokości europalety) albo redukcja RMSE mniejsza niż </w:t>
+      </w:r>
+      <w:r>
+        <w:rPr>
+          <w:b w:val="0"/>
+          <w:highlight w:val="yellow"/>
+        </w:rPr>
+        <w:t>30%</w:t>
+      </w:r>
+      <w:r>
+        <w:rPr>
+          <w:b w:val="0"/>
+        </w:rPr>
+        <w:t>. Decyzję podejmuje komitet sterujący w M9 (zadanie Z1) lub w M27 (zadanie Z5): zmienia architekturę sensoryczną, na przykład na kamery EO ze światłem strukturalnym, albo przerywa zadanie.</w:t>
+      </w:r>
+    </w:p>
+    <w:p>
+      <w:pPr>
+        <w:pStyle w:val="Heading2"/>
+      </w:pPr>
+      <w:r>
+        <w:t>R2</w:t>
+      </w:r>
+    </w:p>
+    <w:p>
+      <w:r>
+        <w:rPr>
+          <w:color w:val="666666"/>
+        </w:rPr>
+        <w:t>Rodzaj ryzyka: badawcze/technologiczne</w:t>
+      </w:r>
+    </w:p>
+    <w:p>
+      <w:pPr>
+        <w:keepNext/>
+        <w:spacing w:before="160" w:after="40"/>
+      </w:pPr>
+      <w:r>
+        <w:rPr>
+          <w:b/>
+          <w:sz w:val="20"/>
+        </w:rPr>
+        <w:t>Nazwa ryzyka</w:t>
+      </w:r>
+      <w:r>
+        <w:rPr>
+          <w:color w:val="666666"/>
+          <w:sz w:val="17"/>
+        </w:rPr>
+        <w:t xml:space="preserve"> [165 z 200 znaków]</w:t>
+      </w:r>
+    </w:p>
+    <w:p>
+      <w:pPr>
+        <w:spacing w:after="60"/>
+        <w:shd w:val="clear" w:color="auto" w:fill="FBF3E6"/>
+      </w:pPr>
+      <w:r>
+        <w:rPr>
+          <w:b w:val="0"/>
+        </w:rPr>
+        <w:t>Nieosiągnięcie AUC-ROC co najmniej 0,85 modelu predykcji ryzyka uszkodzenia ładunku z powodu niezbalansowania klas i braku zbioru treningowego (zadania Z2 i Z4) - R2</w:t>
+      </w:r>
+    </w:p>
+    <w:p>
+      <w:pPr>
+        <w:keepNext/>
+        <w:spacing w:before="160" w:after="40"/>
+      </w:pPr>
+      <w:r>
+        <w:rPr>
+          <w:b/>
+          <w:sz w:val="20"/>
+        </w:rPr>
+        <w:t>Opis ryzyka</w:t>
+      </w:r>
+      <w:r>
+        <w:rPr>
+          <w:color w:val="666666"/>
+          <w:sz w:val="17"/>
+        </w:rPr>
+        <w:t xml:space="preserve"> [1152 z 2000 znaków]</w:t>
+      </w:r>
+    </w:p>
+    <w:p>
+      <w:pPr>
+        <w:spacing w:after="60"/>
+        <w:shd w:val="clear" w:color="auto" w:fill="FBF3E6"/>
+      </w:pPr>
+      <w:r>
+        <w:rPr>
+          <w:b w:val="0"/>
+        </w:rPr>
+        <w:t xml:space="preserve">Ryzyko dotyczy badań przemysłowych w zadaniu Z2 (zbiór danych, Everest11) i prac rozwojowych w zadaniu Z4 (model, PRz). Polega na możliwości nieosiągnięcia AUC-ROC co najmniej 0,85 dla co najmniej 3 klas ładunku przez model FP32 na teście naturalnym. Niepewność potwierdza luka badawcza: przeszukanie IEEE Xplore, Scopus i Google Scholar (maj 2026) nie wykazało modelu ML ryzyka uszkodzenia z sygnałów in-transit z klasą ładunku i kumulacją narażenia, a Neupane i in. (2025) wskazują brak wspólnej metodyki dla niezbalansowania. Problemy są dwa. Zdarzenia są rzadkie (uszkodzenia w 1-3% przesyłek, stosunek klas 1:30-1:100), więc zdarzeń naturalnych nie wystarczy do progu liczności: spodziewamy się </w:t>
+      </w:r>
+      <w:r>
+        <w:rPr>
+          <w:b w:val="0"/>
+          <w:highlight w:val="yellow"/>
+        </w:rPr>
+        <w:t>20-40</w:t>
+      </w:r>
+      <w:r>
+        <w:rPr>
+          <w:b w:val="0"/>
+        </w:rPr>
+        <w:t xml:space="preserve"> ZR naturalnych w zadaniu Z2 przy co najmniej 50 kursach, około </w:t>
+      </w:r>
+      <w:r>
+        <w:rPr>
+          <w:b w:val="0"/>
+          <w:highlight w:val="yellow"/>
+        </w:rPr>
+        <w:t>8</w:t>
+      </w:r>
+      <w:r>
+        <w:rPr>
+          <w:b w:val="0"/>
+        </w:rPr>
+        <w:t xml:space="preserve"> przesyłkach na kurs i częstości ZR </w:t>
+      </w:r>
+      <w:r>
+        <w:rPr>
+          <w:b w:val="0"/>
+          <w:highlight w:val="yellow"/>
+        </w:rPr>
+        <w:t>5-10%</w:t>
+      </w:r>
+      <w:r>
+        <w:rPr>
+          <w:b w:val="0"/>
+        </w:rPr>
+        <w:t>, a próg to 50 ZR na klasę, razem 250, uzupełniane scenariuszami kontrolowanymi. Ponadto nie ma publicznego zbioru danych. Prawdopodobieństwo jest średnie do podwyższonego. Skutkiem byłaby niższa jakość funkcji predykcji ryzyka, czyli cechy innowacyjnej „predykcja ryzyka z klasą ładunku”, oraz opóźnienie modelowania przy niedoborze danych.</w:t>
+      </w:r>
+    </w:p>
+    <w:p>
+      <w:pPr>
+        <w:keepNext/>
+        <w:spacing w:before="160" w:after="40"/>
+      </w:pPr>
+      <w:r>
+        <w:rPr>
+          <w:b/>
+          <w:sz w:val="20"/>
+        </w:rPr>
+        <w:t>Sposoby zapobiegania i minimalizacji skutków</w:t>
+      </w:r>
+      <w:r>
+        <w:rPr>
+          <w:color w:val="666666"/>
+          <w:sz w:val="17"/>
+        </w:rPr>
+        <w:t xml:space="preserve"> [1683 z 2000 znaków]</w:t>
+      </w:r>
+    </w:p>
+    <w:p>
+      <w:pPr>
+        <w:spacing w:after="60"/>
+        <w:shd w:val="clear" w:color="auto" w:fill="FBF3E6"/>
+      </w:pPr>
+      <w:r>
+        <w:rPr>
+          <w:b w:val="0"/>
+        </w:rPr>
+        <w:t>Ryzyku zapobiegamy pięcioma działaniami. W zadaniu Z2 dane są gromadzone wcześnie i w sposób ciągły, z protokołem inspekcji ślepej. Zdarzenie ryzyka jest zdefiniowane jako uszkodzenie albo przemieszczenie o co najmniej 0,10 m potwierdzone inspekcją, co zwiększa liczność przy etykiecie niezależnej od sygnałów. Techniki uczenia przy niezbalansowaniu (SMOTE, ADASYN, funkcja straty zależna od kosztu błędu, zespoły modeli) są porównywane z badaniem ablacyjnym. Dane kontrolowane i syntetyczne trafiają tylko do treningu i osobnego testu kontrolowanego, a test naturalny i walidacja w zadaniu Z9 używają wyłącznie danych naturalnych (co najmniej 30 ZR, co najmniej 10 na klasę). AUC-ROC i AUC-PR są raportowane z przedziałem ufności 95%.</w:t>
+      </w:r>
+    </w:p>
+    <w:p>
+      <w:pPr>
+        <w:spacing w:after="60"/>
+        <w:shd w:val="clear" w:color="auto" w:fill="FBF3E6"/>
+      </w:pPr>
+      <w:r>
+        <w:rPr>
+          <w:b w:val="0"/>
+        </w:rPr>
+        <w:t>Skutki ograniczamy tak: wykonujemy nie więcej niż 2 iteracje korekcyjne w oknie od 4 do 6 tygodni przed KM-Z4, a przy niedoborze zdarzeń prowadzimy drugą kampanię kontrolowaną i wydłużamy rejestrację w ramach zadania Z2. Wariant zawężony to 2 klasy ładunku (kruchy, wrażliwy temperaturowo) z AUC-ROC co najmniej 0,85, opisany jako udokumentowany wyjątek, a nie jako alternatywna definicja wskaźnika. Zachowuje cechy innowacyjne, a wskaźnik co najmniej 3 klas aktualizujemy w trybie zmiany projektu. W zadaniu Z9 oczekujemy AUC-ROC po kompresji co najmniej 0,82, czyli spadku nie większego niż 3 punkty procentowe.</w:t>
+      </w:r>
+    </w:p>
+    <w:p>
+      <w:pPr>
+        <w:spacing w:after="60"/>
+        <w:shd w:val="clear" w:color="auto" w:fill="FBF3E6"/>
+      </w:pPr>
+      <w:r>
+        <w:rPr>
+          <w:b w:val="0"/>
+        </w:rPr>
+        <w:t xml:space="preserve">Warunki no-go: AUC-ROC mniejsze niż </w:t>
+      </w:r>
+      <w:r>
+        <w:rPr>
+          <w:b w:val="0"/>
+          <w:highlight w:val="yellow"/>
+        </w:rPr>
+        <w:t>0,75</w:t>
+      </w:r>
+      <w:r>
+        <w:rPr>
+          <w:b w:val="0"/>
+        </w:rPr>
+        <w:t xml:space="preserve"> w każdej klasie po dwóch iteracjach, albo przyrost AUC względem detektora progowego mniejszy niż </w:t>
+      </w:r>
+      <w:r>
+        <w:rPr>
+          <w:b w:val="0"/>
+          <w:highlight w:val="yellow"/>
+        </w:rPr>
+        <w:t>0,05</w:t>
+      </w:r>
+      <w:r>
+        <w:rPr>
+          <w:b w:val="0"/>
+        </w:rPr>
+        <w:t xml:space="preserve">, albo mniej niż </w:t>
+      </w:r>
+      <w:r>
+        <w:rPr>
+          <w:b w:val="0"/>
+          <w:highlight w:val="yellow"/>
+        </w:rPr>
+        <w:t>30</w:t>
+      </w:r>
+      <w:r>
+        <w:rPr>
+          <w:b w:val="0"/>
+        </w:rPr>
+        <w:t xml:space="preserve"> ZR łącznie w co najmniej 3 klasach. Decyzję podejmuje komitet sterujący w M18 (zadanie Z2) lub w M27 (zadanie Z4): ogranicza zakres funkcji albo przerywa zadanie modelowe.</w:t>
+      </w:r>
+    </w:p>
+    <w:p>
+      <w:pPr>
+        <w:pStyle w:val="Heading2"/>
+      </w:pPr>
+      <w:r>
+        <w:t>R3</w:t>
+      </w:r>
+    </w:p>
+    <w:p>
+      <w:r>
+        <w:rPr>
+          <w:color w:val="666666"/>
+        </w:rPr>
+        <w:t>Rodzaj ryzyka: badawcze/technologiczne</w:t>
+      </w:r>
+    </w:p>
+    <w:p>
+      <w:pPr>
+        <w:keepNext/>
+        <w:spacing w:before="160" w:after="40"/>
+      </w:pPr>
+      <w:r>
+        <w:rPr>
+          <w:b/>
+          <w:sz w:val="20"/>
+        </w:rPr>
+        <w:t>Nazwa ryzyka</w:t>
+      </w:r>
+      <w:r>
+        <w:rPr>
+          <w:color w:val="666666"/>
+          <w:sz w:val="17"/>
+        </w:rPr>
+        <w:t xml:space="preserve"> [160 z 200 znaków]</w:t>
+      </w:r>
+    </w:p>
+    <w:p>
+      <w:pPr>
+        <w:spacing w:after="60"/>
+        <w:shd w:val="clear" w:color="auto" w:fill="FBF3E6"/>
+      </w:pPr>
+      <w:r>
+        <w:rPr>
+          <w:b w:val="0"/>
+        </w:rPr>
+        <w:t>Nieosiągnięcie mAP co najmniej 0,75 wizyjnej detekcji zabezpieczeń ładunku z powodu braku taksonomii i zbioru oraz okluzji w ruchomej naczepie (zadanie Z8) - R3</w:t>
+      </w:r>
+    </w:p>
+    <w:p>
+      <w:pPr>
+        <w:keepNext/>
+        <w:spacing w:before="160" w:after="40"/>
+      </w:pPr>
+      <w:r>
+        <w:rPr>
+          <w:b/>
+          <w:sz w:val="20"/>
+        </w:rPr>
+        <w:t>Opis ryzyka</w:t>
+      </w:r>
+      <w:r>
+        <w:rPr>
+          <w:color w:val="666666"/>
+          <w:sz w:val="17"/>
+        </w:rPr>
+        <w:t xml:space="preserve"> [1091 z 2000 znaków]</w:t>
+      </w:r>
+    </w:p>
+    <w:p>
+      <w:pPr>
+        <w:spacing w:after="60"/>
+        <w:shd w:val="clear" w:color="auto" w:fill="FBF3E6"/>
+      </w:pPr>
+      <w:r>
+        <w:rPr>
+          <w:b w:val="0"/>
+        </w:rPr>
+        <w:t>Ryzyko dotyczy prac rozwojowych w zadaniu Z8, realizowanych przez PRz. Polega na możliwości nieosiągnięcia mAP przy IoU 0,50 co najmniej 0,75 dla co najmniej 5 klas zabezpieczeń na zbiorze testowym co najmniej 2000 obrazów oraz F1 modułu change detection co najmniej 0,85 dla przemieszczeń od 0,10 m. Brakuje punktu odniesienia, ponieważ żaden system ani żadna praca naukowa nie realizuje wizyjnej weryfikacji mocowania w ruchomej naczepie, a rozwiązanie magazynowe (Ega, 2025) dotyczy środowiska statycznego. Problemy są trzy: brak taksonomii klas zabezpieczeń zgodnej z EN 12195 (opracowanie w zadaniu Z3, walidacja współczynnikiem kappa co najmniej 0,80), brak zbioru obrazowego (zadanie Z2) oraz okluzje, zmienne oświetlenie NIR i drgania, które wymagają adaptacji domenowej niewalidowanej dla tej kombinacji. Prawdopodobieństwo jest średnie do podwyższonego. Skutkiem byłaby niższa wiarygodność dowodu PoL, gorsza jakość rezultatu i możliwe wydłużenie prac przy rozbudowie zbioru lub taksonomii. Ryzyko dotyczy cechy innowacyjnej „automatyczna weryfikacja zabezpieczeń” i wskaźnika mAP.</w:t>
+      </w:r>
+    </w:p>
+    <w:p>
+      <w:pPr>
+        <w:keepNext/>
+        <w:spacing w:before="160" w:after="40"/>
+      </w:pPr>
+      <w:r>
+        <w:rPr>
+          <w:b/>
+          <w:sz w:val="20"/>
+        </w:rPr>
+        <w:t>Sposoby zapobiegania i minimalizacji skutków</w:t>
+      </w:r>
+      <w:r>
+        <w:rPr>
+          <w:color w:val="666666"/>
+          <w:sz w:val="17"/>
+        </w:rPr>
+        <w:t xml:space="preserve"> [1329 z 2000 znaków]</w:t>
+      </w:r>
+    </w:p>
+    <w:p>
+      <w:pPr>
+        <w:spacing w:after="60"/>
+        <w:shd w:val="clear" w:color="auto" w:fill="FBF3E6"/>
+      </w:pPr>
+      <w:r>
+        <w:rPr>
+          <w:b w:val="0"/>
+        </w:rPr>
+        <w:t>Ryzyku zapobiegamy pięcioma działaniami. Taksonomia powstaje z konsultacją ekspertów TSL przed anotacją i jest walidowana współczynnikiem kappa na próbie pilotażowej w M10. Anotacja zbioru jest etapowa, z kontrolą zgodności. Stosujemy augmentację domenową (rozmycie od drgań, domena NIR, okluzje) i transfer learning z modeli pretrenowanych. Ewaluacja odbywa się na zbiorze testowym i etykietach z inspekcji z zadania Z2. Wersja release candidate jest gotowa w M26, co pozwala na wczesną iterację korekt.</w:t>
+      </w:r>
+    </w:p>
+    <w:p>
+      <w:pPr>
+        <w:spacing w:after="60"/>
+        <w:shd w:val="clear" w:color="auto" w:fill="FBF3E6"/>
+      </w:pPr>
+      <w:r>
+        <w:rPr>
+          <w:b w:val="0"/>
+        </w:rPr>
+        <w:t>Skutki ograniczamy tak: wykonujemy nie więcej niż 2 iteracje w oknie od 4 do 6 tygodni przed M26, a dla zadania Z8 przy terminie M30 mieści się jedna iteracja trwająca około 4 tygodnie po Fazie B. Wariant zawężony to co najmniej 3 z 5 klas, z priorytetem dla pasów i klinów (EN 12195), jako najbardziej uniwersalnych zabezpieczeń, a siatki, separatory i blokady są pierwszymi klasami do odrzucenia. Wariant jest udokumentowanym wyjątkiem, zachowuje automatyczną weryfikację kluczowych zabezpieczeń, a wskaźnik co najmniej 5 klas aktualizujemy w trybie zmiany projektu.</w:t>
+      </w:r>
+    </w:p>
+    <w:p>
+      <w:pPr>
+        <w:spacing w:after="60"/>
+        <w:shd w:val="clear" w:color="auto" w:fill="FBF3E6"/>
+      </w:pPr>
+      <w:r>
+        <w:rPr>
+          <w:b w:val="0"/>
+        </w:rPr>
+        <w:t xml:space="preserve">Warunki no-go: mAP mniejsze niż </w:t>
+      </w:r>
+      <w:r>
+        <w:rPr>
+          <w:b w:val="0"/>
+          <w:highlight w:val="yellow"/>
+        </w:rPr>
+        <w:t>0,60</w:t>
+      </w:r>
+      <w:r>
+        <w:rPr>
+          <w:b w:val="0"/>
+        </w:rPr>
+        <w:t xml:space="preserve"> dla pasów lub klinów albo F1 change detection mniejsze niż </w:t>
+      </w:r>
+      <w:r>
+        <w:rPr>
+          <w:b w:val="0"/>
+          <w:highlight w:val="yellow"/>
+        </w:rPr>
+        <w:t>0,70</w:t>
+      </w:r>
+      <w:r>
+        <w:rPr>
+          <w:b w:val="0"/>
+        </w:rPr>
+        <w:t xml:space="preserve"> po iteracjach. Decyzję podejmuje komitet sterujący w M26 (wersja RC) i w M30 (końcowa): ogranicza zakres funkcji CV albo wydziela je do prac po projekcie.</w:t>
+      </w:r>
+    </w:p>
+    <w:p>
+      <w:pPr>
+        <w:pStyle w:val="Heading2"/>
+      </w:pPr>
+      <w:r>
+        <w:t>R4</w:t>
+      </w:r>
+    </w:p>
+    <w:p>
+      <w:r>
+        <w:rPr>
+          <w:color w:val="666666"/>
+        </w:rPr>
+        <w:t>Rodzaj ryzyka: badawcze/technologiczne</w:t>
+      </w:r>
+    </w:p>
+    <w:p>
+      <w:pPr>
+        <w:keepNext/>
+        <w:spacing w:before="160" w:after="40"/>
+      </w:pPr>
+      <w:r>
+        <w:rPr>
+          <w:b/>
+          <w:sz w:val="20"/>
+        </w:rPr>
+        <w:t>Nazwa ryzyka</w:t>
+      </w:r>
+      <w:r>
+        <w:rPr>
+          <w:color w:val="666666"/>
+          <w:sz w:val="17"/>
+        </w:rPr>
+        <w:t xml:space="preserve"> [176 z 200 znaków]</w:t>
+      </w:r>
+    </w:p>
+    <w:p>
+      <w:pPr>
+        <w:spacing w:after="60"/>
+        <w:shd w:val="clear" w:color="auto" w:fill="FBF3E6"/>
+      </w:pPr>
+      <w:r>
+        <w:rPr>
+          <w:b w:val="0"/>
+        </w:rPr>
+        <w:t>Niedotrzymanie opóźnienia alertu, wydajności obliczeniowej i odporności środowiskowej po kompresji modeli AI oraz brak potwierdzenia w testach terenowych (zadania Z7 i Z9) - R4</w:t>
+      </w:r>
+    </w:p>
+    <w:p>
+      <w:pPr>
+        <w:keepNext/>
+        <w:spacing w:before="160" w:after="40"/>
+      </w:pPr>
+      <w:r>
+        <w:rPr>
+          <w:b/>
+          <w:sz w:val="20"/>
+        </w:rPr>
+        <w:t>Opis ryzyka</w:t>
+      </w:r>
+      <w:r>
+        <w:rPr>
+          <w:color w:val="666666"/>
+          <w:sz w:val="17"/>
+        </w:rPr>
+        <w:t xml:space="preserve"> [1047 z 2000 znaków]</w:t>
+      </w:r>
+    </w:p>
+    <w:p>
+      <w:pPr>
+        <w:spacing w:after="60"/>
+        <w:shd w:val="clear" w:color="auto" w:fill="FBF3E6"/>
+      </w:pPr>
+      <w:r>
+        <w:rPr>
+          <w:b w:val="0"/>
+        </w:rPr>
+        <w:t>Ryzyko dotyczy prac rozwojowych w zadaniu Z7 i testów terenowych w zadaniu Z9, realizowanych przez Everest11 (TRL 7 do 8). Polega na możliwości, że kompresja modeli (INT8, przycinanie, destylacja) nie utrzyma jednocześnie opóźnienia alertu lokalnego (percentyl 95 nie większy niż 1 s, bez łączności), degradacji dokładności nie większej niż 3 punkty procentowe (AUC-ROC co najmniej 0,82, mAP co najmniej 0,72), częstotliwości aktualizacji modelu 3D co najmniej 5 Hz oraz wymagań energetycznych, termicznych i środowiskowych (IP67, od -25 do +70 °C, drgania ISO 8608 klasy D). Ponadto modele potwierdzone w laboratorium mogą nie utrzymać dokładności w ruchu (domain shift) na co najmniej 3 pojazdach. Prawdopodobieństwo jest średnie. Skutkiem byłaby niższa jakość alertu offline, czyli cechy innowacyjnej, a negatywne wyniki terenowe mogłyby wymusić powrót do prac rozwojowych i wydłużyć realizację. Wydajność jednostki w operacjach na sekundę (40 TOPS w INT8, czyli 4 razy 10 do potęgi 13 na sekundę) jest jednostką branżową bez odpowiednika w SI.</w:t>
+      </w:r>
+    </w:p>
+    <w:p>
+      <w:pPr>
+        <w:keepNext/>
+        <w:spacing w:before="160" w:after="40"/>
+      </w:pPr>
+      <w:r>
+        <w:rPr>
+          <w:b/>
+          <w:sz w:val="20"/>
+        </w:rPr>
+        <w:t>Sposoby zapobiegania i minimalizacji skutków</w:t>
+      </w:r>
+      <w:r>
+        <w:rPr>
+          <w:color w:val="666666"/>
+          <w:sz w:val="17"/>
+        </w:rPr>
+        <w:t xml:space="preserve"> [1424 z 2000 znaków]</w:t>
+      </w:r>
+    </w:p>
+    <w:p>
+      <w:pPr>
+        <w:spacing w:after="60"/>
+        <w:shd w:val="clear" w:color="auto" w:fill="FBF3E6"/>
+      </w:pPr>
+      <w:r>
+        <w:rPr>
+          <w:b w:val="0"/>
+        </w:rPr>
+        <w:t>Ryzyku zapobiegamy czterema działaniami. Modele są trenowane z uwzględnieniem ograniczeń sprzętowych i profilowane na docelowej platformie o wydajności co najmniej 40 TOPS. Warianty kompresji są porównywane z kontrolą spadku dokładności względem FP32. Testy stanowiskowe (rig wibracyjny, komora termiczna, EMC) odbywają się przed zadaniem Z9. Testy terenowe są etapowe, na rosnącej liczbie pojazdów, z logowaniem opóźnienia (mediana, percentyl 95) i dokładności.</w:t>
+      </w:r>
+    </w:p>
+    <w:p>
+      <w:pPr>
+        <w:spacing w:after="60"/>
+        <w:shd w:val="clear" w:color="auto" w:fill="FBF3E6"/>
+      </w:pPr>
+      <w:r>
+        <w:rPr>
+          <w:b w:val="0"/>
+        </w:rPr>
+        <w:t>Skutki ograniczamy tak: wykonujemy nie więcej niż 2 iteracje w oknie od 4 do 6 tygodni przed M27 (silniejsza kompresja, batching, TensorRT, mieszana precyzja albo mocniejszy moduł). Wariant zawężony polega na uruchomieniu na platformie embedded modelu ML ryzyka i alertu, przy CV po stronie TMS, co zachowuje funkcję alertu offline, a wskaźnik opóźnienia dotyczy wtedy modelu ML i jest aktualizowany w trybie zmiany projektu. Przy domain shift w zadaniu Z9 wykonujemy rekalibrację progów i douczenie w oknie M30 oraz walidację potwierdzającą.</w:t>
+      </w:r>
+    </w:p>
+    <w:p>
+      <w:pPr>
+        <w:spacing w:after="60"/>
+        <w:shd w:val="clear" w:color="auto" w:fill="FBF3E6"/>
+      </w:pPr>
+      <w:r>
+        <w:rPr>
+          <w:b w:val="0"/>
+        </w:rPr>
+        <w:t xml:space="preserve">Warunki no-go po dwóch iteracjach: opóźnienie w percentylu 95 większe niż </w:t>
+      </w:r>
+      <w:r>
+        <w:rPr>
+          <w:b w:val="0"/>
+          <w:highlight w:val="yellow"/>
+        </w:rPr>
+        <w:t>2 s</w:t>
+      </w:r>
+      <w:r>
+        <w:rPr>
+          <w:b w:val="0"/>
+        </w:rPr>
+        <w:t xml:space="preserve"> albo degradacja większa niż </w:t>
+      </w:r>
+      <w:r>
+        <w:rPr>
+          <w:b w:val="0"/>
+          <w:highlight w:val="yellow"/>
+        </w:rPr>
+        <w:t>6 punktów procentowych</w:t>
+      </w:r>
+      <w:r>
+        <w:rPr>
+          <w:b w:val="0"/>
+        </w:rPr>
+        <w:t xml:space="preserve"> albo częstotliwość modelu 3D mniejsza niż </w:t>
+      </w:r>
+      <w:r>
+        <w:rPr>
+          <w:b w:val="0"/>
+          <w:highlight w:val="yellow"/>
+        </w:rPr>
+        <w:t>2 Hz</w:t>
+      </w:r>
+      <w:r>
+        <w:rPr>
+          <w:b w:val="0"/>
+        </w:rPr>
+        <w:t>. Decyzję podejmuje komitet sterujący w M27: zmienia platformę sprzętową lub zakres funkcji offline albo przerywa zadanie. Parametry sprzętowe można potwierdzić stanowiskowo, ale AUC-ROC i mAP na zdarzeniach naturalnych są niezbędne dla TRL 8.</w:t>
+      </w:r>
+    </w:p>
+    <w:p>
+      <w:pPr>
+        <w:pStyle w:val="Heading2"/>
+      </w:pPr>
+      <w:r>
+        <w:t>R5</w:t>
+      </w:r>
+    </w:p>
+    <w:p>
+      <w:r>
+        <w:rPr>
+          <w:color w:val="666666"/>
+        </w:rPr>
+        <w:t>Rodzaj ryzyka: administracyjne</w:t>
+      </w:r>
+    </w:p>
+    <w:p>
+      <w:pPr>
+        <w:keepNext/>
+        <w:spacing w:before="160" w:after="40"/>
+      </w:pPr>
+      <w:r>
+        <w:rPr>
+          <w:b/>
+          <w:sz w:val="20"/>
+        </w:rPr>
+        <w:t>Nazwa ryzyka</w:t>
+      </w:r>
+      <w:r>
+        <w:rPr>
+          <w:color w:val="666666"/>
+          <w:sz w:val="17"/>
+        </w:rPr>
+        <w:t xml:space="preserve"> [153 z 200 znaków]</w:t>
+      </w:r>
+    </w:p>
+    <w:p>
+      <w:pPr>
+        <w:spacing w:after="60"/>
+        <w:shd w:val="clear" w:color="auto" w:fill="FBF3E6"/>
+      </w:pPr>
+      <w:r>
+        <w:rPr>
+          <w:b w:val="0"/>
+        </w:rPr>
+        <w:t>Opóźnienia administracyjne: dopuszczenie i montaż urządzenia na pojeździe do testów terenowych oraz zmiany aktów wykonawczych eFTI (zadania Z6 i Z9) - R5</w:t>
+      </w:r>
+    </w:p>
+    <w:p>
+      <w:pPr>
+        <w:keepNext/>
+        <w:spacing w:before="160" w:after="40"/>
+      </w:pPr>
+      <w:r>
+        <w:rPr>
+          <w:b/>
+          <w:sz w:val="20"/>
+        </w:rPr>
+        <w:t>Opis ryzyka</w:t>
+      </w:r>
+      <w:r>
+        <w:rPr>
+          <w:color w:val="666666"/>
+          <w:sz w:val="17"/>
+        </w:rPr>
+        <w:t xml:space="preserve"> [996 z 2000 znaków]</w:t>
+      </w:r>
+    </w:p>
+    <w:p>
+      <w:pPr>
+        <w:spacing w:after="60"/>
+        <w:shd w:val="clear" w:color="auto" w:fill="FBF3E6"/>
+      </w:pPr>
+      <w:r>
+        <w:rPr>
+          <w:b w:val="0"/>
+        </w:rPr>
+        <w:t>Ryzyko dotyczy prac rozwojowych w zadaniach Z6 i Z9. Składają się na nie dwa zagrożenia. Po pierwsze, montaż prototypu na pojazdach floty do testów drogowych może wymagać uzgodnień (bezpieczeństwo montażu, zasilanie, brak ingerencji w układy pojazdu), co opóźniłoby start Fazy A zadania Z9. Po drugie, rozporządzenie UE 2020/1056 i akty wykonawcze są wdrażane etapowo, więc zmiany specyfikacji eFTI mogą utrudnić osiągnięcie pokrycia co najmniej 95% pól obligatoryjnych i czasu PoC do 30 s. Prawdopodobieństwo jest niskie do średniego. Skutkiem byłoby przesunięcie walidacji TRL i kamieni milowych końcowych oraz korekta warstwy mapowania eFTI. Testy terenowe niezbędne do potwierdzenia TRL 8 i kluczowych KPI to AUC-ROC i mAP na zdarzeniach naturalnych w ruchu oraz pomiar błędu pozycji w ruchu. Bez utraty możliwości potwierdzenia rezultatu można zastąpić testami stanowiskowymi lub półpolowymi pomiary opóźnienia alertu, wydajności obliczeniowej oraz odporności IP67, termicznej i wibracyjnej.</w:t>
+      </w:r>
+    </w:p>
+    <w:p>
+      <w:pPr>
+        <w:keepNext/>
+        <w:spacing w:before="160" w:after="40"/>
+      </w:pPr>
+      <w:r>
+        <w:rPr>
+          <w:b/>
+          <w:sz w:val="20"/>
+        </w:rPr>
+        <w:t>Sposoby zapobiegania i minimalizacji skutków</w:t>
+      </w:r>
+      <w:r>
+        <w:rPr>
+          <w:color w:val="666666"/>
+          <w:sz w:val="17"/>
+        </w:rPr>
+        <w:t xml:space="preserve"> [1209 z 2000 znaków]</w:t>
+      </w:r>
+    </w:p>
+    <w:p>
+      <w:pPr>
+        <w:spacing w:after="60"/>
+        <w:shd w:val="clear" w:color="auto" w:fill="FBF3E6"/>
+      </w:pPr>
+      <w:r>
+        <w:rPr>
+          <w:b w:val="0"/>
+        </w:rPr>
+        <w:t>Ryzyku zapobiegamy trzema działaniami. Warunki montażu są uzgadniane z dysponentem floty i podwykonawcą wcześniej, z rezerwą w harmonogramie przed zadaniem Z9. Montaż i zasilanie są nieinwazyjne, co ogranicza wymogi formalne. Integracja eFTI opiera się na aktualnych, opublikowanych specyfikacjach, z warstwą adaptacyjną, a prace legislacyjne UE są monitorowane.</w:t>
+      </w:r>
+    </w:p>
+    <w:p>
+      <w:pPr>
+        <w:spacing w:after="60"/>
+        <w:shd w:val="clear" w:color="auto" w:fill="FBF3E6"/>
+      </w:pPr>
+      <w:r>
+        <w:rPr>
+          <w:b w:val="0"/>
+        </w:rPr>
+        <w:t xml:space="preserve">Skutki ograniczamy tak: przy opóźnieniu dopuszczenia o więcej niż </w:t>
+      </w:r>
+      <w:r>
+        <w:rPr>
+          <w:b w:val="0"/>
+          <w:highlight w:val="yellow"/>
+        </w:rPr>
+        <w:t>8 tygodni</w:t>
+      </w:r>
+      <w:r>
+        <w:rPr>
+          <w:b w:val="0"/>
+        </w:rPr>
+        <w:t xml:space="preserve"> od planowanego startu Fazy A testy sprzętowe wykonujemy stanowiskowo, ale pomiarów AUC-ROC i mAP na zdarzeniach naturalnych nie zastępujemy testem stanowiskowym. Jeżeli opóźnienie przekroczy ten próg, TRL 8 przesuwa się poza projekt, a wynikiem projektu pozostaje TRL 7, co opisujemy wyłącznie jako skutek materializacji ryzyka, bez zmiany deklarowanych wskaźników. Przy zmianie specyfikacji eFTI walidacja w zadaniu Z9 jest wykonywana względem wersji obowiązującej w dniu testów, a zgodność z późniejszą wersją jest zadaniem po projekcie.</w:t>
+      </w:r>
+    </w:p>
+    <w:p>
+      <w:pPr>
+        <w:spacing w:after="60"/>
+        <w:shd w:val="clear" w:color="auto" w:fill="FBF3E6"/>
+      </w:pPr>
+      <w:r>
+        <w:rPr>
+          <w:b w:val="0"/>
+        </w:rPr>
+        <w:t>Warunek no-go: brak możliwości montażu na co najmniej 3 pojazdach do końca M27 przy braku pojazdu zastępczego (ryzyko R11). Wtedy ograniczamy zakres walidacji do elementów wykonalnych i modyfikujemy KM-Z9 w trybie zmiany projektu.</w:t>
+      </w:r>
+    </w:p>
+    <w:p>
+      <w:pPr>
+        <w:pStyle w:val="Heading2"/>
+      </w:pPr>
+      <w:r>
+        <w:t>R9</w:t>
+      </w:r>
+    </w:p>
+    <w:p>
+      <w:r>
+        <w:rPr>
+          <w:color w:val="666666"/>
+        </w:rPr>
+        <w:t>Rodzaj ryzyka: inne</w:t>
+      </w:r>
+    </w:p>
+    <w:p>
+      <w:pPr>
+        <w:keepNext/>
+        <w:spacing w:before="160" w:after="40"/>
+      </w:pPr>
+      <w:r>
+        <w:rPr>
+          <w:b/>
+          <w:sz w:val="20"/>
+        </w:rPr>
+        <w:t>Nazwa ryzyka</w:t>
+      </w:r>
+      <w:r>
+        <w:rPr>
+          <w:color w:val="666666"/>
+          <w:sz w:val="17"/>
+        </w:rPr>
+        <w:t xml:space="preserve"> [134 z 200 znaków]</w:t>
+      </w:r>
+    </w:p>
+    <w:p>
+      <w:pPr>
+        <w:spacing w:after="60"/>
+        <w:shd w:val="clear" w:color="auto" w:fill="FBF3E6"/>
+      </w:pPr>
+      <w:r>
+        <w:rPr>
+          <w:b w:val="0"/>
+        </w:rPr>
+        <w:t>Ryzyko konsorcjalne: opóźnienie przekazania modeli AI z PRz (zadania Z4, Z5, Z8) do optymalizacji embedded Everest11 (zadanie Z7) - R9</w:t>
+      </w:r>
+    </w:p>
+    <w:p>
+      <w:pPr>
+        <w:keepNext/>
+        <w:spacing w:before="160" w:after="40"/>
+      </w:pPr>
+      <w:r>
+        <w:rPr>
+          <w:b/>
+          <w:sz w:val="20"/>
+        </w:rPr>
+        <w:t>Opis ryzyka</w:t>
+      </w:r>
+      <w:r>
+        <w:rPr>
+          <w:color w:val="666666"/>
+          <w:sz w:val="17"/>
+        </w:rPr>
+        <w:t xml:space="preserve"> [1035 z 2000 znaków]</w:t>
+      </w:r>
+    </w:p>
+    <w:p>
+      <w:pPr>
+        <w:spacing w:after="60"/>
+        <w:shd w:val="clear" w:color="auto" w:fill="FBF3E6"/>
+      </w:pPr>
+      <w:r>
+        <w:rPr>
+          <w:b w:val="0"/>
+        </w:rPr>
+        <w:t xml:space="preserve">Ryzyko dotyczy prac rozwojowych i interfejsu konsorcjum między PRz i Everest11. Modele PRz (pozycjonowanie 3D, predykcja ryzyka, detekcja zabezpieczeń) są wejściem do optymalizacji embedded w zadaniu Z7. Opóźnienie lub niepełna gotowość modeli, wynikające z trudności algorytmicznych w osiąganiu progów, ograniczeń kadrowych albo czasowej niedostępności infrastruktury PRz, mogłoby przesunąć przekazanie do zadania Z7. Prawdopodobieństwo jest niskie do średniego. Skutkiem byłoby przesunięcie startu optymalizacji embedded, testów terenowych w zadaniu Z9 i kamieni milowych końcowych, a optymalizacja na niedojrzałych modelach obniżyłaby jakość rezultatu. Zadanie Z7 może zostać odebrane na modelach o obniżonych, lecz zmierzonych parametrach. Wartości minimalne to: AUC-ROC co najmniej </w:t>
+      </w:r>
+      <w:r>
+        <w:rPr>
+          <w:b w:val="0"/>
+          <w:highlight w:val="yellow"/>
+        </w:rPr>
+        <w:t>0,75</w:t>
+      </w:r>
+      <w:r>
+        <w:rPr>
+          <w:b w:val="0"/>
+        </w:rPr>
+        <w:t xml:space="preserve"> (cel 0,85), mAP przy IoU 0,50 co najmniej </w:t>
+      </w:r>
+      <w:r>
+        <w:rPr>
+          <w:b w:val="0"/>
+          <w:highlight w:val="yellow"/>
+        </w:rPr>
+        <w:t>0,70</w:t>
+      </w:r>
+      <w:r>
+        <w:rPr>
+          <w:b w:val="0"/>
+        </w:rPr>
+        <w:t xml:space="preserve"> w wersji RC (cel 0,75) oraz mediana błędu pozycji nie większa niż </w:t>
+      </w:r>
+      <w:r>
+        <w:rPr>
+          <w:b w:val="0"/>
+          <w:highlight w:val="yellow"/>
+        </w:rPr>
+        <w:t>0,50 m</w:t>
+      </w:r>
+      <w:r>
+        <w:rPr>
+          <w:b w:val="0"/>
+        </w:rPr>
+        <w:t xml:space="preserve"> (cel 0,30 m). Poniżej tych wartości modele nie są przyjmowane do zadania Z7, co odpowiada warunkom no-go ryzyk R1, R2 i R3.</w:t>
+      </w:r>
+    </w:p>
+    <w:p>
+      <w:pPr>
+        <w:keepNext/>
+        <w:spacing w:before="160" w:after="40"/>
+      </w:pPr>
+      <w:r>
+        <w:rPr>
+          <w:b/>
+          <w:sz w:val="20"/>
+        </w:rPr>
+        <w:t>Sposoby zapobiegania i minimalizacji skutków</w:t>
+      </w:r>
+      <w:r>
+        <w:rPr>
+          <w:color w:val="666666"/>
+          <w:sz w:val="17"/>
+        </w:rPr>
+        <w:t xml:space="preserve"> [1317 z 2000 znaków]</w:t>
+      </w:r>
+    </w:p>
+    <w:p>
+      <w:pPr>
+        <w:spacing w:after="60"/>
+        <w:shd w:val="clear" w:color="auto" w:fill="FBF3E6"/>
+      </w:pPr>
+      <w:r>
+        <w:rPr>
+          <w:b w:val="0"/>
+        </w:rPr>
+        <w:t>Ryzyku zapobiegamy czterema działaniami. Modele są przekazywane etapowo, w wersjach release candidate o rosnącej dojrzałości, a optymalizacja embedded zaczyna się na wczesnych wersjach. Harmonogram ma bufor: wersje RC są gotowe w M26, a przekazanie następuje w M27. W umowie konsorcjum określamy format modeli, specyfikację API, kryteria odbioru, kamienie milowe integracyjne oraz zobowiązania PRz dotyczące dostępności infrastruktury laboratoryjnej i zasobów kadrowych. Odbywają się regularne spotkania koordynacyjne ze wspólnym backlogiem i wczesnym sygnalizowaniem opóźnień.</w:t>
+      </w:r>
+    </w:p>
+    <w:p>
+      <w:pPr>
+        <w:spacing w:after="60"/>
+        <w:shd w:val="clear" w:color="auto" w:fill="FBF3E6"/>
+      </w:pPr>
+      <w:r>
+        <w:rPr>
+          <w:b w:val="0"/>
+        </w:rPr>
+        <w:t>Skutki ograniczamy tak: przy opóźnieniu jednego modelu optymalizację zaczynamy od modeli gotowych (modułowa architektura zadania Z7), a brakujący model dołączamy w kolejnej iteracji. Przy ograniczeniach PRz przesuwamy zadanie w ramach rezerwy, bez zlecania prac między konsorcjantami. Zadanie Z7 może zostać odebrane na modelach o obniżonych parametrach w granicach wartości minimalnych, a zadanie Z9 waliduje wtedy model na danych terenowych i dostraja go w oknie M30. Zakres wskaźników AUC-ROC i mAP w KM-Z9 odnosi się do modelu po kompresji (co najmniej 0,82 i 0,72).</w:t>
+      </w:r>
+    </w:p>
+    <w:p>
+      <w:pPr>
+        <w:spacing w:after="60"/>
+        <w:shd w:val="clear" w:color="auto" w:fill="FBF3E6"/>
+      </w:pPr>
+      <w:r>
+        <w:rPr>
+          <w:b w:val="0"/>
+        </w:rPr>
+        <w:t>Warunek no-go: model poniżej wartości minimalnych w M27. Wtedy komitet sterujący ogranicza zakres funkcji uruchamianych na platformie embedded albo przerywa zadanie Z7.</w:t>
+      </w:r>
+    </w:p>
+    <w:p>
+      <w:pPr>
+        <w:pStyle w:val="Heading2"/>
+      </w:pPr>
+      <w:r>
+        <w:t>R10</w:t>
+      </w:r>
+    </w:p>
+    <w:p>
+      <w:r>
+        <w:rPr>
+          <w:color w:val="666666"/>
+        </w:rPr>
+        <w:t>Rodzaj ryzyka: inne (prawne)</w:t>
+      </w:r>
+    </w:p>
+    <w:p>
+      <w:pPr>
+        <w:keepNext/>
+        <w:spacing w:before="160" w:after="40"/>
+      </w:pPr>
+      <w:r>
+        <w:rPr>
+          <w:b/>
+          <w:sz w:val="20"/>
+        </w:rPr>
+        <w:t>Nazwa ryzyka</w:t>
+      </w:r>
+      <w:r>
+        <w:rPr>
+          <w:color w:val="666666"/>
+          <w:sz w:val="17"/>
+        </w:rPr>
+        <w:t xml:space="preserve"> [178 z 200 znaków]</w:t>
+      </w:r>
+    </w:p>
+    <w:p>
+      <w:pPr>
+        <w:spacing w:after="60"/>
+        <w:shd w:val="clear" w:color="auto" w:fill="FBF3E6"/>
+      </w:pPr>
+      <w:r>
+        <w:rPr>
+          <w:b w:val="0"/>
+        </w:rPr>
+        <w:t>Ryzyko prawne i regulacyjne: swoboda wdrożenia (FTO), przeniesienie praw PRz-Everest11, RODO i obraz w pojeździe, zmiany eFTI w CEE oraz odpowiedzialność za treść PoL i PoC - R10</w:t>
+      </w:r>
+    </w:p>
+    <w:p>
+      <w:pPr>
+        <w:keepNext/>
+        <w:spacing w:before="160" w:after="40"/>
+      </w:pPr>
+      <w:r>
+        <w:rPr>
+          <w:b/>
+          <w:sz w:val="20"/>
+        </w:rPr>
+        <w:t>Opis ryzyka</w:t>
+      </w:r>
+      <w:r>
+        <w:rPr>
+          <w:color w:val="666666"/>
+          <w:sz w:val="17"/>
+        </w:rPr>
+        <w:t xml:space="preserve"> [1060 z 2000 znaków]</w:t>
+      </w:r>
+    </w:p>
+    <w:p>
+      <w:pPr>
+        <w:spacing w:after="60"/>
+        <w:shd w:val="clear" w:color="auto" w:fill="FBF3E6"/>
+      </w:pPr>
+      <w:r>
+        <w:rPr>
+          <w:b w:val="0"/>
+        </w:rPr>
+        <w:t>Ryzyko dotyczy całego projektu i wdrożenia. Składa się z pięciu zagrożeń. Pierwsze to swoboda wdrożenia (FTO): analiza może nie wykryć blokującego patentu albo osoba trzecia zgłosi roszczenie w trakcie komercjalizacji; prawdopodobieństwo jest niskie, wpływ na wdrożenie wysoki. Drugie to prawa majątkowe: przeniesienie praw z PRz do Everest11 może nastąpić do 12 miesięcy po zakończeniu projektu, więc istnieje ryzyko opóźnienia lub sporu; prawdopodobieństwo jest niskie do średniego. Trzecie to RODO: kamery w przestrzeni ładunkowej mogą rejestrować wizerunek osób podczas załadunku i rozładunku oraz dane lokalizacyjne kierowcy; prawdopodobieństwo jest średnie, wpływ wysoki (zgodność, kary). Czwarte to eFTI: zmiana aktów wykonawczych albo różnice w transpozycji w krajach CEE wpływają na ważność generowanych dokumentów; prawdopodobieństwo jest średnie. Piąte to odpowiedzialność za treść dokumentów PoL i PoC użytych w sporze (błąd systemu, wynik fałszywie ujemny); prawdopodobieństwo jest niskie, wpływ średni na komercjalizację, bez wpływu na prace B+R.</w:t>
+      </w:r>
+    </w:p>
+    <w:p>
+      <w:pPr>
+        <w:keepNext/>
+        <w:spacing w:before="160" w:after="40"/>
+      </w:pPr>
+      <w:r>
+        <w:rPr>
+          <w:b/>
+          <w:sz w:val="20"/>
+        </w:rPr>
+        <w:t>Sposoby zapobiegania i minimalizacji skutków</w:t>
+      </w:r>
+      <w:r>
+        <w:rPr>
+          <w:color w:val="666666"/>
+          <w:sz w:val="17"/>
+        </w:rPr>
+        <w:t xml:space="preserve"> [1143 z 2000 znaków]</w:t>
+      </w:r>
+    </w:p>
+    <w:p>
+      <w:pPr>
+        <w:spacing w:after="60"/>
+        <w:shd w:val="clear" w:color="auto" w:fill="FBF3E6"/>
+      </w:pPr>
+      <w:r>
+        <w:rPr>
+          <w:b w:val="0"/>
+        </w:rPr>
+        <w:t>Pierwsze zagrożenie ograniczamy analizą FTO według elementów rozwiązania (zakres zastrzeżeń, status prawny, terytoria wdrożenia) przed wdrożeniem i przed zgłoszeniem do EPO oraz monitoringiem nowych zgłoszeń patentowych. Drugie zagrożenie ograniczamy zapisem w umowie konsorcjum: prawa dostępu i licencja dla Everest11 od zakończenia projektu albo wcześniejsze przeniesienie, za wynagrodzeniem rynkowym. Brak przeniesienia nie wstrzymuje wdrożenia. Trzecie zagrożenie ograniczamy oceną skutków dla ochrony danych (DPIA), anonimizacją obrazu na brzegu (rozmycie osób i twarzy), minimalizacją danych, polityką przetwarzania przygotowaną przez specjalistę ds. cyberbezpieczeństwa oraz umowami z wynajmującym i partnerem testowym. Czwarte zagrożenie ograniczamy warstwą adaptacyjną i monitoringiem legislacji, a w razie zmiany aktualizujemy mapowanie bez zmiany rdzenia systemu. Piąte zagrożenie ograniczamy zastrzeżeniami w umowach licencyjnych z klientami (ograniczenie odpowiedzialności, pomocniczy charakter dokumentu, procedura odwoławcza) i rejestrem zmian wersji modeli. Zgodność produktowa urządzenia (CE, EMC) jest planowana w zadaniu Z7.</w:t>
+      </w:r>
+    </w:p>
+    <w:p>
+      <w:pPr>
+        <w:pStyle w:val="Heading2"/>
+      </w:pPr>
+      <w:r>
+        <w:t>R11</w:t>
+      </w:r>
+    </w:p>
+    <w:p>
+      <w:r>
+        <w:rPr>
+          <w:color w:val="666666"/>
+        </w:rPr>
+        <w:t>Rodzaj ryzyka: inne</w:t>
+      </w:r>
+    </w:p>
+    <w:p>
+      <w:pPr>
+        <w:keepNext/>
+        <w:spacing w:before="160" w:after="40"/>
+      </w:pPr>
+      <w:r>
+        <w:rPr>
+          <w:b/>
+          <w:sz w:val="20"/>
+        </w:rPr>
+        <w:t>Nazwa ryzyka</w:t>
+      </w:r>
+      <w:r>
+        <w:rPr>
+          <w:color w:val="666666"/>
+          <w:sz w:val="17"/>
+        </w:rPr>
+        <w:t xml:space="preserve"> [136 z 200 znaków]</w:t>
+      </w:r>
+    </w:p>
+    <w:p>
+      <w:pPr>
+        <w:spacing w:after="60"/>
+        <w:shd w:val="clear" w:color="auto" w:fill="FBF3E6"/>
+      </w:pPr>
+      <w:r>
+        <w:rPr>
+          <w:b w:val="0"/>
+        </w:rPr>
+        <w:t>Ryzyko utraty lub ograniczenia dostępu do floty testowej Natanek Logistics (zadania Z2 i Z9, zbiór in-transit, walidacja terenowa) - R11</w:t>
+      </w:r>
+    </w:p>
+    <w:p>
+      <w:pPr>
+        <w:keepNext/>
+        <w:spacing w:before="160" w:after="40"/>
+      </w:pPr>
+      <w:r>
+        <w:rPr>
+          <w:b/>
+          <w:sz w:val="20"/>
+        </w:rPr>
+        <w:t>Opis ryzyka</w:t>
+      </w:r>
+      <w:r>
+        <w:rPr>
+          <w:color w:val="666666"/>
+          <w:sz w:val="17"/>
+        </w:rPr>
+        <w:t xml:space="preserve"> [806 z 2000 znaków]</w:t>
+      </w:r>
+    </w:p>
+    <w:p>
+      <w:pPr>
+        <w:spacing w:after="60"/>
+        <w:shd w:val="clear" w:color="auto" w:fill="FBF3E6"/>
+      </w:pPr>
+      <w:r>
+        <w:rPr>
+          <w:b w:val="0"/>
+        </w:rPr>
+        <w:t xml:space="preserve">Ryzyko dotyczy zadań Z2 (akwizycja) i Z9 (walidacja terenowa). Montaż i dane z obu zadań zależą od dostępu do co najmniej 3 pojazdów partnera testowego na podstawie umowy partnerskiej. Zagrożeniem jest utrata albo ograniczenie dostępu: zmiana relacji biznesowej, wycofanie pojazdów, ograniczenia ubezpieczeniowe, brak zgody na instalację sprzętu eksperymentalnego albo ograniczony dostęp do danych o ładunkach i dokumentacji inspekcyjnej. Prawdopodobieństwo jest niskie, bo umowa jest podpisana, a wpływ wysoki. Skutkiem byłoby zagrożenie liczności zbioru w zadaniu Z2 (co najmniej 500 h i 50 kursów), samego zbioru in-transit, walidacji terenowej w zadaniu Z9 (co najmniej 180 kursów), KPI oraz kamieni milowych KM-Z2 i KM-Z9, z opóźnieniem o czas pozyskania nowego partnera i montażu, około </w:t>
+      </w:r>
+      <w:r>
+        <w:rPr>
+          <w:b w:val="0"/>
+          <w:highlight w:val="yellow"/>
+        </w:rPr>
+        <w:t>6-10 tygodni</w:t>
+      </w:r>
+      <w:r>
+        <w:rPr>
+          <w:b w:val="0"/>
+        </w:rPr>
+        <w:t>.</w:t>
+      </w:r>
+    </w:p>
+    <w:p>
+      <w:pPr>
+        <w:keepNext/>
+        <w:spacing w:before="160" w:after="40"/>
+      </w:pPr>
+      <w:r>
+        <w:rPr>
+          <w:b/>
+          <w:sz w:val="20"/>
+        </w:rPr>
+        <w:t>Sposoby zapobiegania i minimalizacji skutków</w:t>
+      </w:r>
+      <w:r>
+        <w:rPr>
+          <w:color w:val="666666"/>
+          <w:sz w:val="17"/>
+        </w:rPr>
+        <w:t xml:space="preserve"> [1164 z 2000 znaków]</w:t>
+      </w:r>
+    </w:p>
+    <w:p>
+      <w:pPr>
+        <w:spacing w:after="60"/>
+        <w:shd w:val="clear" w:color="auto" w:fill="FBF3E6"/>
+      </w:pPr>
+      <w:r>
+        <w:rPr>
+          <w:b w:val="0"/>
+        </w:rPr>
+        <w:t>Plan zastępczy składa się z czterech elementów. Pierwszym jest umowa partnerska z drugim przewoźnikiem spośród aktywnych kontrahentów Everest11, przygotowywana warunkowo przed M13 (start kampanii) i uruchamiana, gdy dostępność floty spadnie poniżej 3 pojazdów lub 2 tras. Drugim są pojazdy w najmie Everest11 (5 zestawów ciągnik z naczepą, z planowanym wzrostem do 20) jako rezerwa do montażu zestawów, przy czym ground truth i rola partnera w odbiorze pozostają rozdzielone ścieżką audytu z zadania Z9. Trzecim jest metodyka anotacji i taksonomia niezależne od źródła pojazdów, więc zmiana floty nie wymaga powtórzenia anotacji. Czwartym są gwarancje dostępu do danych o ładunkach, tras i dokumentacji inspekcyjnej w umowach. Dywersyfikacja floty wzmacnia także niezależność walidacji, bo żaden pojedynczy podmiot nie jest jednocześnie partnerem testowym i odbiorcą.</w:t>
+      </w:r>
+    </w:p>
+    <w:p>
+      <w:pPr>
+        <w:spacing w:after="60"/>
+        <w:shd w:val="clear" w:color="auto" w:fill="FBF3E6"/>
+      </w:pPr>
+      <w:r>
+        <w:rPr>
+          <w:b w:val="0"/>
+        </w:rPr>
+        <w:t>Skutki ograniczamy tak: przesuwamy kampanię w ramach rezerwy czasowej zadania Z2 (przed M18) i wydłużamy Fazę A zadania Z9. Jeżeli do M22 nie ma floty zastępczej, ograniczamy walidację w zadaniu Z9 do liczby kursów osiągalnej na pojazdach Everest11 i aktualizujemy KM-Z9 w trybie zmiany projektu.</w:t>
+      </w:r>
+    </w:p>
+    <w:p>
+      <w:pPr>
+        <w:pStyle w:val="Heading2"/>
+      </w:pPr>
+      <w:r>
+        <w:t>R12</w:t>
+      </w:r>
+    </w:p>
+    <w:p>
+      <w:r>
+        <w:rPr>
+          <w:color w:val="666666"/>
+        </w:rPr>
+        <w:t>Rodzaj ryzyka: finansowe/inne</w:t>
+      </w:r>
+    </w:p>
+    <w:p>
+      <w:pPr>
+        <w:keepNext/>
+        <w:spacing w:before="160" w:after="40"/>
+      </w:pPr>
+      <w:r>
+        <w:rPr>
+          <w:b/>
+          <w:sz w:val="20"/>
+        </w:rPr>
+        <w:t>Nazwa ryzyka</w:t>
+      </w:r>
+      <w:r>
+        <w:rPr>
+          <w:color w:val="666666"/>
+          <w:sz w:val="17"/>
+        </w:rPr>
+        <w:t xml:space="preserve"> [111 z 200 znaków]</w:t>
+      </w:r>
+    </w:p>
+    <w:p>
+      <w:pPr>
+        <w:spacing w:after="60"/>
+        <w:shd w:val="clear" w:color="auto" w:fill="FBF3E6"/>
+      </w:pPr>
+      <w:r>
+        <w:rPr>
+          <w:b w:val="0"/>
+        </w:rPr>
+        <w:t>Ryzyko cen transferowych i transakcji z podmiotami powiązanymi z przyszłym Inwestorem (Natanek Logistics) - R12</w:t>
+      </w:r>
+    </w:p>
+    <w:p>
+      <w:pPr>
+        <w:keepNext/>
+        <w:spacing w:before="160" w:after="40"/>
+      </w:pPr>
+      <w:r>
+        <w:rPr>
+          <w:b/>
+          <w:sz w:val="20"/>
+        </w:rPr>
+        <w:t>Opis ryzyka</w:t>
+      </w:r>
+      <w:r>
+        <w:rPr>
+          <w:color w:val="666666"/>
+          <w:sz w:val="17"/>
+        </w:rPr>
+        <w:t xml:space="preserve"> [739 z 2000 znaków]</w:t>
+      </w:r>
+    </w:p>
+    <w:p>
+      <w:pPr>
+        <w:spacing w:after="60"/>
+        <w:shd w:val="clear" w:color="auto" w:fill="FBF3E6"/>
+      </w:pPr>
+      <w:r>
+        <w:rPr>
+          <w:b w:val="0"/>
+        </w:rPr>
+        <w:t>Ryzyko dotyczy całego okresu realizacji i wdrożenia. Po wejściu Inwestora (Zbigniew Natanek, do 20% udziałów Everest11) transakcje Everest11 z podmiotami Inwestora, w szczególności z Natanek Logistics (udostępnienie floty testowej, kontrakty sprzedażowe CargoDT), mogą zostać zakwestionowane jako niezgodne z warunkami rynkowymi. Dotyczy to przepisów o podmiotach powiązanych (próg 25% udziałów), zasad pomocy publicznej i racjonalności wydatków. Natanek Logistics jest jednym z trzech niezależnych, potwierdzonych klientów (listy intencyjne), co ogranicza skalę zależności. Prawdopodobieństwo jest niskie. Skutkiem byłoby zakwestionowanie wydatków lub przychodów, opóźnienie rozliczeń i ryzyko reputacyjne. Ryzyko nie wpływa na prace B+R.</w:t>
+      </w:r>
+    </w:p>
+    <w:p>
+      <w:pPr>
+        <w:keepNext/>
+        <w:spacing w:before="160" w:after="40"/>
+      </w:pPr>
+      <w:r>
+        <w:rPr>
+          <w:b/>
+          <w:sz w:val="20"/>
+        </w:rPr>
+        <w:t>Sposoby zapobiegania i minimalizacji skutków</w:t>
+      </w:r>
+      <w:r>
+        <w:rPr>
+          <w:color w:val="666666"/>
+          <w:sz w:val="17"/>
+        </w:rPr>
+        <w:t xml:space="preserve"> [873 z 2000 znaków]</w:t>
+      </w:r>
+    </w:p>
+    <w:p>
+      <w:pPr>
+        <w:spacing w:after="60"/>
+        <w:shd w:val="clear" w:color="auto" w:fill="FBF3E6"/>
+      </w:pPr>
+      <w:r>
+        <w:rPr>
+          <w:b w:val="0"/>
+        </w:rPr>
+        <w:t>Ryzyko ograniczamy czterema działaniami. Wszystkie transakcje z podmiotami powiązanymi z Inwestorem zawieramy na warunkach rynkowych, weryfikowanych tą samą metodą, którą stosujemy do cen rynkowych praw majątkowych między konsorcjantami: rozeznaniem rynku, niezależną wyceną albo negocjacjami w warunkach pełnej konkurencji. Umowę partnerską dotyczącą floty testowej dokumentujemy odniesieniem do porównywalnych ofert rynkowych (koszty wynajmu floty u innych podmiotów) i wpisujemy do rejestru transakcji. Formalnie ustalamy, czy Everest11 i Natanek Logistics są powiązane w rozumieniu przepisów o podatku dochodowym (próg 25% udziałów, a Inwestor ma najwyżej 20%), a niezależnie od wyniku dokumentujemy warunki rynkowe transakcji. Niezależność walidacji zabezpiecza ścieżka audytu z zadania Z9 i dywersyfikacja floty (R11). Ocena transakcji jest prowadzona raz na kwartał.</w:t>
       </w:r>
     </w:p>
     <w:p>
@@ -13831,6 +15279,947 @@
         <w:t>Sprawdzono automatycznie: limity znaków z Instrukcji, brak podwójnych spacji, spacji niełamliwych, tabulatorów, myślników długich i półpauz, strzałek, symboli większe-równe i mniejsze-równe oraz wypunktowań w postaci znaków specjalnych. Wszystkie pola spełniają kryteria.</w:t>
       </w:r>
     </w:p>
+    <w:tbl>
+      <w:tblPr>
+        <w:tblStyle w:val="TableGrid"/>
+        <w:tblW w:type="auto" w:w="0"/>
+        <w:jc w:val="center"/>
+        <w:tblLook w:firstColumn="1" w:firstRow="1" w:lastColumn="0" w:lastRow="0" w:noHBand="0" w:noVBand="1" w:val="04A0"/>
+      </w:tblPr>
+      <w:tblGrid>
+        <w:gridCol w:w="1928"/>
+        <w:gridCol w:w="1928"/>
+        <w:gridCol w:w="1928"/>
+        <w:gridCol w:w="1928"/>
+        <w:gridCol w:w="1928"/>
+      </w:tblGrid>
+      <w:tr>
+        <w:tc>
+          <w:tcPr>
+            <w:tcW w:type="dxa" w:w="1417"/>
+            <w:shd w:val="clear" w:color="auto" w:fill="D9E2F3"/>
+          </w:tcPr>
+          <w:p>
+            <w:pPr>
+              <w:spacing w:after="20"/>
+            </w:pPr>
+            <w:r/>
+            <w:r>
+              <w:rPr>
+                <w:b/>
+                <w:sz w:val="17"/>
+              </w:rPr>
+              <w:t>Ryzyko</w:t>
+            </w:r>
+          </w:p>
+        </w:tc>
+        <w:tc>
+          <w:tcPr>
+            <w:tcW w:type="dxa" w:w="1701"/>
+            <w:shd w:val="clear" w:color="auto" w:fill="D9E2F3"/>
+          </w:tcPr>
+          <w:p>
+            <w:pPr>
+              <w:spacing w:after="20"/>
+            </w:pPr>
+            <w:r/>
+            <w:r>
+              <w:rPr>
+                <w:b/>
+                <w:sz w:val="17"/>
+              </w:rPr>
+              <w:t>Nazwa</w:t>
+            </w:r>
+          </w:p>
+        </w:tc>
+        <w:tc>
+          <w:tcPr>
+            <w:tcW w:type="dxa" w:w="1701"/>
+            <w:shd w:val="clear" w:color="auto" w:fill="D9E2F3"/>
+          </w:tcPr>
+          <w:p>
+            <w:pPr>
+              <w:spacing w:after="20"/>
+            </w:pPr>
+            <w:r/>
+            <w:r>
+              <w:rPr>
+                <w:b/>
+                <w:sz w:val="17"/>
+              </w:rPr>
+              <w:t>Opis</w:t>
+            </w:r>
+          </w:p>
+        </w:tc>
+        <w:tc>
+          <w:tcPr>
+            <w:tcW w:type="dxa" w:w="1984"/>
+            <w:shd w:val="clear" w:color="auto" w:fill="D9E2F3"/>
+          </w:tcPr>
+          <w:p>
+            <w:pPr>
+              <w:spacing w:after="20"/>
+            </w:pPr>
+            <w:r/>
+            <w:r>
+              <w:rPr>
+                <w:b/>
+                <w:sz w:val="17"/>
+              </w:rPr>
+              <w:t>Zapobieganie</w:t>
+            </w:r>
+          </w:p>
+        </w:tc>
+        <w:tc>
+          <w:tcPr>
+            <w:tcW w:type="dxa" w:w="1701"/>
+            <w:shd w:val="clear" w:color="auto" w:fill="D9E2F3"/>
+          </w:tcPr>
+          <w:p>
+            <w:pPr>
+              <w:spacing w:after="20"/>
+            </w:pPr>
+            <w:r/>
+            <w:r>
+              <w:rPr>
+                <w:b/>
+                <w:sz w:val="17"/>
+              </w:rPr>
+              <w:t>Znaki specjalne</w:t>
+            </w:r>
+          </w:p>
+        </w:tc>
+      </w:tr>
+      <w:tr>
+        <w:tc>
+          <w:tcPr>
+            <w:tcW w:type="dxa" w:w="1417"/>
+          </w:tcPr>
+          <w:p>
+            <w:pPr>
+              <w:spacing w:after="20"/>
+            </w:pPr>
+            <w:r/>
+            <w:r>
+              <w:rPr>
+                <w:b w:val="0"/>
+                <w:sz w:val="17"/>
+              </w:rPr>
+              <w:t>R1</w:t>
+            </w:r>
+          </w:p>
+        </w:tc>
+        <w:tc>
+          <w:tcPr>
+            <w:tcW w:type="dxa" w:w="1701"/>
+          </w:tcPr>
+          <w:p>
+            <w:pPr>
+              <w:spacing w:after="20"/>
+            </w:pPr>
+            <w:r/>
+            <w:r>
+              <w:rPr>
+                <w:b w:val="0"/>
+                <w:sz w:val="17"/>
+              </w:rPr>
+              <w:t>139/200</w:t>
+            </w:r>
+          </w:p>
+        </w:tc>
+        <w:tc>
+          <w:tcPr>
+            <w:tcW w:type="dxa" w:w="1701"/>
+          </w:tcPr>
+          <w:p>
+            <w:pPr>
+              <w:spacing w:after="20"/>
+            </w:pPr>
+            <w:r/>
+            <w:r>
+              <w:rPr>
+                <w:b w:val="0"/>
+                <w:sz w:val="17"/>
+              </w:rPr>
+              <w:t>1238/2000</w:t>
+            </w:r>
+          </w:p>
+        </w:tc>
+        <w:tc>
+          <w:tcPr>
+            <w:tcW w:type="dxa" w:w="1984"/>
+          </w:tcPr>
+          <w:p>
+            <w:pPr>
+              <w:spacing w:after="20"/>
+            </w:pPr>
+            <w:r/>
+            <w:r>
+              <w:rPr>
+                <w:b w:val="0"/>
+                <w:sz w:val="17"/>
+              </w:rPr>
+              <w:t>1334/2000</w:t>
+            </w:r>
+          </w:p>
+        </w:tc>
+        <w:tc>
+          <w:tcPr>
+            <w:tcW w:type="dxa" w:w="1701"/>
+          </w:tcPr>
+          <w:p>
+            <w:pPr>
+              <w:spacing w:after="20"/>
+            </w:pPr>
+            <w:r/>
+            <w:r>
+              <w:rPr>
+                <w:b w:val="0"/>
+                <w:sz w:val="17"/>
+              </w:rPr>
+              <w:t>brak</w:t>
+            </w:r>
+          </w:p>
+        </w:tc>
+      </w:tr>
+      <w:tr>
+        <w:tc>
+          <w:tcPr>
+            <w:tcW w:type="dxa" w:w="1417"/>
+          </w:tcPr>
+          <w:p>
+            <w:pPr>
+              <w:spacing w:after="20"/>
+            </w:pPr>
+            <w:r/>
+            <w:r>
+              <w:rPr>
+                <w:b w:val="0"/>
+                <w:sz w:val="17"/>
+              </w:rPr>
+              <w:t>R2</w:t>
+            </w:r>
+          </w:p>
+        </w:tc>
+        <w:tc>
+          <w:tcPr>
+            <w:tcW w:type="dxa" w:w="1701"/>
+          </w:tcPr>
+          <w:p>
+            <w:pPr>
+              <w:spacing w:after="20"/>
+            </w:pPr>
+            <w:r/>
+            <w:r>
+              <w:rPr>
+                <w:b w:val="0"/>
+                <w:sz w:val="17"/>
+              </w:rPr>
+              <w:t>165/200</w:t>
+            </w:r>
+          </w:p>
+        </w:tc>
+        <w:tc>
+          <w:tcPr>
+            <w:tcW w:type="dxa" w:w="1701"/>
+          </w:tcPr>
+          <w:p>
+            <w:pPr>
+              <w:spacing w:after="20"/>
+            </w:pPr>
+            <w:r/>
+            <w:r>
+              <w:rPr>
+                <w:b w:val="0"/>
+                <w:sz w:val="17"/>
+              </w:rPr>
+              <w:t>1152/2000</w:t>
+            </w:r>
+          </w:p>
+        </w:tc>
+        <w:tc>
+          <w:tcPr>
+            <w:tcW w:type="dxa" w:w="1984"/>
+          </w:tcPr>
+          <w:p>
+            <w:pPr>
+              <w:spacing w:after="20"/>
+            </w:pPr>
+            <w:r/>
+            <w:r>
+              <w:rPr>
+                <w:b w:val="0"/>
+                <w:sz w:val="17"/>
+              </w:rPr>
+              <w:t>1683/2000</w:t>
+            </w:r>
+          </w:p>
+        </w:tc>
+        <w:tc>
+          <w:tcPr>
+            <w:tcW w:type="dxa" w:w="1701"/>
+          </w:tcPr>
+          <w:p>
+            <w:pPr>
+              <w:spacing w:after="20"/>
+            </w:pPr>
+            <w:r/>
+            <w:r>
+              <w:rPr>
+                <w:b w:val="0"/>
+                <w:sz w:val="17"/>
+              </w:rPr>
+              <w:t>brak</w:t>
+            </w:r>
+          </w:p>
+        </w:tc>
+      </w:tr>
+      <w:tr>
+        <w:tc>
+          <w:tcPr>
+            <w:tcW w:type="dxa" w:w="1417"/>
+          </w:tcPr>
+          <w:p>
+            <w:pPr>
+              <w:spacing w:after="20"/>
+            </w:pPr>
+            <w:r/>
+            <w:r>
+              <w:rPr>
+                <w:b w:val="0"/>
+                <w:sz w:val="17"/>
+              </w:rPr>
+              <w:t>R3</w:t>
+            </w:r>
+          </w:p>
+        </w:tc>
+        <w:tc>
+          <w:tcPr>
+            <w:tcW w:type="dxa" w:w="1701"/>
+          </w:tcPr>
+          <w:p>
+            <w:pPr>
+              <w:spacing w:after="20"/>
+            </w:pPr>
+            <w:r/>
+            <w:r>
+              <w:rPr>
+                <w:b w:val="0"/>
+                <w:sz w:val="17"/>
+              </w:rPr>
+              <w:t>160/200</w:t>
+            </w:r>
+          </w:p>
+        </w:tc>
+        <w:tc>
+          <w:tcPr>
+            <w:tcW w:type="dxa" w:w="1701"/>
+          </w:tcPr>
+          <w:p>
+            <w:pPr>
+              <w:spacing w:after="20"/>
+            </w:pPr>
+            <w:r/>
+            <w:r>
+              <w:rPr>
+                <w:b w:val="0"/>
+                <w:sz w:val="17"/>
+              </w:rPr>
+              <w:t>1091/2000</w:t>
+            </w:r>
+          </w:p>
+        </w:tc>
+        <w:tc>
+          <w:tcPr>
+            <w:tcW w:type="dxa" w:w="1984"/>
+          </w:tcPr>
+          <w:p>
+            <w:pPr>
+              <w:spacing w:after="20"/>
+            </w:pPr>
+            <w:r/>
+            <w:r>
+              <w:rPr>
+                <w:b w:val="0"/>
+                <w:sz w:val="17"/>
+              </w:rPr>
+              <w:t>1329/2000</w:t>
+            </w:r>
+          </w:p>
+        </w:tc>
+        <w:tc>
+          <w:tcPr>
+            <w:tcW w:type="dxa" w:w="1701"/>
+          </w:tcPr>
+          <w:p>
+            <w:pPr>
+              <w:spacing w:after="20"/>
+            </w:pPr>
+            <w:r/>
+            <w:r>
+              <w:rPr>
+                <w:b w:val="0"/>
+                <w:sz w:val="17"/>
+              </w:rPr>
+              <w:t>brak</w:t>
+            </w:r>
+          </w:p>
+        </w:tc>
+      </w:tr>
+      <w:tr>
+        <w:tc>
+          <w:tcPr>
+            <w:tcW w:type="dxa" w:w="1417"/>
+          </w:tcPr>
+          <w:p>
+            <w:pPr>
+              <w:spacing w:after="20"/>
+            </w:pPr>
+            <w:r/>
+            <w:r>
+              <w:rPr>
+                <w:b w:val="0"/>
+                <w:sz w:val="17"/>
+              </w:rPr>
+              <w:t>R4</w:t>
+            </w:r>
+          </w:p>
+        </w:tc>
+        <w:tc>
+          <w:tcPr>
+            <w:tcW w:type="dxa" w:w="1701"/>
+          </w:tcPr>
+          <w:p>
+            <w:pPr>
+              <w:spacing w:after="20"/>
+            </w:pPr>
+            <w:r/>
+            <w:r>
+              <w:rPr>
+                <w:b w:val="0"/>
+                <w:sz w:val="17"/>
+              </w:rPr>
+              <w:t>176/200</w:t>
+            </w:r>
+          </w:p>
+        </w:tc>
+        <w:tc>
+          <w:tcPr>
+            <w:tcW w:type="dxa" w:w="1701"/>
+          </w:tcPr>
+          <w:p>
+            <w:pPr>
+              <w:spacing w:after="20"/>
+            </w:pPr>
+            <w:r/>
+            <w:r>
+              <w:rPr>
+                <w:b w:val="0"/>
+                <w:sz w:val="17"/>
+              </w:rPr>
+              <w:t>1047/2000</w:t>
+            </w:r>
+          </w:p>
+        </w:tc>
+        <w:tc>
+          <w:tcPr>
+            <w:tcW w:type="dxa" w:w="1984"/>
+          </w:tcPr>
+          <w:p>
+            <w:pPr>
+              <w:spacing w:after="20"/>
+            </w:pPr>
+            <w:r/>
+            <w:r>
+              <w:rPr>
+                <w:b w:val="0"/>
+                <w:sz w:val="17"/>
+              </w:rPr>
+              <w:t>1424/2000</w:t>
+            </w:r>
+          </w:p>
+        </w:tc>
+        <w:tc>
+          <w:tcPr>
+            <w:tcW w:type="dxa" w:w="1701"/>
+          </w:tcPr>
+          <w:p>
+            <w:pPr>
+              <w:spacing w:after="20"/>
+            </w:pPr>
+            <w:r/>
+            <w:r>
+              <w:rPr>
+                <w:b w:val="0"/>
+                <w:sz w:val="17"/>
+              </w:rPr>
+              <w:t>brak</w:t>
+            </w:r>
+          </w:p>
+        </w:tc>
+      </w:tr>
+      <w:tr>
+        <w:tc>
+          <w:tcPr>
+            <w:tcW w:type="dxa" w:w="1417"/>
+          </w:tcPr>
+          <w:p>
+            <w:pPr>
+              <w:spacing w:after="20"/>
+            </w:pPr>
+            <w:r/>
+            <w:r>
+              <w:rPr>
+                <w:b w:val="0"/>
+                <w:sz w:val="17"/>
+              </w:rPr>
+              <w:t>R5</w:t>
+            </w:r>
+          </w:p>
+        </w:tc>
+        <w:tc>
+          <w:tcPr>
+            <w:tcW w:type="dxa" w:w="1701"/>
+          </w:tcPr>
+          <w:p>
+            <w:pPr>
+              <w:spacing w:after="20"/>
+            </w:pPr>
+            <w:r/>
+            <w:r>
+              <w:rPr>
+                <w:b w:val="0"/>
+                <w:sz w:val="17"/>
+              </w:rPr>
+              <w:t>153/200</w:t>
+            </w:r>
+          </w:p>
+        </w:tc>
+        <w:tc>
+          <w:tcPr>
+            <w:tcW w:type="dxa" w:w="1701"/>
+          </w:tcPr>
+          <w:p>
+            <w:pPr>
+              <w:spacing w:after="20"/>
+            </w:pPr>
+            <w:r/>
+            <w:r>
+              <w:rPr>
+                <w:b w:val="0"/>
+                <w:sz w:val="17"/>
+              </w:rPr>
+              <w:t>996/2000</w:t>
+            </w:r>
+          </w:p>
+        </w:tc>
+        <w:tc>
+          <w:tcPr>
+            <w:tcW w:type="dxa" w:w="1984"/>
+          </w:tcPr>
+          <w:p>
+            <w:pPr>
+              <w:spacing w:after="20"/>
+            </w:pPr>
+            <w:r/>
+            <w:r>
+              <w:rPr>
+                <w:b w:val="0"/>
+                <w:sz w:val="17"/>
+              </w:rPr>
+              <w:t>1209/2000</w:t>
+            </w:r>
+          </w:p>
+        </w:tc>
+        <w:tc>
+          <w:tcPr>
+            <w:tcW w:type="dxa" w:w="1701"/>
+          </w:tcPr>
+          <w:p>
+            <w:pPr>
+              <w:spacing w:after="20"/>
+            </w:pPr>
+            <w:r/>
+            <w:r>
+              <w:rPr>
+                <w:b w:val="0"/>
+                <w:sz w:val="17"/>
+              </w:rPr>
+              <w:t>brak</w:t>
+            </w:r>
+          </w:p>
+        </w:tc>
+      </w:tr>
+      <w:tr>
+        <w:tc>
+          <w:tcPr>
+            <w:tcW w:type="dxa" w:w="1417"/>
+          </w:tcPr>
+          <w:p>
+            <w:pPr>
+              <w:spacing w:after="20"/>
+            </w:pPr>
+            <w:r/>
+            <w:r>
+              <w:rPr>
+                <w:b w:val="0"/>
+                <w:sz w:val="17"/>
+              </w:rPr>
+              <w:t>R9</w:t>
+            </w:r>
+          </w:p>
+        </w:tc>
+        <w:tc>
+          <w:tcPr>
+            <w:tcW w:type="dxa" w:w="1701"/>
+          </w:tcPr>
+          <w:p>
+            <w:pPr>
+              <w:spacing w:after="20"/>
+            </w:pPr>
+            <w:r/>
+            <w:r>
+              <w:rPr>
+                <w:b w:val="0"/>
+                <w:sz w:val="17"/>
+              </w:rPr>
+              <w:t>134/200</w:t>
+            </w:r>
+          </w:p>
+        </w:tc>
+        <w:tc>
+          <w:tcPr>
+            <w:tcW w:type="dxa" w:w="1701"/>
+          </w:tcPr>
+          <w:p>
+            <w:pPr>
+              <w:spacing w:after="20"/>
+            </w:pPr>
+            <w:r/>
+            <w:r>
+              <w:rPr>
+                <w:b w:val="0"/>
+                <w:sz w:val="17"/>
+              </w:rPr>
+              <w:t>1035/2000</w:t>
+            </w:r>
+          </w:p>
+        </w:tc>
+        <w:tc>
+          <w:tcPr>
+            <w:tcW w:type="dxa" w:w="1984"/>
+          </w:tcPr>
+          <w:p>
+            <w:pPr>
+              <w:spacing w:after="20"/>
+            </w:pPr>
+            <w:r/>
+            <w:r>
+              <w:rPr>
+                <w:b w:val="0"/>
+                <w:sz w:val="17"/>
+              </w:rPr>
+              <w:t>1317/2000</w:t>
+            </w:r>
+          </w:p>
+        </w:tc>
+        <w:tc>
+          <w:tcPr>
+            <w:tcW w:type="dxa" w:w="1701"/>
+          </w:tcPr>
+          <w:p>
+            <w:pPr>
+              <w:spacing w:after="20"/>
+            </w:pPr>
+            <w:r/>
+            <w:r>
+              <w:rPr>
+                <w:b w:val="0"/>
+                <w:sz w:val="17"/>
+              </w:rPr>
+              <w:t>brak</w:t>
+            </w:r>
+          </w:p>
+        </w:tc>
+      </w:tr>
+      <w:tr>
+        <w:tc>
+          <w:tcPr>
+            <w:tcW w:type="dxa" w:w="1417"/>
+          </w:tcPr>
+          <w:p>
+            <w:pPr>
+              <w:spacing w:after="20"/>
+            </w:pPr>
+            <w:r/>
+            <w:r>
+              <w:rPr>
+                <w:b w:val="0"/>
+                <w:sz w:val="17"/>
+              </w:rPr>
+              <w:t>R10</w:t>
+            </w:r>
+          </w:p>
+        </w:tc>
+        <w:tc>
+          <w:tcPr>
+            <w:tcW w:type="dxa" w:w="1701"/>
+          </w:tcPr>
+          <w:p>
+            <w:pPr>
+              <w:spacing w:after="20"/>
+            </w:pPr>
+            <w:r/>
+            <w:r>
+              <w:rPr>
+                <w:b w:val="0"/>
+                <w:sz w:val="17"/>
+              </w:rPr>
+              <w:t>178/200</w:t>
+            </w:r>
+          </w:p>
+        </w:tc>
+        <w:tc>
+          <w:tcPr>
+            <w:tcW w:type="dxa" w:w="1701"/>
+          </w:tcPr>
+          <w:p>
+            <w:pPr>
+              <w:spacing w:after="20"/>
+            </w:pPr>
+            <w:r/>
+            <w:r>
+              <w:rPr>
+                <w:b w:val="0"/>
+                <w:sz w:val="17"/>
+              </w:rPr>
+              <w:t>1060/2000</w:t>
+            </w:r>
+          </w:p>
+        </w:tc>
+        <w:tc>
+          <w:tcPr>
+            <w:tcW w:type="dxa" w:w="1984"/>
+          </w:tcPr>
+          <w:p>
+            <w:pPr>
+              <w:spacing w:after="20"/>
+            </w:pPr>
+            <w:r/>
+            <w:r>
+              <w:rPr>
+                <w:b w:val="0"/>
+                <w:sz w:val="17"/>
+              </w:rPr>
+              <w:t>1143/2000</w:t>
+            </w:r>
+          </w:p>
+        </w:tc>
+        <w:tc>
+          <w:tcPr>
+            <w:tcW w:type="dxa" w:w="1701"/>
+          </w:tcPr>
+          <w:p>
+            <w:pPr>
+              <w:spacing w:after="20"/>
+            </w:pPr>
+            <w:r/>
+            <w:r>
+              <w:rPr>
+                <w:b w:val="0"/>
+                <w:sz w:val="17"/>
+              </w:rPr>
+              <w:t>brak</w:t>
+            </w:r>
+          </w:p>
+        </w:tc>
+      </w:tr>
+      <w:tr>
+        <w:tc>
+          <w:tcPr>
+            <w:tcW w:type="dxa" w:w="1417"/>
+          </w:tcPr>
+          <w:p>
+            <w:pPr>
+              <w:spacing w:after="20"/>
+            </w:pPr>
+            <w:r/>
+            <w:r>
+              <w:rPr>
+                <w:b w:val="0"/>
+                <w:sz w:val="17"/>
+              </w:rPr>
+              <w:t>R11</w:t>
+            </w:r>
+          </w:p>
+        </w:tc>
+        <w:tc>
+          <w:tcPr>
+            <w:tcW w:type="dxa" w:w="1701"/>
+          </w:tcPr>
+          <w:p>
+            <w:pPr>
+              <w:spacing w:after="20"/>
+            </w:pPr>
+            <w:r/>
+            <w:r>
+              <w:rPr>
+                <w:b w:val="0"/>
+                <w:sz w:val="17"/>
+              </w:rPr>
+              <w:t>136/200</w:t>
+            </w:r>
+          </w:p>
+        </w:tc>
+        <w:tc>
+          <w:tcPr>
+            <w:tcW w:type="dxa" w:w="1701"/>
+          </w:tcPr>
+          <w:p>
+            <w:pPr>
+              <w:spacing w:after="20"/>
+            </w:pPr>
+            <w:r/>
+            <w:r>
+              <w:rPr>
+                <w:b w:val="0"/>
+                <w:sz w:val="17"/>
+              </w:rPr>
+              <w:t>806/2000</w:t>
+            </w:r>
+          </w:p>
+        </w:tc>
+        <w:tc>
+          <w:tcPr>
+            <w:tcW w:type="dxa" w:w="1984"/>
+          </w:tcPr>
+          <w:p>
+            <w:pPr>
+              <w:spacing w:after="20"/>
+            </w:pPr>
+            <w:r/>
+            <w:r>
+              <w:rPr>
+                <w:b w:val="0"/>
+                <w:sz w:val="17"/>
+              </w:rPr>
+              <w:t>1164/2000</w:t>
+            </w:r>
+          </w:p>
+        </w:tc>
+        <w:tc>
+          <w:tcPr>
+            <w:tcW w:type="dxa" w:w="1701"/>
+          </w:tcPr>
+          <w:p>
+            <w:pPr>
+              <w:spacing w:after="20"/>
+            </w:pPr>
+            <w:r/>
+            <w:r>
+              <w:rPr>
+                <w:b w:val="0"/>
+                <w:sz w:val="17"/>
+              </w:rPr>
+              <w:t>brak</w:t>
+            </w:r>
+          </w:p>
+        </w:tc>
+      </w:tr>
+      <w:tr>
+        <w:tc>
+          <w:tcPr>
+            <w:tcW w:type="dxa" w:w="1417"/>
+          </w:tcPr>
+          <w:p>
+            <w:pPr>
+              <w:spacing w:after="20"/>
+            </w:pPr>
+            <w:r/>
+            <w:r>
+              <w:rPr>
+                <w:b w:val="0"/>
+                <w:sz w:val="17"/>
+              </w:rPr>
+              <w:t>R12</w:t>
+            </w:r>
+          </w:p>
+        </w:tc>
+        <w:tc>
+          <w:tcPr>
+            <w:tcW w:type="dxa" w:w="1701"/>
+          </w:tcPr>
+          <w:p>
+            <w:pPr>
+              <w:spacing w:after="20"/>
+            </w:pPr>
+            <w:r/>
+            <w:r>
+              <w:rPr>
+                <w:b w:val="0"/>
+                <w:sz w:val="17"/>
+              </w:rPr>
+              <w:t>111/200</w:t>
+            </w:r>
+          </w:p>
+        </w:tc>
+        <w:tc>
+          <w:tcPr>
+            <w:tcW w:type="dxa" w:w="1701"/>
+          </w:tcPr>
+          <w:p>
+            <w:pPr>
+              <w:spacing w:after="20"/>
+            </w:pPr>
+            <w:r/>
+            <w:r>
+              <w:rPr>
+                <w:b w:val="0"/>
+                <w:sz w:val="17"/>
+              </w:rPr>
+              <w:t>739/2000</w:t>
+            </w:r>
+          </w:p>
+        </w:tc>
+        <w:tc>
+          <w:tcPr>
+            <w:tcW w:type="dxa" w:w="1984"/>
+          </w:tcPr>
+          <w:p>
+            <w:pPr>
+              <w:spacing w:after="20"/>
+            </w:pPr>
+            <w:r/>
+            <w:r>
+              <w:rPr>
+                <w:b w:val="0"/>
+                <w:sz w:val="17"/>
+              </w:rPr>
+              <w:t>873/2000</w:t>
+            </w:r>
+          </w:p>
+        </w:tc>
+        <w:tc>
+          <w:tcPr>
+            <w:tcW w:type="dxa" w:w="1701"/>
+          </w:tcPr>
+          <w:p>
+            <w:pPr>
+              <w:spacing w:after="20"/>
+            </w:pPr>
+            <w:r/>
+            <w:r>
+              <w:rPr>
+                <w:b w:val="0"/>
+                <w:sz w:val="17"/>
+              </w:rPr>
+              <w:t>brak</w:t>
+            </w:r>
+          </w:p>
+        </w:tc>
+      </w:tr>
+    </w:tbl>
+    <w:p/>
     <w:sectPr>
       <w:pgSz w:w="11906" w:h="16838"/>
       <w:pgMar w:top="1134" w:right="1134" w:bottom="1134" w:left="1134" w:header="720" w:footer="720" w:gutter="0"/>

</xml_diff>

<commit_message>
Poprawione nazwy zadan wg wniosku, Aneks E (27 miejsc do dostosowania), arkusz niespojnosci, D31
Co-Authored-By: Claude Sonnet 5.5 <noreply@anthropic.com>
Claude-Session: https://claude.ai/code/session_01672WnJhixnEcarbb7uiwfx
</commit_message>
<xml_diff>
--- a/Opisy_zadan_z_kamieniami_milowymi.docx
+++ b/Opisy_zadan_z_kamieniami_milowymi.docx
@@ -621,7 +621,7 @@
         <w:rPr>
           <w:b/>
         </w:rPr>
-        <w:t>2. Badania przemysłowe: Akwizycja wielomodalnego datasetu in-transit (Z2)</w:t>
+        <w:t>2. Badania przemysłowe: Opracowanie metodologii wielomodalnej akwizycji danych i budowa datasetu środowiskowego przestrzeni ładunkowej naczepy TIR (Z2)</w:t>
       </w:r>
     </w:p>
     <w:p>
@@ -2119,7 +2119,7 @@
         <w:rPr>
           <w:b/>
         </w:rPr>
-        <w:t>5. Prace rozwojowe: Algorytmy 3D state estimation: mitygacja MCI, IMU-aided registration, pipeline modelu 3D (Z5)</w:t>
+        <w:t>5. Prace rozwojowe: Algorytmy fuzji ToF RGB-D lub EO/IR ze światłem strukturalnym z kompensacją drgań (Z5)</w:t>
       </w:r>
     </w:p>
     <w:p>
@@ -2617,7 +2617,7 @@
         <w:rPr>
           <w:b/>
         </w:rPr>
-        <w:t>6. Prace rozwojowe: Pipeline PoL/PoC i zgodność z eFTI (Z6)</w:t>
+        <w:t>6. Prace rozwojowe: Pipeline PoC + integracja TMS/eFTI/e-CMR (Z6)</w:t>
       </w:r>
     </w:p>
     <w:p>
@@ -3116,7 +3116,7 @@
         <w:rPr>
           <w:b/>
         </w:rPr>
-        <w:t>7. Prace rozwojowe: Optymalizacja i integracja embedded (Z7)</w:t>
+        <w:t>7. Prace rozwojowe: Optymalizacja embedded AI + architektura sprzętowa</w:t>
       </w:r>
     </w:p>
     <w:p>
@@ -3589,7 +3589,7 @@
         <w:rPr>
           <w:b/>
         </w:rPr>
-        <w:t>8. Prace rozwojowe: Modele CV i change detection (Z8)</w:t>
+        <w:t>8. Prace rozwojowe: Modele CV weryfikacji zabezpieczeń + change detection (Z8)</w:t>
       </w:r>
     </w:p>
     <w:p>
@@ -4034,7 +4034,7 @@
         <w:rPr>
           <w:b/>
         </w:rPr>
-        <w:t>9. Prace rozwojowe: Testy terenowe i walidacja TRL 8 (Z9)</w:t>
+        <w:t>9. Prace rozwojowe: Testy terenowe + walidacja KPI na flocie Natanek Logistics (Z9)</w:t>
       </w:r>
     </w:p>
     <w:p>
@@ -4246,7 +4246,7 @@
           <w:color w:val="666666"/>
           <w:sz w:val="17"/>
         </w:rPr>
-        <w:t xml:space="preserve"> [3555 z 4000 znaków]</w:t>
+        <w:t xml:space="preserve"> [3764 z 4000 znaków]</w:t>
       </w:r>
     </w:p>
     <w:p>
@@ -4312,7 +4312,7 @@
         <w:rPr>
           <w:b w:val="0"/>
         </w:rPr>
-        <w:t>Zadanie zamyka łańcuch prac projektu. Integruje wyniki zadań Z4, Z5, Z6, Z7 i Z8, a potwierdzone KPI stanowią podstawę wskaźników rezultatu. Raport techniczny z zadania Z9 jest wejściem do prac patentowych w zadaniu Z11, a koszty zadania obejmują wynagrodzenia wymienionych osób Everest11 oraz usługę podwykonawcy.</w:t>
+        <w:t>Zadanie zamyka łańcuch prac projektu. Integruje wyniki zadań Z4, Z5, Z6, Z7 i Z8, a potwierdzone KPI stanowią podstawę wskaźników rezultatu. Z danych radaru mmWave będzie dodatkowo wyznaczany wskaźnik wykorzystania kubatury naczepy (cel co najmniej 80%), raportowany miesięcznie jako wskaźnik operacyjny, który nie jest parametrem kamienia milowego. Raport techniczny z zadania Z9 jest wejściem do prac patentowych w zadaniu Z11, a koszty zadania obejmują wynagrodzenia wymienionych osób Everest11 oraz usługę podwykonawcy.</w:t>
       </w:r>
     </w:p>
     <w:p>
@@ -13774,6 +13774,3178 @@
       </w:r>
     </w:p>
     <w:p>
+      <w:r>
+        <w:br w:type="page"/>
+      </w:r>
+    </w:p>
+    <w:p>
+      <w:pPr>
+        <w:pStyle w:val="Heading1"/>
+      </w:pPr>
+      <w:r>
+        <w:t>Aneks E. Miejsca we wniosku do dostosowania do nowych tekstów</w:t>
+      </w:r>
+    </w:p>
+    <w:p>
+      <w:pPr>
+        <w:spacing w:after="60"/>
+      </w:pPr>
+      <w:r>
+        <w:rPr>
+          <w:b w:val="0"/>
+        </w:rPr>
+        <w:t>Przegląd całego wniosku pod kątem sprzeczności z nowymi opisami zadań, kamieniami milowymi i ryzykami. Każda pozycja wskazuje miejsce, obecny zapis i wymaganą zmianę. Pozycje o priorytecie wysokim trzeba poprawić przed wysłaniem korekty, bo ekspert wskazał je w uwagach albo tworzą wprost sprzeczność w ocenianych polach.</w:t>
+      </w:r>
+    </w:p>
+    <w:tbl>
+      <w:tblPr>
+        <w:tblStyle w:val="TableGrid"/>
+        <w:tblW w:type="auto" w:w="0"/>
+        <w:jc w:val="center"/>
+        <w:tblLook w:firstColumn="1" w:firstRow="1" w:lastColumn="0" w:lastRow="0" w:noHBand="0" w:noVBand="1" w:val="04A0"/>
+      </w:tblPr>
+      <w:tblGrid>
+        <w:gridCol w:w="1606"/>
+        <w:gridCol w:w="1606"/>
+        <w:gridCol w:w="1606"/>
+        <w:gridCol w:w="1606"/>
+        <w:gridCol w:w="1606"/>
+        <w:gridCol w:w="1606"/>
+      </w:tblGrid>
+      <w:tr>
+        <w:tc>
+          <w:tcPr>
+            <w:tcW w:type="dxa" w:w="567"/>
+            <w:shd w:val="clear" w:color="auto" w:fill="D9E2F3"/>
+          </w:tcPr>
+          <w:p>
+            <w:pPr>
+              <w:spacing w:after="20"/>
+            </w:pPr>
+            <w:r/>
+            <w:r>
+              <w:rPr>
+                <w:b/>
+                <w:sz w:val="15"/>
+              </w:rPr>
+              <w:t>Nr</w:t>
+            </w:r>
+          </w:p>
+        </w:tc>
+        <w:tc>
+          <w:tcPr>
+            <w:tcW w:type="dxa" w:w="1871"/>
+            <w:shd w:val="clear" w:color="auto" w:fill="D9E2F3"/>
+          </w:tcPr>
+          <w:p>
+            <w:pPr>
+              <w:spacing w:after="20"/>
+            </w:pPr>
+            <w:r/>
+            <w:r>
+              <w:rPr>
+                <w:b/>
+                <w:sz w:val="15"/>
+              </w:rPr>
+              <w:t>Miejsce we wniosku</w:t>
+            </w:r>
+          </w:p>
+        </w:tc>
+        <w:tc>
+          <w:tcPr>
+            <w:tcW w:type="dxa" w:w="2041"/>
+            <w:shd w:val="clear" w:color="auto" w:fill="D9E2F3"/>
+          </w:tcPr>
+          <w:p>
+            <w:pPr>
+              <w:spacing w:after="20"/>
+            </w:pPr>
+            <w:r/>
+            <w:r>
+              <w:rPr>
+                <w:b/>
+                <w:sz w:val="15"/>
+              </w:rPr>
+              <w:t>Obecny zapis</w:t>
+            </w:r>
+          </w:p>
+        </w:tc>
+        <w:tc>
+          <w:tcPr>
+            <w:tcW w:type="dxa" w:w="3175"/>
+            <w:shd w:val="clear" w:color="auto" w:fill="D9E2F3"/>
+          </w:tcPr>
+          <w:p>
+            <w:pPr>
+              <w:spacing w:after="20"/>
+            </w:pPr>
+            <w:r/>
+            <w:r>
+              <w:rPr>
+                <w:b/>
+                <w:sz w:val="15"/>
+              </w:rPr>
+              <w:t>Wymagana zmiana</w:t>
+            </w:r>
+          </w:p>
+        </w:tc>
+        <w:tc>
+          <w:tcPr>
+            <w:tcW w:type="dxa" w:w="1247"/>
+            <w:shd w:val="clear" w:color="auto" w:fill="D9E2F3"/>
+          </w:tcPr>
+          <w:p>
+            <w:pPr>
+              <w:spacing w:after="20"/>
+            </w:pPr>
+            <w:r/>
+            <w:r>
+              <w:rPr>
+                <w:b/>
+                <w:sz w:val="15"/>
+              </w:rPr>
+              <w:t>Źródło</w:t>
+            </w:r>
+          </w:p>
+        </w:tc>
+        <w:tc>
+          <w:tcPr>
+            <w:tcW w:type="dxa" w:w="737"/>
+            <w:shd w:val="clear" w:color="auto" w:fill="D9E2F3"/>
+          </w:tcPr>
+          <w:p>
+            <w:pPr>
+              <w:spacing w:after="20"/>
+            </w:pPr>
+            <w:r/>
+            <w:r>
+              <w:rPr>
+                <w:b/>
+                <w:sz w:val="15"/>
+              </w:rPr>
+              <w:t>Priorytet</w:t>
+            </w:r>
+          </w:p>
+        </w:tc>
+      </w:tr>
+      <w:tr>
+        <w:tc>
+          <w:tcPr>
+            <w:tcW w:type="dxa" w:w="567"/>
+          </w:tcPr>
+          <w:p>
+            <w:pPr>
+              <w:spacing w:after="20"/>
+            </w:pPr>
+            <w:r/>
+            <w:r>
+              <w:rPr>
+                <w:b w:val="0"/>
+                <w:sz w:val="15"/>
+              </w:rPr>
+              <w:t>N01</w:t>
+            </w:r>
+          </w:p>
+        </w:tc>
+        <w:tc>
+          <w:tcPr>
+            <w:tcW w:type="dxa" w:w="1871"/>
+          </w:tcPr>
+          <w:p>
+            <w:pPr>
+              <w:spacing w:after="20"/>
+            </w:pPr>
+            <w:r/>
+            <w:r>
+              <w:rPr>
+                <w:b w:val="0"/>
+                <w:sz w:val="15"/>
+              </w:rPr>
+              <w:t>3.1.1 Nazwa zadania Z6 (i wszystkie pozycje kosztowe Z6 w 3.1.2)</w:t>
+            </w:r>
+          </w:p>
+        </w:tc>
+        <w:tc>
+          <w:tcPr>
+            <w:tcW w:type="dxa" w:w="2041"/>
+          </w:tcPr>
+          <w:p>
+            <w:pPr>
+              <w:spacing w:after="20"/>
+            </w:pPr>
+            <w:r/>
+            <w:r>
+              <w:rPr>
+                <w:b w:val="0"/>
+                <w:sz w:val="15"/>
+              </w:rPr>
+              <w:t>„Pipeline PoC + integracja TMS/eFTI/e-CMR (Z6)”: nazwa obejmuje integrację TMS i e-CMR, które opis Z6 wyłącza z prac B+R i kosztów.</w:t>
+            </w:r>
+          </w:p>
+        </w:tc>
+        <w:tc>
+          <w:tcPr>
+            <w:tcW w:type="dxa" w:w="3175"/>
+          </w:tcPr>
+          <w:p>
+            <w:pPr>
+              <w:spacing w:after="20"/>
+            </w:pPr>
+            <w:r/>
+            <w:r>
+              <w:rPr>
+                <w:b w:val="0"/>
+                <w:sz w:val="15"/>
+              </w:rPr>
+              <w:t>Zmienić nazwę, np. na „Pipeline PoL/PoC i zgodność z eFTI (Z6)”, we wszystkich pozycjach budżetu Z6 i w modelu finansowym. Alternatywa: zostawić nazwę i dodać w opisie zdanie, że integracje standardowe są poza zakresem (obecnie jest). Wymaga decyzji właściciela.</w:t>
+            </w:r>
+          </w:p>
+        </w:tc>
+        <w:tc>
+          <w:tcPr>
+            <w:tcW w:type="dxa" w:w="1247"/>
+          </w:tcPr>
+          <w:p>
+            <w:pPr>
+              <w:spacing w:after="20"/>
+            </w:pPr>
+            <w:r/>
+            <w:r>
+              <w:rPr>
+                <w:b w:val="0"/>
+                <w:sz w:val="15"/>
+              </w:rPr>
+              <w:t>K3-08; D24</w:t>
+            </w:r>
+          </w:p>
+        </w:tc>
+        <w:tc>
+          <w:tcPr>
+            <w:tcW w:type="dxa" w:w="737"/>
+          </w:tcPr>
+          <w:p>
+            <w:pPr>
+              <w:spacing w:after="20"/>
+            </w:pPr>
+            <w:r/>
+            <w:r>
+              <w:rPr>
+                <w:b w:val="0"/>
+                <w:sz w:val="15"/>
+              </w:rPr>
+              <w:t>WYSOKI</w:t>
+            </w:r>
+          </w:p>
+        </w:tc>
+      </w:tr>
+      <w:tr>
+        <w:tc>
+          <w:tcPr>
+            <w:tcW w:type="dxa" w:w="567"/>
+          </w:tcPr>
+          <w:p>
+            <w:pPr>
+              <w:spacing w:after="20"/>
+            </w:pPr>
+            <w:r/>
+            <w:r>
+              <w:rPr>
+                <w:b w:val="0"/>
+                <w:sz w:val="15"/>
+              </w:rPr>
+              <w:t>N02</w:t>
+            </w:r>
+          </w:p>
+        </w:tc>
+        <w:tc>
+          <w:tcPr>
+            <w:tcW w:type="dxa" w:w="1871"/>
+          </w:tcPr>
+          <w:p>
+            <w:pPr>
+              <w:spacing w:after="20"/>
+            </w:pPr>
+            <w:r/>
+            <w:r>
+              <w:rPr>
+                <w:b w:val="0"/>
+                <w:sz w:val="15"/>
+              </w:rPr>
+              <w:t>1.2 Wskaźnik innowacyjności nr 1 (model 3D): wartość docelowa, jednostka, metodologia</w:t>
+            </w:r>
+          </w:p>
+        </w:tc>
+        <w:tc>
+          <w:tcPr>
+            <w:tcW w:type="dxa" w:w="2041"/>
+          </w:tcPr>
+          <w:p>
+            <w:pPr>
+              <w:spacing w:after="20"/>
+            </w:pPr>
+            <w:r/>
+            <w:r>
+              <w:rPr>
+                <w:b w:val="0"/>
+                <w:sz w:val="15"/>
+              </w:rPr>
+              <w:t>„Błąd estymacji pozycji ≤30 cm”, jednostka [cm]/[Hz]; uzasadnienie, że błąd 30 cm pozwala wykryć przemieszczenie 100 mm.</w:t>
+            </w:r>
+          </w:p>
+        </w:tc>
+        <w:tc>
+          <w:tcPr>
+            <w:tcW w:type="dxa" w:w="3175"/>
+          </w:tcPr>
+          <w:p>
+            <w:pPr>
+              <w:spacing w:after="20"/>
+            </w:pPr>
+            <w:r/>
+            <w:r>
+              <w:rPr>
+                <w:b w:val="0"/>
+                <w:sz w:val="15"/>
+              </w:rPr>
+              <w:t xml:space="preserve">Jednostka [m]/[Hz]. Wartość: mediana nie więcej niż 0,30 m i percentyl 95 nie więcej niż 0,35 m. Poprawić uzasadnienie: wykrywanie przemieszczeń od 0,10 m opiera się na błędzie przemieszczenia względnego (mediana </w:t>
+            </w:r>
+            <w:r>
+              <w:rPr>
+                <w:b w:val="0"/>
+                <w:sz w:val="15"/>
+                <w:highlight w:val="yellow"/>
+              </w:rPr>
+              <w:t>0,03 m</w:t>
+            </w:r>
+            <w:r>
+              <w:rPr>
+                <w:b w:val="0"/>
+                <w:sz w:val="15"/>
+              </w:rPr>
+              <w:t>), a nie na błędzie pozycji bezwzględnej. Weryfikacja: Z5 (rig) i Z9 (1000 pomiarów).</w:t>
+            </w:r>
+          </w:p>
+        </w:tc>
+        <w:tc>
+          <w:tcPr>
+            <w:tcW w:type="dxa" w:w="1247"/>
+          </w:tcPr>
+          <w:p>
+            <w:pPr>
+              <w:spacing w:after="20"/>
+            </w:pPr>
+            <w:r/>
+            <w:r>
+              <w:rPr>
+                <w:b w:val="0"/>
+                <w:sz w:val="15"/>
+              </w:rPr>
+              <w:t>K3-16, K3-17, K3-13; KM-Z5, KM-Z9</w:t>
+            </w:r>
+          </w:p>
+        </w:tc>
+        <w:tc>
+          <w:tcPr>
+            <w:tcW w:type="dxa" w:w="737"/>
+          </w:tcPr>
+          <w:p>
+            <w:pPr>
+              <w:spacing w:after="20"/>
+            </w:pPr>
+            <w:r/>
+            <w:r>
+              <w:rPr>
+                <w:b w:val="0"/>
+                <w:sz w:val="15"/>
+              </w:rPr>
+              <w:t>WYSOKI</w:t>
+            </w:r>
+          </w:p>
+        </w:tc>
+      </w:tr>
+      <w:tr>
+        <w:tc>
+          <w:tcPr>
+            <w:tcW w:type="dxa" w:w="567"/>
+          </w:tcPr>
+          <w:p>
+            <w:pPr>
+              <w:spacing w:after="20"/>
+            </w:pPr>
+            <w:r/>
+            <w:r>
+              <w:rPr>
+                <w:b w:val="0"/>
+                <w:sz w:val="15"/>
+              </w:rPr>
+              <w:t>N03</w:t>
+            </w:r>
+          </w:p>
+        </w:tc>
+        <w:tc>
+          <w:tcPr>
+            <w:tcW w:type="dxa" w:w="1871"/>
+          </w:tcPr>
+          <w:p>
+            <w:pPr>
+              <w:spacing w:after="20"/>
+            </w:pPr>
+            <w:r/>
+            <w:r>
+              <w:rPr>
+                <w:b w:val="0"/>
+                <w:sz w:val="15"/>
+              </w:rPr>
+              <w:t>1.2 Wskaźnik nr 2 (AUC-ROC): wartość bazowa i weryfikacja</w:t>
+            </w:r>
+          </w:p>
+        </w:tc>
+        <w:tc>
+          <w:tcPr>
+            <w:tcW w:type="dxa" w:w="2041"/>
+          </w:tcPr>
+          <w:p>
+            <w:pPr>
+              <w:spacing w:after="20"/>
+            </w:pPr>
+            <w:r/>
+            <w:r>
+              <w:rPr>
+                <w:b w:val="0"/>
+                <w:sz w:val="15"/>
+              </w:rPr>
+              <w:t>Baza AUC-ROC 0,50 (klasyfikator losowy); weryfikacja: „niezależna walidacja Everest11 na danych terenowych Z9”.</w:t>
+            </w:r>
+          </w:p>
+        </w:tc>
+        <w:tc>
+          <w:tcPr>
+            <w:tcW w:type="dxa" w:w="3175"/>
+          </w:tcPr>
+          <w:p>
+            <w:pPr>
+              <w:spacing w:after="20"/>
+            </w:pPr>
+            <w:r/>
+            <w:r>
+              <w:rPr>
+                <w:b w:val="0"/>
+                <w:sz w:val="15"/>
+              </w:rPr>
+              <w:t>Baza: wynik detektora progowego wg EN 12195-1 zmierzony na tym samym teście w Z4 (D16). Wartość docelowa 0,85 dotyczy modelu FP32 (KM-Z4); w Z9 model po kompresji nie mniej niż 0,82. Usunąć sformułowanie o niezależnej walidacji Everest11, zastąpić ścieżką audytu Z9.</w:t>
+            </w:r>
+          </w:p>
+        </w:tc>
+        <w:tc>
+          <w:tcPr>
+            <w:tcW w:type="dxa" w:w="1247"/>
+          </w:tcPr>
+          <w:p>
+            <w:pPr>
+              <w:spacing w:after="20"/>
+            </w:pPr>
+            <w:r/>
+            <w:r>
+              <w:rPr>
+                <w:b w:val="0"/>
+                <w:sz w:val="15"/>
+              </w:rPr>
+              <w:t>K1-03, K3-15, K3-19; D16, D22</w:t>
+            </w:r>
+          </w:p>
+        </w:tc>
+        <w:tc>
+          <w:tcPr>
+            <w:tcW w:type="dxa" w:w="737"/>
+          </w:tcPr>
+          <w:p>
+            <w:pPr>
+              <w:spacing w:after="20"/>
+            </w:pPr>
+            <w:r/>
+            <w:r>
+              <w:rPr>
+                <w:b w:val="0"/>
+                <w:sz w:val="15"/>
+              </w:rPr>
+              <w:t>WYSOKI</w:t>
+            </w:r>
+          </w:p>
+        </w:tc>
+      </w:tr>
+      <w:tr>
+        <w:tc>
+          <w:tcPr>
+            <w:tcW w:type="dxa" w:w="567"/>
+          </w:tcPr>
+          <w:p>
+            <w:pPr>
+              <w:spacing w:after="20"/>
+            </w:pPr>
+            <w:r/>
+            <w:r>
+              <w:rPr>
+                <w:b w:val="0"/>
+                <w:sz w:val="15"/>
+              </w:rPr>
+              <w:t>N04</w:t>
+            </w:r>
+          </w:p>
+        </w:tc>
+        <w:tc>
+          <w:tcPr>
+            <w:tcW w:type="dxa" w:w="1871"/>
+          </w:tcPr>
+          <w:p>
+            <w:pPr>
+              <w:spacing w:after="20"/>
+            </w:pPr>
+            <w:r/>
+            <w:r>
+              <w:rPr>
+                <w:b w:val="0"/>
+                <w:sz w:val="15"/>
+              </w:rPr>
+              <w:t>1.2 Wskaźnik nr 3 (mAP)</w:t>
+            </w:r>
+          </w:p>
+        </w:tc>
+        <w:tc>
+          <w:tcPr>
+            <w:tcW w:type="dxa" w:w="2041"/>
+          </w:tcPr>
+          <w:p>
+            <w:pPr>
+              <w:spacing w:after="20"/>
+            </w:pPr>
+            <w:r/>
+            <w:r>
+              <w:rPr>
+                <w:b w:val="0"/>
+                <w:sz w:val="15"/>
+              </w:rPr>
+              <w:t>Wartość bazowa „N/D” w jednym miejscu i „0%” w innym; weryfikacja: „ocena eksperta TSL Everest11 jako ground truth”.</w:t>
+            </w:r>
+          </w:p>
+        </w:tc>
+        <w:tc>
+          <w:tcPr>
+            <w:tcW w:type="dxa" w:w="3175"/>
+          </w:tcPr>
+          <w:p>
+            <w:pPr>
+              <w:spacing w:after="20"/>
+            </w:pPr>
+            <w:r/>
+            <w:r>
+              <w:rPr>
+                <w:b w:val="0"/>
+                <w:sz w:val="15"/>
+              </w:rPr>
+              <w:t>Ujednolicić bazę jako „brak systemu, wartość 0”. Podać mAP 0,75 dla FP32 i 0,72 po kompresji (Z9). Ground truth: inspekcje z Z2 i procedura ślepa z Z9, bez wskazywania jednej osoby.</w:t>
+            </w:r>
+          </w:p>
+        </w:tc>
+        <w:tc>
+          <w:tcPr>
+            <w:tcW w:type="dxa" w:w="1247"/>
+          </w:tcPr>
+          <w:p>
+            <w:pPr>
+              <w:spacing w:after="20"/>
+            </w:pPr>
+            <w:r/>
+            <w:r>
+              <w:rPr>
+                <w:b w:val="0"/>
+                <w:sz w:val="15"/>
+              </w:rPr>
+              <w:t>K3-15, K3-19; D05, D22</w:t>
+            </w:r>
+          </w:p>
+        </w:tc>
+        <w:tc>
+          <w:tcPr>
+            <w:tcW w:type="dxa" w:w="737"/>
+          </w:tcPr>
+          <w:p>
+            <w:pPr>
+              <w:spacing w:after="20"/>
+            </w:pPr>
+            <w:r/>
+            <w:r>
+              <w:rPr>
+                <w:b w:val="0"/>
+                <w:sz w:val="15"/>
+              </w:rPr>
+              <w:t>WYSOKI</w:t>
+            </w:r>
+          </w:p>
+        </w:tc>
+      </w:tr>
+      <w:tr>
+        <w:tc>
+          <w:tcPr>
+            <w:tcW w:type="dxa" w:w="567"/>
+          </w:tcPr>
+          <w:p>
+            <w:pPr>
+              <w:spacing w:after="20"/>
+            </w:pPr>
+            <w:r/>
+            <w:r>
+              <w:rPr>
+                <w:b w:val="0"/>
+                <w:sz w:val="15"/>
+              </w:rPr>
+              <w:t>N05</w:t>
+            </w:r>
+          </w:p>
+        </w:tc>
+        <w:tc>
+          <w:tcPr>
+            <w:tcW w:type="dxa" w:w="1871"/>
+          </w:tcPr>
+          <w:p>
+            <w:pPr>
+              <w:spacing w:after="20"/>
+            </w:pPr>
+            <w:r/>
+            <w:r>
+              <w:rPr>
+                <w:b w:val="0"/>
+                <w:sz w:val="15"/>
+              </w:rPr>
+              <w:t>1.2 Wskaźnik nr 4 (czas PoC i zgodność z eFTI)</w:t>
+            </w:r>
+          </w:p>
+        </w:tc>
+        <w:tc>
+          <w:tcPr>
+            <w:tcW w:type="dxa" w:w="2041"/>
+          </w:tcPr>
+          <w:p>
+            <w:pPr>
+              <w:spacing w:after="20"/>
+            </w:pPr>
+            <w:r/>
+            <w:r>
+              <w:rPr>
+                <w:b w:val="0"/>
+                <w:sz w:val="15"/>
+              </w:rPr>
+              <w:t>„Testy terenowe Z9 na min. 50 cyklach”; zgodność z polami eFTI ≥95% bez określenia mianownika.</w:t>
+            </w:r>
+          </w:p>
+        </w:tc>
+        <w:tc>
+          <w:tcPr>
+            <w:tcW w:type="dxa" w:w="3175"/>
+          </w:tcPr>
+          <w:p>
+            <w:pPr>
+              <w:spacing w:after="20"/>
+            </w:pPr>
+            <w:r/>
+            <w:r>
+              <w:rPr>
+                <w:b w:val="0"/>
+                <w:sz w:val="15"/>
+              </w:rPr>
+              <w:t xml:space="preserve">Z9: co najmniej 200 cykli. Doprecyzować: 95% wszystkich pól obligatoryjnych; zgodność treści PoL/PoC z ground truth co najmniej 90% </w:t>
+            </w:r>
+            <w:r>
+              <w:rPr>
+                <w:b w:val="0"/>
+                <w:sz w:val="15"/>
+                <w:highlight w:val="yellow"/>
+              </w:rPr>
+              <w:t>do potwierdzenia</w:t>
+            </w:r>
+            <w:r>
+              <w:rPr>
+                <w:b w:val="0"/>
+                <w:sz w:val="15"/>
+              </w:rPr>
+              <w:t xml:space="preserve"> (KM-Z6).</w:t>
+            </w:r>
+          </w:p>
+        </w:tc>
+        <w:tc>
+          <w:tcPr>
+            <w:tcW w:type="dxa" w:w="1247"/>
+          </w:tcPr>
+          <w:p>
+            <w:pPr>
+              <w:spacing w:after="20"/>
+            </w:pPr>
+            <w:r/>
+            <w:r>
+              <w:rPr>
+                <w:b w:val="0"/>
+                <w:sz w:val="15"/>
+              </w:rPr>
+              <w:t>K3-20; KM-Z6, KM-Z9</w:t>
+            </w:r>
+          </w:p>
+        </w:tc>
+        <w:tc>
+          <w:tcPr>
+            <w:tcW w:type="dxa" w:w="737"/>
+          </w:tcPr>
+          <w:p>
+            <w:pPr>
+              <w:spacing w:after="20"/>
+            </w:pPr>
+            <w:r/>
+            <w:r>
+              <w:rPr>
+                <w:b w:val="0"/>
+                <w:sz w:val="15"/>
+              </w:rPr>
+              <w:t>ŚREDNI</w:t>
+            </w:r>
+          </w:p>
+        </w:tc>
+      </w:tr>
+      <w:tr>
+        <w:tc>
+          <w:tcPr>
+            <w:tcW w:type="dxa" w:w="567"/>
+          </w:tcPr>
+          <w:p>
+            <w:pPr>
+              <w:spacing w:after="20"/>
+            </w:pPr>
+            <w:r/>
+            <w:r>
+              <w:rPr>
+                <w:b w:val="0"/>
+                <w:sz w:val="15"/>
+              </w:rPr>
+              <w:t>N06</w:t>
+            </w:r>
+          </w:p>
+        </w:tc>
+        <w:tc>
+          <w:tcPr>
+            <w:tcW w:type="dxa" w:w="1871"/>
+          </w:tcPr>
+          <w:p>
+            <w:pPr>
+              <w:spacing w:after="20"/>
+            </w:pPr>
+            <w:r/>
+            <w:r>
+              <w:rPr>
+                <w:b w:val="0"/>
+                <w:sz w:val="15"/>
+              </w:rPr>
+              <w:t>1.2 Wskaźnik nr 5 (opóźnienie alertu): jednostka i baza</w:t>
+            </w:r>
+          </w:p>
+        </w:tc>
+        <w:tc>
+          <w:tcPr>
+            <w:tcW w:type="dxa" w:w="2041"/>
+          </w:tcPr>
+          <w:p>
+            <w:pPr>
+              <w:spacing w:after="20"/>
+            </w:pPr>
+            <w:r/>
+            <w:r>
+              <w:rPr>
+                <w:b w:val="0"/>
+                <w:sz w:val="15"/>
+              </w:rPr>
+              <w:t>Jednostka [ms], baza „≥300 000 ms”.</w:t>
+            </w:r>
+          </w:p>
+        </w:tc>
+        <w:tc>
+          <w:tcPr>
+            <w:tcW w:type="dxa" w:w="3175"/>
+          </w:tcPr>
+          <w:p>
+            <w:pPr>
+              <w:spacing w:after="20"/>
+            </w:pPr>
+            <w:r/>
+            <w:r>
+              <w:rPr>
+                <w:b w:val="0"/>
+                <w:sz w:val="15"/>
+              </w:rPr>
+              <w:t>Jednostka [s]: wartość docelowa 1 s (percentyl 95), baza 300 s. Dodać, że parametr jest mierzony po kompresji (Z7) i w terenie (Z9).</w:t>
+            </w:r>
+          </w:p>
+        </w:tc>
+        <w:tc>
+          <w:tcPr>
+            <w:tcW w:type="dxa" w:w="1247"/>
+          </w:tcPr>
+          <w:p>
+            <w:pPr>
+              <w:spacing w:after="20"/>
+            </w:pPr>
+            <w:r/>
+            <w:r>
+              <w:rPr>
+                <w:b w:val="0"/>
+                <w:sz w:val="15"/>
+              </w:rPr>
+              <w:t>Instrukcja (SI); K3-17; D18</w:t>
+            </w:r>
+          </w:p>
+        </w:tc>
+        <w:tc>
+          <w:tcPr>
+            <w:tcW w:type="dxa" w:w="737"/>
+          </w:tcPr>
+          <w:p>
+            <w:pPr>
+              <w:spacing w:after="20"/>
+            </w:pPr>
+            <w:r/>
+            <w:r>
+              <w:rPr>
+                <w:b w:val="0"/>
+                <w:sz w:val="15"/>
+              </w:rPr>
+              <w:t>ŚREDNI</w:t>
+            </w:r>
+          </w:p>
+        </w:tc>
+      </w:tr>
+      <w:tr>
+        <w:tc>
+          <w:tcPr>
+            <w:tcW w:type="dxa" w:w="567"/>
+          </w:tcPr>
+          <w:p>
+            <w:pPr>
+              <w:spacing w:after="20"/>
+            </w:pPr>
+            <w:r/>
+            <w:r>
+              <w:rPr>
+                <w:b w:val="0"/>
+                <w:sz w:val="15"/>
+              </w:rPr>
+              <w:t>N07</w:t>
+            </w:r>
+          </w:p>
+        </w:tc>
+        <w:tc>
+          <w:tcPr>
+            <w:tcW w:type="dxa" w:w="1871"/>
+          </w:tcPr>
+          <w:p>
+            <w:pPr>
+              <w:spacing w:after="20"/>
+            </w:pPr>
+            <w:r/>
+            <w:r>
+              <w:rPr>
+                <w:b w:val="0"/>
+                <w:sz w:val="15"/>
+              </w:rPr>
+              <w:t>1.4 Wskaźnik dodatkowy: pokrycie pól eFTI</w:t>
+            </w:r>
+          </w:p>
+        </w:tc>
+        <w:tc>
+          <w:tcPr>
+            <w:tcW w:type="dxa" w:w="2041"/>
+          </w:tcPr>
+          <w:p>
+            <w:pPr>
+              <w:spacing w:after="20"/>
+            </w:pPr>
+            <w:r/>
+            <w:r>
+              <w:rPr>
+                <w:b w:val="0"/>
+                <w:sz w:val="15"/>
+              </w:rPr>
+              <w:t>„potwierdzone audytem podwykonawcy prawnego”, „audyt prawny podwykonawcy (Z6)”.</w:t>
+            </w:r>
+          </w:p>
+        </w:tc>
+        <w:tc>
+          <w:tcPr>
+            <w:tcW w:type="dxa" w:w="3175"/>
+          </w:tcPr>
+          <w:p>
+            <w:pPr>
+              <w:spacing w:after="20"/>
+            </w:pPr>
+            <w:r/>
+            <w:r>
+              <w:rPr>
+                <w:b w:val="0"/>
+                <w:sz w:val="15"/>
+              </w:rPr>
+              <w:t>Usunąć podwykonawcę prawnego (nie ma go w budżecie). Metoda: test zgodności z implementacją referencyjną KE i walidacja XSD wykonane przez zespół Everest11 (Z6).</w:t>
+            </w:r>
+          </w:p>
+        </w:tc>
+        <w:tc>
+          <w:tcPr>
+            <w:tcW w:type="dxa" w:w="1247"/>
+          </w:tcPr>
+          <w:p>
+            <w:pPr>
+              <w:spacing w:after="20"/>
+            </w:pPr>
+            <w:r/>
+            <w:r>
+              <w:rPr>
+                <w:b w:val="0"/>
+                <w:sz w:val="15"/>
+              </w:rPr>
+              <w:t>K3-08, K3-45; opis Z6</w:t>
+            </w:r>
+          </w:p>
+        </w:tc>
+        <w:tc>
+          <w:tcPr>
+            <w:tcW w:type="dxa" w:w="737"/>
+          </w:tcPr>
+          <w:p>
+            <w:pPr>
+              <w:spacing w:after="20"/>
+            </w:pPr>
+            <w:r/>
+            <w:r>
+              <w:rPr>
+                <w:b w:val="0"/>
+                <w:sz w:val="15"/>
+              </w:rPr>
+              <w:t>WYSOKI</w:t>
+            </w:r>
+          </w:p>
+        </w:tc>
+      </w:tr>
+      <w:tr>
+        <w:tc>
+          <w:tcPr>
+            <w:tcW w:type="dxa" w:w="567"/>
+          </w:tcPr>
+          <w:p>
+            <w:pPr>
+              <w:spacing w:after="20"/>
+            </w:pPr>
+            <w:r/>
+            <w:r>
+              <w:rPr>
+                <w:b w:val="0"/>
+                <w:sz w:val="15"/>
+              </w:rPr>
+              <w:t>N08</w:t>
+            </w:r>
+          </w:p>
+        </w:tc>
+        <w:tc>
+          <w:tcPr>
+            <w:tcW w:type="dxa" w:w="1871"/>
+          </w:tcPr>
+          <w:p>
+            <w:pPr>
+              <w:spacing w:after="20"/>
+            </w:pPr>
+            <w:r/>
+            <w:r>
+              <w:rPr>
+                <w:b w:val="0"/>
+                <w:sz w:val="15"/>
+              </w:rPr>
+              <w:t>1.4 Wskaźnik dodatkowy: wykorzystanie kubatury (fill rate)</w:t>
+            </w:r>
+          </w:p>
+        </w:tc>
+        <w:tc>
+          <w:tcPr>
+            <w:tcW w:type="dxa" w:w="2041"/>
+          </w:tcPr>
+          <w:p>
+            <w:pPr>
+              <w:spacing w:after="20"/>
+            </w:pPr>
+            <w:r/>
+            <w:r>
+              <w:rPr>
+                <w:b w:val="0"/>
+                <w:sz w:val="15"/>
+              </w:rPr>
+              <w:t>Pomiar radarem mmWave na kursach floty w Z9; baza 65% (Eurostat 2024, źródło niezweryfikowane).</w:t>
+            </w:r>
+          </w:p>
+        </w:tc>
+        <w:tc>
+          <w:tcPr>
+            <w:tcW w:type="dxa" w:w="3175"/>
+          </w:tcPr>
+          <w:p>
+            <w:pPr>
+              <w:spacing w:after="20"/>
+            </w:pPr>
+            <w:r/>
+            <w:r>
+              <w:rPr>
+                <w:b w:val="0"/>
+                <w:sz w:val="15"/>
+              </w:rPr>
+              <w:t>Z9 zawiera teraz wskaźnik operacyjny (cel 80%), niebędący parametrem kamienia. Baza 65%: potwierdzić źródło (D20) albo przeformułować jako wartość mierzoną na tych samych pojazdach przed wdrożeniem.</w:t>
+            </w:r>
+          </w:p>
+        </w:tc>
+        <w:tc>
+          <w:tcPr>
+            <w:tcW w:type="dxa" w:w="1247"/>
+          </w:tcPr>
+          <w:p>
+            <w:pPr>
+              <w:spacing w:after="20"/>
+            </w:pPr>
+            <w:r/>
+            <w:r>
+              <w:rPr>
+                <w:b w:val="0"/>
+                <w:sz w:val="15"/>
+              </w:rPr>
+              <w:t>D20; opis Z9</w:t>
+            </w:r>
+          </w:p>
+        </w:tc>
+        <w:tc>
+          <w:tcPr>
+            <w:tcW w:type="dxa" w:w="737"/>
+          </w:tcPr>
+          <w:p>
+            <w:pPr>
+              <w:spacing w:after="20"/>
+            </w:pPr>
+            <w:r/>
+            <w:r>
+              <w:rPr>
+                <w:b w:val="0"/>
+                <w:sz w:val="15"/>
+              </w:rPr>
+              <w:t>ŚREDNI</w:t>
+            </w:r>
+          </w:p>
+        </w:tc>
+      </w:tr>
+      <w:tr>
+        <w:tc>
+          <w:tcPr>
+            <w:tcW w:type="dxa" w:w="567"/>
+          </w:tcPr>
+          <w:p>
+            <w:pPr>
+              <w:spacing w:after="20"/>
+            </w:pPr>
+            <w:r/>
+            <w:r>
+              <w:rPr>
+                <w:b w:val="0"/>
+                <w:sz w:val="15"/>
+              </w:rPr>
+              <w:t>N09</w:t>
+            </w:r>
+          </w:p>
+        </w:tc>
+        <w:tc>
+          <w:tcPr>
+            <w:tcW w:type="dxa" w:w="1871"/>
+          </w:tcPr>
+          <w:p>
+            <w:pPr>
+              <w:spacing w:after="20"/>
+            </w:pPr>
+            <w:r/>
+            <w:r>
+              <w:rPr>
+                <w:b w:val="0"/>
+                <w:sz w:val="15"/>
+              </w:rPr>
+              <w:t>1.1 Cel projektu, 1.2 Innowacyjność, opis prac Z2 i Z5 (wiersze z „0,5 g”)</w:t>
+            </w:r>
+          </w:p>
+        </w:tc>
+        <w:tc>
+          <w:tcPr>
+            <w:tcW w:type="dxa" w:w="2041"/>
+          </w:tcPr>
+          <w:p>
+            <w:pPr>
+              <w:spacing w:after="20"/>
+            </w:pPr>
+            <w:r/>
+            <w:r>
+              <w:rPr>
+                <w:b w:val="0"/>
+                <w:sz w:val="15"/>
+              </w:rPr>
+              <w:t>„amplitudy do 0,5 g”.</w:t>
+            </w:r>
+          </w:p>
+        </w:tc>
+        <w:tc>
+          <w:tcPr>
+            <w:tcW w:type="dxa" w:w="3175"/>
+          </w:tcPr>
+          <w:p>
+            <w:pPr>
+              <w:spacing w:after="20"/>
+            </w:pPr>
+            <w:r/>
+            <w:r>
+              <w:rPr>
+                <w:b w:val="0"/>
+                <w:sz w:val="15"/>
+              </w:rPr>
+              <w:t>Zapis w SI: „do 4,9 m/s2 (0,5 g)”, spójnie z KM-Z2, KM-Z5 i opisami zadań.</w:t>
+            </w:r>
+          </w:p>
+        </w:tc>
+        <w:tc>
+          <w:tcPr>
+            <w:tcW w:type="dxa" w:w="1247"/>
+          </w:tcPr>
+          <w:p>
+            <w:pPr>
+              <w:spacing w:after="20"/>
+            </w:pPr>
+            <w:r/>
+            <w:r>
+              <w:rPr>
+                <w:b w:val="0"/>
+                <w:sz w:val="15"/>
+              </w:rPr>
+              <w:t>D18</w:t>
+            </w:r>
+          </w:p>
+        </w:tc>
+        <w:tc>
+          <w:tcPr>
+            <w:tcW w:type="dxa" w:w="737"/>
+          </w:tcPr>
+          <w:p>
+            <w:pPr>
+              <w:spacing w:after="20"/>
+            </w:pPr>
+            <w:r/>
+            <w:r>
+              <w:rPr>
+                <w:b w:val="0"/>
+                <w:sz w:val="15"/>
+              </w:rPr>
+              <w:t>NISKI</w:t>
+            </w:r>
+          </w:p>
+        </w:tc>
+      </w:tr>
+      <w:tr>
+        <w:tc>
+          <w:tcPr>
+            <w:tcW w:type="dxa" w:w="567"/>
+          </w:tcPr>
+          <w:p>
+            <w:pPr>
+              <w:spacing w:after="20"/>
+            </w:pPr>
+            <w:r/>
+            <w:r>
+              <w:rPr>
+                <w:b w:val="0"/>
+                <w:sz w:val="15"/>
+              </w:rPr>
+              <w:t>N10</w:t>
+            </w:r>
+          </w:p>
+        </w:tc>
+        <w:tc>
+          <w:tcPr>
+            <w:tcW w:type="dxa" w:w="1871"/>
+          </w:tcPr>
+          <w:p>
+            <w:pPr>
+              <w:spacing w:after="20"/>
+            </w:pPr>
+            <w:r/>
+            <w:r>
+              <w:rPr>
+                <w:b w:val="0"/>
+                <w:sz w:val="15"/>
+              </w:rPr>
+              <w:t>3.1.1 Opisy zadań Z1-Z9 i kamienie milowe (pola zakresu, szczegółowego opisu, KM)</w:t>
+            </w:r>
+          </w:p>
+        </w:tc>
+        <w:tc>
+          <w:tcPr>
+            <w:tcW w:type="dxa" w:w="2041"/>
+          </w:tcPr>
+          <w:p>
+            <w:pPr>
+              <w:spacing w:after="20"/>
+            </w:pPr>
+            <w:r/>
+            <w:r>
+              <w:rPr>
+                <w:b w:val="0"/>
+                <w:sz w:val="15"/>
+              </w:rPr>
+              <w:t>Obecne teksty.</w:t>
+            </w:r>
+          </w:p>
+        </w:tc>
+        <w:tc>
+          <w:tcPr>
+            <w:tcW w:type="dxa" w:w="3175"/>
+          </w:tcPr>
+          <w:p>
+            <w:pPr>
+              <w:spacing w:after="20"/>
+            </w:pPr>
+            <w:r/>
+            <w:r>
+              <w:rPr>
+                <w:b w:val="0"/>
+                <w:sz w:val="15"/>
+              </w:rPr>
+              <w:t>Zastąpić tekstami z części pierwszej tego dokumentu.</w:t>
+            </w:r>
+          </w:p>
+        </w:tc>
+        <w:tc>
+          <w:tcPr>
+            <w:tcW w:type="dxa" w:w="1247"/>
+          </w:tcPr>
+          <w:p>
+            <w:pPr>
+              <w:spacing w:after="20"/>
+            </w:pPr>
+            <w:r/>
+            <w:r>
+              <w:rPr>
+                <w:b w:val="0"/>
+                <w:sz w:val="15"/>
+              </w:rPr>
+              <w:t>K3-01 do K3-22</w:t>
+            </w:r>
+          </w:p>
+        </w:tc>
+        <w:tc>
+          <w:tcPr>
+            <w:tcW w:type="dxa" w:w="737"/>
+          </w:tcPr>
+          <w:p>
+            <w:pPr>
+              <w:spacing w:after="20"/>
+            </w:pPr>
+            <w:r/>
+            <w:r>
+              <w:rPr>
+                <w:b w:val="0"/>
+                <w:sz w:val="15"/>
+              </w:rPr>
+              <w:t>WYSOKI</w:t>
+            </w:r>
+          </w:p>
+        </w:tc>
+      </w:tr>
+      <w:tr>
+        <w:tc>
+          <w:tcPr>
+            <w:tcW w:type="dxa" w:w="567"/>
+          </w:tcPr>
+          <w:p>
+            <w:pPr>
+              <w:spacing w:after="20"/>
+            </w:pPr>
+            <w:r/>
+            <w:r>
+              <w:rPr>
+                <w:b w:val="0"/>
+                <w:sz w:val="15"/>
+              </w:rPr>
+              <w:t>N11</w:t>
+            </w:r>
+          </w:p>
+        </w:tc>
+        <w:tc>
+          <w:tcPr>
+            <w:tcW w:type="dxa" w:w="1871"/>
+          </w:tcPr>
+          <w:p>
+            <w:pPr>
+              <w:spacing w:after="20"/>
+            </w:pPr>
+            <w:r/>
+            <w:r>
+              <w:rPr>
+                <w:b w:val="0"/>
+                <w:sz w:val="15"/>
+              </w:rPr>
+              <w:t>3.1.2 Uzasadnienie kosztu: AI Senior Engineer Z2</w:t>
+            </w:r>
+          </w:p>
+        </w:tc>
+        <w:tc>
+          <w:tcPr>
+            <w:tcW w:type="dxa" w:w="2041"/>
+          </w:tcPr>
+          <w:p>
+            <w:pPr>
+              <w:spacing w:after="20"/>
+            </w:pPr>
+            <w:r/>
+            <w:r>
+              <w:rPr>
+                <w:b w:val="0"/>
+                <w:sz w:val="15"/>
+              </w:rPr>
+              <w:t>„Opracuje specyfikację anotacji Instance Segmentation COCO dla podwykonawcy”.</w:t>
+            </w:r>
+          </w:p>
+        </w:tc>
+        <w:tc>
+          <w:tcPr>
+            <w:tcW w:type="dxa" w:w="3175"/>
+          </w:tcPr>
+          <w:p>
+            <w:pPr>
+              <w:spacing w:after="20"/>
+            </w:pPr>
+            <w:r/>
+            <w:r>
+              <w:rPr>
+                <w:b w:val="0"/>
+                <w:sz w:val="15"/>
+              </w:rPr>
+              <w:t>„dla anotatorów Everest11”. Anotacja jest realizowana przez personel Lidera.</w:t>
+            </w:r>
+          </w:p>
+        </w:tc>
+        <w:tc>
+          <w:tcPr>
+            <w:tcW w:type="dxa" w:w="1247"/>
+          </w:tcPr>
+          <w:p>
+            <w:pPr>
+              <w:spacing w:after="20"/>
+            </w:pPr>
+            <w:r/>
+            <w:r>
+              <w:rPr>
+                <w:b w:val="0"/>
+                <w:sz w:val="15"/>
+              </w:rPr>
+              <w:t>K3-10, K3-39; D21</w:t>
+            </w:r>
+          </w:p>
+        </w:tc>
+        <w:tc>
+          <w:tcPr>
+            <w:tcW w:type="dxa" w:w="737"/>
+          </w:tcPr>
+          <w:p>
+            <w:pPr>
+              <w:spacing w:after="20"/>
+            </w:pPr>
+            <w:r/>
+            <w:r>
+              <w:rPr>
+                <w:b w:val="0"/>
+                <w:sz w:val="15"/>
+              </w:rPr>
+              <w:t>WYSOKI</w:t>
+            </w:r>
+          </w:p>
+        </w:tc>
+      </w:tr>
+      <w:tr>
+        <w:tc>
+          <w:tcPr>
+            <w:tcW w:type="dxa" w:w="567"/>
+          </w:tcPr>
+          <w:p>
+            <w:pPr>
+              <w:spacing w:after="20"/>
+            </w:pPr>
+            <w:r/>
+            <w:r>
+              <w:rPr>
+                <w:b w:val="0"/>
+                <w:sz w:val="15"/>
+              </w:rPr>
+              <w:t>N12</w:t>
+            </w:r>
+          </w:p>
+        </w:tc>
+        <w:tc>
+          <w:tcPr>
+            <w:tcW w:type="dxa" w:w="1871"/>
+          </w:tcPr>
+          <w:p>
+            <w:pPr>
+              <w:spacing w:after="20"/>
+            </w:pPr>
+            <w:r/>
+            <w:r>
+              <w:rPr>
+                <w:b w:val="0"/>
+                <w:sz w:val="15"/>
+              </w:rPr>
+              <w:t>3.1.2 Uzasadnienie kosztu: Anotatorzy Z2</w:t>
+            </w:r>
+          </w:p>
+        </w:tc>
+        <w:tc>
+          <w:tcPr>
+            <w:tcW w:type="dxa" w:w="2041"/>
+          </w:tcPr>
+          <w:p>
+            <w:pPr>
+              <w:spacing w:after="20"/>
+            </w:pPr>
+            <w:r/>
+            <w:r>
+              <w:rPr>
+                <w:b w:val="0"/>
+                <w:sz w:val="15"/>
+              </w:rPr>
+              <w:t>Zakres i nakład „wg wolumenu”.</w:t>
+            </w:r>
+          </w:p>
+        </w:tc>
+        <w:tc>
+          <w:tcPr>
+            <w:tcW w:type="dxa" w:w="3175"/>
+          </w:tcPr>
+          <w:p>
+            <w:pPr>
+              <w:spacing w:after="20"/>
+            </w:pPr>
+            <w:r/>
+            <w:r>
+              <w:rPr>
+                <w:b w:val="0"/>
+                <w:sz w:val="15"/>
+              </w:rPr>
+              <w:t xml:space="preserve">3 osoby, 1,0 etatu, 10 miesięcy </w:t>
+            </w:r>
+            <w:r>
+              <w:rPr>
+                <w:b w:val="0"/>
+                <w:sz w:val="15"/>
+                <w:highlight w:val="yellow"/>
+              </w:rPr>
+              <w:t>M9-M18</w:t>
+            </w:r>
+            <w:r>
+              <w:rPr>
+                <w:b w:val="0"/>
+                <w:sz w:val="15"/>
+              </w:rPr>
+              <w:t>, zakres jak w opisie Z2 (anotacja, zgłaszanie przypadków niejednoznacznych, udział w pomiarze zgodności). Zgodnie z nakładem 3200-3600 godzin w budżecie porównać z 3 x 10 x 168 godzin.</w:t>
+            </w:r>
+          </w:p>
+        </w:tc>
+        <w:tc>
+          <w:tcPr>
+            <w:tcW w:type="dxa" w:w="1247"/>
+          </w:tcPr>
+          <w:p>
+            <w:pPr>
+              <w:spacing w:after="20"/>
+            </w:pPr>
+            <w:r/>
+            <w:r>
+              <w:rPr>
+                <w:b w:val="0"/>
+                <w:sz w:val="15"/>
+              </w:rPr>
+              <w:t>K3-39, K5-03</w:t>
+            </w:r>
+          </w:p>
+        </w:tc>
+        <w:tc>
+          <w:tcPr>
+            <w:tcW w:type="dxa" w:w="737"/>
+          </w:tcPr>
+          <w:p>
+            <w:pPr>
+              <w:spacing w:after="20"/>
+            </w:pPr>
+            <w:r/>
+            <w:r>
+              <w:rPr>
+                <w:b w:val="0"/>
+                <w:sz w:val="15"/>
+              </w:rPr>
+              <w:t>WYSOKI</w:t>
+            </w:r>
+          </w:p>
+        </w:tc>
+      </w:tr>
+      <w:tr>
+        <w:tc>
+          <w:tcPr>
+            <w:tcW w:type="dxa" w:w="567"/>
+          </w:tcPr>
+          <w:p>
+            <w:pPr>
+              <w:spacing w:after="20"/>
+            </w:pPr>
+            <w:r/>
+            <w:r>
+              <w:rPr>
+                <w:b w:val="0"/>
+                <w:sz w:val="15"/>
+              </w:rPr>
+              <w:t>N13</w:t>
+            </w:r>
+          </w:p>
+        </w:tc>
+        <w:tc>
+          <w:tcPr>
+            <w:tcW w:type="dxa" w:w="1871"/>
+          </w:tcPr>
+          <w:p>
+            <w:pPr>
+              <w:spacing w:after="20"/>
+            </w:pPr>
+            <w:r/>
+            <w:r>
+              <w:rPr>
+                <w:b w:val="0"/>
+                <w:sz w:val="15"/>
+              </w:rPr>
+              <w:t>3.1.2 Uzasadnienie kosztu: Cybersecurity / AI Act Specialist Z9 (wiersz „przegląd prior art i analizę freedom-to-operate”, aktualizacja dokumentacji AI Act)</w:t>
+            </w:r>
+          </w:p>
+        </w:tc>
+        <w:tc>
+          <w:tcPr>
+            <w:tcW w:type="dxa" w:w="2041"/>
+          </w:tcPr>
+          <w:p>
+            <w:pPr>
+              <w:spacing w:after="20"/>
+            </w:pPr>
+            <w:r/>
+            <w:r>
+              <w:rPr>
+                <w:b w:val="0"/>
+                <w:sz w:val="15"/>
+              </w:rPr>
+              <w:t>Aktualizacja dokumentacji AI Act, integralność PoC, materiały do zgłoszenia EPO, prior art, FTO.</w:t>
+            </w:r>
+          </w:p>
+        </w:tc>
+        <w:tc>
+          <w:tcPr>
+            <w:tcW w:type="dxa" w:w="3175"/>
+          </w:tcPr>
+          <w:p>
+            <w:pPr>
+              <w:spacing w:after="20"/>
+            </w:pPr>
+            <w:r/>
+            <w:r>
+              <w:rPr>
+                <w:b w:val="0"/>
+                <w:sz w:val="15"/>
+              </w:rPr>
+              <w:t>Zostawić testy bezpieczeństwa prototypu w terenie i uruchamianie zamrożonego skryptu ewaluacyjnego (niezależny ewaluator). Usunąć AI Act, EPO, prior art, FTO (są w Z11 i poza B+R).</w:t>
+            </w:r>
+          </w:p>
+        </w:tc>
+        <w:tc>
+          <w:tcPr>
+            <w:tcW w:type="dxa" w:w="1247"/>
+          </w:tcPr>
+          <w:p>
+            <w:pPr>
+              <w:spacing w:after="20"/>
+            </w:pPr>
+            <w:r/>
+            <w:r>
+              <w:rPr>
+                <w:b w:val="0"/>
+                <w:sz w:val="15"/>
+              </w:rPr>
+              <w:t>K3-40, K3-66; D05</w:t>
+            </w:r>
+          </w:p>
+        </w:tc>
+        <w:tc>
+          <w:tcPr>
+            <w:tcW w:type="dxa" w:w="737"/>
+          </w:tcPr>
+          <w:p>
+            <w:pPr>
+              <w:spacing w:after="20"/>
+            </w:pPr>
+            <w:r/>
+            <w:r>
+              <w:rPr>
+                <w:b w:val="0"/>
+                <w:sz w:val="15"/>
+              </w:rPr>
+              <w:t>WYSOKI</w:t>
+            </w:r>
+          </w:p>
+        </w:tc>
+      </w:tr>
+      <w:tr>
+        <w:tc>
+          <w:tcPr>
+            <w:tcW w:type="dxa" w:w="567"/>
+          </w:tcPr>
+          <w:p>
+            <w:pPr>
+              <w:spacing w:after="20"/>
+            </w:pPr>
+            <w:r/>
+            <w:r>
+              <w:rPr>
+                <w:b w:val="0"/>
+                <w:sz w:val="15"/>
+              </w:rPr>
+              <w:t>N14</w:t>
+            </w:r>
+          </w:p>
+        </w:tc>
+        <w:tc>
+          <w:tcPr>
+            <w:tcW w:type="dxa" w:w="1871"/>
+          </w:tcPr>
+          <w:p>
+            <w:pPr>
+              <w:spacing w:after="20"/>
+            </w:pPr>
+            <w:r/>
+            <w:r>
+              <w:rPr>
+                <w:b w:val="0"/>
+                <w:sz w:val="15"/>
+              </w:rPr>
+              <w:t>3.1.2 Uzasadnienia kosztu: Cybersecurity Z2 i Z6</w:t>
+            </w:r>
+          </w:p>
+        </w:tc>
+        <w:tc>
+          <w:tcPr>
+            <w:tcW w:type="dxa" w:w="2041"/>
+          </w:tcPr>
+          <w:p>
+            <w:pPr>
+              <w:spacing w:after="20"/>
+            </w:pPr>
+            <w:r/>
+            <w:r>
+              <w:rPr>
+                <w:b w:val="0"/>
+                <w:sz w:val="15"/>
+              </w:rPr>
+              <w:t>Klasyfikacja ryzyka AI Act, karta oceny ryzyka, polityka RODO.</w:t>
+            </w:r>
+          </w:p>
+        </w:tc>
+        <w:tc>
+          <w:tcPr>
+            <w:tcW w:type="dxa" w:w="3175"/>
+          </w:tcPr>
+          <w:p>
+            <w:pPr>
+              <w:spacing w:after="20"/>
+            </w:pPr>
+            <w:r/>
+            <w:r>
+              <w:rPr>
+                <w:b w:val="0"/>
+                <w:sz w:val="15"/>
+              </w:rPr>
+              <w:t>Zostawić prace techniczne (szyfrowanie, klucze, pseudonimizacja, podpis, integralność). Usunąć dokumentację AI Act i politykę RODO z kosztów B+R (czynność przedwdrożeniowa).</w:t>
+            </w:r>
+          </w:p>
+        </w:tc>
+        <w:tc>
+          <w:tcPr>
+            <w:tcW w:type="dxa" w:w="1247"/>
+          </w:tcPr>
+          <w:p>
+            <w:pPr>
+              <w:spacing w:after="20"/>
+            </w:pPr>
+            <w:r/>
+            <w:r>
+              <w:rPr>
+                <w:b w:val="0"/>
+                <w:sz w:val="15"/>
+              </w:rPr>
+              <w:t>K3-38; 6.1 Maziarz</w:t>
+            </w:r>
+          </w:p>
+        </w:tc>
+        <w:tc>
+          <w:tcPr>
+            <w:tcW w:type="dxa" w:w="737"/>
+          </w:tcPr>
+          <w:p>
+            <w:pPr>
+              <w:spacing w:after="20"/>
+            </w:pPr>
+            <w:r/>
+            <w:r>
+              <w:rPr>
+                <w:b w:val="0"/>
+                <w:sz w:val="15"/>
+              </w:rPr>
+              <w:t>WYSOKI</w:t>
+            </w:r>
+          </w:p>
+        </w:tc>
+      </w:tr>
+      <w:tr>
+        <w:tc>
+          <w:tcPr>
+            <w:tcW w:type="dxa" w:w="567"/>
+          </w:tcPr>
+          <w:p>
+            <w:pPr>
+              <w:spacing w:after="20"/>
+            </w:pPr>
+            <w:r/>
+            <w:r>
+              <w:rPr>
+                <w:b w:val="0"/>
+                <w:sz w:val="15"/>
+              </w:rPr>
+              <w:t>N15</w:t>
+            </w:r>
+          </w:p>
+        </w:tc>
+        <w:tc>
+          <w:tcPr>
+            <w:tcW w:type="dxa" w:w="1871"/>
+          </w:tcPr>
+          <w:p>
+            <w:pPr>
+              <w:spacing w:after="20"/>
+            </w:pPr>
+            <w:r/>
+            <w:r>
+              <w:rPr>
+                <w:b w:val="0"/>
+                <w:sz w:val="15"/>
+              </w:rPr>
+              <w:t>3.1.2 Uzasadnienia kosztu: IT Specialist Z6 i Backend/Full-Stack Z6</w:t>
+            </w:r>
+          </w:p>
+        </w:tc>
+        <w:tc>
+          <w:tcPr>
+            <w:tcW w:type="dxa" w:w="2041"/>
+          </w:tcPr>
+          <w:p>
+            <w:pPr>
+              <w:spacing w:after="20"/>
+            </w:pPr>
+            <w:r/>
+            <w:r>
+              <w:rPr>
+                <w:b w:val="0"/>
+                <w:sz w:val="15"/>
+              </w:rPr>
+              <w:t>Trans.eu, TimoCom, e-CMR, „rozwój i utrzymanie” API, „w całości siłami własnymi Lidera”.</w:t>
+            </w:r>
+          </w:p>
+        </w:tc>
+        <w:tc>
+          <w:tcPr>
+            <w:tcW w:type="dxa" w:w="3175"/>
+          </w:tcPr>
+          <w:p>
+            <w:pPr>
+              <w:spacing w:after="20"/>
+            </w:pPr>
+            <w:r/>
+            <w:r>
+              <w:rPr>
+                <w:b w:val="0"/>
+                <w:sz w:val="15"/>
+              </w:rPr>
+              <w:t>Zastąpić zakresem z opisu Z6: pipeline i generator eFTI (IT), strumieniowy potok, kolejkowanie i test zgodności eFTI (Backend). Usunąć utrzymanie i integracje standardowe.</w:t>
+            </w:r>
+          </w:p>
+        </w:tc>
+        <w:tc>
+          <w:tcPr>
+            <w:tcW w:type="dxa" w:w="1247"/>
+          </w:tcPr>
+          <w:p>
+            <w:pPr>
+              <w:spacing w:after="20"/>
+            </w:pPr>
+            <w:r/>
+            <w:r>
+              <w:rPr>
+                <w:b w:val="0"/>
+                <w:sz w:val="15"/>
+              </w:rPr>
+              <w:t>K3-08, K3-38; D24</w:t>
+            </w:r>
+          </w:p>
+        </w:tc>
+        <w:tc>
+          <w:tcPr>
+            <w:tcW w:type="dxa" w:w="737"/>
+          </w:tcPr>
+          <w:p>
+            <w:pPr>
+              <w:spacing w:after="20"/>
+            </w:pPr>
+            <w:r/>
+            <w:r>
+              <w:rPr>
+                <w:b w:val="0"/>
+                <w:sz w:val="15"/>
+              </w:rPr>
+              <w:t>WYSOKI</w:t>
+            </w:r>
+          </w:p>
+        </w:tc>
+      </w:tr>
+      <w:tr>
+        <w:tc>
+          <w:tcPr>
+            <w:tcW w:type="dxa" w:w="567"/>
+          </w:tcPr>
+          <w:p>
+            <w:pPr>
+              <w:spacing w:after="20"/>
+            </w:pPr>
+            <w:r/>
+            <w:r>
+              <w:rPr>
+                <w:b w:val="0"/>
+                <w:sz w:val="15"/>
+              </w:rPr>
+              <w:t>N16</w:t>
+            </w:r>
+          </w:p>
+        </w:tc>
+        <w:tc>
+          <w:tcPr>
+            <w:tcW w:type="dxa" w:w="1871"/>
+          </w:tcPr>
+          <w:p>
+            <w:pPr>
+              <w:spacing w:after="20"/>
+            </w:pPr>
+            <w:r/>
+            <w:r>
+              <w:rPr>
+                <w:b w:val="0"/>
+                <w:sz w:val="15"/>
+              </w:rPr>
+              <w:t>3.1.2 Pozycje kosztowe Backend/Full-Stack: Z6 i Z9</w:t>
+            </w:r>
+          </w:p>
+        </w:tc>
+        <w:tc>
+          <w:tcPr>
+            <w:tcW w:type="dxa" w:w="2041"/>
+          </w:tcPr>
+          <w:p>
+            <w:pPr>
+              <w:spacing w:after="20"/>
+            </w:pPr>
+            <w:r/>
+            <w:r>
+              <w:rPr>
+                <w:b w:val="0"/>
+                <w:sz w:val="15"/>
+              </w:rPr>
+              <w:t>Jedna pozycja Z6 na 12 mc, 260 280 zł.</w:t>
+            </w:r>
+          </w:p>
+        </w:tc>
+        <w:tc>
+          <w:tcPr>
+            <w:tcW w:type="dxa" w:w="3175"/>
+          </w:tcPr>
+          <w:p>
+            <w:pPr>
+              <w:spacing w:after="20"/>
+            </w:pPr>
+            <w:r/>
+            <w:r>
+              <w:rPr>
+                <w:b w:val="0"/>
+                <w:sz w:val="15"/>
+              </w:rPr>
+              <w:t>Dwie pozycje: Z6 9 mc (195 210 zł) i Z9 3 mc (65 070 zł), suma bez zmian; opis Z9 w zakresie walidacji PoC i zgodności eFTI w terenie.</w:t>
+            </w:r>
+          </w:p>
+        </w:tc>
+        <w:tc>
+          <w:tcPr>
+            <w:tcW w:type="dxa" w:w="1247"/>
+          </w:tcPr>
+          <w:p>
+            <w:pPr>
+              <w:spacing w:after="20"/>
+            </w:pPr>
+            <w:r/>
+            <w:r>
+              <w:rPr>
+                <w:b w:val="0"/>
+                <w:sz w:val="15"/>
+              </w:rPr>
+              <w:t>K3-36, K3-37; D07</w:t>
+            </w:r>
+          </w:p>
+        </w:tc>
+        <w:tc>
+          <w:tcPr>
+            <w:tcW w:type="dxa" w:w="737"/>
+          </w:tcPr>
+          <w:p>
+            <w:pPr>
+              <w:spacing w:after="20"/>
+            </w:pPr>
+            <w:r/>
+            <w:r>
+              <w:rPr>
+                <w:b w:val="0"/>
+                <w:sz w:val="15"/>
+              </w:rPr>
+              <w:t>WYSOKI</w:t>
+            </w:r>
+          </w:p>
+        </w:tc>
+      </w:tr>
+      <w:tr>
+        <w:tc>
+          <w:tcPr>
+            <w:tcW w:type="dxa" w:w="567"/>
+          </w:tcPr>
+          <w:p>
+            <w:pPr>
+              <w:spacing w:after="20"/>
+            </w:pPr>
+            <w:r/>
+            <w:r>
+              <w:rPr>
+                <w:b w:val="0"/>
+                <w:sz w:val="15"/>
+              </w:rPr>
+              <w:t>N17</w:t>
+            </w:r>
+          </w:p>
+        </w:tc>
+        <w:tc>
+          <w:tcPr>
+            <w:tcW w:type="dxa" w:w="1871"/>
+          </w:tcPr>
+          <w:p>
+            <w:pPr>
+              <w:spacing w:after="20"/>
+            </w:pPr>
+            <w:r/>
+            <w:r>
+              <w:rPr>
+                <w:b w:val="0"/>
+                <w:sz w:val="15"/>
+              </w:rPr>
+              <w:t>3.1.2 IT Specialist Z9</w:t>
+            </w:r>
+          </w:p>
+        </w:tc>
+        <w:tc>
+          <w:tcPr>
+            <w:tcW w:type="dxa" w:w="2041"/>
+          </w:tcPr>
+          <w:p>
+            <w:pPr>
+              <w:spacing w:after="20"/>
+            </w:pPr>
+            <w:r/>
+            <w:r>
+              <w:rPr>
+                <w:b w:val="0"/>
+                <w:sz w:val="15"/>
+              </w:rPr>
+              <w:t>„hotfixy”, utrzymanie środowiska integracyjnego.</w:t>
+            </w:r>
+          </w:p>
+        </w:tc>
+        <w:tc>
+          <w:tcPr>
+            <w:tcW w:type="dxa" w:w="3175"/>
+          </w:tcPr>
+          <w:p>
+            <w:pPr>
+              <w:spacing w:after="20"/>
+            </w:pPr>
+            <w:r/>
+            <w:r>
+              <w:rPr>
+                <w:b w:val="0"/>
+                <w:sz w:val="15"/>
+              </w:rPr>
+              <w:t>Rejestracja i analiza danych KPI; poprawki tylko w oknie korekt w M30. Bez bieżącego utrzymania.</w:t>
+            </w:r>
+          </w:p>
+        </w:tc>
+        <w:tc>
+          <w:tcPr>
+            <w:tcW w:type="dxa" w:w="1247"/>
+          </w:tcPr>
+          <w:p>
+            <w:pPr>
+              <w:spacing w:after="20"/>
+            </w:pPr>
+            <w:r/>
+            <w:r>
+              <w:rPr>
+                <w:b w:val="0"/>
+                <w:sz w:val="15"/>
+              </w:rPr>
+              <w:t>K3-38; opis Z9</w:t>
+            </w:r>
+          </w:p>
+        </w:tc>
+        <w:tc>
+          <w:tcPr>
+            <w:tcW w:type="dxa" w:w="737"/>
+          </w:tcPr>
+          <w:p>
+            <w:pPr>
+              <w:spacing w:after="20"/>
+            </w:pPr>
+            <w:r/>
+            <w:r>
+              <w:rPr>
+                <w:b w:val="0"/>
+                <w:sz w:val="15"/>
+              </w:rPr>
+              <w:t>ŚREDNI</w:t>
+            </w:r>
+          </w:p>
+        </w:tc>
+      </w:tr>
+      <w:tr>
+        <w:tc>
+          <w:tcPr>
+            <w:tcW w:type="dxa" w:w="567"/>
+          </w:tcPr>
+          <w:p>
+            <w:pPr>
+              <w:spacing w:after="20"/>
+            </w:pPr>
+            <w:r/>
+            <w:r>
+              <w:rPr>
+                <w:b w:val="0"/>
+                <w:sz w:val="15"/>
+              </w:rPr>
+              <w:t>N18</w:t>
+            </w:r>
+          </w:p>
+        </w:tc>
+        <w:tc>
+          <w:tcPr>
+            <w:tcW w:type="dxa" w:w="1871"/>
+          </w:tcPr>
+          <w:p>
+            <w:pPr>
+              <w:spacing w:after="20"/>
+            </w:pPr>
+            <w:r/>
+            <w:r>
+              <w:rPr>
+                <w:b w:val="0"/>
+                <w:sz w:val="15"/>
+              </w:rPr>
+              <w:t>3.1.2 Sześć stanowisk Everest11 w Z6, Z7, Z9: metoda szacowania</w:t>
+            </w:r>
+          </w:p>
+        </w:tc>
+        <w:tc>
+          <w:tcPr>
+            <w:tcW w:type="dxa" w:w="2041"/>
+          </w:tcPr>
+          <w:p>
+            <w:pPr>
+              <w:spacing w:after="20"/>
+            </w:pPr>
+            <w:r/>
+            <w:r>
+              <w:rPr>
+                <w:b w:val="0"/>
+                <w:sz w:val="15"/>
+              </w:rPr>
+              <w:t>„12 mc fazy PR podzielone przez 3”.</w:t>
+            </w:r>
+          </w:p>
+        </w:tc>
+        <w:tc>
+          <w:tcPr>
+            <w:tcW w:type="dxa" w:w="3175"/>
+          </w:tcPr>
+          <w:p>
+            <w:pPr>
+              <w:spacing w:after="20"/>
+            </w:pPr>
+            <w:r/>
+            <w:r>
+              <w:rPr>
+                <w:b w:val="0"/>
+                <w:sz w:val="15"/>
+              </w:rPr>
+              <w:t>Rzeczywisty podział miesięcy lub godzin między zadania, przy zachowaniu sumy i etatu w każdym miesiącu (propozycja w bloku budżetowym).</w:t>
+            </w:r>
+          </w:p>
+        </w:tc>
+        <w:tc>
+          <w:tcPr>
+            <w:tcW w:type="dxa" w:w="1247"/>
+          </w:tcPr>
+          <w:p>
+            <w:pPr>
+              <w:spacing w:after="20"/>
+            </w:pPr>
+            <w:r/>
+            <w:r>
+              <w:rPr>
+                <w:b w:val="0"/>
+                <w:sz w:val="15"/>
+              </w:rPr>
+              <w:t>K3-36, K3-37; D29</w:t>
+            </w:r>
+          </w:p>
+        </w:tc>
+        <w:tc>
+          <w:tcPr>
+            <w:tcW w:type="dxa" w:w="737"/>
+          </w:tcPr>
+          <w:p>
+            <w:pPr>
+              <w:spacing w:after="20"/>
+            </w:pPr>
+            <w:r/>
+            <w:r>
+              <w:rPr>
+                <w:b w:val="0"/>
+                <w:sz w:val="15"/>
+              </w:rPr>
+              <w:t>WYSOKI</w:t>
+            </w:r>
+          </w:p>
+        </w:tc>
+      </w:tr>
+      <w:tr>
+        <w:tc>
+          <w:tcPr>
+            <w:tcW w:type="dxa" w:w="567"/>
+          </w:tcPr>
+          <w:p>
+            <w:pPr>
+              <w:spacing w:after="20"/>
+            </w:pPr>
+            <w:r/>
+            <w:r>
+              <w:rPr>
+                <w:b w:val="0"/>
+                <w:sz w:val="15"/>
+              </w:rPr>
+              <w:t>N19</w:t>
+            </w:r>
+          </w:p>
+        </w:tc>
+        <w:tc>
+          <w:tcPr>
+            <w:tcW w:type="dxa" w:w="1871"/>
+          </w:tcPr>
+          <w:p>
+            <w:pPr>
+              <w:spacing w:after="20"/>
+            </w:pPr>
+            <w:r/>
+            <w:r>
+              <w:rPr>
+                <w:b w:val="0"/>
+                <w:sz w:val="15"/>
+              </w:rPr>
+              <w:t>6.1 Jakub Kosterna (AI Lead): zakres obowiązków</w:t>
+            </w:r>
+          </w:p>
+        </w:tc>
+        <w:tc>
+          <w:tcPr>
+            <w:tcW w:type="dxa" w:w="2041"/>
+          </w:tcPr>
+          <w:p>
+            <w:pPr>
+              <w:spacing w:after="20"/>
+            </w:pPr>
+            <w:r/>
+            <w:r>
+              <w:rPr>
+                <w:b w:val="0"/>
+                <w:sz w:val="15"/>
+              </w:rPr>
+              <w:t>Przygotowanie dokumentacji technicznej do zgłoszenia patentowego.</w:t>
+            </w:r>
+          </w:p>
+        </w:tc>
+        <w:tc>
+          <w:tcPr>
+            <w:tcW w:type="dxa" w:w="3175"/>
+          </w:tcPr>
+          <w:p>
+            <w:pPr>
+              <w:spacing w:after="20"/>
+            </w:pPr>
+            <w:r/>
+            <w:r>
+              <w:rPr>
+                <w:b w:val="0"/>
+                <w:sz w:val="15"/>
+              </w:rPr>
+              <w:t>Usunąć lub opisać jako dostarczenie danych technicznych do rzecznika w Z11, poza kosztami Z9.</w:t>
+            </w:r>
+          </w:p>
+        </w:tc>
+        <w:tc>
+          <w:tcPr>
+            <w:tcW w:type="dxa" w:w="1247"/>
+          </w:tcPr>
+          <w:p>
+            <w:pPr>
+              <w:spacing w:after="20"/>
+            </w:pPr>
+            <w:r/>
+            <w:r>
+              <w:rPr>
+                <w:b w:val="0"/>
+                <w:sz w:val="15"/>
+              </w:rPr>
+              <w:t>K3-40, K3-66; D30</w:t>
+            </w:r>
+          </w:p>
+        </w:tc>
+        <w:tc>
+          <w:tcPr>
+            <w:tcW w:type="dxa" w:w="737"/>
+          </w:tcPr>
+          <w:p>
+            <w:pPr>
+              <w:spacing w:after="20"/>
+            </w:pPr>
+            <w:r/>
+            <w:r>
+              <w:rPr>
+                <w:b w:val="0"/>
+                <w:sz w:val="15"/>
+              </w:rPr>
+              <w:t>ŚREDNI</w:t>
+            </w:r>
+          </w:p>
+        </w:tc>
+      </w:tr>
+      <w:tr>
+        <w:tc>
+          <w:tcPr>
+            <w:tcW w:type="dxa" w:w="567"/>
+          </w:tcPr>
+          <w:p>
+            <w:pPr>
+              <w:spacing w:after="20"/>
+            </w:pPr>
+            <w:r/>
+            <w:r>
+              <w:rPr>
+                <w:b w:val="0"/>
+                <w:sz w:val="15"/>
+              </w:rPr>
+              <w:t>N20</w:t>
+            </w:r>
+          </w:p>
+        </w:tc>
+        <w:tc>
+          <w:tcPr>
+            <w:tcW w:type="dxa" w:w="1871"/>
+          </w:tcPr>
+          <w:p>
+            <w:pPr>
+              <w:spacing w:after="20"/>
+            </w:pPr>
+            <w:r/>
+            <w:r>
+              <w:rPr>
+                <w:b w:val="0"/>
+                <w:sz w:val="15"/>
+              </w:rPr>
+              <w:t>6.1 Michał Hajduk (specjalista TSL): zakres obowiązków</w:t>
+            </w:r>
+          </w:p>
+        </w:tc>
+        <w:tc>
+          <w:tcPr>
+            <w:tcW w:type="dxa" w:w="2041"/>
+          </w:tcPr>
+          <w:p>
+            <w:pPr>
+              <w:spacing w:after="20"/>
+            </w:pPr>
+            <w:r/>
+            <w:r>
+              <w:rPr>
+                <w:b w:val="0"/>
+                <w:sz w:val="15"/>
+              </w:rPr>
+              <w:t>Badanie akceptacji UX i ocena trafności alertów z perspektywy operacyjnej.</w:t>
+            </w:r>
+          </w:p>
+        </w:tc>
+        <w:tc>
+          <w:tcPr>
+            <w:tcW w:type="dxa" w:w="3175"/>
+          </w:tcPr>
+          <w:p>
+            <w:pPr>
+              <w:spacing w:after="20"/>
+            </w:pPr>
+            <w:r/>
+            <w:r>
+              <w:rPr>
+                <w:b w:val="0"/>
+                <w:sz w:val="15"/>
+              </w:rPr>
+              <w:t>Ground truth i scenariusze operacyjne; ocena trafności alertów skryptem, bez udziału pracownika odbiorcy wdrożenia; UX prowadzi AI Senior Engineer. Dodać deklarację poufności wobec podmiotów powiązanych (MJA Partners, Natanek Logistics).</w:t>
+            </w:r>
+          </w:p>
+        </w:tc>
+        <w:tc>
+          <w:tcPr>
+            <w:tcW w:type="dxa" w:w="1247"/>
+          </w:tcPr>
+          <w:p>
+            <w:pPr>
+              <w:spacing w:after="20"/>
+            </w:pPr>
+            <w:r/>
+            <w:r>
+              <w:rPr>
+                <w:b w:val="0"/>
+                <w:sz w:val="15"/>
+              </w:rPr>
+              <w:t>K3-11, K5-07; D05</w:t>
+            </w:r>
+          </w:p>
+        </w:tc>
+        <w:tc>
+          <w:tcPr>
+            <w:tcW w:type="dxa" w:w="737"/>
+          </w:tcPr>
+          <w:p>
+            <w:pPr>
+              <w:spacing w:after="20"/>
+            </w:pPr>
+            <w:r/>
+            <w:r>
+              <w:rPr>
+                <w:b w:val="0"/>
+                <w:sz w:val="15"/>
+              </w:rPr>
+              <w:t>WYSOKI</w:t>
+            </w:r>
+          </w:p>
+        </w:tc>
+      </w:tr>
+      <w:tr>
+        <w:tc>
+          <w:tcPr>
+            <w:tcW w:type="dxa" w:w="567"/>
+          </w:tcPr>
+          <w:p>
+            <w:pPr>
+              <w:spacing w:after="20"/>
+            </w:pPr>
+            <w:r/>
+            <w:r>
+              <w:rPr>
+                <w:b w:val="0"/>
+                <w:sz w:val="15"/>
+              </w:rPr>
+              <w:t>N21</w:t>
+            </w:r>
+          </w:p>
+        </w:tc>
+        <w:tc>
+          <w:tcPr>
+            <w:tcW w:type="dxa" w:w="1871"/>
+          </w:tcPr>
+          <w:p>
+            <w:pPr>
+              <w:spacing w:after="20"/>
+            </w:pPr>
+            <w:r/>
+            <w:r>
+              <w:rPr>
+                <w:b w:val="0"/>
+                <w:sz w:val="15"/>
+              </w:rPr>
+              <w:t>6.1 Personel planowany: Anotatorzy, Backend/Full-Stack</w:t>
+            </w:r>
+          </w:p>
+        </w:tc>
+        <w:tc>
+          <w:tcPr>
+            <w:tcW w:type="dxa" w:w="2041"/>
+          </w:tcPr>
+          <w:p>
+            <w:pPr>
+              <w:spacing w:after="20"/>
+            </w:pPr>
+            <w:r/>
+            <w:r>
+              <w:rPr>
+                <w:b w:val="0"/>
+                <w:sz w:val="15"/>
+              </w:rPr>
+              <w:t>Anotatorzy: M1-M18, „wymiar wg wolumenu”. Backend: Z2 (M13-M18) i Z6 (M19-M30), 18 mc.</w:t>
+            </w:r>
+          </w:p>
+        </w:tc>
+        <w:tc>
+          <w:tcPr>
+            <w:tcW w:type="dxa" w:w="3175"/>
+          </w:tcPr>
+          <w:p>
+            <w:pPr>
+              <w:spacing w:after="20"/>
+            </w:pPr>
+            <w:r/>
+            <w:r>
+              <w:rPr>
+                <w:b w:val="0"/>
+                <w:sz w:val="15"/>
+              </w:rPr>
+              <w:t>Anotatorzy: 3 osoby, 1,0 etatu, 10 mc [M9-M18]. Backend: Z2 6 mc, Z6 9 mc, Z9 3 mc, razem 18 mc.</w:t>
+            </w:r>
+          </w:p>
+        </w:tc>
+        <w:tc>
+          <w:tcPr>
+            <w:tcW w:type="dxa" w:w="1247"/>
+          </w:tcPr>
+          <w:p>
+            <w:pPr>
+              <w:spacing w:after="20"/>
+            </w:pPr>
+            <w:r/>
+            <w:r>
+              <w:rPr>
+                <w:b w:val="0"/>
+                <w:sz w:val="15"/>
+              </w:rPr>
+              <w:t>K5-03, K5-10, K5-11; D07</w:t>
+            </w:r>
+          </w:p>
+        </w:tc>
+        <w:tc>
+          <w:tcPr>
+            <w:tcW w:type="dxa" w:w="737"/>
+          </w:tcPr>
+          <w:p>
+            <w:pPr>
+              <w:spacing w:after="20"/>
+            </w:pPr>
+            <w:r/>
+            <w:r>
+              <w:rPr>
+                <w:b w:val="0"/>
+                <w:sz w:val="15"/>
+              </w:rPr>
+              <w:t>WYSOKI</w:t>
+            </w:r>
+          </w:p>
+        </w:tc>
+      </w:tr>
+      <w:tr>
+        <w:tc>
+          <w:tcPr>
+            <w:tcW w:type="dxa" w:w="567"/>
+          </w:tcPr>
+          <w:p>
+            <w:pPr>
+              <w:spacing w:after="20"/>
+            </w:pPr>
+            <w:r/>
+            <w:r>
+              <w:rPr>
+                <w:b w:val="0"/>
+                <w:sz w:val="15"/>
+              </w:rPr>
+              <w:t>N22</w:t>
+            </w:r>
+          </w:p>
+        </w:tc>
+        <w:tc>
+          <w:tcPr>
+            <w:tcW w:type="dxa" w:w="1871"/>
+          </w:tcPr>
+          <w:p>
+            <w:pPr>
+              <w:spacing w:after="20"/>
+            </w:pPr>
+            <w:r/>
+            <w:r>
+              <w:rPr>
+                <w:b w:val="0"/>
+                <w:sz w:val="15"/>
+              </w:rPr>
+              <w:t>6.1 Sposób zarządzania projektem (ścieżka decyzyjna)</w:t>
+            </w:r>
+          </w:p>
+        </w:tc>
+        <w:tc>
+          <w:tcPr>
+            <w:tcW w:type="dxa" w:w="2041"/>
+          </w:tcPr>
+          <w:p>
+            <w:pPr>
+              <w:spacing w:after="20"/>
+            </w:pPr>
+            <w:r/>
+            <w:r>
+              <w:rPr>
+                <w:b w:val="0"/>
+                <w:sz w:val="15"/>
+              </w:rPr>
+              <w:t>Brak komitetu sterującego i niezależnego nadzoru nad zadaniami PRz.</w:t>
+            </w:r>
+          </w:p>
+        </w:tc>
+        <w:tc>
+          <w:tcPr>
+            <w:tcW w:type="dxa" w:w="3175"/>
+          </w:tcPr>
+          <w:p>
+            <w:pPr>
+              <w:spacing w:after="20"/>
+            </w:pPr>
+            <w:r/>
+            <w:r>
+              <w:rPr>
+                <w:b w:val="0"/>
+                <w:sz w:val="15"/>
+              </w:rPr>
+              <w:t>Dopisać skład i rolę komitetu (kierownik zarządzający, kierownik B+R, przedstawiciel PRz), osobę weryfikującą i odbierającą każdy KM oraz niezależne przeliczenie metryk przez AI Lead Everest11.</w:t>
+            </w:r>
+          </w:p>
+        </w:tc>
+        <w:tc>
+          <w:tcPr>
+            <w:tcW w:type="dxa" w:w="1247"/>
+          </w:tcPr>
+          <w:p>
+            <w:pPr>
+              <w:spacing w:after="20"/>
+            </w:pPr>
+            <w:r/>
+            <w:r>
+              <w:rPr>
+                <w:b w:val="0"/>
+                <w:sz w:val="15"/>
+              </w:rPr>
+              <w:t>K5-05, K5-09; D27, D28</w:t>
+            </w:r>
+          </w:p>
+        </w:tc>
+        <w:tc>
+          <w:tcPr>
+            <w:tcW w:type="dxa" w:w="737"/>
+          </w:tcPr>
+          <w:p>
+            <w:pPr>
+              <w:spacing w:after="20"/>
+            </w:pPr>
+            <w:r/>
+            <w:r>
+              <w:rPr>
+                <w:b w:val="0"/>
+                <w:sz w:val="15"/>
+              </w:rPr>
+              <w:t>WYSOKI</w:t>
+            </w:r>
+          </w:p>
+        </w:tc>
+      </w:tr>
+      <w:tr>
+        <w:tc>
+          <w:tcPr>
+            <w:tcW w:type="dxa" w:w="567"/>
+          </w:tcPr>
+          <w:p>
+            <w:pPr>
+              <w:spacing w:after="20"/>
+            </w:pPr>
+            <w:r/>
+            <w:r>
+              <w:rPr>
+                <w:b w:val="0"/>
+                <w:sz w:val="15"/>
+              </w:rPr>
+              <w:t>N23</w:t>
+            </w:r>
+          </w:p>
+        </w:tc>
+        <w:tc>
+          <w:tcPr>
+            <w:tcW w:type="dxa" w:w="1871"/>
+          </w:tcPr>
+          <w:p>
+            <w:pPr>
+              <w:spacing w:after="20"/>
+            </w:pPr>
+            <w:r/>
+            <w:r>
+              <w:rPr>
+                <w:b w:val="0"/>
+                <w:sz w:val="15"/>
+              </w:rPr>
+              <w:t>6.2 Zasoby techniczne Everest11 (przeznaczenie)</w:t>
+            </w:r>
+          </w:p>
+        </w:tc>
+        <w:tc>
+          <w:tcPr>
+            <w:tcW w:type="dxa" w:w="2041"/>
+          </w:tcPr>
+          <w:p>
+            <w:pPr>
+              <w:spacing w:after="20"/>
+            </w:pPr>
+            <w:r/>
+            <w:r>
+              <w:rPr>
+                <w:b w:val="0"/>
+                <w:sz w:val="15"/>
+              </w:rPr>
+              <w:t>„koordynacja prac konsorcjum, zarządzanie projektem, integracja systemowa (API TMS, eFTI, e-CMR)”, „walidacja KPI w ruchu komercyjnym”.</w:t>
+            </w:r>
+          </w:p>
+        </w:tc>
+        <w:tc>
+          <w:tcPr>
+            <w:tcW w:type="dxa" w:w="3175"/>
+          </w:tcPr>
+          <w:p>
+            <w:pPr>
+              <w:spacing w:after="20"/>
+            </w:pPr>
+            <w:r/>
+            <w:r>
+              <w:rPr>
+                <w:b w:val="0"/>
+                <w:sz w:val="15"/>
+              </w:rPr>
+              <w:t>Opisać zasoby (stanowiska, serwery, repozytoria) bez funkcji koordynacyjnych w pracach B+R. „W ruchu komercyjnym” zamienić na „w eksploatacji na flocie testowej”. Dopisać parametry komputerów, serwerów i chmury (uwaga 14).</w:t>
+            </w:r>
+          </w:p>
+        </w:tc>
+        <w:tc>
+          <w:tcPr>
+            <w:tcW w:type="dxa" w:w="1247"/>
+          </w:tcPr>
+          <w:p>
+            <w:pPr>
+              <w:spacing w:after="20"/>
+            </w:pPr>
+            <w:r/>
+            <w:r>
+              <w:rPr>
+                <w:b w:val="0"/>
+                <w:sz w:val="15"/>
+              </w:rPr>
+              <w:t>K3-38, K5-14</w:t>
+            </w:r>
+          </w:p>
+        </w:tc>
+        <w:tc>
+          <w:tcPr>
+            <w:tcW w:type="dxa" w:w="737"/>
+          </w:tcPr>
+          <w:p>
+            <w:pPr>
+              <w:spacing w:after="20"/>
+            </w:pPr>
+            <w:r/>
+            <w:r>
+              <w:rPr>
+                <w:b w:val="0"/>
+                <w:sz w:val="15"/>
+              </w:rPr>
+              <w:t>ŚREDNI</w:t>
+            </w:r>
+          </w:p>
+        </w:tc>
+      </w:tr>
+      <w:tr>
+        <w:tc>
+          <w:tcPr>
+            <w:tcW w:type="dxa" w:w="567"/>
+          </w:tcPr>
+          <w:p>
+            <w:pPr>
+              <w:spacing w:after="20"/>
+            </w:pPr>
+            <w:r/>
+            <w:r>
+              <w:rPr>
+                <w:b w:val="0"/>
+                <w:sz w:val="15"/>
+              </w:rPr>
+              <w:t>N24</w:t>
+            </w:r>
+          </w:p>
+        </w:tc>
+        <w:tc>
+          <w:tcPr>
+            <w:tcW w:type="dxa" w:w="1871"/>
+          </w:tcPr>
+          <w:p>
+            <w:pPr>
+              <w:spacing w:after="20"/>
+            </w:pPr>
+            <w:r/>
+            <w:r>
+              <w:rPr>
+                <w:b w:val="0"/>
+                <w:sz w:val="15"/>
+              </w:rPr>
+              <w:t>5. Analiza ryzyka R3 (opis zapobiegania) i R8 (podwykonawstwo)</w:t>
+            </w:r>
+          </w:p>
+        </w:tc>
+        <w:tc>
+          <w:tcPr>
+            <w:tcW w:type="dxa" w:w="2041"/>
+          </w:tcPr>
+          <w:p>
+            <w:pPr>
+              <w:spacing w:after="20"/>
+            </w:pPr>
+            <w:r/>
+            <w:r>
+              <w:rPr>
+                <w:b w:val="0"/>
+                <w:sz w:val="15"/>
+              </w:rPr>
+              <w:t>R3: „z udziałem podwykonawcy anotacji”. R8: podwykonawstwo obejmuje anotację datasetu.</w:t>
+            </w:r>
+          </w:p>
+        </w:tc>
+        <w:tc>
+          <w:tcPr>
+            <w:tcW w:type="dxa" w:w="3175"/>
+          </w:tcPr>
+          <w:p>
+            <w:pPr>
+              <w:spacing w:after="20"/>
+            </w:pPr>
+            <w:r/>
+            <w:r>
+              <w:rPr>
+                <w:b w:val="0"/>
+                <w:sz w:val="15"/>
+              </w:rPr>
+              <w:t>Usunąć anotację z listy podwykonawstwa. R8: montaż (Z2, Z9) i rzecznik patentowy (Z11). Zastąpić R1-R5, R9 i dodać R10-R12 tekstami z części drugiej.</w:t>
+            </w:r>
+          </w:p>
+        </w:tc>
+        <w:tc>
+          <w:tcPr>
+            <w:tcW w:type="dxa" w:w="1247"/>
+          </w:tcPr>
+          <w:p>
+            <w:pPr>
+              <w:spacing w:after="20"/>
+            </w:pPr>
+            <w:r/>
+            <w:r>
+              <w:rPr>
+                <w:b w:val="0"/>
+                <w:sz w:val="15"/>
+              </w:rPr>
+              <w:t>K3-10, K3-46, K3-25 do K3-32</w:t>
+            </w:r>
+          </w:p>
+        </w:tc>
+        <w:tc>
+          <w:tcPr>
+            <w:tcW w:type="dxa" w:w="737"/>
+          </w:tcPr>
+          <w:p>
+            <w:pPr>
+              <w:spacing w:after="20"/>
+            </w:pPr>
+            <w:r/>
+            <w:r>
+              <w:rPr>
+                <w:b w:val="0"/>
+                <w:sz w:val="15"/>
+              </w:rPr>
+              <w:t>WYSOKI</w:t>
+            </w:r>
+          </w:p>
+        </w:tc>
+      </w:tr>
+      <w:tr>
+        <w:tc>
+          <w:tcPr>
+            <w:tcW w:type="dxa" w:w="567"/>
+          </w:tcPr>
+          <w:p>
+            <w:pPr>
+              <w:spacing w:after="20"/>
+            </w:pPr>
+            <w:r/>
+            <w:r>
+              <w:rPr>
+                <w:b w:val="0"/>
+                <w:sz w:val="15"/>
+              </w:rPr>
+              <w:t>N25</w:t>
+            </w:r>
+          </w:p>
+        </w:tc>
+        <w:tc>
+          <w:tcPr>
+            <w:tcW w:type="dxa" w:w="1871"/>
+          </w:tcPr>
+          <w:p>
+            <w:pPr>
+              <w:spacing w:after="20"/>
+            </w:pPr>
+            <w:r/>
+            <w:r>
+              <w:rPr>
+                <w:b w:val="0"/>
+                <w:sz w:val="15"/>
+              </w:rPr>
+              <w:t>3.1.1 Z9 (stary tekst): odbiór i niezależna walidacja</w:t>
+            </w:r>
+          </w:p>
+        </w:tc>
+        <w:tc>
+          <w:tcPr>
+            <w:tcW w:type="dxa" w:w="2041"/>
+          </w:tcPr>
+          <w:p>
+            <w:pPr>
+              <w:spacing w:after="20"/>
+            </w:pPr>
+            <w:r/>
+            <w:r>
+              <w:rPr>
+                <w:b w:val="0"/>
+                <w:sz w:val="15"/>
+              </w:rPr>
+              <w:t>Protokół podpisuje kierownik B+R i kluczowy personel PRz; „niezależna walidacja PRz na ≥180 kursach”.</w:t>
+            </w:r>
+          </w:p>
+        </w:tc>
+        <w:tc>
+          <w:tcPr>
+            <w:tcW w:type="dxa" w:w="3175"/>
+          </w:tcPr>
+          <w:p>
+            <w:pPr>
+              <w:spacing w:after="20"/>
+            </w:pPr>
+            <w:r/>
+            <w:r>
+              <w:rPr>
+                <w:b w:val="0"/>
+                <w:sz w:val="15"/>
+              </w:rPr>
+              <w:t>Zastąpione ścieżką audytu z nowego tekstu (PRz tylko odbiór metodyczny w Z8). Sprawdzić, czy zdanie nie zostało także w sekcjach 1.2 i 2.x.</w:t>
+            </w:r>
+          </w:p>
+        </w:tc>
+        <w:tc>
+          <w:tcPr>
+            <w:tcW w:type="dxa" w:w="1247"/>
+          </w:tcPr>
+          <w:p>
+            <w:pPr>
+              <w:spacing w:after="20"/>
+            </w:pPr>
+            <w:r/>
+            <w:r>
+              <w:rPr>
+                <w:b w:val="0"/>
+                <w:sz w:val="15"/>
+              </w:rPr>
+              <w:t>K3-11, K3-12; D25</w:t>
+            </w:r>
+          </w:p>
+        </w:tc>
+        <w:tc>
+          <w:tcPr>
+            <w:tcW w:type="dxa" w:w="737"/>
+          </w:tcPr>
+          <w:p>
+            <w:pPr>
+              <w:spacing w:after="20"/>
+            </w:pPr>
+            <w:r/>
+            <w:r>
+              <w:rPr>
+                <w:b w:val="0"/>
+                <w:sz w:val="15"/>
+              </w:rPr>
+              <w:t>WYSOKI</w:t>
+            </w:r>
+          </w:p>
+        </w:tc>
+      </w:tr>
+      <w:tr>
+        <w:tc>
+          <w:tcPr>
+            <w:tcW w:type="dxa" w:w="567"/>
+          </w:tcPr>
+          <w:p>
+            <w:pPr>
+              <w:spacing w:after="20"/>
+            </w:pPr>
+            <w:r/>
+            <w:r>
+              <w:rPr>
+                <w:b w:val="0"/>
+                <w:sz w:val="15"/>
+              </w:rPr>
+              <w:t>N26</w:t>
+            </w:r>
+          </w:p>
+        </w:tc>
+        <w:tc>
+          <w:tcPr>
+            <w:tcW w:type="dxa" w:w="1871"/>
+          </w:tcPr>
+          <w:p>
+            <w:pPr>
+              <w:spacing w:after="20"/>
+            </w:pPr>
+            <w:r/>
+            <w:r>
+              <w:rPr>
+                <w:b w:val="0"/>
+                <w:sz w:val="15"/>
+              </w:rPr>
+              <w:t>6.4 Podwykonawcy oraz pozycje podwykonawstwa Z2 (150 000 zł) i Z9 (70 000 zł)</w:t>
+            </w:r>
+          </w:p>
+        </w:tc>
+        <w:tc>
+          <w:tcPr>
+            <w:tcW w:type="dxa" w:w="2041"/>
+          </w:tcPr>
+          <w:p>
+            <w:pPr>
+              <w:spacing w:after="20"/>
+            </w:pPr>
+            <w:r/>
+            <w:r>
+              <w:rPr>
+                <w:b w:val="0"/>
+                <w:sz w:val="15"/>
+              </w:rPr>
+              <w:t>Brak kalkulacji i liczby ofert; wymagania dla niewybranego podwykonawcy.</w:t>
+            </w:r>
+          </w:p>
+        </w:tc>
+        <w:tc>
+          <w:tcPr>
+            <w:tcW w:type="dxa" w:w="3175"/>
+          </w:tcPr>
+          <w:p>
+            <w:pPr>
+              <w:spacing w:after="20"/>
+            </w:pPr>
+            <w:r/>
+            <w:r>
+              <w:rPr>
+                <w:b w:val="0"/>
+                <w:sz w:val="15"/>
+              </w:rPr>
+              <w:t>Uzupełnić: zakres (tylko montaż, instalacja, demontaż), liczba pojazdów, pracochłonność lub ryczałt, oferty, wybór kwoty; rozdzielenie Z2 i Z9. Wymagania minimalne wykonawcy.</w:t>
+            </w:r>
+          </w:p>
+        </w:tc>
+        <w:tc>
+          <w:tcPr>
+            <w:tcW w:type="dxa" w:w="1247"/>
+          </w:tcPr>
+          <w:p>
+            <w:pPr>
+              <w:spacing w:after="20"/>
+            </w:pPr>
+            <w:r/>
+            <w:r>
+              <w:rPr>
+                <w:b w:val="0"/>
+                <w:sz w:val="15"/>
+              </w:rPr>
+              <w:t>K3-43 do K3-46; D08</w:t>
+            </w:r>
+          </w:p>
+        </w:tc>
+        <w:tc>
+          <w:tcPr>
+            <w:tcW w:type="dxa" w:w="737"/>
+          </w:tcPr>
+          <w:p>
+            <w:pPr>
+              <w:spacing w:after="20"/>
+            </w:pPr>
+            <w:r/>
+            <w:r>
+              <w:rPr>
+                <w:b w:val="0"/>
+                <w:sz w:val="15"/>
+              </w:rPr>
+              <w:t>WYSOKI</w:t>
+            </w:r>
+          </w:p>
+        </w:tc>
+      </w:tr>
+      <w:tr>
+        <w:tc>
+          <w:tcPr>
+            <w:tcW w:type="dxa" w:w="567"/>
+          </w:tcPr>
+          <w:p>
+            <w:pPr>
+              <w:spacing w:after="20"/>
+            </w:pPr>
+            <w:r/>
+            <w:r>
+              <w:rPr>
+                <w:b w:val="0"/>
+                <w:sz w:val="15"/>
+              </w:rPr>
+              <w:t>N27</w:t>
+            </w:r>
+          </w:p>
+        </w:tc>
+        <w:tc>
+          <w:tcPr>
+            <w:tcW w:type="dxa" w:w="1871"/>
+          </w:tcPr>
+          <w:p>
+            <w:pPr>
+              <w:spacing w:after="20"/>
+            </w:pPr>
+            <w:r/>
+            <w:r>
+              <w:rPr>
+                <w:b w:val="0"/>
+                <w:sz w:val="15"/>
+              </w:rPr>
+              <w:t>Model finansowy (Założenia, Rozliczenie dotacji)</w:t>
+            </w:r>
+          </w:p>
+        </w:tc>
+        <w:tc>
+          <w:tcPr>
+            <w:tcW w:type="dxa" w:w="2041"/>
+          </w:tcPr>
+          <w:p>
+            <w:pPr>
+              <w:spacing w:after="20"/>
+            </w:pPr>
+            <w:r/>
+            <w:r>
+              <w:rPr>
+                <w:b w:val="0"/>
+                <w:sz w:val="15"/>
+              </w:rPr>
+              <w:t>Komentarz „18 miesięcy” w Założeniach; liczby godzin i etatów jak w starej wersji budżetu.</w:t>
+            </w:r>
+          </w:p>
+        </w:tc>
+        <w:tc>
+          <w:tcPr>
+            <w:tcW w:type="dxa" w:w="3175"/>
+          </w:tcPr>
+          <w:p>
+            <w:pPr>
+              <w:spacing w:after="20"/>
+            </w:pPr>
+            <w:r/>
+            <w:r>
+              <w:rPr>
+                <w:b w:val="0"/>
+                <w:sz w:val="15"/>
+              </w:rPr>
+              <w:t>Poprawić na 30 miesięcy oraz uspójnić z nowym podziałem Backend Z6/Z9 (N16) i z podziałem N18.</w:t>
+            </w:r>
+          </w:p>
+        </w:tc>
+        <w:tc>
+          <w:tcPr>
+            <w:tcW w:type="dxa" w:w="1247"/>
+          </w:tcPr>
+          <w:p>
+            <w:pPr>
+              <w:spacing w:after="20"/>
+            </w:pPr>
+            <w:r/>
+            <w:r>
+              <w:rPr>
+                <w:b w:val="0"/>
+                <w:sz w:val="15"/>
+              </w:rPr>
+              <w:t>K3-36; uwaga ogólna o spójności</w:t>
+            </w:r>
+          </w:p>
+        </w:tc>
+        <w:tc>
+          <w:tcPr>
+            <w:tcW w:type="dxa" w:w="737"/>
+          </w:tcPr>
+          <w:p>
+            <w:pPr>
+              <w:spacing w:after="20"/>
+            </w:pPr>
+            <w:r/>
+            <w:r>
+              <w:rPr>
+                <w:b w:val="0"/>
+                <w:sz w:val="15"/>
+              </w:rPr>
+              <w:t>ŚREDNI</w:t>
+            </w:r>
+          </w:p>
+        </w:tc>
+      </w:tr>
+    </w:tbl>
+    <w:p/>
+    <w:p>
       <w:pPr>
         <w:pStyle w:val="Heading1"/>
       </w:pPr>
@@ -15171,7 +18343,7 @@
                 <w:b w:val="0"/>
                 <w:sz w:val="17"/>
               </w:rPr>
-              <w:t>3555/4000</w:t>
+              <w:t>3764/4000</w:t>
             </w:r>
           </w:p>
         </w:tc>

</xml_diff>

<commit_message>
Nazwa Z6 zmieniona (D31), uzasadnienia kosztu personelu Everest11 (28 pozycji), N28 (300 ms)
Co-Authored-By: Claude Sonnet 5.5 <noreply@anthropic.com>
Claude-Session: https://claude.ai/code/session_01672WnJhixnEcarbb7uiwfx
</commit_message>
<xml_diff>
--- a/Opisy_zadan_z_kamieniami_milowymi.docx
+++ b/Opisy_zadan_z_kamieniami_milowymi.docx
@@ -2617,7 +2617,7 @@
         <w:rPr>
           <w:b/>
         </w:rPr>
-        <w:t>6. Prace rozwojowe: Pipeline PoC + integracja TMS/eFTI/e-CMR (Z6)</w:t>
+        <w:t>6. Prace rozwojowe: Pipeline PoL/PoC i zgodność z eFTI (Z6)</w:t>
       </w:r>
     </w:p>
     <w:p>
@@ -4062,7 +4062,7 @@
           <w:color w:val="666666"/>
           <w:sz w:val="17"/>
         </w:rPr>
-        <w:t xml:space="preserve"> [3829 z 4000 znaków]</w:t>
+        <w:t xml:space="preserve"> [3959 z 4000 znaków]</w:t>
       </w:r>
     </w:p>
     <w:p>
@@ -4226,7 +4226,7 @@
         <w:rPr>
           <w:b w:val="0"/>
         </w:rPr>
-        <w:t>Zadanie będzie realizowane przez zespół Everest11. AI Lead opracuje protokół walidacji KPI, zbierze i uporządkuje dane terenowe, obliczy metryki dla każdej klasy i przy stwierdzeniu domain shift przeprowadzi adaptację domenową. AI Senior Engineer zoptymalizuje modele na platformie, zdiagnozuje domain shift, wdroży korekty, zmierzy wskaźniki jakości i przygotuje raport KPI, a także przeprowadzi badanie akceptacji użytkowników (kierowcy, dyspozytorzy) według scenariuszy specjalisty TSL. IoT Specialist odbierze zestawy po montażu, skalibruje je i zarejestruje parametry niezawodności sprzętu. IT Specialist zbierze logi (dostępność, status GSM, bufor), zmierzy czas PoC i opóźnienia oraz opracuje dane do raportu KPI. Bieżące utrzymanie systemu nie należy do tego zadania. Cybersecurity / AI Act Specialist wykona testy bezpieczeństwa prototypu w terenie i uruchomi zamrożony skrypt ewaluacyjny jako niezależny ewaluator. Specjalista ds. logistyki TSL poprowadzi inspekcje ground truth. Backend/Full-Stack Developer, w wymiarze 1,0 etatu przez 3 miesiące od M28 do M30, obsłuży walidację PoC i zgodności eFTI w terenie na co najmniej 200 cyklach oraz analizę błędów. Nakład czasu pozostałych osób wynika z podziału ich etatów między zadania Z6, Z7 i Z9 określonego w budżecie.</w:t>
+        <w:t>Zadanie będzie realizowane przez zespół Everest11. AI Lead opracuje protokół walidacji KPI, zbierze i uporządkuje dane terenowe, obliczy metryki dla każdej klasy i przy stwierdzeniu domain shift przeprowadzi adaptację domenową. AI Senior Engineer zoptymalizuje modele na platformie, zdiagnozuje domain shift, wdroży korekty, zmierzy wskaźniki jakości i przygotuje raport KPI oraz anotację próbki co najmniej 200 obrazów terenowych, weryfikowaną przez specjalistę TSL, a także przeprowadzi badanie akceptacji użytkowników (kierowcy, dyspozytorzy) według scenariuszy specjalisty TSL. IoT Specialist odbierze zestawy po montażu, skalibruje je i zarejestruje parametry niezawodności sprzętu. IT Specialist zbierze logi (dostępność, status GSM, bufor), zmierzy czas PoC i opóźnienia oraz opracuje dane do raportu KPI. Bieżące utrzymanie systemu nie należy do tego zadania. Cybersecurity / AI Act Specialist wykona testy bezpieczeństwa prototypu w terenie i uruchomi zamrożony skrypt ewaluacyjny jako niezależny ewaluator. Specjalista ds. logistyki TSL poprowadzi inspekcje ground truth i zweryfikuje anotację próbki obrazów. Backend/Full-Stack Developer, w wymiarze 1,0 etatu przez 3 miesiące od M28 do M30, obsłuży walidację PoC i zgodności eFTI w terenie na co najmniej 200 cyklach oraz analizę błędów. Nakład czasu pozostałych osób wynika z podziału ich etatów między zadania Z6, Z7 i Z9 określonego w budżecie.</w:t>
       </w:r>
     </w:p>
     <w:p>
@@ -6083,6 +6083,958 @@
           <w:b w:val="0"/>
         </w:rPr>
         <w:t>Ryzyko ograniczamy czterema działaniami. Wszystkie transakcje z podmiotami powiązanymi z Inwestorem zawieramy na warunkach rynkowych, weryfikowanych tą samą metodą, którą stosujemy do cen rynkowych praw majątkowych między konsorcjantami: rozeznaniem rynku, niezależną wyceną albo negocjacjami w warunkach pełnej konkurencji. Umowę partnerską dotyczącą floty testowej dokumentujemy odniesieniem do porównywalnych ofert rynkowych (koszty wynajmu floty u innych podmiotów) i wpisujemy do rejestru transakcji. Formalnie ustalamy, czy Everest11 i Natanek Logistics są powiązane w rozumieniu przepisów o podatku dochodowym (próg 25% udziałów, a Inwestor ma najwyżej 20%), a niezależnie od wyniku dokumentujemy warunki rynkowe transakcji. Niezależność walidacji zabezpiecza ścieżka audytu z zadania Z9 i dywersyfikacja floty (R11). Ocena transakcji jest prowadzona raz na kwartał.</w:t>
+      </w:r>
+    </w:p>
+    <w:p>
+      <w:r>
+        <w:br w:type="page"/>
+      </w:r>
+    </w:p>
+    <w:p>
+      <w:pPr>
+        <w:pStyle w:val="Heading1"/>
+      </w:pPr>
+      <w:r>
+        <w:t>Część trzecia. Uzasadnienie kosztu personelu Everest11 (3.1.2)</w:t>
+      </w:r>
+    </w:p>
+    <w:p>
+      <w:pPr>
+        <w:spacing w:after="60"/>
+      </w:pPr>
+      <w:r>
+        <w:rPr>
+          <w:b w:val="0"/>
+        </w:rPr>
+        <w:t>Nowe teksty pola „Uzasadnienie kosztu” (limit 1500 znaków) dla stanowisk Everest11 w zadaniach Z2, Z6, Z7 i Z9. Są zgodne z opisami zadań, z punktem 6.1 i z uwagami 33, 38, 39 i 40. Pole „Metoda szacowania” pozostaje do zmiany po decyzji o podziale etatów między Z6, Z7 i Z9 oraz o podziale Backend/Full-Stack na Z6 i Z9 (osobna pozycja kosztowa Z9).</w:t>
+      </w:r>
+    </w:p>
+    <w:p>
+      <w:pPr>
+        <w:pStyle w:val="Heading2"/>
+      </w:pPr>
+      <w:r>
+        <w:t>Zadanie 2</w:t>
+      </w:r>
+    </w:p>
+    <w:p>
+      <w:pPr>
+        <w:keepNext/>
+        <w:spacing w:before="160" w:after="40"/>
+      </w:pPr>
+      <w:r>
+        <w:rPr>
+          <w:b/>
+          <w:sz w:val="20"/>
+        </w:rPr>
+        <w:t>AI Lead - wynagrodzenie (Z2)</w:t>
+      </w:r>
+      <w:r>
+        <w:rPr>
+          <w:color w:val="666666"/>
+          <w:sz w:val="17"/>
+        </w:rPr>
+        <w:t xml:space="preserve"> [876 z 1500 znaków]</w:t>
+      </w:r>
+    </w:p>
+    <w:p>
+      <w:pPr>
+        <w:spacing w:after="60"/>
+        <w:shd w:val="clear" w:color="auto" w:fill="EEF6EE"/>
+      </w:pPr>
+      <w:r>
+        <w:rPr>
+          <w:b w:val="0"/>
+        </w:rPr>
+        <w:t>AI Lead zaprojektuje architekturę potoku wielomodalnej akwizycji i zdefiniuje wymaganie synchronizacji znaczników czasu do 0,001 s dla kamer, radaru mmWave i czujników MEMS. Opracuje algorytm wykrywania i korekcji utraty synchronizacji przy drganiach oraz framework oceny jakości strumieni (kompletność, ciągłość, spójność czasowa). Przygotuje schemat anotacji i kryteria jakości danych, a także oceni zgodność anotatorów współczynnikiem Cohena i zdecyduje o reanotacji, gdy zgodność spadnie poniżej 0,80. Opracuje strukturę i wersjonowanie zbioru przekazywanego do PRz. Stanowisko jest niezbędne, ponieważ jakość synchronizacji i anotacji decyduje o tym, czy modele w zadaniach Z4 i Z8 będzie można wytrenować. Zakres stanowiska ma wyłącznie charakter badawczo-rozwojowy i nie obejmuje czynności zarządczych, kierowniczych, koordynacyjnych, administracyjnych ani nadzorczych.</w:t>
+      </w:r>
+    </w:p>
+    <w:p>
+      <w:pPr>
+        <w:keepNext/>
+        <w:spacing w:before="160" w:after="40"/>
+      </w:pPr>
+      <w:r>
+        <w:rPr>
+          <w:b/>
+          <w:sz w:val="20"/>
+        </w:rPr>
+        <w:t>AI Senior Engineer - wynagrodzenie (Z2)</w:t>
+      </w:r>
+      <w:r>
+        <w:rPr>
+          <w:color w:val="666666"/>
+          <w:sz w:val="17"/>
+        </w:rPr>
+        <w:t xml:space="preserve"> [747 z 1500 znaków]</w:t>
+      </w:r>
+    </w:p>
+    <w:p>
+      <w:pPr>
+        <w:spacing w:after="60"/>
+        <w:shd w:val="clear" w:color="auto" w:fill="EEF6EE"/>
+      </w:pPr>
+      <w:r>
+        <w:rPr>
+          <w:b w:val="0"/>
+        </w:rPr>
+        <w:t>AI Senior Engineer zaprogramuje moduł ujednolicania znaczników czasu dla strumieni o częstotliwościach od około 0,017 Hz do 1000 Hz, system monitorowania integralności danych oraz oprogramowanie kalibracji kamer z automatyczną weryfikacją. Opracuje specyfikację anotacji segmentacji instancji w standardzie COCO dla anotatorów Everest11: kryteria decyzyjne dla każdej klasy zabezpieczeń, warunki graniczne okluzji i protokół kontroli jakości. Wykona analizę pilotażową zbioru pod kątem możliwości trenowania modeli. Stanowisko jest niezbędne dla wiarygodności i kompletności zbioru. Zakres stanowiska ma wyłącznie charakter badawczo-rozwojowy i nie obejmuje czynności zarządczych, kierowniczych, koordynacyjnych, administracyjnych ani nadzorczych.</w:t>
+      </w:r>
+    </w:p>
+    <w:p>
+      <w:pPr>
+        <w:keepNext/>
+        <w:spacing w:before="160" w:after="40"/>
+      </w:pPr>
+      <w:r>
+        <w:rPr>
+          <w:b/>
+          <w:sz w:val="20"/>
+        </w:rPr>
+        <w:t>Cybersecurity / AI Act Specialist - wynagrodzenie (Z2)</w:t>
+      </w:r>
+      <w:r>
+        <w:rPr>
+          <w:color w:val="666666"/>
+          <w:sz w:val="17"/>
+        </w:rPr>
+        <w:t xml:space="preserve"> [670 z 1500 znaków]</w:t>
+      </w:r>
+    </w:p>
+    <w:p>
+      <w:pPr>
+        <w:spacing w:after="60"/>
+        <w:shd w:val="clear" w:color="auto" w:fill="EEF6EE"/>
+      </w:pPr>
+      <w:r>
+        <w:rPr>
+          <w:b w:val="0"/>
+        </w:rPr>
+        <w:t>Specjalista ds. cyberbezpieczeństwa zaprojektuje zabezpieczenia akwizycji i przechowywania danych: szyfrowanie danych sensorycznych w spoczynku i w transmisji, mechanizm kluczy dostępu do repozytorium oraz pseudonimizację danych wizyjnych i lokalizacyjnych w zbiorze. Zabezpieczenia są częścią metody akwizycji, ponieważ zbiór zawiera dane kierowców i bez nich nie można go zebrać ani przekazać do PRz. Czynności z zakresu zgodności z AI Act i RODO mają charakter przedwdrożeniowy i nie są objęte kosztem. Zakres stanowiska ma wyłącznie charakter badawczo-rozwojowy i nie obejmuje czynności zarządczych, kierowniczych, koordynacyjnych, administracyjnych ani nadzorczych.</w:t>
+      </w:r>
+    </w:p>
+    <w:p>
+      <w:pPr>
+        <w:keepNext/>
+        <w:spacing w:before="160" w:after="40"/>
+      </w:pPr>
+      <w:r>
+        <w:rPr>
+          <w:b/>
+          <w:sz w:val="20"/>
+        </w:rPr>
+        <w:t>IT Specialist - wynagrodzenie (Z2)</w:t>
+      </w:r>
+      <w:r>
+        <w:rPr>
+          <w:color w:val="666666"/>
+          <w:sz w:val="17"/>
+        </w:rPr>
+        <w:t xml:space="preserve"> [741 z 1500 znaków]</w:t>
+      </w:r>
+    </w:p>
+    <w:p>
+      <w:pPr>
+        <w:spacing w:after="60"/>
+        <w:shd w:val="clear" w:color="auto" w:fill="EEF6EE"/>
+      </w:pPr>
+      <w:r>
+        <w:rPr>
+          <w:b w:val="0"/>
+        </w:rPr>
+        <w:t>IT Specialist zbuduje infrastrukturę zapisu danych: ciągły zapis wszystkich strumieni na dysku NVMe, kompresję i rotację logów oraz odzyskiwanie po zaniku zasilania. Wykona potok strukturyzacji i wersjonowania zbioru: tagowanie sesji metadanymi (trasa, klasa ładunku, warunki pogodowe, identyfikator naczepy), walidację kompletności każdej sesji i eksport do repozytorium PRz z sumami kontrolnymi. Wdroży zdalny monitoring stanu zestawów sensorycznych w trakcie kampanii. Bez tej infrastruktury nie będzie możliwe wiarygodne zebranie co najmniej 500 godzin danych użytecznych. Zakres stanowiska ma wyłącznie charakter badawczo-rozwojowy i nie obejmuje czynności zarządczych, kierowniczych, koordynacyjnych, administracyjnych ani nadzorczych.</w:t>
+      </w:r>
+    </w:p>
+    <w:p>
+      <w:pPr>
+        <w:keepNext/>
+        <w:spacing w:before="160" w:after="40"/>
+      </w:pPr>
+      <w:r>
+        <w:rPr>
+          <w:b/>
+          <w:sz w:val="20"/>
+        </w:rPr>
+        <w:t>IoT Specialist - wynagrodzenie (Z2)</w:t>
+      </w:r>
+      <w:r>
+        <w:rPr>
+          <w:color w:val="666666"/>
+          <w:sz w:val="17"/>
+        </w:rPr>
+        <w:t xml:space="preserve"> [728 z 1500 znaków]</w:t>
+      </w:r>
+    </w:p>
+    <w:p>
+      <w:pPr>
+        <w:spacing w:after="60"/>
+        <w:shd w:val="clear" w:color="auto" w:fill="EEF6EE"/>
+      </w:pPr>
+      <w:r>
+        <w:rPr>
+          <w:b w:val="0"/>
+        </w:rPr>
+        <w:t>IoT Specialist zaprojektuje warstwę sprzętową toru pomiarowego: dobierze i skonfiguruje czujniki MEMS i radar mmWave FMCW 77 GHz, zaprojektuje zasilanie z sieci pojazdu 12 i 24 V oraz iteracyjnie dobierze ekranowanie EMC ograniczające artefakty od metalowych ścian w widmie drgań od 5 do 150 Hz. Wykona odbiór techniczny montażu wykonanego przez podwykonawcę, uruchomi tor i przeprowadzi testy kalibracyjne: stacjonarny co najmniej 24 h i drogowy co najmniej 500 km. Montaż nie należy do tego stanowiska. Prace są warunkiem fizycznej poprawności toru pomiarowego. Zakres stanowiska ma wyłącznie charakter badawczo-rozwojowy i nie obejmuje czynności zarządczych, kierowniczych, koordynacyjnych, administracyjnych ani nadzorczych.</w:t>
+      </w:r>
+    </w:p>
+    <w:p>
+      <w:pPr>
+        <w:keepNext/>
+        <w:spacing w:before="160" w:after="40"/>
+      </w:pPr>
+      <w:r>
+        <w:rPr>
+          <w:b/>
+          <w:sz w:val="20"/>
+        </w:rPr>
+        <w:t>Specjalista ds. logistyki TSL - wynagrodzenie (Z2)</w:t>
+      </w:r>
+      <w:r>
+        <w:rPr>
+          <w:color w:val="666666"/>
+          <w:sz w:val="17"/>
+        </w:rPr>
+        <w:t xml:space="preserve"> [692 z 1500 znaków]</w:t>
+      </w:r>
+    </w:p>
+    <w:p>
+      <w:pPr>
+        <w:spacing w:after="60"/>
+        <w:shd w:val="clear" w:color="auto" w:fill="EEF6EE"/>
+      </w:pPr>
+      <w:r>
+        <w:rPr>
+          <w:b w:val="0"/>
+        </w:rPr>
+        <w:t>Specjalista ds. logistyki TSL przekaże PRz wymagania operacyjne i uwagi domenowe do protokołu zbioru oraz taksonomii klas, a także zweryfikuje ich trafność na podstawie obserwacji z przewozów. Poprowadzi inspekcję fizyczną stanu ładunku przy załadunku i rozładunku według protokołu z zadania Z3, ze zdjęciami ze znacznikiem czasu i w trybie ślepym względem modelu, co tworzy warstwę ground truth zbioru. Zatwierdzi etykietę referencyjną przy rozbieżnościach anotatorów. Bez tej wiedzy domenowej etykiety byłyby niejednoznaczne. Zakres stanowiska ma wyłącznie charakter badawczo-rozwojowy i nie obejmuje czynności zarządczych, kierowniczych, koordynacyjnych, administracyjnych ani nadzorczych.</w:t>
+      </w:r>
+    </w:p>
+    <w:p>
+      <w:pPr>
+        <w:keepNext/>
+        <w:spacing w:before="160" w:after="40"/>
+      </w:pPr>
+      <w:r>
+        <w:rPr>
+          <w:b/>
+          <w:sz w:val="20"/>
+        </w:rPr>
+        <w:t>Backend/Full-Stack Developer - wynagrodzenie (Z2)</w:t>
+      </w:r>
+      <w:r>
+        <w:rPr>
+          <w:color w:val="666666"/>
+          <w:sz w:val="17"/>
+        </w:rPr>
+        <w:t xml:space="preserve"> [613 z 1500 znaków]</w:t>
+      </w:r>
+    </w:p>
+    <w:p>
+      <w:pPr>
+        <w:spacing w:after="60"/>
+        <w:shd w:val="clear" w:color="auto" w:fill="EEF6EE"/>
+      </w:pPr>
+      <w:r>
+        <w:rPr>
+          <w:b w:val="0"/>
+        </w:rPr>
+        <w:t>Backend/Full-Stack Developer, w wymiarze 1,0 etatu w M13-M18, zaimplementuje warstwę programową potoku akwizycji: moduły zbierania i porządkowania strumieni z różnych sensorów, zapis i przesył danych oraz strukturyzację zbioru przekazywanego do PRz. Zaangażowanie przypada na okres intensywnej akwizycji i porządkowania danych. Stanowisko jest niezbędne, aby utrzymać przepustowość i jakość potoku przy wielomiesięcznej kampanii na wielu pojazdach. Zakres stanowiska ma wyłącznie charakter badawczo-rozwojowy i nie obejmuje czynności zarządczych, kierowniczych, koordynacyjnych, administracyjnych ani nadzorczych.</w:t>
+      </w:r>
+    </w:p>
+    <w:p>
+      <w:pPr>
+        <w:keepNext/>
+        <w:spacing w:before="160" w:after="40"/>
+      </w:pPr>
+      <w:r>
+        <w:rPr>
+          <w:b/>
+          <w:sz w:val="20"/>
+        </w:rPr>
+        <w:t>Anotatorzy - wynagrodzenie (Z2)</w:t>
+      </w:r>
+      <w:r>
+        <w:rPr>
+          <w:color w:val="666666"/>
+          <w:sz w:val="17"/>
+        </w:rPr>
+        <w:t xml:space="preserve"> [888 z 1500 znaków]</w:t>
+      </w:r>
+    </w:p>
+    <w:p>
+      <w:pPr>
+        <w:spacing w:after="60"/>
+        <w:shd w:val="clear" w:color="auto" w:fill="EEF6EE"/>
+      </w:pPr>
+      <w:r>
+        <w:rPr>
+          <w:b w:val="0"/>
+        </w:rPr>
+        <w:t>Trzech anotatorów, każdy w wymiarze 1,0 etatu przez 10 miesięcy, wykona anotację co najmniej 15 000 klatek RGB metodą segmentacji instancji w standardzie COCO według taksonomii TSL i kryteriów opracowanych przez zespół B+R Lidera. Przy gęstych scenach i okluzjach nakład wynosi około 11-12 minut na klatkę, do czego dochodzą reanotacja po kontroli jakości oraz niezależna anotacja próby co najmniej 10% klatek do pomiaru zgodności (współczynnik Cohena co najmniej 0,80). Anotatorzy zgłaszają przypadki niejednoznaczne, które są materiałem do walidacji taksonomii w zadaniu Z3. Ich praca jest bezpośrednim udziałem w badaniach, ponieważ wytwarza zbiór referencyjny i dane do pomiaru zgodności, a nie samą obróbkę techniczną. Zakres stanowiska ma wyłącznie charakter badawczo-rozwojowy i nie obejmuje czynności zarządczych, kierowniczych, koordynacyjnych, administracyjnych ani nadzorczych.</w:t>
+      </w:r>
+    </w:p>
+    <w:p>
+      <w:pPr>
+        <w:pStyle w:val="Heading2"/>
+      </w:pPr>
+      <w:r>
+        <w:t>Zadanie 6</w:t>
+      </w:r>
+    </w:p>
+    <w:p>
+      <w:pPr>
+        <w:keepNext/>
+        <w:spacing w:before="160" w:after="40"/>
+      </w:pPr>
+      <w:r>
+        <w:rPr>
+          <w:b/>
+          <w:sz w:val="20"/>
+        </w:rPr>
+        <w:t>AI Lead - wynagrodzenie (Z6)</w:t>
+      </w:r>
+      <w:r>
+        <w:rPr>
+          <w:color w:val="666666"/>
+          <w:sz w:val="17"/>
+        </w:rPr>
+        <w:t xml:space="preserve"> [665 z 1500 znaków]</w:t>
+      </w:r>
+    </w:p>
+    <w:p>
+      <w:pPr>
+        <w:spacing w:after="60"/>
+        <w:shd w:val="clear" w:color="auto" w:fill="EEF6EE"/>
+      </w:pPr>
+      <w:r>
+        <w:rPr>
+          <w:b w:val="0"/>
+        </w:rPr>
+        <w:t>AI Lead zaprojektuje architekturę pipeline'u generacji dokumentów PoL i PoC: przepływ danych od modeli AI do generatora, logikę fuzji źródeł (model 3D z zadania Z5, raport CV z zadania Z8, historia sygnałów MEMS, raport ML z zadania Z4) oraz format wyjściowy z podpisem kryptograficznym. Zoptymalizuje czas generowania PoC do 30 s: sprofiluje poszczególne etapy, wskaże wąskie gardła i wdroży przetwarzanie przyrostowe. Niepewność dotyczy utrzymania 30 s przy jednoczesnej fuzji wielu różnych źródeł. Zakres stanowiska ma wyłącznie charakter badawczo-rozwojowy i nie obejmuje czynności zarządczych, kierowniczych, koordynacyjnych, administracyjnych ani nadzorczych.</w:t>
+      </w:r>
+    </w:p>
+    <w:p>
+      <w:pPr>
+        <w:keepNext/>
+        <w:spacing w:before="160" w:after="40"/>
+      </w:pPr>
+      <w:r>
+        <w:rPr>
+          <w:b/>
+          <w:sz w:val="20"/>
+        </w:rPr>
+        <w:t>AI Senior Engineer - wynagrodzenie (Z6)</w:t>
+      </w:r>
+      <w:r>
+        <w:rPr>
+          <w:color w:val="666666"/>
+          <w:sz w:val="17"/>
+        </w:rPr>
+        <w:t xml:space="preserve"> [571 z 1500 znaków]</w:t>
+      </w:r>
+    </w:p>
+    <w:p>
+      <w:pPr>
+        <w:spacing w:after="60"/>
+        <w:shd w:val="clear" w:color="auto" w:fill="EEF6EE"/>
+      </w:pPr>
+      <w:r>
+        <w:rPr>
+          <w:b w:val="0"/>
+        </w:rPr>
+        <w:t>AI Senior Engineer zaimplementuje integrację modułu change detection z zadania Z8 w pipeline PoC: porównanie stanu 3D przy załadunku i rozładunku, mapę anomalii z prawdopodobieństwem uszkodzenia dla każdej pozycji ładunkowej oraz wizualizację 3D. Zaimplementuje generator raportu klasyfikatora ML: oś czasu narażenia, podsumowanie dla każdej klasy i wyjaśnienia SHAP (5 najważniejszych cech dla zdarzenia). Zakres stanowiska ma wyłącznie charakter badawczo-rozwojowy i nie obejmuje czynności zarządczych, kierowniczych, koordynacyjnych, administracyjnych ani nadzorczych.</w:t>
+      </w:r>
+    </w:p>
+    <w:p>
+      <w:pPr>
+        <w:keepNext/>
+        <w:spacing w:before="160" w:after="40"/>
+      </w:pPr>
+      <w:r>
+        <w:rPr>
+          <w:b/>
+          <w:sz w:val="20"/>
+        </w:rPr>
+        <w:t>Cybersecurity / AI Act Specialist - wynagrodzenie (Z6)</w:t>
+      </w:r>
+      <w:r>
+        <w:rPr>
+          <w:color w:val="666666"/>
+          <w:sz w:val="17"/>
+        </w:rPr>
+        <w:t xml:space="preserve"> [608 z 1500 znaków]</w:t>
+      </w:r>
+    </w:p>
+    <w:p>
+      <w:pPr>
+        <w:spacing w:after="60"/>
+        <w:shd w:val="clear" w:color="auto" w:fill="EEF6EE"/>
+      </w:pPr>
+      <w:r>
+        <w:rPr>
+          <w:b w:val="0"/>
+        </w:rPr>
+        <w:t>Specjalista ds. cyberbezpieczeństwa zaimplementuje podpis kryptograficzny dokumentów PoL i PoC ze znacznikiem czasu oraz łańcuch integralności danych od sensora do dokumentu, a następnie zbada jego odporność na utratę łączności. Prace są częścią niepewności technicznej zadania, czyli zachowania wartości dowodowej dokumentu. Polityka ochrony danych i dokumentacja zgodności z AI Act są czynnościami przedwdrożeniowymi i nie są objęte kosztem. Zakres stanowiska ma wyłącznie charakter badawczo-rozwojowy i nie obejmuje czynności zarządczych, kierowniczych, koordynacyjnych, administracyjnych ani nadzorczych.</w:t>
+      </w:r>
+    </w:p>
+    <w:p>
+      <w:pPr>
+        <w:keepNext/>
+        <w:spacing w:before="160" w:after="40"/>
+      </w:pPr>
+      <w:r>
+        <w:rPr>
+          <w:b/>
+          <w:sz w:val="20"/>
+        </w:rPr>
+        <w:t>IT Specialist - wynagrodzenie (Z6)</w:t>
+      </w:r>
+      <w:r>
+        <w:rPr>
+          <w:color w:val="666666"/>
+          <w:sz w:val="17"/>
+        </w:rPr>
+        <w:t xml:space="preserve"> [701 z 1500 znaków]</w:t>
+      </w:r>
+    </w:p>
+    <w:p>
+      <w:pPr>
+        <w:spacing w:after="60"/>
+        <w:shd w:val="clear" w:color="auto" w:fill="EEF6EE"/>
+      </w:pPr>
+      <w:r>
+        <w:rPr>
+          <w:b w:val="0"/>
+        </w:rPr>
+        <w:t>IT Specialist zaimplementuje pipeline PoL i PoC oraz generator dokumentów eFTI w formacie XML i JSON według reguł przekształcania zdarzeń z sensorów w pola eFTI. Wykona walidację schematem XSD i zmierzy czas generowania oraz opóźnienie przesłania zdarzenia do interfejsu testowego TMS w testach integracyjnych na co najmniej 50 cyklach załadunek-rozładunek (cel: mediana do 30 s, opóźnienie do 2 s). Standardowe API TMS, integracje z Trans.eu, TimoCom i e-CMR oraz utrzymanie nie są objęte kosztem; Everest11 wykonuje je poza projektem. Zakres stanowiska ma wyłącznie charakter badawczo-rozwojowy i nie obejmuje czynności zarządczych, kierowniczych, koordynacyjnych, administracyjnych ani nadzorczych.</w:t>
+      </w:r>
+    </w:p>
+    <w:p>
+      <w:pPr>
+        <w:keepNext/>
+        <w:spacing w:before="160" w:after="40"/>
+      </w:pPr>
+      <w:r>
+        <w:rPr>
+          <w:b/>
+          <w:sz w:val="20"/>
+        </w:rPr>
+        <w:t>IoT Specialist - wynagrodzenie (Z6)</w:t>
+      </w:r>
+      <w:r>
+        <w:rPr>
+          <w:color w:val="666666"/>
+          <w:sz w:val="17"/>
+        </w:rPr>
+        <w:t xml:space="preserve"> [554 z 1500 znaków]</w:t>
+      </w:r>
+    </w:p>
+    <w:p>
+      <w:pPr>
+        <w:spacing w:after="60"/>
+        <w:shd w:val="clear" w:color="auto" w:fill="EEF6EE"/>
+      </w:pPr>
+      <w:r>
+        <w:rPr>
+          <w:b w:val="0"/>
+        </w:rPr>
+        <w:t>IoT Specialist zintegruje sygnał czujnika drzwi jako wyzwalacz generowania PoL i PoC, zsynchronizuje znaczniki czasu GPS z zegarem systemu embedded oraz zaimplementuje moduł agregacji historii sygnałów środowiskowych z trasy (profil drgań, temperatura, wilgotność) w formacie przekazywanym do pipeline'u. Prace są warunkiem poprawnej fuzji danych i wiarygodności znacznika czasu dokumentu. Zakres stanowiska ma wyłącznie charakter badawczo-rozwojowy i nie obejmuje czynności zarządczych, kierowniczych, koordynacyjnych, administracyjnych ani nadzorczych.</w:t>
+      </w:r>
+    </w:p>
+    <w:p>
+      <w:pPr>
+        <w:keepNext/>
+        <w:spacing w:before="160" w:after="40"/>
+      </w:pPr>
+      <w:r>
+        <w:rPr>
+          <w:b/>
+          <w:sz w:val="20"/>
+        </w:rPr>
+        <w:t>Specjalista ds. logistyki TSL - wynagrodzenie (Z6)</w:t>
+      </w:r>
+      <w:r>
+        <w:rPr>
+          <w:color w:val="666666"/>
+          <w:sz w:val="17"/>
+        </w:rPr>
+        <w:t xml:space="preserve"> [545 z 1500 znaków]</w:t>
+      </w:r>
+    </w:p>
+    <w:p>
+      <w:pPr>
+        <w:spacing w:after="60"/>
+        <w:shd w:val="clear" w:color="auto" w:fill="EEF6EE"/>
+      </w:pPr>
+      <w:r>
+        <w:rPr>
+          <w:b w:val="0"/>
+        </w:rPr>
+        <w:t>Specjalista ds. logistyki TSL zinterpretuje operacyjnie pola eFTI przy opracowywaniu reguł przekształcania zdarzeń. Oceni treść PoL i PoC pod kątem przydatności w obronie reklamacji, zgodności z wymaganiami ubezpieczyciela i czytelności. Przetestuje pipeline na scenariuszach załadunku mieszanego, ADR i LTL oraz wskaże przypadki brzegowe, które posłużą do dostrajania pipeline'u. Zakres stanowiska ma wyłącznie charakter badawczo-rozwojowy i nie obejmuje czynności zarządczych, kierowniczych, koordynacyjnych, administracyjnych ani nadzorczych.</w:t>
+      </w:r>
+    </w:p>
+    <w:p>
+      <w:pPr>
+        <w:keepNext/>
+        <w:spacing w:before="160" w:after="40"/>
+      </w:pPr>
+      <w:r>
+        <w:rPr>
+          <w:b/>
+          <w:sz w:val="20"/>
+        </w:rPr>
+        <w:t>Backend/Full-Stack Developer - wynagrodzenie (Z6)</w:t>
+      </w:r>
+      <w:r>
+        <w:rPr>
+          <w:color w:val="666666"/>
+          <w:sz w:val="17"/>
+        </w:rPr>
+        <w:t xml:space="preserve"> [760 z 1500 znaków]</w:t>
+      </w:r>
+    </w:p>
+    <w:p>
+      <w:pPr>
+        <w:spacing w:after="60"/>
+        <w:shd w:val="clear" w:color="auto" w:fill="EEF6EE"/>
+      </w:pPr>
+      <w:r>
+        <w:rPr>
+          <w:b w:val="0"/>
+        </w:rPr>
+        <w:t>Backend/Full-Stack Developer, w wymiarze 1,0 etatu przez 9 miesięcy od M19 do M27, zbuduje strumieniowy potok danych z urządzenia embedded do pipeline'u PoL i PoC, kolejkowanie i mechanizmy zachowania spójności danych przy utracie łączności oraz przepływ danych z potoku akwizycji z zadania Z2. Wykona test zgodności wygenerowanych dokumentów eFTI z implementacją referencyjną Komisji Europejskiej i wesprze testy integracyjne. Ciągłość kompetencji z zadania Z2 zapewnia spójność warstwy danych między akwizycją a generacją dokumentów. Rutynowa integracja API i utrzymanie nie są objęte kosztem. Zakres stanowiska ma wyłącznie charakter badawczo-rozwojowy i nie obejmuje czynności zarządczych, kierowniczych, koordynacyjnych, administracyjnych ani nadzorczych.</w:t>
+      </w:r>
+    </w:p>
+    <w:p>
+      <w:pPr>
+        <w:pStyle w:val="Heading2"/>
+      </w:pPr>
+      <w:r>
+        <w:t>Zadanie 7</w:t>
+      </w:r>
+    </w:p>
+    <w:p>
+      <w:pPr>
+        <w:keepNext/>
+        <w:spacing w:before="160" w:after="40"/>
+      </w:pPr>
+      <w:r>
+        <w:rPr>
+          <w:b/>
+          <w:sz w:val="20"/>
+        </w:rPr>
+        <w:t>AI Lead - wynagrodzenie (Z7)</w:t>
+      </w:r>
+      <w:r>
+        <w:rPr>
+          <w:color w:val="666666"/>
+          <w:sz w:val="17"/>
+        </w:rPr>
+        <w:t xml:space="preserve"> [812 z 1500 znaków]</w:t>
+      </w:r>
+    </w:p>
+    <w:p>
+      <w:pPr>
+        <w:spacing w:after="60"/>
+        <w:shd w:val="clear" w:color="auto" w:fill="EEF6EE"/>
+      </w:pPr>
+      <w:r>
+        <w:rPr>
+          <w:b w:val="0"/>
+        </w:rPr>
+        <w:t>AI Lead wyznaczy strategię kompresji dla każdego modelu (INT8, trening z uwzględnieniem kwantyzacji, mieszana precyzja warstw) i budżet degradacji dokładności nie większy niż 3 punkty procentowe. Zaprojektuje wieloetapowy proces kompresji w kolejności: kwantyzacja, przycinanie, destylacja, z pomiarami po każdym etapie. Zwaliduje dokładność modeli skompresowanych na zbiorach testowych z zadań Z4 i Z8, porównując FP32 i INT8 dla AUC-ROC i mAP, oraz zintegruje modele PRz w wersjach release candidate. Prace mają rozstrzygnąć niepewność, czy opóźnienie alertu do 1 s da się pogodzić z degradacją do 3 punktów procentowych na docelowej platformie. Zakres stanowiska ma wyłącznie charakter badawczo-rozwojowy i nie obejmuje czynności zarządczych, kierowniczych, koordynacyjnych, administracyjnych ani nadzorczych.</w:t>
+      </w:r>
+    </w:p>
+    <w:p>
+      <w:pPr>
+        <w:keepNext/>
+        <w:spacing w:before="160" w:after="40"/>
+      </w:pPr>
+      <w:r>
+        <w:rPr>
+          <w:b/>
+          <w:sz w:val="20"/>
+        </w:rPr>
+        <w:t>AI Senior Engineer - wynagrodzenie (Z7)</w:t>
+      </w:r>
+      <w:r>
+        <w:rPr>
+          <w:color w:val="666666"/>
+          <w:sz w:val="17"/>
+        </w:rPr>
+        <w:t xml:space="preserve"> [733 z 1500 znaków]</w:t>
+      </w:r>
+    </w:p>
+    <w:p>
+      <w:pPr>
+        <w:spacing w:after="60"/>
+        <w:shd w:val="clear" w:color="auto" w:fill="EEF6EE"/>
+      </w:pPr>
+      <w:r>
+        <w:rPr>
+          <w:b w:val="0"/>
+        </w:rPr>
+        <w:t>AI Senior Engineer zaimplementuje kompresję modeli: kwantyzację INT8 z profilowaniem warstw, trening z uwzględnieniem kwantyzacji dla modeli CV wrażliwych na kwantyzację, przycinanie strukturalne według macierzy informacji Fishera oraz destylację wiedzy z projektem sieci typu student pod platformę embedded. Zaimplementuje potok inferencji brzegowej (modele 3D z zadania Z5, CV z zadania Z8, ML ryzyka z zadania Z4) i zoptymalizuje opóźnienie przez profilowanie modułów, batching i TensorRT. Zmierzy opóźnienie (mediana, percentyl 95) na co najmniej 1000 przebiegach. Zakres stanowiska ma wyłącznie charakter badawczo-rozwojowy i nie obejmuje czynności zarządczych, kierowniczych, koordynacyjnych, administracyjnych ani nadzorczych.</w:t>
+      </w:r>
+    </w:p>
+    <w:p>
+      <w:pPr>
+        <w:keepNext/>
+        <w:spacing w:before="160" w:after="40"/>
+      </w:pPr>
+      <w:r>
+        <w:rPr>
+          <w:b/>
+          <w:sz w:val="20"/>
+        </w:rPr>
+        <w:t>Cybersecurity / AI Act Specialist - wynagrodzenie (Z7)</w:t>
+      </w:r>
+      <w:r>
+        <w:rPr>
+          <w:color w:val="666666"/>
+          <w:sz w:val="17"/>
+        </w:rPr>
+        <w:t xml:space="preserve"> [691 z 1500 znaków]</w:t>
+      </w:r>
+    </w:p>
+    <w:p>
+      <w:pPr>
+        <w:spacing w:after="60"/>
+        <w:shd w:val="clear" w:color="auto" w:fill="EEF6EE"/>
+      </w:pPr>
+      <w:r>
+        <w:rPr>
+          <w:b w:val="0"/>
+        </w:rPr>
+        <w:t>Specjalista ds. cyberbezpieczeństwa zaprojektuje i zaimplementuje bezpieczny rozruch (ochrona firmware), szyfrowanie danych w buforze lokalnym, podpisywanie aktualizacji OTA oraz szyfrowanie transmisji z urządzenia do TMS. Zabezpieczenia są częścią architektury systemu embedded, ponieważ system pracuje bez nadzoru w pojeździe i musi zachować integralność danych dowodowych. Karta transparentności, ocena ryzyka systemu AI i inne czynności z zakresu zgodności z AI Act mają charakter przedwdrożeniowy i nie są objęte kosztem. Zakres stanowiska ma wyłącznie charakter badawczo-rozwojowy i nie obejmuje czynności zarządczych, kierowniczych, koordynacyjnych, administracyjnych ani nadzorczych.</w:t>
+      </w:r>
+    </w:p>
+    <w:p>
+      <w:pPr>
+        <w:keepNext/>
+        <w:spacing w:before="160" w:after="40"/>
+      </w:pPr>
+      <w:r>
+        <w:rPr>
+          <w:b/>
+          <w:sz w:val="20"/>
+        </w:rPr>
+        <w:t>IT Specialist - wynagrodzenie (Z7)</w:t>
+      </w:r>
+      <w:r>
+        <w:rPr>
+          <w:color w:val="666666"/>
+          <w:sz w:val="17"/>
+        </w:rPr>
+        <w:t xml:space="preserve"> [667 z 1500 znaków]</w:t>
+      </w:r>
+    </w:p>
+    <w:p>
+      <w:pPr>
+        <w:spacing w:after="60"/>
+        <w:shd w:val="clear" w:color="auto" w:fill="EEF6EE"/>
+      </w:pPr>
+      <w:r>
+        <w:rPr>
+          <w:b w:val="0"/>
+        </w:rPr>
+        <w:t>IT Specialist zaimplementuje oprogramowanie embedded: system czasu rzeczywistego, sterowniki sensorów, moduł buforowania danych do transmisji GSM (autonomia do 72 h), mechanizm aktualizacji OTA, generator alertu lokalnego (3 poziomy ryzyka, logika eskalacji, zapis zdarzeń w buforze) oraz moduł komunikacji z TMS (protokół transmisji, priorytetyzacja alertów względem danych historycznych, ponawianie). Prace są częścią eksperymentalnego rozwoju systemu pracującego w czasie rzeczywistym bez łączności. Zakres stanowiska ma wyłącznie charakter badawczo-rozwojowy i nie obejmuje czynności zarządczych, kierowniczych, koordynacyjnych, administracyjnych ani nadzorczych.</w:t>
+      </w:r>
+    </w:p>
+    <w:p>
+      <w:pPr>
+        <w:keepNext/>
+        <w:spacing w:before="160" w:after="40"/>
+      </w:pPr>
+      <w:r>
+        <w:rPr>
+          <w:b/>
+          <w:sz w:val="20"/>
+        </w:rPr>
+        <w:t>IoT Specialist - wynagrodzenie (Z7)</w:t>
+      </w:r>
+      <w:r>
+        <w:rPr>
+          <w:color w:val="666666"/>
+          <w:sz w:val="17"/>
+        </w:rPr>
+        <w:t xml:space="preserve"> [757 z 1500 znaków]</w:t>
+      </w:r>
+    </w:p>
+    <w:p>
+      <w:pPr>
+        <w:spacing w:after="60"/>
+        <w:shd w:val="clear" w:color="auto" w:fill="EEF6EE"/>
+      </w:pPr>
+      <w:r>
+        <w:rPr>
+          <w:b w:val="0"/>
+        </w:rPr>
+        <w:t>IoT Specialist zaprojektuje architekturę sprzętową embedded: integrację jednostki AI o wydajności co najmniej 40 TOPS w INT8 z sensorami (USB3, MIPI, SPI, UART, I2C) oraz zasilanie 12 i 24 V DC z buforem UPS co najmniej 1800 s. Zaprojektuje obudowę IP67 (dobór materiałów dla temperatury od -25 do +70 °C, chłodzenie pasywne, mocowanie odporne na drgania ISO 8608 klasy D). Przeprowadzi testy środowiskowe na infrastrukturze PRz: rig wibracyjny (co najmniej 14 400 s), komorę termiczną (cykl 24 h) i testy EMC, a także zmierzy opóźnienie alertu. Montaż w pojazdach nie należy do tego zadania. Zakres stanowiska ma wyłącznie charakter badawczo-rozwojowy i nie obejmuje czynności zarządczych, kierowniczych, koordynacyjnych, administracyjnych ani nadzorczych.</w:t>
+      </w:r>
+    </w:p>
+    <w:p>
+      <w:pPr>
+        <w:keepNext/>
+        <w:spacing w:before="160" w:after="40"/>
+      </w:pPr>
+      <w:r>
+        <w:rPr>
+          <w:b/>
+          <w:sz w:val="20"/>
+        </w:rPr>
+        <w:t>Specjalista ds. logistyki TSL - wynagrodzenie (Z7)</w:t>
+      </w:r>
+      <w:r>
+        <w:rPr>
+          <w:color w:val="666666"/>
+          <w:sz w:val="17"/>
+        </w:rPr>
+        <w:t xml:space="preserve"> [614 z 1500 znaków]</w:t>
+      </w:r>
+    </w:p>
+    <w:p>
+      <w:pPr>
+        <w:spacing w:after="60"/>
+        <w:shd w:val="clear" w:color="auto" w:fill="EEF6EE"/>
+      </w:pPr>
+      <w:r>
+        <w:rPr>
+          <w:b w:val="0"/>
+        </w:rPr>
+        <w:t>Specjalista ds. logistyki TSL zdefiniuje scenariusze walidacji alertów z perspektywy operacyjnej oraz progi ryzyka niski, średni i wysoki dla każdej klasy ładunku, sprawdzając, czy progi modelu odpowiadają rzeczywistym ryzykom. Oceni użyteczność alertu dźwiękowego w warunkach kabiny i to, czy system nie zakłóca załadunku i rozładunku, jako uczestnik testów środowiskowych. Prace dostarczają kryteriów, według których walidowany jest alert lokalny. Zakres stanowiska ma wyłącznie charakter badawczo-rozwojowy i nie obejmuje czynności zarządczych, kierowniczych, koordynacyjnych, administracyjnych ani nadzorczych.</w:t>
+      </w:r>
+    </w:p>
+    <w:p>
+      <w:pPr>
+        <w:pStyle w:val="Heading2"/>
+      </w:pPr>
+      <w:r>
+        <w:t>Zadanie 9</w:t>
+      </w:r>
+    </w:p>
+    <w:p>
+      <w:pPr>
+        <w:keepNext/>
+        <w:spacing w:before="160" w:after="40"/>
+      </w:pPr>
+      <w:r>
+        <w:rPr>
+          <w:b/>
+          <w:sz w:val="20"/>
+        </w:rPr>
+        <w:t>AI Lead - wynagrodzenie (Z9)</w:t>
+      </w:r>
+      <w:r>
+        <w:rPr>
+          <w:color w:val="666666"/>
+          <w:sz w:val="17"/>
+        </w:rPr>
+        <w:t xml:space="preserve"> [728 z 1500 znaków]</w:t>
+      </w:r>
+    </w:p>
+    <w:p>
+      <w:pPr>
+        <w:spacing w:after="60"/>
+        <w:shd w:val="clear" w:color="auto" w:fill="EEF6EE"/>
+      </w:pPr>
+      <w:r>
+        <w:rPr>
+          <w:b w:val="0"/>
+        </w:rPr>
+        <w:t>AI Lead opracuje protokół walidacji KPI modeli AI (co najmniej 180 kursów dla AUC-ROC, co najmniej 200 obrazów dla mAP), zbierze i uporządkuje dane terenowe oraz obliczy metryki dla każdej klasy. Przy stwierdzeniu przesunięcia domeny (domain shift) przeprowadzi adaptację domenową: douczenie, rekalibrację progów i ponowną walidację w oknie korekt w M30. Niepewność dotyczy utrzymania wskaźników laboratoryjnych w rzeczywistej eksploatacji. Czynności związane z ochroną własności przemysłowej i zgłoszeniem patentowym nie są objęte kosztem; należą do zadania Z11. Zakres stanowiska ma wyłącznie charakter badawczo-rozwojowy i nie obejmuje czynności zarządczych, kierowniczych, koordynacyjnych, administracyjnych ani nadzorczych.</w:t>
+      </w:r>
+    </w:p>
+    <w:p>
+      <w:pPr>
+        <w:keepNext/>
+        <w:spacing w:before="160" w:after="40"/>
+      </w:pPr>
+      <w:r>
+        <w:rPr>
+          <w:b/>
+          <w:sz w:val="20"/>
+        </w:rPr>
+        <w:t>AI Senior Engineer - wynagrodzenie (Z9)</w:t>
+      </w:r>
+      <w:r>
+        <w:rPr>
+          <w:color w:val="666666"/>
+          <w:sz w:val="17"/>
+        </w:rPr>
+        <w:t xml:space="preserve"> [740 z 1500 znaków]</w:t>
+      </w:r>
+    </w:p>
+    <w:p>
+      <w:pPr>
+        <w:spacing w:after="60"/>
+        <w:shd w:val="clear" w:color="auto" w:fill="EEF6EE"/>
+      </w:pPr>
+      <w:r>
+        <w:rPr>
+          <w:b w:val="0"/>
+        </w:rPr>
+        <w:t>AI Senior Engineer zoptymalizuje modele na platformie w warunkach terenowych, wskaże scenariusze o obniżonej dokładności, zdiagnozuje przyczyny (przesunięcie domeny, nowe ładunki, oświetlenie) i wdroży korekty: douczenie, augmentację terenową i rekalibrację. Przygotuje anotację próbki co najmniej 200 obrazów terenowych jako ground truth dla mAP, weryfikowaną przez specjalistę ds. logistyki TSL. Opracuje raport KPI (krzywe ROC, macierze pomyłek, analiza błędów) oraz przeprowadzi badanie akceptacji użytkowników (kierowcy, dyspozytorzy) według scenariuszy specjalisty TSL. Zakres stanowiska ma wyłącznie charakter badawczo-rozwojowy i nie obejmuje czynności zarządczych, kierowniczych, koordynacyjnych, administracyjnych ani nadzorczych.</w:t>
+      </w:r>
+    </w:p>
+    <w:p>
+      <w:pPr>
+        <w:keepNext/>
+        <w:spacing w:before="160" w:after="40"/>
+      </w:pPr>
+      <w:r>
+        <w:rPr>
+          <w:b/>
+          <w:sz w:val="20"/>
+        </w:rPr>
+        <w:t>Cybersecurity / AI Act Specialist - wynagrodzenie (Z9)</w:t>
+      </w:r>
+      <w:r>
+        <w:rPr>
+          <w:color w:val="666666"/>
+          <w:sz w:val="17"/>
+        </w:rPr>
+        <w:t xml:space="preserve"> [681 z 1500 znaków]</w:t>
+      </w:r>
+    </w:p>
+    <w:p>
+      <w:pPr>
+        <w:spacing w:after="60"/>
+        <w:shd w:val="clear" w:color="auto" w:fill="EEF6EE"/>
+      </w:pPr>
+      <w:r>
+        <w:rPr>
+          <w:b w:val="0"/>
+        </w:rPr>
+        <w:t>Specjalista ds. cyberbezpieczeństwa wykona testy bezpieczeństwa prototypu w terenie, w tym weryfikację integralności kryptograficznej dokumentów PoL i PoC oraz bezpieczeństwa transmisji. Uruchomi zamrożony skrypt ewaluacyjny jako niezależny ewaluator: nie ma powiązań z partnerem testowym ani udziału w modelowaniu, a wyniki powstają automatycznie ze skryptu, na danych z logu niemodyfikowalnego. Aktualizacja dokumentacji AI Act, przegląd stanu techniki patentowej i analiza swobody wdrożenia nie są objęte kosztem. Zakres stanowiska ma wyłącznie charakter badawczo-rozwojowy i nie obejmuje czynności zarządczych, kierowniczych, koordynacyjnych, administracyjnych ani nadzorczych.</w:t>
+      </w:r>
+    </w:p>
+    <w:p>
+      <w:pPr>
+        <w:keepNext/>
+        <w:spacing w:before="160" w:after="40"/>
+      </w:pPr>
+      <w:r>
+        <w:rPr>
+          <w:b/>
+          <w:sz w:val="20"/>
+        </w:rPr>
+        <w:t>IT Specialist - wynagrodzenie (Z9)</w:t>
+      </w:r>
+      <w:r>
+        <w:rPr>
+          <w:color w:val="666666"/>
+          <w:sz w:val="17"/>
+        </w:rPr>
+        <w:t xml:space="preserve"> [572 z 1500 znaków]</w:t>
+      </w:r>
+    </w:p>
+    <w:p>
+      <w:pPr>
+        <w:spacing w:after="60"/>
+        <w:shd w:val="clear" w:color="auto" w:fill="EEF6EE"/>
+      </w:pPr>
+      <w:r>
+        <w:rPr>
+          <w:b w:val="0"/>
+        </w:rPr>
+        <w:t>IT Specialist zbierze i uporządkuje logi terenowe (dostępność, status GSM, bufor), wykona pomiar czasu generowania PoC na co najmniej 200 cyklach (cel: mediana do 30 s) i opóźnienia transmisji oraz przygotuje dane do raportu KPI. Poprawki oprogramowania wprowadzi wyłącznie w oknie korekt w M30, na podstawie wyników walidacji. Bieżące utrzymanie systemu i środowiska integracyjnego nie jest objęte kosztem. Zakres stanowiska ma wyłącznie charakter badawczo-rozwojowy i nie obejmuje czynności zarządczych, kierowniczych, koordynacyjnych, administracyjnych ani nadzorczych.</w:t>
+      </w:r>
+    </w:p>
+    <w:p>
+      <w:pPr>
+        <w:keepNext/>
+        <w:spacing w:before="160" w:after="40"/>
+      </w:pPr>
+      <w:r>
+        <w:rPr>
+          <w:b/>
+          <w:sz w:val="20"/>
+        </w:rPr>
+        <w:t>IoT Specialist - wynagrodzenie (Z9)</w:t>
+      </w:r>
+      <w:r>
+        <w:rPr>
+          <w:color w:val="666666"/>
+          <w:sz w:val="17"/>
+        </w:rPr>
+        <w:t xml:space="preserve"> [686 z 1500 znaków]</w:t>
+      </w:r>
+    </w:p>
+    <w:p>
+      <w:pPr>
+        <w:spacing w:after="60"/>
+        <w:shd w:val="clear" w:color="auto" w:fill="EEF6EE"/>
+      </w:pPr>
+      <w:r>
+        <w:rPr>
+          <w:b w:val="0"/>
+        </w:rPr>
+        <w:t>IoT Specialist wykona projekt techniczny instalacji, konfigurację i kalibrację kamer i radaru w warunkach rzeczywistych oraz odbiór techniczny zestawów po montażu na co najmniej 3 pojazdach floty testowej. Montaż i demontaż wykonuje podwykonawca. Zarejestruje parametry niezawodności sprzętu (dostępność co najmniej 95%, temperatura modułów, status sensorów, degradacja połączeń) i zmierzy opóźnienie alertu na co najmniej 500 zdarzeniach bez GSM (cel: percentyl 95 do 1 s). Serwis i naprawy awarii nie są objęte kosztem. Zakres stanowiska ma wyłącznie charakter badawczo-rozwojowy i nie obejmuje czynności zarządczych, kierowniczych, koordynacyjnych, administracyjnych ani nadzorczych.</w:t>
+      </w:r>
+    </w:p>
+    <w:p>
+      <w:pPr>
+        <w:keepNext/>
+        <w:spacing w:before="160" w:after="40"/>
+      </w:pPr>
+      <w:r>
+        <w:rPr>
+          <w:b/>
+          <w:sz w:val="20"/>
+        </w:rPr>
+        <w:t>Specjalista ds. logistyki TSL - wynagrodzenie (Z9)</w:t>
+      </w:r>
+      <w:r>
+        <w:rPr>
+          <w:color w:val="666666"/>
+          <w:sz w:val="17"/>
+        </w:rPr>
+        <w:t xml:space="preserve"> [705 z 1500 znaków]</w:t>
+      </w:r>
+    </w:p>
+    <w:p>
+      <w:pPr>
+        <w:spacing w:after="60"/>
+        <w:shd w:val="clear" w:color="auto" w:fill="EEF6EE"/>
+      </w:pPr>
+      <w:r>
+        <w:rPr>
+          <w:b w:val="0"/>
+        </w:rPr>
+        <w:t>Specjalista ds. logistyki TSL poprowadzi inspekcje stanu ładunku na co najmniej 180 kursach (dokumentacja fotograficzna ze znacznikiem czasu, oznaczanie zdarzeń) w trybie ślepym względem predykcji, według protokołu z zadania Z3, tworząc ground truth dla AUC-ROC. Zweryfikuje anotację próbki obrazów terenowych i przygotuje scenariusze badania akceptacji użytkowników. Nie ocenia trafności alertów i nie podpisuje protokołu odbioru, a co najmniej 10% jego inspekcji jest powtórnie weryfikowane przez drugą osobę Everest11 na podstawie zdjęć. Zakres stanowiska ma wyłącznie charakter badawczo-rozwojowy i nie obejmuje czynności zarządczych, kierowniczych, koordynacyjnych, administracyjnych ani nadzorczych.</w:t>
+      </w:r>
+    </w:p>
+    <w:p>
+      <w:pPr>
+        <w:keepNext/>
+        <w:spacing w:before="160" w:after="40"/>
+      </w:pPr>
+      <w:r>
+        <w:rPr>
+          <w:b/>
+          <w:sz w:val="20"/>
+        </w:rPr>
+        <w:t>Backend/Full-Stack Developer - wynagrodzenie (Z9)</w:t>
+      </w:r>
+      <w:r>
+        <w:rPr>
+          <w:color w:val="666666"/>
+          <w:sz w:val="17"/>
+        </w:rPr>
+        <w:t xml:space="preserve"> [558 z 1500 znaków]</w:t>
+      </w:r>
+    </w:p>
+    <w:p>
+      <w:pPr>
+        <w:spacing w:after="60"/>
+        <w:shd w:val="clear" w:color="auto" w:fill="EEF6EE"/>
+      </w:pPr>
+      <w:r>
+        <w:rPr>
+          <w:b w:val="0"/>
+        </w:rPr>
+        <w:t>Backend/Full-Stack Developer, w wymiarze 1,0 etatu przez 3 miesiące od M28 do M30, obsłuży walidację PoC i zgodności eFTI w terenie na co najmniej 200 cyklach, przeanalizuje błędy i dostroi warstwę danych w oknie korekt. Prace kontynuują zadanie Z6 i są niezbędne do potwierdzenia czasu generowania PoC i pokrycia pól eFTI w eksploatacji. Bieżące utrzymanie integracji nie jest objęte kosztem. Zakres stanowiska ma wyłącznie charakter badawczo-rozwojowy i nie obejmuje czynności zarządczych, kierowniczych, koordynacyjnych, administracyjnych ani nadzorczych.</w:t>
       </w:r>
     </w:p>
     <w:p>
@@ -13997,7 +14949,7 @@
                 <w:b w:val="0"/>
                 <w:sz w:val="15"/>
               </w:rPr>
-              <w:t>Zmienić nazwę, np. na „Pipeline PoL/PoC i zgodność z eFTI (Z6)”. Nazwę wpisuje się raz w 3.1.1, a pola przy pozycjach kosztowych pobierają ją automatycznie (Instrukcja, pole techniczne), więc zmiana jest jednorazowa. Do sprawdzenia w LSI. Alternatywa: zostawić nazwę, bo opis Z6 już wyłącza integracje standardowe. Wymaga decyzji właściciela.</w:t>
+              <w:t>Zmienić nazwę, np. na „Pipeline PoL/PoC i zgodność z eFTI (Z6)”. Nazwę wpisuje się raz w 3.1.1, a pola przy pozycjach kosztowych pobierają ją automatycznie (Instrukcja, pole techniczne), więc zmiana jest jednorazowa. Do sprawdzenia w LSI. Alternatywa: zostawić nazwę, bo opis Z6 już wyłącza integracje standardowe. DECYZJA: zatwierdzona, nazwa zmieniona w tym dokumencie.</w:t>
             </w:r>
           </w:p>
         </w:tc>
@@ -14015,7 +14967,7 @@
                 <w:b w:val="0"/>
                 <w:sz w:val="15"/>
               </w:rPr>
-              <w:t>K3-08; D24</w:t>
+              <w:t>K3-08; D24, D31</w:t>
             </w:r>
           </w:p>
         </w:tc>
@@ -16811,6 +17763,116 @@
                 <w:sz w:val="15"/>
               </w:rPr>
               <w:t>K3-43 do K3-46; D08</w:t>
+            </w:r>
+          </w:p>
+        </w:tc>
+        <w:tc>
+          <w:tcPr>
+            <w:tcW w:type="dxa" w:w="737"/>
+          </w:tcPr>
+          <w:p>
+            <w:pPr>
+              <w:spacing w:after="20"/>
+            </w:pPr>
+            <w:r/>
+            <w:r>
+              <w:rPr>
+                <w:b w:val="0"/>
+                <w:sz w:val="15"/>
+              </w:rPr>
+              <w:t>WYSOKI</w:t>
+            </w:r>
+          </w:p>
+        </w:tc>
+      </w:tr>
+      <w:tr>
+        <w:tc>
+          <w:tcPr>
+            <w:tcW w:type="dxa" w:w="567"/>
+          </w:tcPr>
+          <w:p>
+            <w:pPr>
+              <w:spacing w:after="20"/>
+            </w:pPr>
+            <w:r/>
+            <w:r>
+              <w:rPr>
+                <w:b w:val="0"/>
+                <w:sz w:val="15"/>
+              </w:rPr>
+              <w:t>N28</w:t>
+            </w:r>
+          </w:p>
+        </w:tc>
+        <w:tc>
+          <w:tcPr>
+            <w:tcW w:type="dxa" w:w="1871"/>
+          </w:tcPr>
+          <w:p>
+            <w:pPr>
+              <w:spacing w:after="20"/>
+            </w:pPr>
+            <w:r/>
+            <w:r>
+              <w:rPr>
+                <w:b w:val="0"/>
+                <w:sz w:val="15"/>
+              </w:rPr>
+              <w:t>3.1.2 AI Lead Z7, IoT Specialist Z9 oraz uzasadnienie kosztu edge AI w Z2 (wiersze „300 ms”)</w:t>
+            </w:r>
+          </w:p>
+        </w:tc>
+        <w:tc>
+          <w:tcPr>
+            <w:tcW w:type="dxa" w:w="2041"/>
+          </w:tcPr>
+          <w:p>
+            <w:pPr>
+              <w:spacing w:after="20"/>
+            </w:pPr>
+            <w:r/>
+            <w:r>
+              <w:rPr>
+                <w:b w:val="0"/>
+                <w:sz w:val="15"/>
+              </w:rPr>
+              <w:t>Opóźnienie alertu „≤300 ms” (AI Lead Z7: pogodzenie 300 ms z degradacją 3 pp; IoT Z9: percentyl 95 do 300 ms; edge AI Z2: alerty do 300 ms).</w:t>
+            </w:r>
+          </w:p>
+        </w:tc>
+        <w:tc>
+          <w:tcPr>
+            <w:tcW w:type="dxa" w:w="3175"/>
+          </w:tcPr>
+          <w:p>
+            <w:pPr>
+              <w:spacing w:after="20"/>
+            </w:pPr>
+            <w:r/>
+            <w:r>
+              <w:rPr>
+                <w:b w:val="0"/>
+                <w:sz w:val="15"/>
+              </w:rPr>
+              <w:t>Ujednolicić do 1 s (percentyl 95), zgodnie ze wskaźnikiem, KM-Z7 i KM-Z9. Nowe teksty uzasadnień są w części trzeciej.</w:t>
+            </w:r>
+          </w:p>
+        </w:tc>
+        <w:tc>
+          <w:tcPr>
+            <w:tcW w:type="dxa" w:w="1247"/>
+          </w:tcPr>
+          <w:p>
+            <w:pPr>
+              <w:spacing w:after="20"/>
+            </w:pPr>
+            <w:r/>
+            <w:r>
+              <w:rPr>
+                <w:b w:val="0"/>
+                <w:sz w:val="15"/>
+              </w:rPr>
+              <w:t>K3-13, K3-15; KM-Z7</w:t>
             </w:r>
           </w:p>
         </w:tc>
@@ -18325,7 +19387,7 @@
                 <w:b w:val="0"/>
                 <w:sz w:val="17"/>
               </w:rPr>
-              <w:t>3829/4000</w:t>
+              <w:t>3959/4000</w:t>
             </w:r>
           </w:p>
         </w:tc>

</xml_diff>

<commit_message>
Z6: integracje TMS/Trans.eu/TimoCom/e-CMR jako prace techniczne niezbedne do walidacji (D24 zmieniona)
Co-Authored-By: Claude Sonnet 5.5 <noreply@anthropic.com>
Claude-Session: https://claude.ai/code/session_01672WnJhixnEcarbb7uiwfx
</commit_message>
<xml_diff>
--- a/Opisy_zadan_z_kamieniami_milowymi.docx
+++ b/Opisy_zadan_z_kamieniami_milowymi.docx
@@ -2645,7 +2645,7 @@
           <w:color w:val="666666"/>
           <w:sz w:val="17"/>
         </w:rPr>
-        <w:t xml:space="preserve"> [3275 z 4000 znaków]</w:t>
+        <w:t xml:space="preserve"> [3805 z 4000 znaków]</w:t>
       </w:r>
     </w:p>
     <w:p>
@@ -2722,7 +2722,7 @@
         <w:rPr>
           <w:b w:val="0"/>
         </w:rPr>
-        <w:t>Poza zakresem prac B+R i poza kosztami projektu pozostają: standardowe API TMS, integracje z Trans.eu, TimoCom i e-CMR, produkcyjny dashboard TMS, utrzymanie i przygotowanie do wdrożenia operacyjnego. Z istniejącego TMS zadanie korzysta przez interfejs testowy, wyłącznie do pomiaru czasu i kompletności.</w:t>
+        <w:t>Zadanie obejmuje także czynności techniczne o charakterze integracyjnym, wykonywane wyłącznie w zakresie niezbędnym do przetestowania i zwalidowania pipeline'u w warunkach zbliżonych do rzeczywistych: dwukierunkowe API z TMS Everest11 (zdarzenia do TMS, plan załadunku do urządzenia embedded) oraz prototypową integrację z Trans.eu, TimoCom i e-CMR w środowisku testowym, z wykorzystaniem istniejących interfejsów Everest11. Są one potrzebne do pomiaru czasu i opóźnień oraz do sprawdzenia, czy dokumenty eFTI są przyjmowane przez systemy zewnętrzne. Poza zakresem projektu pozostają wdrożenie produkcyjne, produkcyjny dashboard TMS, utrzymanie i obsługa operacyjna.</w:t>
       </w:r>
     </w:p>
     <w:p>
@@ -2733,7 +2733,7 @@
         <w:rPr>
           <w:b w:val="0"/>
         </w:rPr>
-        <w:t>Zadanie będzie realizowane przez zespół Everest11. AI Lead zaprojektuje architekturę pipeline'u i fuzję źródeł oraz zoptymalizuje czas generacji. AI Senior Engineer zaimplementuje integrację change detection i generator raportu klasyfikatora ML z wyjaśnieniami SHAP. Cybersecurity / AI Act Specialist zaimplementuje podpis kryptograficzny i integralność łańcucha dowodowego, bez prac prawnych i dokumentacyjnych. IT Specialist zaimplementuje pipeline i generator eFTI w XML i JSON oraz zmierzy czasy i opóźnienia w testach integracyjnych. Backend/Full-Stack Developer, w wymiarze 1,0 etatu przez 9 miesięcy od M19 do M27, zbuduje strumieniowy potok danych z embedded do pipeline'u, kolejkowanie i spójność przy utracie łączności oraz wykona test zgodności eFTI z implementacją referencyjną Komisji Europejskiej. IoT Specialist zintegruje sygnał czujnika drzwi, synchronizację znaczników czasu GPS i agregację historii drgań, temperatury i wilgotności. Specjalista ds. logistyki TSL zinterpretuje operacyjnie pola eFTI i oceni treść PoL i PoC. Nakład czasu tych osób wynika z podziału ich etatów między zadania Z6, Z7 i Z9 określonego w budżecie.</w:t>
+        <w:t>Zadanie będzie realizowane przez zespół Everest11. AI Lead zaprojektuje architekturę pipeline'u i fuzję źródeł oraz zoptymalizuje czas generacji. AI Senior Engineer zaimplementuje integrację change detection i generator raportu klasyfikatora ML z wyjaśnieniami SHAP. Cybersecurity / AI Act Specialist zaimplementuje podpis kryptograficzny i integralność łańcucha dowodowego, bez prac prawnych i dokumentacyjnych. IT Specialist zaimplementuje pipeline i generator eFTI w XML i JSON, dwukierunkowe API z TMS oraz prototypowe integracje z Trans.eu, TimoCom i e-CMR w środowisku testowym, a także zmierzy czasy i opóźnienia w testach integracyjnych. Backend/Full-Stack Developer, w wymiarze 1,0 etatu przez 9 miesięcy od M19 do M27, zbuduje strumieniowy potok danych z embedded do pipeline'u, kolejkowanie i spójność przy utracie łączności, wesprze integracje testowe z TMS i platformami zewnętrznymi oraz wykona test zgodności eFTI z implementacją referencyjną Komisji Europejskiej. IoT Specialist zintegruje sygnał czujnika drzwi, synchronizację znaczników czasu GPS i agregację historii drgań, temperatury i wilgotności. Specjalista ds. logistyki TSL zinterpretuje operacyjnie pola eFTI i oceni treść PoL i PoC. Nakład czasu tych osób wynika z podziału ich etatów między zadania Z6, Z7 i Z9 określonego w budżecie.</w:t>
       </w:r>
     </w:p>
     <w:p>
@@ -2753,7 +2753,7 @@
           <w:color w:val="666666"/>
           <w:sz w:val="17"/>
         </w:rPr>
-        <w:t xml:space="preserve"> [3098 z 4000 znaków]</w:t>
+        <w:t xml:space="preserve"> [3518 z 4000 znaków]</w:t>
       </w:r>
     </w:p>
     <w:p>
@@ -2775,7 +2775,7 @@
         <w:rPr>
           <w:b w:val="0"/>
         </w:rPr>
-        <w:t>Zadanie ma charakter prac rozwojowych, a nie standardowej integracji IT, ponieważ dotyczy trzech niepewności technicznych. Pierwsza to czas generowania do 30 s przy fuzji snapshotu 3D, raportu CV, osi narażenia ML, historii sygnałów i wizualizacji 3D. Druga to pokrycie co najmniej 95% obligatoryjnych pól eFTI, gdy część pól wymaga danych spoza sensorów. Trzecia to zgodność treści dokumentu z rzeczywistym stanem ładunku. Czynności standardowe (API TMS, Trans.eu, TimoCom, e-CMR, produkcyjny dashboard, utrzymanie) nie są pracami B+R i nie są kosztem projektu.</w:t>
+        <w:t>Zadanie ma charakter prac rozwojowych, a nie standardowej integracji IT, ponieważ dotyczy trzech niepewności technicznych. Pierwsza to czas generowania do 30 s przy fuzji snapshotu 3D, raportu CV, osi narażenia ML, historii sygnałów i wizualizacji 3D. Druga to pokrycie co najmniej 95% obligatoryjnych pól eFTI, gdy część pól wymaga danych spoza sensorów. Trzecia to zgodność treści dokumentu z rzeczywistym stanem ładunku. Czynności integracyjne (API TMS, Trans.eu, TimoCom, e-CMR) mają w zadaniu charakter techniczny i pomocniczy: są wykonywane wyłącznie w zakresie niezbędnym do przetestowania i zwalidowania prototypu, w środowisku testowym, a ich wynik nie jest odrębnym rezultatem badawczym. Produkcyjny dashboard, wdrożenie produkcyjne i utrzymanie nie są pracami B+R i nie są kosztem projektu.</w:t>
       </w:r>
     </w:p>
     <w:p>
@@ -2786,7 +2786,7 @@
         <w:rPr>
           <w:b w:val="0"/>
         </w:rPr>
-        <w:t>Metoda obejmuje trzy obszary prac. Dla pipeline'u zostaną sprofilowane wszystkie etapy, wskazane wąskie gardła i zastosowane przetwarzanie przyrostowe oraz bufor modelu 3D, a czas zostanie zmierzony na co najmniej 50 cyklach (mediana do 30 s, opóźnienie zdarzenia do interfejsu testowego TMS do 2 s). Łańcuch integralności będzie podpisanym pakietem z hashem źródeł i znacznikiem czasu, badanym testem odporności na utratę łączności. Dla eFTI zostaną przeanalizowane pola obligatoryjne, ustalona formalna reguła przekształcania zdarzeń w pola i przeprowadzona walidacja schematem XSD oraz implementacją referencyjną KE jako narzędziami testowymi, a mianownikiem wskaźnika pokrycia będą wszystkie pola obligatoryjne.</w:t>
+        <w:t>Metoda obejmuje trzy obszary prac. Dla pipeline'u zostaną sprofilowane wszystkie etapy, wskazane wąskie gardła i zastosowane przetwarzanie przyrostowe oraz bufor modelu 3D, a czas zostanie zmierzony na co najmniej 50 cyklach (mediana do 30 s, opóźnienie zdarzenia do TMS w środowisku testowym do 2 s), a przyjęcie dokumentów eFTI przez środowiska testowe Trans.eu, TimoCom i prototyp e-CMR potwierdzi, że format jest użyteczny poza systemem Everest11). Łańcuch integralności będzie podpisanym pakietem z hashem źródeł i znacznikiem czasu, badanym testem odporności na utratę łączności. Dla eFTI zostaną przeanalizowane pola obligatoryjne, ustalona formalna reguła przekształcania zdarzeń w pola i przeprowadzona walidacja schematem XSD oraz implementacją referencyjną KE jako narzędziami testowymi, a mianownikiem wskaźnika pokrycia będą wszystkie pola obligatoryjne.</w:t>
       </w:r>
     </w:p>
     <w:p>
@@ -2821,7 +2821,7 @@
         <w:rPr>
           <w:b w:val="0"/>
         </w:rPr>
-        <w:t>Wybór metody jest uzasadniony czterema względami. Test na rzeczywistych cyklach jest jedynym wiarygodnym sprawdzianem wykonalności, dlatego metoda jest celowa i skuteczna. Walidacja formalna i porównanie z ground truth zapewniają rzetelność, czyli niezawodność. Równoległość z zadaniem Z7 i interfejs testowy do istniejącego TMS zapewniają ekonomiczność, a koszty zadania obejmują wynagrodzenia wymienionych osób Everest11, z Backend/Full-Stack Developerem na 9 miesięcy.</w:t>
+        <w:t>Wybór metody jest uzasadniony czterema względami. Test na rzeczywistych cyklach jest jedynym wiarygodnym sprawdzianem wykonalności, dlatego metoda jest celowa i skuteczna. Walidacja formalna i porównanie z ground truth zapewniają rzetelność, czyli niezawodność. Równoległość z zadaniem Z7 i wykorzystanie istniejących interfejsów Everest11 do TMS i platform zapewniają ekonomiczność, a koszty zadania obejmują wynagrodzenia wymienionych osób Everest11, z Backend/Full-Stack Developerem na 9 miesięcy.</w:t>
       </w:r>
     </w:p>
     <w:p>
@@ -2931,7 +2931,7 @@
           <w:color w:val="666666"/>
           <w:sz w:val="17"/>
         </w:rPr>
-        <w:t xml:space="preserve"> [919 z 1300 znaków]</w:t>
+        <w:t xml:space="preserve"> [978 z 1300 znaków]</w:t>
       </w:r>
     </w:p>
     <w:p>
@@ -2980,7 +2980,7 @@
         <w:rPr>
           <w:b w:val="0"/>
         </w:rPr>
-        <w:t>3. Czas generowania PoL i PoC, każdego osobno, mediana: nie więcej niż 30 s. Opóźnienie przesłania zdarzenia do interfejsu testowego TMS: nie więcej niż 2 s. Próba co najmniej 50 cykli załadunek-rozładunek.</w:t>
+        <w:t>3. Czas generowania PoL i PoC, każdego osobno, mediana: nie więcej niż 30 s. Opóźnienie przesłania zdarzenia do TMS w środowisku testowym: nie więcej niż 2 s. Próba co najmniej 50 cykli załadunek-rozładunek.</w:t>
       </w:r>
     </w:p>
     <w:p>
@@ -2992,7 +2992,7 @@
         <w:rPr>
           <w:b w:val="0"/>
         </w:rPr>
-        <w:t>Kompletność: PoL i PoC w dwóch fazach operacyjnych, eksport eFTI w XML i JSON z walidacją XSD, podpis kryptograficzny dokumentów, interfejs testowy do TMS. Integracje z Trans.eu, TimoCom i e-CMR są poza zakresem prac B+R.</w:t>
+        <w:t>Kompletność: PoL i PoC w dwóch fazach operacyjnych, eksport eFTI w XML i JSON z walidacją XSD, podpis kryptograficzny dokumentów, dwukierunkowe API z TMS w środowisku testowym. Integracje testowe z Trans.eu, TimoCom i e-CMR są wykonywane tylko w zakresie niezbędnym do walidacji.</w:t>
       </w:r>
     </w:p>
     <w:p>
@@ -6494,7 +6494,7 @@
           <w:color w:val="666666"/>
           <w:sz w:val="17"/>
         </w:rPr>
-        <w:t xml:space="preserve"> [701 z 1500 znaków]</w:t>
+        <w:t xml:space="preserve"> [844 z 1500 znaków]</w:t>
       </w:r>
     </w:p>
     <w:p>
@@ -6506,7 +6506,7 @@
         <w:rPr>
           <w:b w:val="0"/>
         </w:rPr>
-        <w:t>IT Specialist zaimplementuje pipeline PoL i PoC oraz generator dokumentów eFTI w formacie XML i JSON według reguł przekształcania zdarzeń z sensorów w pola eFTI. Wykona walidację schematem XSD i zmierzy czas generowania oraz opóźnienie przesłania zdarzenia do interfejsu testowego TMS w testach integracyjnych na co najmniej 50 cyklach załadunek-rozładunek (cel: mediana do 30 s, opóźnienie do 2 s). Standardowe API TMS, integracje z Trans.eu, TimoCom i e-CMR oraz utrzymanie nie są objęte kosztem; Everest11 wykonuje je poza projektem. Zakres stanowiska ma wyłącznie charakter badawczo-rozwojowy i nie obejmuje czynności zarządczych, kierowniczych, koordynacyjnych, administracyjnych ani nadzorczych.</w:t>
+        <w:t>IT Specialist zaimplementuje pipeline PoL i PoC oraz generator dokumentów eFTI w formacie XML i JSON według reguł przekształcania zdarzeń z sensorów w pola eFTI. Wykona walidację schematem XSD oraz dwukierunkowe API z TMS i prototypowe integracje z Trans.eu, TimoCom i e-CMR w środowisku testowym, z wykorzystaniem istniejących interfejsów Everest11. Czynności integracyjne są techniczne i pomocnicze, wykonywane wyłącznie w zakresie niezbędnym do pomiaru czasu i opóźnień oraz do sprawdzenia przyjmowania dokumentów eFTI w testach na co najmniej 50 cyklach załadunek-rozładunek (cel: mediana do 30 s, opóźnienie do 2 s). Wdrożenie produkcyjne i utrzymanie nie są objęte kosztem. Zakres stanowiska ma wyłącznie charakter badawczo-rozwojowy i nie obejmuje czynności zarządczych, kierowniczych, koordynacyjnych, administracyjnych ani nadzorczych.</w:t>
       </w:r>
     </w:p>
     <w:p>
@@ -6590,7 +6590,7 @@
           <w:color w:val="666666"/>
           <w:sz w:val="17"/>
         </w:rPr>
-        <w:t xml:space="preserve"> [760 z 1500 znaków]</w:t>
+        <w:t xml:space="preserve"> [802 z 1500 znaków]</w:t>
       </w:r>
     </w:p>
     <w:p>
@@ -6602,7 +6602,7 @@
         <w:rPr>
           <w:b w:val="0"/>
         </w:rPr>
-        <w:t>Backend/Full-Stack Developer, w wymiarze 1,0 etatu przez 9 miesięcy od M19 do M27, zbuduje strumieniowy potok danych z urządzenia embedded do pipeline'u PoL i PoC, kolejkowanie i mechanizmy zachowania spójności danych przy utracie łączności oraz przepływ danych z potoku akwizycji z zadania Z2. Wykona test zgodności wygenerowanych dokumentów eFTI z implementacją referencyjną Komisji Europejskiej i wesprze testy integracyjne. Ciągłość kompetencji z zadania Z2 zapewnia spójność warstwy danych między akwizycją a generacją dokumentów. Rutynowa integracja API i utrzymanie nie są objęte kosztem. Zakres stanowiska ma wyłącznie charakter badawczo-rozwojowy i nie obejmuje czynności zarządczych, kierowniczych, koordynacyjnych, administracyjnych ani nadzorczych.</w:t>
+        <w:t>Backend/Full-Stack Developer, w wymiarze 1,0 etatu przez 9 miesięcy od M19 do M27, zbuduje strumieniowy potok danych z urządzenia embedded do pipeline'u PoL i PoC, kolejkowanie i mechanizmy zachowania spójności danych przy utracie łączności oraz przepływ danych z potoku akwizycji z zadania Z2. Wykona test zgodności wygenerowanych dokumentów eFTI z implementacją referencyjną Komisji Europejskiej i wesprze integracje testowe z TMS i platformami zewnętrznymi. Ciągłość kompetencji z zadania Z2 zapewnia spójność warstwy danych między akwizycją a generacją dokumentów. Utrzymanie integracji i wdrożenie produkcyjne nie są objęte kosztem. Zakres stanowiska ma wyłącznie charakter badawczo-rozwojowy i nie obejmuje czynności zarządczych, kierowniczych, koordynacyjnych, administracyjnych ani nadzorczych.</w:t>
       </w:r>
     </w:p>
     <w:p>
@@ -10212,7 +10212,7 @@
                 <w:b w:val="0"/>
                 <w:sz w:val="17"/>
               </w:rPr>
-              <w:t>Z6: wykaz prac poza zakresem B+R i poza kosztami, trzy niepewności</w:t>
+              <w:t>Z6: trzy niepewności badawcze; integracje TMS, Trans.eu, TimoCom i e-CMR opisane jako prace techniczne w środowisku testowym, niezbędne do walidacji; poza zakresem wdrożenie produkcyjne, dashboard, utrzymanie</w:t>
             </w:r>
           </w:p>
         </w:tc>
@@ -16534,7 +16534,7 @@
                 <w:b w:val="0"/>
                 <w:sz w:val="15"/>
               </w:rPr>
-              <w:t>Zastąpić zakresem z opisu Z6: pipeline i generator eFTI (IT), strumieniowy potok, kolejkowanie i test zgodności eFTI (Backend). Usunąć utrzymanie i integracje standardowe.</w:t>
+              <w:t>Zastąpić zakresem z opisu Z6: pipeline, generator eFTI oraz dwukierunkowe API z TMS i prototypowe integracje z Trans.eu, TimoCom i e-CMR w środowisku testowym (IT); strumieniowy potok, kolejkowanie, wsparcie integracji testowych i test zgodności eFTI (Backend). Czynności integracyjne opisać jako techniczne i pomocnicze, w zakresie niezbędnym do testów i walidacji. Usunąć utrzymanie, wdrożenie produkcyjne i produkcyjny dashboard.</w:t>
             </w:r>
           </w:p>
         </w:tc>
@@ -18949,7 +18949,7 @@
                 <w:b w:val="0"/>
                 <w:sz w:val="17"/>
               </w:rPr>
-              <w:t>3275/4000</w:t>
+              <w:t>3805/4000</w:t>
             </w:r>
           </w:p>
         </w:tc>
@@ -18967,7 +18967,7 @@
                 <w:b w:val="0"/>
                 <w:sz w:val="17"/>
               </w:rPr>
-              <w:t>3098/4000</w:t>
+              <w:t>3518/4000</w:t>
             </w:r>
           </w:p>
         </w:tc>
@@ -19003,7 +19003,7 @@
                 <w:b w:val="0"/>
                 <w:sz w:val="17"/>
               </w:rPr>
-              <w:t>919/1300</w:t>
+              <w:t>978/1300</w:t>
             </w:r>
           </w:p>
         </w:tc>

</xml_diff>

<commit_message>
D29: podzial etatow Z6/Z7/Z9, metoda szacowania, arkusz 10 z formulami
Co-Authored-By: Claude Sonnet 5.5 <noreply@anthropic.com>
Claude-Session: https://claude.ai/code/session_01672WnJhixnEcarbb7uiwfx
</commit_message>
<xml_diff>
--- a/Opisy_zadan_z_kamieniami_milowymi.docx
+++ b/Opisy_zadan_z_kamieniami_milowymi.docx
@@ -2645,7 +2645,7 @@
           <w:color w:val="666666"/>
           <w:sz w:val="17"/>
         </w:rPr>
-        <w:t xml:space="preserve"> [3805 z 4000 znaków]</w:t>
+        <w:t xml:space="preserve"> [3871 z 4000 znaków]</w:t>
       </w:r>
     </w:p>
     <w:p>
@@ -2722,7 +2722,7 @@
         <w:rPr>
           <w:b w:val="0"/>
         </w:rPr>
-        <w:t>Zadanie obejmuje także czynności techniczne o charakterze integracyjnym, wykonywane wyłącznie w zakresie niezbędnym do przetestowania i zwalidowania pipeline'u w warunkach zbliżonych do rzeczywistych: dwukierunkowe API z TMS Everest11 (zdarzenia do TMS, plan załadunku do urządzenia embedded) oraz prototypową integrację z Trans.eu, TimoCom i e-CMR w środowisku testowym, z wykorzystaniem istniejących interfejsów Everest11. Są one potrzebne do pomiaru czasu i opóźnień oraz do sprawdzenia, czy dokumenty eFTI są przyjmowane przez systemy zewnętrzne. Poza zakresem projektu pozostają wdrożenie produkcyjne, produkcyjny dashboard TMS, utrzymanie i obsługa operacyjna.</w:t>
+        <w:t>Zadanie obejmuje także czynności techniczne o charakterze integracyjnym, wykonywane wyłącznie w zakresie niezbędnym do przetestowania i zwalidowania pipeline'u w warunkach zbliżonych do rzeczywistych: dwukierunkowe API z TMS Everest11 (zdarzenia do TMS, plan załadunku do urządzenia embedded) oraz prototypową integrację z Trans.eu, TimoCom i e-CMR w środowisku testowym, z wykorzystaniem istniejących interfejsów Everest11. Poza zakresem projektu pozostają wdrożenie produkcyjne, produkcyjny dashboard TMS, utrzymanie i obsługa operacyjna.</w:t>
       </w:r>
     </w:p>
     <w:p>
@@ -2733,7 +2733,7 @@
         <w:rPr>
           <w:b w:val="0"/>
         </w:rPr>
-        <w:t>Zadanie będzie realizowane przez zespół Everest11. AI Lead zaprojektuje architekturę pipeline'u i fuzję źródeł oraz zoptymalizuje czas generacji. AI Senior Engineer zaimplementuje integrację change detection i generator raportu klasyfikatora ML z wyjaśnieniami SHAP. Cybersecurity / AI Act Specialist zaimplementuje podpis kryptograficzny i integralność łańcucha dowodowego, bez prac prawnych i dokumentacyjnych. IT Specialist zaimplementuje pipeline i generator eFTI w XML i JSON, dwukierunkowe API z TMS oraz prototypowe integracje z Trans.eu, TimoCom i e-CMR w środowisku testowym, a także zmierzy czasy i opóźnienia w testach integracyjnych. Backend/Full-Stack Developer, w wymiarze 1,0 etatu przez 9 miesięcy od M19 do M27, zbuduje strumieniowy potok danych z embedded do pipeline'u, kolejkowanie i spójność przy utracie łączności, wesprze integracje testowe z TMS i platformami zewnętrznymi oraz wykona test zgodności eFTI z implementacją referencyjną Komisji Europejskiej. IoT Specialist zintegruje sygnał czujnika drzwi, synchronizację znaczników czasu GPS i agregację historii drgań, temperatury i wilgotności. Specjalista ds. logistyki TSL zinterpretuje operacyjnie pola eFTI i oceni treść PoL i PoC. Nakład czasu tych osób wynika z podziału ich etatów między zadania Z6, Z7 i Z9 określonego w budżecie.</w:t>
+        <w:t>Zadanie będzie realizowane przez zespół Everest11. AI Lead zaprojektuje architekturę pipeline'u i fuzję źródeł oraz zoptymalizuje czas generacji. AI Senior Engineer zaimplementuje integrację change detection i generator raportu klasyfikatora ML z wyjaśnieniami SHAP. Cybersecurity / AI Act Specialist zaimplementuje podpis kryptograficzny i integralność łańcucha dowodowego, bez prac prawnych i dokumentacyjnych. IT Specialist zaimplementuje pipeline i generator eFTI w XML i JSON, dwukierunkowe API z TMS oraz prototypowe integracje z Trans.eu, TimoCom i e-CMR w środowisku testowym, a także zmierzy czasy i opóźnienia w testach integracyjnych. Backend/Full-Stack Developer, w wymiarze 1,0 etatu przez 9 miesięcy od M19 do M27, zbuduje strumieniowy potok danych z embedded do pipeline'u, kolejkowanie i spójność przy utracie łączności, wesprze integracje testowe z TMS i platformami zewnętrznymi oraz wykona test zgodności eFTI z implementacją referencyjną Komisji Europejskiej. IoT Specialist zintegruje sygnał czujnika drzwi, synchronizację znaczników czasu GPS i agregację historii drgań, temperatury i wilgotności. Specjalista ds. logistyki TSL zinterpretuje operacyjnie pola eFTI i oceni treść PoL i PoC. Nakład, wynikający z podziału etatów między zadania Z6, Z7 i Z9 według faz prac, wynosi w miesiącach pracy w przeliczeniu na pełny etat: AI Lead 2,10, AI Senior Engineer 2,15, specjalista ds. cyberbezpieczeństwa 0,80, IT Specialist 3,40, IoT Specialist 0,65, specjalista ds. logistyki TSL 1,35.</w:t>
       </w:r>
     </w:p>
     <w:p>
@@ -3144,7 +3144,7 @@
           <w:color w:val="666666"/>
           <w:sz w:val="17"/>
         </w:rPr>
-        <w:t xml:space="preserve"> [3297 z 4000 znaków]</w:t>
+        <w:t xml:space="preserve"> [3489 z 4000 znaków]</w:t>
       </w:r>
     </w:p>
     <w:p>
@@ -3232,7 +3232,7 @@
         <w:rPr>
           <w:b w:val="0"/>
         </w:rPr>
-        <w:t>Zadanie będzie realizowane przez zespół Everest11. AI Lead wyznaczy strategię kompresji dla każdego modelu i budżet degradacji oraz zwaliduje modele na zbiorach testowych. AI Senior Engineer zaimplementuje kompresję i zoptymalizuje modele na platformie embedded. IoT Specialist zaprojektuje architekturę sprzętową i obudowę oraz zmierzy opóźnienie alertu. IT Specialist zaimplementuje oprogramowanie embedded (system czasu rzeczywistego, sterowniki sensorów, generator alertów, bufor GSM, aktualizacje OTA) i moduł komunikacji z TMS. Cybersecurity / AI Act Specialist zaprojektuje bezpieczny rozruch, podpisywanie aktualizacji i szyfrowanie transmisji. Specjalista ds. logistyki TSL zdefiniuje scenariusze walidacji alertów i progi niski, średni i wysoki dla każdej klasy ładunku oraz oceni użyteczność alertu w kabinie. Nakład czasu tych osób wynika z podziału ich etatów między zadania Z6, Z7 i Z9 określonego w budżecie. Montaż w pojazdach nie należy do tego zadania.</w:t>
+        <w:t>Zadanie będzie realizowane przez zespół Everest11. AI Lead wyznaczy strategię kompresji dla każdego modelu i budżet degradacji oraz zwaliduje modele na zbiorach testowych. AI Senior Engineer zaimplementuje kompresję i zoptymalizuje modele na platformie embedded. IoT Specialist zaprojektuje architekturę sprzętową i obudowę oraz zmierzy opóźnienie alertu. IT Specialist zaimplementuje oprogramowanie embedded (system czasu rzeczywistego, sterowniki sensorów, generator alertów, bufor GSM, aktualizacje OTA) i moduł komunikacji z TMS. Cybersecurity / AI Act Specialist zaprojektuje bezpieczny rozruch, podpisywanie aktualizacji i szyfrowanie transmisji. Specjalista ds. logistyki TSL zdefiniuje scenariusze walidacji alertów i progi niski, średni i wysoki dla każdej klasy ładunku oraz oceni użyteczność alertu w kabinie. Nakład, wynikający z podziału etatów między zadania Z6, Z7 i Z9 według faz prac, wynosi w miesiącach pracy w przeliczeniu na pełny etat: AI Lead 3,05, AI Senior Engineer 3,55, specjalista ds. cyberbezpieczeństwa 0,80, IT Specialist 3,45, IoT Specialist 2,25, specjalista ds. logistyki TSL 1,65. Montaż w pojazdach nie należy do tego zadania.</w:t>
       </w:r>
     </w:p>
     <w:p>
@@ -4062,7 +4062,7 @@
           <w:color w:val="666666"/>
           <w:sz w:val="17"/>
         </w:rPr>
-        <w:t xml:space="preserve"> [3959 z 4000 znaków]</w:t>
+        <w:t xml:space="preserve"> [3938 z 4000 znaków]</w:t>
       </w:r>
     </w:p>
     <w:p>
@@ -4154,7 +4154,7 @@
         <w:rPr>
           <w:b w:val="0"/>
         </w:rPr>
-        <w:t xml:space="preserve"> nowych kursach, w celu ponownego potwierdzenia parametrów po korektach. Zmiany architektury i reanotacje, wymagające dłuższego cyklu, wykona PRz w zadaniu Z8.</w:t>
+        <w:t xml:space="preserve"> nowych kursach, w celu ponownego potwierdzenia parametrów po korektach.</w:t>
       </w:r>
     </w:p>
     <w:p>
@@ -4215,7 +4215,7 @@
         <w:rPr>
           <w:b w:val="0"/>
         </w:rPr>
-        <w:t>Montaż i demontaż zestawów wykona podwykonawca. Projekt techniczny, konfigurację, kalibrację i odbiór techniczny wykona IoT Specialist. Zadanie nie obejmuje czynności patentowych, które są przedmiotem zadania Z11. Zestawy po walidacji zostaną zlikwidowane z protokołem, bez użycia komercyjnego.</w:t>
+        <w:t>Montaż i demontaż zestawów wykona podwykonawca. Projekt techniczny, konfigurację, kalibrację i odbiór techniczny wykona IoT Specialist. Zadanie nie obejmuje czynności patentowych, które są przedmiotem zadania Z11.</w:t>
       </w:r>
     </w:p>
     <w:p>
@@ -4226,7 +4226,7 @@
         <w:rPr>
           <w:b w:val="0"/>
         </w:rPr>
-        <w:t>Zadanie będzie realizowane przez zespół Everest11. AI Lead opracuje protokół walidacji KPI, zbierze i uporządkuje dane terenowe, obliczy metryki dla każdej klasy i przy stwierdzeniu domain shift przeprowadzi adaptację domenową. AI Senior Engineer zoptymalizuje modele na platformie, zdiagnozuje domain shift, wdroży korekty, zmierzy wskaźniki jakości i przygotuje raport KPI oraz anotację próbki co najmniej 200 obrazów terenowych, weryfikowaną przez specjalistę TSL, a także przeprowadzi badanie akceptacji użytkowników (kierowcy, dyspozytorzy) według scenariuszy specjalisty TSL. IoT Specialist odbierze zestawy po montażu, skalibruje je i zarejestruje parametry niezawodności sprzętu. IT Specialist zbierze logi (dostępność, status GSM, bufor), zmierzy czas PoC i opóźnienia oraz opracuje dane do raportu KPI. Bieżące utrzymanie systemu nie należy do tego zadania. Cybersecurity / AI Act Specialist wykona testy bezpieczeństwa prototypu w terenie i uruchomi zamrożony skrypt ewaluacyjny jako niezależny ewaluator. Specjalista ds. logistyki TSL poprowadzi inspekcje ground truth i zweryfikuje anotację próbki obrazów. Backend/Full-Stack Developer, w wymiarze 1,0 etatu przez 3 miesiące od M28 do M30, obsłuży walidację PoC i zgodności eFTI w terenie na co najmniej 200 cyklach oraz analizę błędów. Nakład czasu pozostałych osób wynika z podziału ich etatów między zadania Z6, Z7 i Z9 określonego w budżecie.</w:t>
+        <w:t>Zadanie będzie realizowane przez zespół Everest11. AI Lead opracuje protokół walidacji KPI, zbierze i uporządkuje dane terenowe, obliczy metryki dla każdej klasy i przy stwierdzeniu domain shift przeprowadzi adaptację domenową. AI Senior Engineer zoptymalizuje modele na platformie, zdiagnozuje domain shift, wdroży korekty, zmierzy wskaźniki jakości i przygotuje raport KPI oraz anotację próbki co najmniej 200 obrazów terenowych, weryfikowaną przez specjalistę TSL, a także przeprowadzi badanie akceptacji użytkowników (kierowcy, dyspozytorzy) według scenariuszy specjalisty TSL. IoT Specialist odbierze zestawy po montażu, skalibruje je i zarejestruje parametry niezawodności sprzętu. IT Specialist zbierze logi (dostępność, status GSM, bufor), zmierzy czas PoC i opóźnienia oraz opracuje dane do raportu KPI. Cybersecurity / AI Act Specialist wykona testy bezpieczeństwa prototypu w terenie i uruchomi zamrożony skrypt ewaluacyjny jako niezależny ewaluator. Specjalista ds. logistyki TSL poprowadzi inspekcje ground truth i zweryfikuje anotację próbki obrazów. Backend/Full-Stack Developer, w wymiarze 1,0 etatu przez 3 miesiące od M28 do M30, obsłuży walidację PoC i zgodności eFTI w terenie na co najmniej 200 cyklach oraz analizę błędów. Nakład pozostałych osób, wynikający z podziału etatów między zadania Z6, Z7 i Z9 według faz prac, wynosi w miesiącach pracy w przeliczeniu na pełny etat: AI Lead 3,85, AI Senior Engineer 3,30, specjalista ds. cyberbezpieczeństwa 1,40, IT Specialist 5,15, IoT Specialist 3,10, specjalista ds. logistyki TSL 3,00.</w:t>
       </w:r>
     </w:p>
     <w:p>
@@ -4246,7 +4246,7 @@
           <w:color w:val="666666"/>
           <w:sz w:val="17"/>
         </w:rPr>
-        <w:t xml:space="preserve"> [3764 z 4000 znaków]</w:t>
+        <w:t xml:space="preserve"> [3845 z 4000 znaków]</w:t>
       </w:r>
     </w:p>
     <w:p>
@@ -4312,7 +4312,7 @@
         <w:rPr>
           <w:b w:val="0"/>
         </w:rPr>
-        <w:t>Zadanie zamyka łańcuch prac projektu. Integruje wyniki zadań Z4, Z5, Z6, Z7 i Z8, a potwierdzone KPI stanowią podstawę wskaźników rezultatu. Z danych radaru mmWave będzie dodatkowo wyznaczany wskaźnik wykorzystania kubatury naczepy (cel co najmniej 80%), raportowany miesięcznie jako wskaźnik operacyjny, który nie jest parametrem kamienia milowego. Raport techniczny z zadania Z9 jest wejściem do prac patentowych w zadaniu Z11, a koszty zadania obejmują wynagrodzenia wymienionych osób Everest11 oraz usługę podwykonawcy.</w:t>
+        <w:t>Zadanie zamyka łańcuch prac projektu. Integruje wyniki zadań Z4, Z5, Z6, Z7 i Z8, a potwierdzone KPI stanowią podstawę wskaźników rezultatu. Z danych radaru mmWave będzie dodatkowo wyznaczany wskaźnik wykorzystania kubatury naczepy (cel co najmniej 80%), raportowany miesięcznie jako wskaźnik operacyjny, który nie jest parametrem kamienia milowego. Raport techniczny z zadania Z9 jest wejściem do prac patentowych w zadaniu Z11, a koszty zadania obejmują wynagrodzenia wymienionych osób Everest11 oraz usługę podwykonawcy. Zestawy po walidacji zostaną zlikwidowane z protokołem, bez użycia komercyjnego.</w:t>
       </w:r>
     </w:p>
     <w:p>
@@ -7035,6 +7035,2953 @@
           <w:b w:val="0"/>
         </w:rPr>
         <w:t>Backend/Full-Stack Developer, w wymiarze 1,0 etatu przez 3 miesiące od M28 do M30, obsłuży walidację PoC i zgodności eFTI w terenie na co najmniej 200 cyklach, przeanalizuje błędy i dostroi warstwę danych w oknie korekt. Prace kontynuują zadanie Z6 i są niezbędne do potwierdzenia czasu generowania PoC i pokrycia pól eFTI w eksploatacji. Bieżące utrzymanie integracji nie jest objęte kosztem. Zakres stanowiska ma wyłącznie charakter badawczo-rozwojowy i nie obejmuje czynności zarządczych, kierowniczych, koordynacyjnych, administracyjnych ani nadzorczych.</w:t>
+      </w:r>
+    </w:p>
+    <w:p>
+      <w:r>
+        <w:br w:type="page"/>
+      </w:r>
+    </w:p>
+    <w:p>
+      <w:pPr>
+        <w:pStyle w:val="Heading1"/>
+      </w:pPr>
+      <w:r>
+        <w:t>Część czwarta. Podział etatów w zadaniach Z6, Z7 i Z9 oraz metoda szacowania kosztu</w:t>
+      </w:r>
+    </w:p>
+    <w:p>
+      <w:pPr>
+        <w:spacing w:after="60"/>
+      </w:pPr>
+      <w:r>
+        <w:rPr>
+          <w:b w:val="0"/>
+        </w:rPr>
+        <w:t>Budżet dzielił dotąd 12 miesięcy fazy prac rozwojowych równo na trzy zadania, co ekspert zakwestionował w uwagach 36 i 37 (zadania Z6 i Z7 trwają 9 miesięcy, a koszt odpowiadał 12 miesiącom). Poniżej podział według rzeczywistego przebiegu prac. Dla każdego z sześciu stanowisk suma nakładów w trzech zadaniach w każdym miesiącu równa się jego etatowi, a suma za M19-M30 i koszt łączny każdego stanowiska nie zmieniają się. Zmienia się tylko podział kosztu między zadania. Wszystkie trzy zadania są pracami rozwojowymi o tej samej intensywności pomocy (60%), więc kwota dofinansowania nie zmienia się.</w:t>
+      </w:r>
+    </w:p>
+    <w:p>
+      <w:pPr>
+        <w:pStyle w:val="Heading2"/>
+      </w:pPr>
+      <w:r>
+        <w:t>Tabela 1. Nakład w zadaniach Z6 / Z7 / Z9 w fazach (etat)</w:t>
+      </w:r>
+    </w:p>
+    <w:tbl>
+      <w:tblPr>
+        <w:tblStyle w:val="TableGrid"/>
+        <w:tblW w:type="auto" w:w="0"/>
+        <w:jc w:val="center"/>
+        <w:tblLook w:firstColumn="1" w:firstRow="1" w:lastColumn="0" w:lastRow="0" w:noHBand="0" w:noVBand="1" w:val="04A0"/>
+      </w:tblPr>
+      <w:tblGrid>
+        <w:gridCol w:w="1606"/>
+        <w:gridCol w:w="1606"/>
+        <w:gridCol w:w="1606"/>
+        <w:gridCol w:w="1606"/>
+        <w:gridCol w:w="1606"/>
+        <w:gridCol w:w="1606"/>
+      </w:tblGrid>
+      <w:tr>
+        <w:tc>
+          <w:tcPr>
+            <w:tcW w:type="dxa" w:w="2948"/>
+            <w:shd w:val="clear" w:color="auto" w:fill="D9E2F3"/>
+          </w:tcPr>
+          <w:p>
+            <w:pPr>
+              <w:spacing w:after="20"/>
+            </w:pPr>
+            <w:r/>
+            <w:r>
+              <w:rPr>
+                <w:b/>
+                <w:sz w:val="16"/>
+              </w:rPr>
+              <w:t>Stanowisko (etat)</w:t>
+            </w:r>
+          </w:p>
+        </w:tc>
+        <w:tc>
+          <w:tcPr>
+            <w:tcW w:type="dxa" w:w="1361"/>
+            <w:shd w:val="clear" w:color="auto" w:fill="D9E2F3"/>
+          </w:tcPr>
+          <w:p>
+            <w:pPr>
+              <w:spacing w:after="20"/>
+            </w:pPr>
+            <w:r/>
+            <w:r>
+              <w:rPr>
+                <w:b/>
+                <w:sz w:val="16"/>
+              </w:rPr>
+              <w:t>M19-M21</w:t>
+            </w:r>
+          </w:p>
+        </w:tc>
+        <w:tc>
+          <w:tcPr>
+            <w:tcW w:type="dxa" w:w="1361"/>
+            <w:shd w:val="clear" w:color="auto" w:fill="D9E2F3"/>
+          </w:tcPr>
+          <w:p>
+            <w:pPr>
+              <w:spacing w:after="20"/>
+            </w:pPr>
+            <w:r/>
+            <w:r>
+              <w:rPr>
+                <w:b/>
+                <w:sz w:val="16"/>
+              </w:rPr>
+              <w:t>M22</w:t>
+            </w:r>
+          </w:p>
+        </w:tc>
+        <w:tc>
+          <w:tcPr>
+            <w:tcW w:type="dxa" w:w="1361"/>
+            <w:shd w:val="clear" w:color="auto" w:fill="D9E2F3"/>
+          </w:tcPr>
+          <w:p>
+            <w:pPr>
+              <w:spacing w:after="20"/>
+            </w:pPr>
+            <w:r/>
+            <w:r>
+              <w:rPr>
+                <w:b/>
+                <w:sz w:val="16"/>
+              </w:rPr>
+              <w:t>M23-M25</w:t>
+            </w:r>
+          </w:p>
+        </w:tc>
+        <w:tc>
+          <w:tcPr>
+            <w:tcW w:type="dxa" w:w="1361"/>
+            <w:shd w:val="clear" w:color="auto" w:fill="D9E2F3"/>
+          </w:tcPr>
+          <w:p>
+            <w:pPr>
+              <w:spacing w:after="20"/>
+            </w:pPr>
+            <w:r/>
+            <w:r>
+              <w:rPr>
+                <w:b/>
+                <w:sz w:val="16"/>
+              </w:rPr>
+              <w:t>M26-M27</w:t>
+            </w:r>
+          </w:p>
+        </w:tc>
+        <w:tc>
+          <w:tcPr>
+            <w:tcW w:type="dxa" w:w="1361"/>
+            <w:shd w:val="clear" w:color="auto" w:fill="D9E2F3"/>
+          </w:tcPr>
+          <w:p>
+            <w:pPr>
+              <w:spacing w:after="20"/>
+            </w:pPr>
+            <w:r/>
+            <w:r>
+              <w:rPr>
+                <w:b/>
+                <w:sz w:val="16"/>
+              </w:rPr>
+              <w:t>M28-M30</w:t>
+            </w:r>
+          </w:p>
+        </w:tc>
+      </w:tr>
+      <w:tr>
+        <w:tc>
+          <w:tcPr>
+            <w:tcW w:type="dxa" w:w="2948"/>
+          </w:tcPr>
+          <w:p>
+            <w:pPr>
+              <w:spacing w:after="20"/>
+            </w:pPr>
+            <w:r/>
+            <w:r>
+              <w:rPr>
+                <w:b w:val="0"/>
+                <w:sz w:val="16"/>
+              </w:rPr>
+              <w:t>AI Lead (0,75)</w:t>
+            </w:r>
+          </w:p>
+        </w:tc>
+        <w:tc>
+          <w:tcPr>
+            <w:tcW w:type="dxa" w:w="1361"/>
+          </w:tcPr>
+          <w:p>
+            <w:pPr>
+              <w:spacing w:after="20"/>
+            </w:pPr>
+            <w:r/>
+            <w:r>
+              <w:rPr>
+                <w:b w:val="0"/>
+                <w:sz w:val="16"/>
+              </w:rPr>
+              <w:t>0,30 / 0,45 / 0,00</w:t>
+            </w:r>
+          </w:p>
+        </w:tc>
+        <w:tc>
+          <w:tcPr>
+            <w:tcW w:type="dxa" w:w="1361"/>
+          </w:tcPr>
+          <w:p>
+            <w:pPr>
+              <w:spacing w:after="20"/>
+            </w:pPr>
+            <w:r/>
+            <w:r>
+              <w:rPr>
+                <w:b w:val="0"/>
+                <w:sz w:val="16"/>
+              </w:rPr>
+              <w:t>0,30 / 0,30 / 0,15</w:t>
+            </w:r>
+          </w:p>
+        </w:tc>
+        <w:tc>
+          <w:tcPr>
+            <w:tcW w:type="dxa" w:w="1361"/>
+          </w:tcPr>
+          <w:p>
+            <w:pPr>
+              <w:spacing w:after="20"/>
+            </w:pPr>
+            <w:r/>
+            <w:r>
+              <w:rPr>
+                <w:b w:val="0"/>
+                <w:sz w:val="16"/>
+              </w:rPr>
+              <w:t>0,20 / 0,30 / 0,25</w:t>
+            </w:r>
+          </w:p>
+        </w:tc>
+        <w:tc>
+          <w:tcPr>
+            <w:tcW w:type="dxa" w:w="1361"/>
+          </w:tcPr>
+          <w:p>
+            <w:pPr>
+              <w:spacing w:after="20"/>
+            </w:pPr>
+            <w:r/>
+            <w:r>
+              <w:rPr>
+                <w:b w:val="0"/>
+                <w:sz w:val="16"/>
+              </w:rPr>
+              <w:t>0,15 / 0,25 / 0,35</w:t>
+            </w:r>
+          </w:p>
+        </w:tc>
+        <w:tc>
+          <w:tcPr>
+            <w:tcW w:type="dxa" w:w="1361"/>
+          </w:tcPr>
+          <w:p>
+            <w:pPr>
+              <w:spacing w:after="20"/>
+            </w:pPr>
+            <w:r/>
+            <w:r>
+              <w:rPr>
+                <w:b w:val="0"/>
+                <w:sz w:val="16"/>
+              </w:rPr>
+              <w:t>0,00 / 0,00 / 0,75</w:t>
+            </w:r>
+          </w:p>
+        </w:tc>
+      </w:tr>
+      <w:tr>
+        <w:tc>
+          <w:tcPr>
+            <w:tcW w:type="dxa" w:w="2948"/>
+          </w:tcPr>
+          <w:p>
+            <w:pPr>
+              <w:spacing w:after="20"/>
+            </w:pPr>
+            <w:r/>
+            <w:r>
+              <w:rPr>
+                <w:b w:val="0"/>
+                <w:sz w:val="16"/>
+              </w:rPr>
+              <w:t>AI Senior Engineer (0,75)</w:t>
+            </w:r>
+          </w:p>
+        </w:tc>
+        <w:tc>
+          <w:tcPr>
+            <w:tcW w:type="dxa" w:w="1361"/>
+          </w:tcPr>
+          <w:p>
+            <w:pPr>
+              <w:spacing w:after="20"/>
+            </w:pPr>
+            <w:r/>
+            <w:r>
+              <w:rPr>
+                <w:b w:val="0"/>
+                <w:sz w:val="16"/>
+              </w:rPr>
+              <w:t>0,15 / 0,60 / 0,00</w:t>
+            </w:r>
+          </w:p>
+        </w:tc>
+        <w:tc>
+          <w:tcPr>
+            <w:tcW w:type="dxa" w:w="1361"/>
+          </w:tcPr>
+          <w:p>
+            <w:pPr>
+              <w:spacing w:after="20"/>
+            </w:pPr>
+            <w:r/>
+            <w:r>
+              <w:rPr>
+                <w:b w:val="0"/>
+                <w:sz w:val="16"/>
+              </w:rPr>
+              <w:t>0,20 / 0,45 / 0,10</w:t>
+            </w:r>
+          </w:p>
+        </w:tc>
+        <w:tc>
+          <w:tcPr>
+            <w:tcW w:type="dxa" w:w="1361"/>
+          </w:tcPr>
+          <w:p>
+            <w:pPr>
+              <w:spacing w:after="20"/>
+            </w:pPr>
+            <w:r/>
+            <w:r>
+              <w:rPr>
+                <w:b w:val="0"/>
+                <w:sz w:val="16"/>
+              </w:rPr>
+              <w:t>0,30 / 0,30 / 0,15</w:t>
+            </w:r>
+          </w:p>
+        </w:tc>
+        <w:tc>
+          <w:tcPr>
+            <w:tcW w:type="dxa" w:w="1361"/>
+          </w:tcPr>
+          <w:p>
+            <w:pPr>
+              <w:spacing w:after="20"/>
+            </w:pPr>
+            <w:r/>
+            <w:r>
+              <w:rPr>
+                <w:b w:val="0"/>
+                <w:sz w:val="16"/>
+              </w:rPr>
+              <w:t>0,30 / 0,20 / 0,25</w:t>
+            </w:r>
+          </w:p>
+        </w:tc>
+        <w:tc>
+          <w:tcPr>
+            <w:tcW w:type="dxa" w:w="1361"/>
+          </w:tcPr>
+          <w:p>
+            <w:pPr>
+              <w:spacing w:after="20"/>
+            </w:pPr>
+            <w:r/>
+            <w:r>
+              <w:rPr>
+                <w:b w:val="0"/>
+                <w:sz w:val="16"/>
+              </w:rPr>
+              <w:t>0,00 / 0,00 / 0,75</w:t>
+            </w:r>
+          </w:p>
+        </w:tc>
+      </w:tr>
+      <w:tr>
+        <w:tc>
+          <w:tcPr>
+            <w:tcW w:type="dxa" w:w="2948"/>
+          </w:tcPr>
+          <w:p>
+            <w:pPr>
+              <w:spacing w:after="20"/>
+            </w:pPr>
+            <w:r/>
+            <w:r>
+              <w:rPr>
+                <w:b w:val="0"/>
+                <w:sz w:val="16"/>
+              </w:rPr>
+              <w:t>Cybersecurity / AI Act Specialist (0,25)</w:t>
+            </w:r>
+          </w:p>
+        </w:tc>
+        <w:tc>
+          <w:tcPr>
+            <w:tcW w:type="dxa" w:w="1361"/>
+          </w:tcPr>
+          <w:p>
+            <w:pPr>
+              <w:spacing w:after="20"/>
+            </w:pPr>
+            <w:r/>
+            <w:r>
+              <w:rPr>
+                <w:b w:val="0"/>
+                <w:sz w:val="16"/>
+              </w:rPr>
+              <w:t>0,15 / 0,10 / 0,00</w:t>
+            </w:r>
+          </w:p>
+        </w:tc>
+        <w:tc>
+          <w:tcPr>
+            <w:tcW w:type="dxa" w:w="1361"/>
+          </w:tcPr>
+          <w:p>
+            <w:pPr>
+              <w:spacing w:after="20"/>
+            </w:pPr>
+            <w:r/>
+            <w:r>
+              <w:rPr>
+                <w:b w:val="0"/>
+                <w:sz w:val="16"/>
+              </w:rPr>
+              <w:t>0,10 / 0,10 / 0,05</w:t>
+            </w:r>
+          </w:p>
+        </w:tc>
+        <w:tc>
+          <w:tcPr>
+            <w:tcW w:type="dxa" w:w="1361"/>
+          </w:tcPr>
+          <w:p>
+            <w:pPr>
+              <w:spacing w:after="20"/>
+            </w:pPr>
+            <w:r/>
+            <w:r>
+              <w:rPr>
+                <w:b w:val="0"/>
+                <w:sz w:val="16"/>
+              </w:rPr>
+              <w:t>0,05 / 0,10 / 0,10</w:t>
+            </w:r>
+          </w:p>
+        </w:tc>
+        <w:tc>
+          <w:tcPr>
+            <w:tcW w:type="dxa" w:w="1361"/>
+          </w:tcPr>
+          <w:p>
+            <w:pPr>
+              <w:spacing w:after="20"/>
+            </w:pPr>
+            <w:r/>
+            <w:r>
+              <w:rPr>
+                <w:b w:val="0"/>
+                <w:sz w:val="16"/>
+              </w:rPr>
+              <w:t>0,05 / 0,05 / 0,15</w:t>
+            </w:r>
+          </w:p>
+        </w:tc>
+        <w:tc>
+          <w:tcPr>
+            <w:tcW w:type="dxa" w:w="1361"/>
+          </w:tcPr>
+          <w:p>
+            <w:pPr>
+              <w:spacing w:after="20"/>
+            </w:pPr>
+            <w:r/>
+            <w:r>
+              <w:rPr>
+                <w:b w:val="0"/>
+                <w:sz w:val="16"/>
+              </w:rPr>
+              <w:t>0,00 / 0,00 / 0,25</w:t>
+            </w:r>
+          </w:p>
+        </w:tc>
+      </w:tr>
+      <w:tr>
+        <w:tc>
+          <w:tcPr>
+            <w:tcW w:type="dxa" w:w="2948"/>
+          </w:tcPr>
+          <w:p>
+            <w:pPr>
+              <w:spacing w:after="20"/>
+            </w:pPr>
+            <w:r/>
+            <w:r>
+              <w:rPr>
+                <w:b w:val="0"/>
+                <w:sz w:val="16"/>
+              </w:rPr>
+              <w:t>IT Specialist (1,00)</w:t>
+            </w:r>
+          </w:p>
+        </w:tc>
+        <w:tc>
+          <w:tcPr>
+            <w:tcW w:type="dxa" w:w="1361"/>
+          </w:tcPr>
+          <w:p>
+            <w:pPr>
+              <w:spacing w:after="20"/>
+            </w:pPr>
+            <w:r/>
+            <w:r>
+              <w:rPr>
+                <w:b w:val="0"/>
+                <w:sz w:val="16"/>
+              </w:rPr>
+              <w:t>0,45 / 0,55 / 0,00</w:t>
+            </w:r>
+          </w:p>
+        </w:tc>
+        <w:tc>
+          <w:tcPr>
+            <w:tcW w:type="dxa" w:w="1361"/>
+          </w:tcPr>
+          <w:p>
+            <w:pPr>
+              <w:spacing w:after="20"/>
+            </w:pPr>
+            <w:r/>
+            <w:r>
+              <w:rPr>
+                <w:b w:val="0"/>
+                <w:sz w:val="16"/>
+              </w:rPr>
+              <w:t>0,40 / 0,45 / 0,15</w:t>
+            </w:r>
+          </w:p>
+        </w:tc>
+        <w:tc>
+          <w:tcPr>
+            <w:tcW w:type="dxa" w:w="1361"/>
+          </w:tcPr>
+          <w:p>
+            <w:pPr>
+              <w:spacing w:after="20"/>
+            </w:pPr>
+            <w:r/>
+            <w:r>
+              <w:rPr>
+                <w:b w:val="0"/>
+                <w:sz w:val="16"/>
+              </w:rPr>
+              <w:t>0,35 / 0,35 / 0,30</w:t>
+            </w:r>
+          </w:p>
+        </w:tc>
+        <w:tc>
+          <w:tcPr>
+            <w:tcW w:type="dxa" w:w="1361"/>
+          </w:tcPr>
+          <w:p>
+            <w:pPr>
+              <w:spacing w:after="20"/>
+            </w:pPr>
+            <w:r/>
+            <w:r>
+              <w:rPr>
+                <w:b w:val="0"/>
+                <w:sz w:val="16"/>
+              </w:rPr>
+              <w:t>0,30 / 0,15 / 0,55</w:t>
+            </w:r>
+          </w:p>
+        </w:tc>
+        <w:tc>
+          <w:tcPr>
+            <w:tcW w:type="dxa" w:w="1361"/>
+          </w:tcPr>
+          <w:p>
+            <w:pPr>
+              <w:spacing w:after="20"/>
+            </w:pPr>
+            <w:r/>
+            <w:r>
+              <w:rPr>
+                <w:b w:val="0"/>
+                <w:sz w:val="16"/>
+              </w:rPr>
+              <w:t>0,00 / 0,00 / 1,00</w:t>
+            </w:r>
+          </w:p>
+        </w:tc>
+      </w:tr>
+      <w:tr>
+        <w:tc>
+          <w:tcPr>
+            <w:tcW w:type="dxa" w:w="2948"/>
+          </w:tcPr>
+          <w:p>
+            <w:pPr>
+              <w:spacing w:after="20"/>
+            </w:pPr>
+            <w:r/>
+            <w:r>
+              <w:rPr>
+                <w:b w:val="0"/>
+                <w:sz w:val="16"/>
+              </w:rPr>
+              <w:t>IoT Specialist (0,50)</w:t>
+            </w:r>
+          </w:p>
+        </w:tc>
+        <w:tc>
+          <w:tcPr>
+            <w:tcW w:type="dxa" w:w="1361"/>
+          </w:tcPr>
+          <w:p>
+            <w:pPr>
+              <w:spacing w:after="20"/>
+            </w:pPr>
+            <w:r/>
+            <w:r>
+              <w:rPr>
+                <w:b w:val="0"/>
+                <w:sz w:val="16"/>
+              </w:rPr>
+              <w:t>0,10 / 0,40 / 0,00</w:t>
+            </w:r>
+          </w:p>
+        </w:tc>
+        <w:tc>
+          <w:tcPr>
+            <w:tcW w:type="dxa" w:w="1361"/>
+          </w:tcPr>
+          <w:p>
+            <w:pPr>
+              <w:spacing w:after="20"/>
+            </w:pPr>
+            <w:r/>
+            <w:r>
+              <w:rPr>
+                <w:b w:val="0"/>
+                <w:sz w:val="16"/>
+              </w:rPr>
+              <w:t>0,10 / 0,25 / 0,15</w:t>
+            </w:r>
+          </w:p>
+        </w:tc>
+        <w:tc>
+          <w:tcPr>
+            <w:tcW w:type="dxa" w:w="1361"/>
+          </w:tcPr>
+          <w:p>
+            <w:pPr>
+              <w:spacing w:after="20"/>
+            </w:pPr>
+            <w:r/>
+            <w:r>
+              <w:rPr>
+                <w:b w:val="0"/>
+                <w:sz w:val="16"/>
+              </w:rPr>
+              <w:t>0,05 / 0,20 / 0,25</w:t>
+            </w:r>
+          </w:p>
+        </w:tc>
+        <w:tc>
+          <w:tcPr>
+            <w:tcW w:type="dxa" w:w="1361"/>
+          </w:tcPr>
+          <w:p>
+            <w:pPr>
+              <w:spacing w:after="20"/>
+            </w:pPr>
+            <w:r/>
+            <w:r>
+              <w:rPr>
+                <w:b w:val="0"/>
+                <w:sz w:val="16"/>
+              </w:rPr>
+              <w:t>0,05 / 0,10 / 0,35</w:t>
+            </w:r>
+          </w:p>
+        </w:tc>
+        <w:tc>
+          <w:tcPr>
+            <w:tcW w:type="dxa" w:w="1361"/>
+          </w:tcPr>
+          <w:p>
+            <w:pPr>
+              <w:spacing w:after="20"/>
+            </w:pPr>
+            <w:r/>
+            <w:r>
+              <w:rPr>
+                <w:b w:val="0"/>
+                <w:sz w:val="16"/>
+              </w:rPr>
+              <w:t>0,00 / 0,00 / 0,50</w:t>
+            </w:r>
+          </w:p>
+        </w:tc>
+      </w:tr>
+      <w:tr>
+        <w:tc>
+          <w:tcPr>
+            <w:tcW w:type="dxa" w:w="2948"/>
+          </w:tcPr>
+          <w:p>
+            <w:pPr>
+              <w:spacing w:after="20"/>
+            </w:pPr>
+            <w:r/>
+            <w:r>
+              <w:rPr>
+                <w:b w:val="0"/>
+                <w:sz w:val="16"/>
+              </w:rPr>
+              <w:t>Specjalista ds. logistyki TSL (0,50)</w:t>
+            </w:r>
+          </w:p>
+        </w:tc>
+        <w:tc>
+          <w:tcPr>
+            <w:tcW w:type="dxa" w:w="1361"/>
+          </w:tcPr>
+          <w:p>
+            <w:pPr>
+              <w:spacing w:after="20"/>
+            </w:pPr>
+            <w:r/>
+            <w:r>
+              <w:rPr>
+                <w:b w:val="0"/>
+                <w:sz w:val="16"/>
+              </w:rPr>
+              <w:t>0,15 / 0,35 / 0,00</w:t>
+            </w:r>
+          </w:p>
+        </w:tc>
+        <w:tc>
+          <w:tcPr>
+            <w:tcW w:type="dxa" w:w="1361"/>
+          </w:tcPr>
+          <w:p>
+            <w:pPr>
+              <w:spacing w:after="20"/>
+            </w:pPr>
+            <w:r/>
+            <w:r>
+              <w:rPr>
+                <w:b w:val="0"/>
+                <w:sz w:val="16"/>
+              </w:rPr>
+              <w:t>0,15 / 0,20 / 0,15</w:t>
+            </w:r>
+          </w:p>
+        </w:tc>
+        <w:tc>
+          <w:tcPr>
+            <w:tcW w:type="dxa" w:w="1361"/>
+          </w:tcPr>
+          <w:p>
+            <w:pPr>
+              <w:spacing w:after="20"/>
+            </w:pPr>
+            <w:r/>
+            <w:r>
+              <w:rPr>
+                <w:b w:val="0"/>
+                <w:sz w:val="16"/>
+              </w:rPr>
+              <w:t>0,15 / 0,10 / 0,25</w:t>
+            </w:r>
+          </w:p>
+        </w:tc>
+        <w:tc>
+          <w:tcPr>
+            <w:tcW w:type="dxa" w:w="1361"/>
+          </w:tcPr>
+          <w:p>
+            <w:pPr>
+              <w:spacing w:after="20"/>
+            </w:pPr>
+            <w:r/>
+            <w:r>
+              <w:rPr>
+                <w:b w:val="0"/>
+                <w:sz w:val="16"/>
+              </w:rPr>
+              <w:t>0,15 / 0,05 / 0,30</w:t>
+            </w:r>
+          </w:p>
+        </w:tc>
+        <w:tc>
+          <w:tcPr>
+            <w:tcW w:type="dxa" w:w="1361"/>
+          </w:tcPr>
+          <w:p>
+            <w:pPr>
+              <w:spacing w:after="20"/>
+            </w:pPr>
+            <w:r/>
+            <w:r>
+              <w:rPr>
+                <w:b w:val="0"/>
+                <w:sz w:val="16"/>
+              </w:rPr>
+              <w:t>0,00 / 0,00 / 0,50</w:t>
+            </w:r>
+          </w:p>
+        </w:tc>
+      </w:tr>
+    </w:tbl>
+    <w:p/>
+    <w:p>
+      <w:pPr>
+        <w:spacing w:after="60"/>
+      </w:pPr>
+      <w:r>
+        <w:rPr>
+          <w:b w:val="0"/>
+        </w:rPr>
+        <w:t>Fazy: M19-M21 (projekt architektury, kompresja i projekt sprzętu, pierwsze integracje), M22 (start Z9, Faza A), M23-M25 (integracja platformy i pipeline'u, rejestracja w Fazie A), M26-M27 (testy środowiskowe i walidacja na wersjach RC, koniec Z6 i Z7), M28-M30 (tylko Z9: Faza B i okno korekt). Backend/Full-Stack Developer (1,0 etatu): Z6 w M19-M27 (9 miesięcy), Z9 w M28-M30 (3 miesiące).</w:t>
+      </w:r>
+    </w:p>
+    <w:p>
+      <w:pPr>
+        <w:pStyle w:val="Heading2"/>
+      </w:pPr>
+      <w:r>
+        <w:t>Tabela 2. Etatomiesiące i koszt (zł) po zmianie</w:t>
+      </w:r>
+    </w:p>
+    <w:tbl>
+      <w:tblPr>
+        <w:tblStyle w:val="TableGrid"/>
+        <w:tblW w:type="auto" w:w="0"/>
+        <w:jc w:val="center"/>
+        <w:tblLook w:firstColumn="1" w:firstRow="1" w:lastColumn="0" w:lastRow="0" w:noHBand="0" w:noVBand="1" w:val="04A0"/>
+      </w:tblPr>
+      <w:tblGrid>
+        <w:gridCol w:w="1205"/>
+        <w:gridCol w:w="1205"/>
+        <w:gridCol w:w="1205"/>
+        <w:gridCol w:w="1205"/>
+        <w:gridCol w:w="1205"/>
+        <w:gridCol w:w="1205"/>
+        <w:gridCol w:w="1205"/>
+        <w:gridCol w:w="1205"/>
+      </w:tblGrid>
+      <w:tr>
+        <w:tc>
+          <w:tcPr>
+            <w:tcW w:type="dxa" w:w="2608"/>
+            <w:shd w:val="clear" w:color="auto" w:fill="D9E2F3"/>
+          </w:tcPr>
+          <w:p>
+            <w:pPr>
+              <w:spacing w:after="20"/>
+            </w:pPr>
+            <w:r/>
+            <w:r>
+              <w:rPr>
+                <w:b/>
+                <w:sz w:val="16"/>
+              </w:rPr>
+              <w:t>Stanowisko</w:t>
+            </w:r>
+          </w:p>
+        </w:tc>
+        <w:tc>
+          <w:tcPr>
+            <w:tcW w:type="dxa" w:w="680"/>
+            <w:shd w:val="clear" w:color="auto" w:fill="D9E2F3"/>
+          </w:tcPr>
+          <w:p>
+            <w:pPr>
+              <w:spacing w:after="20"/>
+            </w:pPr>
+            <w:r/>
+            <w:r>
+              <w:rPr>
+                <w:b/>
+                <w:sz w:val="16"/>
+              </w:rPr>
+              <w:t>Z6 em</w:t>
+            </w:r>
+          </w:p>
+        </w:tc>
+        <w:tc>
+          <w:tcPr>
+            <w:tcW w:type="dxa" w:w="680"/>
+            <w:shd w:val="clear" w:color="auto" w:fill="D9E2F3"/>
+          </w:tcPr>
+          <w:p>
+            <w:pPr>
+              <w:spacing w:after="20"/>
+            </w:pPr>
+            <w:r/>
+            <w:r>
+              <w:rPr>
+                <w:b/>
+                <w:sz w:val="16"/>
+              </w:rPr>
+              <w:t>Z7 em</w:t>
+            </w:r>
+          </w:p>
+        </w:tc>
+        <w:tc>
+          <w:tcPr>
+            <w:tcW w:type="dxa" w:w="680"/>
+            <w:shd w:val="clear" w:color="auto" w:fill="D9E2F3"/>
+          </w:tcPr>
+          <w:p>
+            <w:pPr>
+              <w:spacing w:after="20"/>
+            </w:pPr>
+            <w:r/>
+            <w:r>
+              <w:rPr>
+                <w:b/>
+                <w:sz w:val="16"/>
+              </w:rPr>
+              <w:t>Z9 em</w:t>
+            </w:r>
+          </w:p>
+        </w:tc>
+        <w:tc>
+          <w:tcPr>
+            <w:tcW w:type="dxa" w:w="1134"/>
+            <w:shd w:val="clear" w:color="auto" w:fill="D9E2F3"/>
+          </w:tcPr>
+          <w:p>
+            <w:pPr>
+              <w:spacing w:after="20"/>
+            </w:pPr>
+            <w:r/>
+            <w:r>
+              <w:rPr>
+                <w:b/>
+                <w:sz w:val="16"/>
+              </w:rPr>
+              <w:t>Z6 zł</w:t>
+            </w:r>
+          </w:p>
+        </w:tc>
+        <w:tc>
+          <w:tcPr>
+            <w:tcW w:type="dxa" w:w="1134"/>
+            <w:shd w:val="clear" w:color="auto" w:fill="D9E2F3"/>
+          </w:tcPr>
+          <w:p>
+            <w:pPr>
+              <w:spacing w:after="20"/>
+            </w:pPr>
+            <w:r/>
+            <w:r>
+              <w:rPr>
+                <w:b/>
+                <w:sz w:val="16"/>
+              </w:rPr>
+              <w:t>Z7 zł</w:t>
+            </w:r>
+          </w:p>
+        </w:tc>
+        <w:tc>
+          <w:tcPr>
+            <w:tcW w:type="dxa" w:w="1134"/>
+            <w:shd w:val="clear" w:color="auto" w:fill="D9E2F3"/>
+          </w:tcPr>
+          <w:p>
+            <w:pPr>
+              <w:spacing w:after="20"/>
+            </w:pPr>
+            <w:r/>
+            <w:r>
+              <w:rPr>
+                <w:b/>
+                <w:sz w:val="16"/>
+              </w:rPr>
+              <w:t>Z9 zł</w:t>
+            </w:r>
+          </w:p>
+        </w:tc>
+        <w:tc>
+          <w:tcPr>
+            <w:tcW w:type="dxa" w:w="1474"/>
+            <w:shd w:val="clear" w:color="auto" w:fill="D9E2F3"/>
+          </w:tcPr>
+          <w:p>
+            <w:pPr>
+              <w:spacing w:after="20"/>
+            </w:pPr>
+            <w:r/>
+            <w:r>
+              <w:rPr>
+                <w:b/>
+                <w:sz w:val="16"/>
+              </w:rPr>
+              <w:t>Razem zł (bez zmian)</w:t>
+            </w:r>
+          </w:p>
+        </w:tc>
+      </w:tr>
+      <w:tr>
+        <w:tc>
+          <w:tcPr>
+            <w:tcW w:type="dxa" w:w="2608"/>
+          </w:tcPr>
+          <w:p>
+            <w:pPr>
+              <w:spacing w:after="20"/>
+            </w:pPr>
+            <w:r/>
+            <w:r>
+              <w:rPr>
+                <w:b w:val="0"/>
+                <w:sz w:val="16"/>
+              </w:rPr>
+              <w:t>AI Lead</w:t>
+            </w:r>
+          </w:p>
+        </w:tc>
+        <w:tc>
+          <w:tcPr>
+            <w:tcW w:type="dxa" w:w="680"/>
+          </w:tcPr>
+          <w:p>
+            <w:pPr>
+              <w:spacing w:after="20"/>
+            </w:pPr>
+            <w:r/>
+            <w:r>
+              <w:rPr>
+                <w:b w:val="0"/>
+                <w:sz w:val="16"/>
+              </w:rPr>
+              <w:t>2,10</w:t>
+            </w:r>
+          </w:p>
+        </w:tc>
+        <w:tc>
+          <w:tcPr>
+            <w:tcW w:type="dxa" w:w="680"/>
+          </w:tcPr>
+          <w:p>
+            <w:pPr>
+              <w:spacing w:after="20"/>
+            </w:pPr>
+            <w:r/>
+            <w:r>
+              <w:rPr>
+                <w:b w:val="0"/>
+                <w:sz w:val="16"/>
+              </w:rPr>
+              <w:t>3,05</w:t>
+            </w:r>
+          </w:p>
+        </w:tc>
+        <w:tc>
+          <w:tcPr>
+            <w:tcW w:type="dxa" w:w="680"/>
+          </w:tcPr>
+          <w:p>
+            <w:pPr>
+              <w:spacing w:after="20"/>
+            </w:pPr>
+            <w:r/>
+            <w:r>
+              <w:rPr>
+                <w:b w:val="0"/>
+                <w:sz w:val="16"/>
+              </w:rPr>
+              <w:t>3,85</w:t>
+            </w:r>
+          </w:p>
+        </w:tc>
+        <w:tc>
+          <w:tcPr>
+            <w:tcW w:type="dxa" w:w="1134"/>
+          </w:tcPr>
+          <w:p>
+            <w:pPr>
+              <w:spacing w:after="20"/>
+            </w:pPr>
+            <w:r/>
+            <w:r>
+              <w:rPr>
+                <w:b w:val="0"/>
+                <w:sz w:val="16"/>
+              </w:rPr>
+              <w:t>58 201,50</w:t>
+            </w:r>
+          </w:p>
+        </w:tc>
+        <w:tc>
+          <w:tcPr>
+            <w:tcW w:type="dxa" w:w="1134"/>
+          </w:tcPr>
+          <w:p>
+            <w:pPr>
+              <w:spacing w:after="20"/>
+            </w:pPr>
+            <w:r/>
+            <w:r>
+              <w:rPr>
+                <w:b w:val="0"/>
+                <w:sz w:val="16"/>
+              </w:rPr>
+              <w:t>84 530,75</w:t>
+            </w:r>
+          </w:p>
+        </w:tc>
+        <w:tc>
+          <w:tcPr>
+            <w:tcW w:type="dxa" w:w="1134"/>
+          </w:tcPr>
+          <w:p>
+            <w:pPr>
+              <w:spacing w:after="20"/>
+            </w:pPr>
+            <w:r/>
+            <w:r>
+              <w:rPr>
+                <w:b w:val="0"/>
+                <w:sz w:val="16"/>
+              </w:rPr>
+              <w:t>106 702,75</w:t>
+            </w:r>
+          </w:p>
+        </w:tc>
+        <w:tc>
+          <w:tcPr>
+            <w:tcW w:type="dxa" w:w="1474"/>
+          </w:tcPr>
+          <w:p>
+            <w:pPr>
+              <w:spacing w:after="20"/>
+            </w:pPr>
+            <w:r/>
+            <w:r>
+              <w:rPr>
+                <w:b w:val="0"/>
+                <w:sz w:val="16"/>
+              </w:rPr>
+              <w:t>249 435,00</w:t>
+            </w:r>
+          </w:p>
+        </w:tc>
+      </w:tr>
+      <w:tr>
+        <w:tc>
+          <w:tcPr>
+            <w:tcW w:type="dxa" w:w="2608"/>
+          </w:tcPr>
+          <w:p>
+            <w:pPr>
+              <w:spacing w:after="20"/>
+            </w:pPr>
+            <w:r/>
+            <w:r>
+              <w:rPr>
+                <w:b w:val="0"/>
+                <w:sz w:val="16"/>
+              </w:rPr>
+              <w:t>AI Senior Engineer</w:t>
+            </w:r>
+          </w:p>
+        </w:tc>
+        <w:tc>
+          <w:tcPr>
+            <w:tcW w:type="dxa" w:w="680"/>
+          </w:tcPr>
+          <w:p>
+            <w:pPr>
+              <w:spacing w:after="20"/>
+            </w:pPr>
+            <w:r/>
+            <w:r>
+              <w:rPr>
+                <w:b w:val="0"/>
+                <w:sz w:val="16"/>
+              </w:rPr>
+              <w:t>2,15</w:t>
+            </w:r>
+          </w:p>
+        </w:tc>
+        <w:tc>
+          <w:tcPr>
+            <w:tcW w:type="dxa" w:w="680"/>
+          </w:tcPr>
+          <w:p>
+            <w:pPr>
+              <w:spacing w:after="20"/>
+            </w:pPr>
+            <w:r/>
+            <w:r>
+              <w:rPr>
+                <w:b w:val="0"/>
+                <w:sz w:val="16"/>
+              </w:rPr>
+              <w:t>3,55</w:t>
+            </w:r>
+          </w:p>
+        </w:tc>
+        <w:tc>
+          <w:tcPr>
+            <w:tcW w:type="dxa" w:w="680"/>
+          </w:tcPr>
+          <w:p>
+            <w:pPr>
+              <w:spacing w:after="20"/>
+            </w:pPr>
+            <w:r/>
+            <w:r>
+              <w:rPr>
+                <w:b w:val="0"/>
+                <w:sz w:val="16"/>
+              </w:rPr>
+              <w:t>3,30</w:t>
+            </w:r>
+          </w:p>
+        </w:tc>
+        <w:tc>
+          <w:tcPr>
+            <w:tcW w:type="dxa" w:w="1134"/>
+          </w:tcPr>
+          <w:p>
+            <w:pPr>
+              <w:spacing w:after="20"/>
+            </w:pPr>
+            <w:r/>
+            <w:r>
+              <w:rPr>
+                <w:b w:val="0"/>
+                <w:sz w:val="16"/>
+              </w:rPr>
+              <w:t>42 747,38</w:t>
+            </w:r>
+          </w:p>
+        </w:tc>
+        <w:tc>
+          <w:tcPr>
+            <w:tcW w:type="dxa" w:w="1134"/>
+          </w:tcPr>
+          <w:p>
+            <w:pPr>
+              <w:spacing w:after="20"/>
+            </w:pPr>
+            <w:r/>
+            <w:r>
+              <w:rPr>
+                <w:b w:val="0"/>
+                <w:sz w:val="16"/>
+              </w:rPr>
+              <w:t>70 582,88</w:t>
+            </w:r>
+          </w:p>
+        </w:tc>
+        <w:tc>
+          <w:tcPr>
+            <w:tcW w:type="dxa" w:w="1134"/>
+          </w:tcPr>
+          <w:p>
+            <w:pPr>
+              <w:spacing w:after="20"/>
+            </w:pPr>
+            <w:r/>
+            <w:r>
+              <w:rPr>
+                <w:b w:val="0"/>
+                <w:sz w:val="16"/>
+              </w:rPr>
+              <w:t>65 612,24</w:t>
+            </w:r>
+          </w:p>
+        </w:tc>
+        <w:tc>
+          <w:tcPr>
+            <w:tcW w:type="dxa" w:w="1474"/>
+          </w:tcPr>
+          <w:p>
+            <w:pPr>
+              <w:spacing w:after="20"/>
+            </w:pPr>
+            <w:r/>
+            <w:r>
+              <w:rPr>
+                <w:b w:val="0"/>
+                <w:sz w:val="16"/>
+              </w:rPr>
+              <w:t>178 942,50</w:t>
+            </w:r>
+          </w:p>
+        </w:tc>
+      </w:tr>
+      <w:tr>
+        <w:tc>
+          <w:tcPr>
+            <w:tcW w:type="dxa" w:w="2608"/>
+          </w:tcPr>
+          <w:p>
+            <w:pPr>
+              <w:spacing w:after="20"/>
+            </w:pPr>
+            <w:r/>
+            <w:r>
+              <w:rPr>
+                <w:b w:val="0"/>
+                <w:sz w:val="16"/>
+              </w:rPr>
+              <w:t>Cybersecurity / AI Act Specialist</w:t>
+            </w:r>
+          </w:p>
+        </w:tc>
+        <w:tc>
+          <w:tcPr>
+            <w:tcW w:type="dxa" w:w="680"/>
+          </w:tcPr>
+          <w:p>
+            <w:pPr>
+              <w:spacing w:after="20"/>
+            </w:pPr>
+            <w:r/>
+            <w:r>
+              <w:rPr>
+                <w:b w:val="0"/>
+                <w:sz w:val="16"/>
+              </w:rPr>
+              <w:t>0,80</w:t>
+            </w:r>
+          </w:p>
+        </w:tc>
+        <w:tc>
+          <w:tcPr>
+            <w:tcW w:type="dxa" w:w="680"/>
+          </w:tcPr>
+          <w:p>
+            <w:pPr>
+              <w:spacing w:after="20"/>
+            </w:pPr>
+            <w:r/>
+            <w:r>
+              <w:rPr>
+                <w:b w:val="0"/>
+                <w:sz w:val="16"/>
+              </w:rPr>
+              <w:t>0,80</w:t>
+            </w:r>
+          </w:p>
+        </w:tc>
+        <w:tc>
+          <w:tcPr>
+            <w:tcW w:type="dxa" w:w="680"/>
+          </w:tcPr>
+          <w:p>
+            <w:pPr>
+              <w:spacing w:after="20"/>
+            </w:pPr>
+            <w:r/>
+            <w:r>
+              <w:rPr>
+                <w:b w:val="0"/>
+                <w:sz w:val="16"/>
+              </w:rPr>
+              <w:t>1,40</w:t>
+            </w:r>
+          </w:p>
+        </w:tc>
+        <w:tc>
+          <w:tcPr>
+            <w:tcW w:type="dxa" w:w="1134"/>
+          </w:tcPr>
+          <w:p>
+            <w:pPr>
+              <w:spacing w:after="20"/>
+            </w:pPr>
+            <w:r/>
+            <w:r>
+              <w:rPr>
+                <w:b w:val="0"/>
+                <w:sz w:val="16"/>
+              </w:rPr>
+              <w:t>20 244,00</w:t>
+            </w:r>
+          </w:p>
+        </w:tc>
+        <w:tc>
+          <w:tcPr>
+            <w:tcW w:type="dxa" w:w="1134"/>
+          </w:tcPr>
+          <w:p>
+            <w:pPr>
+              <w:spacing w:after="20"/>
+            </w:pPr>
+            <w:r/>
+            <w:r>
+              <w:rPr>
+                <w:b w:val="0"/>
+                <w:sz w:val="16"/>
+              </w:rPr>
+              <w:t>20 244,00</w:t>
+            </w:r>
+          </w:p>
+        </w:tc>
+        <w:tc>
+          <w:tcPr>
+            <w:tcW w:type="dxa" w:w="1134"/>
+          </w:tcPr>
+          <w:p>
+            <w:pPr>
+              <w:spacing w:after="20"/>
+            </w:pPr>
+            <w:r/>
+            <w:r>
+              <w:rPr>
+                <w:b w:val="0"/>
+                <w:sz w:val="16"/>
+              </w:rPr>
+              <w:t>35 427,00</w:t>
+            </w:r>
+          </w:p>
+        </w:tc>
+        <w:tc>
+          <w:tcPr>
+            <w:tcW w:type="dxa" w:w="1474"/>
+          </w:tcPr>
+          <w:p>
+            <w:pPr>
+              <w:spacing w:after="20"/>
+            </w:pPr>
+            <w:r/>
+            <w:r>
+              <w:rPr>
+                <w:b w:val="0"/>
+                <w:sz w:val="16"/>
+              </w:rPr>
+              <w:t>75 915,00</w:t>
+            </w:r>
+          </w:p>
+        </w:tc>
+      </w:tr>
+      <w:tr>
+        <w:tc>
+          <w:tcPr>
+            <w:tcW w:type="dxa" w:w="2608"/>
+          </w:tcPr>
+          <w:p>
+            <w:pPr>
+              <w:spacing w:after="20"/>
+            </w:pPr>
+            <w:r/>
+            <w:r>
+              <w:rPr>
+                <w:b w:val="0"/>
+                <w:sz w:val="16"/>
+              </w:rPr>
+              <w:t>IT Specialist</w:t>
+            </w:r>
+          </w:p>
+        </w:tc>
+        <w:tc>
+          <w:tcPr>
+            <w:tcW w:type="dxa" w:w="680"/>
+          </w:tcPr>
+          <w:p>
+            <w:pPr>
+              <w:spacing w:after="20"/>
+            </w:pPr>
+            <w:r/>
+            <w:r>
+              <w:rPr>
+                <w:b w:val="0"/>
+                <w:sz w:val="16"/>
+              </w:rPr>
+              <w:t>3,40</w:t>
+            </w:r>
+          </w:p>
+        </w:tc>
+        <w:tc>
+          <w:tcPr>
+            <w:tcW w:type="dxa" w:w="680"/>
+          </w:tcPr>
+          <w:p>
+            <w:pPr>
+              <w:spacing w:after="20"/>
+            </w:pPr>
+            <w:r/>
+            <w:r>
+              <w:rPr>
+                <w:b w:val="0"/>
+                <w:sz w:val="16"/>
+              </w:rPr>
+              <w:t>3,45</w:t>
+            </w:r>
+          </w:p>
+        </w:tc>
+        <w:tc>
+          <w:tcPr>
+            <w:tcW w:type="dxa" w:w="680"/>
+          </w:tcPr>
+          <w:p>
+            <w:pPr>
+              <w:spacing w:after="20"/>
+            </w:pPr>
+            <w:r/>
+            <w:r>
+              <w:rPr>
+                <w:b w:val="0"/>
+                <w:sz w:val="16"/>
+              </w:rPr>
+              <w:t>5,15</w:t>
+            </w:r>
+          </w:p>
+        </w:tc>
+        <w:tc>
+          <w:tcPr>
+            <w:tcW w:type="dxa" w:w="1134"/>
+          </w:tcPr>
+          <w:p>
+            <w:pPr>
+              <w:spacing w:after="20"/>
+            </w:pPr>
+            <w:r/>
+            <w:r>
+              <w:rPr>
+                <w:b w:val="0"/>
+                <w:sz w:val="16"/>
+              </w:rPr>
+              <w:t>77 843,00</w:t>
+            </w:r>
+          </w:p>
+        </w:tc>
+        <w:tc>
+          <w:tcPr>
+            <w:tcW w:type="dxa" w:w="1134"/>
+          </w:tcPr>
+          <w:p>
+            <w:pPr>
+              <w:spacing w:after="20"/>
+            </w:pPr>
+            <w:r/>
+            <w:r>
+              <w:rPr>
+                <w:b w:val="0"/>
+                <w:sz w:val="16"/>
+              </w:rPr>
+              <w:t>78 987,75</w:t>
+            </w:r>
+          </w:p>
+        </w:tc>
+        <w:tc>
+          <w:tcPr>
+            <w:tcW w:type="dxa" w:w="1134"/>
+          </w:tcPr>
+          <w:p>
+            <w:pPr>
+              <w:spacing w:after="20"/>
+            </w:pPr>
+            <w:r/>
+            <w:r>
+              <w:rPr>
+                <w:b w:val="0"/>
+                <w:sz w:val="16"/>
+              </w:rPr>
+              <w:t>117 909,25</w:t>
+            </w:r>
+          </w:p>
+        </w:tc>
+        <w:tc>
+          <w:tcPr>
+            <w:tcW w:type="dxa" w:w="1474"/>
+          </w:tcPr>
+          <w:p>
+            <w:pPr>
+              <w:spacing w:after="20"/>
+            </w:pPr>
+            <w:r/>
+            <w:r>
+              <w:rPr>
+                <w:b w:val="0"/>
+                <w:sz w:val="16"/>
+              </w:rPr>
+              <w:t>274 740,00</w:t>
+            </w:r>
+          </w:p>
+        </w:tc>
+      </w:tr>
+      <w:tr>
+        <w:tc>
+          <w:tcPr>
+            <w:tcW w:type="dxa" w:w="2608"/>
+          </w:tcPr>
+          <w:p>
+            <w:pPr>
+              <w:spacing w:after="20"/>
+            </w:pPr>
+            <w:r/>
+            <w:r>
+              <w:rPr>
+                <w:b w:val="0"/>
+                <w:sz w:val="16"/>
+              </w:rPr>
+              <w:t>IoT Specialist</w:t>
+            </w:r>
+          </w:p>
+        </w:tc>
+        <w:tc>
+          <w:tcPr>
+            <w:tcW w:type="dxa" w:w="680"/>
+          </w:tcPr>
+          <w:p>
+            <w:pPr>
+              <w:spacing w:after="20"/>
+            </w:pPr>
+            <w:r/>
+            <w:r>
+              <w:rPr>
+                <w:b w:val="0"/>
+                <w:sz w:val="16"/>
+              </w:rPr>
+              <w:t>0,65</w:t>
+            </w:r>
+          </w:p>
+        </w:tc>
+        <w:tc>
+          <w:tcPr>
+            <w:tcW w:type="dxa" w:w="680"/>
+          </w:tcPr>
+          <w:p>
+            <w:pPr>
+              <w:spacing w:after="20"/>
+            </w:pPr>
+            <w:r/>
+            <w:r>
+              <w:rPr>
+                <w:b w:val="0"/>
+                <w:sz w:val="16"/>
+              </w:rPr>
+              <w:t>2,25</w:t>
+            </w:r>
+          </w:p>
+        </w:tc>
+        <w:tc>
+          <w:tcPr>
+            <w:tcW w:type="dxa" w:w="680"/>
+          </w:tcPr>
+          <w:p>
+            <w:pPr>
+              <w:spacing w:after="20"/>
+            </w:pPr>
+            <w:r/>
+            <w:r>
+              <w:rPr>
+                <w:b w:val="0"/>
+                <w:sz w:val="16"/>
+              </w:rPr>
+              <w:t>3,10</w:t>
+            </w:r>
+          </w:p>
+        </w:tc>
+        <w:tc>
+          <w:tcPr>
+            <w:tcW w:type="dxa" w:w="1134"/>
+          </w:tcPr>
+          <w:p>
+            <w:pPr>
+              <w:spacing w:after="20"/>
+            </w:pPr>
+            <w:r/>
+            <w:r>
+              <w:rPr>
+                <w:b w:val="0"/>
+                <w:sz w:val="16"/>
+              </w:rPr>
+              <w:t>11 748,75</w:t>
+            </w:r>
+          </w:p>
+        </w:tc>
+        <w:tc>
+          <w:tcPr>
+            <w:tcW w:type="dxa" w:w="1134"/>
+          </w:tcPr>
+          <w:p>
+            <w:pPr>
+              <w:spacing w:after="20"/>
+            </w:pPr>
+            <w:r/>
+            <w:r>
+              <w:rPr>
+                <w:b w:val="0"/>
+                <w:sz w:val="16"/>
+              </w:rPr>
+              <w:t>40 668,75</w:t>
+            </w:r>
+          </w:p>
+        </w:tc>
+        <w:tc>
+          <w:tcPr>
+            <w:tcW w:type="dxa" w:w="1134"/>
+          </w:tcPr>
+          <w:p>
+            <w:pPr>
+              <w:spacing w:after="20"/>
+            </w:pPr>
+            <w:r/>
+            <w:r>
+              <w:rPr>
+                <w:b w:val="0"/>
+                <w:sz w:val="16"/>
+              </w:rPr>
+              <w:t>56 032,50</w:t>
+            </w:r>
+          </w:p>
+        </w:tc>
+        <w:tc>
+          <w:tcPr>
+            <w:tcW w:type="dxa" w:w="1474"/>
+          </w:tcPr>
+          <w:p>
+            <w:pPr>
+              <w:spacing w:after="20"/>
+            </w:pPr>
+            <w:r/>
+            <w:r>
+              <w:rPr>
+                <w:b w:val="0"/>
+                <w:sz w:val="16"/>
+              </w:rPr>
+              <w:t>108 450,00</w:t>
+            </w:r>
+          </w:p>
+        </w:tc>
+      </w:tr>
+      <w:tr>
+        <w:tc>
+          <w:tcPr>
+            <w:tcW w:type="dxa" w:w="2608"/>
+          </w:tcPr>
+          <w:p>
+            <w:pPr>
+              <w:spacing w:after="20"/>
+            </w:pPr>
+            <w:r/>
+            <w:r>
+              <w:rPr>
+                <w:b w:val="0"/>
+                <w:sz w:val="16"/>
+              </w:rPr>
+              <w:t>Specjalista ds. logistyki TSL</w:t>
+            </w:r>
+          </w:p>
+        </w:tc>
+        <w:tc>
+          <w:tcPr>
+            <w:tcW w:type="dxa" w:w="680"/>
+          </w:tcPr>
+          <w:p>
+            <w:pPr>
+              <w:spacing w:after="20"/>
+            </w:pPr>
+            <w:r/>
+            <w:r>
+              <w:rPr>
+                <w:b w:val="0"/>
+                <w:sz w:val="16"/>
+              </w:rPr>
+              <w:t>1,35</w:t>
+            </w:r>
+          </w:p>
+        </w:tc>
+        <w:tc>
+          <w:tcPr>
+            <w:tcW w:type="dxa" w:w="680"/>
+          </w:tcPr>
+          <w:p>
+            <w:pPr>
+              <w:spacing w:after="20"/>
+            </w:pPr>
+            <w:r/>
+            <w:r>
+              <w:rPr>
+                <w:b w:val="0"/>
+                <w:sz w:val="16"/>
+              </w:rPr>
+              <w:t>1,65</w:t>
+            </w:r>
+          </w:p>
+        </w:tc>
+        <w:tc>
+          <w:tcPr>
+            <w:tcW w:type="dxa" w:w="680"/>
+          </w:tcPr>
+          <w:p>
+            <w:pPr>
+              <w:spacing w:after="20"/>
+            </w:pPr>
+            <w:r/>
+            <w:r>
+              <w:rPr>
+                <w:b w:val="0"/>
+                <w:sz w:val="16"/>
+              </w:rPr>
+              <w:t>3,00</w:t>
+            </w:r>
+          </w:p>
+        </w:tc>
+        <w:tc>
+          <w:tcPr>
+            <w:tcW w:type="dxa" w:w="1134"/>
+          </w:tcPr>
+          <w:p>
+            <w:pPr>
+              <w:spacing w:after="20"/>
+            </w:pPr>
+            <w:r/>
+            <w:r>
+              <w:rPr>
+                <w:b w:val="0"/>
+                <w:sz w:val="16"/>
+              </w:rPr>
+              <w:t>16 267,50</w:t>
+            </w:r>
+          </w:p>
+        </w:tc>
+        <w:tc>
+          <w:tcPr>
+            <w:tcW w:type="dxa" w:w="1134"/>
+          </w:tcPr>
+          <w:p>
+            <w:pPr>
+              <w:spacing w:after="20"/>
+            </w:pPr>
+            <w:r/>
+            <w:r>
+              <w:rPr>
+                <w:b w:val="0"/>
+                <w:sz w:val="16"/>
+              </w:rPr>
+              <w:t>19 882,50</w:t>
+            </w:r>
+          </w:p>
+        </w:tc>
+        <w:tc>
+          <w:tcPr>
+            <w:tcW w:type="dxa" w:w="1134"/>
+          </w:tcPr>
+          <w:p>
+            <w:pPr>
+              <w:spacing w:after="20"/>
+            </w:pPr>
+            <w:r/>
+            <w:r>
+              <w:rPr>
+                <w:b w:val="0"/>
+                <w:sz w:val="16"/>
+              </w:rPr>
+              <w:t>36 150,00</w:t>
+            </w:r>
+          </w:p>
+        </w:tc>
+        <w:tc>
+          <w:tcPr>
+            <w:tcW w:type="dxa" w:w="1474"/>
+          </w:tcPr>
+          <w:p>
+            <w:pPr>
+              <w:spacing w:after="20"/>
+            </w:pPr>
+            <w:r/>
+            <w:r>
+              <w:rPr>
+                <w:b w:val="0"/>
+                <w:sz w:val="16"/>
+              </w:rPr>
+              <w:t>72 300,00</w:t>
+            </w:r>
+          </w:p>
+        </w:tc>
+      </w:tr>
+      <w:tr>
+        <w:tc>
+          <w:tcPr>
+            <w:tcW w:type="dxa" w:w="2608"/>
+          </w:tcPr>
+          <w:p>
+            <w:pPr>
+              <w:spacing w:after="20"/>
+            </w:pPr>
+            <w:r/>
+            <w:r>
+              <w:rPr>
+                <w:b w:val="0"/>
+                <w:sz w:val="16"/>
+              </w:rPr>
+              <w:t>Backend/Full-Stack Developer</w:t>
+            </w:r>
+          </w:p>
+        </w:tc>
+        <w:tc>
+          <w:tcPr>
+            <w:tcW w:type="dxa" w:w="680"/>
+          </w:tcPr>
+          <w:p>
+            <w:pPr>
+              <w:spacing w:after="20"/>
+            </w:pPr>
+            <w:r/>
+            <w:r>
+              <w:rPr>
+                <w:b w:val="0"/>
+                <w:sz w:val="16"/>
+              </w:rPr>
+              <w:t>9,00</w:t>
+            </w:r>
+          </w:p>
+        </w:tc>
+        <w:tc>
+          <w:tcPr>
+            <w:tcW w:type="dxa" w:w="680"/>
+          </w:tcPr>
+          <w:p>
+            <w:pPr>
+              <w:spacing w:after="20"/>
+            </w:pPr>
+            <w:r/>
+          </w:p>
+        </w:tc>
+        <w:tc>
+          <w:tcPr>
+            <w:tcW w:type="dxa" w:w="680"/>
+          </w:tcPr>
+          <w:p>
+            <w:pPr>
+              <w:spacing w:after="20"/>
+            </w:pPr>
+            <w:r/>
+            <w:r>
+              <w:rPr>
+                <w:b w:val="0"/>
+                <w:sz w:val="16"/>
+              </w:rPr>
+              <w:t>3,00</w:t>
+            </w:r>
+          </w:p>
+        </w:tc>
+        <w:tc>
+          <w:tcPr>
+            <w:tcW w:type="dxa" w:w="1134"/>
+          </w:tcPr>
+          <w:p>
+            <w:pPr>
+              <w:spacing w:after="20"/>
+            </w:pPr>
+            <w:r/>
+            <w:r>
+              <w:rPr>
+                <w:b w:val="0"/>
+                <w:sz w:val="16"/>
+              </w:rPr>
+              <w:t>195 210,00</w:t>
+            </w:r>
+          </w:p>
+        </w:tc>
+        <w:tc>
+          <w:tcPr>
+            <w:tcW w:type="dxa" w:w="1134"/>
+          </w:tcPr>
+          <w:p>
+            <w:pPr>
+              <w:spacing w:after="20"/>
+            </w:pPr>
+            <w:r/>
+          </w:p>
+        </w:tc>
+        <w:tc>
+          <w:tcPr>
+            <w:tcW w:type="dxa" w:w="1134"/>
+          </w:tcPr>
+          <w:p>
+            <w:pPr>
+              <w:spacing w:after="20"/>
+            </w:pPr>
+            <w:r/>
+            <w:r>
+              <w:rPr>
+                <w:b w:val="0"/>
+                <w:sz w:val="16"/>
+              </w:rPr>
+              <w:t>65 070,00</w:t>
+            </w:r>
+          </w:p>
+        </w:tc>
+        <w:tc>
+          <w:tcPr>
+            <w:tcW w:type="dxa" w:w="1474"/>
+          </w:tcPr>
+          <w:p>
+            <w:pPr>
+              <w:spacing w:after="20"/>
+            </w:pPr>
+            <w:r/>
+            <w:r>
+              <w:rPr>
+                <w:b w:val="0"/>
+                <w:sz w:val="16"/>
+              </w:rPr>
+              <w:t>260 280,00</w:t>
+            </w:r>
+          </w:p>
+        </w:tc>
+      </w:tr>
+      <w:tr>
+        <w:tc>
+          <w:tcPr>
+            <w:tcW w:type="dxa" w:w="2608"/>
+          </w:tcPr>
+          <w:p>
+            <w:pPr>
+              <w:spacing w:after="20"/>
+            </w:pPr>
+            <w:r/>
+            <w:r>
+              <w:rPr>
+                <w:b w:val="0"/>
+                <w:sz w:val="16"/>
+              </w:rPr>
+              <w:t>Razem Everest11, personel Z6/Z7/Z9</w:t>
+            </w:r>
+          </w:p>
+        </w:tc>
+        <w:tc>
+          <w:tcPr>
+            <w:tcW w:type="dxa" w:w="680"/>
+          </w:tcPr>
+          <w:p>
+            <w:pPr>
+              <w:spacing w:after="20"/>
+            </w:pPr>
+            <w:r/>
+          </w:p>
+        </w:tc>
+        <w:tc>
+          <w:tcPr>
+            <w:tcW w:type="dxa" w:w="680"/>
+          </w:tcPr>
+          <w:p>
+            <w:pPr>
+              <w:spacing w:after="20"/>
+            </w:pPr>
+            <w:r/>
+          </w:p>
+        </w:tc>
+        <w:tc>
+          <w:tcPr>
+            <w:tcW w:type="dxa" w:w="680"/>
+          </w:tcPr>
+          <w:p>
+            <w:pPr>
+              <w:spacing w:after="20"/>
+            </w:pPr>
+            <w:r/>
+          </w:p>
+        </w:tc>
+        <w:tc>
+          <w:tcPr>
+            <w:tcW w:type="dxa" w:w="1134"/>
+          </w:tcPr>
+          <w:p>
+            <w:pPr>
+              <w:spacing w:after="20"/>
+            </w:pPr>
+            <w:r/>
+            <w:r>
+              <w:rPr>
+                <w:b w:val="0"/>
+                <w:sz w:val="16"/>
+              </w:rPr>
+              <w:t>422 262,13</w:t>
+            </w:r>
+          </w:p>
+        </w:tc>
+        <w:tc>
+          <w:tcPr>
+            <w:tcW w:type="dxa" w:w="1134"/>
+          </w:tcPr>
+          <w:p>
+            <w:pPr>
+              <w:spacing w:after="20"/>
+            </w:pPr>
+            <w:r/>
+            <w:r>
+              <w:rPr>
+                <w:b w:val="0"/>
+                <w:sz w:val="16"/>
+              </w:rPr>
+              <w:t>314 896,63</w:t>
+            </w:r>
+          </w:p>
+        </w:tc>
+        <w:tc>
+          <w:tcPr>
+            <w:tcW w:type="dxa" w:w="1134"/>
+          </w:tcPr>
+          <w:p>
+            <w:pPr>
+              <w:spacing w:after="20"/>
+            </w:pPr>
+            <w:r/>
+            <w:r>
+              <w:rPr>
+                <w:b w:val="0"/>
+                <w:sz w:val="16"/>
+              </w:rPr>
+              <w:t>482 903,74</w:t>
+            </w:r>
+          </w:p>
+        </w:tc>
+        <w:tc>
+          <w:tcPr>
+            <w:tcW w:type="dxa" w:w="1474"/>
+          </w:tcPr>
+          <w:p>
+            <w:pPr>
+              <w:spacing w:after="20"/>
+            </w:pPr>
+            <w:r/>
+            <w:r>
+              <w:rPr>
+                <w:b w:val="0"/>
+                <w:sz w:val="16"/>
+              </w:rPr>
+              <w:t>1 220 062,50</w:t>
+            </w:r>
+          </w:p>
+        </w:tc>
+      </w:tr>
+      <w:tr>
+        <w:tc>
+          <w:tcPr>
+            <w:tcW w:type="dxa" w:w="2608"/>
+          </w:tcPr>
+          <w:p>
+            <w:pPr>
+              <w:spacing w:after="20"/>
+            </w:pPr>
+            <w:r/>
+            <w:r>
+              <w:rPr>
+                <w:b w:val="0"/>
+                <w:sz w:val="16"/>
+              </w:rPr>
+              <w:t>Stan dotychczasowy</w:t>
+            </w:r>
+          </w:p>
+        </w:tc>
+        <w:tc>
+          <w:tcPr>
+            <w:tcW w:type="dxa" w:w="680"/>
+          </w:tcPr>
+          <w:p>
+            <w:pPr>
+              <w:spacing w:after="20"/>
+            </w:pPr>
+            <w:r/>
+          </w:p>
+        </w:tc>
+        <w:tc>
+          <w:tcPr>
+            <w:tcW w:type="dxa" w:w="680"/>
+          </w:tcPr>
+          <w:p>
+            <w:pPr>
+              <w:spacing w:after="20"/>
+            </w:pPr>
+            <w:r/>
+          </w:p>
+        </w:tc>
+        <w:tc>
+          <w:tcPr>
+            <w:tcW w:type="dxa" w:w="680"/>
+          </w:tcPr>
+          <w:p>
+            <w:pPr>
+              <w:spacing w:after="20"/>
+            </w:pPr>
+            <w:r/>
+          </w:p>
+        </w:tc>
+        <w:tc>
+          <w:tcPr>
+            <w:tcW w:type="dxa" w:w="1134"/>
+          </w:tcPr>
+          <w:p>
+            <w:pPr>
+              <w:spacing w:after="20"/>
+            </w:pPr>
+            <w:r/>
+            <w:r>
+              <w:rPr>
+                <w:b w:val="0"/>
+                <w:sz w:val="16"/>
+              </w:rPr>
+              <w:t>580 207,50</w:t>
+            </w:r>
+          </w:p>
+        </w:tc>
+        <w:tc>
+          <w:tcPr>
+            <w:tcW w:type="dxa" w:w="1134"/>
+          </w:tcPr>
+          <w:p>
+            <w:pPr>
+              <w:spacing w:after="20"/>
+            </w:pPr>
+            <w:r/>
+            <w:r>
+              <w:rPr>
+                <w:b w:val="0"/>
+                <w:sz w:val="16"/>
+              </w:rPr>
+              <w:t>319 927,50</w:t>
+            </w:r>
+          </w:p>
+        </w:tc>
+        <w:tc>
+          <w:tcPr>
+            <w:tcW w:type="dxa" w:w="1134"/>
+          </w:tcPr>
+          <w:p>
+            <w:pPr>
+              <w:spacing w:after="20"/>
+            </w:pPr>
+            <w:r/>
+            <w:r>
+              <w:rPr>
+                <w:b w:val="0"/>
+                <w:sz w:val="16"/>
+              </w:rPr>
+              <w:t>319 927,50</w:t>
+            </w:r>
+          </w:p>
+        </w:tc>
+        <w:tc>
+          <w:tcPr>
+            <w:tcW w:type="dxa" w:w="1474"/>
+          </w:tcPr>
+          <w:p>
+            <w:pPr>
+              <w:spacing w:after="20"/>
+            </w:pPr>
+            <w:r/>
+            <w:r>
+              <w:rPr>
+                <w:b w:val="0"/>
+                <w:sz w:val="16"/>
+              </w:rPr>
+              <w:t>1 220 062,50</w:t>
+            </w:r>
+          </w:p>
+        </w:tc>
+      </w:tr>
+    </w:tbl>
+    <w:p/>
+    <w:p>
+      <w:pPr>
+        <w:pStyle w:val="Heading2"/>
+      </w:pPr>
+      <w:r>
+        <w:t>Pole „Metoda szacowania” (limit 1500 znaków)</w:t>
+      </w:r>
+    </w:p>
+    <w:p>
+      <w:pPr>
+        <w:pStyle w:val="Heading3"/>
+      </w:pPr>
+      <w:r>
+        <w:t>Zadanie 6</w:t>
+      </w:r>
+    </w:p>
+    <w:p>
+      <w:pPr>
+        <w:keepNext/>
+        <w:spacing w:before="160" w:after="40"/>
+      </w:pPr>
+      <w:r>
+        <w:rPr>
+          <w:b/>
+          <w:sz w:val="20"/>
+        </w:rPr>
+        <w:t>AI Lead - wynagrodzenie (Z6)</w:t>
+      </w:r>
+      <w:r>
+        <w:rPr>
+          <w:color w:val="666666"/>
+          <w:sz w:val="17"/>
+        </w:rPr>
+        <w:t xml:space="preserve"> [763 z 1500 znaków]</w:t>
+      </w:r>
+    </w:p>
+    <w:p>
+      <w:pPr>
+        <w:spacing w:after="60"/>
+        <w:shd w:val="clear" w:color="auto" w:fill="F3F3F3"/>
+      </w:pPr>
+      <w:r>
+        <w:rPr>
+          <w:b w:val="0"/>
+        </w:rPr>
+        <w:t>Koszt = 23 000,00 zł brutto/mc x narzut pracodawcy 1,205 = 27 715,00 zł/mc x 2,10 etatomiesiąca (miesięcy pracy w przeliczeniu na pełny etat) = 58 201,50 zł. Nakład w zadaniu Z6 wynika z podziału etatu 0,75 stanowiska między zadania Z6, Z7 i Z9 w kolejnych fazach prac (etat w zadaniu Z6): M19-M21: 0,30; M22: 0,30; M23-M25: 0,20; M26-M27: 0,15; M28-M30: 0,00. W każdym miesiącu suma nakładów w trzech zadaniach równa się 0,75 etatu, a w całym okresie M19-M30 9,00 etatomiesiąca. Stawkę brutto zweryfikowano na podstawie No Fluff Jobs „Rynek pracy IT 2025/2026”, kat. AI poziom Senior, UoP 20000-29000 (s. 33; tabela zbiorcza 19000-24000, s. 27), 23000 w środku pasma senior/lead. Wynagrodzenie niezbędne do realizacji prac B+R. Forma zatrudnienia: umowa o pracę.</w:t>
+      </w:r>
+    </w:p>
+    <w:p>
+      <w:pPr>
+        <w:keepNext/>
+        <w:spacing w:before="160" w:after="40"/>
+      </w:pPr>
+      <w:r>
+        <w:rPr>
+          <w:b/>
+          <w:sz w:val="20"/>
+        </w:rPr>
+        <w:t>AI Senior Engineer - wynagrodzenie (Z6)</w:t>
+      </w:r>
+      <w:r>
+        <w:rPr>
+          <w:color w:val="666666"/>
+          <w:sz w:val="17"/>
+        </w:rPr>
+        <w:t xml:space="preserve"> [776 z 1500 znaków]</w:t>
+      </w:r>
+    </w:p>
+    <w:p>
+      <w:pPr>
+        <w:spacing w:after="60"/>
+        <w:shd w:val="clear" w:color="auto" w:fill="F3F3F3"/>
+      </w:pPr>
+      <w:r>
+        <w:rPr>
+          <w:b w:val="0"/>
+        </w:rPr>
+        <w:t>Koszt = 16 500,00 zł brutto/mc x narzut pracodawcy 1,205 = 19 882,50 zł/mc x 2,15 etatomiesiąca (miesięcy pracy w przeliczeniu na pełny etat) = 42 747,38 zł. Nakład w zadaniu Z6 wynika z podziału etatu 0,75 stanowiska między zadania Z6, Z7 i Z9 w kolejnych fazach prac (etat w zadaniu Z6): M19-M21: 0,15; M22: 0,20; M23-M25: 0,30; M26-M27: 0,30; M28-M30: 0,00. W każdym miesiącu suma nakładów w trzech zadaniach równa się 0,75 etatu, a w całym okresie M19-M30 9,00 etatomiesiąca. Stawkę brutto zweryfikowano na podstawie No Fluff Jobs „Rynek pracy IT 2025/2026”, kat. AI (s. 33): Senior 20000-29000, Mid 14000-21000, 16500 w paśmie Mid, poniżej dolnej mediany Senior (założenie konserwatywne). Wynagrodzenie niezbędne do realizacji prac B+R. Forma zatrudnienia: umowa o pracę.</w:t>
+      </w:r>
+    </w:p>
+    <w:p>
+      <w:pPr>
+        <w:keepNext/>
+        <w:spacing w:before="160" w:after="40"/>
+      </w:pPr>
+      <w:r>
+        <w:rPr>
+          <w:b/>
+          <w:sz w:val="20"/>
+        </w:rPr>
+        <w:t>Cybersecurity / AI Act Specialist - wynagrodzenie (Z6)</w:t>
+      </w:r>
+      <w:r>
+        <w:rPr>
+          <w:color w:val="666666"/>
+          <w:sz w:val="17"/>
+        </w:rPr>
+        <w:t xml:space="preserve"> [761 z 1500 znaków]</w:t>
+      </w:r>
+    </w:p>
+    <w:p>
+      <w:pPr>
+        <w:spacing w:after="60"/>
+        <w:shd w:val="clear" w:color="auto" w:fill="F3F3F3"/>
+      </w:pPr>
+      <w:r>
+        <w:rPr>
+          <w:b w:val="0"/>
+        </w:rPr>
+        <w:t>Koszt = 21 000,00 zł brutto/mc x narzut pracodawcy 1,205 = 25 305,00 zł/mc x 0,80 etatomiesiąca (miesięcy pracy w przeliczeniu na pełny etat) = 20 244,00 zł. Nakład w zadaniu Z6 wynika z podziału etatu 0,25 stanowiska między zadania Z6, Z7 i Z9 w kolejnych fazach prac (etat w zadaniu Z6): M19-M21: 0,15; M22: 0,10; M23-M25: 0,05; M26-M27: 0,05; M28-M30: 0,00. W każdym miesiącu suma nakładów w trzech zadaniach równa się 0,25 etatu, a w całym okresie M19-M30 3,00 etatomiesiąca. Stawkę brutto zweryfikowano na podstawie No Fluff Jobs „Rynek pracy IT 2025/2026”, kat. Security poziom Senior, UoP 20000-28000 (s. 32; tabela zbiorcza 17000-23000, s. 27), 21000 w widełkach senior. Wynagrodzenie niezbędne do realizacji prac B+R. Forma zatrudnienia: umowa o pracę.</w:t>
+      </w:r>
+    </w:p>
+    <w:p>
+      <w:pPr>
+        <w:keepNext/>
+        <w:spacing w:before="160" w:after="40"/>
+      </w:pPr>
+      <w:r>
+        <w:rPr>
+          <w:b/>
+          <w:sz w:val="20"/>
+        </w:rPr>
+        <w:t>IT Specialist - wynagrodzenie (Z6)</w:t>
+      </w:r>
+      <w:r>
+        <w:rPr>
+          <w:color w:val="666666"/>
+          <w:sz w:val="17"/>
+        </w:rPr>
+        <w:t xml:space="preserve"> [745 z 1500 znaków]</w:t>
+      </w:r>
+    </w:p>
+    <w:p>
+      <w:pPr>
+        <w:spacing w:after="60"/>
+        <w:shd w:val="clear" w:color="auto" w:fill="F3F3F3"/>
+      </w:pPr>
+      <w:r>
+        <w:rPr>
+          <w:b w:val="0"/>
+        </w:rPr>
+        <w:t>Koszt = 19 000,00 zł brutto/mc x narzut pracodawcy 1,205 = 22 895,00 zł/mc x 3,40 etatomiesiąca (miesięcy pracy w przeliczeniu na pełny etat) = 77 843,00 zł. Nakład w zadaniu Z6 wynika z podziału etatu 1,00 stanowiska między zadania Z6, Z7 i Z9 w kolejnych fazach prac (etat w zadaniu Z6): M19-M21: 0,45; M22: 0,40; M23-M25: 0,35; M26-M27: 0,30; M28-M30: 0,00. W każdym miesiącu suma nakładów w trzech zadaniach równa się 1,00 etatu, a w całym okresie M19-M30 12,00 etatomiesiąca. Stawkę brutto zweryfikowano na podstawie No Fluff Jobs „Rynek pracy IT 2025/2026”, kat. Backend/Fullstack poziom Senior, UoP 18500-25000 (s. 30), 19000 w dolnej części pasma senior. Wynagrodzenie niezbędne do realizacji prac B+R. Forma zatrudnienia: umowa o pracę.</w:t>
+      </w:r>
+    </w:p>
+    <w:p>
+      <w:pPr>
+        <w:keepNext/>
+        <w:spacing w:before="160" w:after="40"/>
+      </w:pPr>
+      <w:r>
+        <w:rPr>
+          <w:b/>
+          <w:sz w:val="20"/>
+        </w:rPr>
+        <w:t>IoT Specialist - wynagrodzenie (Z6)</w:t>
+      </w:r>
+      <w:r>
+        <w:rPr>
+          <w:color w:val="666666"/>
+          <w:sz w:val="17"/>
+        </w:rPr>
+        <w:t xml:space="preserve"> [809 z 1500 znaków]</w:t>
+      </w:r>
+    </w:p>
+    <w:p>
+      <w:pPr>
+        <w:spacing w:after="60"/>
+        <w:shd w:val="clear" w:color="auto" w:fill="F3F3F3"/>
+      </w:pPr>
+      <w:r>
+        <w:rPr>
+          <w:b w:val="0"/>
+        </w:rPr>
+        <w:t>Koszt = 15 000,00 zł brutto/mc x narzut pracodawcy 1,205 = 18 075,00 zł/mc x 0,65 etatomiesiąca (miesięcy pracy w przeliczeniu na pełny etat) = 11 748,75 zł. Nakład w zadaniu Z6 wynika z podziału etatu 0,50 stanowiska między zadania Z6, Z7 i Z9 w kolejnych fazach prac (etat w zadaniu Z6): M19-M21: 0,10; M22: 0,10; M23-M25: 0,05; M26-M27: 0,05; M28-M30: 0,00. W każdym miesiącu suma nakładów w trzech zadaniach równa się 0,50 etatu, a w całym okresie M19-M30 6,00 etatomiesiąca. Stawkę brutto zweryfikowano na podstawie No Fluff Jobs „Rynek pracy IT 2025/2026”, kat. Embedded (s. 27/35: 13000-19000, Mid 12000-17000); pomocniczo Hays „Raport płacowy 2026”, R&amp;D Engineer 13/16/18 tys. (s. 38), 15000 w widełkach kat. Embedded. Wynagrodzenie niezbędne do realizacji prac B+R. Forma zatrudnienia: umowa o pracę.</w:t>
+      </w:r>
+    </w:p>
+    <w:p>
+      <w:pPr>
+        <w:keepNext/>
+        <w:spacing w:before="160" w:after="40"/>
+      </w:pPr>
+      <w:r>
+        <w:rPr>
+          <w:b/>
+          <w:sz w:val="20"/>
+        </w:rPr>
+        <w:t>Specjalista ds. logistyki TSL - wynagrodzenie (Z6)</w:t>
+      </w:r>
+      <w:r>
+        <w:rPr>
+          <w:color w:val="666666"/>
+          <w:sz w:val="17"/>
+        </w:rPr>
+        <w:t xml:space="preserve"> [758 z 1500 znaków]</w:t>
+      </w:r>
+    </w:p>
+    <w:p>
+      <w:pPr>
+        <w:spacing w:after="60"/>
+        <w:shd w:val="clear" w:color="auto" w:fill="F3F3F3"/>
+      </w:pPr>
+      <w:r>
+        <w:rPr>
+          <w:b w:val="0"/>
+        </w:rPr>
+        <w:t>Koszt = 10 000,00 zł brutto/mc x narzut pracodawcy 1,205 = 12 050,00 zł/mc x 1,35 etatomiesiąca (miesięcy pracy w przeliczeniu na pełny etat) = 16 267,50 zł. Nakład w zadaniu Z6 wynika z podziału etatu 0,50 stanowiska między zadania Z6, Z7 i Z9 w kolejnych fazach prac (etat w zadaniu Z6): M19-M21: 0,15; M22: 0,15; M23-M25: 0,15; M26-M27: 0,15; M28-M30: 0,00. W każdym miesiącu suma nakładów w trzech zadaniach równa się 0,50 etatu, a w całym okresie M19-M30 6,00 etatomiesiąca. Stawkę brutto zweryfikowano na podstawie Hays „Raport płacowy 2026”, sekcja Logistyka i zakupy , tabela Logistyka, „Specjalista ds. Logistyki” 8000/10000/13000 (s. 40), 10000 = wartość optymalna. Wynagrodzenie niezbędne do realizacji prac B+R. Forma zatrudnienia: umowa o pracę.</w:t>
+      </w:r>
+    </w:p>
+    <w:p>
+      <w:pPr>
+        <w:keepNext/>
+        <w:spacing w:before="160" w:after="40"/>
+      </w:pPr>
+      <w:r>
+        <w:rPr>
+          <w:b/>
+          <w:sz w:val="20"/>
+        </w:rPr>
+        <w:t>Backend/Full-Stack Developer - wynagrodzenie (Z6)</w:t>
+      </w:r>
+      <w:r>
+        <w:rPr>
+          <w:color w:val="666666"/>
+          <w:sz w:val="17"/>
+        </w:rPr>
+        <w:t xml:space="preserve"> [557 z 1500 znaków]</w:t>
+      </w:r>
+    </w:p>
+    <w:p>
+      <w:pPr>
+        <w:spacing w:after="60"/>
+        <w:shd w:val="clear" w:color="auto" w:fill="F3F3F3"/>
+      </w:pPr>
+      <w:r>
+        <w:rPr>
+          <w:b w:val="0"/>
+        </w:rPr>
+        <w:t>Koszt = 18 000,00 zł brutto/mc x narzut pracodawcy 1,205 = 21 690,00 zł/mc x 1,0 etatu x 9 mc (M19-M27, zadanie Z6) = 195 210,00 zł. Liczba miesięcy wynika z zakresu prac w zadaniu: w Z6 integracje testowe, potok danych i test zgodności eFTI w czasie trwania zadania. Stawkę brutto zweryfikowano na podstawie No Fluff Jobs „Rynek pracy IT 2025/2026”, kat. Backend/Fullstack (s. 30): Mid maks. 18000, Senior 18500-25000, 18000 na granicy Mid/Senior (założenie konserwatywne). Wynagrodzenie niezbędne do realizacji prac B+R. Forma zatrudnienia: umowa o pracę.</w:t>
+      </w:r>
+    </w:p>
+    <w:p>
+      <w:pPr>
+        <w:pStyle w:val="Heading3"/>
+      </w:pPr>
+      <w:r>
+        <w:t>Zadanie 7</w:t>
+      </w:r>
+    </w:p>
+    <w:p>
+      <w:pPr>
+        <w:keepNext/>
+        <w:spacing w:before="160" w:after="40"/>
+      </w:pPr>
+      <w:r>
+        <w:rPr>
+          <w:b/>
+          <w:sz w:val="20"/>
+        </w:rPr>
+        <w:t>AI Lead - wynagrodzenie (Z7)</w:t>
+      </w:r>
+      <w:r>
+        <w:rPr>
+          <w:color w:val="666666"/>
+          <w:sz w:val="17"/>
+        </w:rPr>
+        <w:t xml:space="preserve"> [763 z 1500 znaków]</w:t>
+      </w:r>
+    </w:p>
+    <w:p>
+      <w:pPr>
+        <w:spacing w:after="60"/>
+        <w:shd w:val="clear" w:color="auto" w:fill="F3F3F3"/>
+      </w:pPr>
+      <w:r>
+        <w:rPr>
+          <w:b w:val="0"/>
+        </w:rPr>
+        <w:t>Koszt = 23 000,00 zł brutto/mc x narzut pracodawcy 1,205 = 27 715,00 zł/mc x 3,05 etatomiesiąca (miesięcy pracy w przeliczeniu na pełny etat) = 84 530,75 zł. Nakład w zadaniu Z7 wynika z podziału etatu 0,75 stanowiska między zadania Z6, Z7 i Z9 w kolejnych fazach prac (etat w zadaniu Z7): M19-M21: 0,45; M22: 0,30; M23-M25: 0,30; M26-M27: 0,25; M28-M30: 0,00. W każdym miesiącu suma nakładów w trzech zadaniach równa się 0,75 etatu, a w całym okresie M19-M30 9,00 etatomiesiąca. Stawkę brutto zweryfikowano na podstawie No Fluff Jobs „Rynek pracy IT 2025/2026”, kat. AI poziom Senior, UoP 20000-29000 (s. 33; tabela zbiorcza 19000-24000, s. 27), 23000 w środku pasma senior/lead. Wynagrodzenie niezbędne do realizacji prac B+R. Forma zatrudnienia: umowa o pracę.</w:t>
+      </w:r>
+    </w:p>
+    <w:p>
+      <w:pPr>
+        <w:keepNext/>
+        <w:spacing w:before="160" w:after="40"/>
+      </w:pPr>
+      <w:r>
+        <w:rPr>
+          <w:b/>
+          <w:sz w:val="20"/>
+        </w:rPr>
+        <w:t>AI Senior Engineer - wynagrodzenie (Z7)</w:t>
+      </w:r>
+      <w:r>
+        <w:rPr>
+          <w:color w:val="666666"/>
+          <w:sz w:val="17"/>
+        </w:rPr>
+        <w:t xml:space="preserve"> [776 z 1500 znaków]</w:t>
+      </w:r>
+    </w:p>
+    <w:p>
+      <w:pPr>
+        <w:spacing w:after="60"/>
+        <w:shd w:val="clear" w:color="auto" w:fill="F3F3F3"/>
+      </w:pPr>
+      <w:r>
+        <w:rPr>
+          <w:b w:val="0"/>
+        </w:rPr>
+        <w:t>Koszt = 16 500,00 zł brutto/mc x narzut pracodawcy 1,205 = 19 882,50 zł/mc x 3,55 etatomiesiąca (miesięcy pracy w przeliczeniu na pełny etat) = 70 582,88 zł. Nakład w zadaniu Z7 wynika z podziału etatu 0,75 stanowiska między zadania Z6, Z7 i Z9 w kolejnych fazach prac (etat w zadaniu Z7): M19-M21: 0,60; M22: 0,45; M23-M25: 0,30; M26-M27: 0,20; M28-M30: 0,00. W każdym miesiącu suma nakładów w trzech zadaniach równa się 0,75 etatu, a w całym okresie M19-M30 9,00 etatomiesiąca. Stawkę brutto zweryfikowano na podstawie No Fluff Jobs „Rynek pracy IT 2025/2026”, kat. AI (s. 33): Senior 20000-29000, Mid 14000-21000, 16500 w paśmie Mid, poniżej dolnej mediany Senior (założenie konserwatywne). Wynagrodzenie niezbędne do realizacji prac B+R. Forma zatrudnienia: umowa o pracę.</w:t>
+      </w:r>
+    </w:p>
+    <w:p>
+      <w:pPr>
+        <w:keepNext/>
+        <w:spacing w:before="160" w:after="40"/>
+      </w:pPr>
+      <w:r>
+        <w:rPr>
+          <w:b/>
+          <w:sz w:val="20"/>
+        </w:rPr>
+        <w:t>Cybersecurity / AI Act Specialist - wynagrodzenie (Z7)</w:t>
+      </w:r>
+      <w:r>
+        <w:rPr>
+          <w:color w:val="666666"/>
+          <w:sz w:val="17"/>
+        </w:rPr>
+        <w:t xml:space="preserve"> [761 z 1500 znaków]</w:t>
+      </w:r>
+    </w:p>
+    <w:p>
+      <w:pPr>
+        <w:spacing w:after="60"/>
+        <w:shd w:val="clear" w:color="auto" w:fill="F3F3F3"/>
+      </w:pPr>
+      <w:r>
+        <w:rPr>
+          <w:b w:val="0"/>
+        </w:rPr>
+        <w:t>Koszt = 21 000,00 zł brutto/mc x narzut pracodawcy 1,205 = 25 305,00 zł/mc x 0,80 etatomiesiąca (miesięcy pracy w przeliczeniu na pełny etat) = 20 244,00 zł. Nakład w zadaniu Z7 wynika z podziału etatu 0,25 stanowiska między zadania Z6, Z7 i Z9 w kolejnych fazach prac (etat w zadaniu Z7): M19-M21: 0,10; M22: 0,10; M23-M25: 0,10; M26-M27: 0,05; M28-M30: 0,00. W każdym miesiącu suma nakładów w trzech zadaniach równa się 0,25 etatu, a w całym okresie M19-M30 3,00 etatomiesiąca. Stawkę brutto zweryfikowano na podstawie No Fluff Jobs „Rynek pracy IT 2025/2026”, kat. Security poziom Senior, UoP 20000-28000 (s. 32; tabela zbiorcza 17000-23000, s. 27), 21000 w widełkach senior. Wynagrodzenie niezbędne do realizacji prac B+R. Forma zatrudnienia: umowa o pracę.</w:t>
+      </w:r>
+    </w:p>
+    <w:p>
+      <w:pPr>
+        <w:keepNext/>
+        <w:spacing w:before="160" w:after="40"/>
+      </w:pPr>
+      <w:r>
+        <w:rPr>
+          <w:b/>
+          <w:sz w:val="20"/>
+        </w:rPr>
+        <w:t>IT Specialist - wynagrodzenie (Z7)</w:t>
+      </w:r>
+      <w:r>
+        <w:rPr>
+          <w:color w:val="666666"/>
+          <w:sz w:val="17"/>
+        </w:rPr>
+        <w:t xml:space="preserve"> [745 z 1500 znaków]</w:t>
+      </w:r>
+    </w:p>
+    <w:p>
+      <w:pPr>
+        <w:spacing w:after="60"/>
+        <w:shd w:val="clear" w:color="auto" w:fill="F3F3F3"/>
+      </w:pPr>
+      <w:r>
+        <w:rPr>
+          <w:b w:val="0"/>
+        </w:rPr>
+        <w:t>Koszt = 19 000,00 zł brutto/mc x narzut pracodawcy 1,205 = 22 895,00 zł/mc x 3,45 etatomiesiąca (miesięcy pracy w przeliczeniu na pełny etat) = 78 987,75 zł. Nakład w zadaniu Z7 wynika z podziału etatu 1,00 stanowiska między zadania Z6, Z7 i Z9 w kolejnych fazach prac (etat w zadaniu Z7): M19-M21: 0,55; M22: 0,45; M23-M25: 0,35; M26-M27: 0,15; M28-M30: 0,00. W każdym miesiącu suma nakładów w trzech zadaniach równa się 1,00 etatu, a w całym okresie M19-M30 12,00 etatomiesiąca. Stawkę brutto zweryfikowano na podstawie No Fluff Jobs „Rynek pracy IT 2025/2026”, kat. Backend/Fullstack poziom Senior, UoP 18500-25000 (s. 30), 19000 w dolnej części pasma senior. Wynagrodzenie niezbędne do realizacji prac B+R. Forma zatrudnienia: umowa o pracę.</w:t>
+      </w:r>
+    </w:p>
+    <w:p>
+      <w:pPr>
+        <w:keepNext/>
+        <w:spacing w:before="160" w:after="40"/>
+      </w:pPr>
+      <w:r>
+        <w:rPr>
+          <w:b/>
+          <w:sz w:val="20"/>
+        </w:rPr>
+        <w:t>IoT Specialist - wynagrodzenie (Z7)</w:t>
+      </w:r>
+      <w:r>
+        <w:rPr>
+          <w:color w:val="666666"/>
+          <w:sz w:val="17"/>
+        </w:rPr>
+        <w:t xml:space="preserve"> [809 z 1500 znaków]</w:t>
+      </w:r>
+    </w:p>
+    <w:p>
+      <w:pPr>
+        <w:spacing w:after="60"/>
+        <w:shd w:val="clear" w:color="auto" w:fill="F3F3F3"/>
+      </w:pPr>
+      <w:r>
+        <w:rPr>
+          <w:b w:val="0"/>
+        </w:rPr>
+        <w:t>Koszt = 15 000,00 zł brutto/mc x narzut pracodawcy 1,205 = 18 075,00 zł/mc x 2,25 etatomiesiąca (miesięcy pracy w przeliczeniu na pełny etat) = 40 668,75 zł. Nakład w zadaniu Z7 wynika z podziału etatu 0,50 stanowiska między zadania Z6, Z7 i Z9 w kolejnych fazach prac (etat w zadaniu Z7): M19-M21: 0,40; M22: 0,25; M23-M25: 0,20; M26-M27: 0,10; M28-M30: 0,00. W każdym miesiącu suma nakładów w trzech zadaniach równa się 0,50 etatu, a w całym okresie M19-M30 6,00 etatomiesiąca. Stawkę brutto zweryfikowano na podstawie No Fluff Jobs „Rynek pracy IT 2025/2026”, kat. Embedded (s. 27/35: 13000-19000, Mid 12000-17000); pomocniczo Hays „Raport płacowy 2026”, R&amp;D Engineer 13/16/18 tys. (s. 38), 15000 w widełkach kat. Embedded. Wynagrodzenie niezbędne do realizacji prac B+R. Forma zatrudnienia: umowa o pracę.</w:t>
+      </w:r>
+    </w:p>
+    <w:p>
+      <w:pPr>
+        <w:keepNext/>
+        <w:spacing w:before="160" w:after="40"/>
+      </w:pPr>
+      <w:r>
+        <w:rPr>
+          <w:b/>
+          <w:sz w:val="20"/>
+        </w:rPr>
+        <w:t>Specjalista ds. logistyki TSL - wynagrodzenie (Z7)</w:t>
+      </w:r>
+      <w:r>
+        <w:rPr>
+          <w:color w:val="666666"/>
+          <w:sz w:val="17"/>
+        </w:rPr>
+        <w:t xml:space="preserve"> [758 z 1500 znaków]</w:t>
+      </w:r>
+    </w:p>
+    <w:p>
+      <w:pPr>
+        <w:spacing w:after="60"/>
+        <w:shd w:val="clear" w:color="auto" w:fill="F3F3F3"/>
+      </w:pPr>
+      <w:r>
+        <w:rPr>
+          <w:b w:val="0"/>
+        </w:rPr>
+        <w:t>Koszt = 10 000,00 zł brutto/mc x narzut pracodawcy 1,205 = 12 050,00 zł/mc x 1,65 etatomiesiąca (miesięcy pracy w przeliczeniu na pełny etat) = 19 882,50 zł. Nakład w zadaniu Z7 wynika z podziału etatu 0,50 stanowiska między zadania Z6, Z7 i Z9 w kolejnych fazach prac (etat w zadaniu Z7): M19-M21: 0,35; M22: 0,20; M23-M25: 0,10; M26-M27: 0,05; M28-M30: 0,00. W każdym miesiącu suma nakładów w trzech zadaniach równa się 0,50 etatu, a w całym okresie M19-M30 6,00 etatomiesiąca. Stawkę brutto zweryfikowano na podstawie Hays „Raport płacowy 2026”, sekcja Logistyka i zakupy , tabela Logistyka, „Specjalista ds. Logistyki” 8000/10000/13000 (s. 40), 10000 = wartość optymalna. Wynagrodzenie niezbędne do realizacji prac B+R. Forma zatrudnienia: umowa o pracę.</w:t>
+      </w:r>
+    </w:p>
+    <w:p>
+      <w:pPr>
+        <w:pStyle w:val="Heading3"/>
+      </w:pPr>
+      <w:r>
+        <w:t>Zadanie 9</w:t>
+      </w:r>
+    </w:p>
+    <w:p>
+      <w:pPr>
+        <w:keepNext/>
+        <w:spacing w:before="160" w:after="40"/>
+      </w:pPr>
+      <w:r>
+        <w:rPr>
+          <w:b/>
+          <w:sz w:val="20"/>
+        </w:rPr>
+        <w:t>AI Lead - wynagrodzenie (Z9)</w:t>
+      </w:r>
+      <w:r>
+        <w:rPr>
+          <w:color w:val="666666"/>
+          <w:sz w:val="17"/>
+        </w:rPr>
+        <w:t xml:space="preserve"> [764 z 1500 znaków]</w:t>
+      </w:r>
+    </w:p>
+    <w:p>
+      <w:pPr>
+        <w:spacing w:after="60"/>
+        <w:shd w:val="clear" w:color="auto" w:fill="F3F3F3"/>
+      </w:pPr>
+      <w:r>
+        <w:rPr>
+          <w:b w:val="0"/>
+        </w:rPr>
+        <w:t>Koszt = 23 000,00 zł brutto/mc x narzut pracodawcy 1,205 = 27 715,00 zł/mc x 3,85 etatomiesiąca (miesięcy pracy w przeliczeniu na pełny etat) = 106 702,75 zł. Nakład w zadaniu Z9 wynika z podziału etatu 0,75 stanowiska między zadania Z6, Z7 i Z9 w kolejnych fazach prac (etat w zadaniu Z9): M19-M21: 0,00; M22: 0,15; M23-M25: 0,25; M26-M27: 0,35; M28-M30: 0,75. W każdym miesiącu suma nakładów w trzech zadaniach równa się 0,75 etatu, a w całym okresie M19-M30 9,00 etatomiesiąca. Stawkę brutto zweryfikowano na podstawie No Fluff Jobs „Rynek pracy IT 2025/2026”, kat. AI poziom Senior, UoP 20000-29000 (s. 33; tabela zbiorcza 19000-24000, s. 27), 23000 w środku pasma senior/lead. Wynagrodzenie niezbędne do realizacji prac B+R. Forma zatrudnienia: umowa o pracę.</w:t>
+      </w:r>
+    </w:p>
+    <w:p>
+      <w:pPr>
+        <w:keepNext/>
+        <w:spacing w:before="160" w:after="40"/>
+      </w:pPr>
+      <w:r>
+        <w:rPr>
+          <w:b/>
+          <w:sz w:val="20"/>
+        </w:rPr>
+        <w:t>AI Senior Engineer - wynagrodzenie (Z9)</w:t>
+      </w:r>
+      <w:r>
+        <w:rPr>
+          <w:color w:val="666666"/>
+          <w:sz w:val="17"/>
+        </w:rPr>
+        <w:t xml:space="preserve"> [776 z 1500 znaków]</w:t>
+      </w:r>
+    </w:p>
+    <w:p>
+      <w:pPr>
+        <w:spacing w:after="60"/>
+        <w:shd w:val="clear" w:color="auto" w:fill="F3F3F3"/>
+      </w:pPr>
+      <w:r>
+        <w:rPr>
+          <w:b w:val="0"/>
+        </w:rPr>
+        <w:t>Koszt = 16 500,00 zł brutto/mc x narzut pracodawcy 1,205 = 19 882,50 zł/mc x 3,30 etatomiesiąca (miesięcy pracy w przeliczeniu na pełny etat) = 65 612,24 zł. Nakład w zadaniu Z9 wynika z podziału etatu 0,75 stanowiska między zadania Z6, Z7 i Z9 w kolejnych fazach prac (etat w zadaniu Z9): M19-M21: 0,00; M22: 0,10; M23-M25: 0,15; M26-M27: 0,25; M28-M30: 0,75. W każdym miesiącu suma nakładów w trzech zadaniach równa się 0,75 etatu, a w całym okresie M19-M30 9,00 etatomiesiąca. Stawkę brutto zweryfikowano na podstawie No Fluff Jobs „Rynek pracy IT 2025/2026”, kat. AI (s. 33): Senior 20000-29000, Mid 14000-21000, 16500 w paśmie Mid, poniżej dolnej mediany Senior (założenie konserwatywne). Wynagrodzenie niezbędne do realizacji prac B+R. Forma zatrudnienia: umowa o pracę.</w:t>
+      </w:r>
+    </w:p>
+    <w:p>
+      <w:pPr>
+        <w:keepNext/>
+        <w:spacing w:before="160" w:after="40"/>
+      </w:pPr>
+      <w:r>
+        <w:rPr>
+          <w:b/>
+          <w:sz w:val="20"/>
+        </w:rPr>
+        <w:t>Cybersecurity / AI Act Specialist - wynagrodzenie (Z9)</w:t>
+      </w:r>
+      <w:r>
+        <w:rPr>
+          <w:color w:val="666666"/>
+          <w:sz w:val="17"/>
+        </w:rPr>
+        <w:t xml:space="preserve"> [761 z 1500 znaków]</w:t>
+      </w:r>
+    </w:p>
+    <w:p>
+      <w:pPr>
+        <w:spacing w:after="60"/>
+        <w:shd w:val="clear" w:color="auto" w:fill="F3F3F3"/>
+      </w:pPr>
+      <w:r>
+        <w:rPr>
+          <w:b w:val="0"/>
+        </w:rPr>
+        <w:t>Koszt = 21 000,00 zł brutto/mc x narzut pracodawcy 1,205 = 25 305,00 zł/mc x 1,40 etatomiesiąca (miesięcy pracy w przeliczeniu na pełny etat) = 35 427,00 zł. Nakład w zadaniu Z9 wynika z podziału etatu 0,25 stanowiska między zadania Z6, Z7 i Z9 w kolejnych fazach prac (etat w zadaniu Z9): M19-M21: 0,00; M22: 0,05; M23-M25: 0,10; M26-M27: 0,15; M28-M30: 0,25. W każdym miesiącu suma nakładów w trzech zadaniach równa się 0,25 etatu, a w całym okresie M19-M30 3,00 etatomiesiąca. Stawkę brutto zweryfikowano na podstawie No Fluff Jobs „Rynek pracy IT 2025/2026”, kat. Security poziom Senior, UoP 20000-28000 (s. 32; tabela zbiorcza 17000-23000, s. 27), 21000 w widełkach senior. Wynagrodzenie niezbędne do realizacji prac B+R. Forma zatrudnienia: umowa o pracę.</w:t>
+      </w:r>
+    </w:p>
+    <w:p>
+      <w:pPr>
+        <w:keepNext/>
+        <w:spacing w:before="160" w:after="40"/>
+      </w:pPr>
+      <w:r>
+        <w:rPr>
+          <w:b/>
+          <w:sz w:val="20"/>
+        </w:rPr>
+        <w:t>IT Specialist - wynagrodzenie (Z9)</w:t>
+      </w:r>
+      <w:r>
+        <w:rPr>
+          <w:color w:val="666666"/>
+          <w:sz w:val="17"/>
+        </w:rPr>
+        <w:t xml:space="preserve"> [746 z 1500 znaków]</w:t>
+      </w:r>
+    </w:p>
+    <w:p>
+      <w:pPr>
+        <w:spacing w:after="60"/>
+        <w:shd w:val="clear" w:color="auto" w:fill="F3F3F3"/>
+      </w:pPr>
+      <w:r>
+        <w:rPr>
+          <w:b w:val="0"/>
+        </w:rPr>
+        <w:t>Koszt = 19 000,00 zł brutto/mc x narzut pracodawcy 1,205 = 22 895,00 zł/mc x 5,15 etatomiesiąca (miesięcy pracy w przeliczeniu na pełny etat) = 117 909,25 zł. Nakład w zadaniu Z9 wynika z podziału etatu 1,00 stanowiska między zadania Z6, Z7 i Z9 w kolejnych fazach prac (etat w zadaniu Z9): M19-M21: 0,00; M22: 0,15; M23-M25: 0,30; M26-M27: 0,55; M28-M30: 1,00. W każdym miesiącu suma nakładów w trzech zadaniach równa się 1,00 etatu, a w całym okresie M19-M30 12,00 etatomiesiąca. Stawkę brutto zweryfikowano na podstawie No Fluff Jobs „Rynek pracy IT 2025/2026”, kat. Backend/Fullstack poziom Senior, UoP 18500-25000 (s. 30), 19000 w dolnej części pasma senior. Wynagrodzenie niezbędne do realizacji prac B+R. Forma zatrudnienia: umowa o pracę.</w:t>
+      </w:r>
+    </w:p>
+    <w:p>
+      <w:pPr>
+        <w:keepNext/>
+        <w:spacing w:before="160" w:after="40"/>
+      </w:pPr>
+      <w:r>
+        <w:rPr>
+          <w:b/>
+          <w:sz w:val="20"/>
+        </w:rPr>
+        <w:t>IoT Specialist - wynagrodzenie (Z9)</w:t>
+      </w:r>
+      <w:r>
+        <w:rPr>
+          <w:color w:val="666666"/>
+          <w:sz w:val="17"/>
+        </w:rPr>
+        <w:t xml:space="preserve"> [809 z 1500 znaków]</w:t>
+      </w:r>
+    </w:p>
+    <w:p>
+      <w:pPr>
+        <w:spacing w:after="60"/>
+        <w:shd w:val="clear" w:color="auto" w:fill="F3F3F3"/>
+      </w:pPr>
+      <w:r>
+        <w:rPr>
+          <w:b w:val="0"/>
+        </w:rPr>
+        <w:t>Koszt = 15 000,00 zł brutto/mc x narzut pracodawcy 1,205 = 18 075,00 zł/mc x 3,10 etatomiesiąca (miesięcy pracy w przeliczeniu na pełny etat) = 56 032,50 zł. Nakład w zadaniu Z9 wynika z podziału etatu 0,50 stanowiska między zadania Z6, Z7 i Z9 w kolejnych fazach prac (etat w zadaniu Z9): M19-M21: 0,00; M22: 0,15; M23-M25: 0,25; M26-M27: 0,35; M28-M30: 0,50. W każdym miesiącu suma nakładów w trzech zadaniach równa się 0,50 etatu, a w całym okresie M19-M30 6,00 etatomiesiąca. Stawkę brutto zweryfikowano na podstawie No Fluff Jobs „Rynek pracy IT 2025/2026”, kat. Embedded (s. 27/35: 13000-19000, Mid 12000-17000); pomocniczo Hays „Raport płacowy 2026”, R&amp;D Engineer 13/16/18 tys. (s. 38), 15000 w widełkach kat. Embedded. Wynagrodzenie niezbędne do realizacji prac B+R. Forma zatrudnienia: umowa o pracę.</w:t>
+      </w:r>
+    </w:p>
+    <w:p>
+      <w:pPr>
+        <w:keepNext/>
+        <w:spacing w:before="160" w:after="40"/>
+      </w:pPr>
+      <w:r>
+        <w:rPr>
+          <w:b/>
+          <w:sz w:val="20"/>
+        </w:rPr>
+        <w:t>Specjalista ds. logistyki TSL - wynagrodzenie (Z9)</w:t>
+      </w:r>
+      <w:r>
+        <w:rPr>
+          <w:color w:val="666666"/>
+          <w:sz w:val="17"/>
+        </w:rPr>
+        <w:t xml:space="preserve"> [758 z 1500 znaków]</w:t>
+      </w:r>
+    </w:p>
+    <w:p>
+      <w:pPr>
+        <w:spacing w:after="60"/>
+        <w:shd w:val="clear" w:color="auto" w:fill="F3F3F3"/>
+      </w:pPr>
+      <w:r>
+        <w:rPr>
+          <w:b w:val="0"/>
+        </w:rPr>
+        <w:t>Koszt = 10 000,00 zł brutto/mc x narzut pracodawcy 1,205 = 12 050,00 zł/mc x 3,00 etatomiesiąca (miesięcy pracy w przeliczeniu na pełny etat) = 36 150,00 zł. Nakład w zadaniu Z9 wynika z podziału etatu 0,50 stanowiska między zadania Z6, Z7 i Z9 w kolejnych fazach prac (etat w zadaniu Z9): M19-M21: 0,00; M22: 0,15; M23-M25: 0,25; M26-M27: 0,30; M28-M30: 0,50. W każdym miesiącu suma nakładów w trzech zadaniach równa się 0,50 etatu, a w całym okresie M19-M30 6,00 etatomiesiąca. Stawkę brutto zweryfikowano na podstawie Hays „Raport płacowy 2026”, sekcja Logistyka i zakupy , tabela Logistyka, „Specjalista ds. Logistyki” 8000/10000/13000 (s. 40), 10000 = wartość optymalna. Wynagrodzenie niezbędne do realizacji prac B+R. Forma zatrudnienia: umowa o pracę.</w:t>
+      </w:r>
+    </w:p>
+    <w:p>
+      <w:pPr>
+        <w:keepNext/>
+        <w:spacing w:before="160" w:after="40"/>
+      </w:pPr>
+      <w:r>
+        <w:rPr>
+          <w:b/>
+          <w:sz w:val="20"/>
+        </w:rPr>
+        <w:t>Backend/Full-Stack Developer - wynagrodzenie (Z9)</w:t>
+      </w:r>
+      <w:r>
+        <w:rPr>
+          <w:color w:val="666666"/>
+          <w:sz w:val="17"/>
+        </w:rPr>
+        <w:t xml:space="preserve"> [542 z 1500 znaków]</w:t>
+      </w:r>
+    </w:p>
+    <w:p>
+      <w:pPr>
+        <w:spacing w:after="60"/>
+        <w:shd w:val="clear" w:color="auto" w:fill="F3F3F3"/>
+      </w:pPr>
+      <w:r>
+        <w:rPr>
+          <w:b w:val="0"/>
+        </w:rPr>
+        <w:t>Koszt = 18 000,00 zł brutto/mc x narzut pracodawcy 1,205 = 21 690,00 zł/mc x 1,0 etatu x 3 mc (M28-M30, zadanie Z9) = 65 070,00 zł. Liczba miesięcy wynika z zakresu prac w zadaniu: w Z9 walidacja PoC i zgodności eFTI w terenie w Fazie B i oknie korekt. Stawkę brutto zweryfikowano na podstawie No Fluff Jobs „Rynek pracy IT 2025/2026”, kat. Backend/Fullstack (s. 30): Mid maks. 18000, Senior 18500-25000, 18000 na granicy Mid/Senior (założenie konserwatywne). Wynagrodzenie niezbędne do realizacji prac B+R. Forma zatrudnienia: umowa o pracę.</w:t>
       </w:r>
     </w:p>
     <w:p>
@@ -18949,7 +21896,7 @@
                 <w:b w:val="0"/>
                 <w:sz w:val="17"/>
               </w:rPr>
-              <w:t>3805/4000</w:t>
+              <w:t>3871/4000</w:t>
             </w:r>
           </w:p>
         </w:tc>
@@ -19095,7 +22042,7 @@
                 <w:b w:val="0"/>
                 <w:sz w:val="17"/>
               </w:rPr>
-              <w:t>3297/4000</w:t>
+              <w:t>3489/4000</w:t>
             </w:r>
           </w:p>
         </w:tc>
@@ -19387,7 +22334,7 @@
                 <w:b w:val="0"/>
                 <w:sz w:val="17"/>
               </w:rPr>
-              <w:t>3959/4000</w:t>
+              <w:t>3938/4000</w:t>
             </w:r>
           </w:p>
         </w:tc>
@@ -19405,7 +22352,7 @@
                 <w:b w:val="0"/>
                 <w:sz w:val="17"/>
               </w:rPr>
-              <w:t>3764/4000</w:t>
+              <w:t>3845/4000</w:t>
             </w:r>
           </w:p>
         </w:tc>

</xml_diff>

<commit_message>
Audyt opisow: 10 poprawek (H2, harmonogram Faza A/Z7, Z5, Z7, Z9 podwykonawca), N29, notatki po D29
Co-Authored-By: Claude Sonnet 5.5 <noreply@anthropic.com>
Claude-Session: https://claude.ai/code/session_01672WnJhixnEcarbb7uiwfx
</commit_message>
<xml_diff>
--- a/Opisy_zadan_z_kamieniami_milowymi.docx
+++ b/Opisy_zadan_z_kamieniami_milowymi.docx
@@ -260,7 +260,7 @@
           <w:color w:val="666666"/>
           <w:sz w:val="17"/>
         </w:rPr>
-        <w:t xml:space="preserve"> [3876 z 4000 znaków]</w:t>
+        <w:t xml:space="preserve"> [3890 z 4000 znaków]</w:t>
       </w:r>
     </w:p>
     <w:p>
@@ -271,7 +271,7 @@
         <w:rPr>
           <w:b w:val="0"/>
         </w:rPr>
-        <w:t>Problem badawczy rozwiązywany w zadaniu został zdefiniowany w sekcji Cel projektu i dotyczy braku wiedzy o tym, jak w zamkniętej, metalowej przestrzeni naczepy kamery ToF* wzajemnie zakłócają swoją pracę. Kamery odbierają impulsy podczerwone innych kamer (MCI), a wielokrotne odbicia od metalowych ścian powodują błędy wielościeżkowe (MPI). Opublikowane metody ograniczania tych zakłóceń, takie jak multipleksowanie czasowe, rozdzielenie częstotliwości modulacji czy filtracja obwiedni amplitudy, były sprawdzane w laboratoriach lub w otwartych scenach, przy znanej i stałej geometrii. Nie wiadomo, czy ich wyniki można przenieść na przestrzeń z ładunkami o zmiennym kształcie i refleksyjności. Danych katalogowych producentów nie można w tym celu wykorzystać, ponieważ nie opisują one pracy kilku kamer w metalowej bryle, dlatego rozwiązanie problemu wymaga badań własnych.</w:t>
+        <w:t>Problem badawczy rozwiązywany w zadaniu został zdefiniowany w sekcji Cel projektu i dotyczy braku wiedzy o tym, jak w zamkniętej, metalowej przestrzeni naczepy kamery ToF* wzajemnie zakłócają swoją pracę. Kamery odbierają impulsy podczerwone innych kamer (MCI), a wielokrotne odbicia od metalowych ścian powodują błędy wielościeżkowe (MPI). Opublikowane metody ograniczania tych zakłóceń, takie jak multipleksowanie czasowe, rozdzielenie częstotliwości modulacji czy filtracja obwiedni amplitudy, były sprawdzane w laboratoriach lub w otwartych scenach, przy znanej i stałej geometrii. Nie wiadomo, czy ich wyniki można przenieść na przestrzeń z ładunkami o zmiennym kształcie i refleksyjności. Danych katalogowych producentów nie można w tym celu wykorzystać, ponieważ nie opisują one pracy kilku kamer w metalowej bryle.</w:t>
       </w:r>
     </w:p>
     <w:p>
@@ -282,7 +282,7 @@
         <w:rPr>
           <w:b w:val="0"/>
         </w:rPr>
-        <w:t>W zadaniu zostaną zweryfikowane dwie hipotezy badawcze. Pierwsza (H1) zakłada, że RMSE głębi rośnie wraz z liczbą równocześnie pracujących kamer i maleje wraz z odległością od ściany, a efekt jest większy niż opisywany dla scen otwartych. Druga (H2) zakłada, że istnieje konfiguracja do 4 kamer, w której błąd pozycji ładunku nie przekracza 0,30 m bez osobnego algorytmu mitygacji. Odrzucenie H2 uzasadni prace nad algorytmem adaptacyjnym w zadaniu Z5.</w:t>
+        <w:t>W zadaniu zostaną zweryfikowane dwie hipotezy badawcze. Pierwsza (H1) zakłada, że RMSE głębi rośnie wraz z liczbą równocześnie pracujących kamer i maleje wraz z odległością od ściany, a efekt jest większy niż opisywany dla scen otwartych. Druga (H2) zakłada, że istnieje konfiguracja do 4 kamer, w której RMSE głębi pozwala utrzymać błąd pozycji ładunku nie większy niż 0,30 m (szacowany z RMSE głębi i geometrii) bez osobnego algorytmu mitygacji. Odrzucenie H2 uzasadni prace nad algorytmem adaptacyjnym w zadaniu Z5.</w:t>
       </w:r>
     </w:p>
     <w:p>
@@ -449,7 +449,7 @@
           <w:color w:val="666666"/>
           <w:sz w:val="17"/>
         </w:rPr>
-        <w:t xml:space="preserve"> [923 z 1300 znaków]</w:t>
+        <w:t xml:space="preserve"> [980 z 1300 znaków]</w:t>
       </w:r>
     </w:p>
     <w:p>
@@ -486,7 +486,7 @@
         <w:rPr>
           <w:b w:val="0"/>
         </w:rPr>
-        <w:t xml:space="preserve"> wartości RMSE tej konfiguracji (100% to wartość RMSE tej konfiguracji). Wynik rozstrzyga hipotezy H1 i H2 niezależnie od kierunku rozstrzygnięcia.</w:t>
+        <w:t xml:space="preserve"> wartości RMSE tej konfiguracji (100% to wartość RMSE tej konfiguracji). Wynik rozstrzyga hipotezy H1 i H2 niezależnie od kierunku rozstrzygnięcia (dla H2 błąd pozycji szacowany z RMSE głębi i geometrii).</w:t>
       </w:r>
     </w:p>
     <w:p>
@@ -1036,7 +1036,7 @@
           <w:color w:val="666666"/>
           <w:sz w:val="17"/>
         </w:rPr>
-        <w:t xml:space="preserve"> [794 z 1300 znaków]</w:t>
+        <w:t xml:space="preserve"> [802 z 1300 znaków]</w:t>
       </w:r>
     </w:p>
     <w:p>
@@ -1048,7 +1048,7 @@
         <w:rPr>
           <w:b w:val="0"/>
         </w:rPr>
-        <w:t>Odpowiada Everest11. Odbioru dokonuje kierownik B+R Damian Kordos na podstawie protokołu odbioru zbioru. PRz jako odbiorca potwierdza zgodność ze specyfikacją z Z3. Weryfikacja: 1) ZR z zestawienia zdarzeń z dokumentacją inspekcji i zdjęciami; 2) kappa z raportu zgodności trzech anotatorów (próba losowa warstwowa, ziarno w protokole) po rozstrzygnięciu rozbieżności konsensusem ze specjalistą TSL; 3) tor pomiarowy z logów rejestracji i raportu kalibracji (testy: stacjonarny co najmniej 24 h, drogowy co najmniej 500 km); 4) podział z wykazu kursów w zbiorach treningowym, test naturalny i test kontrolowany, z sumami kontrolnymi, zamrożony przed startem Z4; 5) kompletność z raportu liczności klas, sezonów i typów nawierzchni. Decyzję o dalszym przebiegu podejmuje komitet sterujący w M18.</w:t>
+        <w:t>Odpowiada Everest11. Odbioru dokonuje kierownik B+R Damian Kordos na podstawie protokołu odbioru zbioru. PRz jako odbiorca potwierdza zgodność ze specyfikacją z Z3. Weryfikacja: 1) ZR z zestawienia zdarzeń z dokumentacją inspekcji i zdjęciami; 2) kappa z raportu zgodności trzech anotatorów (próba losowa warstwowa, ziarno w protokole) po rozstrzygnięciu rozbieżności konsensusem ze specjalistą TSL; 3) tor pomiarowy z logów rejestracji i raportu kalibracji (testy: stacjonarny co najmniej 24 h, drogowy co najmniej 500 km); 4) podział z wykazu kursów przypisanych do treningu, testu naturalnego i testu kontrolowanego, z sumami kontrolnymi, zamrożony przed startem Z4; 5) kompletność z raportu liczności klas, sezonów i typów nawierzchni. Decyzję o dalszym przebiegu podejmuje komitet sterujący w M18.</w:t>
       </w:r>
     </w:p>
     <w:p>
@@ -2255,7 +2255,7 @@
           <w:color w:val="666666"/>
           <w:sz w:val="17"/>
         </w:rPr>
-        <w:t xml:space="preserve"> [3170 z 4000 znaków]</w:t>
+        <w:t xml:space="preserve"> [3205 z 4000 znaków]</w:t>
       </w:r>
     </w:p>
     <w:p>
@@ -2299,7 +2299,7 @@
         <w:rPr>
           <w:b w:val="0"/>
         </w:rPr>
-        <w:t>Walidacja statystyczna zostanie wykonana na wielkościach istotnych dla wskaźników projektu. Obejmie medianę i percentyl 95 błędu pozycji na co najmniej 100 sekwencjach, błąd względny przemieszczenia między kolejnymi klatkami (decyduje o wykrywaniu przemieszczeń od 0,10 m w zadaniu Z8) oraz częstotliwość aktualizacji modelu co najmniej 5 Hz, przy czym te same wielkości będą ponownie mierzone po kompresji w zadaniu Z7 i w terenie w zadaniu Z9.</w:t>
+        <w:t>Walidacja statystyczna zostanie wykonana na wielkościach istotnych dla wskaźników projektu. Obejmie medianę i percentyl 95 błędu pozycji na co najmniej 100 sekwencjach, błąd względny przemieszczenia między kolejnymi klatkami (decyduje o wykrywaniu przemieszczeń od 0,10 m w zadaniu Z8) oraz częstotliwość aktualizacji modelu co najmniej 5 Hz, przy czym częstotliwość aktualizacji będzie ponownie mierzona na platformie embedded w zadaniu Z7, a błąd pozycji w terenie w zadaniu Z9.</w:t>
       </w:r>
     </w:p>
     <w:p>
@@ -2753,7 +2753,7 @@
           <w:color w:val="666666"/>
           <w:sz w:val="17"/>
         </w:rPr>
-        <w:t xml:space="preserve"> [3518 z 4000 znaków]</w:t>
+        <w:t xml:space="preserve"> [3515 z 4000 znaków]</w:t>
       </w:r>
     </w:p>
     <w:p>
@@ -2786,7 +2786,7 @@
         <w:rPr>
           <w:b w:val="0"/>
         </w:rPr>
-        <w:t>Metoda obejmuje trzy obszary prac. Dla pipeline'u zostaną sprofilowane wszystkie etapy, wskazane wąskie gardła i zastosowane przetwarzanie przyrostowe oraz bufor modelu 3D, a czas zostanie zmierzony na co najmniej 50 cyklach (mediana do 30 s, opóźnienie zdarzenia do TMS w środowisku testowym do 2 s), a przyjęcie dokumentów eFTI przez środowiska testowe Trans.eu, TimoCom i prototyp e-CMR potwierdzi, że format jest użyteczny poza systemem Everest11). Łańcuch integralności będzie podpisanym pakietem z hashem źródeł i znacznikiem czasu, badanym testem odporności na utratę łączności. Dla eFTI zostaną przeanalizowane pola obligatoryjne, ustalona formalna reguła przekształcania zdarzeń w pola i przeprowadzona walidacja schematem XSD oraz implementacją referencyjną KE jako narzędziami testowymi, a mianownikiem wskaźnika pokrycia będą wszystkie pola obligatoryjne.</w:t>
+        <w:t>Metoda obejmuje trzy obszary prac. Dla pipeline'u zostaną sprofilowane wszystkie etapy, wskazane wąskie gardła i zastosowane przetwarzanie przyrostowe oraz bufor modelu 3D, a czas zostanie zmierzony na co najmniej 50 cyklach (mediana do 30 s, opóźnienie zdarzenia do TMS w środowisku testowym do 2 s). Przyjęcie dokumentów eFTI przez środowiska testowe Trans.eu, TimoCom i prototyp e-CMR potwierdzi, że format jest użyteczny poza systemem Everest11. Łańcuch integralności będzie podpisanym pakietem z hashem źródeł i znacznikiem czasu, badanym testem odporności na utratę łączności. Dla eFTI zostaną przeanalizowane pola obligatoryjne, ustalona formalna reguła przekształcania zdarzeń w pola i przeprowadzona walidacja schematem XSD oraz implementacją referencyjną KE jako narzędziami testowymi, a mianownikiem wskaźnika pokrycia będą wszystkie pola obligatoryjne.</w:t>
       </w:r>
     </w:p>
     <w:p>
@@ -3144,7 +3144,7 @@
           <w:color w:val="666666"/>
           <w:sz w:val="17"/>
         </w:rPr>
-        <w:t xml:space="preserve"> [3489 z 4000 znaków]</w:t>
+        <w:t xml:space="preserve"> [3500 z 4000 znaków]</w:t>
       </w:r>
     </w:p>
     <w:p>
@@ -3188,7 +3188,7 @@
         <w:rPr>
           <w:b w:val="0"/>
         </w:rPr>
-        <w:t>1. Kompresję modeli: kwantyzację po treningu do INT8 oraz trening z uwzględnieniem kwantyzacji (QAT) dla modeli wrażliwych, przycinanie strukturalne (pruning) według czułości filtrów i destylację wiedzy dla modeli CV z projektem sieci typu student, w celu zmieścienia modeli w platformie embedded. Budżet degradacji to nie więcej niż 3 punkty procentowe względem FP32 dla każdego modelu (AUC-ROC dla ML, mAP dla CV), sprawdzany na zbiorach testowych z zadań Z4 i Z8.</w:t>
+        <w:t>1. Kompresję modeli: kwantyzację po treningu do INT8 oraz trening z uwzględnieniem kwantyzacji (QAT) dla modeli wrażliwych, przycinanie strukturalne (pruning) według czułości filtrów i destylację wiedzy dla modeli CV z projektem sieci typu student, w celu dopasowania modeli do możliwości platformy embedded. Budżet degradacji to nie więcej niż 3 punkty procentowe względem FP32 dla każdego modelu (AUC-ROC dla ML, mAP dla CV), sprawdzany na zbiorach testowych z zadań Z4 i Z8.</w:t>
       </w:r>
     </w:p>
     <w:p>
@@ -3252,7 +3252,7 @@
           <w:color w:val="666666"/>
           <w:sz w:val="17"/>
         </w:rPr>
-        <w:t xml:space="preserve"> [3267 z 4000 znaków]</w:t>
+        <w:t xml:space="preserve"> [3503 z 4000 znaków]</w:t>
       </w:r>
     </w:p>
     <w:p>
@@ -3263,7 +3263,7 @@
         <w:rPr>
           <w:b w:val="0"/>
         </w:rPr>
-        <w:t>Problem technologiczny rozwiązywany w zadaniu został zdefiniowany w sekcji Cel projektu i dotyczy uruchomienia modeli badawczych na wbudowanej platformie w czasie rzeczywistym, bez łączności z internetem. Modele z zadań Z4, Z5 i Z8 są budowane w pełnej precyzji FP32 i nie mieszczą się w ograniczeniach mocy, temperatury i drgań naczepy. Przed realizacją nie wiadomo, czy kompromis między opóźnieniem alertu do 1 s a degradacją dokładności modeli skompresowanych do 3 punktów procentowych jest osiągalny na docelowej platformie embedded.</w:t>
+        <w:t>Problem technologiczny rozwiązywany w zadaniu został zdefiniowany w sekcji Cel projektu i dotyczy uruchomienia modeli badawczych na wbudowanej platformie w czasie rzeczywistym, bez łączności z internetem. Modele z zadań Z4 i Z8 są budowane w pełnej precyzji FP32, a algorytmy z zadania Z5 nie były dotąd uruchamiane na platformie embedded, więc żaden z tych elementów nie jest dostosowany do ograniczeń mocy, temperatury i drgań naczepy. Przed realizacją nie wiadomo, czy kompromis między opóźnieniem alertu do 1 s a degradacją dokładności modeli skompresowanych do 3 punktów procentowych jest osiągalny na docelowej platformie embedded.</w:t>
       </w:r>
     </w:p>
     <w:p>
@@ -3357,7 +3357,20 @@
         <w:rPr>
           <w:b w:val="0"/>
         </w:rPr>
-        <w:t>. Zadanie przekaże zintegrowany system do instalacji i testów terenowych w zadaniu Z9, a bez zwalidowanego systemu testy te nie mogą się rozpocząć, dlatego kamień milowy zadania Z7 jest krytyczny. Koszty obejmują wynagrodzenia wymienionych osób Everest11 oraz platformę embedded i obudowy do prototypów.</w:t>
+        <w:t xml:space="preserve">. Pierwsze egzemplarze platformy z modelami pośrednimi zostaną przekazane do zadania Z9 w </w:t>
+      </w:r>
+      <w:r>
+        <w:rPr>
+          <w:b w:val="0"/>
+          <w:highlight w:val="yellow"/>
+        </w:rPr>
+        <w:t>M22</w:t>
+      </w:r>
+      <w:r>
+        <w:rPr>
+          <w:b w:val="0"/>
+        </w:rPr>
+        <w:t>, na potrzeby Fazy A, a zintegrowany system w wersji finalnej, po testach środowiskowych, w M27. Bez zwalidowanego systemu nie można przeprowadzić Fazy B ani walidacji końcowej w zadaniu Z9, dlatego kamień milowy zadania Z7 jest krytyczny. Koszty obejmują wynagrodzenia wymienionych osób Everest11 oraz platformę embedded i obudowy do prototypów.</w:t>
       </w:r>
     </w:p>
     <w:p>
@@ -3517,7 +3530,7 @@
           <w:color w:val="666666"/>
           <w:sz w:val="17"/>
         </w:rPr>
-        <w:t xml:space="preserve"> [902 z 1300 znaków]</w:t>
+        <w:t xml:space="preserve"> [964 z 1300 znaków]</w:t>
       </w:r>
     </w:p>
     <w:p>
@@ -3529,7 +3542,7 @@
         <w:rPr>
           <w:b w:val="0"/>
         </w:rPr>
-        <w:t xml:space="preserve">Brak kamienia uniemożliwia instalację systemu w Z9 i blokuje testy terenowe. Gdy opóźnienie przekracza 1 s, Everest11 stosuje silniejszą kompresję, optymalizację potoku (batching, TensorRT) albo mocniejszą platformę i powtarza pomiary. Gdy degradacja przekracza 3 punkty procentowe, część modeli pozostaje w wyższej precyzji kosztem opóźnienia albo wraca do douczenia w Z4 lub Z8. Do dwóch iteracji, każda w oknie 4-6 tygodni przed M27. Wariant zawężony: na platformie embedded działają tylko model ML i alert, a CV działa po stronie TMS. Zachowuje funkcję alertu offline, a wskaźnik opóźnienia dotyczy wtedy modelu ML. Wartość graniczna no-go: opóźnienie percentyla 95 większe niż </w:t>
+        <w:t xml:space="preserve">Brak kamienia uniemożliwia Fazę B i walidację końcową w Z9, a opóźnia także Fazę A, która zaczyna się od pierwszych egzemplarzy platformy. Gdy opóźnienie przekracza 1 s, Everest11 stosuje silniejszą kompresję, optymalizację potoku (batching, TensorRT) albo mocniejszą platformę i powtarza pomiary. Gdy degradacja przekracza 3 punkty procentowe, część modeli pozostaje w wyższej precyzji kosztem opóźnienia albo wraca do douczenia w Z4 lub Z8. Do dwóch iteracji, każda w oknie 4-6 tygodni przed M27. Wariant zawężony: na platformie embedded działają tylko model ML i alert, a CV działa po stronie TMS. Zachowuje funkcję alertu offline, a wskaźnik opóźnienia dotyczy wtedy modelu ML. Wartość graniczna no-go: opóźnienie percentyla 95 większe niż </w:t>
       </w:r>
       <w:r>
         <w:rPr>
@@ -4062,7 +4075,7 @@
           <w:color w:val="666666"/>
           <w:sz w:val="17"/>
         </w:rPr>
-        <w:t xml:space="preserve"> [3938 z 4000 znaków]</w:t>
+        <w:t xml:space="preserve"> [3936 z 4000 znaków]</w:t>
       </w:r>
     </w:p>
     <w:p>
@@ -4106,7 +4119,7 @@
         <w:rPr>
           <w:b w:val="0"/>
         </w:rPr>
-        <w:t xml:space="preserve">1. Fazę A (M22-M26): instalację i kalibrację egzemplarzy release candidate, rejestrację co najmniej </w:t>
+        <w:t xml:space="preserve">1. Fazę A (M22-M26): instalację i kalibrację pierwszych egzemplarzy zestawu z modelami pośrednimi, rejestrację co najmniej </w:t>
       </w:r>
       <w:r>
         <w:rPr>
@@ -4130,7 +4143,7 @@
         <w:rPr>
           <w:b w:val="0"/>
         </w:rPr>
-        <w:t>2. Fazę B (M27-M29): wdrożenie wersji finalnej, rejestrację do łącznie co najmniej 180 kursów naturalnych i pełną walidację KPI.</w:t>
+        <w:t>2. Fazę B (M27-M29): wdrożenie wersji finalnej (modele w wersji release candidate z M26, po kompresji), rejestrację do łącznie co najmniej 180 kursów naturalnych i pełną walidację KPI.</w:t>
       </w:r>
     </w:p>
     <w:p>
@@ -4154,7 +4167,7 @@
         <w:rPr>
           <w:b w:val="0"/>
         </w:rPr>
-        <w:t xml:space="preserve"> nowych kursach, w celu ponownego potwierdzenia parametrów po korektach.</w:t>
+        <w:t xml:space="preserve"> nowych kursach.</w:t>
       </w:r>
     </w:p>
     <w:p>
@@ -4226,7 +4239,7 @@
         <w:rPr>
           <w:b w:val="0"/>
         </w:rPr>
-        <w:t>Zadanie będzie realizowane przez zespół Everest11. AI Lead opracuje protokół walidacji KPI, zbierze i uporządkuje dane terenowe, obliczy metryki dla każdej klasy i przy stwierdzeniu domain shift przeprowadzi adaptację domenową. AI Senior Engineer zoptymalizuje modele na platformie, zdiagnozuje domain shift, wdroży korekty, zmierzy wskaźniki jakości i przygotuje raport KPI oraz anotację próbki co najmniej 200 obrazów terenowych, weryfikowaną przez specjalistę TSL, a także przeprowadzi badanie akceptacji użytkowników (kierowcy, dyspozytorzy) według scenariuszy specjalisty TSL. IoT Specialist odbierze zestawy po montażu, skalibruje je i zarejestruje parametry niezawodności sprzętu. IT Specialist zbierze logi (dostępność, status GSM, bufor), zmierzy czas PoC i opóźnienia oraz opracuje dane do raportu KPI. Cybersecurity / AI Act Specialist wykona testy bezpieczeństwa prototypu w terenie i uruchomi zamrożony skrypt ewaluacyjny jako niezależny ewaluator. Specjalista ds. logistyki TSL poprowadzi inspekcje ground truth i zweryfikuje anotację próbki obrazów. Backend/Full-Stack Developer, w wymiarze 1,0 etatu przez 3 miesiące od M28 do M30, obsłuży walidację PoC i zgodności eFTI w terenie na co najmniej 200 cyklach oraz analizę błędów. Nakład pozostałych osób, wynikający z podziału etatów między zadania Z6, Z7 i Z9 według faz prac, wynosi w miesiącach pracy w przeliczeniu na pełny etat: AI Lead 3,85, AI Senior Engineer 3,30, specjalista ds. cyberbezpieczeństwa 1,40, IT Specialist 5,15, IoT Specialist 3,10, specjalista ds. logistyki TSL 3,00.</w:t>
+        <w:t>Zadanie będzie realizowane przez zespół Everest11. AI Lead opracuje protokół walidacji KPI, zbierze i uporządkuje dane terenowe, obliczy metryki dla każdej klasy i przy stwierdzeniu domain shift przeprowadzi adaptację domenową. AI Senior Engineer zoptymalizuje modele na platformie, zdiagnozuje domain shift, wdroży korekty, zmierzy wskaźniki jakości i przygotuje raport KPI oraz anotację próbki co najmniej 200 obrazów terenowych, weryfikowaną przez specjalistę TSL, a także przeprowadzi badanie akceptacji użytkowników według scenariuszy specjalisty TSL. IoT Specialist odbierze zestawy po montażu, skalibruje je i zarejestruje parametry niezawodności sprzętu. IT Specialist zbierze logi (dostępność, status GSM, bufor), zmierzy czas PoC i opóźnienia oraz opracuje dane do raportu KPI. Cybersecurity / AI Act Specialist wykona testy bezpieczeństwa prototypu w terenie i uruchomi zamrożony skrypt ewaluacyjny jako niezależny ewaluator. Specjalista ds. logistyki TSL poprowadzi inspekcje ground truth i zweryfikuje anotację próbki obrazów. Backend/Full-Stack Developer, w wymiarze 1,0 etatu przez 3 miesiące od M28 do M30, obsłuży walidację PoC i zgodności eFTI w terenie na co najmniej 200 cyklach oraz analizę błędów. Nakład pozostałych osób, wynikający z podziału etatów między zadania Z6, Z7 i Z9 według faz prac, wynosi w miesiącach pracy w przeliczeniu na pełny etat: AI Lead 3,85, AI Senior Engineer 3,30, specjalista ds. cyberbezpieczeństwa 1,40, IT Specialist 5,15, IoT Specialist 3,10, specjalista ds. logistyki TSL 3,00.</w:t>
       </w:r>
     </w:p>
     <w:p>
@@ -4246,7 +4259,7 @@
           <w:color w:val="666666"/>
           <w:sz w:val="17"/>
         </w:rPr>
-        <w:t xml:space="preserve"> [3845 z 4000 znaków]</w:t>
+        <w:t xml:space="preserve"> [3942 z 4000 znaków]</w:t>
       </w:r>
     </w:p>
     <w:p>
@@ -4301,7 +4314,7 @@
         <w:rPr>
           <w:b w:val="0"/>
         </w:rPr>
-        <w:t>Wybór metody jest uzasadniony czterema względami. Nowe kursy naturalne, zamrożony skrypt i log niemodyfikowalny dają niezawodny wynik, a metoda jest celowa i skuteczna, ponieważ mierzy to, co ma być potwierdzone. Wykorzystanie floty testowej zapewnia ekonomiczność. Podwykonawca zainstaluje wyłącznie finalne zestawy prototypowe i je zdemontuje, a montaż toru pomiarowego z zadania Z2 ma odrębny zakres i termin, więc nie ma podwójnego finansowania.</w:t>
+        <w:t>Wybór metody jest uzasadniony czterema względami. Nowe kursy naturalne, zamrożony skrypt i log niemodyfikowalny dają niezawodny wynik, a metoda jest celowa i skuteczna, ponieważ mierzy to, co ma być potwierdzone. Wykorzystanie floty testowej zapewnia ekonomiczność. Podwykonawca wykona wyłącznie montaż zestawów prototypowych na pojazdach w Fazie A (w Fazie B zmienia się oprogramowanie, bez ponownego montażu) oraz ich demontaż po walidacji, a montaż toru pomiarowego z zadania Z2 ma odrębny zakres i termin, więc nie ma podwójnego finansowania.</w:t>
       </w:r>
     </w:p>
     <w:p>
@@ -11810,7 +11823,7 @@
                 <w:b w:val="0"/>
                 <w:sz w:val="16"/>
               </w:rPr>
-              <w:t>podział etatu*</w:t>
+              <w:t>2,10</w:t>
             </w:r>
           </w:p>
         </w:tc>
@@ -11828,7 +11841,7 @@
                 <w:b w:val="0"/>
                 <w:sz w:val="16"/>
               </w:rPr>
-              <w:t>podział etatu*</w:t>
+              <w:t>3,05</w:t>
             </w:r>
           </w:p>
         </w:tc>
@@ -11846,7 +11859,7 @@
                 <w:b w:val="0"/>
                 <w:sz w:val="16"/>
               </w:rPr>
-              <w:t>podział etatu*</w:t>
+              <w:t>3,85</w:t>
             </w:r>
           </w:p>
         </w:tc>
@@ -11864,7 +11877,7 @@
                 <w:b w:val="0"/>
                 <w:sz w:val="16"/>
               </w:rPr>
-              <w:t>Budżet: 12 mc fazy PR podzielone na 3 zadania</w:t>
+              <w:t>etatomiesiące wg podziału z części czwartej</w:t>
             </w:r>
           </w:p>
         </w:tc>
@@ -11920,7 +11933,7 @@
                 <w:b w:val="0"/>
                 <w:sz w:val="16"/>
               </w:rPr>
-              <w:t>podział etatu*</w:t>
+              <w:t>2,15</w:t>
             </w:r>
           </w:p>
         </w:tc>
@@ -11938,7 +11951,7 @@
                 <w:b w:val="0"/>
                 <w:sz w:val="16"/>
               </w:rPr>
-              <w:t>podział etatu*</w:t>
+              <w:t>3,55</w:t>
             </w:r>
           </w:p>
         </w:tc>
@@ -11956,7 +11969,7 @@
                 <w:b w:val="0"/>
                 <w:sz w:val="16"/>
               </w:rPr>
-              <w:t>podział etatu*</w:t>
+              <w:t>3,30</w:t>
             </w:r>
           </w:p>
         </w:tc>
@@ -12030,7 +12043,7 @@
                 <w:b w:val="0"/>
                 <w:sz w:val="16"/>
               </w:rPr>
-              <w:t>podział etatu*</w:t>
+              <w:t>0,80</w:t>
             </w:r>
           </w:p>
         </w:tc>
@@ -12048,7 +12061,7 @@
                 <w:b w:val="0"/>
                 <w:sz w:val="16"/>
               </w:rPr>
-              <w:t>podział etatu*</w:t>
+              <w:t>0,80</w:t>
             </w:r>
           </w:p>
         </w:tc>
@@ -12066,7 +12079,7 @@
                 <w:b w:val="0"/>
                 <w:sz w:val="16"/>
               </w:rPr>
-              <w:t>podział etatu*</w:t>
+              <w:t>1,40</w:t>
             </w:r>
           </w:p>
         </w:tc>
@@ -12140,7 +12153,7 @@
                 <w:b w:val="0"/>
                 <w:sz w:val="16"/>
               </w:rPr>
-              <w:t>podział etatu*</w:t>
+              <w:t>3,40</w:t>
             </w:r>
           </w:p>
         </w:tc>
@@ -12158,7 +12171,7 @@
                 <w:b w:val="0"/>
                 <w:sz w:val="16"/>
               </w:rPr>
-              <w:t>podział etatu*</w:t>
+              <w:t>3,45</w:t>
             </w:r>
           </w:p>
         </w:tc>
@@ -12176,7 +12189,7 @@
                 <w:b w:val="0"/>
                 <w:sz w:val="16"/>
               </w:rPr>
-              <w:t>podział etatu*</w:t>
+              <w:t>5,15</w:t>
             </w:r>
           </w:p>
         </w:tc>
@@ -12194,7 +12207,7 @@
                 <w:b w:val="0"/>
                 <w:sz w:val="16"/>
               </w:rPr>
-              <w:t>bez rutynowej integracji i utrzymania</w:t>
+              <w:t>integracje testowe w Z6, bez wdrożenia produkcyjnego i utrzymania</w:t>
             </w:r>
           </w:p>
         </w:tc>
@@ -12250,7 +12263,7 @@
                 <w:b w:val="0"/>
                 <w:sz w:val="16"/>
               </w:rPr>
-              <w:t>podział etatu*</w:t>
+              <w:t>0,65</w:t>
             </w:r>
           </w:p>
         </w:tc>
@@ -12268,7 +12281,7 @@
                 <w:b w:val="0"/>
                 <w:sz w:val="16"/>
               </w:rPr>
-              <w:t>podział etatu*</w:t>
+              <w:t>2,25</w:t>
             </w:r>
           </w:p>
         </w:tc>
@@ -12286,7 +12299,7 @@
                 <w:b w:val="0"/>
                 <w:sz w:val="16"/>
               </w:rPr>
-              <w:t>podział etatu*</w:t>
+              <w:t>3,10</w:t>
             </w:r>
           </w:p>
         </w:tc>
@@ -12360,7 +12373,7 @@
                 <w:b w:val="0"/>
                 <w:sz w:val="16"/>
               </w:rPr>
-              <w:t>podział etatu*</w:t>
+              <w:t>1,35</w:t>
             </w:r>
           </w:p>
         </w:tc>
@@ -12378,7 +12391,7 @@
                 <w:b w:val="0"/>
                 <w:sz w:val="16"/>
               </w:rPr>
-              <w:t>podział etatu*</w:t>
+              <w:t>1,65</w:t>
             </w:r>
           </w:p>
         </w:tc>
@@ -12396,7 +12409,7 @@
                 <w:b w:val="0"/>
                 <w:sz w:val="16"/>
               </w:rPr>
-              <w:t>podział etatu*</w:t>
+              <w:t>3,00</w:t>
             </w:r>
           </w:p>
         </w:tc>
@@ -12629,7 +12642,7 @@
         <w:rPr>
           <w:b w:val="0"/>
         </w:rPr>
-        <w:t>* Dla sześciu stanowisk Everest11 budżet dzieli 12 miesięcy fazy prac rozwojowych na trzy równe części (Z6, Z7, Z9). Ekspert w uwagach 36 i 37 pyta o rzeczywisty podział. Opisy zadań podają zakres czynności bez liczby miesięcy i odsyłają do budżetu. Decyzja o rzeczywistym podziale należy do bloku budżetowego (patrz Aneks C, pozycja 6).</w:t>
+        <w:t>Liczby w kolumnach Z6, Z7 i Z9 to etatomiesiące (miesiące pracy w przeliczeniu na pełny etat) według podziału z części czwartej, który zastępuje dotychczasowy podział na trzy równe części (uwagi 36 i 37). Podział czeka na potwierdzenie przez zespół techniczny (D29).</w:t>
       </w:r>
     </w:p>
     <w:p>
@@ -16606,6 +16619,62 @@
                 <w:b w:val="0"/>
                 <w:sz w:val="17"/>
               </w:rPr>
+              <w:t>Opis</w:t>
+            </w:r>
+          </w:p>
+        </w:tc>
+        <w:tc>
+          <w:tcPr>
+            <w:tcW w:type="dxa" w:w="6236"/>
+          </w:tcPr>
+          <w:p>
+            <w:pPr>
+              <w:spacing w:after="20"/>
+            </w:pPr>
+            <w:r/>
+            <w:r>
+              <w:rPr>
+                <w:b w:val="0"/>
+                <w:sz w:val="17"/>
+              </w:rPr>
+              <w:t>M22</w:t>
+            </w:r>
+          </w:p>
+        </w:tc>
+      </w:tr>
+      <w:tr>
+        <w:tc>
+          <w:tcPr>
+            <w:tcW w:type="dxa" w:w="1134"/>
+          </w:tcPr>
+          <w:p>
+            <w:pPr>
+              <w:spacing w:after="20"/>
+            </w:pPr>
+            <w:r/>
+            <w:r>
+              <w:rPr>
+                <w:b w:val="0"/>
+                <w:sz w:val="17"/>
+              </w:rPr>
+              <w:t>Z7</w:t>
+            </w:r>
+          </w:p>
+        </w:tc>
+        <w:tc>
+          <w:tcPr>
+            <w:tcW w:type="dxa" w:w="2268"/>
+          </w:tcPr>
+          <w:p>
+            <w:pPr>
+              <w:spacing w:after="20"/>
+            </w:pPr>
+            <w:r/>
+            <w:r>
+              <w:rPr>
+                <w:b w:val="0"/>
+                <w:sz w:val="17"/>
+              </w:rPr>
               <w:t>KM wpływ</w:t>
             </w:r>
           </w:p>
@@ -17535,7 +17604,7 @@
         <w:rPr>
           <w:b w:val="0"/>
         </w:rPr>
-        <w:t>Razem 61 wartości. Progi graniczne (no-go) i wartości przejściowe proponuje autor tekstu na podstawie parametrów głównych. Zespół techniczny powinien potwierdzić albo zmienić każdą z nich.</w:t>
+        <w:t>Razem 62 wartości. Progi graniczne (no-go) i wartości przejściowe proponuje autor tekstu na podstawie parametrów głównych. Zespół techniczny powinien potwierdzić albo zmienić każdą z nich.</w:t>
       </w:r>
     </w:p>
     <w:p>
@@ -17627,7 +17696,7 @@
         <w:t xml:space="preserve">6. </w:t>
       </w:r>
       <w:r>
-        <w:t>Podział etatów w Z6, Z7 i Z9 dla sześciu stanowisk Everest11: obecnie koszt jest dzielony na trzy równe części, co ekspert kwestionuje w uwagach 36 i 37. Opisy podają zakres czynności bez liczb. Rzeczywisty podział miesięcy trzeba ustalić i wpisać w budżecie. Propozycja rozkładu przy zachowaniu sumy kosztów może być przygotowana w bloku budżetowym.</w:t>
+        <w:t>Podział etatów w Z6, Z7 i Z9 dla sześciu stanowisk Everest11: propozycja jest w części czwartej i w arkuszu 10_Podział_etatów rejestru (formuły). Wymaga potwierdzenia przez zespół techniczny, że fazy prac i udział każdej osoby odpowiadają rzeczywistości. Po potwierdzeniu trzeba zmienić pozycje kosztowe Z6, Z7 i Z9 w 3.1.2 i model finansowy.</w:t>
       </w:r>
     </w:p>
     <w:p>
@@ -20820,6 +20889,116 @@
                 <w:sz w:val="15"/>
               </w:rPr>
               <w:t>K3-13, K3-15; KM-Z7</w:t>
+            </w:r>
+          </w:p>
+        </w:tc>
+        <w:tc>
+          <w:tcPr>
+            <w:tcW w:type="dxa" w:w="737"/>
+          </w:tcPr>
+          <w:p>
+            <w:pPr>
+              <w:spacing w:after="20"/>
+            </w:pPr>
+            <w:r/>
+            <w:r>
+              <w:rPr>
+                <w:b w:val="0"/>
+                <w:sz w:val="15"/>
+              </w:rPr>
+              <w:t>WYSOKI</w:t>
+            </w:r>
+          </w:p>
+        </w:tc>
+      </w:tr>
+      <w:tr>
+        <w:tc>
+          <w:tcPr>
+            <w:tcW w:type="dxa" w:w="567"/>
+          </w:tcPr>
+          <w:p>
+            <w:pPr>
+              <w:spacing w:after="20"/>
+            </w:pPr>
+            <w:r/>
+            <w:r>
+              <w:rPr>
+                <w:b w:val="0"/>
+                <w:sz w:val="15"/>
+              </w:rPr>
+              <w:t>N29</w:t>
+            </w:r>
+          </w:p>
+        </w:tc>
+        <w:tc>
+          <w:tcPr>
+            <w:tcW w:type="dxa" w:w="1871"/>
+          </w:tcPr>
+          <w:p>
+            <w:pPr>
+              <w:spacing w:after="20"/>
+            </w:pPr>
+            <w:r/>
+            <w:r>
+              <w:rPr>
+                <w:b w:val="0"/>
+                <w:sz w:val="15"/>
+              </w:rPr>
+              <w:t>6.4 Podwykonawcy i pozycja podwykonawstwa Z9 (nazwa i opis)</w:t>
+            </w:r>
+          </w:p>
+        </w:tc>
+        <w:tc>
+          <w:tcPr>
+            <w:tcW w:type="dxa" w:w="2041"/>
+          </w:tcPr>
+          <w:p>
+            <w:pPr>
+              <w:spacing w:after="20"/>
+            </w:pPr>
+            <w:r/>
+            <w:r>
+              <w:rPr>
+                <w:b w:val="0"/>
+                <w:sz w:val="15"/>
+              </w:rPr>
+              <w:t>„instalacja finalnych, zwalidowanych zestawów prototypowych oraz demontaż”.</w:t>
+            </w:r>
+          </w:p>
+        </w:tc>
+        <w:tc>
+          <w:tcPr>
+            <w:tcW w:type="dxa" w:w="3175"/>
+          </w:tcPr>
+          <w:p>
+            <w:pPr>
+              <w:spacing w:after="20"/>
+            </w:pPr>
+            <w:r/>
+            <w:r>
+              <w:rPr>
+                <w:b w:val="0"/>
+                <w:sz w:val="15"/>
+              </w:rPr>
+              <w:t>Po zmianie harmonogramu Z7 i Z9 pierwsze zestawy są instalowane w Fazie A (M22). Zmienić nazwę pozycji na „montaż zestawów prototypowych i demontaż po walidacji”, bez słów „finalnych, zwalidowanych”. Zakres: wyłącznie montaż i demontaż.</w:t>
+            </w:r>
+          </w:p>
+        </w:tc>
+        <w:tc>
+          <w:tcPr>
+            <w:tcW w:type="dxa" w:w="1247"/>
+          </w:tcPr>
+          <w:p>
+            <w:pPr>
+              <w:spacing w:after="20"/>
+            </w:pPr>
+            <w:r/>
+            <w:r>
+              <w:rPr>
+                <w:b w:val="0"/>
+                <w:sz w:val="15"/>
+              </w:rPr>
+              <w:t>K3-44; opis Z9, opis Z7</w:t>
             </w:r>
           </w:p>
         </w:tc>
@@ -21184,7 +21363,7 @@
                 <w:b w:val="0"/>
                 <w:sz w:val="17"/>
               </w:rPr>
-              <w:t>3876/4000</w:t>
+              <w:t>3890/4000</w:t>
             </w:r>
           </w:p>
         </w:tc>
@@ -21220,7 +21399,7 @@
                 <w:b w:val="0"/>
                 <w:sz w:val="17"/>
               </w:rPr>
-              <w:t>923/1300</w:t>
+              <w:t>980/1300</w:t>
             </w:r>
           </w:p>
         </w:tc>
@@ -21384,7 +21563,7 @@
                 <w:b w:val="0"/>
                 <w:sz w:val="17"/>
               </w:rPr>
-              <w:t>794/1300</w:t>
+              <w:t>802/1300</w:t>
             </w:r>
           </w:p>
         </w:tc>
@@ -21768,7 +21947,7 @@
                 <w:b w:val="0"/>
                 <w:sz w:val="17"/>
               </w:rPr>
-              <w:t>3170/4000</w:t>
+              <w:t>3205/4000</w:t>
             </w:r>
           </w:p>
         </w:tc>
@@ -21914,7 +22093,7 @@
                 <w:b w:val="0"/>
                 <w:sz w:val="17"/>
               </w:rPr>
-              <w:t>3518/4000</w:t>
+              <w:t>3515/4000</w:t>
             </w:r>
           </w:p>
         </w:tc>
@@ -22042,7 +22221,7 @@
                 <w:b w:val="0"/>
                 <w:sz w:val="17"/>
               </w:rPr>
-              <w:t>3489/4000</w:t>
+              <w:t>3500/4000</w:t>
             </w:r>
           </w:p>
         </w:tc>
@@ -22060,7 +22239,7 @@
                 <w:b w:val="0"/>
                 <w:sz w:val="17"/>
               </w:rPr>
-              <w:t>3267/4000</w:t>
+              <w:t>3503/4000</w:t>
             </w:r>
           </w:p>
         </w:tc>
@@ -22132,7 +22311,7 @@
                 <w:b w:val="0"/>
                 <w:sz w:val="17"/>
               </w:rPr>
-              <w:t>902/1300</w:t>
+              <w:t>964/1300</w:t>
             </w:r>
           </w:p>
         </w:tc>
@@ -22334,7 +22513,7 @@
                 <w:b w:val="0"/>
                 <w:sz w:val="17"/>
               </w:rPr>
-              <w:t>3938/4000</w:t>
+              <w:t>3936/4000</w:t>
             </w:r>
           </w:p>
         </w:tc>
@@ -22352,7 +22531,7 @@
                 <w:b w:val="0"/>
                 <w:sz w:val="17"/>
               </w:rPr>
-              <w:t>3845/4000</w:t>
+              <w:t>3942/4000</w:t>
             </w:r>
           </w:p>
         </w:tc>

</xml_diff>

<commit_message>
D29: wariant wlasciciela (M19-M21 50/50 Z6/Z7, M22-M27 po 1/3, M28-M30 Z9), arkusz 10 z formulami
Co-Authored-By: Claude Sonnet 5.5 <noreply@anthropic.com>
Claude-Session: https://claude.ai/code/session_01672WnJhixnEcarbb7uiwfx
</commit_message>
<xml_diff>
--- a/Opisy_zadan_z_kamieniami_milowymi.docx
+++ b/Opisy_zadan_z_kamieniami_milowymi.docx
@@ -2645,7 +2645,7 @@
           <w:color w:val="666666"/>
           <w:sz w:val="17"/>
         </w:rPr>
-        <w:t xml:space="preserve"> [3871 z 4000 znaków]</w:t>
+        <w:t xml:space="preserve"> [3900 z 4000 znaków]</w:t>
       </w:r>
     </w:p>
     <w:p>
@@ -2733,7 +2733,7 @@
         <w:rPr>
           <w:b w:val="0"/>
         </w:rPr>
-        <w:t>Zadanie będzie realizowane przez zespół Everest11. AI Lead zaprojektuje architekturę pipeline'u i fuzję źródeł oraz zoptymalizuje czas generacji. AI Senior Engineer zaimplementuje integrację change detection i generator raportu klasyfikatora ML z wyjaśnieniami SHAP. Cybersecurity / AI Act Specialist zaimplementuje podpis kryptograficzny i integralność łańcucha dowodowego, bez prac prawnych i dokumentacyjnych. IT Specialist zaimplementuje pipeline i generator eFTI w XML i JSON, dwukierunkowe API z TMS oraz prototypowe integracje z Trans.eu, TimoCom i e-CMR w środowisku testowym, a także zmierzy czasy i opóźnienia w testach integracyjnych. Backend/Full-Stack Developer, w wymiarze 1,0 etatu przez 9 miesięcy od M19 do M27, zbuduje strumieniowy potok danych z embedded do pipeline'u, kolejkowanie i spójność przy utracie łączności, wesprze integracje testowe z TMS i platformami zewnętrznymi oraz wykona test zgodności eFTI z implementacją referencyjną Komisji Europejskiej. IoT Specialist zintegruje sygnał czujnika drzwi, synchronizację znaczników czasu GPS i agregację historii drgań, temperatury i wilgotności. Specjalista ds. logistyki TSL zinterpretuje operacyjnie pola eFTI i oceni treść PoL i PoC. Nakład, wynikający z podziału etatów między zadania Z6, Z7 i Z9 według faz prac, wynosi w miesiącach pracy w przeliczeniu na pełny etat: AI Lead 2,10, AI Senior Engineer 2,15, specjalista ds. cyberbezpieczeństwa 0,80, IT Specialist 3,40, IoT Specialist 0,65, specjalista ds. logistyki TSL 1,35.</w:t>
+        <w:t>Zadanie będzie realizowane przez zespół Everest11. AI Lead zaprojektuje architekturę pipeline'u i fuzję źródeł oraz zoptymalizuje czas generacji. AI Senior Engineer zaimplementuje integrację change detection i generator raportu klasyfikatora ML z wyjaśnieniami SHAP. Cybersecurity / AI Act Specialist zaimplementuje podpis kryptograficzny i integralność łańcucha dowodowego, bez prac prawnych i dokumentacyjnych. IT Specialist zaimplementuje pipeline i generator eFTI w XML i JSON, dwukierunkowe API z TMS oraz prototypowe integracje z Trans.eu, TimoCom i e-CMR w środowisku testowym, a także zmierzy czasy i opóźnienia w testach integracyjnych. Backend/Full-Stack Developer, w wymiarze 1,0 etatu przez 9 miesięcy od M19 do M27, zbuduje strumieniowy potok danych z embedded do pipeline'u, kolejkowanie i spójność przy utracie łączności, wesprze integracje testowe z TMS i platformami zewnętrznymi oraz wykona test zgodności eFTI z implementacją referencyjną Komisji Europejskiej. IoT Specialist zintegruje sygnał czujnika drzwi, synchronizację znaczników czasu GPS i agregację historii drgań, temperatury i wilgotności. Specjalista ds. logistyki TSL zinterpretuje operacyjnie pola eFTI i oceni treść PoL i PoC. Nakład, wynikający z podziału etatów między zadania Z6, Z7 i Z9 według stałych udziałów w trzech okresach, wynosi w miesiącach pracy w przeliczeniu na pełny etat: AI Lead 2,625, AI Senior Engineer 2,625, specjalista ds. cyberbezpieczeństwa 0,875, IT Specialist 3,50, IoT Specialist 1,75, specjalista ds. logistyki TSL 1,75.</w:t>
       </w:r>
     </w:p>
     <w:p>
@@ -3144,7 +3144,7 @@
           <w:color w:val="666666"/>
           <w:sz w:val="17"/>
         </w:rPr>
-        <w:t xml:space="preserve"> [3500 z 4000 znaków]</w:t>
+        <w:t xml:space="preserve"> [3529 z 4000 znaków]</w:t>
       </w:r>
     </w:p>
     <w:p>
@@ -3232,7 +3232,7 @@
         <w:rPr>
           <w:b w:val="0"/>
         </w:rPr>
-        <w:t>Zadanie będzie realizowane przez zespół Everest11. AI Lead wyznaczy strategię kompresji dla każdego modelu i budżet degradacji oraz zwaliduje modele na zbiorach testowych. AI Senior Engineer zaimplementuje kompresję i zoptymalizuje modele na platformie embedded. IoT Specialist zaprojektuje architekturę sprzętową i obudowę oraz zmierzy opóźnienie alertu. IT Specialist zaimplementuje oprogramowanie embedded (system czasu rzeczywistego, sterowniki sensorów, generator alertów, bufor GSM, aktualizacje OTA) i moduł komunikacji z TMS. Cybersecurity / AI Act Specialist zaprojektuje bezpieczny rozruch, podpisywanie aktualizacji i szyfrowanie transmisji. Specjalista ds. logistyki TSL zdefiniuje scenariusze walidacji alertów i progi niski, średni i wysoki dla każdej klasy ładunku oraz oceni użyteczność alertu w kabinie. Nakład, wynikający z podziału etatów między zadania Z6, Z7 i Z9 według faz prac, wynosi w miesiącach pracy w przeliczeniu na pełny etat: AI Lead 3,05, AI Senior Engineer 3,55, specjalista ds. cyberbezpieczeństwa 0,80, IT Specialist 3,45, IoT Specialist 2,25, specjalista ds. logistyki TSL 1,65. Montaż w pojazdach nie należy do tego zadania.</w:t>
+        <w:t>Zadanie będzie realizowane przez zespół Everest11. AI Lead wyznaczy strategię kompresji dla każdego modelu i budżet degradacji oraz zwaliduje modele na zbiorach testowych. AI Senior Engineer zaimplementuje kompresję i zoptymalizuje modele na platformie embedded. IoT Specialist zaprojektuje architekturę sprzętową i obudowę oraz zmierzy opóźnienie alertu. IT Specialist zaimplementuje oprogramowanie embedded (system czasu rzeczywistego, sterowniki sensorów, generator alertów, bufor GSM, aktualizacje OTA) i moduł komunikacji z TMS. Cybersecurity / AI Act Specialist zaprojektuje bezpieczny rozruch, podpisywanie aktualizacji i szyfrowanie transmisji. Specjalista ds. logistyki TSL zdefiniuje scenariusze walidacji alertów i progi niski, średni i wysoki dla każdej klasy ładunku oraz oceni użyteczność alertu w kabinie. Nakład, wynikający z podziału etatów między zadania Z6, Z7 i Z9 według stałych udziałów w trzech okresach, wynosi w miesiącach pracy w przeliczeniu na pełny etat: AI Lead 2,625, AI Senior Engineer 2,625, specjalista ds. cyberbezpieczeństwa 0,875, IT Specialist 3,50, IoT Specialist 1,75, specjalista ds. logistyki TSL 1,75. Montaż w pojazdach nie należy do tego zadania.</w:t>
       </w:r>
     </w:p>
     <w:p>
@@ -4075,7 +4075,7 @@
           <w:color w:val="666666"/>
           <w:sz w:val="17"/>
         </w:rPr>
-        <w:t xml:space="preserve"> [3936 z 4000 znaków]</w:t>
+        <w:t xml:space="preserve"> [3962 z 4000 znaków]</w:t>
       </w:r>
     </w:p>
     <w:p>
@@ -4239,7 +4239,7 @@
         <w:rPr>
           <w:b w:val="0"/>
         </w:rPr>
-        <w:t>Zadanie będzie realizowane przez zespół Everest11. AI Lead opracuje protokół walidacji KPI, zbierze i uporządkuje dane terenowe, obliczy metryki dla każdej klasy i przy stwierdzeniu domain shift przeprowadzi adaptację domenową. AI Senior Engineer zoptymalizuje modele na platformie, zdiagnozuje domain shift, wdroży korekty, zmierzy wskaźniki jakości i przygotuje raport KPI oraz anotację próbki co najmniej 200 obrazów terenowych, weryfikowaną przez specjalistę TSL, a także przeprowadzi badanie akceptacji użytkowników według scenariuszy specjalisty TSL. IoT Specialist odbierze zestawy po montażu, skalibruje je i zarejestruje parametry niezawodności sprzętu. IT Specialist zbierze logi (dostępność, status GSM, bufor), zmierzy czas PoC i opóźnienia oraz opracuje dane do raportu KPI. Cybersecurity / AI Act Specialist wykona testy bezpieczeństwa prototypu w terenie i uruchomi zamrożony skrypt ewaluacyjny jako niezależny ewaluator. Specjalista ds. logistyki TSL poprowadzi inspekcje ground truth i zweryfikuje anotację próbki obrazów. Backend/Full-Stack Developer, w wymiarze 1,0 etatu przez 3 miesiące od M28 do M30, obsłuży walidację PoC i zgodności eFTI w terenie na co najmniej 200 cyklach oraz analizę błędów. Nakład pozostałych osób, wynikający z podziału etatów między zadania Z6, Z7 i Z9 według faz prac, wynosi w miesiącach pracy w przeliczeniu na pełny etat: AI Lead 3,85, AI Senior Engineer 3,30, specjalista ds. cyberbezpieczeństwa 1,40, IT Specialist 5,15, IoT Specialist 3,10, specjalista ds. logistyki TSL 3,00.</w:t>
+        <w:t>Zadanie będzie realizowane przez zespół Everest11. AI Lead opracuje protokół walidacji KPI, zbierze i uporządkuje dane terenowe, obliczy metryki dla każdej klasy i przy stwierdzeniu domain shift przeprowadzi adaptację domenową. AI Senior Engineer zoptymalizuje modele na platformie, zdiagnozuje domain shift, wdroży korekty, zmierzy wskaźniki jakości i przygotuje raport KPI oraz anotację próbki co najmniej 200 obrazów terenowych, weryfikowaną przez specjalistę TSL, a także przeprowadzi badanie akceptacji użytkowników według scenariuszy specjalisty TSL. IoT Specialist odbierze zestawy po montażu, skalibruje je i zarejestruje parametry niezawodności sprzętu. IT Specialist zbierze logi (dostępność, status GSM, bufor), zmierzy czas PoC i opóźnienia oraz opracuje dane do raportu KPI. Cybersecurity / AI Act Specialist wykona testy bezpieczeństwa prototypu w terenie i uruchomi zamrożony skrypt ewaluacyjny jako niezależny ewaluator. Specjalista ds. logistyki TSL poprowadzi inspekcje ground truth i zweryfikuje anotację próbki obrazów. Backend/Full-Stack Developer, w wymiarze 1,0 etatu przez 3 miesiące od M28 do M30, obsłuży walidację PoC i zgodności eFTI w terenie na co najmniej 200 cyklach oraz analizę błędów. Nakład pozostałych osób, wynikający z podziału etatów między zadania Z6, Z7 i Z9 według stałych udziałów w trzech okresach, wynosi w miesiącach pracy w przeliczeniu na pełny etat: AI Lead 3,75, AI Senior Engineer 3,75, specjalista ds. cyberbezpieczeństwa 1,25, IT Specialist 5,00, IoT Specialist 2,50, specjalista ds. logistyki TSL 2,50.</w:t>
       </w:r>
     </w:p>
     <w:p>
@@ -7071,7 +7071,7 @@
         <w:rPr>
           <w:b w:val="0"/>
         </w:rPr>
-        <w:t>Budżet dzielił dotąd 12 miesięcy fazy prac rozwojowych równo na trzy zadania, co ekspert zakwestionował w uwagach 36 i 37 (zadania Z6 i Z7 trwają 9 miesięcy, a koszt odpowiadał 12 miesiącom). Poniżej podział według rzeczywistego przebiegu prac. Dla każdego z sześciu stanowisk suma nakładów w trzech zadaniach w każdym miesiącu równa się jego etatowi, a suma za M19-M30 i koszt łączny każdego stanowiska nie zmieniają się. Zmienia się tylko podział kosztu między zadania. Wszystkie trzy zadania są pracami rozwojowymi o tej samej intensywności pomocy (60%), więc kwota dofinansowania nie zmienia się.</w:t>
+        <w:t>Budżet dzielił dotąd 12 miesięcy fazy prac rozwojowych równo na trzy zadania, co ekspert zakwestionował w uwagach 36 i 37 (zadania Z6 i Z7 trwają 9 miesięcy, a koszt odpowiadał 12 miesiącom). Przyjęty wariant, uzgodniony z właścicielem, ma trzy okresy ze stałymi udziałami czasu pracy: w M19-M21 działają tylko zadania Z6 i Z7 (po 50% czasu pracy w projekcie), w M22-M27 równolegle trzy zadania (po jednej trzeciej), w M28-M30 tylko zadanie Z9 (100%). Udziały są takie same dla wszystkich sześciu stanowisk, więc w zakresie czynności każdej osoby wpisuje się trzy stałe proporcje. Suma nakładów w każdym miesiącu równa się etatowi stanowiska, a koszt łączny każdego stanowiska nie zmienia się. Wszystkie trzy zadania są pracami rozwojowymi o tej samej intensywności pomocy (60%), więc kwota dofinansowania nie zmienia się.</w:t>
       </w:r>
     </w:p>
     <w:p>
@@ -7079,7 +7079,7 @@
         <w:pStyle w:val="Heading2"/>
       </w:pPr>
       <w:r>
-        <w:t>Tabela 1. Nakład w zadaniach Z6 / Z7 / Z9 w fazach (etat)</w:t>
+        <w:t>Tabela 1. Udział czasu pracy w projekcie w okresach (Z6 / Z7 / Z9)</w:t>
       </w:r>
     </w:p>
     <w:tbl>
@@ -7090,17 +7090,15 @@
         <w:tblLook w:firstColumn="1" w:firstRow="1" w:lastColumn="0" w:lastRow="0" w:noHBand="0" w:noVBand="1" w:val="04A0"/>
       </w:tblPr>
       <w:tblGrid>
-        <w:gridCol w:w="1606"/>
-        <w:gridCol w:w="1606"/>
-        <w:gridCol w:w="1606"/>
-        <w:gridCol w:w="1606"/>
-        <w:gridCol w:w="1606"/>
-        <w:gridCol w:w="1606"/>
+        <w:gridCol w:w="2409"/>
+        <w:gridCol w:w="2409"/>
+        <w:gridCol w:w="2409"/>
+        <w:gridCol w:w="2409"/>
       </w:tblGrid>
       <w:tr>
         <w:tc>
           <w:tcPr>
-            <w:tcW w:type="dxa" w:w="2948"/>
+            <w:tcW w:type="dxa" w:w="1814"/>
             <w:shd w:val="clear" w:color="auto" w:fill="D9E2F3"/>
           </w:tcPr>
           <w:p>
@@ -7111,15 +7109,15 @@
             <w:r>
               <w:rPr>
                 <w:b/>
-                <w:sz w:val="16"/>
-              </w:rPr>
-              <w:t>Stanowisko (etat)</w:t>
-            </w:r>
-          </w:p>
-        </w:tc>
-        <w:tc>
-          <w:tcPr>
-            <w:tcW w:type="dxa" w:w="1361"/>
+                <w:sz w:val="17"/>
+              </w:rPr>
+              <w:t>Okres</w:t>
+            </w:r>
+          </w:p>
+        </w:tc>
+        <w:tc>
+          <w:tcPr>
+            <w:tcW w:type="dxa" w:w="1474"/>
             <w:shd w:val="clear" w:color="auto" w:fill="D9E2F3"/>
           </w:tcPr>
           <w:p>
@@ -7130,15 +7128,15 @@
             <w:r>
               <w:rPr>
                 <w:b/>
-                <w:sz w:val="16"/>
-              </w:rPr>
-              <w:t>M19-M21</w:t>
-            </w:r>
-          </w:p>
-        </w:tc>
-        <w:tc>
-          <w:tcPr>
-            <w:tcW w:type="dxa" w:w="1361"/>
+                <w:sz w:val="17"/>
+              </w:rPr>
+              <w:t>Zadania</w:t>
+            </w:r>
+          </w:p>
+        </w:tc>
+        <w:tc>
+          <w:tcPr>
+            <w:tcW w:type="dxa" w:w="2381"/>
             <w:shd w:val="clear" w:color="auto" w:fill="D9E2F3"/>
           </w:tcPr>
           <w:p>
@@ -7149,15 +7147,15 @@
             <w:r>
               <w:rPr>
                 <w:b/>
-                <w:sz w:val="16"/>
-              </w:rPr>
-              <w:t>M22</w:t>
-            </w:r>
-          </w:p>
-        </w:tc>
-        <w:tc>
-          <w:tcPr>
-            <w:tcW w:type="dxa" w:w="1361"/>
+                <w:sz w:val="17"/>
+              </w:rPr>
+              <w:t>Udział Z6 / Z7 / Z9</w:t>
+            </w:r>
+          </w:p>
+        </w:tc>
+        <w:tc>
+          <w:tcPr>
+            <w:tcW w:type="dxa" w:w="2835"/>
             <w:shd w:val="clear" w:color="auto" w:fill="D9E2F3"/>
           </w:tcPr>
           <w:p>
@@ -7168,47 +7166,9 @@
             <w:r>
               <w:rPr>
                 <w:b/>
-                <w:sz w:val="16"/>
-              </w:rPr>
-              <w:t>M23-M25</w:t>
-            </w:r>
-          </w:p>
-        </w:tc>
-        <w:tc>
-          <w:tcPr>
-            <w:tcW w:type="dxa" w:w="1361"/>
-            <w:shd w:val="clear" w:color="auto" w:fill="D9E2F3"/>
-          </w:tcPr>
-          <w:p>
-            <w:pPr>
-              <w:spacing w:after="20"/>
-            </w:pPr>
-            <w:r/>
-            <w:r>
-              <w:rPr>
-                <w:b/>
-                <w:sz w:val="16"/>
-              </w:rPr>
-              <w:t>M26-M27</w:t>
-            </w:r>
-          </w:p>
-        </w:tc>
-        <w:tc>
-          <w:tcPr>
-            <w:tcW w:type="dxa" w:w="1361"/>
-            <w:shd w:val="clear" w:color="auto" w:fill="D9E2F3"/>
-          </w:tcPr>
-          <w:p>
-            <w:pPr>
-              <w:spacing w:after="20"/>
-            </w:pPr>
-            <w:r/>
-            <w:r>
-              <w:rPr>
-                <w:b/>
-                <w:sz w:val="16"/>
-              </w:rPr>
-              <w:t>M28-M30</w:t>
+                <w:sz w:val="17"/>
+              </w:rPr>
+              <w:t>Uwagi</w:t>
             </w:r>
           </w:p>
         </w:tc>
@@ -7216,109 +7176,73 @@
       <w:tr>
         <w:tc>
           <w:tcPr>
-            <w:tcW w:type="dxa" w:w="2948"/>
-          </w:tcPr>
-          <w:p>
-            <w:pPr>
-              <w:spacing w:after="20"/>
-            </w:pPr>
-            <w:r/>
-            <w:r>
-              <w:rPr>
-                <w:b w:val="0"/>
-                <w:sz w:val="16"/>
-              </w:rPr>
-              <w:t>AI Lead (0,75)</w:t>
-            </w:r>
-          </w:p>
-        </w:tc>
-        <w:tc>
-          <w:tcPr>
-            <w:tcW w:type="dxa" w:w="1361"/>
-          </w:tcPr>
-          <w:p>
-            <w:pPr>
-              <w:spacing w:after="20"/>
-            </w:pPr>
-            <w:r/>
-            <w:r>
-              <w:rPr>
-                <w:b w:val="0"/>
-                <w:sz w:val="16"/>
-              </w:rPr>
-              <w:t>0,30 / 0,45 / 0,00</w:t>
-            </w:r>
-          </w:p>
-        </w:tc>
-        <w:tc>
-          <w:tcPr>
-            <w:tcW w:type="dxa" w:w="1361"/>
-          </w:tcPr>
-          <w:p>
-            <w:pPr>
-              <w:spacing w:after="20"/>
-            </w:pPr>
-            <w:r/>
-            <w:r>
-              <w:rPr>
-                <w:b w:val="0"/>
-                <w:sz w:val="16"/>
-              </w:rPr>
-              <w:t>0,30 / 0,30 / 0,15</w:t>
-            </w:r>
-          </w:p>
-        </w:tc>
-        <w:tc>
-          <w:tcPr>
-            <w:tcW w:type="dxa" w:w="1361"/>
-          </w:tcPr>
-          <w:p>
-            <w:pPr>
-              <w:spacing w:after="20"/>
-            </w:pPr>
-            <w:r/>
-            <w:r>
-              <w:rPr>
-                <w:b w:val="0"/>
-                <w:sz w:val="16"/>
-              </w:rPr>
-              <w:t>0,20 / 0,30 / 0,25</w:t>
-            </w:r>
-          </w:p>
-        </w:tc>
-        <w:tc>
-          <w:tcPr>
-            <w:tcW w:type="dxa" w:w="1361"/>
-          </w:tcPr>
-          <w:p>
-            <w:pPr>
-              <w:spacing w:after="20"/>
-            </w:pPr>
-            <w:r/>
-            <w:r>
-              <w:rPr>
-                <w:b w:val="0"/>
-                <w:sz w:val="16"/>
-              </w:rPr>
-              <w:t>0,15 / 0,25 / 0,35</w:t>
-            </w:r>
-          </w:p>
-        </w:tc>
-        <w:tc>
-          <w:tcPr>
-            <w:tcW w:type="dxa" w:w="1361"/>
-          </w:tcPr>
-          <w:p>
-            <w:pPr>
-              <w:spacing w:after="20"/>
-            </w:pPr>
-            <w:r/>
-            <w:r>
-              <w:rPr>
-                <w:b w:val="0"/>
-                <w:sz w:val="16"/>
-              </w:rPr>
-              <w:t>0,00 / 0,00 / 0,75</w:t>
+            <w:tcW w:type="dxa" w:w="1814"/>
+          </w:tcPr>
+          <w:p>
+            <w:pPr>
+              <w:spacing w:after="20"/>
+            </w:pPr>
+            <w:r/>
+            <w:r>
+              <w:rPr>
+                <w:b w:val="0"/>
+                <w:sz w:val="17"/>
+              </w:rPr>
+              <w:t>M19-M21 (3 mc)</w:t>
+            </w:r>
+          </w:p>
+        </w:tc>
+        <w:tc>
+          <w:tcPr>
+            <w:tcW w:type="dxa" w:w="1474"/>
+          </w:tcPr>
+          <w:p>
+            <w:pPr>
+              <w:spacing w:after="20"/>
+            </w:pPr>
+            <w:r/>
+            <w:r>
+              <w:rPr>
+                <w:b w:val="0"/>
+                <w:sz w:val="17"/>
+              </w:rPr>
+              <w:t>Z6, Z7</w:t>
+            </w:r>
+          </w:p>
+        </w:tc>
+        <w:tc>
+          <w:tcPr>
+            <w:tcW w:type="dxa" w:w="2381"/>
+          </w:tcPr>
+          <w:p>
+            <w:pPr>
+              <w:spacing w:after="20"/>
+            </w:pPr>
+            <w:r/>
+            <w:r>
+              <w:rPr>
+                <w:b w:val="0"/>
+                <w:sz w:val="17"/>
+              </w:rPr>
+              <w:t>50% / 50% / 0%</w:t>
+            </w:r>
+          </w:p>
+        </w:tc>
+        <w:tc>
+          <w:tcPr>
+            <w:tcW w:type="dxa" w:w="2835"/>
+          </w:tcPr>
+          <w:p>
+            <w:pPr>
+              <w:spacing w:after="20"/>
+            </w:pPr>
+            <w:r/>
+            <w:r>
+              <w:rPr>
+                <w:b w:val="0"/>
+                <w:sz w:val="17"/>
+              </w:rPr>
+              <w:t>Z9 jeszcze się nie zaczęło</w:t>
             </w:r>
           </w:p>
         </w:tc>
@@ -7326,109 +7250,73 @@
       <w:tr>
         <w:tc>
           <w:tcPr>
-            <w:tcW w:type="dxa" w:w="2948"/>
-          </w:tcPr>
-          <w:p>
-            <w:pPr>
-              <w:spacing w:after="20"/>
-            </w:pPr>
-            <w:r/>
-            <w:r>
-              <w:rPr>
-                <w:b w:val="0"/>
-                <w:sz w:val="16"/>
-              </w:rPr>
-              <w:t>AI Senior Engineer (0,75)</w:t>
-            </w:r>
-          </w:p>
-        </w:tc>
-        <w:tc>
-          <w:tcPr>
-            <w:tcW w:type="dxa" w:w="1361"/>
-          </w:tcPr>
-          <w:p>
-            <w:pPr>
-              <w:spacing w:after="20"/>
-            </w:pPr>
-            <w:r/>
-            <w:r>
-              <w:rPr>
-                <w:b w:val="0"/>
-                <w:sz w:val="16"/>
-              </w:rPr>
-              <w:t>0,15 / 0,60 / 0,00</w:t>
-            </w:r>
-          </w:p>
-        </w:tc>
-        <w:tc>
-          <w:tcPr>
-            <w:tcW w:type="dxa" w:w="1361"/>
-          </w:tcPr>
-          <w:p>
-            <w:pPr>
-              <w:spacing w:after="20"/>
-            </w:pPr>
-            <w:r/>
-            <w:r>
-              <w:rPr>
-                <w:b w:val="0"/>
-                <w:sz w:val="16"/>
-              </w:rPr>
-              <w:t>0,20 / 0,45 / 0,10</w:t>
-            </w:r>
-          </w:p>
-        </w:tc>
-        <w:tc>
-          <w:tcPr>
-            <w:tcW w:type="dxa" w:w="1361"/>
-          </w:tcPr>
-          <w:p>
-            <w:pPr>
-              <w:spacing w:after="20"/>
-            </w:pPr>
-            <w:r/>
-            <w:r>
-              <w:rPr>
-                <w:b w:val="0"/>
-                <w:sz w:val="16"/>
-              </w:rPr>
-              <w:t>0,30 / 0,30 / 0,15</w:t>
-            </w:r>
-          </w:p>
-        </w:tc>
-        <w:tc>
-          <w:tcPr>
-            <w:tcW w:type="dxa" w:w="1361"/>
-          </w:tcPr>
-          <w:p>
-            <w:pPr>
-              <w:spacing w:after="20"/>
-            </w:pPr>
-            <w:r/>
-            <w:r>
-              <w:rPr>
-                <w:b w:val="0"/>
-                <w:sz w:val="16"/>
-              </w:rPr>
-              <w:t>0,30 / 0,20 / 0,25</w:t>
-            </w:r>
-          </w:p>
-        </w:tc>
-        <w:tc>
-          <w:tcPr>
-            <w:tcW w:type="dxa" w:w="1361"/>
-          </w:tcPr>
-          <w:p>
-            <w:pPr>
-              <w:spacing w:after="20"/>
-            </w:pPr>
-            <w:r/>
-            <w:r>
-              <w:rPr>
-                <w:b w:val="0"/>
-                <w:sz w:val="16"/>
-              </w:rPr>
-              <w:t>0,00 / 0,00 / 0,75</w:t>
+            <w:tcW w:type="dxa" w:w="1814"/>
+          </w:tcPr>
+          <w:p>
+            <w:pPr>
+              <w:spacing w:after="20"/>
+            </w:pPr>
+            <w:r/>
+            <w:r>
+              <w:rPr>
+                <w:b w:val="0"/>
+                <w:sz w:val="17"/>
+              </w:rPr>
+              <w:t>M22-M27 (6 mc)</w:t>
+            </w:r>
+          </w:p>
+        </w:tc>
+        <w:tc>
+          <w:tcPr>
+            <w:tcW w:type="dxa" w:w="1474"/>
+          </w:tcPr>
+          <w:p>
+            <w:pPr>
+              <w:spacing w:after="20"/>
+            </w:pPr>
+            <w:r/>
+            <w:r>
+              <w:rPr>
+                <w:b w:val="0"/>
+                <w:sz w:val="17"/>
+              </w:rPr>
+              <w:t>Z6, Z7, Z9</w:t>
+            </w:r>
+          </w:p>
+        </w:tc>
+        <w:tc>
+          <w:tcPr>
+            <w:tcW w:type="dxa" w:w="2381"/>
+          </w:tcPr>
+          <w:p>
+            <w:pPr>
+              <w:spacing w:after="20"/>
+            </w:pPr>
+            <w:r/>
+            <w:r>
+              <w:rPr>
+                <w:b w:val="0"/>
+                <w:sz w:val="17"/>
+              </w:rPr>
+              <w:t>33,3% / 33,3% / 33,3%</w:t>
+            </w:r>
+          </w:p>
+        </w:tc>
+        <w:tc>
+          <w:tcPr>
+            <w:tcW w:type="dxa" w:w="2835"/>
+          </w:tcPr>
+          <w:p>
+            <w:pPr>
+              <w:spacing w:after="20"/>
+            </w:pPr>
+            <w:r/>
+            <w:r>
+              <w:rPr>
+                <w:b w:val="0"/>
+                <w:sz w:val="17"/>
+              </w:rPr>
+              <w:t>trzy zadania równolegle</w:t>
             </w:r>
           </w:p>
         </w:tc>
@@ -7436,439 +7324,73 @@
       <w:tr>
         <w:tc>
           <w:tcPr>
-            <w:tcW w:type="dxa" w:w="2948"/>
-          </w:tcPr>
-          <w:p>
-            <w:pPr>
-              <w:spacing w:after="20"/>
-            </w:pPr>
-            <w:r/>
-            <w:r>
-              <w:rPr>
-                <w:b w:val="0"/>
-                <w:sz w:val="16"/>
-              </w:rPr>
-              <w:t>Cybersecurity / AI Act Specialist (0,25)</w:t>
-            </w:r>
-          </w:p>
-        </w:tc>
-        <w:tc>
-          <w:tcPr>
-            <w:tcW w:type="dxa" w:w="1361"/>
-          </w:tcPr>
-          <w:p>
-            <w:pPr>
-              <w:spacing w:after="20"/>
-            </w:pPr>
-            <w:r/>
-            <w:r>
-              <w:rPr>
-                <w:b w:val="0"/>
-                <w:sz w:val="16"/>
-              </w:rPr>
-              <w:t>0,15 / 0,10 / 0,00</w:t>
-            </w:r>
-          </w:p>
-        </w:tc>
-        <w:tc>
-          <w:tcPr>
-            <w:tcW w:type="dxa" w:w="1361"/>
-          </w:tcPr>
-          <w:p>
-            <w:pPr>
-              <w:spacing w:after="20"/>
-            </w:pPr>
-            <w:r/>
-            <w:r>
-              <w:rPr>
-                <w:b w:val="0"/>
-                <w:sz w:val="16"/>
-              </w:rPr>
-              <w:t>0,10 / 0,10 / 0,05</w:t>
-            </w:r>
-          </w:p>
-        </w:tc>
-        <w:tc>
-          <w:tcPr>
-            <w:tcW w:type="dxa" w:w="1361"/>
-          </w:tcPr>
-          <w:p>
-            <w:pPr>
-              <w:spacing w:after="20"/>
-            </w:pPr>
-            <w:r/>
-            <w:r>
-              <w:rPr>
-                <w:b w:val="0"/>
-                <w:sz w:val="16"/>
-              </w:rPr>
-              <w:t>0,05 / 0,10 / 0,10</w:t>
-            </w:r>
-          </w:p>
-        </w:tc>
-        <w:tc>
-          <w:tcPr>
-            <w:tcW w:type="dxa" w:w="1361"/>
-          </w:tcPr>
-          <w:p>
-            <w:pPr>
-              <w:spacing w:after="20"/>
-            </w:pPr>
-            <w:r/>
-            <w:r>
-              <w:rPr>
-                <w:b w:val="0"/>
-                <w:sz w:val="16"/>
-              </w:rPr>
-              <w:t>0,05 / 0,05 / 0,15</w:t>
-            </w:r>
-          </w:p>
-        </w:tc>
-        <w:tc>
-          <w:tcPr>
-            <w:tcW w:type="dxa" w:w="1361"/>
-          </w:tcPr>
-          <w:p>
-            <w:pPr>
-              <w:spacing w:after="20"/>
-            </w:pPr>
-            <w:r/>
-            <w:r>
-              <w:rPr>
-                <w:b w:val="0"/>
-                <w:sz w:val="16"/>
-              </w:rPr>
-              <w:t>0,00 / 0,00 / 0,25</w:t>
-            </w:r>
-          </w:p>
-        </w:tc>
-      </w:tr>
-      <w:tr>
-        <w:tc>
-          <w:tcPr>
-            <w:tcW w:type="dxa" w:w="2948"/>
-          </w:tcPr>
-          <w:p>
-            <w:pPr>
-              <w:spacing w:after="20"/>
-            </w:pPr>
-            <w:r/>
-            <w:r>
-              <w:rPr>
-                <w:b w:val="0"/>
-                <w:sz w:val="16"/>
-              </w:rPr>
-              <w:t>IT Specialist (1,00)</w:t>
-            </w:r>
-          </w:p>
-        </w:tc>
-        <w:tc>
-          <w:tcPr>
-            <w:tcW w:type="dxa" w:w="1361"/>
-          </w:tcPr>
-          <w:p>
-            <w:pPr>
-              <w:spacing w:after="20"/>
-            </w:pPr>
-            <w:r/>
-            <w:r>
-              <w:rPr>
-                <w:b w:val="0"/>
-                <w:sz w:val="16"/>
-              </w:rPr>
-              <w:t>0,45 / 0,55 / 0,00</w:t>
-            </w:r>
-          </w:p>
-        </w:tc>
-        <w:tc>
-          <w:tcPr>
-            <w:tcW w:type="dxa" w:w="1361"/>
-          </w:tcPr>
-          <w:p>
-            <w:pPr>
-              <w:spacing w:after="20"/>
-            </w:pPr>
-            <w:r/>
-            <w:r>
-              <w:rPr>
-                <w:b w:val="0"/>
-                <w:sz w:val="16"/>
-              </w:rPr>
-              <w:t>0,40 / 0,45 / 0,15</w:t>
-            </w:r>
-          </w:p>
-        </w:tc>
-        <w:tc>
-          <w:tcPr>
-            <w:tcW w:type="dxa" w:w="1361"/>
-          </w:tcPr>
-          <w:p>
-            <w:pPr>
-              <w:spacing w:after="20"/>
-            </w:pPr>
-            <w:r/>
-            <w:r>
-              <w:rPr>
-                <w:b w:val="0"/>
-                <w:sz w:val="16"/>
-              </w:rPr>
-              <w:t>0,35 / 0,35 / 0,30</w:t>
-            </w:r>
-          </w:p>
-        </w:tc>
-        <w:tc>
-          <w:tcPr>
-            <w:tcW w:type="dxa" w:w="1361"/>
-          </w:tcPr>
-          <w:p>
-            <w:pPr>
-              <w:spacing w:after="20"/>
-            </w:pPr>
-            <w:r/>
-            <w:r>
-              <w:rPr>
-                <w:b w:val="0"/>
-                <w:sz w:val="16"/>
-              </w:rPr>
-              <w:t>0,30 / 0,15 / 0,55</w:t>
-            </w:r>
-          </w:p>
-        </w:tc>
-        <w:tc>
-          <w:tcPr>
-            <w:tcW w:type="dxa" w:w="1361"/>
-          </w:tcPr>
-          <w:p>
-            <w:pPr>
-              <w:spacing w:after="20"/>
-            </w:pPr>
-            <w:r/>
-            <w:r>
-              <w:rPr>
-                <w:b w:val="0"/>
-                <w:sz w:val="16"/>
-              </w:rPr>
-              <w:t>0,00 / 0,00 / 1,00</w:t>
-            </w:r>
-          </w:p>
-        </w:tc>
-      </w:tr>
-      <w:tr>
-        <w:tc>
-          <w:tcPr>
-            <w:tcW w:type="dxa" w:w="2948"/>
-          </w:tcPr>
-          <w:p>
-            <w:pPr>
-              <w:spacing w:after="20"/>
-            </w:pPr>
-            <w:r/>
-            <w:r>
-              <w:rPr>
-                <w:b w:val="0"/>
-                <w:sz w:val="16"/>
-              </w:rPr>
-              <w:t>IoT Specialist (0,50)</w:t>
-            </w:r>
-          </w:p>
-        </w:tc>
-        <w:tc>
-          <w:tcPr>
-            <w:tcW w:type="dxa" w:w="1361"/>
-          </w:tcPr>
-          <w:p>
-            <w:pPr>
-              <w:spacing w:after="20"/>
-            </w:pPr>
-            <w:r/>
-            <w:r>
-              <w:rPr>
-                <w:b w:val="0"/>
-                <w:sz w:val="16"/>
-              </w:rPr>
-              <w:t>0,10 / 0,40 / 0,00</w:t>
-            </w:r>
-          </w:p>
-        </w:tc>
-        <w:tc>
-          <w:tcPr>
-            <w:tcW w:type="dxa" w:w="1361"/>
-          </w:tcPr>
-          <w:p>
-            <w:pPr>
-              <w:spacing w:after="20"/>
-            </w:pPr>
-            <w:r/>
-            <w:r>
-              <w:rPr>
-                <w:b w:val="0"/>
-                <w:sz w:val="16"/>
-              </w:rPr>
-              <w:t>0,10 / 0,25 / 0,15</w:t>
-            </w:r>
-          </w:p>
-        </w:tc>
-        <w:tc>
-          <w:tcPr>
-            <w:tcW w:type="dxa" w:w="1361"/>
-          </w:tcPr>
-          <w:p>
-            <w:pPr>
-              <w:spacing w:after="20"/>
-            </w:pPr>
-            <w:r/>
-            <w:r>
-              <w:rPr>
-                <w:b w:val="0"/>
-                <w:sz w:val="16"/>
-              </w:rPr>
-              <w:t>0,05 / 0,20 / 0,25</w:t>
-            </w:r>
-          </w:p>
-        </w:tc>
-        <w:tc>
-          <w:tcPr>
-            <w:tcW w:type="dxa" w:w="1361"/>
-          </w:tcPr>
-          <w:p>
-            <w:pPr>
-              <w:spacing w:after="20"/>
-            </w:pPr>
-            <w:r/>
-            <w:r>
-              <w:rPr>
-                <w:b w:val="0"/>
-                <w:sz w:val="16"/>
-              </w:rPr>
-              <w:t>0,05 / 0,10 / 0,35</w:t>
-            </w:r>
-          </w:p>
-        </w:tc>
-        <w:tc>
-          <w:tcPr>
-            <w:tcW w:type="dxa" w:w="1361"/>
-          </w:tcPr>
-          <w:p>
-            <w:pPr>
-              <w:spacing w:after="20"/>
-            </w:pPr>
-            <w:r/>
-            <w:r>
-              <w:rPr>
-                <w:b w:val="0"/>
-                <w:sz w:val="16"/>
-              </w:rPr>
-              <w:t>0,00 / 0,00 / 0,50</w:t>
-            </w:r>
-          </w:p>
-        </w:tc>
-      </w:tr>
-      <w:tr>
-        <w:tc>
-          <w:tcPr>
-            <w:tcW w:type="dxa" w:w="2948"/>
-          </w:tcPr>
-          <w:p>
-            <w:pPr>
-              <w:spacing w:after="20"/>
-            </w:pPr>
-            <w:r/>
-            <w:r>
-              <w:rPr>
-                <w:b w:val="0"/>
-                <w:sz w:val="16"/>
-              </w:rPr>
-              <w:t>Specjalista ds. logistyki TSL (0,50)</w:t>
-            </w:r>
-          </w:p>
-        </w:tc>
-        <w:tc>
-          <w:tcPr>
-            <w:tcW w:type="dxa" w:w="1361"/>
-          </w:tcPr>
-          <w:p>
-            <w:pPr>
-              <w:spacing w:after="20"/>
-            </w:pPr>
-            <w:r/>
-            <w:r>
-              <w:rPr>
-                <w:b w:val="0"/>
-                <w:sz w:val="16"/>
-              </w:rPr>
-              <w:t>0,15 / 0,35 / 0,00</w:t>
-            </w:r>
-          </w:p>
-        </w:tc>
-        <w:tc>
-          <w:tcPr>
-            <w:tcW w:type="dxa" w:w="1361"/>
-          </w:tcPr>
-          <w:p>
-            <w:pPr>
-              <w:spacing w:after="20"/>
-            </w:pPr>
-            <w:r/>
-            <w:r>
-              <w:rPr>
-                <w:b w:val="0"/>
-                <w:sz w:val="16"/>
-              </w:rPr>
-              <w:t>0,15 / 0,20 / 0,15</w:t>
-            </w:r>
-          </w:p>
-        </w:tc>
-        <w:tc>
-          <w:tcPr>
-            <w:tcW w:type="dxa" w:w="1361"/>
-          </w:tcPr>
-          <w:p>
-            <w:pPr>
-              <w:spacing w:after="20"/>
-            </w:pPr>
-            <w:r/>
-            <w:r>
-              <w:rPr>
-                <w:b w:val="0"/>
-                <w:sz w:val="16"/>
-              </w:rPr>
-              <w:t>0,15 / 0,10 / 0,25</w:t>
-            </w:r>
-          </w:p>
-        </w:tc>
-        <w:tc>
-          <w:tcPr>
-            <w:tcW w:type="dxa" w:w="1361"/>
-          </w:tcPr>
-          <w:p>
-            <w:pPr>
-              <w:spacing w:after="20"/>
-            </w:pPr>
-            <w:r/>
-            <w:r>
-              <w:rPr>
-                <w:b w:val="0"/>
-                <w:sz w:val="16"/>
-              </w:rPr>
-              <w:t>0,15 / 0,05 / 0,30</w:t>
-            </w:r>
-          </w:p>
-        </w:tc>
-        <w:tc>
-          <w:tcPr>
-            <w:tcW w:type="dxa" w:w="1361"/>
-          </w:tcPr>
-          <w:p>
-            <w:pPr>
-              <w:spacing w:after="20"/>
-            </w:pPr>
-            <w:r/>
-            <w:r>
-              <w:rPr>
-                <w:b w:val="0"/>
-                <w:sz w:val="16"/>
-              </w:rPr>
-              <w:t>0,00 / 0,00 / 0,50</w:t>
+            <w:tcW w:type="dxa" w:w="1814"/>
+          </w:tcPr>
+          <w:p>
+            <w:pPr>
+              <w:spacing w:after="20"/>
+            </w:pPr>
+            <w:r/>
+            <w:r>
+              <w:rPr>
+                <w:b w:val="0"/>
+                <w:sz w:val="17"/>
+              </w:rPr>
+              <w:t>M28-M30 (3 mc)</w:t>
+            </w:r>
+          </w:p>
+        </w:tc>
+        <w:tc>
+          <w:tcPr>
+            <w:tcW w:type="dxa" w:w="1474"/>
+          </w:tcPr>
+          <w:p>
+            <w:pPr>
+              <w:spacing w:after="20"/>
+            </w:pPr>
+            <w:r/>
+            <w:r>
+              <w:rPr>
+                <w:b w:val="0"/>
+                <w:sz w:val="17"/>
+              </w:rPr>
+              <w:t>Z9</w:t>
+            </w:r>
+          </w:p>
+        </w:tc>
+        <w:tc>
+          <w:tcPr>
+            <w:tcW w:type="dxa" w:w="2381"/>
+          </w:tcPr>
+          <w:p>
+            <w:pPr>
+              <w:spacing w:after="20"/>
+            </w:pPr>
+            <w:r/>
+            <w:r>
+              <w:rPr>
+                <w:b w:val="0"/>
+                <w:sz w:val="17"/>
+              </w:rPr>
+              <w:t>0% / 0% / 100%</w:t>
+            </w:r>
+          </w:p>
+        </w:tc>
+        <w:tc>
+          <w:tcPr>
+            <w:tcW w:type="dxa" w:w="2835"/>
+          </w:tcPr>
+          <w:p>
+            <w:pPr>
+              <w:spacing w:after="20"/>
+            </w:pPr>
+            <w:r/>
+            <w:r>
+              <w:rPr>
+                <w:b w:val="0"/>
+                <w:sz w:val="17"/>
+              </w:rPr>
+              <w:t>Z6 i Z7 zakończone</w:t>
             </w:r>
           </w:p>
         </w:tc>
@@ -7883,7 +7405,7 @@
         <w:rPr>
           <w:b w:val="0"/>
         </w:rPr>
-        <w:t>Fazy: M19-M21 (projekt architektury, kompresja i projekt sprzętu, pierwsze integracje), M22 (start Z9, Faza A), M23-M25 (integracja platformy i pipeline'u, rejestracja w Fazie A), M26-M27 (testy środowiskowe i walidacja na wersjach RC, koniec Z6 i Z7), M28-M30 (tylko Z9: Faza B i okno korekt). Backend/Full-Stack Developer (1,0 etatu): Z6 w M19-M27 (9 miesięcy), Z9 w M28-M30 (3 miesiące).</w:t>
+        <w:t>Backend/Full-Stack Developer (1,0 etatu): Z6 w M19-M27 (9 miesięcy), Z9 w M28-M30 (3 miesiące). Słabsze punkty wariantu: w M22-M27 równy udział trzech zadań jest mniej dopasowany do pracy stanowisk, których zakres w Z6 jest wąski (IoT Specialist, specjalista ds. cyberbezpieczeństwa, specjalista TSL). Jeżeli ekspert zapyta o te pozycje, uzasadnieniem jest równoległa praca nad trzema zadaniami w tym okresie i stałe proporcje wpisane w zakres czynności.</w:t>
       </w:r>
     </w:p>
     <w:p>
@@ -8098,7 +7620,7 @@
                 <w:b w:val="0"/>
                 <w:sz w:val="16"/>
               </w:rPr>
-              <w:t>2,10</w:t>
+              <w:t>2,625</w:t>
             </w:r>
           </w:p>
         </w:tc>
@@ -8116,7 +7638,7 @@
                 <w:b w:val="0"/>
                 <w:sz w:val="16"/>
               </w:rPr>
-              <w:t>3,05</w:t>
+              <w:t>2,625</w:t>
             </w:r>
           </w:p>
         </w:tc>
@@ -8134,7 +7656,7 @@
                 <w:b w:val="0"/>
                 <w:sz w:val="16"/>
               </w:rPr>
-              <w:t>3,85</w:t>
+              <w:t>3,75</w:t>
             </w:r>
           </w:p>
         </w:tc>
@@ -8152,7 +7674,7 @@
                 <w:b w:val="0"/>
                 <w:sz w:val="16"/>
               </w:rPr>
-              <w:t>58 201,50</w:t>
+              <w:t>72 751,88</w:t>
             </w:r>
           </w:p>
         </w:tc>
@@ -8170,7 +7692,7 @@
                 <w:b w:val="0"/>
                 <w:sz w:val="16"/>
               </w:rPr>
-              <w:t>84 530,75</w:t>
+              <w:t>72 751,88</w:t>
             </w:r>
           </w:p>
         </w:tc>
@@ -8188,7 +7710,7 @@
                 <w:b w:val="0"/>
                 <w:sz w:val="16"/>
               </w:rPr>
-              <w:t>106 702,75</w:t>
+              <w:t>103 931,24</w:t>
             </w:r>
           </w:p>
         </w:tc>
@@ -8244,7 +7766,7 @@
                 <w:b w:val="0"/>
                 <w:sz w:val="16"/>
               </w:rPr>
-              <w:t>2,15</w:t>
+              <w:t>2,625</w:t>
             </w:r>
           </w:p>
         </w:tc>
@@ -8262,7 +7784,7 @@
                 <w:b w:val="0"/>
                 <w:sz w:val="16"/>
               </w:rPr>
-              <w:t>3,55</w:t>
+              <w:t>2,625</w:t>
             </w:r>
           </w:p>
         </w:tc>
@@ -8280,7 +7802,7 @@
                 <w:b w:val="0"/>
                 <w:sz w:val="16"/>
               </w:rPr>
-              <w:t>3,30</w:t>
+              <w:t>3,75</w:t>
             </w:r>
           </w:p>
         </w:tc>
@@ -8298,7 +7820,7 @@
                 <w:b w:val="0"/>
                 <w:sz w:val="16"/>
               </w:rPr>
-              <w:t>42 747,38</w:t>
+              <w:t>52 191,56</w:t>
             </w:r>
           </w:p>
         </w:tc>
@@ -8316,7 +7838,7 @@
                 <w:b w:val="0"/>
                 <w:sz w:val="16"/>
               </w:rPr>
-              <w:t>70 582,88</w:t>
+              <w:t>52 191,56</w:t>
             </w:r>
           </w:p>
         </w:tc>
@@ -8334,7 +7856,7 @@
                 <w:b w:val="0"/>
                 <w:sz w:val="16"/>
               </w:rPr>
-              <w:t>65 612,24</w:t>
+              <w:t>74 559,38</w:t>
             </w:r>
           </w:p>
         </w:tc>
@@ -8390,7 +7912,7 @@
                 <w:b w:val="0"/>
                 <w:sz w:val="16"/>
               </w:rPr>
-              <w:t>0,80</w:t>
+              <w:t>0,875</w:t>
             </w:r>
           </w:p>
         </w:tc>
@@ -8408,7 +7930,7 @@
                 <w:b w:val="0"/>
                 <w:sz w:val="16"/>
               </w:rPr>
-              <w:t>0,80</w:t>
+              <w:t>0,875</w:t>
             </w:r>
           </w:p>
         </w:tc>
@@ -8426,7 +7948,7 @@
                 <w:b w:val="0"/>
                 <w:sz w:val="16"/>
               </w:rPr>
-              <w:t>1,40</w:t>
+              <w:t>1,25</w:t>
             </w:r>
           </w:p>
         </w:tc>
@@ -8444,7 +7966,7 @@
                 <w:b w:val="0"/>
                 <w:sz w:val="16"/>
               </w:rPr>
-              <w:t>20 244,00</w:t>
+              <w:t>22 141,88</w:t>
             </w:r>
           </w:p>
         </w:tc>
@@ -8462,7 +7984,7 @@
                 <w:b w:val="0"/>
                 <w:sz w:val="16"/>
               </w:rPr>
-              <w:t>20 244,00</w:t>
+              <w:t>22 141,88</w:t>
             </w:r>
           </w:p>
         </w:tc>
@@ -8480,7 +8002,7 @@
                 <w:b w:val="0"/>
                 <w:sz w:val="16"/>
               </w:rPr>
-              <w:t>35 427,00</w:t>
+              <w:t>31 631,24</w:t>
             </w:r>
           </w:p>
         </w:tc>
@@ -8536,7 +8058,7 @@
                 <w:b w:val="0"/>
                 <w:sz w:val="16"/>
               </w:rPr>
-              <w:t>3,40</w:t>
+              <w:t>3,50</w:t>
             </w:r>
           </w:p>
         </w:tc>
@@ -8554,7 +8076,7 @@
                 <w:b w:val="0"/>
                 <w:sz w:val="16"/>
               </w:rPr>
-              <w:t>3,45</w:t>
+              <w:t>3,50</w:t>
             </w:r>
           </w:p>
         </w:tc>
@@ -8572,7 +8094,7 @@
                 <w:b w:val="0"/>
                 <w:sz w:val="16"/>
               </w:rPr>
-              <w:t>5,15</w:t>
+              <w:t>5,00</w:t>
             </w:r>
           </w:p>
         </w:tc>
@@ -8590,7 +8112,7 @@
                 <w:b w:val="0"/>
                 <w:sz w:val="16"/>
               </w:rPr>
-              <w:t>77 843,00</w:t>
+              <w:t>80 132,50</w:t>
             </w:r>
           </w:p>
         </w:tc>
@@ -8608,7 +8130,7 @@
                 <w:b w:val="0"/>
                 <w:sz w:val="16"/>
               </w:rPr>
-              <w:t>78 987,75</w:t>
+              <w:t>80 132,50</w:t>
             </w:r>
           </w:p>
         </w:tc>
@@ -8626,7 +8148,7 @@
                 <w:b w:val="0"/>
                 <w:sz w:val="16"/>
               </w:rPr>
-              <w:t>117 909,25</w:t>
+              <w:t>114 475,00</w:t>
             </w:r>
           </w:p>
         </w:tc>
@@ -8682,7 +8204,7 @@
                 <w:b w:val="0"/>
                 <w:sz w:val="16"/>
               </w:rPr>
-              <w:t>0,65</w:t>
+              <w:t>1,75</w:t>
             </w:r>
           </w:p>
         </w:tc>
@@ -8700,7 +8222,7 @@
                 <w:b w:val="0"/>
                 <w:sz w:val="16"/>
               </w:rPr>
-              <w:t>2,25</w:t>
+              <w:t>1,75</w:t>
             </w:r>
           </w:p>
         </w:tc>
@@ -8718,7 +8240,7 @@
                 <w:b w:val="0"/>
                 <w:sz w:val="16"/>
               </w:rPr>
-              <w:t>3,10</w:t>
+              <w:t>2,50</w:t>
             </w:r>
           </w:p>
         </w:tc>
@@ -8736,7 +8258,7 @@
                 <w:b w:val="0"/>
                 <w:sz w:val="16"/>
               </w:rPr>
-              <w:t>11 748,75</w:t>
+              <w:t>31 631,25</w:t>
             </w:r>
           </w:p>
         </w:tc>
@@ -8754,7 +8276,7 @@
                 <w:b w:val="0"/>
                 <w:sz w:val="16"/>
               </w:rPr>
-              <w:t>40 668,75</w:t>
+              <w:t>31 631,25</w:t>
             </w:r>
           </w:p>
         </w:tc>
@@ -8772,7 +8294,7 @@
                 <w:b w:val="0"/>
                 <w:sz w:val="16"/>
               </w:rPr>
-              <w:t>56 032,50</w:t>
+              <w:t>45 187,50</w:t>
             </w:r>
           </w:p>
         </w:tc>
@@ -8828,7 +8350,7 @@
                 <w:b w:val="0"/>
                 <w:sz w:val="16"/>
               </w:rPr>
-              <w:t>1,35</w:t>
+              <w:t>1,75</w:t>
             </w:r>
           </w:p>
         </w:tc>
@@ -8846,7 +8368,7 @@
                 <w:b w:val="0"/>
                 <w:sz w:val="16"/>
               </w:rPr>
-              <w:t>1,65</w:t>
+              <w:t>1,75</w:t>
             </w:r>
           </w:p>
         </w:tc>
@@ -8864,7 +8386,7 @@
                 <w:b w:val="0"/>
                 <w:sz w:val="16"/>
               </w:rPr>
-              <w:t>3,00</w:t>
+              <w:t>2,50</w:t>
             </w:r>
           </w:p>
         </w:tc>
@@ -8882,7 +8404,7 @@
                 <w:b w:val="0"/>
                 <w:sz w:val="16"/>
               </w:rPr>
-              <w:t>16 267,50</w:t>
+              <w:t>21 087,50</w:t>
             </w:r>
           </w:p>
         </w:tc>
@@ -8900,7 +8422,7 @@
                 <w:b w:val="0"/>
                 <w:sz w:val="16"/>
               </w:rPr>
-              <w:t>19 882,50</w:t>
+              <w:t>21 087,50</w:t>
             </w:r>
           </w:p>
         </w:tc>
@@ -8918,7 +8440,7 @@
                 <w:b w:val="0"/>
                 <w:sz w:val="16"/>
               </w:rPr>
-              <w:t>36 150,00</w:t>
+              <w:t>30 125,00</w:t>
             </w:r>
           </w:p>
         </w:tc>
@@ -9139,7 +8661,7 @@
                 <w:b w:val="0"/>
                 <w:sz w:val="16"/>
               </w:rPr>
-              <w:t>422 262,13</w:t>
+              <w:t>475 146,57</w:t>
             </w:r>
           </w:p>
         </w:tc>
@@ -9157,7 +8679,7 @@
                 <w:b w:val="0"/>
                 <w:sz w:val="16"/>
               </w:rPr>
-              <w:t>314 896,63</w:t>
+              <w:t>279 936,57</w:t>
             </w:r>
           </w:p>
         </w:tc>
@@ -9175,7 +8697,7 @@
                 <w:b w:val="0"/>
                 <w:sz w:val="16"/>
               </w:rPr>
-              <w:t>482 903,74</w:t>
+              <w:t>464 979,36</w:t>
             </w:r>
           </w:p>
         </w:tc>
@@ -9358,7 +8880,7 @@
           <w:color w:val="666666"/>
           <w:sz w:val="17"/>
         </w:rPr>
-        <w:t xml:space="preserve"> [763 z 1500 znaków]</w:t>
+        <w:t xml:space="preserve"> [924 z 1500 znaków]</w:t>
       </w:r>
     </w:p>
     <w:p>
@@ -9370,7 +8892,7 @@
         <w:rPr>
           <w:b w:val="0"/>
         </w:rPr>
-        <w:t>Koszt = 23 000,00 zł brutto/mc x narzut pracodawcy 1,205 = 27 715,00 zł/mc x 2,10 etatomiesiąca (miesięcy pracy w przeliczeniu na pełny etat) = 58 201,50 zł. Nakład w zadaniu Z6 wynika z podziału etatu 0,75 stanowiska między zadania Z6, Z7 i Z9 w kolejnych fazach prac (etat w zadaniu Z6): M19-M21: 0,30; M22: 0,30; M23-M25: 0,20; M26-M27: 0,15; M28-M30: 0,00. W każdym miesiącu suma nakładów w trzech zadaniach równa się 0,75 etatu, a w całym okresie M19-M30 9,00 etatomiesiąca. Stawkę brutto zweryfikowano na podstawie No Fluff Jobs „Rynek pracy IT 2025/2026”, kat. AI poziom Senior, UoP 20000-29000 (s. 33; tabela zbiorcza 19000-24000, s. 27), 23000 w środku pasma senior/lead. Wynagrodzenie niezbędne do realizacji prac B+R. Forma zatrudnienia: umowa o pracę.</w:t>
+        <w:t>Koszt = 23 000,00 zł brutto/mc x narzut pracodawcy 1,205 = 27 715,00 zł/mc x 2,625 etatomiesiąca (miesięcy pracy w przeliczeniu na pełny etat) = 72 751,88 zł. Nakład w zadaniu Z6 wynosi 3 mc (M19-M21) x 50% x 0,75 etatu + 6 mc (M22-M27) x 1/3 x 0,75 etatu = 2,625 etatomiesiąca. Udziały czasu pracy w projekcie są stałe w trzech okresach i wpisane w zakresie czynności pracownika: w M19-M21 po 50% na zadania Z6 i Z7, w M22-M27 po jednej trzeciej na zadania Z6, Z7 i Z9 (równoległa praca nad trzema zadaniami), w M28-M30 100% na zadanie Z9. Suma udziałów w każdym miesiącu równa się 0,75 etatu, a w całym okresie M19-M30 9,00 etatomiesiąca. Stawkę brutto zweryfikowano na podstawie No Fluff Jobs „Rynek pracy IT 2025/2026”, kat. AI poziom Senior, UoP 20000-29000 (s. 33; tabela zbiorcza 19000-24000, s. 27), 23000 w środku pasma senior/lead. Wynagrodzenie niezbędne do realizacji prac B+R. Forma zatrudnienia: umowa o pracę.</w:t>
       </w:r>
     </w:p>
     <w:p>
@@ -9390,7 +8912,7 @@
           <w:color w:val="666666"/>
           <w:sz w:val="17"/>
         </w:rPr>
-        <w:t xml:space="preserve"> [776 z 1500 znaków]</w:t>
+        <w:t xml:space="preserve"> [937 z 1500 znaków]</w:t>
       </w:r>
     </w:p>
     <w:p>
@@ -9402,7 +8924,7 @@
         <w:rPr>
           <w:b w:val="0"/>
         </w:rPr>
-        <w:t>Koszt = 16 500,00 zł brutto/mc x narzut pracodawcy 1,205 = 19 882,50 zł/mc x 2,15 etatomiesiąca (miesięcy pracy w przeliczeniu na pełny etat) = 42 747,38 zł. Nakład w zadaniu Z6 wynika z podziału etatu 0,75 stanowiska między zadania Z6, Z7 i Z9 w kolejnych fazach prac (etat w zadaniu Z6): M19-M21: 0,15; M22: 0,20; M23-M25: 0,30; M26-M27: 0,30; M28-M30: 0,00. W każdym miesiącu suma nakładów w trzech zadaniach równa się 0,75 etatu, a w całym okresie M19-M30 9,00 etatomiesiąca. Stawkę brutto zweryfikowano na podstawie No Fluff Jobs „Rynek pracy IT 2025/2026”, kat. AI (s. 33): Senior 20000-29000, Mid 14000-21000, 16500 w paśmie Mid, poniżej dolnej mediany Senior (założenie konserwatywne). Wynagrodzenie niezbędne do realizacji prac B+R. Forma zatrudnienia: umowa o pracę.</w:t>
+        <w:t>Koszt = 16 500,00 zł brutto/mc x narzut pracodawcy 1,205 = 19 882,50 zł/mc x 2,625 etatomiesiąca (miesięcy pracy w przeliczeniu na pełny etat) = 52 191,56 zł. Nakład w zadaniu Z6 wynosi 3 mc (M19-M21) x 50% x 0,75 etatu + 6 mc (M22-M27) x 1/3 x 0,75 etatu = 2,625 etatomiesiąca. Udziały czasu pracy w projekcie są stałe w trzech okresach i wpisane w zakresie czynności pracownika: w M19-M21 po 50% na zadania Z6 i Z7, w M22-M27 po jednej trzeciej na zadania Z6, Z7 i Z9 (równoległa praca nad trzema zadaniami), w M28-M30 100% na zadanie Z9. Suma udziałów w każdym miesiącu równa się 0,75 etatu, a w całym okresie M19-M30 9,00 etatomiesiąca. Stawkę brutto zweryfikowano na podstawie No Fluff Jobs „Rynek pracy IT 2025/2026”, kat. AI (s. 33): Senior 20000-29000, Mid 14000-21000, 16500 w paśmie Mid, poniżej dolnej mediany Senior (założenie konserwatywne). Wynagrodzenie niezbędne do realizacji prac B+R. Forma zatrudnienia: umowa o pracę.</w:t>
       </w:r>
     </w:p>
     <w:p>
@@ -9422,7 +8944,7 @@
           <w:color w:val="666666"/>
           <w:sz w:val="17"/>
         </w:rPr>
-        <w:t xml:space="preserve"> [761 z 1500 znaków]</w:t>
+        <w:t xml:space="preserve"> [922 z 1500 znaków]</w:t>
       </w:r>
     </w:p>
     <w:p>
@@ -9434,7 +8956,7 @@
         <w:rPr>
           <w:b w:val="0"/>
         </w:rPr>
-        <w:t>Koszt = 21 000,00 zł brutto/mc x narzut pracodawcy 1,205 = 25 305,00 zł/mc x 0,80 etatomiesiąca (miesięcy pracy w przeliczeniu na pełny etat) = 20 244,00 zł. Nakład w zadaniu Z6 wynika z podziału etatu 0,25 stanowiska między zadania Z6, Z7 i Z9 w kolejnych fazach prac (etat w zadaniu Z6): M19-M21: 0,15; M22: 0,10; M23-M25: 0,05; M26-M27: 0,05; M28-M30: 0,00. W każdym miesiącu suma nakładów w trzech zadaniach równa się 0,25 etatu, a w całym okresie M19-M30 3,00 etatomiesiąca. Stawkę brutto zweryfikowano na podstawie No Fluff Jobs „Rynek pracy IT 2025/2026”, kat. Security poziom Senior, UoP 20000-28000 (s. 32; tabela zbiorcza 17000-23000, s. 27), 21000 w widełkach senior. Wynagrodzenie niezbędne do realizacji prac B+R. Forma zatrudnienia: umowa o pracę.</w:t>
+        <w:t>Koszt = 21 000,00 zł brutto/mc x narzut pracodawcy 1,205 = 25 305,00 zł/mc x 0,875 etatomiesiąca (miesięcy pracy w przeliczeniu na pełny etat) = 22 141,88 zł. Nakład w zadaniu Z6 wynosi 3 mc (M19-M21) x 50% x 0,25 etatu + 6 mc (M22-M27) x 1/3 x 0,25 etatu = 0,875 etatomiesiąca. Udziały czasu pracy w projekcie są stałe w trzech okresach i wpisane w zakresie czynności pracownika: w M19-M21 po 50% na zadania Z6 i Z7, w M22-M27 po jednej trzeciej na zadania Z6, Z7 i Z9 (równoległa praca nad trzema zadaniami), w M28-M30 100% na zadanie Z9. Suma udziałów w każdym miesiącu równa się 0,25 etatu, a w całym okresie M19-M30 3,00 etatomiesiąca. Stawkę brutto zweryfikowano na podstawie No Fluff Jobs „Rynek pracy IT 2025/2026”, kat. Security poziom Senior, UoP 20000-28000 (s. 32; tabela zbiorcza 17000-23000, s. 27), 21000 w widełkach senior. Wynagrodzenie niezbędne do realizacji prac B+R. Forma zatrudnienia: umowa o pracę.</w:t>
       </w:r>
     </w:p>
     <w:p>
@@ -9454,7 +8976,7 @@
           <w:color w:val="666666"/>
           <w:sz w:val="17"/>
         </w:rPr>
-        <w:t xml:space="preserve"> [745 z 1500 znaków]</w:t>
+        <w:t xml:space="preserve"> [904 z 1500 znaków]</w:t>
       </w:r>
     </w:p>
     <w:p>
@@ -9466,7 +8988,7 @@
         <w:rPr>
           <w:b w:val="0"/>
         </w:rPr>
-        <w:t>Koszt = 19 000,00 zł brutto/mc x narzut pracodawcy 1,205 = 22 895,00 zł/mc x 3,40 etatomiesiąca (miesięcy pracy w przeliczeniu na pełny etat) = 77 843,00 zł. Nakład w zadaniu Z6 wynika z podziału etatu 1,00 stanowiska między zadania Z6, Z7 i Z9 w kolejnych fazach prac (etat w zadaniu Z6): M19-M21: 0,45; M22: 0,40; M23-M25: 0,35; M26-M27: 0,30; M28-M30: 0,00. W każdym miesiącu suma nakładów w trzech zadaniach równa się 1,00 etatu, a w całym okresie M19-M30 12,00 etatomiesiąca. Stawkę brutto zweryfikowano na podstawie No Fluff Jobs „Rynek pracy IT 2025/2026”, kat. Backend/Fullstack poziom Senior, UoP 18500-25000 (s. 30), 19000 w dolnej części pasma senior. Wynagrodzenie niezbędne do realizacji prac B+R. Forma zatrudnienia: umowa o pracę.</w:t>
+        <w:t>Koszt = 19 000,00 zł brutto/mc x narzut pracodawcy 1,205 = 22 895,00 zł/mc x 3,50 etatomiesiąca (miesięcy pracy w przeliczeniu na pełny etat) = 80 132,50 zł. Nakład w zadaniu Z6 wynosi 3 mc (M19-M21) x 50% x 1,00 etatu + 6 mc (M22-M27) x 1/3 x 1,00 etatu = 3,50 etatomiesiąca. Udziały czasu pracy w projekcie są stałe w trzech okresach i wpisane w zakresie czynności pracownika: w M19-M21 po 50% na zadania Z6 i Z7, w M22-M27 po jednej trzeciej na zadania Z6, Z7 i Z9 (równoległa praca nad trzema zadaniami), w M28-M30 100% na zadanie Z9. Suma udziałów w każdym miesiącu równa się 1,00 etatu, a w całym okresie M19-M30 12,00 etatomiesiąca. Stawkę brutto zweryfikowano na podstawie No Fluff Jobs „Rynek pracy IT 2025/2026”, kat. Backend/Fullstack poziom Senior, UoP 18500-25000 (s. 30), 19000 w dolnej części pasma senior. Wynagrodzenie niezbędne do realizacji prac B+R. Forma zatrudnienia: umowa o pracę.</w:t>
       </w:r>
     </w:p>
     <w:p>
@@ -9486,7 +9008,7 @@
           <w:color w:val="666666"/>
           <w:sz w:val="17"/>
         </w:rPr>
-        <w:t xml:space="preserve"> [809 z 1500 znaków]</w:t>
+        <w:t xml:space="preserve"> [968 z 1500 znaków]</w:t>
       </w:r>
     </w:p>
     <w:p>
@@ -9498,7 +9020,7 @@
         <w:rPr>
           <w:b w:val="0"/>
         </w:rPr>
-        <w:t>Koszt = 15 000,00 zł brutto/mc x narzut pracodawcy 1,205 = 18 075,00 zł/mc x 0,65 etatomiesiąca (miesięcy pracy w przeliczeniu na pełny etat) = 11 748,75 zł. Nakład w zadaniu Z6 wynika z podziału etatu 0,50 stanowiska między zadania Z6, Z7 i Z9 w kolejnych fazach prac (etat w zadaniu Z6): M19-M21: 0,10; M22: 0,10; M23-M25: 0,05; M26-M27: 0,05; M28-M30: 0,00. W każdym miesiącu suma nakładów w trzech zadaniach równa się 0,50 etatu, a w całym okresie M19-M30 6,00 etatomiesiąca. Stawkę brutto zweryfikowano na podstawie No Fluff Jobs „Rynek pracy IT 2025/2026”, kat. Embedded (s. 27/35: 13000-19000, Mid 12000-17000); pomocniczo Hays „Raport płacowy 2026”, R&amp;D Engineer 13/16/18 tys. (s. 38), 15000 w widełkach kat. Embedded. Wynagrodzenie niezbędne do realizacji prac B+R. Forma zatrudnienia: umowa o pracę.</w:t>
+        <w:t>Koszt = 15 000,00 zł brutto/mc x narzut pracodawcy 1,205 = 18 075,00 zł/mc x 1,75 etatomiesiąca (miesięcy pracy w przeliczeniu na pełny etat) = 31 631,25 zł. Nakład w zadaniu Z6 wynosi 3 mc (M19-M21) x 50% x 0,50 etatu + 6 mc (M22-M27) x 1/3 x 0,50 etatu = 1,75 etatomiesiąca. Udziały czasu pracy w projekcie są stałe w trzech okresach i wpisane w zakresie czynności pracownika: w M19-M21 po 50% na zadania Z6 i Z7, w M22-M27 po jednej trzeciej na zadania Z6, Z7 i Z9 (równoległa praca nad trzema zadaniami), w M28-M30 100% na zadanie Z9. Suma udziałów w każdym miesiącu równa się 0,50 etatu, a w całym okresie M19-M30 6,00 etatomiesiąca. Stawkę brutto zweryfikowano na podstawie No Fluff Jobs „Rynek pracy IT 2025/2026”, kat. Embedded (s. 27/35: 13000-19000, Mid 12000-17000); pomocniczo Hays „Raport płacowy 2026”, R&amp;D Engineer 13/16/18 tys. (s. 38), 15000 w widełkach kat. Embedded. Wynagrodzenie niezbędne do realizacji prac B+R. Forma zatrudnienia: umowa o pracę.</w:t>
       </w:r>
     </w:p>
     <w:p>
@@ -9518,7 +9040,7 @@
           <w:color w:val="666666"/>
           <w:sz w:val="17"/>
         </w:rPr>
-        <w:t xml:space="preserve"> [758 z 1500 znaków]</w:t>
+        <w:t xml:space="preserve"> [917 z 1500 znaków]</w:t>
       </w:r>
     </w:p>
     <w:p>
@@ -9530,7 +9052,7 @@
         <w:rPr>
           <w:b w:val="0"/>
         </w:rPr>
-        <w:t>Koszt = 10 000,00 zł brutto/mc x narzut pracodawcy 1,205 = 12 050,00 zł/mc x 1,35 etatomiesiąca (miesięcy pracy w przeliczeniu na pełny etat) = 16 267,50 zł. Nakład w zadaniu Z6 wynika z podziału etatu 0,50 stanowiska między zadania Z6, Z7 i Z9 w kolejnych fazach prac (etat w zadaniu Z6): M19-M21: 0,15; M22: 0,15; M23-M25: 0,15; M26-M27: 0,15; M28-M30: 0,00. W każdym miesiącu suma nakładów w trzech zadaniach równa się 0,50 etatu, a w całym okresie M19-M30 6,00 etatomiesiąca. Stawkę brutto zweryfikowano na podstawie Hays „Raport płacowy 2026”, sekcja Logistyka i zakupy , tabela Logistyka, „Specjalista ds. Logistyki” 8000/10000/13000 (s. 40), 10000 = wartość optymalna. Wynagrodzenie niezbędne do realizacji prac B+R. Forma zatrudnienia: umowa o pracę.</w:t>
+        <w:t>Koszt = 10 000,00 zł brutto/mc x narzut pracodawcy 1,205 = 12 050,00 zł/mc x 1,75 etatomiesiąca (miesięcy pracy w przeliczeniu na pełny etat) = 21 087,50 zł. Nakład w zadaniu Z6 wynosi 3 mc (M19-M21) x 50% x 0,50 etatu + 6 mc (M22-M27) x 1/3 x 0,50 etatu = 1,75 etatomiesiąca. Udziały czasu pracy w projekcie są stałe w trzech okresach i wpisane w zakresie czynności pracownika: w M19-M21 po 50% na zadania Z6 i Z7, w M22-M27 po jednej trzeciej na zadania Z6, Z7 i Z9 (równoległa praca nad trzema zadaniami), w M28-M30 100% na zadanie Z9. Suma udziałów w każdym miesiącu równa się 0,50 etatu, a w całym okresie M19-M30 6,00 etatomiesiąca. Stawkę brutto zweryfikowano na podstawie Hays „Raport płacowy 2026”, sekcja Logistyka i zakupy , tabela Logistyka, „Specjalista ds. Logistyki” 8000/10000/13000 (s. 40), 10000 = wartość optymalna. Wynagrodzenie niezbędne do realizacji prac B+R. Forma zatrudnienia: umowa o pracę.</w:t>
       </w:r>
     </w:p>
     <w:p>
@@ -9590,7 +9112,7 @@
           <w:color w:val="666666"/>
           <w:sz w:val="17"/>
         </w:rPr>
-        <w:t xml:space="preserve"> [763 z 1500 znaków]</w:t>
+        <w:t xml:space="preserve"> [924 z 1500 znaków]</w:t>
       </w:r>
     </w:p>
     <w:p>
@@ -9602,7 +9124,7 @@
         <w:rPr>
           <w:b w:val="0"/>
         </w:rPr>
-        <w:t>Koszt = 23 000,00 zł brutto/mc x narzut pracodawcy 1,205 = 27 715,00 zł/mc x 3,05 etatomiesiąca (miesięcy pracy w przeliczeniu na pełny etat) = 84 530,75 zł. Nakład w zadaniu Z7 wynika z podziału etatu 0,75 stanowiska między zadania Z6, Z7 i Z9 w kolejnych fazach prac (etat w zadaniu Z7): M19-M21: 0,45; M22: 0,30; M23-M25: 0,30; M26-M27: 0,25; M28-M30: 0,00. W każdym miesiącu suma nakładów w trzech zadaniach równa się 0,75 etatu, a w całym okresie M19-M30 9,00 etatomiesiąca. Stawkę brutto zweryfikowano na podstawie No Fluff Jobs „Rynek pracy IT 2025/2026”, kat. AI poziom Senior, UoP 20000-29000 (s. 33; tabela zbiorcza 19000-24000, s. 27), 23000 w środku pasma senior/lead. Wynagrodzenie niezbędne do realizacji prac B+R. Forma zatrudnienia: umowa o pracę.</w:t>
+        <w:t>Koszt = 23 000,00 zł brutto/mc x narzut pracodawcy 1,205 = 27 715,00 zł/mc x 2,625 etatomiesiąca (miesięcy pracy w przeliczeniu na pełny etat) = 72 751,88 zł. Nakład w zadaniu Z7 wynosi 3 mc (M19-M21) x 50% x 0,75 etatu + 6 mc (M22-M27) x 1/3 x 0,75 etatu = 2,625 etatomiesiąca. Udziały czasu pracy w projekcie są stałe w trzech okresach i wpisane w zakresie czynności pracownika: w M19-M21 po 50% na zadania Z6 i Z7, w M22-M27 po jednej trzeciej na zadania Z6, Z7 i Z9 (równoległa praca nad trzema zadaniami), w M28-M30 100% na zadanie Z9. Suma udziałów w każdym miesiącu równa się 0,75 etatu, a w całym okresie M19-M30 9,00 etatomiesiąca. Stawkę brutto zweryfikowano na podstawie No Fluff Jobs „Rynek pracy IT 2025/2026”, kat. AI poziom Senior, UoP 20000-29000 (s. 33; tabela zbiorcza 19000-24000, s. 27), 23000 w środku pasma senior/lead. Wynagrodzenie niezbędne do realizacji prac B+R. Forma zatrudnienia: umowa o pracę.</w:t>
       </w:r>
     </w:p>
     <w:p>
@@ -9622,7 +9144,7 @@
           <w:color w:val="666666"/>
           <w:sz w:val="17"/>
         </w:rPr>
-        <w:t xml:space="preserve"> [776 z 1500 znaków]</w:t>
+        <w:t xml:space="preserve"> [937 z 1500 znaków]</w:t>
       </w:r>
     </w:p>
     <w:p>
@@ -9634,7 +9156,7 @@
         <w:rPr>
           <w:b w:val="0"/>
         </w:rPr>
-        <w:t>Koszt = 16 500,00 zł brutto/mc x narzut pracodawcy 1,205 = 19 882,50 zł/mc x 3,55 etatomiesiąca (miesięcy pracy w przeliczeniu na pełny etat) = 70 582,88 zł. Nakład w zadaniu Z7 wynika z podziału etatu 0,75 stanowiska między zadania Z6, Z7 i Z9 w kolejnych fazach prac (etat w zadaniu Z7): M19-M21: 0,60; M22: 0,45; M23-M25: 0,30; M26-M27: 0,20; M28-M30: 0,00. W każdym miesiącu suma nakładów w trzech zadaniach równa się 0,75 etatu, a w całym okresie M19-M30 9,00 etatomiesiąca. Stawkę brutto zweryfikowano na podstawie No Fluff Jobs „Rynek pracy IT 2025/2026”, kat. AI (s. 33): Senior 20000-29000, Mid 14000-21000, 16500 w paśmie Mid, poniżej dolnej mediany Senior (założenie konserwatywne). Wynagrodzenie niezbędne do realizacji prac B+R. Forma zatrudnienia: umowa o pracę.</w:t>
+        <w:t>Koszt = 16 500,00 zł brutto/mc x narzut pracodawcy 1,205 = 19 882,50 zł/mc x 2,625 etatomiesiąca (miesięcy pracy w przeliczeniu na pełny etat) = 52 191,56 zł. Nakład w zadaniu Z7 wynosi 3 mc (M19-M21) x 50% x 0,75 etatu + 6 mc (M22-M27) x 1/3 x 0,75 etatu = 2,625 etatomiesiąca. Udziały czasu pracy w projekcie są stałe w trzech okresach i wpisane w zakresie czynności pracownika: w M19-M21 po 50% na zadania Z6 i Z7, w M22-M27 po jednej trzeciej na zadania Z6, Z7 i Z9 (równoległa praca nad trzema zadaniami), w M28-M30 100% na zadanie Z9. Suma udziałów w każdym miesiącu równa się 0,75 etatu, a w całym okresie M19-M30 9,00 etatomiesiąca. Stawkę brutto zweryfikowano na podstawie No Fluff Jobs „Rynek pracy IT 2025/2026”, kat. AI (s. 33): Senior 20000-29000, Mid 14000-21000, 16500 w paśmie Mid, poniżej dolnej mediany Senior (założenie konserwatywne). Wynagrodzenie niezbędne do realizacji prac B+R. Forma zatrudnienia: umowa o pracę.</w:t>
       </w:r>
     </w:p>
     <w:p>
@@ -9654,7 +9176,7 @@
           <w:color w:val="666666"/>
           <w:sz w:val="17"/>
         </w:rPr>
-        <w:t xml:space="preserve"> [761 z 1500 znaków]</w:t>
+        <w:t xml:space="preserve"> [922 z 1500 znaków]</w:t>
       </w:r>
     </w:p>
     <w:p>
@@ -9666,7 +9188,7 @@
         <w:rPr>
           <w:b w:val="0"/>
         </w:rPr>
-        <w:t>Koszt = 21 000,00 zł brutto/mc x narzut pracodawcy 1,205 = 25 305,00 zł/mc x 0,80 etatomiesiąca (miesięcy pracy w przeliczeniu na pełny etat) = 20 244,00 zł. Nakład w zadaniu Z7 wynika z podziału etatu 0,25 stanowiska między zadania Z6, Z7 i Z9 w kolejnych fazach prac (etat w zadaniu Z7): M19-M21: 0,10; M22: 0,10; M23-M25: 0,10; M26-M27: 0,05; M28-M30: 0,00. W każdym miesiącu suma nakładów w trzech zadaniach równa się 0,25 etatu, a w całym okresie M19-M30 3,00 etatomiesiąca. Stawkę brutto zweryfikowano na podstawie No Fluff Jobs „Rynek pracy IT 2025/2026”, kat. Security poziom Senior, UoP 20000-28000 (s. 32; tabela zbiorcza 17000-23000, s. 27), 21000 w widełkach senior. Wynagrodzenie niezbędne do realizacji prac B+R. Forma zatrudnienia: umowa o pracę.</w:t>
+        <w:t>Koszt = 21 000,00 zł brutto/mc x narzut pracodawcy 1,205 = 25 305,00 zł/mc x 0,875 etatomiesiąca (miesięcy pracy w przeliczeniu na pełny etat) = 22 141,88 zł. Nakład w zadaniu Z7 wynosi 3 mc (M19-M21) x 50% x 0,25 etatu + 6 mc (M22-M27) x 1/3 x 0,25 etatu = 0,875 etatomiesiąca. Udziały czasu pracy w projekcie są stałe w trzech okresach i wpisane w zakresie czynności pracownika: w M19-M21 po 50% na zadania Z6 i Z7, w M22-M27 po jednej trzeciej na zadania Z6, Z7 i Z9 (równoległa praca nad trzema zadaniami), w M28-M30 100% na zadanie Z9. Suma udziałów w każdym miesiącu równa się 0,25 etatu, a w całym okresie M19-M30 3,00 etatomiesiąca. Stawkę brutto zweryfikowano na podstawie No Fluff Jobs „Rynek pracy IT 2025/2026”, kat. Security poziom Senior, UoP 20000-28000 (s. 32; tabela zbiorcza 17000-23000, s. 27), 21000 w widełkach senior. Wynagrodzenie niezbędne do realizacji prac B+R. Forma zatrudnienia: umowa o pracę.</w:t>
       </w:r>
     </w:p>
     <w:p>
@@ -9686,7 +9208,7 @@
           <w:color w:val="666666"/>
           <w:sz w:val="17"/>
         </w:rPr>
-        <w:t xml:space="preserve"> [745 z 1500 znaków]</w:t>
+        <w:t xml:space="preserve"> [904 z 1500 znaków]</w:t>
       </w:r>
     </w:p>
     <w:p>
@@ -9698,7 +9220,7 @@
         <w:rPr>
           <w:b w:val="0"/>
         </w:rPr>
-        <w:t>Koszt = 19 000,00 zł brutto/mc x narzut pracodawcy 1,205 = 22 895,00 zł/mc x 3,45 etatomiesiąca (miesięcy pracy w przeliczeniu na pełny etat) = 78 987,75 zł. Nakład w zadaniu Z7 wynika z podziału etatu 1,00 stanowiska między zadania Z6, Z7 i Z9 w kolejnych fazach prac (etat w zadaniu Z7): M19-M21: 0,55; M22: 0,45; M23-M25: 0,35; M26-M27: 0,15; M28-M30: 0,00. W każdym miesiącu suma nakładów w trzech zadaniach równa się 1,00 etatu, a w całym okresie M19-M30 12,00 etatomiesiąca. Stawkę brutto zweryfikowano na podstawie No Fluff Jobs „Rynek pracy IT 2025/2026”, kat. Backend/Fullstack poziom Senior, UoP 18500-25000 (s. 30), 19000 w dolnej części pasma senior. Wynagrodzenie niezbędne do realizacji prac B+R. Forma zatrudnienia: umowa o pracę.</w:t>
+        <w:t>Koszt = 19 000,00 zł brutto/mc x narzut pracodawcy 1,205 = 22 895,00 zł/mc x 3,50 etatomiesiąca (miesięcy pracy w przeliczeniu na pełny etat) = 80 132,50 zł. Nakład w zadaniu Z7 wynosi 3 mc (M19-M21) x 50% x 1,00 etatu + 6 mc (M22-M27) x 1/3 x 1,00 etatu = 3,50 etatomiesiąca. Udziały czasu pracy w projekcie są stałe w trzech okresach i wpisane w zakresie czynności pracownika: w M19-M21 po 50% na zadania Z6 i Z7, w M22-M27 po jednej trzeciej na zadania Z6, Z7 i Z9 (równoległa praca nad trzema zadaniami), w M28-M30 100% na zadanie Z9. Suma udziałów w każdym miesiącu równa się 1,00 etatu, a w całym okresie M19-M30 12,00 etatomiesiąca. Stawkę brutto zweryfikowano na podstawie No Fluff Jobs „Rynek pracy IT 2025/2026”, kat. Backend/Fullstack poziom Senior, UoP 18500-25000 (s. 30), 19000 w dolnej części pasma senior. Wynagrodzenie niezbędne do realizacji prac B+R. Forma zatrudnienia: umowa o pracę.</w:t>
       </w:r>
     </w:p>
     <w:p>
@@ -9718,7 +9240,7 @@
           <w:color w:val="666666"/>
           <w:sz w:val="17"/>
         </w:rPr>
-        <w:t xml:space="preserve"> [809 z 1500 znaków]</w:t>
+        <w:t xml:space="preserve"> [968 z 1500 znaków]</w:t>
       </w:r>
     </w:p>
     <w:p>
@@ -9730,7 +9252,7 @@
         <w:rPr>
           <w:b w:val="0"/>
         </w:rPr>
-        <w:t>Koszt = 15 000,00 zł brutto/mc x narzut pracodawcy 1,205 = 18 075,00 zł/mc x 2,25 etatomiesiąca (miesięcy pracy w przeliczeniu na pełny etat) = 40 668,75 zł. Nakład w zadaniu Z7 wynika z podziału etatu 0,50 stanowiska między zadania Z6, Z7 i Z9 w kolejnych fazach prac (etat w zadaniu Z7): M19-M21: 0,40; M22: 0,25; M23-M25: 0,20; M26-M27: 0,10; M28-M30: 0,00. W każdym miesiącu suma nakładów w trzech zadaniach równa się 0,50 etatu, a w całym okresie M19-M30 6,00 etatomiesiąca. Stawkę brutto zweryfikowano na podstawie No Fluff Jobs „Rynek pracy IT 2025/2026”, kat. Embedded (s. 27/35: 13000-19000, Mid 12000-17000); pomocniczo Hays „Raport płacowy 2026”, R&amp;D Engineer 13/16/18 tys. (s. 38), 15000 w widełkach kat. Embedded. Wynagrodzenie niezbędne do realizacji prac B+R. Forma zatrudnienia: umowa o pracę.</w:t>
+        <w:t>Koszt = 15 000,00 zł brutto/mc x narzut pracodawcy 1,205 = 18 075,00 zł/mc x 1,75 etatomiesiąca (miesięcy pracy w przeliczeniu na pełny etat) = 31 631,25 zł. Nakład w zadaniu Z7 wynosi 3 mc (M19-M21) x 50% x 0,50 etatu + 6 mc (M22-M27) x 1/3 x 0,50 etatu = 1,75 etatomiesiąca. Udziały czasu pracy w projekcie są stałe w trzech okresach i wpisane w zakresie czynności pracownika: w M19-M21 po 50% na zadania Z6 i Z7, w M22-M27 po jednej trzeciej na zadania Z6, Z7 i Z9 (równoległa praca nad trzema zadaniami), w M28-M30 100% na zadanie Z9. Suma udziałów w każdym miesiącu równa się 0,50 etatu, a w całym okresie M19-M30 6,00 etatomiesiąca. Stawkę brutto zweryfikowano na podstawie No Fluff Jobs „Rynek pracy IT 2025/2026”, kat. Embedded (s. 27/35: 13000-19000, Mid 12000-17000); pomocniczo Hays „Raport płacowy 2026”, R&amp;D Engineer 13/16/18 tys. (s. 38), 15000 w widełkach kat. Embedded. Wynagrodzenie niezbędne do realizacji prac B+R. Forma zatrudnienia: umowa o pracę.</w:t>
       </w:r>
     </w:p>
     <w:p>
@@ -9750,7 +9272,7 @@
           <w:color w:val="666666"/>
           <w:sz w:val="17"/>
         </w:rPr>
-        <w:t xml:space="preserve"> [758 z 1500 znaków]</w:t>
+        <w:t xml:space="preserve"> [917 z 1500 znaków]</w:t>
       </w:r>
     </w:p>
     <w:p>
@@ -9762,7 +9284,7 @@
         <w:rPr>
           <w:b w:val="0"/>
         </w:rPr>
-        <w:t>Koszt = 10 000,00 zł brutto/mc x narzut pracodawcy 1,205 = 12 050,00 zł/mc x 1,65 etatomiesiąca (miesięcy pracy w przeliczeniu na pełny etat) = 19 882,50 zł. Nakład w zadaniu Z7 wynika z podziału etatu 0,50 stanowiska między zadania Z6, Z7 i Z9 w kolejnych fazach prac (etat w zadaniu Z7): M19-M21: 0,35; M22: 0,20; M23-M25: 0,10; M26-M27: 0,05; M28-M30: 0,00. W każdym miesiącu suma nakładów w trzech zadaniach równa się 0,50 etatu, a w całym okresie M19-M30 6,00 etatomiesiąca. Stawkę brutto zweryfikowano na podstawie Hays „Raport płacowy 2026”, sekcja Logistyka i zakupy , tabela Logistyka, „Specjalista ds. Logistyki” 8000/10000/13000 (s. 40), 10000 = wartość optymalna. Wynagrodzenie niezbędne do realizacji prac B+R. Forma zatrudnienia: umowa o pracę.</w:t>
+        <w:t>Koszt = 10 000,00 zł brutto/mc x narzut pracodawcy 1,205 = 12 050,00 zł/mc x 1,75 etatomiesiąca (miesięcy pracy w przeliczeniu na pełny etat) = 21 087,50 zł. Nakład w zadaniu Z7 wynosi 3 mc (M19-M21) x 50% x 0,50 etatu + 6 mc (M22-M27) x 1/3 x 0,50 etatu = 1,75 etatomiesiąca. Udziały czasu pracy w projekcie są stałe w trzech okresach i wpisane w zakresie czynności pracownika: w M19-M21 po 50% na zadania Z6 i Z7, w M22-M27 po jednej trzeciej na zadania Z6, Z7 i Z9 (równoległa praca nad trzema zadaniami), w M28-M30 100% na zadanie Z9. Suma udziałów w każdym miesiącu równa się 0,50 etatu, a w całym okresie M19-M30 6,00 etatomiesiąca. Stawkę brutto zweryfikowano na podstawie Hays „Raport płacowy 2026”, sekcja Logistyka i zakupy , tabela Logistyka, „Specjalista ds. Logistyki” 8000/10000/13000 (s. 40), 10000 = wartość optymalna. Wynagrodzenie niezbędne do realizacji prac B+R. Forma zatrudnienia: umowa o pracę.</w:t>
       </w:r>
     </w:p>
     <w:p>
@@ -9790,7 +9312,7 @@
           <w:color w:val="666666"/>
           <w:sz w:val="17"/>
         </w:rPr>
-        <w:t xml:space="preserve"> [764 z 1500 znaków]</w:t>
+        <w:t xml:space="preserve"> [924 z 1500 znaków]</w:t>
       </w:r>
     </w:p>
     <w:p>
@@ -9802,7 +9324,7 @@
         <w:rPr>
           <w:b w:val="0"/>
         </w:rPr>
-        <w:t>Koszt = 23 000,00 zł brutto/mc x narzut pracodawcy 1,205 = 27 715,00 zł/mc x 3,85 etatomiesiąca (miesięcy pracy w przeliczeniu na pełny etat) = 106 702,75 zł. Nakład w zadaniu Z9 wynika z podziału etatu 0,75 stanowiska między zadania Z6, Z7 i Z9 w kolejnych fazach prac (etat w zadaniu Z9): M19-M21: 0,00; M22: 0,15; M23-M25: 0,25; M26-M27: 0,35; M28-M30: 0,75. W każdym miesiącu suma nakładów w trzech zadaniach równa się 0,75 etatu, a w całym okresie M19-M30 9,00 etatomiesiąca. Stawkę brutto zweryfikowano na podstawie No Fluff Jobs „Rynek pracy IT 2025/2026”, kat. AI poziom Senior, UoP 20000-29000 (s. 33; tabela zbiorcza 19000-24000, s. 27), 23000 w środku pasma senior/lead. Wynagrodzenie niezbędne do realizacji prac B+R. Forma zatrudnienia: umowa o pracę.</w:t>
+        <w:t>Koszt = 23 000,00 zł brutto/mc x narzut pracodawcy 1,205 = 27 715,00 zł/mc x 3,75 etatomiesiąca (miesięcy pracy w przeliczeniu na pełny etat) = 103 931,24 zł. Nakład w zadaniu Z9 wynosi 6 mc (M22-M27) x 1/3 x 0,75 etatu + 3 mc (M28-M30) x 100% x 0,75 etatu = 3,75 etatomiesiąca. Udziały czasu pracy w projekcie są stałe w trzech okresach i wpisane w zakresie czynności pracownika: w M19-M21 po 50% na zadania Z6 i Z7, w M22-M27 po jednej trzeciej na zadania Z6, Z7 i Z9 (równoległa praca nad trzema zadaniami), w M28-M30 100% na zadanie Z9. Suma udziałów w każdym miesiącu równa się 0,75 etatu, a w całym okresie M19-M30 9,00 etatomiesiąca. Stawkę brutto zweryfikowano na podstawie No Fluff Jobs „Rynek pracy IT 2025/2026”, kat. AI poziom Senior, UoP 20000-29000 (s. 33; tabela zbiorcza 19000-24000, s. 27), 23000 w środku pasma senior/lead. Wynagrodzenie niezbędne do realizacji prac B+R. Forma zatrudnienia: umowa o pracę.</w:t>
       </w:r>
     </w:p>
     <w:p>
@@ -9822,7 +9344,7 @@
           <w:color w:val="666666"/>
           <w:sz w:val="17"/>
         </w:rPr>
-        <w:t xml:space="preserve"> [776 z 1500 znaków]</w:t>
+        <w:t xml:space="preserve"> [936 z 1500 znaków]</w:t>
       </w:r>
     </w:p>
     <w:p>
@@ -9834,7 +9356,7 @@
         <w:rPr>
           <w:b w:val="0"/>
         </w:rPr>
-        <w:t>Koszt = 16 500,00 zł brutto/mc x narzut pracodawcy 1,205 = 19 882,50 zł/mc x 3,30 etatomiesiąca (miesięcy pracy w przeliczeniu na pełny etat) = 65 612,24 zł. Nakład w zadaniu Z9 wynika z podziału etatu 0,75 stanowiska między zadania Z6, Z7 i Z9 w kolejnych fazach prac (etat w zadaniu Z9): M19-M21: 0,00; M22: 0,10; M23-M25: 0,15; M26-M27: 0,25; M28-M30: 0,75. W każdym miesiącu suma nakładów w trzech zadaniach równa się 0,75 etatu, a w całym okresie M19-M30 9,00 etatomiesiąca. Stawkę brutto zweryfikowano na podstawie No Fluff Jobs „Rynek pracy IT 2025/2026”, kat. AI (s. 33): Senior 20000-29000, Mid 14000-21000, 16500 w paśmie Mid, poniżej dolnej mediany Senior (założenie konserwatywne). Wynagrodzenie niezbędne do realizacji prac B+R. Forma zatrudnienia: umowa o pracę.</w:t>
+        <w:t>Koszt = 16 500,00 zł brutto/mc x narzut pracodawcy 1,205 = 19 882,50 zł/mc x 3,75 etatomiesiąca (miesięcy pracy w przeliczeniu na pełny etat) = 74 559,38 zł. Nakład w zadaniu Z9 wynosi 6 mc (M22-M27) x 1/3 x 0,75 etatu + 3 mc (M28-M30) x 100% x 0,75 etatu = 3,75 etatomiesiąca. Udziały czasu pracy w projekcie są stałe w trzech okresach i wpisane w zakresie czynności pracownika: w M19-M21 po 50% na zadania Z6 i Z7, w M22-M27 po jednej trzeciej na zadania Z6, Z7 i Z9 (równoległa praca nad trzema zadaniami), w M28-M30 100% na zadanie Z9. Suma udziałów w każdym miesiącu równa się 0,75 etatu, a w całym okresie M19-M30 9,00 etatomiesiąca. Stawkę brutto zweryfikowano na podstawie No Fluff Jobs „Rynek pracy IT 2025/2026”, kat. AI (s. 33): Senior 20000-29000, Mid 14000-21000, 16500 w paśmie Mid, poniżej dolnej mediany Senior (założenie konserwatywne). Wynagrodzenie niezbędne do realizacji prac B+R. Forma zatrudnienia: umowa o pracę.</w:t>
       </w:r>
     </w:p>
     <w:p>
@@ -9854,7 +9376,7 @@
           <w:color w:val="666666"/>
           <w:sz w:val="17"/>
         </w:rPr>
-        <w:t xml:space="preserve"> [761 z 1500 znaków]</w:t>
+        <w:t xml:space="preserve"> [921 z 1500 znaków]</w:t>
       </w:r>
     </w:p>
     <w:p>
@@ -9866,7 +9388,7 @@
         <w:rPr>
           <w:b w:val="0"/>
         </w:rPr>
-        <w:t>Koszt = 21 000,00 zł brutto/mc x narzut pracodawcy 1,205 = 25 305,00 zł/mc x 1,40 etatomiesiąca (miesięcy pracy w przeliczeniu na pełny etat) = 35 427,00 zł. Nakład w zadaniu Z9 wynika z podziału etatu 0,25 stanowiska między zadania Z6, Z7 i Z9 w kolejnych fazach prac (etat w zadaniu Z9): M19-M21: 0,00; M22: 0,05; M23-M25: 0,10; M26-M27: 0,15; M28-M30: 0,25. W każdym miesiącu suma nakładów w trzech zadaniach równa się 0,25 etatu, a w całym okresie M19-M30 3,00 etatomiesiąca. Stawkę brutto zweryfikowano na podstawie No Fluff Jobs „Rynek pracy IT 2025/2026”, kat. Security poziom Senior, UoP 20000-28000 (s. 32; tabela zbiorcza 17000-23000, s. 27), 21000 w widełkach senior. Wynagrodzenie niezbędne do realizacji prac B+R. Forma zatrudnienia: umowa o pracę.</w:t>
+        <w:t>Koszt = 21 000,00 zł brutto/mc x narzut pracodawcy 1,205 = 25 305,00 zł/mc x 1,25 etatomiesiąca (miesięcy pracy w przeliczeniu na pełny etat) = 31 631,24 zł. Nakład w zadaniu Z9 wynosi 6 mc (M22-M27) x 1/3 x 0,25 etatu + 3 mc (M28-M30) x 100% x 0,25 etatu = 1,25 etatomiesiąca. Udziały czasu pracy w projekcie są stałe w trzech okresach i wpisane w zakresie czynności pracownika: w M19-M21 po 50% na zadania Z6 i Z7, w M22-M27 po jednej trzeciej na zadania Z6, Z7 i Z9 (równoległa praca nad trzema zadaniami), w M28-M30 100% na zadanie Z9. Suma udziałów w każdym miesiącu równa się 0,25 etatu, a w całym okresie M19-M30 3,00 etatomiesiąca. Stawkę brutto zweryfikowano na podstawie No Fluff Jobs „Rynek pracy IT 2025/2026”, kat. Security poziom Senior, UoP 20000-28000 (s. 32; tabela zbiorcza 17000-23000, s. 27), 21000 w widełkach senior. Wynagrodzenie niezbędne do realizacji prac B+R. Forma zatrudnienia: umowa o pracę.</w:t>
       </w:r>
     </w:p>
     <w:p>
@@ -9886,7 +9408,7 @@
           <w:color w:val="666666"/>
           <w:sz w:val="17"/>
         </w:rPr>
-        <w:t xml:space="preserve"> [746 z 1500 znaków]</w:t>
+        <w:t xml:space="preserve"> [906 z 1500 znaków]</w:t>
       </w:r>
     </w:p>
     <w:p>
@@ -9898,7 +9420,7 @@
         <w:rPr>
           <w:b w:val="0"/>
         </w:rPr>
-        <w:t>Koszt = 19 000,00 zł brutto/mc x narzut pracodawcy 1,205 = 22 895,00 zł/mc x 5,15 etatomiesiąca (miesięcy pracy w przeliczeniu na pełny etat) = 117 909,25 zł. Nakład w zadaniu Z9 wynika z podziału etatu 1,00 stanowiska między zadania Z6, Z7 i Z9 w kolejnych fazach prac (etat w zadaniu Z9): M19-M21: 0,00; M22: 0,15; M23-M25: 0,30; M26-M27: 0,55; M28-M30: 1,00. W każdym miesiącu suma nakładów w trzech zadaniach równa się 1,00 etatu, a w całym okresie M19-M30 12,00 etatomiesiąca. Stawkę brutto zweryfikowano na podstawie No Fluff Jobs „Rynek pracy IT 2025/2026”, kat. Backend/Fullstack poziom Senior, UoP 18500-25000 (s. 30), 19000 w dolnej części pasma senior. Wynagrodzenie niezbędne do realizacji prac B+R. Forma zatrudnienia: umowa o pracę.</w:t>
+        <w:t>Koszt = 19 000,00 zł brutto/mc x narzut pracodawcy 1,205 = 22 895,00 zł/mc x 5,00 etatomiesiąca (miesięcy pracy w przeliczeniu na pełny etat) = 114 475,00 zł. Nakład w zadaniu Z9 wynosi 6 mc (M22-M27) x 1/3 x 1,00 etatu + 3 mc (M28-M30) x 100% x 1,00 etatu = 5,00 etatomiesiąca. Udziały czasu pracy w projekcie są stałe w trzech okresach i wpisane w zakresie czynności pracownika: w M19-M21 po 50% na zadania Z6 i Z7, w M22-M27 po jednej trzeciej na zadania Z6, Z7 i Z9 (równoległa praca nad trzema zadaniami), w M28-M30 100% na zadanie Z9. Suma udziałów w każdym miesiącu równa się 1,00 etatu, a w całym okresie M19-M30 12,00 etatomiesiąca. Stawkę brutto zweryfikowano na podstawie No Fluff Jobs „Rynek pracy IT 2025/2026”, kat. Backend/Fullstack poziom Senior, UoP 18500-25000 (s. 30), 19000 w dolnej części pasma senior. Wynagrodzenie niezbędne do realizacji prac B+R. Forma zatrudnienia: umowa o pracę.</w:t>
       </w:r>
     </w:p>
     <w:p>
@@ -9918,7 +9440,7 @@
           <w:color w:val="666666"/>
           <w:sz w:val="17"/>
         </w:rPr>
-        <w:t xml:space="preserve"> [809 z 1500 znaków]</w:t>
+        <w:t xml:space="preserve"> [969 z 1500 znaków]</w:t>
       </w:r>
     </w:p>
     <w:p>
@@ -9930,7 +9452,7 @@
         <w:rPr>
           <w:b w:val="0"/>
         </w:rPr>
-        <w:t>Koszt = 15 000,00 zł brutto/mc x narzut pracodawcy 1,205 = 18 075,00 zł/mc x 3,10 etatomiesiąca (miesięcy pracy w przeliczeniu na pełny etat) = 56 032,50 zł. Nakład w zadaniu Z9 wynika z podziału etatu 0,50 stanowiska między zadania Z6, Z7 i Z9 w kolejnych fazach prac (etat w zadaniu Z9): M19-M21: 0,00; M22: 0,15; M23-M25: 0,25; M26-M27: 0,35; M28-M30: 0,50. W każdym miesiącu suma nakładów w trzech zadaniach równa się 0,50 etatu, a w całym okresie M19-M30 6,00 etatomiesiąca. Stawkę brutto zweryfikowano na podstawie No Fluff Jobs „Rynek pracy IT 2025/2026”, kat. Embedded (s. 27/35: 13000-19000, Mid 12000-17000); pomocniczo Hays „Raport płacowy 2026”, R&amp;D Engineer 13/16/18 tys. (s. 38), 15000 w widełkach kat. Embedded. Wynagrodzenie niezbędne do realizacji prac B+R. Forma zatrudnienia: umowa o pracę.</w:t>
+        <w:t>Koszt = 15 000,00 zł brutto/mc x narzut pracodawcy 1,205 = 18 075,00 zł/mc x 2,50 etatomiesiąca (miesięcy pracy w przeliczeniu na pełny etat) = 45 187,50 zł. Nakład w zadaniu Z9 wynosi 6 mc (M22-M27) x 1/3 x 0,50 etatu + 3 mc (M28-M30) x 100% x 0,50 etatu = 2,50 etatomiesiąca. Udziały czasu pracy w projekcie są stałe w trzech okresach i wpisane w zakresie czynności pracownika: w M19-M21 po 50% na zadania Z6 i Z7, w M22-M27 po jednej trzeciej na zadania Z6, Z7 i Z9 (równoległa praca nad trzema zadaniami), w M28-M30 100% na zadanie Z9. Suma udziałów w każdym miesiącu równa się 0,50 etatu, a w całym okresie M19-M30 6,00 etatomiesiąca. Stawkę brutto zweryfikowano na podstawie No Fluff Jobs „Rynek pracy IT 2025/2026”, kat. Embedded (s. 27/35: 13000-19000, Mid 12000-17000); pomocniczo Hays „Raport płacowy 2026”, R&amp;D Engineer 13/16/18 tys. (s. 38), 15000 w widełkach kat. Embedded. Wynagrodzenie niezbędne do realizacji prac B+R. Forma zatrudnienia: umowa o pracę.</w:t>
       </w:r>
     </w:p>
     <w:p>
@@ -9950,7 +9472,7 @@
           <w:color w:val="666666"/>
           <w:sz w:val="17"/>
         </w:rPr>
-        <w:t xml:space="preserve"> [758 z 1500 znaków]</w:t>
+        <w:t xml:space="preserve"> [918 z 1500 znaków]</w:t>
       </w:r>
     </w:p>
     <w:p>
@@ -9962,7 +9484,7 @@
         <w:rPr>
           <w:b w:val="0"/>
         </w:rPr>
-        <w:t>Koszt = 10 000,00 zł brutto/mc x narzut pracodawcy 1,205 = 12 050,00 zł/mc x 3,00 etatomiesiąca (miesięcy pracy w przeliczeniu na pełny etat) = 36 150,00 zł. Nakład w zadaniu Z9 wynika z podziału etatu 0,50 stanowiska między zadania Z6, Z7 i Z9 w kolejnych fazach prac (etat w zadaniu Z9): M19-M21: 0,00; M22: 0,15; M23-M25: 0,25; M26-M27: 0,30; M28-M30: 0,50. W każdym miesiącu suma nakładów w trzech zadaniach równa się 0,50 etatu, a w całym okresie M19-M30 6,00 etatomiesiąca. Stawkę brutto zweryfikowano na podstawie Hays „Raport płacowy 2026”, sekcja Logistyka i zakupy , tabela Logistyka, „Specjalista ds. Logistyki” 8000/10000/13000 (s. 40), 10000 = wartość optymalna. Wynagrodzenie niezbędne do realizacji prac B+R. Forma zatrudnienia: umowa o pracę.</w:t>
+        <w:t>Koszt = 10 000,00 zł brutto/mc x narzut pracodawcy 1,205 = 12 050,00 zł/mc x 2,50 etatomiesiąca (miesięcy pracy w przeliczeniu na pełny etat) = 30 125,00 zł. Nakład w zadaniu Z9 wynosi 6 mc (M22-M27) x 1/3 x 0,50 etatu + 3 mc (M28-M30) x 100% x 0,50 etatu = 2,50 etatomiesiąca. Udziały czasu pracy w projekcie są stałe w trzech okresach i wpisane w zakresie czynności pracownika: w M19-M21 po 50% na zadania Z6 i Z7, w M22-M27 po jednej trzeciej na zadania Z6, Z7 i Z9 (równoległa praca nad trzema zadaniami), w M28-M30 100% na zadanie Z9. Suma udziałów w każdym miesiącu równa się 0,50 etatu, a w całym okresie M19-M30 6,00 etatomiesiąca. Stawkę brutto zweryfikowano na podstawie Hays „Raport płacowy 2026”, sekcja Logistyka i zakupy , tabela Logistyka, „Specjalista ds. Logistyki” 8000/10000/13000 (s. 40), 10000 = wartość optymalna. Wynagrodzenie niezbędne do realizacji prac B+R. Forma zatrudnienia: umowa o pracę.</w:t>
       </w:r>
     </w:p>
     <w:p>
@@ -11823,7 +11345,7 @@
                 <w:b w:val="0"/>
                 <w:sz w:val="16"/>
               </w:rPr>
-              <w:t>2,10</w:t>
+              <w:t>2,625</w:t>
             </w:r>
           </w:p>
         </w:tc>
@@ -11841,7 +11363,7 @@
                 <w:b w:val="0"/>
                 <w:sz w:val="16"/>
               </w:rPr>
-              <w:t>3,05</w:t>
+              <w:t>2,625</w:t>
             </w:r>
           </w:p>
         </w:tc>
@@ -11859,7 +11381,7 @@
                 <w:b w:val="0"/>
                 <w:sz w:val="16"/>
               </w:rPr>
-              <w:t>3,85</w:t>
+              <w:t>3,75</w:t>
             </w:r>
           </w:p>
         </w:tc>
@@ -11933,7 +11455,7 @@
                 <w:b w:val="0"/>
                 <w:sz w:val="16"/>
               </w:rPr>
-              <w:t>2,15</w:t>
+              <w:t>2,625</w:t>
             </w:r>
           </w:p>
         </w:tc>
@@ -11951,7 +11473,7 @@
                 <w:b w:val="0"/>
                 <w:sz w:val="16"/>
               </w:rPr>
-              <w:t>3,55</w:t>
+              <w:t>2,625</w:t>
             </w:r>
           </w:p>
         </w:tc>
@@ -11969,7 +11491,7 @@
                 <w:b w:val="0"/>
                 <w:sz w:val="16"/>
               </w:rPr>
-              <w:t>3,30</w:t>
+              <w:t>3,75</w:t>
             </w:r>
           </w:p>
         </w:tc>
@@ -12043,7 +11565,7 @@
                 <w:b w:val="0"/>
                 <w:sz w:val="16"/>
               </w:rPr>
-              <w:t>0,80</w:t>
+              <w:t>0,875</w:t>
             </w:r>
           </w:p>
         </w:tc>
@@ -12061,7 +11583,7 @@
                 <w:b w:val="0"/>
                 <w:sz w:val="16"/>
               </w:rPr>
-              <w:t>0,80</w:t>
+              <w:t>0,875</w:t>
             </w:r>
           </w:p>
         </w:tc>
@@ -12079,7 +11601,7 @@
                 <w:b w:val="0"/>
                 <w:sz w:val="16"/>
               </w:rPr>
-              <w:t>1,40</w:t>
+              <w:t>1,25</w:t>
             </w:r>
           </w:p>
         </w:tc>
@@ -12153,7 +11675,7 @@
                 <w:b w:val="0"/>
                 <w:sz w:val="16"/>
               </w:rPr>
-              <w:t>3,40</w:t>
+              <w:t>3,50</w:t>
             </w:r>
           </w:p>
         </w:tc>
@@ -12171,7 +11693,7 @@
                 <w:b w:val="0"/>
                 <w:sz w:val="16"/>
               </w:rPr>
-              <w:t>3,45</w:t>
+              <w:t>3,50</w:t>
             </w:r>
           </w:p>
         </w:tc>
@@ -12189,7 +11711,7 @@
                 <w:b w:val="0"/>
                 <w:sz w:val="16"/>
               </w:rPr>
-              <w:t>5,15</w:t>
+              <w:t>5,00</w:t>
             </w:r>
           </w:p>
         </w:tc>
@@ -12263,7 +11785,7 @@
                 <w:b w:val="0"/>
                 <w:sz w:val="16"/>
               </w:rPr>
-              <w:t>0,65</w:t>
+              <w:t>1,75</w:t>
             </w:r>
           </w:p>
         </w:tc>
@@ -12281,7 +11803,7 @@
                 <w:b w:val="0"/>
                 <w:sz w:val="16"/>
               </w:rPr>
-              <w:t>2,25</w:t>
+              <w:t>1,75</w:t>
             </w:r>
           </w:p>
         </w:tc>
@@ -12299,7 +11821,7 @@
                 <w:b w:val="0"/>
                 <w:sz w:val="16"/>
               </w:rPr>
-              <w:t>3,10</w:t>
+              <w:t>2,50</w:t>
             </w:r>
           </w:p>
         </w:tc>
@@ -12373,7 +11895,7 @@
                 <w:b w:val="0"/>
                 <w:sz w:val="16"/>
               </w:rPr>
-              <w:t>1,35</w:t>
+              <w:t>1,75</w:t>
             </w:r>
           </w:p>
         </w:tc>
@@ -12391,7 +11913,7 @@
                 <w:b w:val="0"/>
                 <w:sz w:val="16"/>
               </w:rPr>
-              <w:t>1,65</w:t>
+              <w:t>1,75</w:t>
             </w:r>
           </w:p>
         </w:tc>
@@ -12409,7 +11931,7 @@
                 <w:b w:val="0"/>
                 <w:sz w:val="16"/>
               </w:rPr>
-              <w:t>3,00</w:t>
+              <w:t>2,50</w:t>
             </w:r>
           </w:p>
         </w:tc>
@@ -22075,7 +21597,7 @@
                 <w:b w:val="0"/>
                 <w:sz w:val="17"/>
               </w:rPr>
-              <w:t>3871/4000</w:t>
+              <w:t>3900/4000</w:t>
             </w:r>
           </w:p>
         </w:tc>
@@ -22221,7 +21743,7 @@
                 <w:b w:val="0"/>
                 <w:sz w:val="17"/>
               </w:rPr>
-              <w:t>3500/4000</w:t>
+              <w:t>3529/4000</w:t>
             </w:r>
           </w:p>
         </w:tc>
@@ -22513,7 +22035,7 @@
                 <w:b w:val="0"/>
                 <w:sz w:val="17"/>
               </w:rPr>
-              <w:t>3936/4000</w:t>
+              <w:t>3962/4000</w:t>
             </w:r>
           </w:p>
         </w:tc>

</xml_diff>

<commit_message>
Poprawka interpunkcji w metodzie szacowania TSL
Co-Authored-By: Claude Sonnet 5.5 <noreply@anthropic.com>
Claude-Session: https://claude.ai/code/session_01672WnJhixnEcarbb7uiwfx
</commit_message>
<xml_diff>
--- a/Opisy_zadan_z_kamieniami_milowymi.docx
+++ b/Opisy_zadan_z_kamieniami_milowymi.docx
@@ -9040,7 +9040,7 @@
           <w:color w:val="666666"/>
           <w:sz w:val="17"/>
         </w:rPr>
-        <w:t xml:space="preserve"> [917 z 1500 znaków]</w:t>
+        <w:t xml:space="preserve"> [916 z 1500 znaków]</w:t>
       </w:r>
     </w:p>
     <w:p>
@@ -9052,7 +9052,7 @@
         <w:rPr>
           <w:b w:val="0"/>
         </w:rPr>
-        <w:t>Koszt = 10 000,00 zł brutto/mc x narzut pracodawcy 1,205 = 12 050,00 zł/mc x 1,75 etatomiesiąca (miesięcy pracy w przeliczeniu na pełny etat) = 21 087,50 zł. Nakład w zadaniu Z6 wynosi 3 mc (M19-M21) x 50% x 0,50 etatu + 6 mc (M22-M27) x 1/3 x 0,50 etatu = 1,75 etatomiesiąca. Udziały czasu pracy w projekcie są stałe w trzech okresach i wpisane w zakresie czynności pracownika: w M19-M21 po 50% na zadania Z6 i Z7, w M22-M27 po jednej trzeciej na zadania Z6, Z7 i Z9 (równoległa praca nad trzema zadaniami), w M28-M30 100% na zadanie Z9. Suma udziałów w każdym miesiącu równa się 0,50 etatu, a w całym okresie M19-M30 6,00 etatomiesiąca. Stawkę brutto zweryfikowano na podstawie Hays „Raport płacowy 2026”, sekcja Logistyka i zakupy , tabela Logistyka, „Specjalista ds. Logistyki” 8000/10000/13000 (s. 40), 10000 = wartość optymalna. Wynagrodzenie niezbędne do realizacji prac B+R. Forma zatrudnienia: umowa o pracę.</w:t>
+        <w:t>Koszt = 10 000,00 zł brutto/mc x narzut pracodawcy 1,205 = 12 050,00 zł/mc x 1,75 etatomiesiąca (miesięcy pracy w przeliczeniu na pełny etat) = 21 087,50 zł. Nakład w zadaniu Z6 wynosi 3 mc (M19-M21) x 50% x 0,50 etatu + 6 mc (M22-M27) x 1/3 x 0,50 etatu = 1,75 etatomiesiąca. Udziały czasu pracy w projekcie są stałe w trzech okresach i wpisane w zakresie czynności pracownika: w M19-M21 po 50% na zadania Z6 i Z7, w M22-M27 po jednej trzeciej na zadania Z6, Z7 i Z9 (równoległa praca nad trzema zadaniami), w M28-M30 100% na zadanie Z9. Suma udziałów w każdym miesiącu równa się 0,50 etatu, a w całym okresie M19-M30 6,00 etatomiesiąca. Stawkę brutto zweryfikowano na podstawie Hays „Raport płacowy 2026”, sekcja Logistyka i zakupy, tabela Logistyka, „Specjalista ds. Logistyki” 8000/10000/13000 (s. 40), 10000 = wartość optymalna. Wynagrodzenie niezbędne do realizacji prac B+R. Forma zatrudnienia: umowa o pracę.</w:t>
       </w:r>
     </w:p>
     <w:p>
@@ -9272,7 +9272,7 @@
           <w:color w:val="666666"/>
           <w:sz w:val="17"/>
         </w:rPr>
-        <w:t xml:space="preserve"> [917 z 1500 znaków]</w:t>
+        <w:t xml:space="preserve"> [916 z 1500 znaków]</w:t>
       </w:r>
     </w:p>
     <w:p>
@@ -9284,7 +9284,7 @@
         <w:rPr>
           <w:b w:val="0"/>
         </w:rPr>
-        <w:t>Koszt = 10 000,00 zł brutto/mc x narzut pracodawcy 1,205 = 12 050,00 zł/mc x 1,75 etatomiesiąca (miesięcy pracy w przeliczeniu na pełny etat) = 21 087,50 zł. Nakład w zadaniu Z7 wynosi 3 mc (M19-M21) x 50% x 0,50 etatu + 6 mc (M22-M27) x 1/3 x 0,50 etatu = 1,75 etatomiesiąca. Udziały czasu pracy w projekcie są stałe w trzech okresach i wpisane w zakresie czynności pracownika: w M19-M21 po 50% na zadania Z6 i Z7, w M22-M27 po jednej trzeciej na zadania Z6, Z7 i Z9 (równoległa praca nad trzema zadaniami), w M28-M30 100% na zadanie Z9. Suma udziałów w każdym miesiącu równa się 0,50 etatu, a w całym okresie M19-M30 6,00 etatomiesiąca. Stawkę brutto zweryfikowano na podstawie Hays „Raport płacowy 2026”, sekcja Logistyka i zakupy , tabela Logistyka, „Specjalista ds. Logistyki” 8000/10000/13000 (s. 40), 10000 = wartość optymalna. Wynagrodzenie niezbędne do realizacji prac B+R. Forma zatrudnienia: umowa o pracę.</w:t>
+        <w:t>Koszt = 10 000,00 zł brutto/mc x narzut pracodawcy 1,205 = 12 050,00 zł/mc x 1,75 etatomiesiąca (miesięcy pracy w przeliczeniu na pełny etat) = 21 087,50 zł. Nakład w zadaniu Z7 wynosi 3 mc (M19-M21) x 50% x 0,50 etatu + 6 mc (M22-M27) x 1/3 x 0,50 etatu = 1,75 etatomiesiąca. Udziały czasu pracy w projekcie są stałe w trzech okresach i wpisane w zakresie czynności pracownika: w M19-M21 po 50% na zadania Z6 i Z7, w M22-M27 po jednej trzeciej na zadania Z6, Z7 i Z9 (równoległa praca nad trzema zadaniami), w M28-M30 100% na zadanie Z9. Suma udziałów w każdym miesiącu równa się 0,50 etatu, a w całym okresie M19-M30 6,00 etatomiesiąca. Stawkę brutto zweryfikowano na podstawie Hays „Raport płacowy 2026”, sekcja Logistyka i zakupy, tabela Logistyka, „Specjalista ds. Logistyki” 8000/10000/13000 (s. 40), 10000 = wartość optymalna. Wynagrodzenie niezbędne do realizacji prac B+R. Forma zatrudnienia: umowa o pracę.</w:t>
       </w:r>
     </w:p>
     <w:p>
@@ -9472,7 +9472,7 @@
           <w:color w:val="666666"/>
           <w:sz w:val="17"/>
         </w:rPr>
-        <w:t xml:space="preserve"> [918 z 1500 znaków]</w:t>
+        <w:t xml:space="preserve"> [917 z 1500 znaków]</w:t>
       </w:r>
     </w:p>
     <w:p>
@@ -9484,7 +9484,7 @@
         <w:rPr>
           <w:b w:val="0"/>
         </w:rPr>
-        <w:t>Koszt = 10 000,00 zł brutto/mc x narzut pracodawcy 1,205 = 12 050,00 zł/mc x 2,50 etatomiesiąca (miesięcy pracy w przeliczeniu na pełny etat) = 30 125,00 zł. Nakład w zadaniu Z9 wynosi 6 mc (M22-M27) x 1/3 x 0,50 etatu + 3 mc (M28-M30) x 100% x 0,50 etatu = 2,50 etatomiesiąca. Udziały czasu pracy w projekcie są stałe w trzech okresach i wpisane w zakresie czynności pracownika: w M19-M21 po 50% na zadania Z6 i Z7, w M22-M27 po jednej trzeciej na zadania Z6, Z7 i Z9 (równoległa praca nad trzema zadaniami), w M28-M30 100% na zadanie Z9. Suma udziałów w każdym miesiącu równa się 0,50 etatu, a w całym okresie M19-M30 6,00 etatomiesiąca. Stawkę brutto zweryfikowano na podstawie Hays „Raport płacowy 2026”, sekcja Logistyka i zakupy , tabela Logistyka, „Specjalista ds. Logistyki” 8000/10000/13000 (s. 40), 10000 = wartość optymalna. Wynagrodzenie niezbędne do realizacji prac B+R. Forma zatrudnienia: umowa o pracę.</w:t>
+        <w:t>Koszt = 10 000,00 zł brutto/mc x narzut pracodawcy 1,205 = 12 050,00 zł/mc x 2,50 etatomiesiąca (miesięcy pracy w przeliczeniu na pełny etat) = 30 125,00 zł. Nakład w zadaniu Z9 wynosi 6 mc (M22-M27) x 1/3 x 0,50 etatu + 3 mc (M28-M30) x 100% x 0,50 etatu = 2,50 etatomiesiąca. Udziały czasu pracy w projekcie są stałe w trzech okresach i wpisane w zakresie czynności pracownika: w M19-M21 po 50% na zadania Z6 i Z7, w M22-M27 po jednej trzeciej na zadania Z6, Z7 i Z9 (równoległa praca nad trzema zadaniami), w M28-M30 100% na zadanie Z9. Suma udziałów w każdym miesiącu równa się 0,50 etatu, a w całym okresie M19-M30 6,00 etatomiesiąca. Stawkę brutto zweryfikowano na podstawie Hays „Raport płacowy 2026”, sekcja Logistyka i zakupy, tabela Logistyka, „Specjalista ds. Logistyki” 8000/10000/13000 (s. 40), 10000 = wartość optymalna. Wynagrodzenie niezbędne do realizacji prac B+R. Forma zatrudnienia: umowa o pracę.</w:t>
       </w:r>
     </w:p>
     <w:p>

</xml_diff>

<commit_message>
D29: M19-M21 40/60 (Z6/Z7), przeliczenie kosztow i opisow
Co-Authored-By: Claude Sonnet 5.5 <noreply@anthropic.com>
Claude-Session: https://claude.ai/code/session_01672WnJhixnEcarbb7uiwfx
</commit_message>
<xml_diff>
--- a/Opisy_zadan_z_kamieniami_milowymi.docx
+++ b/Opisy_zadan_z_kamieniami_milowymi.docx
@@ -2645,7 +2645,7 @@
           <w:color w:val="666666"/>
           <w:sz w:val="17"/>
         </w:rPr>
-        <w:t xml:space="preserve"> [3900 z 4000 znaków]</w:t>
+        <w:t xml:space="preserve"> [3897 z 4000 znaków]</w:t>
       </w:r>
     </w:p>
     <w:p>
@@ -2733,7 +2733,7 @@
         <w:rPr>
           <w:b w:val="0"/>
         </w:rPr>
-        <w:t>Zadanie będzie realizowane przez zespół Everest11. AI Lead zaprojektuje architekturę pipeline'u i fuzję źródeł oraz zoptymalizuje czas generacji. AI Senior Engineer zaimplementuje integrację change detection i generator raportu klasyfikatora ML z wyjaśnieniami SHAP. Cybersecurity / AI Act Specialist zaimplementuje podpis kryptograficzny i integralność łańcucha dowodowego, bez prac prawnych i dokumentacyjnych. IT Specialist zaimplementuje pipeline i generator eFTI w XML i JSON, dwukierunkowe API z TMS oraz prototypowe integracje z Trans.eu, TimoCom i e-CMR w środowisku testowym, a także zmierzy czasy i opóźnienia w testach integracyjnych. Backend/Full-Stack Developer, w wymiarze 1,0 etatu przez 9 miesięcy od M19 do M27, zbuduje strumieniowy potok danych z embedded do pipeline'u, kolejkowanie i spójność przy utracie łączności, wesprze integracje testowe z TMS i platformami zewnętrznymi oraz wykona test zgodności eFTI z implementacją referencyjną Komisji Europejskiej. IoT Specialist zintegruje sygnał czujnika drzwi, synchronizację znaczników czasu GPS i agregację historii drgań, temperatury i wilgotności. Specjalista ds. logistyki TSL zinterpretuje operacyjnie pola eFTI i oceni treść PoL i PoC. Nakład, wynikający z podziału etatów między zadania Z6, Z7 i Z9 według stałych udziałów w trzech okresach, wynosi w miesiącach pracy w przeliczeniu na pełny etat: AI Lead 2,625, AI Senior Engineer 2,625, specjalista ds. cyberbezpieczeństwa 0,875, IT Specialist 3,50, IoT Specialist 1,75, specjalista ds. logistyki TSL 1,75.</w:t>
+        <w:t>Zadanie będzie realizowane przez zespół Everest11. AI Lead zaprojektuje architekturę pipeline'u i fuzję źródeł oraz zoptymalizuje czas generacji. AI Senior Engineer zaimplementuje integrację change detection i generator raportu klasyfikatora ML z wyjaśnieniami SHAP. Cybersecurity / AI Act Specialist zaimplementuje podpis kryptograficzny i integralność łańcucha dowodowego, bez prac prawnych i dokumentacyjnych. IT Specialist zaimplementuje pipeline i generator eFTI w XML i JSON, dwukierunkowe API z TMS oraz prototypowe integracje z Trans.eu, TimoCom i e-CMR w środowisku testowym, a także zmierzy czasy i opóźnienia w testach integracyjnych. Backend/Full-Stack Developer, w wymiarze 1,0 etatu przez 9 miesięcy od M19 do M27, zbuduje strumieniowy potok danych z embedded do pipeline'u, kolejkowanie i spójność przy utracie łączności, wesprze integracje testowe z TMS i platformami zewnętrznymi oraz wykona test zgodności eFTI z implementacją referencyjną Komisji Europejskiej. IoT Specialist zintegruje sygnał czujnika drzwi, synchronizację znaczników czasu GPS i agregację historii drgań, temperatury i wilgotności. Specjalista ds. logistyki TSL zinterpretuje operacyjnie pola eFTI i oceni treść PoL i PoC. Nakład, wynikający z podziału etatów między zadania Z6, Z7 i Z9 według stałych udziałów w trzech okresach, wynosi w miesiącach pracy w przeliczeniu na pełny etat: AI Lead 2,40, AI Senior Engineer 2,40, specjalista ds. cyberbezpieczeństwa 0,80, IT Specialist 3,20, IoT Specialist 1,60, specjalista ds. logistyki TSL 1,60.</w:t>
       </w:r>
     </w:p>
     <w:p>
@@ -3144,7 +3144,7 @@
           <w:color w:val="666666"/>
           <w:sz w:val="17"/>
         </w:rPr>
-        <w:t xml:space="preserve"> [3529 z 4000 znaków]</w:t>
+        <w:t xml:space="preserve"> [3526 z 4000 znaków]</w:t>
       </w:r>
     </w:p>
     <w:p>
@@ -3232,7 +3232,7 @@
         <w:rPr>
           <w:b w:val="0"/>
         </w:rPr>
-        <w:t>Zadanie będzie realizowane przez zespół Everest11. AI Lead wyznaczy strategię kompresji dla każdego modelu i budżet degradacji oraz zwaliduje modele na zbiorach testowych. AI Senior Engineer zaimplementuje kompresję i zoptymalizuje modele na platformie embedded. IoT Specialist zaprojektuje architekturę sprzętową i obudowę oraz zmierzy opóźnienie alertu. IT Specialist zaimplementuje oprogramowanie embedded (system czasu rzeczywistego, sterowniki sensorów, generator alertów, bufor GSM, aktualizacje OTA) i moduł komunikacji z TMS. Cybersecurity / AI Act Specialist zaprojektuje bezpieczny rozruch, podpisywanie aktualizacji i szyfrowanie transmisji. Specjalista ds. logistyki TSL zdefiniuje scenariusze walidacji alertów i progi niski, średni i wysoki dla każdej klasy ładunku oraz oceni użyteczność alertu w kabinie. Nakład, wynikający z podziału etatów między zadania Z6, Z7 i Z9 według stałych udziałów w trzech okresach, wynosi w miesiącach pracy w przeliczeniu na pełny etat: AI Lead 2,625, AI Senior Engineer 2,625, specjalista ds. cyberbezpieczeństwa 0,875, IT Specialist 3,50, IoT Specialist 1,75, specjalista ds. logistyki TSL 1,75. Montaż w pojazdach nie należy do tego zadania.</w:t>
+        <w:t>Zadanie będzie realizowane przez zespół Everest11. AI Lead wyznaczy strategię kompresji dla każdego modelu i budżet degradacji oraz zwaliduje modele na zbiorach testowych. AI Senior Engineer zaimplementuje kompresję i zoptymalizuje modele na platformie embedded. IoT Specialist zaprojektuje architekturę sprzętową i obudowę oraz zmierzy opóźnienie alertu. IT Specialist zaimplementuje oprogramowanie embedded (system czasu rzeczywistego, sterowniki sensorów, generator alertów, bufor GSM, aktualizacje OTA) i moduł komunikacji z TMS. Cybersecurity / AI Act Specialist zaprojektuje bezpieczny rozruch, podpisywanie aktualizacji i szyfrowanie transmisji. Specjalista ds. logistyki TSL zdefiniuje scenariusze walidacji alertów i progi niski, średni i wysoki dla każdej klasy ładunku oraz oceni użyteczność alertu w kabinie. Nakład, wynikający z podziału etatów między zadania Z6, Z7 i Z9 według stałych udziałów w trzech okresach, wynosi w miesiącach pracy w przeliczeniu na pełny etat: AI Lead 2,85, AI Senior Engineer 2,85, specjalista ds. cyberbezpieczeństwa 0,95, IT Specialist 3,80, IoT Specialist 1,90, specjalista ds. logistyki TSL 1,90. Montaż w pojazdach nie należy do tego zadania.</w:t>
       </w:r>
     </w:p>
     <w:p>
@@ -7071,7 +7071,7 @@
         <w:rPr>
           <w:b w:val="0"/>
         </w:rPr>
-        <w:t>Budżet dzielił dotąd 12 miesięcy fazy prac rozwojowych równo na trzy zadania, co ekspert zakwestionował w uwagach 36 i 37 (zadania Z6 i Z7 trwają 9 miesięcy, a koszt odpowiadał 12 miesiącom). Przyjęty wariant, uzgodniony z właścicielem, ma trzy okresy ze stałymi udziałami czasu pracy: w M19-M21 działają tylko zadania Z6 i Z7 (po 50% czasu pracy w projekcie), w M22-M27 równolegle trzy zadania (po jednej trzeciej), w M28-M30 tylko zadanie Z9 (100%). Udziały są takie same dla wszystkich sześciu stanowisk, więc w zakresie czynności każdej osoby wpisuje się trzy stałe proporcje. Suma nakładów w każdym miesiącu równa się etatowi stanowiska, a koszt łączny każdego stanowiska nie zmienia się. Wszystkie trzy zadania są pracami rozwojowymi o tej samej intensywności pomocy (60%), więc kwota dofinansowania nie zmienia się.</w:t>
+        <w:t>Budżet dzielił dotąd 12 miesięcy fazy prac rozwojowych równo na trzy zadania, co ekspert zakwestionował w uwagach 36 i 37 (zadania Z6 i Z7 trwają 9 miesięcy, a koszt odpowiadał 12 miesiącom). Przyjęty wariant, uzgodniony z właścicielem, ma trzy okresy ze stałymi udziałami czasu pracy: w M19-M21 działają tylko zadania Z6 i Z7 (40% i 60% czasu pracy w projekcie, bo zadanie Z7 wymaga wcześniejszego projektu sprzętu i pierwszych egzemplarzy platformy na M22), w M22-M27 równolegle trzy zadania (po jednej trzeciej), w M28-M30 tylko zadanie Z9 (100%). Udziały są takie same dla wszystkich sześciu stanowisk, więc w zakresie czynności każdej osoby wpisuje się trzy stałe proporcje. Suma nakładów w każdym miesiącu równa się etatowi stanowiska, a koszt łączny każdego stanowiska nie zmienia się. Wszystkie trzy zadania są pracami rozwojowymi o tej samej intensywności pomocy (60%), więc kwota dofinansowania nie zmienia się.</w:t>
       </w:r>
     </w:p>
     <w:p>
@@ -7224,7 +7224,7 @@
                 <w:b w:val="0"/>
                 <w:sz w:val="17"/>
               </w:rPr>
-              <w:t>50% / 50% / 0%</w:t>
+              <w:t>40% / 60% / 0%</w:t>
             </w:r>
           </w:p>
         </w:tc>
@@ -7242,7 +7242,7 @@
                 <w:b w:val="0"/>
                 <w:sz w:val="17"/>
               </w:rPr>
-              <w:t>Z9 jeszcze się nie zaczęło</w:t>
+              <w:t>Z7 wcześniej: projekt sprzętu, pierwsze egzemplarze na M22</w:t>
             </w:r>
           </w:p>
         </w:tc>
@@ -7620,7 +7620,7 @@
                 <w:b w:val="0"/>
                 <w:sz w:val="16"/>
               </w:rPr>
-              <w:t>2,625</w:t>
+              <w:t>2,40</w:t>
             </w:r>
           </w:p>
         </w:tc>
@@ -7638,7 +7638,7 @@
                 <w:b w:val="0"/>
                 <w:sz w:val="16"/>
               </w:rPr>
-              <w:t>2,625</w:t>
+              <w:t>2,85</w:t>
             </w:r>
           </w:p>
         </w:tc>
@@ -7674,7 +7674,7 @@
                 <w:b w:val="0"/>
                 <w:sz w:val="16"/>
               </w:rPr>
-              <w:t>72 751,88</w:t>
+              <w:t>66 516,00</w:t>
             </w:r>
           </w:p>
         </w:tc>
@@ -7692,7 +7692,7 @@
                 <w:b w:val="0"/>
                 <w:sz w:val="16"/>
               </w:rPr>
-              <w:t>72 751,88</w:t>
+              <w:t>78 987,75</w:t>
             </w:r>
           </w:p>
         </w:tc>
@@ -7710,7 +7710,7 @@
                 <w:b w:val="0"/>
                 <w:sz w:val="16"/>
               </w:rPr>
-              <w:t>103 931,24</w:t>
+              <w:t>103 931,25</w:t>
             </w:r>
           </w:p>
         </w:tc>
@@ -7766,7 +7766,7 @@
                 <w:b w:val="0"/>
                 <w:sz w:val="16"/>
               </w:rPr>
-              <w:t>2,625</w:t>
+              <w:t>2,40</w:t>
             </w:r>
           </w:p>
         </w:tc>
@@ -7784,7 +7784,7 @@
                 <w:b w:val="0"/>
                 <w:sz w:val="16"/>
               </w:rPr>
-              <w:t>2,625</w:t>
+              <w:t>2,85</w:t>
             </w:r>
           </w:p>
         </w:tc>
@@ -7820,7 +7820,7 @@
                 <w:b w:val="0"/>
                 <w:sz w:val="16"/>
               </w:rPr>
-              <w:t>52 191,56</w:t>
+              <w:t>47 718,00</w:t>
             </w:r>
           </w:p>
         </w:tc>
@@ -7838,7 +7838,7 @@
                 <w:b w:val="0"/>
                 <w:sz w:val="16"/>
               </w:rPr>
-              <w:t>52 191,56</w:t>
+              <w:t>56 665,12</w:t>
             </w:r>
           </w:p>
         </w:tc>
@@ -7912,7 +7912,7 @@
                 <w:b w:val="0"/>
                 <w:sz w:val="16"/>
               </w:rPr>
-              <w:t>0,875</w:t>
+              <w:t>0,80</w:t>
             </w:r>
           </w:p>
         </w:tc>
@@ -7930,7 +7930,7 @@
                 <w:b w:val="0"/>
                 <w:sz w:val="16"/>
               </w:rPr>
-              <w:t>0,875</w:t>
+              <w:t>0,95</w:t>
             </w:r>
           </w:p>
         </w:tc>
@@ -7966,7 +7966,7 @@
                 <w:b w:val="0"/>
                 <w:sz w:val="16"/>
               </w:rPr>
-              <w:t>22 141,88</w:t>
+              <w:t>20 244,00</w:t>
             </w:r>
           </w:p>
         </w:tc>
@@ -7984,7 +7984,7 @@
                 <w:b w:val="0"/>
                 <w:sz w:val="16"/>
               </w:rPr>
-              <w:t>22 141,88</w:t>
+              <w:t>24 039,75</w:t>
             </w:r>
           </w:p>
         </w:tc>
@@ -8002,7 +8002,7 @@
                 <w:b w:val="0"/>
                 <w:sz w:val="16"/>
               </w:rPr>
-              <w:t>31 631,24</w:t>
+              <w:t>31 631,25</w:t>
             </w:r>
           </w:p>
         </w:tc>
@@ -8058,7 +8058,7 @@
                 <w:b w:val="0"/>
                 <w:sz w:val="16"/>
               </w:rPr>
-              <w:t>3,50</w:t>
+              <w:t>3,20</w:t>
             </w:r>
           </w:p>
         </w:tc>
@@ -8076,7 +8076,7 @@
                 <w:b w:val="0"/>
                 <w:sz w:val="16"/>
               </w:rPr>
-              <w:t>3,50</w:t>
+              <w:t>3,80</w:t>
             </w:r>
           </w:p>
         </w:tc>
@@ -8112,7 +8112,7 @@
                 <w:b w:val="0"/>
                 <w:sz w:val="16"/>
               </w:rPr>
-              <w:t>80 132,50</w:t>
+              <w:t>73 264,00</w:t>
             </w:r>
           </w:p>
         </w:tc>
@@ -8130,7 +8130,7 @@
                 <w:b w:val="0"/>
                 <w:sz w:val="16"/>
               </w:rPr>
-              <w:t>80 132,50</w:t>
+              <w:t>87 001,00</w:t>
             </w:r>
           </w:p>
         </w:tc>
@@ -8204,7 +8204,7 @@
                 <w:b w:val="0"/>
                 <w:sz w:val="16"/>
               </w:rPr>
-              <w:t>1,75</w:t>
+              <w:t>1,60</w:t>
             </w:r>
           </w:p>
         </w:tc>
@@ -8222,7 +8222,7 @@
                 <w:b w:val="0"/>
                 <w:sz w:val="16"/>
               </w:rPr>
-              <w:t>1,75</w:t>
+              <w:t>1,90</w:t>
             </w:r>
           </w:p>
         </w:tc>
@@ -8258,7 +8258,7 @@
                 <w:b w:val="0"/>
                 <w:sz w:val="16"/>
               </w:rPr>
-              <w:t>31 631,25</w:t>
+              <w:t>28 920,00</w:t>
             </w:r>
           </w:p>
         </w:tc>
@@ -8276,7 +8276,7 @@
                 <w:b w:val="0"/>
                 <w:sz w:val="16"/>
               </w:rPr>
-              <w:t>31 631,25</w:t>
+              <w:t>34 342,50</w:t>
             </w:r>
           </w:p>
         </w:tc>
@@ -8350,7 +8350,7 @@
                 <w:b w:val="0"/>
                 <w:sz w:val="16"/>
               </w:rPr>
-              <w:t>1,75</w:t>
+              <w:t>1,60</w:t>
             </w:r>
           </w:p>
         </w:tc>
@@ -8368,7 +8368,7 @@
                 <w:b w:val="0"/>
                 <w:sz w:val="16"/>
               </w:rPr>
-              <w:t>1,75</w:t>
+              <w:t>1,90</w:t>
             </w:r>
           </w:p>
         </w:tc>
@@ -8404,7 +8404,7 @@
                 <w:b w:val="0"/>
                 <w:sz w:val="16"/>
               </w:rPr>
-              <w:t>21 087,50</w:t>
+              <w:t>19 280,00</w:t>
             </w:r>
           </w:p>
         </w:tc>
@@ -8422,7 +8422,7 @@
                 <w:b w:val="0"/>
                 <w:sz w:val="16"/>
               </w:rPr>
-              <w:t>21 087,50</w:t>
+              <w:t>22 895,00</w:t>
             </w:r>
           </w:p>
         </w:tc>
@@ -8661,7 +8661,7 @@
                 <w:b w:val="0"/>
                 <w:sz w:val="16"/>
               </w:rPr>
-              <w:t>475 146,57</w:t>
+              <w:t>451 152,00</w:t>
             </w:r>
           </w:p>
         </w:tc>
@@ -8679,7 +8679,7 @@
                 <w:b w:val="0"/>
                 <w:sz w:val="16"/>
               </w:rPr>
-              <w:t>279 936,57</w:t>
+              <w:t>303 931,12</w:t>
             </w:r>
           </w:p>
         </w:tc>
@@ -8697,7 +8697,7 @@
                 <w:b w:val="0"/>
                 <w:sz w:val="16"/>
               </w:rPr>
-              <w:t>464 979,36</w:t>
+              <w:t>464 979,38</w:t>
             </w:r>
           </w:p>
         </w:tc>
@@ -8880,7 +8880,7 @@
           <w:color w:val="666666"/>
           <w:sz w:val="17"/>
         </w:rPr>
-        <w:t xml:space="preserve"> [924 z 1500 znaków]</w:t>
+        <w:t xml:space="preserve"> [1020 z 1500 znaków]</w:t>
       </w:r>
     </w:p>
     <w:p>
@@ -8892,7 +8892,7 @@
         <w:rPr>
           <w:b w:val="0"/>
         </w:rPr>
-        <w:t>Koszt = 23 000,00 zł brutto/mc x narzut pracodawcy 1,205 = 27 715,00 zł/mc x 2,625 etatomiesiąca (miesięcy pracy w przeliczeniu na pełny etat) = 72 751,88 zł. Nakład w zadaniu Z6 wynosi 3 mc (M19-M21) x 50% x 0,75 etatu + 6 mc (M22-M27) x 1/3 x 0,75 etatu = 2,625 etatomiesiąca. Udziały czasu pracy w projekcie są stałe w trzech okresach i wpisane w zakresie czynności pracownika: w M19-M21 po 50% na zadania Z6 i Z7, w M22-M27 po jednej trzeciej na zadania Z6, Z7 i Z9 (równoległa praca nad trzema zadaniami), w M28-M30 100% na zadanie Z9. Suma udziałów w każdym miesiącu równa się 0,75 etatu, a w całym okresie M19-M30 9,00 etatomiesiąca. Stawkę brutto zweryfikowano na podstawie No Fluff Jobs „Rynek pracy IT 2025/2026”, kat. AI poziom Senior, UoP 20000-29000 (s. 33; tabela zbiorcza 19000-24000, s. 27), 23000 w środku pasma senior/lead. Wynagrodzenie niezbędne do realizacji prac B+R. Forma zatrudnienia: umowa o pracę.</w:t>
+        <w:t>Koszt = 23 000,00 zł brutto/mc x narzut pracodawcy 1,205 = 27 715,00 zł/mc x 2,40 etatomiesiąca (miesięcy pracy w przeliczeniu na pełny etat) = 66 516,00 zł. Nakład w zadaniu Z6 wynosi 3 mc (M19-M21) x 40% x 0,75 etatu + 6 mc (M22-M27) x 1/3 x 0,75 etatu = 2,40 etatomiesiąca. Udziały czasu pracy w projekcie są stałe w trzech okresach i wpisane w zakresie czynności pracownika: w M19-M21 40% na zadanie Z6 i 60% na zadanie Z7 (Z7 wymaga wcześniejszego projektu sprzętu i pierwszych egzemplarzy platformy na M22), w M22-M27 po jednej trzeciej na zadania Z6, Z7 i Z9 (równoległa praca nad trzema zadaniami), w M28-M30 100% na zadanie Z9. Suma udziałów w każdym miesiącu równa się 0,75 etatu, a w całym okresie M19-M30 9,00 etatomiesiąca. Stawkę brutto zweryfikowano na podstawie No Fluff Jobs „Rynek pracy IT 2025/2026”, kat. AI poziom Senior, UoP 20000-29000 (s. 33; tabela zbiorcza 19000-24000, s. 27), 23000 w środku pasma senior/lead. Wynagrodzenie niezbędne do realizacji prac B+R. Forma zatrudnienia: umowa o pracę.</w:t>
       </w:r>
     </w:p>
     <w:p>
@@ -8912,7 +8912,7 @@
           <w:color w:val="666666"/>
           <w:sz w:val="17"/>
         </w:rPr>
-        <w:t xml:space="preserve"> [937 z 1500 znaków]</w:t>
+        <w:t xml:space="preserve"> [1033 z 1500 znaków]</w:t>
       </w:r>
     </w:p>
     <w:p>
@@ -8924,7 +8924,7 @@
         <w:rPr>
           <w:b w:val="0"/>
         </w:rPr>
-        <w:t>Koszt = 16 500,00 zł brutto/mc x narzut pracodawcy 1,205 = 19 882,50 zł/mc x 2,625 etatomiesiąca (miesięcy pracy w przeliczeniu na pełny etat) = 52 191,56 zł. Nakład w zadaniu Z6 wynosi 3 mc (M19-M21) x 50% x 0,75 etatu + 6 mc (M22-M27) x 1/3 x 0,75 etatu = 2,625 etatomiesiąca. Udziały czasu pracy w projekcie są stałe w trzech okresach i wpisane w zakresie czynności pracownika: w M19-M21 po 50% na zadania Z6 i Z7, w M22-M27 po jednej trzeciej na zadania Z6, Z7 i Z9 (równoległa praca nad trzema zadaniami), w M28-M30 100% na zadanie Z9. Suma udziałów w każdym miesiącu równa się 0,75 etatu, a w całym okresie M19-M30 9,00 etatomiesiąca. Stawkę brutto zweryfikowano na podstawie No Fluff Jobs „Rynek pracy IT 2025/2026”, kat. AI (s. 33): Senior 20000-29000, Mid 14000-21000, 16500 w paśmie Mid, poniżej dolnej mediany Senior (założenie konserwatywne). Wynagrodzenie niezbędne do realizacji prac B+R. Forma zatrudnienia: umowa o pracę.</w:t>
+        <w:t>Koszt = 16 500,00 zł brutto/mc x narzut pracodawcy 1,205 = 19 882,50 zł/mc x 2,40 etatomiesiąca (miesięcy pracy w przeliczeniu na pełny etat) = 47 718,00 zł. Nakład w zadaniu Z6 wynosi 3 mc (M19-M21) x 40% x 0,75 etatu + 6 mc (M22-M27) x 1/3 x 0,75 etatu = 2,40 etatomiesiąca. Udziały czasu pracy w projekcie są stałe w trzech okresach i wpisane w zakresie czynności pracownika: w M19-M21 40% na zadanie Z6 i 60% na zadanie Z7 (Z7 wymaga wcześniejszego projektu sprzętu i pierwszych egzemplarzy platformy na M22), w M22-M27 po jednej trzeciej na zadania Z6, Z7 i Z9 (równoległa praca nad trzema zadaniami), w M28-M30 100% na zadanie Z9. Suma udziałów w każdym miesiącu równa się 0,75 etatu, a w całym okresie M19-M30 9,00 etatomiesiąca. Stawkę brutto zweryfikowano na podstawie No Fluff Jobs „Rynek pracy IT 2025/2026”, kat. AI (s. 33): Senior 20000-29000, Mid 14000-21000, 16500 w paśmie Mid, poniżej dolnej mediany Senior (założenie konserwatywne). Wynagrodzenie niezbędne do realizacji prac B+R. Forma zatrudnienia: umowa o pracę.</w:t>
       </w:r>
     </w:p>
     <w:p>
@@ -8944,7 +8944,7 @@
           <w:color w:val="666666"/>
           <w:sz w:val="17"/>
         </w:rPr>
-        <w:t xml:space="preserve"> [922 z 1500 znaków]</w:t>
+        <w:t xml:space="preserve"> [1018 z 1500 znaków]</w:t>
       </w:r>
     </w:p>
     <w:p>
@@ -8956,7 +8956,7 @@
         <w:rPr>
           <w:b w:val="0"/>
         </w:rPr>
-        <w:t>Koszt = 21 000,00 zł brutto/mc x narzut pracodawcy 1,205 = 25 305,00 zł/mc x 0,875 etatomiesiąca (miesięcy pracy w przeliczeniu na pełny etat) = 22 141,88 zł. Nakład w zadaniu Z6 wynosi 3 mc (M19-M21) x 50% x 0,25 etatu + 6 mc (M22-M27) x 1/3 x 0,25 etatu = 0,875 etatomiesiąca. Udziały czasu pracy w projekcie są stałe w trzech okresach i wpisane w zakresie czynności pracownika: w M19-M21 po 50% na zadania Z6 i Z7, w M22-M27 po jednej trzeciej na zadania Z6, Z7 i Z9 (równoległa praca nad trzema zadaniami), w M28-M30 100% na zadanie Z9. Suma udziałów w każdym miesiącu równa się 0,25 etatu, a w całym okresie M19-M30 3,00 etatomiesiąca. Stawkę brutto zweryfikowano na podstawie No Fluff Jobs „Rynek pracy IT 2025/2026”, kat. Security poziom Senior, UoP 20000-28000 (s. 32; tabela zbiorcza 17000-23000, s. 27), 21000 w widełkach senior. Wynagrodzenie niezbędne do realizacji prac B+R. Forma zatrudnienia: umowa o pracę.</w:t>
+        <w:t>Koszt = 21 000,00 zł brutto/mc x narzut pracodawcy 1,205 = 25 305,00 zł/mc x 0,80 etatomiesiąca (miesięcy pracy w przeliczeniu na pełny etat) = 20 244,00 zł. Nakład w zadaniu Z6 wynosi 3 mc (M19-M21) x 40% x 0,25 etatu + 6 mc (M22-M27) x 1/3 x 0,25 etatu = 0,80 etatomiesiąca. Udziały czasu pracy w projekcie są stałe w trzech okresach i wpisane w zakresie czynności pracownika: w M19-M21 40% na zadanie Z6 i 60% na zadanie Z7 (Z7 wymaga wcześniejszego projektu sprzętu i pierwszych egzemplarzy platformy na M22), w M22-M27 po jednej trzeciej na zadania Z6, Z7 i Z9 (równoległa praca nad trzema zadaniami), w M28-M30 100% na zadanie Z9. Suma udziałów w każdym miesiącu równa się 0,25 etatu, a w całym okresie M19-M30 3,00 etatomiesiąca. Stawkę brutto zweryfikowano na podstawie No Fluff Jobs „Rynek pracy IT 2025/2026”, kat. Security poziom Senior, UoP 20000-28000 (s. 32; tabela zbiorcza 17000-23000, s. 27), 21000 w widełkach senior. Wynagrodzenie niezbędne do realizacji prac B+R. Forma zatrudnienia: umowa o pracę.</w:t>
       </w:r>
     </w:p>
     <w:p>
@@ -8976,7 +8976,7 @@
           <w:color w:val="666666"/>
           <w:sz w:val="17"/>
         </w:rPr>
-        <w:t xml:space="preserve"> [904 z 1500 znaków]</w:t>
+        <w:t xml:space="preserve"> [1002 z 1500 znaków]</w:t>
       </w:r>
     </w:p>
     <w:p>
@@ -8988,7 +8988,7 @@
         <w:rPr>
           <w:b w:val="0"/>
         </w:rPr>
-        <w:t>Koszt = 19 000,00 zł brutto/mc x narzut pracodawcy 1,205 = 22 895,00 zł/mc x 3,50 etatomiesiąca (miesięcy pracy w przeliczeniu na pełny etat) = 80 132,50 zł. Nakład w zadaniu Z6 wynosi 3 mc (M19-M21) x 50% x 1,00 etatu + 6 mc (M22-M27) x 1/3 x 1,00 etatu = 3,50 etatomiesiąca. Udziały czasu pracy w projekcie są stałe w trzech okresach i wpisane w zakresie czynności pracownika: w M19-M21 po 50% na zadania Z6 i Z7, w M22-M27 po jednej trzeciej na zadania Z6, Z7 i Z9 (równoległa praca nad trzema zadaniami), w M28-M30 100% na zadanie Z9. Suma udziałów w każdym miesiącu równa się 1,00 etatu, a w całym okresie M19-M30 12,00 etatomiesiąca. Stawkę brutto zweryfikowano na podstawie No Fluff Jobs „Rynek pracy IT 2025/2026”, kat. Backend/Fullstack poziom Senior, UoP 18500-25000 (s. 30), 19000 w dolnej części pasma senior. Wynagrodzenie niezbędne do realizacji prac B+R. Forma zatrudnienia: umowa o pracę.</w:t>
+        <w:t>Koszt = 19 000,00 zł brutto/mc x narzut pracodawcy 1,205 = 22 895,00 zł/mc x 3,20 etatomiesiąca (miesięcy pracy w przeliczeniu na pełny etat) = 73 264,00 zł. Nakład w zadaniu Z6 wynosi 3 mc (M19-M21) x 40% x 1,00 etatu + 6 mc (M22-M27) x 1/3 x 1,00 etatu = 3,20 etatomiesiąca. Udziały czasu pracy w projekcie są stałe w trzech okresach i wpisane w zakresie czynności pracownika: w M19-M21 40% na zadanie Z6 i 60% na zadanie Z7 (Z7 wymaga wcześniejszego projektu sprzętu i pierwszych egzemplarzy platformy na M22), w M22-M27 po jednej trzeciej na zadania Z6, Z7 i Z9 (równoległa praca nad trzema zadaniami), w M28-M30 100% na zadanie Z9. Suma udziałów w każdym miesiącu równa się 1,00 etatu, a w całym okresie M19-M30 12,00 etatomiesiąca. Stawkę brutto zweryfikowano na podstawie No Fluff Jobs „Rynek pracy IT 2025/2026”, kat. Backend/Fullstack poziom Senior, UoP 18500-25000 (s. 30), 19000 w dolnej części pasma senior. Wynagrodzenie niezbędne do realizacji prac B+R. Forma zatrudnienia: umowa o pracę.</w:t>
       </w:r>
     </w:p>
     <w:p>
@@ -9008,7 +9008,7 @@
           <w:color w:val="666666"/>
           <w:sz w:val="17"/>
         </w:rPr>
-        <w:t xml:space="preserve"> [968 z 1500 znaków]</w:t>
+        <w:t xml:space="preserve"> [1066 z 1500 znaków]</w:t>
       </w:r>
     </w:p>
     <w:p>
@@ -9020,7 +9020,7 @@
         <w:rPr>
           <w:b w:val="0"/>
         </w:rPr>
-        <w:t>Koszt = 15 000,00 zł brutto/mc x narzut pracodawcy 1,205 = 18 075,00 zł/mc x 1,75 etatomiesiąca (miesięcy pracy w przeliczeniu na pełny etat) = 31 631,25 zł. Nakład w zadaniu Z6 wynosi 3 mc (M19-M21) x 50% x 0,50 etatu + 6 mc (M22-M27) x 1/3 x 0,50 etatu = 1,75 etatomiesiąca. Udziały czasu pracy w projekcie są stałe w trzech okresach i wpisane w zakresie czynności pracownika: w M19-M21 po 50% na zadania Z6 i Z7, w M22-M27 po jednej trzeciej na zadania Z6, Z7 i Z9 (równoległa praca nad trzema zadaniami), w M28-M30 100% na zadanie Z9. Suma udziałów w każdym miesiącu równa się 0,50 etatu, a w całym okresie M19-M30 6,00 etatomiesiąca. Stawkę brutto zweryfikowano na podstawie No Fluff Jobs „Rynek pracy IT 2025/2026”, kat. Embedded (s. 27/35: 13000-19000, Mid 12000-17000); pomocniczo Hays „Raport płacowy 2026”, R&amp;D Engineer 13/16/18 tys. (s. 38), 15000 w widełkach kat. Embedded. Wynagrodzenie niezbędne do realizacji prac B+R. Forma zatrudnienia: umowa o pracę.</w:t>
+        <w:t>Koszt = 15 000,00 zł brutto/mc x narzut pracodawcy 1,205 = 18 075,00 zł/mc x 1,60 etatomiesiąca (miesięcy pracy w przeliczeniu na pełny etat) = 28 920,00 zł. Nakład w zadaniu Z6 wynosi 3 mc (M19-M21) x 40% x 0,50 etatu + 6 mc (M22-M27) x 1/3 x 0,50 etatu = 1,60 etatomiesiąca. Udziały czasu pracy w projekcie są stałe w trzech okresach i wpisane w zakresie czynności pracownika: w M19-M21 40% na zadanie Z6 i 60% na zadanie Z7 (Z7 wymaga wcześniejszego projektu sprzętu i pierwszych egzemplarzy platformy na M22), w M22-M27 po jednej trzeciej na zadania Z6, Z7 i Z9 (równoległa praca nad trzema zadaniami), w M28-M30 100% na zadanie Z9. Suma udziałów w każdym miesiącu równa się 0,50 etatu, a w całym okresie M19-M30 6,00 etatomiesiąca. Stawkę brutto zweryfikowano na podstawie No Fluff Jobs „Rynek pracy IT 2025/2026”, kat. Embedded (s. 27/35: 13000-19000, Mid 12000-17000); pomocniczo Hays „Raport płacowy 2026”, R&amp;D Engineer 13/16/18 tys. (s. 38), 15000 w widełkach kat. Embedded. Wynagrodzenie niezbędne do realizacji prac B+R. Forma zatrudnienia: umowa o pracę.</w:t>
       </w:r>
     </w:p>
     <w:p>
@@ -9040,7 +9040,7 @@
           <w:color w:val="666666"/>
           <w:sz w:val="17"/>
         </w:rPr>
-        <w:t xml:space="preserve"> [916 z 1500 znaków]</w:t>
+        <w:t xml:space="preserve"> [1014 z 1500 znaków]</w:t>
       </w:r>
     </w:p>
     <w:p>
@@ -9052,7 +9052,7 @@
         <w:rPr>
           <w:b w:val="0"/>
         </w:rPr>
-        <w:t>Koszt = 10 000,00 zł brutto/mc x narzut pracodawcy 1,205 = 12 050,00 zł/mc x 1,75 etatomiesiąca (miesięcy pracy w przeliczeniu na pełny etat) = 21 087,50 zł. Nakład w zadaniu Z6 wynosi 3 mc (M19-M21) x 50% x 0,50 etatu + 6 mc (M22-M27) x 1/3 x 0,50 etatu = 1,75 etatomiesiąca. Udziały czasu pracy w projekcie są stałe w trzech okresach i wpisane w zakresie czynności pracownika: w M19-M21 po 50% na zadania Z6 i Z7, w M22-M27 po jednej trzeciej na zadania Z6, Z7 i Z9 (równoległa praca nad trzema zadaniami), w M28-M30 100% na zadanie Z9. Suma udziałów w każdym miesiącu równa się 0,50 etatu, a w całym okresie M19-M30 6,00 etatomiesiąca. Stawkę brutto zweryfikowano na podstawie Hays „Raport płacowy 2026”, sekcja Logistyka i zakupy, tabela Logistyka, „Specjalista ds. Logistyki” 8000/10000/13000 (s. 40), 10000 = wartość optymalna. Wynagrodzenie niezbędne do realizacji prac B+R. Forma zatrudnienia: umowa o pracę.</w:t>
+        <w:t>Koszt = 10 000,00 zł brutto/mc x narzut pracodawcy 1,205 = 12 050,00 zł/mc x 1,60 etatomiesiąca (miesięcy pracy w przeliczeniu na pełny etat) = 19 280,00 zł. Nakład w zadaniu Z6 wynosi 3 mc (M19-M21) x 40% x 0,50 etatu + 6 mc (M22-M27) x 1/3 x 0,50 etatu = 1,60 etatomiesiąca. Udziały czasu pracy w projekcie są stałe w trzech okresach i wpisane w zakresie czynności pracownika: w M19-M21 40% na zadanie Z6 i 60% na zadanie Z7 (Z7 wymaga wcześniejszego projektu sprzętu i pierwszych egzemplarzy platformy na M22), w M22-M27 po jednej trzeciej na zadania Z6, Z7 i Z9 (równoległa praca nad trzema zadaniami), w M28-M30 100% na zadanie Z9. Suma udziałów w każdym miesiącu równa się 0,50 etatu, a w całym okresie M19-M30 6,00 etatomiesiąca. Stawkę brutto zweryfikowano na podstawie Hays „Raport płacowy 2026”, sekcja Logistyka i zakupy, tabela Logistyka, „Specjalista ds. Logistyki” 8000/10000/13000 (s. 40), 10000 = wartość optymalna. Wynagrodzenie niezbędne do realizacji prac B+R. Forma zatrudnienia: umowa o pracę.</w:t>
       </w:r>
     </w:p>
     <w:p>
@@ -9112,7 +9112,7 @@
           <w:color w:val="666666"/>
           <w:sz w:val="17"/>
         </w:rPr>
-        <w:t xml:space="preserve"> [924 z 1500 znaków]</w:t>
+        <w:t xml:space="preserve"> [1020 z 1500 znaków]</w:t>
       </w:r>
     </w:p>
     <w:p>
@@ -9124,7 +9124,7 @@
         <w:rPr>
           <w:b w:val="0"/>
         </w:rPr>
-        <w:t>Koszt = 23 000,00 zł brutto/mc x narzut pracodawcy 1,205 = 27 715,00 zł/mc x 2,625 etatomiesiąca (miesięcy pracy w przeliczeniu na pełny etat) = 72 751,88 zł. Nakład w zadaniu Z7 wynosi 3 mc (M19-M21) x 50% x 0,75 etatu + 6 mc (M22-M27) x 1/3 x 0,75 etatu = 2,625 etatomiesiąca. Udziały czasu pracy w projekcie są stałe w trzech okresach i wpisane w zakresie czynności pracownika: w M19-M21 po 50% na zadania Z6 i Z7, w M22-M27 po jednej trzeciej na zadania Z6, Z7 i Z9 (równoległa praca nad trzema zadaniami), w M28-M30 100% na zadanie Z9. Suma udziałów w każdym miesiącu równa się 0,75 etatu, a w całym okresie M19-M30 9,00 etatomiesiąca. Stawkę brutto zweryfikowano na podstawie No Fluff Jobs „Rynek pracy IT 2025/2026”, kat. AI poziom Senior, UoP 20000-29000 (s. 33; tabela zbiorcza 19000-24000, s. 27), 23000 w środku pasma senior/lead. Wynagrodzenie niezbędne do realizacji prac B+R. Forma zatrudnienia: umowa o pracę.</w:t>
+        <w:t>Koszt = 23 000,00 zł brutto/mc x narzut pracodawcy 1,205 = 27 715,00 zł/mc x 2,85 etatomiesiąca (miesięcy pracy w przeliczeniu na pełny etat) = 78 987,75 zł. Nakład w zadaniu Z7 wynosi 3 mc (M19-M21) x 60% x 0,75 etatu + 6 mc (M22-M27) x 1/3 x 0,75 etatu = 2,85 etatomiesiąca. Udziały czasu pracy w projekcie są stałe w trzech okresach i wpisane w zakresie czynności pracownika: w M19-M21 40% na zadanie Z6 i 60% na zadanie Z7 (Z7 wymaga wcześniejszego projektu sprzętu i pierwszych egzemplarzy platformy na M22), w M22-M27 po jednej trzeciej na zadania Z6, Z7 i Z9 (równoległa praca nad trzema zadaniami), w M28-M30 100% na zadanie Z9. Suma udziałów w każdym miesiącu równa się 0,75 etatu, a w całym okresie M19-M30 9,00 etatomiesiąca. Stawkę brutto zweryfikowano na podstawie No Fluff Jobs „Rynek pracy IT 2025/2026”, kat. AI poziom Senior, UoP 20000-29000 (s. 33; tabela zbiorcza 19000-24000, s. 27), 23000 w środku pasma senior/lead. Wynagrodzenie niezbędne do realizacji prac B+R. Forma zatrudnienia: umowa o pracę.</w:t>
       </w:r>
     </w:p>
     <w:p>
@@ -9144,7 +9144,7 @@
           <w:color w:val="666666"/>
           <w:sz w:val="17"/>
         </w:rPr>
-        <w:t xml:space="preserve"> [937 z 1500 znaków]</w:t>
+        <w:t xml:space="preserve"> [1033 z 1500 znaków]</w:t>
       </w:r>
     </w:p>
     <w:p>
@@ -9156,7 +9156,7 @@
         <w:rPr>
           <w:b w:val="0"/>
         </w:rPr>
-        <w:t>Koszt = 16 500,00 zł brutto/mc x narzut pracodawcy 1,205 = 19 882,50 zł/mc x 2,625 etatomiesiąca (miesięcy pracy w przeliczeniu na pełny etat) = 52 191,56 zł. Nakład w zadaniu Z7 wynosi 3 mc (M19-M21) x 50% x 0,75 etatu + 6 mc (M22-M27) x 1/3 x 0,75 etatu = 2,625 etatomiesiąca. Udziały czasu pracy w projekcie są stałe w trzech okresach i wpisane w zakresie czynności pracownika: w M19-M21 po 50% na zadania Z6 i Z7, w M22-M27 po jednej trzeciej na zadania Z6, Z7 i Z9 (równoległa praca nad trzema zadaniami), w M28-M30 100% na zadanie Z9. Suma udziałów w każdym miesiącu równa się 0,75 etatu, a w całym okresie M19-M30 9,00 etatomiesiąca. Stawkę brutto zweryfikowano na podstawie No Fluff Jobs „Rynek pracy IT 2025/2026”, kat. AI (s. 33): Senior 20000-29000, Mid 14000-21000, 16500 w paśmie Mid, poniżej dolnej mediany Senior (założenie konserwatywne). Wynagrodzenie niezbędne do realizacji prac B+R. Forma zatrudnienia: umowa o pracę.</w:t>
+        <w:t>Koszt = 16 500,00 zł brutto/mc x narzut pracodawcy 1,205 = 19 882,50 zł/mc x 2,85 etatomiesiąca (miesięcy pracy w przeliczeniu na pełny etat) = 56 665,12 zł. Nakład w zadaniu Z7 wynosi 3 mc (M19-M21) x 60% x 0,75 etatu + 6 mc (M22-M27) x 1/3 x 0,75 etatu = 2,85 etatomiesiąca. Udziały czasu pracy w projekcie są stałe w trzech okresach i wpisane w zakresie czynności pracownika: w M19-M21 40% na zadanie Z6 i 60% na zadanie Z7 (Z7 wymaga wcześniejszego projektu sprzętu i pierwszych egzemplarzy platformy na M22), w M22-M27 po jednej trzeciej na zadania Z6, Z7 i Z9 (równoległa praca nad trzema zadaniami), w M28-M30 100% na zadanie Z9. Suma udziałów w każdym miesiącu równa się 0,75 etatu, a w całym okresie M19-M30 9,00 etatomiesiąca. Stawkę brutto zweryfikowano na podstawie No Fluff Jobs „Rynek pracy IT 2025/2026”, kat. AI (s. 33): Senior 20000-29000, Mid 14000-21000, 16500 w paśmie Mid, poniżej dolnej mediany Senior (założenie konserwatywne). Wynagrodzenie niezbędne do realizacji prac B+R. Forma zatrudnienia: umowa o pracę.</w:t>
       </w:r>
     </w:p>
     <w:p>
@@ -9176,7 +9176,7 @@
           <w:color w:val="666666"/>
           <w:sz w:val="17"/>
         </w:rPr>
-        <w:t xml:space="preserve"> [922 z 1500 znaków]</w:t>
+        <w:t xml:space="preserve"> [1018 z 1500 znaków]</w:t>
       </w:r>
     </w:p>
     <w:p>
@@ -9188,7 +9188,7 @@
         <w:rPr>
           <w:b w:val="0"/>
         </w:rPr>
-        <w:t>Koszt = 21 000,00 zł brutto/mc x narzut pracodawcy 1,205 = 25 305,00 zł/mc x 0,875 etatomiesiąca (miesięcy pracy w przeliczeniu na pełny etat) = 22 141,88 zł. Nakład w zadaniu Z7 wynosi 3 mc (M19-M21) x 50% x 0,25 etatu + 6 mc (M22-M27) x 1/3 x 0,25 etatu = 0,875 etatomiesiąca. Udziały czasu pracy w projekcie są stałe w trzech okresach i wpisane w zakresie czynności pracownika: w M19-M21 po 50% na zadania Z6 i Z7, w M22-M27 po jednej trzeciej na zadania Z6, Z7 i Z9 (równoległa praca nad trzema zadaniami), w M28-M30 100% na zadanie Z9. Suma udziałów w każdym miesiącu równa się 0,25 etatu, a w całym okresie M19-M30 3,00 etatomiesiąca. Stawkę brutto zweryfikowano na podstawie No Fluff Jobs „Rynek pracy IT 2025/2026”, kat. Security poziom Senior, UoP 20000-28000 (s. 32; tabela zbiorcza 17000-23000, s. 27), 21000 w widełkach senior. Wynagrodzenie niezbędne do realizacji prac B+R. Forma zatrudnienia: umowa o pracę.</w:t>
+        <w:t>Koszt = 21 000,00 zł brutto/mc x narzut pracodawcy 1,205 = 25 305,00 zł/mc x 0,95 etatomiesiąca (miesięcy pracy w przeliczeniu na pełny etat) = 24 039,75 zł. Nakład w zadaniu Z7 wynosi 3 mc (M19-M21) x 60% x 0,25 etatu + 6 mc (M22-M27) x 1/3 x 0,25 etatu = 0,95 etatomiesiąca. Udziały czasu pracy w projekcie są stałe w trzech okresach i wpisane w zakresie czynności pracownika: w M19-M21 40% na zadanie Z6 i 60% na zadanie Z7 (Z7 wymaga wcześniejszego projektu sprzętu i pierwszych egzemplarzy platformy na M22), w M22-M27 po jednej trzeciej na zadania Z6, Z7 i Z9 (równoległa praca nad trzema zadaniami), w M28-M30 100% na zadanie Z9. Suma udziałów w każdym miesiącu równa się 0,25 etatu, a w całym okresie M19-M30 3,00 etatomiesiąca. Stawkę brutto zweryfikowano na podstawie No Fluff Jobs „Rynek pracy IT 2025/2026”, kat. Security poziom Senior, UoP 20000-28000 (s. 32; tabela zbiorcza 17000-23000, s. 27), 21000 w widełkach senior. Wynagrodzenie niezbędne do realizacji prac B+R. Forma zatrudnienia: umowa o pracę.</w:t>
       </w:r>
     </w:p>
     <w:p>
@@ -9208,7 +9208,7 @@
           <w:color w:val="666666"/>
           <w:sz w:val="17"/>
         </w:rPr>
-        <w:t xml:space="preserve"> [904 z 1500 znaków]</w:t>
+        <w:t xml:space="preserve"> [1002 z 1500 znaków]</w:t>
       </w:r>
     </w:p>
     <w:p>
@@ -9220,7 +9220,7 @@
         <w:rPr>
           <w:b w:val="0"/>
         </w:rPr>
-        <w:t>Koszt = 19 000,00 zł brutto/mc x narzut pracodawcy 1,205 = 22 895,00 zł/mc x 3,50 etatomiesiąca (miesięcy pracy w przeliczeniu na pełny etat) = 80 132,50 zł. Nakład w zadaniu Z7 wynosi 3 mc (M19-M21) x 50% x 1,00 etatu + 6 mc (M22-M27) x 1/3 x 1,00 etatu = 3,50 etatomiesiąca. Udziały czasu pracy w projekcie są stałe w trzech okresach i wpisane w zakresie czynności pracownika: w M19-M21 po 50% na zadania Z6 i Z7, w M22-M27 po jednej trzeciej na zadania Z6, Z7 i Z9 (równoległa praca nad trzema zadaniami), w M28-M30 100% na zadanie Z9. Suma udziałów w każdym miesiącu równa się 1,00 etatu, a w całym okresie M19-M30 12,00 etatomiesiąca. Stawkę brutto zweryfikowano na podstawie No Fluff Jobs „Rynek pracy IT 2025/2026”, kat. Backend/Fullstack poziom Senior, UoP 18500-25000 (s. 30), 19000 w dolnej części pasma senior. Wynagrodzenie niezbędne do realizacji prac B+R. Forma zatrudnienia: umowa o pracę.</w:t>
+        <w:t>Koszt = 19 000,00 zł brutto/mc x narzut pracodawcy 1,205 = 22 895,00 zł/mc x 3,80 etatomiesiąca (miesięcy pracy w przeliczeniu na pełny etat) = 87 001,00 zł. Nakład w zadaniu Z7 wynosi 3 mc (M19-M21) x 60% x 1,00 etatu + 6 mc (M22-M27) x 1/3 x 1,00 etatu = 3,80 etatomiesiąca. Udziały czasu pracy w projekcie są stałe w trzech okresach i wpisane w zakresie czynności pracownika: w M19-M21 40% na zadanie Z6 i 60% na zadanie Z7 (Z7 wymaga wcześniejszego projektu sprzętu i pierwszych egzemplarzy platformy na M22), w M22-M27 po jednej trzeciej na zadania Z6, Z7 i Z9 (równoległa praca nad trzema zadaniami), w M28-M30 100% na zadanie Z9. Suma udziałów w każdym miesiącu równa się 1,00 etatu, a w całym okresie M19-M30 12,00 etatomiesiąca. Stawkę brutto zweryfikowano na podstawie No Fluff Jobs „Rynek pracy IT 2025/2026”, kat. Backend/Fullstack poziom Senior, UoP 18500-25000 (s. 30), 19000 w dolnej części pasma senior. Wynagrodzenie niezbędne do realizacji prac B+R. Forma zatrudnienia: umowa o pracę.</w:t>
       </w:r>
     </w:p>
     <w:p>
@@ -9240,7 +9240,7 @@
           <w:color w:val="666666"/>
           <w:sz w:val="17"/>
         </w:rPr>
-        <w:t xml:space="preserve"> [968 z 1500 znaków]</w:t>
+        <w:t xml:space="preserve"> [1066 z 1500 znaków]</w:t>
       </w:r>
     </w:p>
     <w:p>
@@ -9252,7 +9252,7 @@
         <w:rPr>
           <w:b w:val="0"/>
         </w:rPr>
-        <w:t>Koszt = 15 000,00 zł brutto/mc x narzut pracodawcy 1,205 = 18 075,00 zł/mc x 1,75 etatomiesiąca (miesięcy pracy w przeliczeniu na pełny etat) = 31 631,25 zł. Nakład w zadaniu Z7 wynosi 3 mc (M19-M21) x 50% x 0,50 etatu + 6 mc (M22-M27) x 1/3 x 0,50 etatu = 1,75 etatomiesiąca. Udziały czasu pracy w projekcie są stałe w trzech okresach i wpisane w zakresie czynności pracownika: w M19-M21 po 50% na zadania Z6 i Z7, w M22-M27 po jednej trzeciej na zadania Z6, Z7 i Z9 (równoległa praca nad trzema zadaniami), w M28-M30 100% na zadanie Z9. Suma udziałów w każdym miesiącu równa się 0,50 etatu, a w całym okresie M19-M30 6,00 etatomiesiąca. Stawkę brutto zweryfikowano na podstawie No Fluff Jobs „Rynek pracy IT 2025/2026”, kat. Embedded (s. 27/35: 13000-19000, Mid 12000-17000); pomocniczo Hays „Raport płacowy 2026”, R&amp;D Engineer 13/16/18 tys. (s. 38), 15000 w widełkach kat. Embedded. Wynagrodzenie niezbędne do realizacji prac B+R. Forma zatrudnienia: umowa o pracę.</w:t>
+        <w:t>Koszt = 15 000,00 zł brutto/mc x narzut pracodawcy 1,205 = 18 075,00 zł/mc x 1,90 etatomiesiąca (miesięcy pracy w przeliczeniu na pełny etat) = 34 342,50 zł. Nakład w zadaniu Z7 wynosi 3 mc (M19-M21) x 60% x 0,50 etatu + 6 mc (M22-M27) x 1/3 x 0,50 etatu = 1,90 etatomiesiąca. Udziały czasu pracy w projekcie są stałe w trzech okresach i wpisane w zakresie czynności pracownika: w M19-M21 40% na zadanie Z6 i 60% na zadanie Z7 (Z7 wymaga wcześniejszego projektu sprzętu i pierwszych egzemplarzy platformy na M22), w M22-M27 po jednej trzeciej na zadania Z6, Z7 i Z9 (równoległa praca nad trzema zadaniami), w M28-M30 100% na zadanie Z9. Suma udziałów w każdym miesiącu równa się 0,50 etatu, a w całym okresie M19-M30 6,00 etatomiesiąca. Stawkę brutto zweryfikowano na podstawie No Fluff Jobs „Rynek pracy IT 2025/2026”, kat. Embedded (s. 27/35: 13000-19000, Mid 12000-17000); pomocniczo Hays „Raport płacowy 2026”, R&amp;D Engineer 13/16/18 tys. (s. 38), 15000 w widełkach kat. Embedded. Wynagrodzenie niezbędne do realizacji prac B+R. Forma zatrudnienia: umowa o pracę.</w:t>
       </w:r>
     </w:p>
     <w:p>
@@ -9272,7 +9272,7 @@
           <w:color w:val="666666"/>
           <w:sz w:val="17"/>
         </w:rPr>
-        <w:t xml:space="preserve"> [916 z 1500 znaków]</w:t>
+        <w:t xml:space="preserve"> [1014 z 1500 znaków]</w:t>
       </w:r>
     </w:p>
     <w:p>
@@ -9284,7 +9284,7 @@
         <w:rPr>
           <w:b w:val="0"/>
         </w:rPr>
-        <w:t>Koszt = 10 000,00 zł brutto/mc x narzut pracodawcy 1,205 = 12 050,00 zł/mc x 1,75 etatomiesiąca (miesięcy pracy w przeliczeniu na pełny etat) = 21 087,50 zł. Nakład w zadaniu Z7 wynosi 3 mc (M19-M21) x 50% x 0,50 etatu + 6 mc (M22-M27) x 1/3 x 0,50 etatu = 1,75 etatomiesiąca. Udziały czasu pracy w projekcie są stałe w trzech okresach i wpisane w zakresie czynności pracownika: w M19-M21 po 50% na zadania Z6 i Z7, w M22-M27 po jednej trzeciej na zadania Z6, Z7 i Z9 (równoległa praca nad trzema zadaniami), w M28-M30 100% na zadanie Z9. Suma udziałów w każdym miesiącu równa się 0,50 etatu, a w całym okresie M19-M30 6,00 etatomiesiąca. Stawkę brutto zweryfikowano na podstawie Hays „Raport płacowy 2026”, sekcja Logistyka i zakupy, tabela Logistyka, „Specjalista ds. Logistyki” 8000/10000/13000 (s. 40), 10000 = wartość optymalna. Wynagrodzenie niezbędne do realizacji prac B+R. Forma zatrudnienia: umowa o pracę.</w:t>
+        <w:t>Koszt = 10 000,00 zł brutto/mc x narzut pracodawcy 1,205 = 12 050,00 zł/mc x 1,90 etatomiesiąca (miesięcy pracy w przeliczeniu na pełny etat) = 22 895,00 zł. Nakład w zadaniu Z7 wynosi 3 mc (M19-M21) x 60% x 0,50 etatu + 6 mc (M22-M27) x 1/3 x 0,50 etatu = 1,90 etatomiesiąca. Udziały czasu pracy w projekcie są stałe w trzech okresach i wpisane w zakresie czynności pracownika: w M19-M21 40% na zadanie Z6 i 60% na zadanie Z7 (Z7 wymaga wcześniejszego projektu sprzętu i pierwszych egzemplarzy platformy na M22), w M22-M27 po jednej trzeciej na zadania Z6, Z7 i Z9 (równoległa praca nad trzema zadaniami), w M28-M30 100% na zadanie Z9. Suma udziałów w każdym miesiącu równa się 0,50 etatu, a w całym okresie M19-M30 6,00 etatomiesiąca. Stawkę brutto zweryfikowano na podstawie Hays „Raport płacowy 2026”, sekcja Logistyka i zakupy, tabela Logistyka, „Specjalista ds. Logistyki” 8000/10000/13000 (s. 40), 10000 = wartość optymalna. Wynagrodzenie niezbędne do realizacji prac B+R. Forma zatrudnienia: umowa o pracę.</w:t>
       </w:r>
     </w:p>
     <w:p>
@@ -9312,7 +9312,7 @@
           <w:color w:val="666666"/>
           <w:sz w:val="17"/>
         </w:rPr>
-        <w:t xml:space="preserve"> [924 z 1500 znaków]</w:t>
+        <w:t xml:space="preserve"> [1022 z 1500 znaków]</w:t>
       </w:r>
     </w:p>
     <w:p>
@@ -9324,7 +9324,7 @@
         <w:rPr>
           <w:b w:val="0"/>
         </w:rPr>
-        <w:t>Koszt = 23 000,00 zł brutto/mc x narzut pracodawcy 1,205 = 27 715,00 zł/mc x 3,75 etatomiesiąca (miesięcy pracy w przeliczeniu na pełny etat) = 103 931,24 zł. Nakład w zadaniu Z9 wynosi 6 mc (M22-M27) x 1/3 x 0,75 etatu + 3 mc (M28-M30) x 100% x 0,75 etatu = 3,75 etatomiesiąca. Udziały czasu pracy w projekcie są stałe w trzech okresach i wpisane w zakresie czynności pracownika: w M19-M21 po 50% na zadania Z6 i Z7, w M22-M27 po jednej trzeciej na zadania Z6, Z7 i Z9 (równoległa praca nad trzema zadaniami), w M28-M30 100% na zadanie Z9. Suma udziałów w każdym miesiącu równa się 0,75 etatu, a w całym okresie M19-M30 9,00 etatomiesiąca. Stawkę brutto zweryfikowano na podstawie No Fluff Jobs „Rynek pracy IT 2025/2026”, kat. AI poziom Senior, UoP 20000-29000 (s. 33; tabela zbiorcza 19000-24000, s. 27), 23000 w środku pasma senior/lead. Wynagrodzenie niezbędne do realizacji prac B+R. Forma zatrudnienia: umowa o pracę.</w:t>
+        <w:t>Koszt = 23 000,00 zł brutto/mc x narzut pracodawcy 1,205 = 27 715,00 zł/mc x 3,75 etatomiesiąca (miesięcy pracy w przeliczeniu na pełny etat) = 103 931,25 zł. Nakład w zadaniu Z9 wynosi 6 mc (M22-M27) x 1/3 x 0,75 etatu + 3 mc (M28-M30) x 100% x 0,75 etatu = 3,75 etatomiesiąca. Udziały czasu pracy w projekcie są stałe w trzech okresach i wpisane w zakresie czynności pracownika: w M19-M21 40% na zadanie Z6 i 60% na zadanie Z7 (Z7 wymaga wcześniejszego projektu sprzętu i pierwszych egzemplarzy platformy na M22), w M22-M27 po jednej trzeciej na zadania Z6, Z7 i Z9 (równoległa praca nad trzema zadaniami), w M28-M30 100% na zadanie Z9. Suma udziałów w każdym miesiącu równa się 0,75 etatu, a w całym okresie M19-M30 9,00 etatomiesiąca. Stawkę brutto zweryfikowano na podstawie No Fluff Jobs „Rynek pracy IT 2025/2026”, kat. AI poziom Senior, UoP 20000-29000 (s. 33; tabela zbiorcza 19000-24000, s. 27), 23000 w środku pasma senior/lead. Wynagrodzenie niezbędne do realizacji prac B+R. Forma zatrudnienia: umowa o pracę.</w:t>
       </w:r>
     </w:p>
     <w:p>
@@ -9344,7 +9344,7 @@
           <w:color w:val="666666"/>
           <w:sz w:val="17"/>
         </w:rPr>
-        <w:t xml:space="preserve"> [936 z 1500 znaków]</w:t>
+        <w:t xml:space="preserve"> [1034 z 1500 znaków]</w:t>
       </w:r>
     </w:p>
     <w:p>
@@ -9356,7 +9356,7 @@
         <w:rPr>
           <w:b w:val="0"/>
         </w:rPr>
-        <w:t>Koszt = 16 500,00 zł brutto/mc x narzut pracodawcy 1,205 = 19 882,50 zł/mc x 3,75 etatomiesiąca (miesięcy pracy w przeliczeniu na pełny etat) = 74 559,38 zł. Nakład w zadaniu Z9 wynosi 6 mc (M22-M27) x 1/3 x 0,75 etatu + 3 mc (M28-M30) x 100% x 0,75 etatu = 3,75 etatomiesiąca. Udziały czasu pracy w projekcie są stałe w trzech okresach i wpisane w zakresie czynności pracownika: w M19-M21 po 50% na zadania Z6 i Z7, w M22-M27 po jednej trzeciej na zadania Z6, Z7 i Z9 (równoległa praca nad trzema zadaniami), w M28-M30 100% na zadanie Z9. Suma udziałów w każdym miesiącu równa się 0,75 etatu, a w całym okresie M19-M30 9,00 etatomiesiąca. Stawkę brutto zweryfikowano na podstawie No Fluff Jobs „Rynek pracy IT 2025/2026”, kat. AI (s. 33): Senior 20000-29000, Mid 14000-21000, 16500 w paśmie Mid, poniżej dolnej mediany Senior (założenie konserwatywne). Wynagrodzenie niezbędne do realizacji prac B+R. Forma zatrudnienia: umowa o pracę.</w:t>
+        <w:t>Koszt = 16 500,00 zł brutto/mc x narzut pracodawcy 1,205 = 19 882,50 zł/mc x 3,75 etatomiesiąca (miesięcy pracy w przeliczeniu na pełny etat) = 74 559,38 zł. Nakład w zadaniu Z9 wynosi 6 mc (M22-M27) x 1/3 x 0,75 etatu + 3 mc (M28-M30) x 100% x 0,75 etatu = 3,75 etatomiesiąca. Udziały czasu pracy w projekcie są stałe w trzech okresach i wpisane w zakresie czynności pracownika: w M19-M21 40% na zadanie Z6 i 60% na zadanie Z7 (Z7 wymaga wcześniejszego projektu sprzętu i pierwszych egzemplarzy platformy na M22), w M22-M27 po jednej trzeciej na zadania Z6, Z7 i Z9 (równoległa praca nad trzema zadaniami), w M28-M30 100% na zadanie Z9. Suma udziałów w każdym miesiącu równa się 0,75 etatu, a w całym okresie M19-M30 9,00 etatomiesiąca. Stawkę brutto zweryfikowano na podstawie No Fluff Jobs „Rynek pracy IT 2025/2026”, kat. AI (s. 33): Senior 20000-29000, Mid 14000-21000, 16500 w paśmie Mid, poniżej dolnej mediany Senior (założenie konserwatywne). Wynagrodzenie niezbędne do realizacji prac B+R. Forma zatrudnienia: umowa o pracę.</w:t>
       </w:r>
     </w:p>
     <w:p>
@@ -9376,7 +9376,7 @@
           <w:color w:val="666666"/>
           <w:sz w:val="17"/>
         </w:rPr>
-        <w:t xml:space="preserve"> [921 z 1500 znaków]</w:t>
+        <w:t xml:space="preserve"> [1019 z 1500 znaków]</w:t>
       </w:r>
     </w:p>
     <w:p>
@@ -9388,7 +9388,7 @@
         <w:rPr>
           <w:b w:val="0"/>
         </w:rPr>
-        <w:t>Koszt = 21 000,00 zł brutto/mc x narzut pracodawcy 1,205 = 25 305,00 zł/mc x 1,25 etatomiesiąca (miesięcy pracy w przeliczeniu na pełny etat) = 31 631,24 zł. Nakład w zadaniu Z9 wynosi 6 mc (M22-M27) x 1/3 x 0,25 etatu + 3 mc (M28-M30) x 100% x 0,25 etatu = 1,25 etatomiesiąca. Udziały czasu pracy w projekcie są stałe w trzech okresach i wpisane w zakresie czynności pracownika: w M19-M21 po 50% na zadania Z6 i Z7, w M22-M27 po jednej trzeciej na zadania Z6, Z7 i Z9 (równoległa praca nad trzema zadaniami), w M28-M30 100% na zadanie Z9. Suma udziałów w każdym miesiącu równa się 0,25 etatu, a w całym okresie M19-M30 3,00 etatomiesiąca. Stawkę brutto zweryfikowano na podstawie No Fluff Jobs „Rynek pracy IT 2025/2026”, kat. Security poziom Senior, UoP 20000-28000 (s. 32; tabela zbiorcza 17000-23000, s. 27), 21000 w widełkach senior. Wynagrodzenie niezbędne do realizacji prac B+R. Forma zatrudnienia: umowa o pracę.</w:t>
+        <w:t>Koszt = 21 000,00 zł brutto/mc x narzut pracodawcy 1,205 = 25 305,00 zł/mc x 1,25 etatomiesiąca (miesięcy pracy w przeliczeniu na pełny etat) = 31 631,25 zł. Nakład w zadaniu Z9 wynosi 6 mc (M22-M27) x 1/3 x 0,25 etatu + 3 mc (M28-M30) x 100% x 0,25 etatu = 1,25 etatomiesiąca. Udziały czasu pracy w projekcie są stałe w trzech okresach i wpisane w zakresie czynności pracownika: w M19-M21 40% na zadanie Z6 i 60% na zadanie Z7 (Z7 wymaga wcześniejszego projektu sprzętu i pierwszych egzemplarzy platformy na M22), w M22-M27 po jednej trzeciej na zadania Z6, Z7 i Z9 (równoległa praca nad trzema zadaniami), w M28-M30 100% na zadanie Z9. Suma udziałów w każdym miesiącu równa się 0,25 etatu, a w całym okresie M19-M30 3,00 etatomiesiąca. Stawkę brutto zweryfikowano na podstawie No Fluff Jobs „Rynek pracy IT 2025/2026”, kat. Security poziom Senior, UoP 20000-28000 (s. 32; tabela zbiorcza 17000-23000, s. 27), 21000 w widełkach senior. Wynagrodzenie niezbędne do realizacji prac B+R. Forma zatrudnienia: umowa o pracę.</w:t>
       </w:r>
     </w:p>
     <w:p>
@@ -9408,7 +9408,7 @@
           <w:color w:val="666666"/>
           <w:sz w:val="17"/>
         </w:rPr>
-        <w:t xml:space="preserve"> [906 z 1500 znaków]</w:t>
+        <w:t xml:space="preserve"> [1004 z 1500 znaków]</w:t>
       </w:r>
     </w:p>
     <w:p>
@@ -9420,7 +9420,7 @@
         <w:rPr>
           <w:b w:val="0"/>
         </w:rPr>
-        <w:t>Koszt = 19 000,00 zł brutto/mc x narzut pracodawcy 1,205 = 22 895,00 zł/mc x 5,00 etatomiesiąca (miesięcy pracy w przeliczeniu na pełny etat) = 114 475,00 zł. Nakład w zadaniu Z9 wynosi 6 mc (M22-M27) x 1/3 x 1,00 etatu + 3 mc (M28-M30) x 100% x 1,00 etatu = 5,00 etatomiesiąca. Udziały czasu pracy w projekcie są stałe w trzech okresach i wpisane w zakresie czynności pracownika: w M19-M21 po 50% na zadania Z6 i Z7, w M22-M27 po jednej trzeciej na zadania Z6, Z7 i Z9 (równoległa praca nad trzema zadaniami), w M28-M30 100% na zadanie Z9. Suma udziałów w każdym miesiącu równa się 1,00 etatu, a w całym okresie M19-M30 12,00 etatomiesiąca. Stawkę brutto zweryfikowano na podstawie No Fluff Jobs „Rynek pracy IT 2025/2026”, kat. Backend/Fullstack poziom Senior, UoP 18500-25000 (s. 30), 19000 w dolnej części pasma senior. Wynagrodzenie niezbędne do realizacji prac B+R. Forma zatrudnienia: umowa o pracę.</w:t>
+        <w:t>Koszt = 19 000,00 zł brutto/mc x narzut pracodawcy 1,205 = 22 895,00 zł/mc x 5,00 etatomiesiąca (miesięcy pracy w przeliczeniu na pełny etat) = 114 475,00 zł. Nakład w zadaniu Z9 wynosi 6 mc (M22-M27) x 1/3 x 1,00 etatu + 3 mc (M28-M30) x 100% x 1,00 etatu = 5,00 etatomiesiąca. Udziały czasu pracy w projekcie są stałe w trzech okresach i wpisane w zakresie czynności pracownika: w M19-M21 40% na zadanie Z6 i 60% na zadanie Z7 (Z7 wymaga wcześniejszego projektu sprzętu i pierwszych egzemplarzy platformy na M22), w M22-M27 po jednej trzeciej na zadania Z6, Z7 i Z9 (równoległa praca nad trzema zadaniami), w M28-M30 100% na zadanie Z9. Suma udziałów w każdym miesiącu równa się 1,00 etatu, a w całym okresie M19-M30 12,00 etatomiesiąca. Stawkę brutto zweryfikowano na podstawie No Fluff Jobs „Rynek pracy IT 2025/2026”, kat. Backend/Fullstack poziom Senior, UoP 18500-25000 (s. 30), 19000 w dolnej części pasma senior. Wynagrodzenie niezbędne do realizacji prac B+R. Forma zatrudnienia: umowa o pracę.</w:t>
       </w:r>
     </w:p>
     <w:p>
@@ -9440,7 +9440,7 @@
           <w:color w:val="666666"/>
           <w:sz w:val="17"/>
         </w:rPr>
-        <w:t xml:space="preserve"> [969 z 1500 znaków]</w:t>
+        <w:t xml:space="preserve"> [1067 z 1500 znaków]</w:t>
       </w:r>
     </w:p>
     <w:p>
@@ -9452,7 +9452,7 @@
         <w:rPr>
           <w:b w:val="0"/>
         </w:rPr>
-        <w:t>Koszt = 15 000,00 zł brutto/mc x narzut pracodawcy 1,205 = 18 075,00 zł/mc x 2,50 etatomiesiąca (miesięcy pracy w przeliczeniu na pełny etat) = 45 187,50 zł. Nakład w zadaniu Z9 wynosi 6 mc (M22-M27) x 1/3 x 0,50 etatu + 3 mc (M28-M30) x 100% x 0,50 etatu = 2,50 etatomiesiąca. Udziały czasu pracy w projekcie są stałe w trzech okresach i wpisane w zakresie czynności pracownika: w M19-M21 po 50% na zadania Z6 i Z7, w M22-M27 po jednej trzeciej na zadania Z6, Z7 i Z9 (równoległa praca nad trzema zadaniami), w M28-M30 100% na zadanie Z9. Suma udziałów w każdym miesiącu równa się 0,50 etatu, a w całym okresie M19-M30 6,00 etatomiesiąca. Stawkę brutto zweryfikowano na podstawie No Fluff Jobs „Rynek pracy IT 2025/2026”, kat. Embedded (s. 27/35: 13000-19000, Mid 12000-17000); pomocniczo Hays „Raport płacowy 2026”, R&amp;D Engineer 13/16/18 tys. (s. 38), 15000 w widełkach kat. Embedded. Wynagrodzenie niezbędne do realizacji prac B+R. Forma zatrudnienia: umowa o pracę.</w:t>
+        <w:t>Koszt = 15 000,00 zł brutto/mc x narzut pracodawcy 1,205 = 18 075,00 zł/mc x 2,50 etatomiesiąca (miesięcy pracy w przeliczeniu na pełny etat) = 45 187,50 zł. Nakład w zadaniu Z9 wynosi 6 mc (M22-M27) x 1/3 x 0,50 etatu + 3 mc (M28-M30) x 100% x 0,50 etatu = 2,50 etatomiesiąca. Udziały czasu pracy w projekcie są stałe w trzech okresach i wpisane w zakresie czynności pracownika: w M19-M21 40% na zadanie Z6 i 60% na zadanie Z7 (Z7 wymaga wcześniejszego projektu sprzętu i pierwszych egzemplarzy platformy na M22), w M22-M27 po jednej trzeciej na zadania Z6, Z7 i Z9 (równoległa praca nad trzema zadaniami), w M28-M30 100% na zadanie Z9. Suma udziałów w każdym miesiącu równa się 0,50 etatu, a w całym okresie M19-M30 6,00 etatomiesiąca. Stawkę brutto zweryfikowano na podstawie No Fluff Jobs „Rynek pracy IT 2025/2026”, kat. Embedded (s. 27/35: 13000-19000, Mid 12000-17000); pomocniczo Hays „Raport płacowy 2026”, R&amp;D Engineer 13/16/18 tys. (s. 38), 15000 w widełkach kat. Embedded. Wynagrodzenie niezbędne do realizacji prac B+R. Forma zatrudnienia: umowa o pracę.</w:t>
       </w:r>
     </w:p>
     <w:p>
@@ -9472,7 +9472,7 @@
           <w:color w:val="666666"/>
           <w:sz w:val="17"/>
         </w:rPr>
-        <w:t xml:space="preserve"> [917 z 1500 znaków]</w:t>
+        <w:t xml:space="preserve"> [1015 z 1500 znaków]</w:t>
       </w:r>
     </w:p>
     <w:p>
@@ -9484,7 +9484,7 @@
         <w:rPr>
           <w:b w:val="0"/>
         </w:rPr>
-        <w:t>Koszt = 10 000,00 zł brutto/mc x narzut pracodawcy 1,205 = 12 050,00 zł/mc x 2,50 etatomiesiąca (miesięcy pracy w przeliczeniu na pełny etat) = 30 125,00 zł. Nakład w zadaniu Z9 wynosi 6 mc (M22-M27) x 1/3 x 0,50 etatu + 3 mc (M28-M30) x 100% x 0,50 etatu = 2,50 etatomiesiąca. Udziały czasu pracy w projekcie są stałe w trzech okresach i wpisane w zakresie czynności pracownika: w M19-M21 po 50% na zadania Z6 i Z7, w M22-M27 po jednej trzeciej na zadania Z6, Z7 i Z9 (równoległa praca nad trzema zadaniami), w M28-M30 100% na zadanie Z9. Suma udziałów w każdym miesiącu równa się 0,50 etatu, a w całym okresie M19-M30 6,00 etatomiesiąca. Stawkę brutto zweryfikowano na podstawie Hays „Raport płacowy 2026”, sekcja Logistyka i zakupy, tabela Logistyka, „Specjalista ds. Logistyki” 8000/10000/13000 (s. 40), 10000 = wartość optymalna. Wynagrodzenie niezbędne do realizacji prac B+R. Forma zatrudnienia: umowa o pracę.</w:t>
+        <w:t>Koszt = 10 000,00 zł brutto/mc x narzut pracodawcy 1,205 = 12 050,00 zł/mc x 2,50 etatomiesiąca (miesięcy pracy w przeliczeniu na pełny etat) = 30 125,00 zł. Nakład w zadaniu Z9 wynosi 6 mc (M22-M27) x 1/3 x 0,50 etatu + 3 mc (M28-M30) x 100% x 0,50 etatu = 2,50 etatomiesiąca. Udziały czasu pracy w projekcie są stałe w trzech okresach i wpisane w zakresie czynności pracownika: w M19-M21 40% na zadanie Z6 i 60% na zadanie Z7 (Z7 wymaga wcześniejszego projektu sprzętu i pierwszych egzemplarzy platformy na M22), w M22-M27 po jednej trzeciej na zadania Z6, Z7 i Z9 (równoległa praca nad trzema zadaniami), w M28-M30 100% na zadanie Z9. Suma udziałów w każdym miesiącu równa się 0,50 etatu, a w całym okresie M19-M30 6,00 etatomiesiąca. Stawkę brutto zweryfikowano na podstawie Hays „Raport płacowy 2026”, sekcja Logistyka i zakupy, tabela Logistyka, „Specjalista ds. Logistyki” 8000/10000/13000 (s. 40), 10000 = wartość optymalna. Wynagrodzenie niezbędne do realizacji prac B+R. Forma zatrudnienia: umowa o pracę.</w:t>
       </w:r>
     </w:p>
     <w:p>
@@ -11345,7 +11345,7 @@
                 <w:b w:val="0"/>
                 <w:sz w:val="16"/>
               </w:rPr>
-              <w:t>2,625</w:t>
+              <w:t>2,40</w:t>
             </w:r>
           </w:p>
         </w:tc>
@@ -11363,7 +11363,7 @@
                 <w:b w:val="0"/>
                 <w:sz w:val="16"/>
               </w:rPr>
-              <w:t>2,625</w:t>
+              <w:t>2,85</w:t>
             </w:r>
           </w:p>
         </w:tc>
@@ -11455,7 +11455,7 @@
                 <w:b w:val="0"/>
                 <w:sz w:val="16"/>
               </w:rPr>
-              <w:t>2,625</w:t>
+              <w:t>2,40</w:t>
             </w:r>
           </w:p>
         </w:tc>
@@ -11473,7 +11473,7 @@
                 <w:b w:val="0"/>
                 <w:sz w:val="16"/>
               </w:rPr>
-              <w:t>2,625</w:t>
+              <w:t>2,85</w:t>
             </w:r>
           </w:p>
         </w:tc>
@@ -11565,7 +11565,7 @@
                 <w:b w:val="0"/>
                 <w:sz w:val="16"/>
               </w:rPr>
-              <w:t>0,875</w:t>
+              <w:t>0,80</w:t>
             </w:r>
           </w:p>
         </w:tc>
@@ -11583,7 +11583,7 @@
                 <w:b w:val="0"/>
                 <w:sz w:val="16"/>
               </w:rPr>
-              <w:t>0,875</w:t>
+              <w:t>0,95</w:t>
             </w:r>
           </w:p>
         </w:tc>
@@ -11675,7 +11675,7 @@
                 <w:b w:val="0"/>
                 <w:sz w:val="16"/>
               </w:rPr>
-              <w:t>3,50</w:t>
+              <w:t>3,20</w:t>
             </w:r>
           </w:p>
         </w:tc>
@@ -11693,7 +11693,7 @@
                 <w:b w:val="0"/>
                 <w:sz w:val="16"/>
               </w:rPr>
-              <w:t>3,50</w:t>
+              <w:t>3,80</w:t>
             </w:r>
           </w:p>
         </w:tc>
@@ -11785,7 +11785,7 @@
                 <w:b w:val="0"/>
                 <w:sz w:val="16"/>
               </w:rPr>
-              <w:t>1,75</w:t>
+              <w:t>1,60</w:t>
             </w:r>
           </w:p>
         </w:tc>
@@ -11803,7 +11803,7 @@
                 <w:b w:val="0"/>
                 <w:sz w:val="16"/>
               </w:rPr>
-              <w:t>1,75</w:t>
+              <w:t>1,90</w:t>
             </w:r>
           </w:p>
         </w:tc>
@@ -11895,7 +11895,7 @@
                 <w:b w:val="0"/>
                 <w:sz w:val="16"/>
               </w:rPr>
-              <w:t>1,75</w:t>
+              <w:t>1,60</w:t>
             </w:r>
           </w:p>
         </w:tc>
@@ -11913,7 +11913,7 @@
                 <w:b w:val="0"/>
                 <w:sz w:val="16"/>
               </w:rPr>
-              <w:t>1,75</w:t>
+              <w:t>1,90</w:t>
             </w:r>
           </w:p>
         </w:tc>
@@ -21597,7 +21597,7 @@
                 <w:b w:val="0"/>
                 <w:sz w:val="17"/>
               </w:rPr>
-              <w:t>3900/4000</w:t>
+              <w:t>3897/4000</w:t>
             </w:r>
           </w:p>
         </w:tc>
@@ -21743,7 +21743,7 @@
                 <w:b w:val="0"/>
                 <w:sz w:val="17"/>
               </w:rPr>
-              <w:t>3529/4000</w:t>
+              <w:t>3526/4000</w:t>
             </w:r>
           </w:p>
         </w:tc>

</xml_diff>

<commit_message>
D29: wyjatki IoT/cyber/TSL w M22-M27, audyt spojnosci, N30 (stawki z raportow)
Co-Authored-By: Claude Sonnet 5.5 <noreply@anthropic.com>
Claude-Session: https://claude.ai/code/session_01672WnJhixnEcarbb7uiwfx
</commit_message>
<xml_diff>
--- a/Opisy_zadan_z_kamieniami_milowymi.docx
+++ b/Opisy_zadan_z_kamieniami_milowymi.docx
@@ -2733,7 +2733,7 @@
         <w:rPr>
           <w:b w:val="0"/>
         </w:rPr>
-        <w:t>Zadanie będzie realizowane przez zespół Everest11. AI Lead zaprojektuje architekturę pipeline'u i fuzję źródeł oraz zoptymalizuje czas generacji. AI Senior Engineer zaimplementuje integrację change detection i generator raportu klasyfikatora ML z wyjaśnieniami SHAP. Cybersecurity / AI Act Specialist zaimplementuje podpis kryptograficzny i integralność łańcucha dowodowego, bez prac prawnych i dokumentacyjnych. IT Specialist zaimplementuje pipeline i generator eFTI w XML i JSON, dwukierunkowe API z TMS oraz prototypowe integracje z Trans.eu, TimoCom i e-CMR w środowisku testowym, a także zmierzy czasy i opóźnienia w testach integracyjnych. Backend/Full-Stack Developer, w wymiarze 1,0 etatu przez 9 miesięcy od M19 do M27, zbuduje strumieniowy potok danych z embedded do pipeline'u, kolejkowanie i spójność przy utracie łączności, wesprze integracje testowe z TMS i platformami zewnętrznymi oraz wykona test zgodności eFTI z implementacją referencyjną Komisji Europejskiej. IoT Specialist zintegruje sygnał czujnika drzwi, synchronizację znaczników czasu GPS i agregację historii drgań, temperatury i wilgotności. Specjalista ds. logistyki TSL zinterpretuje operacyjnie pola eFTI i oceni treść PoL i PoC. Nakład, wynikający z podziału etatów między zadania Z6, Z7 i Z9 według stałych udziałów w trzech okresach, wynosi w miesiącach pracy w przeliczeniu na pełny etat: AI Lead 2,40, AI Senior Engineer 2,40, specjalista ds. cyberbezpieczeństwa 0,80, IT Specialist 3,20, IoT Specialist 1,60, specjalista ds. logistyki TSL 1,60.</w:t>
+        <w:t>Zadanie będzie realizowane przez zespół Everest11. AI Lead zaprojektuje architekturę pipeline'u i fuzję źródeł oraz zoptymalizuje czas generacji. AI Senior Engineer zaimplementuje integrację change detection i generator raportu klasyfikatora ML z wyjaśnieniami SHAP. Cybersecurity / AI Act Specialist zaimplementuje podpis kryptograficzny i integralność łańcucha dowodowego, bez prac prawnych i dokumentacyjnych. IT Specialist zaimplementuje pipeline i generator eFTI w XML i JSON, dwukierunkowe API z TMS oraz prototypowe integracje z Trans.eu, TimoCom i e-CMR w środowisku testowym, a także zmierzy czasy i opóźnienia w testach integracyjnych. Backend/Full-Stack Developer, w wymiarze 1,0 etatu przez 9 miesięcy od M19 do M27, zbuduje strumieniowy potok danych z embedded do pipeline'u, kolejkowanie i spójność przy utracie łączności, wesprze integracje testowe z TMS i platformami zewnętrznymi oraz wykona test zgodności eFTI z implementacją referencyjną Komisji Europejskiej. IoT Specialist zintegruje sygnał czujnika drzwi, synchronizację znaczników czasu GPS i agregację historii drgań, temperatury i wilgotności. Specjalista ds. logistyki TSL zinterpretuje operacyjnie pola eFTI i oceni treść PoL i PoC. Nakład, wynikający z podziału etatów między zadania Z6, Z7 i Z9 według stałych udziałów w trzech okresach, wynosi w miesiącach pracy w przeliczeniu na pełny etat: AI Lead 2,40, AI Senior Engineer 2,40, specjalista ds. cyberbezpieczeństwa 0,60, IT Specialist 3,20, IoT Specialist 1,20, specjalista ds. logistyki TSL 1,20.</w:t>
       </w:r>
     </w:p>
     <w:p>
@@ -3232,7 +3232,7 @@
         <w:rPr>
           <w:b w:val="0"/>
         </w:rPr>
-        <w:t>Zadanie będzie realizowane przez zespół Everest11. AI Lead wyznaczy strategię kompresji dla każdego modelu i budżet degradacji oraz zwaliduje modele na zbiorach testowych. AI Senior Engineer zaimplementuje kompresję i zoptymalizuje modele na platformie embedded. IoT Specialist zaprojektuje architekturę sprzętową i obudowę oraz zmierzy opóźnienie alertu. IT Specialist zaimplementuje oprogramowanie embedded (system czasu rzeczywistego, sterowniki sensorów, generator alertów, bufor GSM, aktualizacje OTA) i moduł komunikacji z TMS. Cybersecurity / AI Act Specialist zaprojektuje bezpieczny rozruch, podpisywanie aktualizacji i szyfrowanie transmisji. Specjalista ds. logistyki TSL zdefiniuje scenariusze walidacji alertów i progi niski, średni i wysoki dla każdej klasy ładunku oraz oceni użyteczność alertu w kabinie. Nakład, wynikający z podziału etatów między zadania Z6, Z7 i Z9 według stałych udziałów w trzech okresach, wynosi w miesiącach pracy w przeliczeniu na pełny etat: AI Lead 2,85, AI Senior Engineer 2,85, specjalista ds. cyberbezpieczeństwa 0,95, IT Specialist 3,80, IoT Specialist 1,90, specjalista ds. logistyki TSL 1,90. Montaż w pojazdach nie należy do tego zadania.</w:t>
+        <w:t>Zadanie będzie realizowane przez zespół Everest11. AI Lead wyznaczy strategię kompresji dla każdego modelu i budżet degradacji oraz zwaliduje modele na zbiorach testowych. AI Senior Engineer zaimplementuje kompresję i zoptymalizuje modele na platformie embedded. IoT Specialist zaprojektuje architekturę sprzętową i obudowę oraz zmierzy opóźnienie alertu. IT Specialist zaimplementuje oprogramowanie embedded (system czasu rzeczywistego, sterowniki sensorów, generator alertów, bufor GSM, aktualizacje OTA) i moduł komunikacji z TMS. Cybersecurity / AI Act Specialist zaprojektuje bezpieczny rozruch, podpisywanie aktualizacji i szyfrowanie transmisji. Specjalista ds. logistyki TSL zdefiniuje scenariusze walidacji alertów i progi niski, średni i wysoki dla każdej klasy ładunku oraz oceni użyteczność alertu w kabinie. Nakład, wynikający z podziału etatów między zadania Z6, Z7 i Z9 według stałych udziałów w trzech okresach, wynosi w miesiącach pracy w przeliczeniu na pełny etat: AI Lead 2,85, AI Senior Engineer 2,85, specjalista ds. cyberbezpieczeństwa 1,05, IT Specialist 3,80, IoT Specialist 2,10, specjalista ds. logistyki TSL 1,80. Montaż w pojazdach nie należy do tego zadania.</w:t>
       </w:r>
     </w:p>
     <w:p>
@@ -4239,7 +4239,7 @@
         <w:rPr>
           <w:b w:val="0"/>
         </w:rPr>
-        <w:t>Zadanie będzie realizowane przez zespół Everest11. AI Lead opracuje protokół walidacji KPI, zbierze i uporządkuje dane terenowe, obliczy metryki dla każdej klasy i przy stwierdzeniu domain shift przeprowadzi adaptację domenową. AI Senior Engineer zoptymalizuje modele na platformie, zdiagnozuje domain shift, wdroży korekty, zmierzy wskaźniki jakości i przygotuje raport KPI oraz anotację próbki co najmniej 200 obrazów terenowych, weryfikowaną przez specjalistę TSL, a także przeprowadzi badanie akceptacji użytkowników według scenariuszy specjalisty TSL. IoT Specialist odbierze zestawy po montażu, skalibruje je i zarejestruje parametry niezawodności sprzętu. IT Specialist zbierze logi (dostępność, status GSM, bufor), zmierzy czas PoC i opóźnienia oraz opracuje dane do raportu KPI. Cybersecurity / AI Act Specialist wykona testy bezpieczeństwa prototypu w terenie i uruchomi zamrożony skrypt ewaluacyjny jako niezależny ewaluator. Specjalista ds. logistyki TSL poprowadzi inspekcje ground truth i zweryfikuje anotację próbki obrazów. Backend/Full-Stack Developer, w wymiarze 1,0 etatu przez 3 miesiące od M28 do M30, obsłuży walidację PoC i zgodności eFTI w terenie na co najmniej 200 cyklach oraz analizę błędów. Nakład pozostałych osób, wynikający z podziału etatów między zadania Z6, Z7 i Z9 według stałych udziałów w trzech okresach, wynosi w miesiącach pracy w przeliczeniu na pełny etat: AI Lead 3,75, AI Senior Engineer 3,75, specjalista ds. cyberbezpieczeństwa 1,25, IT Specialist 5,00, IoT Specialist 2,50, specjalista ds. logistyki TSL 2,50.</w:t>
+        <w:t>Zadanie będzie realizowane przez zespół Everest11. AI Lead opracuje protokół walidacji KPI, zbierze i uporządkuje dane terenowe, obliczy metryki dla każdej klasy i przy stwierdzeniu domain shift przeprowadzi adaptację domenową. AI Senior Engineer zoptymalizuje modele na platformie, zdiagnozuje domain shift, wdroży korekty, zmierzy wskaźniki jakości i przygotuje raport KPI oraz anotację próbki co najmniej 200 obrazów terenowych, weryfikowaną przez specjalistę TSL, a także przeprowadzi badanie akceptacji użytkowników według scenariuszy specjalisty TSL. IoT Specialist odbierze zestawy po montażu, skalibruje je i zarejestruje parametry niezawodności sprzętu. IT Specialist zbierze logi (dostępność, status GSM, bufor), zmierzy czas PoC i opóźnienia oraz opracuje dane do raportu KPI. Cybersecurity / AI Act Specialist wykona testy bezpieczeństwa prototypu w terenie i uruchomi zamrożony skrypt ewaluacyjny jako niezależny ewaluator. Specjalista ds. logistyki TSL poprowadzi inspekcje ground truth i zweryfikuje anotację próbki obrazów. Backend/Full-Stack Developer, w wymiarze 1,0 etatu przez 3 miesiące od M28 do M30, obsłuży walidację PoC i zgodności eFTI w terenie na co najmniej 200 cyklach oraz analizę błędów. Nakład pozostałych osób, wynikający z podziału etatów między zadania Z6, Z7 i Z9 według stałych udziałów w trzech okresach, wynosi w miesiącach pracy w przeliczeniu na pełny etat: AI Lead 3,75, AI Senior Engineer 3,75, specjalista ds. cyberbezpieczeństwa 1,35, IT Specialist 5,00, IoT Specialist 2,70, specjalista ds. logistyki TSL 3,00.</w:t>
       </w:r>
     </w:p>
     <w:p>
@@ -7071,7 +7071,7 @@
         <w:rPr>
           <w:b w:val="0"/>
         </w:rPr>
-        <w:t>Budżet dzielił dotąd 12 miesięcy fazy prac rozwojowych równo na trzy zadania, co ekspert zakwestionował w uwagach 36 i 37 (zadania Z6 i Z7 trwają 9 miesięcy, a koszt odpowiadał 12 miesiącom). Przyjęty wariant, uzgodniony z właścicielem, ma trzy okresy ze stałymi udziałami czasu pracy: w M19-M21 działają tylko zadania Z6 i Z7 (40% i 60% czasu pracy w projekcie, bo zadanie Z7 wymaga wcześniejszego projektu sprzętu i pierwszych egzemplarzy platformy na M22), w M22-M27 równolegle trzy zadania (po jednej trzeciej), w M28-M30 tylko zadanie Z9 (100%). Udziały są takie same dla wszystkich sześciu stanowisk, więc w zakresie czynności każdej osoby wpisuje się trzy stałe proporcje. Suma nakładów w każdym miesiącu równa się etatowi stanowiska, a koszt łączny każdego stanowiska nie zmienia się. Wszystkie trzy zadania są pracami rozwojowymi o tej samej intensywności pomocy (60%), więc kwota dofinansowania nie zmienia się.</w:t>
+        <w:t>Budżet dzielił dotąd 12 miesięcy fazy prac rozwojowych równo na trzy zadania, co ekspert zakwestionował w uwagach 36 i 37 (zadania Z6 i Z7 trwają 9 miesięcy, a koszt odpowiadał 12 miesiącom). Przyjęty wariant ma trzy okresy ze stałymi udziałami czasu pracy w projekcie: w M19-M21 działają tylko zadania Z6 i Z7 (40% i 60%, bo zadanie Z7 wymaga wcześniejszego projektu sprzętu i pierwszych egzemplarzy platformy na M22), w M22-M27 równolegle trzy zadania, w M28-M30 tylko zadanie Z9 (100%). W M22-M27 trzy stanowiska o wąskim zakresie w Z6 (IoT Specialist, specjalista ds. cyberbezpieczeństwa, specjalista TSL) mają mniejszy udział Z6, a pozostałe po jednej trzeciej. W zakresie czynności każdej osoby wpisuje się trzy stałe proporcje. Suma nakładów w każdym miesiącu równa się etatowi stanowiska, a koszt łączny każdego stanowiska nie zmienia się. Wszystkie trzy zadania są pracami rozwojowymi o tej samej intensywności pomocy (60%), więc kwota dofinansowania nie zmienia się.</w:t>
       </w:r>
     </w:p>
     <w:p>
@@ -7098,7 +7098,7 @@
       <w:tr>
         <w:tc>
           <w:tcPr>
-            <w:tcW w:type="dxa" w:w="1814"/>
+            <w:tcW w:type="dxa" w:w="3402"/>
             <w:shd w:val="clear" w:color="auto" w:fill="D9E2F3"/>
           </w:tcPr>
           <w:p>
@@ -7111,13 +7111,13 @@
                 <w:b/>
                 <w:sz w:val="17"/>
               </w:rPr>
-              <w:t>Okres</w:t>
-            </w:r>
-          </w:p>
-        </w:tc>
-        <w:tc>
-          <w:tcPr>
-            <w:tcW w:type="dxa" w:w="1474"/>
+              <w:t>Stanowisko (etat)</w:t>
+            </w:r>
+          </w:p>
+        </w:tc>
+        <w:tc>
+          <w:tcPr>
+            <w:tcW w:type="dxa" w:w="2041"/>
             <w:shd w:val="clear" w:color="auto" w:fill="D9E2F3"/>
           </w:tcPr>
           <w:p>
@@ -7130,13 +7130,13 @@
                 <w:b/>
                 <w:sz w:val="17"/>
               </w:rPr>
-              <w:t>Zadania</w:t>
-            </w:r>
-          </w:p>
-        </w:tc>
-        <w:tc>
-          <w:tcPr>
-            <w:tcW w:type="dxa" w:w="2381"/>
+              <w:t>M19-M21 (3 mc)</w:t>
+            </w:r>
+          </w:p>
+        </w:tc>
+        <w:tc>
+          <w:tcPr>
+            <w:tcW w:type="dxa" w:w="2154"/>
             <w:shd w:val="clear" w:color="auto" w:fill="D9E2F3"/>
           </w:tcPr>
           <w:p>
@@ -7149,13 +7149,13 @@
                 <w:b/>
                 <w:sz w:val="17"/>
               </w:rPr>
-              <w:t>Udział Z6 / Z7 / Z9</w:t>
-            </w:r>
-          </w:p>
-        </w:tc>
-        <w:tc>
-          <w:tcPr>
-            <w:tcW w:type="dxa" w:w="2835"/>
+              <w:t>M22-M27 (6 mc)</w:t>
+            </w:r>
+          </w:p>
+        </w:tc>
+        <w:tc>
+          <w:tcPr>
+            <w:tcW w:type="dxa" w:w="1928"/>
             <w:shd w:val="clear" w:color="auto" w:fill="D9E2F3"/>
           </w:tcPr>
           <w:p>
@@ -7168,7 +7168,7 @@
                 <w:b/>
                 <w:sz w:val="17"/>
               </w:rPr>
-              <w:t>Uwagi</w:t>
+              <w:t>M28-M30 (3 mc)</w:t>
             </w:r>
           </w:p>
         </w:tc>
@@ -7176,7 +7176,7 @@
       <w:tr>
         <w:tc>
           <w:tcPr>
-            <w:tcW w:type="dxa" w:w="1814"/>
+            <w:tcW w:type="dxa" w:w="3402"/>
           </w:tcPr>
           <w:p>
             <w:pPr>
@@ -7188,13 +7188,13 @@
                 <w:b w:val="0"/>
                 <w:sz w:val="17"/>
               </w:rPr>
-              <w:t>M19-M21 (3 mc)</w:t>
-            </w:r>
-          </w:p>
-        </w:tc>
-        <w:tc>
-          <w:tcPr>
-            <w:tcW w:type="dxa" w:w="1474"/>
+              <w:t>AI Lead (0,75)</w:t>
+            </w:r>
+          </w:p>
+        </w:tc>
+        <w:tc>
+          <w:tcPr>
+            <w:tcW w:type="dxa" w:w="2041"/>
           </w:tcPr>
           <w:p>
             <w:pPr>
@@ -7206,13 +7206,13 @@
                 <w:b w:val="0"/>
                 <w:sz w:val="17"/>
               </w:rPr>
-              <w:t>Z6, Z7</w:t>
-            </w:r>
-          </w:p>
-        </w:tc>
-        <w:tc>
-          <w:tcPr>
-            <w:tcW w:type="dxa" w:w="2381"/>
+              <w:t>40% / 60% / 0%</w:t>
+            </w:r>
+          </w:p>
+        </w:tc>
+        <w:tc>
+          <w:tcPr>
+            <w:tcW w:type="dxa" w:w="2154"/>
           </w:tcPr>
           <w:p>
             <w:pPr>
@@ -7224,13 +7224,13 @@
                 <w:b w:val="0"/>
                 <w:sz w:val="17"/>
               </w:rPr>
-              <w:t>40% / 60% / 0%</w:t>
-            </w:r>
-          </w:p>
-        </w:tc>
-        <w:tc>
-          <w:tcPr>
-            <w:tcW w:type="dxa" w:w="2835"/>
+              <w:t>33,3% / 33,3% / 33,3%</w:t>
+            </w:r>
+          </w:p>
+        </w:tc>
+        <w:tc>
+          <w:tcPr>
+            <w:tcW w:type="dxa" w:w="1928"/>
           </w:tcPr>
           <w:p>
             <w:pPr>
@@ -7242,7 +7242,7 @@
                 <w:b w:val="0"/>
                 <w:sz w:val="17"/>
               </w:rPr>
-              <w:t>Z7 wcześniej: projekt sprzętu, pierwsze egzemplarze na M22</w:t>
+              <w:t>0% / 0% / 100%</w:t>
             </w:r>
           </w:p>
         </w:tc>
@@ -7250,7 +7250,7 @@
       <w:tr>
         <w:tc>
           <w:tcPr>
-            <w:tcW w:type="dxa" w:w="1814"/>
+            <w:tcW w:type="dxa" w:w="3402"/>
           </w:tcPr>
           <w:p>
             <w:pPr>
@@ -7262,13 +7262,13 @@
                 <w:b w:val="0"/>
                 <w:sz w:val="17"/>
               </w:rPr>
-              <w:t>M22-M27 (6 mc)</w:t>
-            </w:r>
-          </w:p>
-        </w:tc>
-        <w:tc>
-          <w:tcPr>
-            <w:tcW w:type="dxa" w:w="1474"/>
+              <w:t>AI Senior Engineer (0,75)</w:t>
+            </w:r>
+          </w:p>
+        </w:tc>
+        <w:tc>
+          <w:tcPr>
+            <w:tcW w:type="dxa" w:w="2041"/>
           </w:tcPr>
           <w:p>
             <w:pPr>
@@ -7280,13 +7280,13 @@
                 <w:b w:val="0"/>
                 <w:sz w:val="17"/>
               </w:rPr>
-              <w:t>Z6, Z7, Z9</w:t>
-            </w:r>
-          </w:p>
-        </w:tc>
-        <w:tc>
-          <w:tcPr>
-            <w:tcW w:type="dxa" w:w="2381"/>
+              <w:t>40% / 60% / 0%</w:t>
+            </w:r>
+          </w:p>
+        </w:tc>
+        <w:tc>
+          <w:tcPr>
+            <w:tcW w:type="dxa" w:w="2154"/>
           </w:tcPr>
           <w:p>
             <w:pPr>
@@ -7304,7 +7304,7 @@
         </w:tc>
         <w:tc>
           <w:tcPr>
-            <w:tcW w:type="dxa" w:w="2835"/>
+            <w:tcW w:type="dxa" w:w="1928"/>
           </w:tcPr>
           <w:p>
             <w:pPr>
@@ -7316,7 +7316,7 @@
                 <w:b w:val="0"/>
                 <w:sz w:val="17"/>
               </w:rPr>
-              <w:t>trzy zadania równolegle</w:t>
+              <w:t>0% / 0% / 100%</w:t>
             </w:r>
           </w:p>
         </w:tc>
@@ -7324,7 +7324,7 @@
       <w:tr>
         <w:tc>
           <w:tcPr>
-            <w:tcW w:type="dxa" w:w="1814"/>
+            <w:tcW w:type="dxa" w:w="3402"/>
           </w:tcPr>
           <w:p>
             <w:pPr>
@@ -7336,13 +7336,13 @@
                 <w:b w:val="0"/>
                 <w:sz w:val="17"/>
               </w:rPr>
-              <w:t>M28-M30 (3 mc)</w:t>
-            </w:r>
-          </w:p>
-        </w:tc>
-        <w:tc>
-          <w:tcPr>
-            <w:tcW w:type="dxa" w:w="1474"/>
+              <w:t>Cybersecurity / AI Act Specialist (0,25)</w:t>
+            </w:r>
+          </w:p>
+        </w:tc>
+        <w:tc>
+          <w:tcPr>
+            <w:tcW w:type="dxa" w:w="2041"/>
           </w:tcPr>
           <w:p>
             <w:pPr>
@@ -7354,13 +7354,13 @@
                 <w:b w:val="0"/>
                 <w:sz w:val="17"/>
               </w:rPr>
-              <w:t>Z9</w:t>
-            </w:r>
-          </w:p>
-        </w:tc>
-        <w:tc>
-          <w:tcPr>
-            <w:tcW w:type="dxa" w:w="2381"/>
+              <w:t>40% / 60% / 0%</w:t>
+            </w:r>
+          </w:p>
+        </w:tc>
+        <w:tc>
+          <w:tcPr>
+            <w:tcW w:type="dxa" w:w="2154"/>
           </w:tcPr>
           <w:p>
             <w:pPr>
@@ -7372,13 +7372,33 @@
                 <w:b w:val="0"/>
                 <w:sz w:val="17"/>
               </w:rPr>
+              <w:t>20% / 40% / 40%</w:t>
+            </w:r>
+          </w:p>
+        </w:tc>
+        <w:tc>
+          <w:tcPr>
+            <w:tcW w:type="dxa" w:w="1928"/>
+          </w:tcPr>
+          <w:p>
+            <w:pPr>
+              <w:spacing w:after="20"/>
+            </w:pPr>
+            <w:r/>
+            <w:r>
+              <w:rPr>
+                <w:b w:val="0"/>
+                <w:sz w:val="17"/>
+              </w:rPr>
               <w:t>0% / 0% / 100%</w:t>
             </w:r>
           </w:p>
         </w:tc>
-        <w:tc>
-          <w:tcPr>
-            <w:tcW w:type="dxa" w:w="2835"/>
+      </w:tr>
+      <w:tr>
+        <w:tc>
+          <w:tcPr>
+            <w:tcW w:type="dxa" w:w="3402"/>
           </w:tcPr>
           <w:p>
             <w:pPr>
@@ -7390,7 +7410,209 @@
                 <w:b w:val="0"/>
                 <w:sz w:val="17"/>
               </w:rPr>
-              <w:t>Z6 i Z7 zakończone</w:t>
+              <w:t>IT Specialist (1,00)</w:t>
+            </w:r>
+          </w:p>
+        </w:tc>
+        <w:tc>
+          <w:tcPr>
+            <w:tcW w:type="dxa" w:w="2041"/>
+          </w:tcPr>
+          <w:p>
+            <w:pPr>
+              <w:spacing w:after="20"/>
+            </w:pPr>
+            <w:r/>
+            <w:r>
+              <w:rPr>
+                <w:b w:val="0"/>
+                <w:sz w:val="17"/>
+              </w:rPr>
+              <w:t>40% / 60% / 0%</w:t>
+            </w:r>
+          </w:p>
+        </w:tc>
+        <w:tc>
+          <w:tcPr>
+            <w:tcW w:type="dxa" w:w="2154"/>
+          </w:tcPr>
+          <w:p>
+            <w:pPr>
+              <w:spacing w:after="20"/>
+            </w:pPr>
+            <w:r/>
+            <w:r>
+              <w:rPr>
+                <w:b w:val="0"/>
+                <w:sz w:val="17"/>
+              </w:rPr>
+              <w:t>33,3% / 33,3% / 33,3%</w:t>
+            </w:r>
+          </w:p>
+        </w:tc>
+        <w:tc>
+          <w:tcPr>
+            <w:tcW w:type="dxa" w:w="1928"/>
+          </w:tcPr>
+          <w:p>
+            <w:pPr>
+              <w:spacing w:after="20"/>
+            </w:pPr>
+            <w:r/>
+            <w:r>
+              <w:rPr>
+                <w:b w:val="0"/>
+                <w:sz w:val="17"/>
+              </w:rPr>
+              <w:t>0% / 0% / 100%</w:t>
+            </w:r>
+          </w:p>
+        </w:tc>
+      </w:tr>
+      <w:tr>
+        <w:tc>
+          <w:tcPr>
+            <w:tcW w:type="dxa" w:w="3402"/>
+          </w:tcPr>
+          <w:p>
+            <w:pPr>
+              <w:spacing w:after="20"/>
+            </w:pPr>
+            <w:r/>
+            <w:r>
+              <w:rPr>
+                <w:b w:val="0"/>
+                <w:sz w:val="17"/>
+              </w:rPr>
+              <w:t>IoT Specialist (0,50)</w:t>
+            </w:r>
+          </w:p>
+        </w:tc>
+        <w:tc>
+          <w:tcPr>
+            <w:tcW w:type="dxa" w:w="2041"/>
+          </w:tcPr>
+          <w:p>
+            <w:pPr>
+              <w:spacing w:after="20"/>
+            </w:pPr>
+            <w:r/>
+            <w:r>
+              <w:rPr>
+                <w:b w:val="0"/>
+                <w:sz w:val="17"/>
+              </w:rPr>
+              <w:t>40% / 60% / 0%</w:t>
+            </w:r>
+          </w:p>
+        </w:tc>
+        <w:tc>
+          <w:tcPr>
+            <w:tcW w:type="dxa" w:w="2154"/>
+          </w:tcPr>
+          <w:p>
+            <w:pPr>
+              <w:spacing w:after="20"/>
+            </w:pPr>
+            <w:r/>
+            <w:r>
+              <w:rPr>
+                <w:b w:val="0"/>
+                <w:sz w:val="17"/>
+              </w:rPr>
+              <w:t>20% / 40% / 40%</w:t>
+            </w:r>
+          </w:p>
+        </w:tc>
+        <w:tc>
+          <w:tcPr>
+            <w:tcW w:type="dxa" w:w="1928"/>
+          </w:tcPr>
+          <w:p>
+            <w:pPr>
+              <w:spacing w:after="20"/>
+            </w:pPr>
+            <w:r/>
+            <w:r>
+              <w:rPr>
+                <w:b w:val="0"/>
+                <w:sz w:val="17"/>
+              </w:rPr>
+              <w:t>0% / 0% / 100%</w:t>
+            </w:r>
+          </w:p>
+        </w:tc>
+      </w:tr>
+      <w:tr>
+        <w:tc>
+          <w:tcPr>
+            <w:tcW w:type="dxa" w:w="3402"/>
+          </w:tcPr>
+          <w:p>
+            <w:pPr>
+              <w:spacing w:after="20"/>
+            </w:pPr>
+            <w:r/>
+            <w:r>
+              <w:rPr>
+                <w:b w:val="0"/>
+                <w:sz w:val="17"/>
+              </w:rPr>
+              <w:t>Specjalista ds. logistyki TSL (0,50)</w:t>
+            </w:r>
+          </w:p>
+        </w:tc>
+        <w:tc>
+          <w:tcPr>
+            <w:tcW w:type="dxa" w:w="2041"/>
+          </w:tcPr>
+          <w:p>
+            <w:pPr>
+              <w:spacing w:after="20"/>
+            </w:pPr>
+            <w:r/>
+            <w:r>
+              <w:rPr>
+                <w:b w:val="0"/>
+                <w:sz w:val="17"/>
+              </w:rPr>
+              <w:t>40% / 60% / 0%</w:t>
+            </w:r>
+          </w:p>
+        </w:tc>
+        <w:tc>
+          <w:tcPr>
+            <w:tcW w:type="dxa" w:w="2154"/>
+          </w:tcPr>
+          <w:p>
+            <w:pPr>
+              <w:spacing w:after="20"/>
+            </w:pPr>
+            <w:r/>
+            <w:r>
+              <w:rPr>
+                <w:b w:val="0"/>
+                <w:sz w:val="17"/>
+              </w:rPr>
+              <w:t>20% / 30% / 50%</w:t>
+            </w:r>
+          </w:p>
+        </w:tc>
+        <w:tc>
+          <w:tcPr>
+            <w:tcW w:type="dxa" w:w="1928"/>
+          </w:tcPr>
+          <w:p>
+            <w:pPr>
+              <w:spacing w:after="20"/>
+            </w:pPr>
+            <w:r/>
+            <w:r>
+              <w:rPr>
+                <w:b w:val="0"/>
+                <w:sz w:val="17"/>
+              </w:rPr>
+              <w:t>0% / 0% / 100%</w:t>
             </w:r>
           </w:p>
         </w:tc>
@@ -7405,7 +7627,7 @@
         <w:rPr>
           <w:b w:val="0"/>
         </w:rPr>
-        <w:t>Backend/Full-Stack Developer (1,0 etatu): Z6 w M19-M27 (9 miesięcy), Z9 w M28-M30 (3 miesiące). Słabsze punkty wariantu: w M22-M27 równy udział trzech zadań jest mniej dopasowany do pracy stanowisk, których zakres w Z6 jest wąski (IoT Specialist, specjalista ds. cyberbezpieczeństwa, specjalista TSL). Jeżeli ekspert zapyta o te pozycje, uzasadnieniem jest równoległa praca nad trzema zadaniami w tym okresie i stałe proporcje wpisane w zakres czynności.</w:t>
+        <w:t>Backend/Full-Stack Developer (1,0 etatu): Z6 w M19-M27 (9 miesięcy), Z9 w M28-M30 (3 miesiące). W M22-M27 stanowiska AI Lead, AI Senior Engineer i IT Specialist mają równy podział na trzy zadania, co uzasadnia równoległa praca o zbliżonym nakładzie. Jeżeli ekspert zapyta o tę równość, odpowiedzią jest opis zakresu prac w każdym z trzech zadań (zakresy Z6, Z7 i Z9) oraz stałe proporcje wpisane w zakres czynności.</w:t>
       </w:r>
     </w:p>
     <w:p>
@@ -7912,7 +8134,7 @@
                 <w:b w:val="0"/>
                 <w:sz w:val="16"/>
               </w:rPr>
-              <w:t>0,80</w:t>
+              <w:t>0,60</w:t>
             </w:r>
           </w:p>
         </w:tc>
@@ -7930,7 +8152,7 @@
                 <w:b w:val="0"/>
                 <w:sz w:val="16"/>
               </w:rPr>
-              <w:t>0,95</w:t>
+              <w:t>1,05</w:t>
             </w:r>
           </w:p>
         </w:tc>
@@ -7948,7 +8170,7 @@
                 <w:b w:val="0"/>
                 <w:sz w:val="16"/>
               </w:rPr>
-              <w:t>1,25</w:t>
+              <w:t>1,35</w:t>
             </w:r>
           </w:p>
         </w:tc>
@@ -7966,7 +8188,7 @@
                 <w:b w:val="0"/>
                 <w:sz w:val="16"/>
               </w:rPr>
-              <w:t>20 244,00</w:t>
+              <w:t>15 183,00</w:t>
             </w:r>
           </w:p>
         </w:tc>
@@ -7984,7 +8206,7 @@
                 <w:b w:val="0"/>
                 <w:sz w:val="16"/>
               </w:rPr>
-              <w:t>24 039,75</w:t>
+              <w:t>26 570,25</w:t>
             </w:r>
           </w:p>
         </w:tc>
@@ -8002,7 +8224,7 @@
                 <w:b w:val="0"/>
                 <w:sz w:val="16"/>
               </w:rPr>
-              <w:t>31 631,25</w:t>
+              <w:t>34 161,75</w:t>
             </w:r>
           </w:p>
         </w:tc>
@@ -8204,7 +8426,7 @@
                 <w:b w:val="0"/>
                 <w:sz w:val="16"/>
               </w:rPr>
-              <w:t>1,60</w:t>
+              <w:t>1,20</w:t>
             </w:r>
           </w:p>
         </w:tc>
@@ -8222,7 +8444,7 @@
                 <w:b w:val="0"/>
                 <w:sz w:val="16"/>
               </w:rPr>
-              <w:t>1,90</w:t>
+              <w:t>2,10</w:t>
             </w:r>
           </w:p>
         </w:tc>
@@ -8240,7 +8462,7 @@
                 <w:b w:val="0"/>
                 <w:sz w:val="16"/>
               </w:rPr>
-              <w:t>2,50</w:t>
+              <w:t>2,70</w:t>
             </w:r>
           </w:p>
         </w:tc>
@@ -8258,7 +8480,7 @@
                 <w:b w:val="0"/>
                 <w:sz w:val="16"/>
               </w:rPr>
-              <w:t>28 920,00</w:t>
+              <w:t>21 690,00</w:t>
             </w:r>
           </w:p>
         </w:tc>
@@ -8276,7 +8498,7 @@
                 <w:b w:val="0"/>
                 <w:sz w:val="16"/>
               </w:rPr>
-              <w:t>34 342,50</w:t>
+              <w:t>37 957,50</w:t>
             </w:r>
           </w:p>
         </w:tc>
@@ -8294,7 +8516,7 @@
                 <w:b w:val="0"/>
                 <w:sz w:val="16"/>
               </w:rPr>
-              <w:t>45 187,50</w:t>
+              <w:t>48 802,50</w:t>
             </w:r>
           </w:p>
         </w:tc>
@@ -8350,7 +8572,7 @@
                 <w:b w:val="0"/>
                 <w:sz w:val="16"/>
               </w:rPr>
-              <w:t>1,60</w:t>
+              <w:t>1,20</w:t>
             </w:r>
           </w:p>
         </w:tc>
@@ -8368,7 +8590,7 @@
                 <w:b w:val="0"/>
                 <w:sz w:val="16"/>
               </w:rPr>
-              <w:t>1,90</w:t>
+              <w:t>1,80</w:t>
             </w:r>
           </w:p>
         </w:tc>
@@ -8386,7 +8608,7 @@
                 <w:b w:val="0"/>
                 <w:sz w:val="16"/>
               </w:rPr>
-              <w:t>2,50</w:t>
+              <w:t>3,00</w:t>
             </w:r>
           </w:p>
         </w:tc>
@@ -8404,7 +8626,7 @@
                 <w:b w:val="0"/>
                 <w:sz w:val="16"/>
               </w:rPr>
-              <w:t>19 280,00</w:t>
+              <w:t>14 460,00</w:t>
             </w:r>
           </w:p>
         </w:tc>
@@ -8422,7 +8644,7 @@
                 <w:b w:val="0"/>
                 <w:sz w:val="16"/>
               </w:rPr>
-              <w:t>22 895,00</w:t>
+              <w:t>21 690,00</w:t>
             </w:r>
           </w:p>
         </w:tc>
@@ -8440,7 +8662,7 @@
                 <w:b w:val="0"/>
                 <w:sz w:val="16"/>
               </w:rPr>
-              <w:t>30 125,00</w:t>
+              <w:t>36 150,00</w:t>
             </w:r>
           </w:p>
         </w:tc>
@@ -8661,7 +8883,7 @@
                 <w:b w:val="0"/>
                 <w:sz w:val="16"/>
               </w:rPr>
-              <w:t>451 152,00</w:t>
+              <w:t>434 041,00</w:t>
             </w:r>
           </w:p>
         </w:tc>
@@ -8679,7 +8901,7 @@
                 <w:b w:val="0"/>
                 <w:sz w:val="16"/>
               </w:rPr>
-              <w:t>303 931,12</w:t>
+              <w:t>308 871,62</w:t>
             </w:r>
           </w:p>
         </w:tc>
@@ -8697,7 +8919,7 @@
                 <w:b w:val="0"/>
                 <w:sz w:val="16"/>
               </w:rPr>
-              <w:t>464 979,38</w:t>
+              <w:t>477 149,88</w:t>
             </w:r>
           </w:p>
         </w:tc>
@@ -8880,7 +9102,7 @@
           <w:color w:val="666666"/>
           <w:sz w:val="17"/>
         </w:rPr>
-        <w:t xml:space="preserve"> [1020 z 1500 znaków]</w:t>
+        <w:t xml:space="preserve"> [1130 z 1500 znaków]</w:t>
       </w:r>
     </w:p>
     <w:p>
@@ -8892,7 +9114,7 @@
         <w:rPr>
           <w:b w:val="0"/>
         </w:rPr>
-        <w:t>Koszt = 23 000,00 zł brutto/mc x narzut pracodawcy 1,205 = 27 715,00 zł/mc x 2,40 etatomiesiąca (miesięcy pracy w przeliczeniu na pełny etat) = 66 516,00 zł. Nakład w zadaniu Z6 wynosi 3 mc (M19-M21) x 40% x 0,75 etatu + 6 mc (M22-M27) x 1/3 x 0,75 etatu = 2,40 etatomiesiąca. Udziały czasu pracy w projekcie są stałe w trzech okresach i wpisane w zakresie czynności pracownika: w M19-M21 40% na zadanie Z6 i 60% na zadanie Z7 (Z7 wymaga wcześniejszego projektu sprzętu i pierwszych egzemplarzy platformy na M22), w M22-M27 po jednej trzeciej na zadania Z6, Z7 i Z9 (równoległa praca nad trzema zadaniami), w M28-M30 100% na zadanie Z9. Suma udziałów w każdym miesiącu równa się 0,75 etatu, a w całym okresie M19-M30 9,00 etatomiesiąca. Stawkę brutto zweryfikowano na podstawie No Fluff Jobs „Rynek pracy IT 2025/2026”, kat. AI poziom Senior, UoP 20000-29000 (s. 33; tabela zbiorcza 19000-24000, s. 27), 23000 w środku pasma senior/lead. Wynagrodzenie niezbędne do realizacji prac B+R. Forma zatrudnienia: umowa o pracę.</w:t>
+        <w:t>Koszt = 23 000,00 zł brutto/mc x narzut pracodawcy 1,205 = 27 715,00 zł/mc x 2,40 etatomiesiąca (miesięcy pracy w przeliczeniu na pełny etat) = 66 516,00 zł. Nakład w zadaniu Z6 wynosi 3 mc (M19-M21) x 40% x 0,75 etatu + 6 mc (M22-M27) x 1/3 x 0,75 etatu = 2,40 etatomiesiąca. Udziały czasu pracy w projekcie są stałe w trzech okresach i wpisane w zakresie czynności pracownika: w M19-M21 40% na zadanie Z6 i 60% na zadanie Z7 (Z7 wymaga wcześniejszego projektu sprzętu i pierwszych egzemplarzy platformy na M22), w M22-M27 po jednej trzeciej, bo równolegle trwają architektura i optymalizacja pipeline'u (Z6), strategia kompresji i walidacja modeli (Z7) oraz protokół KPI i dane terenowe (Z9) o zbliżonym nakładzie, w M28-M30 100% na zadanie Z9. Suma udziałów w każdym miesiącu równa się 0,75 etatu, a w całym okresie M19-M30 9,00 etatomiesiąca. Stawkę brutto zweryfikowano na podstawie No Fluff Jobs „Rynek pracy IT 2025/2026”, kat. AI poziom Senior, UoP 20000-29000 (s. 33; tabela zbiorcza 19000-24000, s. 27), 23000 w środku pasma senior/lead. Wynagrodzenie niezbędne do realizacji prac B+R. Forma zatrudnienia: umowa o pracę.</w:t>
       </w:r>
     </w:p>
     <w:p>
@@ -8912,7 +9134,7 @@
           <w:color w:val="666666"/>
           <w:sz w:val="17"/>
         </w:rPr>
-        <w:t xml:space="preserve"> [1033 z 1500 znaków]</w:t>
+        <w:t xml:space="preserve"> [1168 z 1500 znaków]</w:t>
       </w:r>
     </w:p>
     <w:p>
@@ -8924,7 +9146,7 @@
         <w:rPr>
           <w:b w:val="0"/>
         </w:rPr>
-        <w:t>Koszt = 16 500,00 zł brutto/mc x narzut pracodawcy 1,205 = 19 882,50 zł/mc x 2,40 etatomiesiąca (miesięcy pracy w przeliczeniu na pełny etat) = 47 718,00 zł. Nakład w zadaniu Z6 wynosi 3 mc (M19-M21) x 40% x 0,75 etatu + 6 mc (M22-M27) x 1/3 x 0,75 etatu = 2,40 etatomiesiąca. Udziały czasu pracy w projekcie są stałe w trzech okresach i wpisane w zakresie czynności pracownika: w M19-M21 40% na zadanie Z6 i 60% na zadanie Z7 (Z7 wymaga wcześniejszego projektu sprzętu i pierwszych egzemplarzy platformy na M22), w M22-M27 po jednej trzeciej na zadania Z6, Z7 i Z9 (równoległa praca nad trzema zadaniami), w M28-M30 100% na zadanie Z9. Suma udziałów w każdym miesiącu równa się 0,75 etatu, a w całym okresie M19-M30 9,00 etatomiesiąca. Stawkę brutto zweryfikowano na podstawie No Fluff Jobs „Rynek pracy IT 2025/2026”, kat. AI (s. 33): Senior 20000-29000, Mid 14000-21000, 16500 w paśmie Mid, poniżej dolnej mediany Senior (założenie konserwatywne). Wynagrodzenie niezbędne do realizacji prac B+R. Forma zatrudnienia: umowa o pracę.</w:t>
+        <w:t>Koszt = 16 500,00 zł brutto/mc x narzut pracodawcy 1,205 = 19 882,50 zł/mc x 2,40 etatomiesiąca (miesięcy pracy w przeliczeniu na pełny etat) = 47 718,00 zł. Nakład w zadaniu Z6 wynosi 3 mc (M19-M21) x 40% x 0,75 etatu + 6 mc (M22-M27) x 1/3 x 0,75 etatu = 2,40 etatomiesiąca. Udziały czasu pracy w projekcie są stałe w trzech okresach i wpisane w zakresie czynności pracownika: w M19-M21 40% na zadanie Z6 i 60% na zadanie Z7 (Z7 wymaga wcześniejszego projektu sprzętu i pierwszych egzemplarzy platformy na M22), w M22-M27 po jednej trzeciej, bo równolegle trwają integracja change detection i raport ML (Z6), implementacja kompresji i optymalizacja na platformie (Z7) oraz diagnoza przesunięcia domeny i korekty (Z9) o zbliżonym nakładzie, w M28-M30 100% na zadanie Z9. Suma udziałów w każdym miesiącu równa się 0,75 etatu, a w całym okresie M19-M30 9,00 etatomiesiąca. Stawkę brutto zweryfikowano na podstawie No Fluff Jobs „Rynek pracy IT 2025/2026”, kat. AI (s. 33): Senior 20000-29000, Mid 14000-21000, 16500 w paśmie Mid, poniżej dolnej mediany Senior (założenie konserwatywne). Wynagrodzenie niezbędne do realizacji prac B+R. Forma zatrudnienia: umowa o pracę.</w:t>
       </w:r>
     </w:p>
     <w:p>
@@ -8944,7 +9166,7 @@
           <w:color w:val="666666"/>
           <w:sz w:val="17"/>
         </w:rPr>
-        <w:t xml:space="preserve"> [1018 z 1500 znaków]</w:t>
+        <w:t xml:space="preserve"> [1153 z 1500 znaków]</w:t>
       </w:r>
     </w:p>
     <w:p>
@@ -8956,7 +9178,7 @@
         <w:rPr>
           <w:b w:val="0"/>
         </w:rPr>
-        <w:t>Koszt = 21 000,00 zł brutto/mc x narzut pracodawcy 1,205 = 25 305,00 zł/mc x 0,80 etatomiesiąca (miesięcy pracy w przeliczeniu na pełny etat) = 20 244,00 zł. Nakład w zadaniu Z6 wynosi 3 mc (M19-M21) x 40% x 0,25 etatu + 6 mc (M22-M27) x 1/3 x 0,25 etatu = 0,80 etatomiesiąca. Udziały czasu pracy w projekcie są stałe w trzech okresach i wpisane w zakresie czynności pracownika: w M19-M21 40% na zadanie Z6 i 60% na zadanie Z7 (Z7 wymaga wcześniejszego projektu sprzętu i pierwszych egzemplarzy platformy na M22), w M22-M27 po jednej trzeciej na zadania Z6, Z7 i Z9 (równoległa praca nad trzema zadaniami), w M28-M30 100% na zadanie Z9. Suma udziałów w każdym miesiącu równa się 0,25 etatu, a w całym okresie M19-M30 3,00 etatomiesiąca. Stawkę brutto zweryfikowano na podstawie No Fluff Jobs „Rynek pracy IT 2025/2026”, kat. Security poziom Senior, UoP 20000-28000 (s. 32; tabela zbiorcza 17000-23000, s. 27), 21000 w widełkach senior. Wynagrodzenie niezbędne do realizacji prac B+R. Forma zatrudnienia: umowa o pracę.</w:t>
+        <w:t>Koszt = 21 000,00 zł brutto/mc x narzut pracodawcy 1,205 = 25 305,00 zł/mc x 0,60 etatomiesiąca (miesięcy pracy w przeliczeniu na pełny etat) = 15 183,00 zł. Nakład w zadaniu Z6 wynosi 3 mc (M19-M21) x 40% x 0,25 etatu + 6 mc (M22-M27) x 20% x 0,25 etatu = 0,60 etatomiesiąca. Udziały czasu pracy w projekcie są stałe w trzech okresach i wpisane w zakresie czynności pracownika: w M19-M21 40% na zadanie Z6 i 60% na zadanie Z7 (Z7 wymaga wcześniejszego projektu sprzętu i pierwszych egzemplarzy platformy na M22), w M22-M27 20% na Z6 (podpis kryptograficzny i łańcuch integralności), 40% na Z7 (bezpieczny rozruch, podpisywanie aktualizacji, szyfrowanie transmisji) i 40% na Z9 (testy bezpieczeństwa w terenie, rola niezależnego ewaluatora), w M28-M30 100% na zadanie Z9. Suma udziałów w każdym miesiącu równa się 0,25 etatu, a w całym okresie M19-M30 3,00 etatomiesiąca. Stawkę brutto zweryfikowano na podstawie No Fluff Jobs „Rynek pracy IT 2025/2026”, kat. Security poziom Senior, UoP 20000-28000 (s. 32; tabela zbiorcza 17000-23000, s. 27), 21000 w widełkach senior. Wynagrodzenie niezbędne do realizacji prac B+R. Forma zatrudnienia: umowa o pracę.</w:t>
       </w:r>
     </w:p>
     <w:p>
@@ -8976,7 +9198,7 @@
           <w:color w:val="666666"/>
           <w:sz w:val="17"/>
         </w:rPr>
-        <w:t xml:space="preserve"> [1002 z 1500 znaków]</w:t>
+        <w:t xml:space="preserve"> [1099 z 1500 znaków]</w:t>
       </w:r>
     </w:p>
     <w:p>
@@ -8988,7 +9210,7 @@
         <w:rPr>
           <w:b w:val="0"/>
         </w:rPr>
-        <w:t>Koszt = 19 000,00 zł brutto/mc x narzut pracodawcy 1,205 = 22 895,00 zł/mc x 3,20 etatomiesiąca (miesięcy pracy w przeliczeniu na pełny etat) = 73 264,00 zł. Nakład w zadaniu Z6 wynosi 3 mc (M19-M21) x 40% x 1,00 etatu + 6 mc (M22-M27) x 1/3 x 1,00 etatu = 3,20 etatomiesiąca. Udziały czasu pracy w projekcie są stałe w trzech okresach i wpisane w zakresie czynności pracownika: w M19-M21 40% na zadanie Z6 i 60% na zadanie Z7 (Z7 wymaga wcześniejszego projektu sprzętu i pierwszych egzemplarzy platformy na M22), w M22-M27 po jednej trzeciej na zadania Z6, Z7 i Z9 (równoległa praca nad trzema zadaniami), w M28-M30 100% na zadanie Z9. Suma udziałów w każdym miesiącu równa się 1,00 etatu, a w całym okresie M19-M30 12,00 etatomiesiąca. Stawkę brutto zweryfikowano na podstawie No Fluff Jobs „Rynek pracy IT 2025/2026”, kat. Backend/Fullstack poziom Senior, UoP 18500-25000 (s. 30), 19000 w dolnej części pasma senior. Wynagrodzenie niezbędne do realizacji prac B+R. Forma zatrudnienia: umowa o pracę.</w:t>
+        <w:t>Koszt = 19 000,00 zł brutto/mc x narzut pracodawcy 1,205 = 22 895,00 zł/mc x 3,20 etatomiesiąca (miesięcy pracy w przeliczeniu na pełny etat) = 73 264,00 zł. Nakład w zadaniu Z6 wynosi 3 mc (M19-M21) x 40% x 1,00 etatu + 6 mc (M22-M27) x 1/3 x 1,00 etatu = 3,20 etatomiesiąca. Udziały czasu pracy w projekcie są stałe w trzech okresach i wpisane w zakresie czynności pracownika: w M19-M21 40% na zadanie Z6 i 60% na zadanie Z7 (Z7 wymaga wcześniejszego projektu sprzętu i pierwszych egzemplarzy platformy na M22), w M22-M27 po jednej trzeciej, bo równolegle trwają pipeline, generator eFTI i integracje testowe (Z6), oprogramowanie embedded (Z7) oraz logi i pomiary w Fazie A (Z9) o zbliżonym nakładzie, w M28-M30 100% na zadanie Z9. Suma udziałów w każdym miesiącu równa się 1,00 etatu, a w całym okresie M19-M30 12,00 etatomiesiąca. Stawkę brutto zweryfikowano na podstawie No Fluff Jobs „Rynek pracy IT 2025/2026”, kat. Backend/Fullstack poziom Senior, UoP 18500-25000 (s. 30), 19000 w dolnej części pasma senior. Wynagrodzenie niezbędne do realizacji prac B+R. Forma zatrudnienia: umowa o pracę.</w:t>
       </w:r>
     </w:p>
     <w:p>
@@ -9008,7 +9230,7 @@
           <w:color w:val="666666"/>
           <w:sz w:val="17"/>
         </w:rPr>
-        <w:t xml:space="preserve"> [1066 z 1500 znaków]</w:t>
+        <w:t xml:space="preserve"> [1233 z 1500 znaków]</w:t>
       </w:r>
     </w:p>
     <w:p>
@@ -9020,7 +9242,7 @@
         <w:rPr>
           <w:b w:val="0"/>
         </w:rPr>
-        <w:t>Koszt = 15 000,00 zł brutto/mc x narzut pracodawcy 1,205 = 18 075,00 zł/mc x 1,60 etatomiesiąca (miesięcy pracy w przeliczeniu na pełny etat) = 28 920,00 zł. Nakład w zadaniu Z6 wynosi 3 mc (M19-M21) x 40% x 0,50 etatu + 6 mc (M22-M27) x 1/3 x 0,50 etatu = 1,60 etatomiesiąca. Udziały czasu pracy w projekcie są stałe w trzech okresach i wpisane w zakresie czynności pracownika: w M19-M21 40% na zadanie Z6 i 60% na zadanie Z7 (Z7 wymaga wcześniejszego projektu sprzętu i pierwszych egzemplarzy platformy na M22), w M22-M27 po jednej trzeciej na zadania Z6, Z7 i Z9 (równoległa praca nad trzema zadaniami), w M28-M30 100% na zadanie Z9. Suma udziałów w każdym miesiącu równa się 0,50 etatu, a w całym okresie M19-M30 6,00 etatomiesiąca. Stawkę brutto zweryfikowano na podstawie No Fluff Jobs „Rynek pracy IT 2025/2026”, kat. Embedded (s. 27/35: 13000-19000, Mid 12000-17000); pomocniczo Hays „Raport płacowy 2026”, R&amp;D Engineer 13/16/18 tys. (s. 38), 15000 w widełkach kat. Embedded. Wynagrodzenie niezbędne do realizacji prac B+R. Forma zatrudnienia: umowa o pracę.</w:t>
+        <w:t>Koszt = 15 000,00 zł brutto/mc x narzut pracodawcy 1,205 = 18 075,00 zł/mc x 1,20 etatomiesiąca (miesięcy pracy w przeliczeniu na pełny etat) = 21 690,00 zł. Nakład w zadaniu Z6 wynosi 3 mc (M19-M21) x 40% x 0,50 etatu + 6 mc (M22-M27) x 20% x 0,50 etatu = 1,20 etatomiesiąca. Udziały czasu pracy w projekcie są stałe w trzech okresach i wpisane w zakresie czynności pracownika: w M19-M21 40% na zadanie Z6 i 60% na zadanie Z7 (Z7 wymaga wcześniejszego projektu sprzętu i pierwszych egzemplarzy platformy na M22), w M22-M27 20% na Z6 (czujnik drzwi, synchronizacja GPS, agregacja historii sygnałów), 40% na Z7 (architektura sprzętowa, obudowa, testy środowiskowe, pomiar opóźnienia) i 40% na Z9 (odbiór zestawów po montażu, kalibracja, rejestracja niezawodności w terenie), w M28-M30 100% na zadanie Z9. Suma udziałów w każdym miesiącu równa się 0,50 etatu, a w całym okresie M19-M30 6,00 etatomiesiąca. Stawkę brutto zweryfikowano na podstawie No Fluff Jobs „Rynek pracy IT 2025/2026”, kat. Embedded (s. 27/35: 13000-19000, Mid 12000-17000); pomocniczo Hays „Raport płacowy 2026”, R&amp;D Engineer 13/16/18 tys. (s. 38), 15000 w widełkach kat. Embedded. Wynagrodzenie niezbędne do realizacji prac B+R. Forma zatrudnienia: umowa o pracę.</w:t>
       </w:r>
     </w:p>
     <w:p>
@@ -9040,7 +9262,7 @@
           <w:color w:val="666666"/>
           <w:sz w:val="17"/>
         </w:rPr>
-        <w:t xml:space="preserve"> [1014 z 1500 znaków]</w:t>
+        <w:t xml:space="preserve"> [1102 z 1500 znaków]</w:t>
       </w:r>
     </w:p>
     <w:p>
@@ -9052,7 +9274,7 @@
         <w:rPr>
           <w:b w:val="0"/>
         </w:rPr>
-        <w:t>Koszt = 10 000,00 zł brutto/mc x narzut pracodawcy 1,205 = 12 050,00 zł/mc x 1,60 etatomiesiąca (miesięcy pracy w przeliczeniu na pełny etat) = 19 280,00 zł. Nakład w zadaniu Z6 wynosi 3 mc (M19-M21) x 40% x 0,50 etatu + 6 mc (M22-M27) x 1/3 x 0,50 etatu = 1,60 etatomiesiąca. Udziały czasu pracy w projekcie są stałe w trzech okresach i wpisane w zakresie czynności pracownika: w M19-M21 40% na zadanie Z6 i 60% na zadanie Z7 (Z7 wymaga wcześniejszego projektu sprzętu i pierwszych egzemplarzy platformy na M22), w M22-M27 po jednej trzeciej na zadania Z6, Z7 i Z9 (równoległa praca nad trzema zadaniami), w M28-M30 100% na zadanie Z9. Suma udziałów w każdym miesiącu równa się 0,50 etatu, a w całym okresie M19-M30 6,00 etatomiesiąca. Stawkę brutto zweryfikowano na podstawie Hays „Raport płacowy 2026”, sekcja Logistyka i zakupy, tabela Logistyka, „Specjalista ds. Logistyki” 8000/10000/13000 (s. 40), 10000 = wartość optymalna. Wynagrodzenie niezbędne do realizacji prac B+R. Forma zatrudnienia: umowa o pracę.</w:t>
+        <w:t>Koszt = 10 000,00 zł brutto/mc x narzut pracodawcy 1,205 = 12 050,00 zł/mc x 1,20 etatomiesiąca (miesięcy pracy w przeliczeniu na pełny etat) = 14 460,00 zł. Nakład w zadaniu Z6 wynosi 3 mc (M19-M21) x 40% x 0,50 etatu + 6 mc (M22-M27) x 20% x 0,50 etatu = 1,20 etatomiesiąca. Udziały czasu pracy w projekcie są stałe w trzech okresach i wpisane w zakresie czynności pracownika: w M19-M21 40% na zadanie Z6 i 60% na zadanie Z7 (Z7 wymaga wcześniejszego projektu sprzętu i pierwszych egzemplarzy platformy na M22), w M22-M27 20% na Z6 (interpretacja pól eFTI, ocena treści PoL i PoC), 30% na Z7 (scenariusze i progi alertów, użyteczność w kabinie) i 50% na Z9 (inspekcje ground truth od Fazy A), w M28-M30 100% na zadanie Z9. Suma udziałów w każdym miesiącu równa się 0,50 etatu, a w całym okresie M19-M30 6,00 etatomiesiąca. Stawkę brutto zweryfikowano na podstawie Hays „Raport płacowy 2026”, sekcja Logistyka i zakupy, tabela Logistyka, „Specjalista ds. Logistyki” 8000/10000/13000 (s. 40), 10000 = wartość optymalna. Wynagrodzenie niezbędne do realizacji prac B+R. Forma zatrudnienia: umowa o pracę.</w:t>
       </w:r>
     </w:p>
     <w:p>
@@ -9112,7 +9334,7 @@
           <w:color w:val="666666"/>
           <w:sz w:val="17"/>
         </w:rPr>
-        <w:t xml:space="preserve"> [1020 z 1500 znaków]</w:t>
+        <w:t xml:space="preserve"> [1130 z 1500 znaków]</w:t>
       </w:r>
     </w:p>
     <w:p>
@@ -9124,7 +9346,7 @@
         <w:rPr>
           <w:b w:val="0"/>
         </w:rPr>
-        <w:t>Koszt = 23 000,00 zł brutto/mc x narzut pracodawcy 1,205 = 27 715,00 zł/mc x 2,85 etatomiesiąca (miesięcy pracy w przeliczeniu na pełny etat) = 78 987,75 zł. Nakład w zadaniu Z7 wynosi 3 mc (M19-M21) x 60% x 0,75 etatu + 6 mc (M22-M27) x 1/3 x 0,75 etatu = 2,85 etatomiesiąca. Udziały czasu pracy w projekcie są stałe w trzech okresach i wpisane w zakresie czynności pracownika: w M19-M21 40% na zadanie Z6 i 60% na zadanie Z7 (Z7 wymaga wcześniejszego projektu sprzętu i pierwszych egzemplarzy platformy na M22), w M22-M27 po jednej trzeciej na zadania Z6, Z7 i Z9 (równoległa praca nad trzema zadaniami), w M28-M30 100% na zadanie Z9. Suma udziałów w każdym miesiącu równa się 0,75 etatu, a w całym okresie M19-M30 9,00 etatomiesiąca. Stawkę brutto zweryfikowano na podstawie No Fluff Jobs „Rynek pracy IT 2025/2026”, kat. AI poziom Senior, UoP 20000-29000 (s. 33; tabela zbiorcza 19000-24000, s. 27), 23000 w środku pasma senior/lead. Wynagrodzenie niezbędne do realizacji prac B+R. Forma zatrudnienia: umowa o pracę.</w:t>
+        <w:t>Koszt = 23 000,00 zł brutto/mc x narzut pracodawcy 1,205 = 27 715,00 zł/mc x 2,85 etatomiesiąca (miesięcy pracy w przeliczeniu na pełny etat) = 78 987,75 zł. Nakład w zadaniu Z7 wynosi 3 mc (M19-M21) x 60% x 0,75 etatu + 6 mc (M22-M27) x 1/3 x 0,75 etatu = 2,85 etatomiesiąca. Udziały czasu pracy w projekcie są stałe w trzech okresach i wpisane w zakresie czynności pracownika: w M19-M21 40% na zadanie Z6 i 60% na zadanie Z7 (Z7 wymaga wcześniejszego projektu sprzętu i pierwszych egzemplarzy platformy na M22), w M22-M27 po jednej trzeciej, bo równolegle trwają architektura i optymalizacja pipeline'u (Z6), strategia kompresji i walidacja modeli (Z7) oraz protokół KPI i dane terenowe (Z9) o zbliżonym nakładzie, w M28-M30 100% na zadanie Z9. Suma udziałów w każdym miesiącu równa się 0,75 etatu, a w całym okresie M19-M30 9,00 etatomiesiąca. Stawkę brutto zweryfikowano na podstawie No Fluff Jobs „Rynek pracy IT 2025/2026”, kat. AI poziom Senior, UoP 20000-29000 (s. 33; tabela zbiorcza 19000-24000, s. 27), 23000 w środku pasma senior/lead. Wynagrodzenie niezbędne do realizacji prac B+R. Forma zatrudnienia: umowa o pracę.</w:t>
       </w:r>
     </w:p>
     <w:p>
@@ -9144,7 +9366,7 @@
           <w:color w:val="666666"/>
           <w:sz w:val="17"/>
         </w:rPr>
-        <w:t xml:space="preserve"> [1033 z 1500 znaków]</w:t>
+        <w:t xml:space="preserve"> [1168 z 1500 znaków]</w:t>
       </w:r>
     </w:p>
     <w:p>
@@ -9156,7 +9378,7 @@
         <w:rPr>
           <w:b w:val="0"/>
         </w:rPr>
-        <w:t>Koszt = 16 500,00 zł brutto/mc x narzut pracodawcy 1,205 = 19 882,50 zł/mc x 2,85 etatomiesiąca (miesięcy pracy w przeliczeniu na pełny etat) = 56 665,12 zł. Nakład w zadaniu Z7 wynosi 3 mc (M19-M21) x 60% x 0,75 etatu + 6 mc (M22-M27) x 1/3 x 0,75 etatu = 2,85 etatomiesiąca. Udziały czasu pracy w projekcie są stałe w trzech okresach i wpisane w zakresie czynności pracownika: w M19-M21 40% na zadanie Z6 i 60% na zadanie Z7 (Z7 wymaga wcześniejszego projektu sprzętu i pierwszych egzemplarzy platformy na M22), w M22-M27 po jednej trzeciej na zadania Z6, Z7 i Z9 (równoległa praca nad trzema zadaniami), w M28-M30 100% na zadanie Z9. Suma udziałów w każdym miesiącu równa się 0,75 etatu, a w całym okresie M19-M30 9,00 etatomiesiąca. Stawkę brutto zweryfikowano na podstawie No Fluff Jobs „Rynek pracy IT 2025/2026”, kat. AI (s. 33): Senior 20000-29000, Mid 14000-21000, 16500 w paśmie Mid, poniżej dolnej mediany Senior (założenie konserwatywne). Wynagrodzenie niezbędne do realizacji prac B+R. Forma zatrudnienia: umowa o pracę.</w:t>
+        <w:t>Koszt = 16 500,00 zł brutto/mc x narzut pracodawcy 1,205 = 19 882,50 zł/mc x 2,85 etatomiesiąca (miesięcy pracy w przeliczeniu na pełny etat) = 56 665,12 zł. Nakład w zadaniu Z7 wynosi 3 mc (M19-M21) x 60% x 0,75 etatu + 6 mc (M22-M27) x 1/3 x 0,75 etatu = 2,85 etatomiesiąca. Udziały czasu pracy w projekcie są stałe w trzech okresach i wpisane w zakresie czynności pracownika: w M19-M21 40% na zadanie Z6 i 60% na zadanie Z7 (Z7 wymaga wcześniejszego projektu sprzętu i pierwszych egzemplarzy platformy na M22), w M22-M27 po jednej trzeciej, bo równolegle trwają integracja change detection i raport ML (Z6), implementacja kompresji i optymalizacja na platformie (Z7) oraz diagnoza przesunięcia domeny i korekty (Z9) o zbliżonym nakładzie, w M28-M30 100% na zadanie Z9. Suma udziałów w każdym miesiącu równa się 0,75 etatu, a w całym okresie M19-M30 9,00 etatomiesiąca. Stawkę brutto zweryfikowano na podstawie No Fluff Jobs „Rynek pracy IT 2025/2026”, kat. AI (s. 33): Senior 20000-29000, Mid 14000-21000, 16500 w paśmie Mid, poniżej dolnej mediany Senior (założenie konserwatywne). Wynagrodzenie niezbędne do realizacji prac B+R. Forma zatrudnienia: umowa o pracę.</w:t>
       </w:r>
     </w:p>
     <w:p>
@@ -9176,7 +9398,7 @@
           <w:color w:val="666666"/>
           <w:sz w:val="17"/>
         </w:rPr>
-        <w:t xml:space="preserve"> [1018 z 1500 znaków]</w:t>
+        <w:t xml:space="preserve"> [1153 z 1500 znaków]</w:t>
       </w:r>
     </w:p>
     <w:p>
@@ -9188,7 +9410,7 @@
         <w:rPr>
           <w:b w:val="0"/>
         </w:rPr>
-        <w:t>Koszt = 21 000,00 zł brutto/mc x narzut pracodawcy 1,205 = 25 305,00 zł/mc x 0,95 etatomiesiąca (miesięcy pracy w przeliczeniu na pełny etat) = 24 039,75 zł. Nakład w zadaniu Z7 wynosi 3 mc (M19-M21) x 60% x 0,25 etatu + 6 mc (M22-M27) x 1/3 x 0,25 etatu = 0,95 etatomiesiąca. Udziały czasu pracy w projekcie są stałe w trzech okresach i wpisane w zakresie czynności pracownika: w M19-M21 40% na zadanie Z6 i 60% na zadanie Z7 (Z7 wymaga wcześniejszego projektu sprzętu i pierwszych egzemplarzy platformy na M22), w M22-M27 po jednej trzeciej na zadania Z6, Z7 i Z9 (równoległa praca nad trzema zadaniami), w M28-M30 100% na zadanie Z9. Suma udziałów w każdym miesiącu równa się 0,25 etatu, a w całym okresie M19-M30 3,00 etatomiesiąca. Stawkę brutto zweryfikowano na podstawie No Fluff Jobs „Rynek pracy IT 2025/2026”, kat. Security poziom Senior, UoP 20000-28000 (s. 32; tabela zbiorcza 17000-23000, s. 27), 21000 w widełkach senior. Wynagrodzenie niezbędne do realizacji prac B+R. Forma zatrudnienia: umowa o pracę.</w:t>
+        <w:t>Koszt = 21 000,00 zł brutto/mc x narzut pracodawcy 1,205 = 25 305,00 zł/mc x 1,05 etatomiesiąca (miesięcy pracy w przeliczeniu na pełny etat) = 26 570,25 zł. Nakład w zadaniu Z7 wynosi 3 mc (M19-M21) x 60% x 0,25 etatu + 6 mc (M22-M27) x 40% x 0,25 etatu = 1,05 etatomiesiąca. Udziały czasu pracy w projekcie są stałe w trzech okresach i wpisane w zakresie czynności pracownika: w M19-M21 40% na zadanie Z6 i 60% na zadanie Z7 (Z7 wymaga wcześniejszego projektu sprzętu i pierwszych egzemplarzy platformy na M22), w M22-M27 20% na Z6 (podpis kryptograficzny i łańcuch integralności), 40% na Z7 (bezpieczny rozruch, podpisywanie aktualizacji, szyfrowanie transmisji) i 40% na Z9 (testy bezpieczeństwa w terenie, rola niezależnego ewaluatora), w M28-M30 100% na zadanie Z9. Suma udziałów w każdym miesiącu równa się 0,25 etatu, a w całym okresie M19-M30 3,00 etatomiesiąca. Stawkę brutto zweryfikowano na podstawie No Fluff Jobs „Rynek pracy IT 2025/2026”, kat. Security poziom Senior, UoP 20000-28000 (s. 32; tabela zbiorcza 17000-23000, s. 27), 21000 w widełkach senior. Wynagrodzenie niezbędne do realizacji prac B+R. Forma zatrudnienia: umowa o pracę.</w:t>
       </w:r>
     </w:p>
     <w:p>
@@ -9208,7 +9430,7 @@
           <w:color w:val="666666"/>
           <w:sz w:val="17"/>
         </w:rPr>
-        <w:t xml:space="preserve"> [1002 z 1500 znaków]</w:t>
+        <w:t xml:space="preserve"> [1099 z 1500 znaków]</w:t>
       </w:r>
     </w:p>
     <w:p>
@@ -9220,7 +9442,7 @@
         <w:rPr>
           <w:b w:val="0"/>
         </w:rPr>
-        <w:t>Koszt = 19 000,00 zł brutto/mc x narzut pracodawcy 1,205 = 22 895,00 zł/mc x 3,80 etatomiesiąca (miesięcy pracy w przeliczeniu na pełny etat) = 87 001,00 zł. Nakład w zadaniu Z7 wynosi 3 mc (M19-M21) x 60% x 1,00 etatu + 6 mc (M22-M27) x 1/3 x 1,00 etatu = 3,80 etatomiesiąca. Udziały czasu pracy w projekcie są stałe w trzech okresach i wpisane w zakresie czynności pracownika: w M19-M21 40% na zadanie Z6 i 60% na zadanie Z7 (Z7 wymaga wcześniejszego projektu sprzętu i pierwszych egzemplarzy platformy na M22), w M22-M27 po jednej trzeciej na zadania Z6, Z7 i Z9 (równoległa praca nad trzema zadaniami), w M28-M30 100% na zadanie Z9. Suma udziałów w każdym miesiącu równa się 1,00 etatu, a w całym okresie M19-M30 12,00 etatomiesiąca. Stawkę brutto zweryfikowano na podstawie No Fluff Jobs „Rynek pracy IT 2025/2026”, kat. Backend/Fullstack poziom Senior, UoP 18500-25000 (s. 30), 19000 w dolnej części pasma senior. Wynagrodzenie niezbędne do realizacji prac B+R. Forma zatrudnienia: umowa o pracę.</w:t>
+        <w:t>Koszt = 19 000,00 zł brutto/mc x narzut pracodawcy 1,205 = 22 895,00 zł/mc x 3,80 etatomiesiąca (miesięcy pracy w przeliczeniu na pełny etat) = 87 001,00 zł. Nakład w zadaniu Z7 wynosi 3 mc (M19-M21) x 60% x 1,00 etatu + 6 mc (M22-M27) x 1/3 x 1,00 etatu = 3,80 etatomiesiąca. Udziały czasu pracy w projekcie są stałe w trzech okresach i wpisane w zakresie czynności pracownika: w M19-M21 40% na zadanie Z6 i 60% na zadanie Z7 (Z7 wymaga wcześniejszego projektu sprzętu i pierwszych egzemplarzy platformy na M22), w M22-M27 po jednej trzeciej, bo równolegle trwają pipeline, generator eFTI i integracje testowe (Z6), oprogramowanie embedded (Z7) oraz logi i pomiary w Fazie A (Z9) o zbliżonym nakładzie, w M28-M30 100% na zadanie Z9. Suma udziałów w każdym miesiącu równa się 1,00 etatu, a w całym okresie M19-M30 12,00 etatomiesiąca. Stawkę brutto zweryfikowano na podstawie No Fluff Jobs „Rynek pracy IT 2025/2026”, kat. Backend/Fullstack poziom Senior, UoP 18500-25000 (s. 30), 19000 w dolnej części pasma senior. Wynagrodzenie niezbędne do realizacji prac B+R. Forma zatrudnienia: umowa o pracę.</w:t>
       </w:r>
     </w:p>
     <w:p>
@@ -9240,7 +9462,7 @@
           <w:color w:val="666666"/>
           <w:sz w:val="17"/>
         </w:rPr>
-        <w:t xml:space="preserve"> [1066 z 1500 znaków]</w:t>
+        <w:t xml:space="preserve"> [1233 z 1500 znaków]</w:t>
       </w:r>
     </w:p>
     <w:p>
@@ -9252,7 +9474,7 @@
         <w:rPr>
           <w:b w:val="0"/>
         </w:rPr>
-        <w:t>Koszt = 15 000,00 zł brutto/mc x narzut pracodawcy 1,205 = 18 075,00 zł/mc x 1,90 etatomiesiąca (miesięcy pracy w przeliczeniu na pełny etat) = 34 342,50 zł. Nakład w zadaniu Z7 wynosi 3 mc (M19-M21) x 60% x 0,50 etatu + 6 mc (M22-M27) x 1/3 x 0,50 etatu = 1,90 etatomiesiąca. Udziały czasu pracy w projekcie są stałe w trzech okresach i wpisane w zakresie czynności pracownika: w M19-M21 40% na zadanie Z6 i 60% na zadanie Z7 (Z7 wymaga wcześniejszego projektu sprzętu i pierwszych egzemplarzy platformy na M22), w M22-M27 po jednej trzeciej na zadania Z6, Z7 i Z9 (równoległa praca nad trzema zadaniami), w M28-M30 100% na zadanie Z9. Suma udziałów w każdym miesiącu równa się 0,50 etatu, a w całym okresie M19-M30 6,00 etatomiesiąca. Stawkę brutto zweryfikowano na podstawie No Fluff Jobs „Rynek pracy IT 2025/2026”, kat. Embedded (s. 27/35: 13000-19000, Mid 12000-17000); pomocniczo Hays „Raport płacowy 2026”, R&amp;D Engineer 13/16/18 tys. (s. 38), 15000 w widełkach kat. Embedded. Wynagrodzenie niezbędne do realizacji prac B+R. Forma zatrudnienia: umowa o pracę.</w:t>
+        <w:t>Koszt = 15 000,00 zł brutto/mc x narzut pracodawcy 1,205 = 18 075,00 zł/mc x 2,10 etatomiesiąca (miesięcy pracy w przeliczeniu na pełny etat) = 37 957,50 zł. Nakład w zadaniu Z7 wynosi 3 mc (M19-M21) x 60% x 0,50 etatu + 6 mc (M22-M27) x 40% x 0,50 etatu = 2,10 etatomiesiąca. Udziały czasu pracy w projekcie są stałe w trzech okresach i wpisane w zakresie czynności pracownika: w M19-M21 40% na zadanie Z6 i 60% na zadanie Z7 (Z7 wymaga wcześniejszego projektu sprzętu i pierwszych egzemplarzy platformy na M22), w M22-M27 20% na Z6 (czujnik drzwi, synchronizacja GPS, agregacja historii sygnałów), 40% na Z7 (architektura sprzętowa, obudowa, testy środowiskowe, pomiar opóźnienia) i 40% na Z9 (odbiór zestawów po montażu, kalibracja, rejestracja niezawodności w terenie), w M28-M30 100% na zadanie Z9. Suma udziałów w każdym miesiącu równa się 0,50 etatu, a w całym okresie M19-M30 6,00 etatomiesiąca. Stawkę brutto zweryfikowano na podstawie No Fluff Jobs „Rynek pracy IT 2025/2026”, kat. Embedded (s. 27/35: 13000-19000, Mid 12000-17000); pomocniczo Hays „Raport płacowy 2026”, R&amp;D Engineer 13/16/18 tys. (s. 38), 15000 w widełkach kat. Embedded. Wynagrodzenie niezbędne do realizacji prac B+R. Forma zatrudnienia: umowa o pracę.</w:t>
       </w:r>
     </w:p>
     <w:p>
@@ -9272,7 +9494,7 @@
           <w:color w:val="666666"/>
           <w:sz w:val="17"/>
         </w:rPr>
-        <w:t xml:space="preserve"> [1014 z 1500 znaków]</w:t>
+        <w:t xml:space="preserve"> [1102 z 1500 znaków]</w:t>
       </w:r>
     </w:p>
     <w:p>
@@ -9284,7 +9506,7 @@
         <w:rPr>
           <w:b w:val="0"/>
         </w:rPr>
-        <w:t>Koszt = 10 000,00 zł brutto/mc x narzut pracodawcy 1,205 = 12 050,00 zł/mc x 1,90 etatomiesiąca (miesięcy pracy w przeliczeniu na pełny etat) = 22 895,00 zł. Nakład w zadaniu Z7 wynosi 3 mc (M19-M21) x 60% x 0,50 etatu + 6 mc (M22-M27) x 1/3 x 0,50 etatu = 1,90 etatomiesiąca. Udziały czasu pracy w projekcie są stałe w trzech okresach i wpisane w zakresie czynności pracownika: w M19-M21 40% na zadanie Z6 i 60% na zadanie Z7 (Z7 wymaga wcześniejszego projektu sprzętu i pierwszych egzemplarzy platformy na M22), w M22-M27 po jednej trzeciej na zadania Z6, Z7 i Z9 (równoległa praca nad trzema zadaniami), w M28-M30 100% na zadanie Z9. Suma udziałów w każdym miesiącu równa się 0,50 etatu, a w całym okresie M19-M30 6,00 etatomiesiąca. Stawkę brutto zweryfikowano na podstawie Hays „Raport płacowy 2026”, sekcja Logistyka i zakupy, tabela Logistyka, „Specjalista ds. Logistyki” 8000/10000/13000 (s. 40), 10000 = wartość optymalna. Wynagrodzenie niezbędne do realizacji prac B+R. Forma zatrudnienia: umowa o pracę.</w:t>
+        <w:t>Koszt = 10 000,00 zł brutto/mc x narzut pracodawcy 1,205 = 12 050,00 zł/mc x 1,80 etatomiesiąca (miesięcy pracy w przeliczeniu na pełny etat) = 21 690,00 zł. Nakład w zadaniu Z7 wynosi 3 mc (M19-M21) x 60% x 0,50 etatu + 6 mc (M22-M27) x 30% x 0,50 etatu = 1,80 etatomiesiąca. Udziały czasu pracy w projekcie są stałe w trzech okresach i wpisane w zakresie czynności pracownika: w M19-M21 40% na zadanie Z6 i 60% na zadanie Z7 (Z7 wymaga wcześniejszego projektu sprzętu i pierwszych egzemplarzy platformy na M22), w M22-M27 20% na Z6 (interpretacja pól eFTI, ocena treści PoL i PoC), 30% na Z7 (scenariusze i progi alertów, użyteczność w kabinie) i 50% na Z9 (inspekcje ground truth od Fazy A), w M28-M30 100% na zadanie Z9. Suma udziałów w każdym miesiącu równa się 0,50 etatu, a w całym okresie M19-M30 6,00 etatomiesiąca. Stawkę brutto zweryfikowano na podstawie Hays „Raport płacowy 2026”, sekcja Logistyka i zakupy, tabela Logistyka, „Specjalista ds. Logistyki” 8000/10000/13000 (s. 40), 10000 = wartość optymalna. Wynagrodzenie niezbędne do realizacji prac B+R. Forma zatrudnienia: umowa o pracę.</w:t>
       </w:r>
     </w:p>
     <w:p>
@@ -9312,7 +9534,7 @@
           <w:color w:val="666666"/>
           <w:sz w:val="17"/>
         </w:rPr>
-        <w:t xml:space="preserve"> [1022 z 1500 znaków]</w:t>
+        <w:t xml:space="preserve"> [1132 z 1500 znaków]</w:t>
       </w:r>
     </w:p>
     <w:p>
@@ -9324,7 +9546,7 @@
         <w:rPr>
           <w:b w:val="0"/>
         </w:rPr>
-        <w:t>Koszt = 23 000,00 zł brutto/mc x narzut pracodawcy 1,205 = 27 715,00 zł/mc x 3,75 etatomiesiąca (miesięcy pracy w przeliczeniu na pełny etat) = 103 931,25 zł. Nakład w zadaniu Z9 wynosi 6 mc (M22-M27) x 1/3 x 0,75 etatu + 3 mc (M28-M30) x 100% x 0,75 etatu = 3,75 etatomiesiąca. Udziały czasu pracy w projekcie są stałe w trzech okresach i wpisane w zakresie czynności pracownika: w M19-M21 40% na zadanie Z6 i 60% na zadanie Z7 (Z7 wymaga wcześniejszego projektu sprzętu i pierwszych egzemplarzy platformy na M22), w M22-M27 po jednej trzeciej na zadania Z6, Z7 i Z9 (równoległa praca nad trzema zadaniami), w M28-M30 100% na zadanie Z9. Suma udziałów w każdym miesiącu równa się 0,75 etatu, a w całym okresie M19-M30 9,00 etatomiesiąca. Stawkę brutto zweryfikowano na podstawie No Fluff Jobs „Rynek pracy IT 2025/2026”, kat. AI poziom Senior, UoP 20000-29000 (s. 33; tabela zbiorcza 19000-24000, s. 27), 23000 w środku pasma senior/lead. Wynagrodzenie niezbędne do realizacji prac B+R. Forma zatrudnienia: umowa o pracę.</w:t>
+        <w:t>Koszt = 23 000,00 zł brutto/mc x narzut pracodawcy 1,205 = 27 715,00 zł/mc x 3,75 etatomiesiąca (miesięcy pracy w przeliczeniu na pełny etat) = 103 931,25 zł. Nakład w zadaniu Z9 wynosi 6 mc (M22-M27) x 1/3 x 0,75 etatu + 3 mc (M28-M30) x 100% x 0,75 etatu = 3,75 etatomiesiąca. Udziały czasu pracy w projekcie są stałe w trzech okresach i wpisane w zakresie czynności pracownika: w M19-M21 40% na zadanie Z6 i 60% na zadanie Z7 (Z7 wymaga wcześniejszego projektu sprzętu i pierwszych egzemplarzy platformy na M22), w M22-M27 po jednej trzeciej, bo równolegle trwają architektura i optymalizacja pipeline'u (Z6), strategia kompresji i walidacja modeli (Z7) oraz protokół KPI i dane terenowe (Z9) o zbliżonym nakładzie, w M28-M30 100% na zadanie Z9. Suma udziałów w każdym miesiącu równa się 0,75 etatu, a w całym okresie M19-M30 9,00 etatomiesiąca. Stawkę brutto zweryfikowano na podstawie No Fluff Jobs „Rynek pracy IT 2025/2026”, kat. AI poziom Senior, UoP 20000-29000 (s. 33; tabela zbiorcza 19000-24000, s. 27), 23000 w środku pasma senior/lead. Wynagrodzenie niezbędne do realizacji prac B+R. Forma zatrudnienia: umowa o pracę.</w:t>
       </w:r>
     </w:p>
     <w:p>
@@ -9344,7 +9566,7 @@
           <w:color w:val="666666"/>
           <w:sz w:val="17"/>
         </w:rPr>
-        <w:t xml:space="preserve"> [1034 z 1500 znaków]</w:t>
+        <w:t xml:space="preserve"> [1169 z 1500 znaków]</w:t>
       </w:r>
     </w:p>
     <w:p>
@@ -9356,7 +9578,7 @@
         <w:rPr>
           <w:b w:val="0"/>
         </w:rPr>
-        <w:t>Koszt = 16 500,00 zł brutto/mc x narzut pracodawcy 1,205 = 19 882,50 zł/mc x 3,75 etatomiesiąca (miesięcy pracy w przeliczeniu na pełny etat) = 74 559,38 zł. Nakład w zadaniu Z9 wynosi 6 mc (M22-M27) x 1/3 x 0,75 etatu + 3 mc (M28-M30) x 100% x 0,75 etatu = 3,75 etatomiesiąca. Udziały czasu pracy w projekcie są stałe w trzech okresach i wpisane w zakresie czynności pracownika: w M19-M21 40% na zadanie Z6 i 60% na zadanie Z7 (Z7 wymaga wcześniejszego projektu sprzętu i pierwszych egzemplarzy platformy na M22), w M22-M27 po jednej trzeciej na zadania Z6, Z7 i Z9 (równoległa praca nad trzema zadaniami), w M28-M30 100% na zadanie Z9. Suma udziałów w każdym miesiącu równa się 0,75 etatu, a w całym okresie M19-M30 9,00 etatomiesiąca. Stawkę brutto zweryfikowano na podstawie No Fluff Jobs „Rynek pracy IT 2025/2026”, kat. AI (s. 33): Senior 20000-29000, Mid 14000-21000, 16500 w paśmie Mid, poniżej dolnej mediany Senior (założenie konserwatywne). Wynagrodzenie niezbędne do realizacji prac B+R. Forma zatrudnienia: umowa o pracę.</w:t>
+        <w:t>Koszt = 16 500,00 zł brutto/mc x narzut pracodawcy 1,205 = 19 882,50 zł/mc x 3,75 etatomiesiąca (miesięcy pracy w przeliczeniu na pełny etat) = 74 559,38 zł. Nakład w zadaniu Z9 wynosi 6 mc (M22-M27) x 1/3 x 0,75 etatu + 3 mc (M28-M30) x 100% x 0,75 etatu = 3,75 etatomiesiąca. Udziały czasu pracy w projekcie są stałe w trzech okresach i wpisane w zakresie czynności pracownika: w M19-M21 40% na zadanie Z6 i 60% na zadanie Z7 (Z7 wymaga wcześniejszego projektu sprzętu i pierwszych egzemplarzy platformy na M22), w M22-M27 po jednej trzeciej, bo równolegle trwają integracja change detection i raport ML (Z6), implementacja kompresji i optymalizacja na platformie (Z7) oraz diagnoza przesunięcia domeny i korekty (Z9) o zbliżonym nakładzie, w M28-M30 100% na zadanie Z9. Suma udziałów w każdym miesiącu równa się 0,75 etatu, a w całym okresie M19-M30 9,00 etatomiesiąca. Stawkę brutto zweryfikowano na podstawie No Fluff Jobs „Rynek pracy IT 2025/2026”, kat. AI (s. 33): Senior 20000-29000, Mid 14000-21000, 16500 w paśmie Mid, poniżej dolnej mediany Senior (założenie konserwatywne). Wynagrodzenie niezbędne do realizacji prac B+R. Forma zatrudnienia: umowa o pracę.</w:t>
       </w:r>
     </w:p>
     <w:p>
@@ -9376,7 +9598,7 @@
           <w:color w:val="666666"/>
           <w:sz w:val="17"/>
         </w:rPr>
-        <w:t xml:space="preserve"> [1019 z 1500 znaków]</w:t>
+        <w:t xml:space="preserve"> [1154 z 1500 znaków]</w:t>
       </w:r>
     </w:p>
     <w:p>
@@ -9388,7 +9610,7 @@
         <w:rPr>
           <w:b w:val="0"/>
         </w:rPr>
-        <w:t>Koszt = 21 000,00 zł brutto/mc x narzut pracodawcy 1,205 = 25 305,00 zł/mc x 1,25 etatomiesiąca (miesięcy pracy w przeliczeniu na pełny etat) = 31 631,25 zł. Nakład w zadaniu Z9 wynosi 6 mc (M22-M27) x 1/3 x 0,25 etatu + 3 mc (M28-M30) x 100% x 0,25 etatu = 1,25 etatomiesiąca. Udziały czasu pracy w projekcie są stałe w trzech okresach i wpisane w zakresie czynności pracownika: w M19-M21 40% na zadanie Z6 i 60% na zadanie Z7 (Z7 wymaga wcześniejszego projektu sprzętu i pierwszych egzemplarzy platformy na M22), w M22-M27 po jednej trzeciej na zadania Z6, Z7 i Z9 (równoległa praca nad trzema zadaniami), w M28-M30 100% na zadanie Z9. Suma udziałów w każdym miesiącu równa się 0,25 etatu, a w całym okresie M19-M30 3,00 etatomiesiąca. Stawkę brutto zweryfikowano na podstawie No Fluff Jobs „Rynek pracy IT 2025/2026”, kat. Security poziom Senior, UoP 20000-28000 (s. 32; tabela zbiorcza 17000-23000, s. 27), 21000 w widełkach senior. Wynagrodzenie niezbędne do realizacji prac B+R. Forma zatrudnienia: umowa o pracę.</w:t>
+        <w:t>Koszt = 21 000,00 zł brutto/mc x narzut pracodawcy 1,205 = 25 305,00 zł/mc x 1,35 etatomiesiąca (miesięcy pracy w przeliczeniu na pełny etat) = 34 161,75 zł. Nakład w zadaniu Z9 wynosi 6 mc (M22-M27) x 40% x 0,25 etatu + 3 mc (M28-M30) x 100% x 0,25 etatu = 1,35 etatomiesiąca. Udziały czasu pracy w projekcie są stałe w trzech okresach i wpisane w zakresie czynności pracownika: w M19-M21 40% na zadanie Z6 i 60% na zadanie Z7 (Z7 wymaga wcześniejszego projektu sprzętu i pierwszych egzemplarzy platformy na M22), w M22-M27 20% na Z6 (podpis kryptograficzny i łańcuch integralności), 40% na Z7 (bezpieczny rozruch, podpisywanie aktualizacji, szyfrowanie transmisji) i 40% na Z9 (testy bezpieczeństwa w terenie, rola niezależnego ewaluatora), w M28-M30 100% na zadanie Z9. Suma udziałów w każdym miesiącu równa się 0,25 etatu, a w całym okresie M19-M30 3,00 etatomiesiąca. Stawkę brutto zweryfikowano na podstawie No Fluff Jobs „Rynek pracy IT 2025/2026”, kat. Security poziom Senior, UoP 20000-28000 (s. 32; tabela zbiorcza 17000-23000, s. 27), 21000 w widełkach senior. Wynagrodzenie niezbędne do realizacji prac B+R. Forma zatrudnienia: umowa o pracę.</w:t>
       </w:r>
     </w:p>
     <w:p>
@@ -9408,7 +9630,7 @@
           <w:color w:val="666666"/>
           <w:sz w:val="17"/>
         </w:rPr>
-        <w:t xml:space="preserve"> [1004 z 1500 znaków]</w:t>
+        <w:t xml:space="preserve"> [1101 z 1500 znaków]</w:t>
       </w:r>
     </w:p>
     <w:p>
@@ -9420,7 +9642,7 @@
         <w:rPr>
           <w:b w:val="0"/>
         </w:rPr>
-        <w:t>Koszt = 19 000,00 zł brutto/mc x narzut pracodawcy 1,205 = 22 895,00 zł/mc x 5,00 etatomiesiąca (miesięcy pracy w przeliczeniu na pełny etat) = 114 475,00 zł. Nakład w zadaniu Z9 wynosi 6 mc (M22-M27) x 1/3 x 1,00 etatu + 3 mc (M28-M30) x 100% x 1,00 etatu = 5,00 etatomiesiąca. Udziały czasu pracy w projekcie są stałe w trzech okresach i wpisane w zakresie czynności pracownika: w M19-M21 40% na zadanie Z6 i 60% na zadanie Z7 (Z7 wymaga wcześniejszego projektu sprzętu i pierwszych egzemplarzy platformy na M22), w M22-M27 po jednej trzeciej na zadania Z6, Z7 i Z9 (równoległa praca nad trzema zadaniami), w M28-M30 100% na zadanie Z9. Suma udziałów w każdym miesiącu równa się 1,00 etatu, a w całym okresie M19-M30 12,00 etatomiesiąca. Stawkę brutto zweryfikowano na podstawie No Fluff Jobs „Rynek pracy IT 2025/2026”, kat. Backend/Fullstack poziom Senior, UoP 18500-25000 (s. 30), 19000 w dolnej części pasma senior. Wynagrodzenie niezbędne do realizacji prac B+R. Forma zatrudnienia: umowa o pracę.</w:t>
+        <w:t>Koszt = 19 000,00 zł brutto/mc x narzut pracodawcy 1,205 = 22 895,00 zł/mc x 5,00 etatomiesiąca (miesięcy pracy w przeliczeniu na pełny etat) = 114 475,00 zł. Nakład w zadaniu Z9 wynosi 6 mc (M22-M27) x 1/3 x 1,00 etatu + 3 mc (M28-M30) x 100% x 1,00 etatu = 5,00 etatomiesiąca. Udziały czasu pracy w projekcie są stałe w trzech okresach i wpisane w zakresie czynności pracownika: w M19-M21 40% na zadanie Z6 i 60% na zadanie Z7 (Z7 wymaga wcześniejszego projektu sprzętu i pierwszych egzemplarzy platformy na M22), w M22-M27 po jednej trzeciej, bo równolegle trwają pipeline, generator eFTI i integracje testowe (Z6), oprogramowanie embedded (Z7) oraz logi i pomiary w Fazie A (Z9) o zbliżonym nakładzie, w M28-M30 100% na zadanie Z9. Suma udziałów w każdym miesiącu równa się 1,00 etatu, a w całym okresie M19-M30 12,00 etatomiesiąca. Stawkę brutto zweryfikowano na podstawie No Fluff Jobs „Rynek pracy IT 2025/2026”, kat. Backend/Fullstack poziom Senior, UoP 18500-25000 (s. 30), 19000 w dolnej części pasma senior. Wynagrodzenie niezbędne do realizacji prac B+R. Forma zatrudnienia: umowa o pracę.</w:t>
       </w:r>
     </w:p>
     <w:p>
@@ -9440,7 +9662,7 @@
           <w:color w:val="666666"/>
           <w:sz w:val="17"/>
         </w:rPr>
-        <w:t xml:space="preserve"> [1067 z 1500 znaków]</w:t>
+        <w:t xml:space="preserve"> [1234 z 1500 znaków]</w:t>
       </w:r>
     </w:p>
     <w:p>
@@ -9452,7 +9674,7 @@
         <w:rPr>
           <w:b w:val="0"/>
         </w:rPr>
-        <w:t>Koszt = 15 000,00 zł brutto/mc x narzut pracodawcy 1,205 = 18 075,00 zł/mc x 2,50 etatomiesiąca (miesięcy pracy w przeliczeniu na pełny etat) = 45 187,50 zł. Nakład w zadaniu Z9 wynosi 6 mc (M22-M27) x 1/3 x 0,50 etatu + 3 mc (M28-M30) x 100% x 0,50 etatu = 2,50 etatomiesiąca. Udziały czasu pracy w projekcie są stałe w trzech okresach i wpisane w zakresie czynności pracownika: w M19-M21 40% na zadanie Z6 i 60% na zadanie Z7 (Z7 wymaga wcześniejszego projektu sprzętu i pierwszych egzemplarzy platformy na M22), w M22-M27 po jednej trzeciej na zadania Z6, Z7 i Z9 (równoległa praca nad trzema zadaniami), w M28-M30 100% na zadanie Z9. Suma udziałów w każdym miesiącu równa się 0,50 etatu, a w całym okresie M19-M30 6,00 etatomiesiąca. Stawkę brutto zweryfikowano na podstawie No Fluff Jobs „Rynek pracy IT 2025/2026”, kat. Embedded (s. 27/35: 13000-19000, Mid 12000-17000); pomocniczo Hays „Raport płacowy 2026”, R&amp;D Engineer 13/16/18 tys. (s. 38), 15000 w widełkach kat. Embedded. Wynagrodzenie niezbędne do realizacji prac B+R. Forma zatrudnienia: umowa o pracę.</w:t>
+        <w:t>Koszt = 15 000,00 zł brutto/mc x narzut pracodawcy 1,205 = 18 075,00 zł/mc x 2,70 etatomiesiąca (miesięcy pracy w przeliczeniu na pełny etat) = 48 802,50 zł. Nakład w zadaniu Z9 wynosi 6 mc (M22-M27) x 40% x 0,50 etatu + 3 mc (M28-M30) x 100% x 0,50 etatu = 2,70 etatomiesiąca. Udziały czasu pracy w projekcie są stałe w trzech okresach i wpisane w zakresie czynności pracownika: w M19-M21 40% na zadanie Z6 i 60% na zadanie Z7 (Z7 wymaga wcześniejszego projektu sprzętu i pierwszych egzemplarzy platformy na M22), w M22-M27 20% na Z6 (czujnik drzwi, synchronizacja GPS, agregacja historii sygnałów), 40% na Z7 (architektura sprzętowa, obudowa, testy środowiskowe, pomiar opóźnienia) i 40% na Z9 (odbiór zestawów po montażu, kalibracja, rejestracja niezawodności w terenie), w M28-M30 100% na zadanie Z9. Suma udziałów w każdym miesiącu równa się 0,50 etatu, a w całym okresie M19-M30 6,00 etatomiesiąca. Stawkę brutto zweryfikowano na podstawie No Fluff Jobs „Rynek pracy IT 2025/2026”, kat. Embedded (s. 27/35: 13000-19000, Mid 12000-17000); pomocniczo Hays „Raport płacowy 2026”, R&amp;D Engineer 13/16/18 tys. (s. 38), 15000 w widełkach kat. Embedded. Wynagrodzenie niezbędne do realizacji prac B+R. Forma zatrudnienia: umowa o pracę.</w:t>
       </w:r>
     </w:p>
     <w:p>
@@ -9472,7 +9694,7 @@
           <w:color w:val="666666"/>
           <w:sz w:val="17"/>
         </w:rPr>
-        <w:t xml:space="preserve"> [1015 z 1500 znaków]</w:t>
+        <w:t xml:space="preserve"> [1103 z 1500 znaków]</w:t>
       </w:r>
     </w:p>
     <w:p>
@@ -9484,7 +9706,7 @@
         <w:rPr>
           <w:b w:val="0"/>
         </w:rPr>
-        <w:t>Koszt = 10 000,00 zł brutto/mc x narzut pracodawcy 1,205 = 12 050,00 zł/mc x 2,50 etatomiesiąca (miesięcy pracy w przeliczeniu na pełny etat) = 30 125,00 zł. Nakład w zadaniu Z9 wynosi 6 mc (M22-M27) x 1/3 x 0,50 etatu + 3 mc (M28-M30) x 100% x 0,50 etatu = 2,50 etatomiesiąca. Udziały czasu pracy w projekcie są stałe w trzech okresach i wpisane w zakresie czynności pracownika: w M19-M21 40% na zadanie Z6 i 60% na zadanie Z7 (Z7 wymaga wcześniejszego projektu sprzętu i pierwszych egzemplarzy platformy na M22), w M22-M27 po jednej trzeciej na zadania Z6, Z7 i Z9 (równoległa praca nad trzema zadaniami), w M28-M30 100% na zadanie Z9. Suma udziałów w każdym miesiącu równa się 0,50 etatu, a w całym okresie M19-M30 6,00 etatomiesiąca. Stawkę brutto zweryfikowano na podstawie Hays „Raport płacowy 2026”, sekcja Logistyka i zakupy, tabela Logistyka, „Specjalista ds. Logistyki” 8000/10000/13000 (s. 40), 10000 = wartość optymalna. Wynagrodzenie niezbędne do realizacji prac B+R. Forma zatrudnienia: umowa o pracę.</w:t>
+        <w:t>Koszt = 10 000,00 zł brutto/mc x narzut pracodawcy 1,205 = 12 050,00 zł/mc x 3,00 etatomiesiąca (miesięcy pracy w przeliczeniu na pełny etat) = 36 150,00 zł. Nakład w zadaniu Z9 wynosi 6 mc (M22-M27) x 50% x 0,50 etatu + 3 mc (M28-M30) x 100% x 0,50 etatu = 3,00 etatomiesiąca. Udziały czasu pracy w projekcie są stałe w trzech okresach i wpisane w zakresie czynności pracownika: w M19-M21 40% na zadanie Z6 i 60% na zadanie Z7 (Z7 wymaga wcześniejszego projektu sprzętu i pierwszych egzemplarzy platformy na M22), w M22-M27 20% na Z6 (interpretacja pól eFTI, ocena treści PoL i PoC), 30% na Z7 (scenariusze i progi alertów, użyteczność w kabinie) i 50% na Z9 (inspekcje ground truth od Fazy A), w M28-M30 100% na zadanie Z9. Suma udziałów w każdym miesiącu równa się 0,50 etatu, a w całym okresie M19-M30 6,00 etatomiesiąca. Stawkę brutto zweryfikowano na podstawie Hays „Raport płacowy 2026”, sekcja Logistyka i zakupy, tabela Logistyka, „Specjalista ds. Logistyki” 8000/10000/13000 (s. 40), 10000 = wartość optymalna. Wynagrodzenie niezbędne do realizacji prac B+R. Forma zatrudnienia: umowa o pracę.</w:t>
       </w:r>
     </w:p>
     <w:p>
@@ -11565,7 +11787,7 @@
                 <w:b w:val="0"/>
                 <w:sz w:val="16"/>
               </w:rPr>
-              <w:t>0,80</w:t>
+              <w:t>0,60</w:t>
             </w:r>
           </w:p>
         </w:tc>
@@ -11583,7 +11805,7 @@
                 <w:b w:val="0"/>
                 <w:sz w:val="16"/>
               </w:rPr>
-              <w:t>0,95</w:t>
+              <w:t>1,05</w:t>
             </w:r>
           </w:p>
         </w:tc>
@@ -11601,7 +11823,7 @@
                 <w:b w:val="0"/>
                 <w:sz w:val="16"/>
               </w:rPr>
-              <w:t>1,25</w:t>
+              <w:t>1,35</w:t>
             </w:r>
           </w:p>
         </w:tc>
@@ -11785,7 +12007,7 @@
                 <w:b w:val="0"/>
                 <w:sz w:val="16"/>
               </w:rPr>
-              <w:t>1,60</w:t>
+              <w:t>1,20</w:t>
             </w:r>
           </w:p>
         </w:tc>
@@ -11803,7 +12025,7 @@
                 <w:b w:val="0"/>
                 <w:sz w:val="16"/>
               </w:rPr>
-              <w:t>1,90</w:t>
+              <w:t>2,10</w:t>
             </w:r>
           </w:p>
         </w:tc>
@@ -11821,7 +12043,7 @@
                 <w:b w:val="0"/>
                 <w:sz w:val="16"/>
               </w:rPr>
-              <w:t>2,50</w:t>
+              <w:t>2,70</w:t>
             </w:r>
           </w:p>
         </w:tc>
@@ -11895,7 +12117,7 @@
                 <w:b w:val="0"/>
                 <w:sz w:val="16"/>
               </w:rPr>
-              <w:t>1,60</w:t>
+              <w:t>1,20</w:t>
             </w:r>
           </w:p>
         </w:tc>
@@ -11913,7 +12135,7 @@
                 <w:b w:val="0"/>
                 <w:sz w:val="16"/>
               </w:rPr>
-              <w:t>1,90</w:t>
+              <w:t>1,80</w:t>
             </w:r>
           </w:p>
         </w:tc>
@@ -11931,7 +12153,7 @@
                 <w:b w:val="0"/>
                 <w:sz w:val="16"/>
               </w:rPr>
-              <w:t>2,50</w:t>
+              <w:t>3,00</w:t>
             </w:r>
           </w:p>
         </w:tc>
@@ -20521,6 +20743,116 @@
                 <w:sz w:val="15"/>
               </w:rPr>
               <w:t>K3-44; opis Z9, opis Z7</w:t>
+            </w:r>
+          </w:p>
+        </w:tc>
+        <w:tc>
+          <w:tcPr>
+            <w:tcW w:type="dxa" w:w="737"/>
+          </w:tcPr>
+          <w:p>
+            <w:pPr>
+              <w:spacing w:after="20"/>
+            </w:pPr>
+            <w:r/>
+            <w:r>
+              <w:rPr>
+                <w:b w:val="0"/>
+                <w:sz w:val="15"/>
+              </w:rPr>
+              <w:t>WYSOKI</w:t>
+            </w:r>
+          </w:p>
+        </w:tc>
+      </w:tr>
+      <w:tr>
+        <w:tc>
+          <w:tcPr>
+            <w:tcW w:type="dxa" w:w="567"/>
+          </w:tcPr>
+          <w:p>
+            <w:pPr>
+              <w:spacing w:after="20"/>
+            </w:pPr>
+            <w:r/>
+            <w:r>
+              <w:rPr>
+                <w:b w:val="0"/>
+                <w:sz w:val="15"/>
+              </w:rPr>
+              <w:t>N30</w:t>
+            </w:r>
+          </w:p>
+        </w:tc>
+        <w:tc>
+          <w:tcPr>
+            <w:tcW w:type="dxa" w:w="1871"/>
+          </w:tcPr>
+          <w:p>
+            <w:pPr>
+              <w:spacing w:after="20"/>
+            </w:pPr>
+            <w:r/>
+            <w:r>
+              <w:rPr>
+                <w:b w:val="0"/>
+                <w:sz w:val="15"/>
+              </w:rPr>
+              <w:t>3.1.2 Metoda szacowania personelu Everest11: stawki referencyjne z raportów płacowych (uwagi 34 i 35)</w:t>
+            </w:r>
+          </w:p>
+        </w:tc>
+        <w:tc>
+          <w:tcPr>
+            <w:tcW w:type="dxa" w:w="2041"/>
+          </w:tcPr>
+          <w:p>
+            <w:pPr>
+              <w:spacing w:after="20"/>
+            </w:pPr>
+            <w:r/>
+            <w:r>
+              <w:rPr>
+                <w:b w:val="0"/>
+                <w:sz w:val="15"/>
+              </w:rPr>
+              <w:t>Raport No Fluff Jobs „Rynek pracy IT 2025/2026” i Hays „Raport płacowy 2026”: stanowiska w budżecie nie odpowiadają wprost nazwom w raportach (Backend/Full-Stack Developer, IT Specialist, AI Lead, Anotatorzy), AI Senior Engineer ma stawkę z pasma Mid, a część pozycji cytuje dwie strony i dwa zakresy (IoT: s. 27/35; AI Lead: s. 33 i s. 27).</w:t>
+            </w:r>
+          </w:p>
+        </w:tc>
+        <w:tc>
+          <w:tcPr>
+            <w:tcW w:type="dxa" w:w="3175"/>
+          </w:tcPr>
+          <w:p>
+            <w:pPr>
+              <w:spacing w:after="20"/>
+            </w:pPr>
+            <w:r/>
+            <w:r>
+              <w:rPr>
+                <w:b w:val="0"/>
+                <w:sz w:val="15"/>
+              </w:rPr>
+              <w:t>Dla każdej pozycji jedno odniesienie w formacie z uwagi 35: UoP albo B2B albo godzinowa, nazwa stanowiska referencyjnego dokładnie jak w raporcie, poziom, strona, widełki, położenie stawki, przeliczenie na koszt pracodawcy. Backend: kategorie „Backend” i „Fullstack” są w raporcie osobno (s. 30), a stawka 18 000 zł to górna granica pasma Mid (Mid 13 000-18 000, Senior 18 500-25 000), więc opis „na granicy Mid/Senior” zastąpić jednoznacznym poziomem. Anotatorzy: brak takiego stanowiska w raporcie (zastępnik: QA Junior, s. 31) i forma zlecenia, więc podać stawkę godzinową brutto-brutto i liczbę godzin. Dla osób obecnie zatrudnionych (uwaga 34) dopisać relację do obecnego wynagrodzenia. Liczby z raportów do sprawdzenia na oryginałach (nie ma ich w tej sesji).</w:t>
+            </w:r>
+          </w:p>
+        </w:tc>
+        <w:tc>
+          <w:tcPr>
+            <w:tcW w:type="dxa" w:w="1247"/>
+          </w:tcPr>
+          <w:p>
+            <w:pPr>
+              <w:spacing w:after="20"/>
+            </w:pPr>
+            <w:r/>
+            <w:r>
+              <w:rPr>
+                <w:b w:val="0"/>
+                <w:sz w:val="15"/>
+              </w:rPr>
+              <w:t>K3-34, K3-35</w:t>
             </w:r>
           </w:p>
         </w:tc>

</xml_diff>

<commit_message>
Metoda szacowania Backend i IT Specialist wg s. 30 raportu NFJ (zweryfikowane)
Co-Authored-By: Claude Sonnet 5.5 <noreply@anthropic.com>
Claude-Session: https://claude.ai/code/session_01672WnJhixnEcarbb7uiwfx
</commit_message>
<xml_diff>
--- a/Opisy_zadan_z_kamieniami_milowymi.docx
+++ b/Opisy_zadan_z_kamieniami_milowymi.docx
@@ -9198,7 +9198,7 @@
           <w:color w:val="666666"/>
           <w:sz w:val="17"/>
         </w:rPr>
-        <w:t xml:space="preserve"> [1099 z 1500 znaków]</w:t>
+        <w:t xml:space="preserve"> [1398 z 1500 znaków]</w:t>
       </w:r>
     </w:p>
     <w:p>
@@ -9210,7 +9210,7 @@
         <w:rPr>
           <w:b w:val="0"/>
         </w:rPr>
-        <w:t>Koszt = 19 000,00 zł brutto/mc x narzut pracodawcy 1,205 = 22 895,00 zł/mc x 3,20 etatomiesiąca (miesięcy pracy w przeliczeniu na pełny etat) = 73 264,00 zł. Nakład w zadaniu Z6 wynosi 3 mc (M19-M21) x 40% x 1,00 etatu + 6 mc (M22-M27) x 1/3 x 1,00 etatu = 3,20 etatomiesiąca. Udziały czasu pracy w projekcie są stałe w trzech okresach i wpisane w zakresie czynności pracownika: w M19-M21 40% na zadanie Z6 i 60% na zadanie Z7 (Z7 wymaga wcześniejszego projektu sprzętu i pierwszych egzemplarzy platformy na M22), w M22-M27 po jednej trzeciej, bo równolegle trwają pipeline, generator eFTI i integracje testowe (Z6), oprogramowanie embedded (Z7) oraz logi i pomiary w Fazie A (Z9) o zbliżonym nakładzie, w M28-M30 100% na zadanie Z9. Suma udziałów w każdym miesiącu równa się 1,00 etatu, a w całym okresie M19-M30 12,00 etatomiesiąca. Stawkę brutto zweryfikowano na podstawie No Fluff Jobs „Rynek pracy IT 2025/2026”, kat. Backend/Fullstack poziom Senior, UoP 18500-25000 (s. 30), 19000 w dolnej części pasma senior. Wynagrodzenie niezbędne do realizacji prac B+R. Forma zatrudnienia: umowa o pracę.</w:t>
+        <w:t>Koszt = 19 000,00 zł brutto/mc x narzut pracodawcy 1,205 = 22 895,00 zł/mc x 3,20 etatomiesiąca (miesięcy pracy w przeliczeniu na pełny etat) = 73 264,00 zł. Nakład w zadaniu Z6 wynosi 3 mc (M19-M21) x 40% x 1,00 etatu + 6 mc (M22-M27) x 1/3 x 1,00 etatu = 3,20 etatomiesiąca. Udziały czasu pracy w projekcie są stałe w trzech okresach i wpisane w zakresie czynności pracownika: w M19-M21 40% na zadanie Z6 i 60% na zadanie Z7 (Z7 wymaga wcześniejszego projektu sprzętu i pierwszych egzemplarzy platformy na M22), w M22-M27 po jednej trzeciej, bo równolegle trwają pipeline, generator eFTI i integracje testowe (Z6), oprogramowanie embedded (Z7) oraz logi i pomiary w Fazie A (Z9) o zbliżonym nakładzie, w M28-M30 100% na zadanie Z9. Suma udziałów w każdym miesiącu równa się 1,00 etatu, a w całym okresie M19-M30 12,00 etatomiesiąca. Dane referencyjne dotyczą umowy o pracę, kwot brutto miesięcznie. Źródło: No Fluff Jobs, „Rynek pracy IT 2025/2026”, s. 30, tabela „Wytwarzanie i rozwój oprogramowania”, kategoria Backend, poziom Senior: 18 500-25 000 zł (mediany dolnych i górnych widełek z ogłoszeń o pracy). Kategorię Backend przyjęto jako najbliższy odpowiednik zakresu stanowiska (oprogramowanie systemowe i potoki danych). Przyjęto 19 000 zł, czyli dolną część widełek Senior (500 zł powyżej dolnej granicy). Wynagrodzenie niezbędne do realizacji prac B+R. Forma zatrudnienia: umowa o pracę.</w:t>
       </w:r>
     </w:p>
     <w:p>
@@ -9294,7 +9294,7 @@
           <w:color w:val="666666"/>
           <w:sz w:val="17"/>
         </w:rPr>
-        <w:t xml:space="preserve"> [557 z 1500 znaków]</w:t>
+        <w:t xml:space="preserve"> [852 z 1500 znaków]</w:t>
       </w:r>
     </w:p>
     <w:p>
@@ -9306,7 +9306,7 @@
         <w:rPr>
           <w:b w:val="0"/>
         </w:rPr>
-        <w:t>Koszt = 18 000,00 zł brutto/mc x narzut pracodawcy 1,205 = 21 690,00 zł/mc x 1,0 etatu x 9 mc (M19-M27, zadanie Z6) = 195 210,00 zł. Liczba miesięcy wynika z zakresu prac w zadaniu: w Z6 integracje testowe, potok danych i test zgodności eFTI w czasie trwania zadania. Stawkę brutto zweryfikowano na podstawie No Fluff Jobs „Rynek pracy IT 2025/2026”, kat. Backend/Fullstack (s. 30): Mid maks. 18000, Senior 18500-25000, 18000 na granicy Mid/Senior (założenie konserwatywne). Wynagrodzenie niezbędne do realizacji prac B+R. Forma zatrudnienia: umowa o pracę.</w:t>
+        <w:t>Koszt = 18 000,00 zł brutto/mc x narzut pracodawcy 1,205 = 21 690,00 zł/mc x 1,0 etatu x 9 mc (M19-M27, zadanie Z6) = 195 210,00 zł. Liczba miesięcy wynika z zakresu prac w zadaniu: w Z6 integracje testowe, potok danych i test zgodności eFTI w czasie trwania zadania. Dane referencyjne dotyczą umowy o pracę, kwot brutto miesięcznie. Źródło: No Fluff Jobs, „Rynek pracy IT 2025/2026”, s. 30, tabela „Wytwarzanie i rozwój oprogramowania”, kategorie Backend i Fullstack (widełki identyczne w obu kategoriach): poziom Mid 13 000-18 000 zł, poziom Senior 18 500-25 000 zł (mediany dolnych i górnych widełek z ogłoszeń o pracy). Stanowisko obsadzane jest na poziomie Mid, dlatego przyjęto 18 000 zł, czyli górną granicę widełek Mid, o 500 zł niższą niż dolna granica Senior. Wynagrodzenie niezbędne do realizacji prac B+R. Forma zatrudnienia: umowa o pracę.</w:t>
       </w:r>
     </w:p>
     <w:p>
@@ -9430,7 +9430,7 @@
           <w:color w:val="666666"/>
           <w:sz w:val="17"/>
         </w:rPr>
-        <w:t xml:space="preserve"> [1099 z 1500 znaków]</w:t>
+        <w:t xml:space="preserve"> [1398 z 1500 znaków]</w:t>
       </w:r>
     </w:p>
     <w:p>
@@ -9442,7 +9442,7 @@
         <w:rPr>
           <w:b w:val="0"/>
         </w:rPr>
-        <w:t>Koszt = 19 000,00 zł brutto/mc x narzut pracodawcy 1,205 = 22 895,00 zł/mc x 3,80 etatomiesiąca (miesięcy pracy w przeliczeniu na pełny etat) = 87 001,00 zł. Nakład w zadaniu Z7 wynosi 3 mc (M19-M21) x 60% x 1,00 etatu + 6 mc (M22-M27) x 1/3 x 1,00 etatu = 3,80 etatomiesiąca. Udziały czasu pracy w projekcie są stałe w trzech okresach i wpisane w zakresie czynności pracownika: w M19-M21 40% na zadanie Z6 i 60% na zadanie Z7 (Z7 wymaga wcześniejszego projektu sprzętu i pierwszych egzemplarzy platformy na M22), w M22-M27 po jednej trzeciej, bo równolegle trwają pipeline, generator eFTI i integracje testowe (Z6), oprogramowanie embedded (Z7) oraz logi i pomiary w Fazie A (Z9) o zbliżonym nakładzie, w M28-M30 100% na zadanie Z9. Suma udziałów w każdym miesiącu równa się 1,00 etatu, a w całym okresie M19-M30 12,00 etatomiesiąca. Stawkę brutto zweryfikowano na podstawie No Fluff Jobs „Rynek pracy IT 2025/2026”, kat. Backend/Fullstack poziom Senior, UoP 18500-25000 (s. 30), 19000 w dolnej części pasma senior. Wynagrodzenie niezbędne do realizacji prac B+R. Forma zatrudnienia: umowa o pracę.</w:t>
+        <w:t>Koszt = 19 000,00 zł brutto/mc x narzut pracodawcy 1,205 = 22 895,00 zł/mc x 3,80 etatomiesiąca (miesięcy pracy w przeliczeniu na pełny etat) = 87 001,00 zł. Nakład w zadaniu Z7 wynosi 3 mc (M19-M21) x 60% x 1,00 etatu + 6 mc (M22-M27) x 1/3 x 1,00 etatu = 3,80 etatomiesiąca. Udziały czasu pracy w projekcie są stałe w trzech okresach i wpisane w zakresie czynności pracownika: w M19-M21 40% na zadanie Z6 i 60% na zadanie Z7 (Z7 wymaga wcześniejszego projektu sprzętu i pierwszych egzemplarzy platformy na M22), w M22-M27 po jednej trzeciej, bo równolegle trwają pipeline, generator eFTI i integracje testowe (Z6), oprogramowanie embedded (Z7) oraz logi i pomiary w Fazie A (Z9) o zbliżonym nakładzie, w M28-M30 100% na zadanie Z9. Suma udziałów w każdym miesiącu równa się 1,00 etatu, a w całym okresie M19-M30 12,00 etatomiesiąca. Dane referencyjne dotyczą umowy o pracę, kwot brutto miesięcznie. Źródło: No Fluff Jobs, „Rynek pracy IT 2025/2026”, s. 30, tabela „Wytwarzanie i rozwój oprogramowania”, kategoria Backend, poziom Senior: 18 500-25 000 zł (mediany dolnych i górnych widełek z ogłoszeń o pracy). Kategorię Backend przyjęto jako najbliższy odpowiednik zakresu stanowiska (oprogramowanie systemowe i potoki danych). Przyjęto 19 000 zł, czyli dolną część widełek Senior (500 zł powyżej dolnej granicy). Wynagrodzenie niezbędne do realizacji prac B+R. Forma zatrudnienia: umowa o pracę.</w:t>
       </w:r>
     </w:p>
     <w:p>
@@ -9630,7 +9630,7 @@
           <w:color w:val="666666"/>
           <w:sz w:val="17"/>
         </w:rPr>
-        <w:t xml:space="preserve"> [1101 z 1500 znaków]</w:t>
+        <w:t xml:space="preserve"> [1400 z 1500 znaków]</w:t>
       </w:r>
     </w:p>
     <w:p>
@@ -9642,7 +9642,7 @@
         <w:rPr>
           <w:b w:val="0"/>
         </w:rPr>
-        <w:t>Koszt = 19 000,00 zł brutto/mc x narzut pracodawcy 1,205 = 22 895,00 zł/mc x 5,00 etatomiesiąca (miesięcy pracy w przeliczeniu na pełny etat) = 114 475,00 zł. Nakład w zadaniu Z9 wynosi 6 mc (M22-M27) x 1/3 x 1,00 etatu + 3 mc (M28-M30) x 100% x 1,00 etatu = 5,00 etatomiesiąca. Udziały czasu pracy w projekcie są stałe w trzech okresach i wpisane w zakresie czynności pracownika: w M19-M21 40% na zadanie Z6 i 60% na zadanie Z7 (Z7 wymaga wcześniejszego projektu sprzętu i pierwszych egzemplarzy platformy na M22), w M22-M27 po jednej trzeciej, bo równolegle trwają pipeline, generator eFTI i integracje testowe (Z6), oprogramowanie embedded (Z7) oraz logi i pomiary w Fazie A (Z9) o zbliżonym nakładzie, w M28-M30 100% na zadanie Z9. Suma udziałów w każdym miesiącu równa się 1,00 etatu, a w całym okresie M19-M30 12,00 etatomiesiąca. Stawkę brutto zweryfikowano na podstawie No Fluff Jobs „Rynek pracy IT 2025/2026”, kat. Backend/Fullstack poziom Senior, UoP 18500-25000 (s. 30), 19000 w dolnej części pasma senior. Wynagrodzenie niezbędne do realizacji prac B+R. Forma zatrudnienia: umowa o pracę.</w:t>
+        <w:t>Koszt = 19 000,00 zł brutto/mc x narzut pracodawcy 1,205 = 22 895,00 zł/mc x 5,00 etatomiesiąca (miesięcy pracy w przeliczeniu na pełny etat) = 114 475,00 zł. Nakład w zadaniu Z9 wynosi 6 mc (M22-M27) x 1/3 x 1,00 etatu + 3 mc (M28-M30) x 100% x 1,00 etatu = 5,00 etatomiesiąca. Udziały czasu pracy w projekcie są stałe w trzech okresach i wpisane w zakresie czynności pracownika: w M19-M21 40% na zadanie Z6 i 60% na zadanie Z7 (Z7 wymaga wcześniejszego projektu sprzętu i pierwszych egzemplarzy platformy na M22), w M22-M27 po jednej trzeciej, bo równolegle trwają pipeline, generator eFTI i integracje testowe (Z6), oprogramowanie embedded (Z7) oraz logi i pomiary w Fazie A (Z9) o zbliżonym nakładzie, w M28-M30 100% na zadanie Z9. Suma udziałów w każdym miesiącu równa się 1,00 etatu, a w całym okresie M19-M30 12,00 etatomiesiąca. Dane referencyjne dotyczą umowy o pracę, kwot brutto miesięcznie. Źródło: No Fluff Jobs, „Rynek pracy IT 2025/2026”, s. 30, tabela „Wytwarzanie i rozwój oprogramowania”, kategoria Backend, poziom Senior: 18 500-25 000 zł (mediany dolnych i górnych widełek z ogłoszeń o pracy). Kategorię Backend przyjęto jako najbliższy odpowiednik zakresu stanowiska (oprogramowanie systemowe i potoki danych). Przyjęto 19 000 zł, czyli dolną część widełek Senior (500 zł powyżej dolnej granicy). Wynagrodzenie niezbędne do realizacji prac B+R. Forma zatrudnienia: umowa o pracę.</w:t>
       </w:r>
     </w:p>
     <w:p>
@@ -9726,7 +9726,7 @@
           <w:color w:val="666666"/>
           <w:sz w:val="17"/>
         </w:rPr>
-        <w:t xml:space="preserve"> [542 z 1500 znaków]</w:t>
+        <w:t xml:space="preserve"> [837 z 1500 znaków]</w:t>
       </w:r>
     </w:p>
     <w:p>
@@ -9738,7 +9738,7 @@
         <w:rPr>
           <w:b w:val="0"/>
         </w:rPr>
-        <w:t>Koszt = 18 000,00 zł brutto/mc x narzut pracodawcy 1,205 = 21 690,00 zł/mc x 1,0 etatu x 3 mc (M28-M30, zadanie Z9) = 65 070,00 zł. Liczba miesięcy wynika z zakresu prac w zadaniu: w Z9 walidacja PoC i zgodności eFTI w terenie w Fazie B i oknie korekt. Stawkę brutto zweryfikowano na podstawie No Fluff Jobs „Rynek pracy IT 2025/2026”, kat. Backend/Fullstack (s. 30): Mid maks. 18000, Senior 18500-25000, 18000 na granicy Mid/Senior (założenie konserwatywne). Wynagrodzenie niezbędne do realizacji prac B+R. Forma zatrudnienia: umowa o pracę.</w:t>
+        <w:t>Koszt = 18 000,00 zł brutto/mc x narzut pracodawcy 1,205 = 21 690,00 zł/mc x 1,0 etatu x 3 mc (M28-M30, zadanie Z9) = 65 070,00 zł. Liczba miesięcy wynika z zakresu prac w zadaniu: w Z9 walidacja PoC i zgodności eFTI w terenie w Fazie B i oknie korekt. Dane referencyjne dotyczą umowy o pracę, kwot brutto miesięcznie. Źródło: No Fluff Jobs, „Rynek pracy IT 2025/2026”, s. 30, tabela „Wytwarzanie i rozwój oprogramowania”, kategorie Backend i Fullstack (widełki identyczne w obu kategoriach): poziom Mid 13 000-18 000 zł, poziom Senior 18 500-25 000 zł (mediany dolnych i górnych widełek z ogłoszeń o pracy). Stanowisko obsadzane jest na poziomie Mid, dlatego przyjęto 18 000 zł, czyli górną granicę widełek Mid, o 500 zł niższą niż dolna granica Senior. Wynagrodzenie niezbędne do realizacji prac B+R. Forma zatrudnienia: umowa o pracę.</w:t>
       </w:r>
     </w:p>
     <w:p>
@@ -20834,7 +20834,7 @@
                 <w:b w:val="0"/>
                 <w:sz w:val="15"/>
               </w:rPr>
-              <w:t>Dla każdej pozycji jedno odniesienie w formacie z uwagi 35: UoP albo B2B albo godzinowa, nazwa stanowiska referencyjnego dokładnie jak w raporcie, poziom, strona, widełki, położenie stawki, przeliczenie na koszt pracodawcy. Backend: kategorie „Backend” i „Fullstack” są w raporcie osobno (s. 30), a stawka 18 000 zł to górna granica pasma Mid (Mid 13 000-18 000, Senior 18 500-25 000), więc opis „na granicy Mid/Senior” zastąpić jednoznacznym poziomem. Anotatorzy: brak takiego stanowiska w raporcie (zastępnik: QA Junior, s. 31) i forma zlecenia, więc podać stawkę godzinową brutto-brutto i liczbę godzin. Dla osób obecnie zatrudnionych (uwaga 34) dopisać relację do obecnego wynagrodzenia. Liczby z raportów do sprawdzenia na oryginałach (nie ma ich w tej sesji).</w:t>
+              <w:t>Dla każdej pozycji jedno odniesienie w formacie z uwagi 35: UoP albo B2B albo godzinowa, nazwa stanowiska referencyjnego dokładnie jak w raporcie, poziom, strona, widełki, położenie stawki, przeliczenie na koszt pracodawcy. Backend: kategorie „Backend” i „Fullstack” są w raporcie osobno (s. 30), a stawka 18 000 zł to górna granica pasma Mid (Mid 13 000-18 000, Senior 18 500-25 000), więc opis „na granicy Mid/Senior” zastąpić jednoznacznym poziomem. Anotatorzy: brak takiego stanowiska w raporcie (zastępnik: QA Junior, s. 31) i forma zlecenia, więc podać stawkę godzinową brutto-brutto i liczbę godzin. Dla osób obecnie zatrudnionych (uwaga 34) dopisać relację do obecnego wynagrodzenia. Zweryfikowano na s. 30 raportu NFJ (screen od właściciela): Backend i Fullstack, UoP, Mid 13 000-18 000, Senior 18 500-25 000; kwoty to mediany dolnych i górnych widełek z ogłoszeń. Metody dla Backendu i IT Specialist przepisane. Pozostałe pozycje (AI Lead, AI Senior, cyber, IoT, TSL, Anotatorzy) czekają na screeny stron 27, 31, 32, 33, 35 i tabel Hays.</w:t>
             </w:r>
           </w:p>
         </w:tc>

</xml_diff>

<commit_message>
Metoda szacowania 28 pozycji Everest11 wg raportow NFJ i Hays (zweryfikowane), D32
Co-Authored-By: Claude Sonnet 5.5 <noreply@anthropic.com>
Claude-Session: https://claude.ai/code/session_01672WnJhixnEcarbb7uiwfx
</commit_message>
<xml_diff>
--- a/Opisy_zadan_z_kamieniami_milowymi.docx
+++ b/Opisy_zadan_z_kamieniami_milowymi.docx
@@ -9082,7 +9082,7 @@
         <w:pStyle w:val="Heading3"/>
       </w:pPr>
       <w:r>
-        <w:t>Zadanie 6</w:t>
+        <w:t>Zadanie 2</w:t>
       </w:r>
     </w:p>
     <w:p>
@@ -9095,14 +9095,14 @@
           <w:b/>
           <w:sz w:val="20"/>
         </w:rPr>
-        <w:t>AI Lead - wynagrodzenie (Z6)</w:t>
+        <w:t>AI Lead - wynagrodzenie (Z2)</w:t>
       </w:r>
       <w:r>
         <w:rPr>
           <w:color w:val="666666"/>
           <w:sz w:val="17"/>
         </w:rPr>
-        <w:t xml:space="preserve"> [1130 z 1500 znaków]</w:t>
+        <w:t xml:space="preserve"> [772 z 1500 znaków]</w:t>
       </w:r>
     </w:p>
     <w:p>
@@ -9114,7 +9114,7 @@
         <w:rPr>
           <w:b w:val="0"/>
         </w:rPr>
-        <w:t>Koszt = 23 000,00 zł brutto/mc x narzut pracodawcy 1,205 = 27 715,00 zł/mc x 2,40 etatomiesiąca (miesięcy pracy w przeliczeniu na pełny etat) = 66 516,00 zł. Nakład w zadaniu Z6 wynosi 3 mc (M19-M21) x 40% x 0,75 etatu + 6 mc (M22-M27) x 1/3 x 0,75 etatu = 2,40 etatomiesiąca. Udziały czasu pracy w projekcie są stałe w trzech okresach i wpisane w zakresie czynności pracownika: w M19-M21 40% na zadanie Z6 i 60% na zadanie Z7 (Z7 wymaga wcześniejszego projektu sprzętu i pierwszych egzemplarzy platformy na M22), w M22-M27 po jednej trzeciej, bo równolegle trwają architektura i optymalizacja pipeline'u (Z6), strategia kompresji i walidacja modeli (Z7) oraz protokół KPI i dane terenowe (Z9) o zbliżonym nakładzie, w M28-M30 100% na zadanie Z9. Suma udziałów w każdym miesiącu równa się 0,75 etatu, a w całym okresie M19-M30 9,00 etatomiesiąca. Stawkę brutto zweryfikowano na podstawie No Fluff Jobs „Rynek pracy IT 2025/2026”, kat. AI poziom Senior, UoP 20000-29000 (s. 33; tabela zbiorcza 19000-24000, s. 27), 23000 w środku pasma senior/lead. Wynagrodzenie niezbędne do realizacji prac B+R. Forma zatrudnienia: umowa o pracę.</w:t>
+        <w:t>Koszt = 23 000,00 zł brutto/mc x narzut pracodawcy 1,205 = 27 715,00 zł/mc x 0,75 etatu x 18 mc (M1-M18, zadanie Z2) = 374 152,50 zł. Liczba miesięcy i wymiar etatu wynikają z zakresu prac w zadaniu Z2. Dane referencyjne dotyczą umowy o pracę, kwot brutto miesięcznie. Źródło: No Fluff Jobs, „Rynek pracy IT 2025/2026”, s. 33, kategoria AI, poziom Senior: 20 000-29 000 zł (mediany dolnych i górnych widełek z ogłoszeń o pracy); kategoria AI ogółem (s. 27): 19 000-24 000 zł. W raporcie nie ma osobnego poziomu Lead, więc stanowisko odniesiono do poziomu Senior. Przyjęto 23 000 zł, czyli dolną połowę widełek Senior (środek widełek to 24 500 zł) i górną część widełek kategorii AI ogółem. Wynagrodzenie niezbędne do realizacji prac B+R. Forma zatrudnienia: umowa o pracę.</w:t>
       </w:r>
     </w:p>
     <w:p>
@@ -9127,14 +9127,14 @@
           <w:b/>
           <w:sz w:val="20"/>
         </w:rPr>
-        <w:t>AI Senior Engineer - wynagrodzenie (Z6)</w:t>
+        <w:t>AI Senior Engineer - wynagrodzenie (Z2)</w:t>
       </w:r>
       <w:r>
         <w:rPr>
           <w:color w:val="666666"/>
           <w:sz w:val="17"/>
         </w:rPr>
-        <w:t xml:space="preserve"> [1168 z 1500 znaków]</w:t>
+        <w:t xml:space="preserve"> [714 z 1500 znaków]</w:t>
       </w:r>
     </w:p>
     <w:p>
@@ -9146,7 +9146,7 @@
         <w:rPr>
           <w:b w:val="0"/>
         </w:rPr>
-        <w:t>Koszt = 16 500,00 zł brutto/mc x narzut pracodawcy 1,205 = 19 882,50 zł/mc x 2,40 etatomiesiąca (miesięcy pracy w przeliczeniu na pełny etat) = 47 718,00 zł. Nakład w zadaniu Z6 wynosi 3 mc (M19-M21) x 40% x 0,75 etatu + 6 mc (M22-M27) x 1/3 x 0,75 etatu = 2,40 etatomiesiąca. Udziały czasu pracy w projekcie są stałe w trzech okresach i wpisane w zakresie czynności pracownika: w M19-M21 40% na zadanie Z6 i 60% na zadanie Z7 (Z7 wymaga wcześniejszego projektu sprzętu i pierwszych egzemplarzy platformy na M22), w M22-M27 po jednej trzeciej, bo równolegle trwają integracja change detection i raport ML (Z6), implementacja kompresji i optymalizacja na platformie (Z7) oraz diagnoza przesunięcia domeny i korekty (Z9) o zbliżonym nakładzie, w M28-M30 100% na zadanie Z9. Suma udziałów w każdym miesiącu równa się 0,75 etatu, a w całym okresie M19-M30 9,00 etatomiesiąca. Stawkę brutto zweryfikowano na podstawie No Fluff Jobs „Rynek pracy IT 2025/2026”, kat. AI (s. 33): Senior 20000-29000, Mid 14000-21000, 16500 w paśmie Mid, poniżej dolnej mediany Senior (założenie konserwatywne). Wynagrodzenie niezbędne do realizacji prac B+R. Forma zatrudnienia: umowa o pracę.</w:t>
+        <w:t>Koszt = 16 500,00 zł brutto/mc x narzut pracodawcy 1,205 = 19 882,50 zł/mc x 0,75 etatu x 18 mc (M1-M18, zadanie Z2) = 268 413,75 zł. Liczba miesięcy i wymiar etatu wynikają z zakresu prac w zadaniu Z2. Dane referencyjne dotyczą umowy o pracę, kwot brutto miesięcznie. Źródło: No Fluff Jobs, „Rynek pracy IT 2025/2026”, s. 33, kategoria AI, poziom Mid: 14 000-21 000 zł, poziom Senior: 20 000-29 000 zł (mediany dolnych i górnych widełek z ogłoszeń o pracy). Stanowisko obsadzane jest na poziomie Mid, dlatego przyjęto 16 500 zł, czyli dolną połowę widełek Mid (środek widełek to 17 500 zł), 3 500 zł poniżej dolnej granicy Senior. Wynagrodzenie niezbędne do realizacji prac B+R. Forma zatrudnienia: umowa o pracę.</w:t>
       </w:r>
     </w:p>
     <w:p>
@@ -9159,14 +9159,14 @@
           <w:b/>
           <w:sz w:val="20"/>
         </w:rPr>
-        <w:t>Cybersecurity / AI Act Specialist - wynagrodzenie (Z6)</w:t>
+        <w:t>Cybersecurity / AI Act Specialist - wynagrodzenie (Z2)</w:t>
       </w:r>
       <w:r>
         <w:rPr>
           <w:color w:val="666666"/>
           <w:sz w:val="17"/>
         </w:rPr>
-        <w:t xml:space="preserve"> [1153 z 1500 znaków]</w:t>
+        <w:t xml:space="preserve"> [688 z 1500 znaków]</w:t>
       </w:r>
     </w:p>
     <w:p>
@@ -9178,7 +9178,7 @@
         <w:rPr>
           <w:b w:val="0"/>
         </w:rPr>
-        <w:t>Koszt = 21 000,00 zł brutto/mc x narzut pracodawcy 1,205 = 25 305,00 zł/mc x 0,60 etatomiesiąca (miesięcy pracy w przeliczeniu na pełny etat) = 15 183,00 zł. Nakład w zadaniu Z6 wynosi 3 mc (M19-M21) x 40% x 0,25 etatu + 6 mc (M22-M27) x 20% x 0,25 etatu = 0,60 etatomiesiąca. Udziały czasu pracy w projekcie są stałe w trzech okresach i wpisane w zakresie czynności pracownika: w M19-M21 40% na zadanie Z6 i 60% na zadanie Z7 (Z7 wymaga wcześniejszego projektu sprzętu i pierwszych egzemplarzy platformy na M22), w M22-M27 20% na Z6 (podpis kryptograficzny i łańcuch integralności), 40% na Z7 (bezpieczny rozruch, podpisywanie aktualizacji, szyfrowanie transmisji) i 40% na Z9 (testy bezpieczeństwa w terenie, rola niezależnego ewaluatora), w M28-M30 100% na zadanie Z9. Suma udziałów w każdym miesiącu równa się 0,25 etatu, a w całym okresie M19-M30 3,00 etatomiesiąca. Stawkę brutto zweryfikowano na podstawie No Fluff Jobs „Rynek pracy IT 2025/2026”, kat. Security poziom Senior, UoP 20000-28000 (s. 32; tabela zbiorcza 17000-23000, s. 27), 21000 w widełkach senior. Wynagrodzenie niezbędne do realizacji prac B+R. Forma zatrudnienia: umowa o pracę.</w:t>
+        <w:t>Koszt = 21 000,00 zł brutto/mc x narzut pracodawcy 1,205 = 25 305,00 zł/mc x 0,25 etatu x 18 mc (M1-M18, zadanie Z2) = 113 872,50 zł. Liczba miesięcy i wymiar etatu wynikają z zakresu prac w zadaniu Z2. Dane referencyjne dotyczą umowy o pracę, kwot brutto miesięcznie. Źródło: No Fluff Jobs, „Rynek pracy IT 2025/2026”, s. 32, kategoria Security, poziom Senior: 20 000-28 000 zł, poziom Mid: 14 000-17 000 zł (mediany dolnych i górnych widełek z ogłoszeń o pracy); kategoria Security ogółem (s. 27): 17 000-23 000 zł. Przyjęto 21 000 zł, czyli dolną część widełek Senior (1 000 zł powyżej dolnej granicy). Wynagrodzenie niezbędne do realizacji prac B+R. Forma zatrudnienia: umowa o pracę.</w:t>
       </w:r>
     </w:p>
     <w:p>
@@ -9191,14 +9191,14 @@
           <w:b/>
           <w:sz w:val="20"/>
         </w:rPr>
-        <w:t>IT Specialist - wynagrodzenie (Z6)</w:t>
+        <w:t>IT Specialist - wynagrodzenie (Z2)</w:t>
       </w:r>
       <w:r>
         <w:rPr>
           <w:color w:val="666666"/>
           <w:sz w:val="17"/>
         </w:rPr>
-        <w:t xml:space="preserve"> [1398 z 1500 znaków]</w:t>
+        <w:t xml:space="preserve"> [766 z 1500 znaków]</w:t>
       </w:r>
     </w:p>
     <w:p>
@@ -9210,7 +9210,7 @@
         <w:rPr>
           <w:b w:val="0"/>
         </w:rPr>
-        <w:t>Koszt = 19 000,00 zł brutto/mc x narzut pracodawcy 1,205 = 22 895,00 zł/mc x 3,20 etatomiesiąca (miesięcy pracy w przeliczeniu na pełny etat) = 73 264,00 zł. Nakład w zadaniu Z6 wynosi 3 mc (M19-M21) x 40% x 1,00 etatu + 6 mc (M22-M27) x 1/3 x 1,00 etatu = 3,20 etatomiesiąca. Udziały czasu pracy w projekcie są stałe w trzech okresach i wpisane w zakresie czynności pracownika: w M19-M21 40% na zadanie Z6 i 60% na zadanie Z7 (Z7 wymaga wcześniejszego projektu sprzętu i pierwszych egzemplarzy platformy na M22), w M22-M27 po jednej trzeciej, bo równolegle trwają pipeline, generator eFTI i integracje testowe (Z6), oprogramowanie embedded (Z7) oraz logi i pomiary w Fazie A (Z9) o zbliżonym nakładzie, w M28-M30 100% na zadanie Z9. Suma udziałów w każdym miesiącu równa się 1,00 etatu, a w całym okresie M19-M30 12,00 etatomiesiąca. Dane referencyjne dotyczą umowy o pracę, kwot brutto miesięcznie. Źródło: No Fluff Jobs, „Rynek pracy IT 2025/2026”, s. 30, tabela „Wytwarzanie i rozwój oprogramowania”, kategoria Backend, poziom Senior: 18 500-25 000 zł (mediany dolnych i górnych widełek z ogłoszeń o pracy). Kategorię Backend przyjęto jako najbliższy odpowiednik zakresu stanowiska (oprogramowanie systemowe i potoki danych). Przyjęto 19 000 zł, czyli dolną część widełek Senior (500 zł powyżej dolnej granicy). Wynagrodzenie niezbędne do realizacji prac B+R. Forma zatrudnienia: umowa o pracę.</w:t>
+        <w:t>Koszt = 19 000,00 zł brutto/mc x narzut pracodawcy 1,205 = 22 895,00 zł/mc x 1,00 etatu x 18 mc (M1-M18, zadanie Z2) = 412 110,00 zł. Liczba miesięcy i wymiar etatu wynikają z zakresu prac w zadaniu Z2. Dane referencyjne dotyczą umowy o pracę, kwot brutto miesięcznie. Źródło: No Fluff Jobs, „Rynek pracy IT 2025/2026”, s. 30, tabela „Wytwarzanie i rozwój oprogramowania”, kategoria Backend, poziom Senior: 18 500-25 000 zł (mediany dolnych i górnych widełek z ogłoszeń o pracy). Kategorię Backend przyjęto jako najbliższy odpowiednik zakresu stanowiska (oprogramowanie systemowe i potoki danych). Przyjęto 19 000 zł, czyli dolną część widełek Senior (500 zł powyżej dolnej granicy). Wynagrodzenie niezbędne do realizacji prac B+R. Forma zatrudnienia: umowa o pracę.</w:t>
       </w:r>
     </w:p>
     <w:p>
@@ -9223,14 +9223,14 @@
           <w:b/>
           <w:sz w:val="20"/>
         </w:rPr>
-        <w:t>IoT Specialist - wynagrodzenie (Z6)</w:t>
+        <w:t>IoT Specialist - wynagrodzenie (Z2)</w:t>
       </w:r>
       <w:r>
         <w:rPr>
           <w:color w:val="666666"/>
           <w:sz w:val="17"/>
         </w:rPr>
-        <w:t xml:space="preserve"> [1233 z 1500 znaków]</w:t>
+        <w:t xml:space="preserve"> [733 z 1500 znaków]</w:t>
       </w:r>
     </w:p>
     <w:p>
@@ -9242,7 +9242,7 @@
         <w:rPr>
           <w:b w:val="0"/>
         </w:rPr>
-        <w:t>Koszt = 15 000,00 zł brutto/mc x narzut pracodawcy 1,205 = 18 075,00 zł/mc x 1,20 etatomiesiąca (miesięcy pracy w przeliczeniu na pełny etat) = 21 690,00 zł. Nakład w zadaniu Z6 wynosi 3 mc (M19-M21) x 40% x 0,50 etatu + 6 mc (M22-M27) x 20% x 0,50 etatu = 1,20 etatomiesiąca. Udziały czasu pracy w projekcie są stałe w trzech okresach i wpisane w zakresie czynności pracownika: w M19-M21 40% na zadanie Z6 i 60% na zadanie Z7 (Z7 wymaga wcześniejszego projektu sprzętu i pierwszych egzemplarzy platformy na M22), w M22-M27 20% na Z6 (czujnik drzwi, synchronizacja GPS, agregacja historii sygnałów), 40% na Z7 (architektura sprzętowa, obudowa, testy środowiskowe, pomiar opóźnienia) i 40% na Z9 (odbiór zestawów po montażu, kalibracja, rejestracja niezawodności w terenie), w M28-M30 100% na zadanie Z9. Suma udziałów w każdym miesiącu równa się 0,50 etatu, a w całym okresie M19-M30 6,00 etatomiesiąca. Stawkę brutto zweryfikowano na podstawie No Fluff Jobs „Rynek pracy IT 2025/2026”, kat. Embedded (s. 27/35: 13000-19000, Mid 12000-17000); pomocniczo Hays „Raport płacowy 2026”, R&amp;D Engineer 13/16/18 tys. (s. 38), 15000 w widełkach kat. Embedded. Wynagrodzenie niezbędne do realizacji prac B+R. Forma zatrudnienia: umowa o pracę.</w:t>
+        <w:t>Koszt = 15 000,00 zł brutto/mc x narzut pracodawcy 1,205 = 18 075,00 zł/mc x 0,50 etatu x 18 mc (M1-M18, zadanie Z2) = 162 675,00 zł. Liczba miesięcy i wymiar etatu wynikają z zakresu prac w zadaniu Z2. Dane referencyjne dotyczą umowy o pracę, kwot brutto miesięcznie. Źródło: No Fluff Jobs, „Rynek pracy IT 2025/2026”, s. 35, kategoria Embedded, poziom Mid: 12 000-17 000 zł, poziom Senior: 17 000-22 000 zł (mediany dolnych i górnych widełek z ogłoszeń o pracy); kategoria Embedded ogółem (s. 27): 13 000-19 000 zł. Stanowisko obsadzane jest na poziomie Mid, dlatego przyjęto 15 000 zł, czyli górną połowę widełek Mid (środek widełek to 14 500 zł). Wynagrodzenie niezbędne do realizacji prac B+R. Forma zatrudnienia: umowa o pracę.</w:t>
       </w:r>
     </w:p>
     <w:p>
@@ -9255,14 +9255,14 @@
           <w:b/>
           <w:sz w:val="20"/>
         </w:rPr>
-        <w:t>Specjalista ds. logistyki TSL - wynagrodzenie (Z6)</w:t>
+        <w:t>Specjalista ds. logistyki TSL - wynagrodzenie (Z2)</w:t>
       </w:r>
       <w:r>
         <w:rPr>
           <w:color w:val="666666"/>
           <w:sz w:val="17"/>
         </w:rPr>
-        <w:t xml:space="preserve"> [1102 z 1500 znaków]</w:t>
+        <w:t xml:space="preserve"> [637 z 1500 znaków]</w:t>
       </w:r>
     </w:p>
     <w:p>
@@ -9274,7 +9274,7 @@
         <w:rPr>
           <w:b w:val="0"/>
         </w:rPr>
-        <w:t>Koszt = 10 000,00 zł brutto/mc x narzut pracodawcy 1,205 = 12 050,00 zł/mc x 1,20 etatomiesiąca (miesięcy pracy w przeliczeniu na pełny etat) = 14 460,00 zł. Nakład w zadaniu Z6 wynosi 3 mc (M19-M21) x 40% x 0,50 etatu + 6 mc (M22-M27) x 20% x 0,50 etatu = 1,20 etatomiesiąca. Udziały czasu pracy w projekcie są stałe w trzech okresach i wpisane w zakresie czynności pracownika: w M19-M21 40% na zadanie Z6 i 60% na zadanie Z7 (Z7 wymaga wcześniejszego projektu sprzętu i pierwszych egzemplarzy platformy na M22), w M22-M27 20% na Z6 (interpretacja pól eFTI, ocena treści PoL i PoC), 30% na Z7 (scenariusze i progi alertów, użyteczność w kabinie) i 50% na Z9 (inspekcje ground truth od Fazy A), w M28-M30 100% na zadanie Z9. Suma udziałów w każdym miesiącu równa się 0,50 etatu, a w całym okresie M19-M30 6,00 etatomiesiąca. Stawkę brutto zweryfikowano na podstawie Hays „Raport płacowy 2026”, sekcja Logistyka i zakupy, tabela Logistyka, „Specjalista ds. Logistyki” 8000/10000/13000 (s. 40), 10000 = wartość optymalna. Wynagrodzenie niezbędne do realizacji prac B+R. Forma zatrudnienia: umowa o pracę.</w:t>
+        <w:t>Koszt = 10 000,00 zł brutto/mc x narzut pracodawcy 1,205 = 12 050,00 zł/mc x 0,50 etatu x 18 mc (M1-M18, zadanie Z2) = 108 450,00 zł. Liczba miesięcy i wymiar etatu wynikają z zakresu prac w zadaniu Z2. Dane referencyjne dotyczą kwot brutto miesięcznie za pełny etat (raport nie rozróżnia form zatrudnienia). Źródło: Hays Poland, „Raport płacowy 2026”, s. 40, sekcja Logistyka, stanowisko Specjalista ds. Logistyki: Min 8 000 zł, Opt 10 000 zł (najczęściej oferowane wynagrodzenie), Max 13 000 zł. Przyjęto 10 000 zł, czyli wartość najczęściej oferowaną. Wynagrodzenie niezbędne do realizacji prac B+R. Forma zatrudnienia: umowa o pracę.</w:t>
       </w:r>
     </w:p>
     <w:p>
@@ -9287,14 +9287,14 @@
           <w:b/>
           <w:sz w:val="20"/>
         </w:rPr>
-        <w:t>Backend/Full-Stack Developer - wynagrodzenie (Z6)</w:t>
+        <w:t>Backend/Full-Stack Developer - wynagrodzenie (Z2)</w:t>
       </w:r>
       <w:r>
         <w:rPr>
           <w:color w:val="666666"/>
           <w:sz w:val="17"/>
         </w:rPr>
-        <w:t xml:space="preserve"> [852 z 1500 znaków]</w:t>
+        <w:t xml:space="preserve"> [787 z 1500 znaków]</w:t>
       </w:r>
     </w:p>
     <w:p>
@@ -9306,15 +9306,7 @@
         <w:rPr>
           <w:b w:val="0"/>
         </w:rPr>
-        <w:t>Koszt = 18 000,00 zł brutto/mc x narzut pracodawcy 1,205 = 21 690,00 zł/mc x 1,0 etatu x 9 mc (M19-M27, zadanie Z6) = 195 210,00 zł. Liczba miesięcy wynika z zakresu prac w zadaniu: w Z6 integracje testowe, potok danych i test zgodności eFTI w czasie trwania zadania. Dane referencyjne dotyczą umowy o pracę, kwot brutto miesięcznie. Źródło: No Fluff Jobs, „Rynek pracy IT 2025/2026”, s. 30, tabela „Wytwarzanie i rozwój oprogramowania”, kategorie Backend i Fullstack (widełki identyczne w obu kategoriach): poziom Mid 13 000-18 000 zł, poziom Senior 18 500-25 000 zł (mediany dolnych i górnych widełek z ogłoszeń o pracy). Stanowisko obsadzane jest na poziomie Mid, dlatego przyjęto 18 000 zł, czyli górną granicę widełek Mid, o 500 zł niższą niż dolna granica Senior. Wynagrodzenie niezbędne do realizacji prac B+R. Forma zatrudnienia: umowa o pracę.</w:t>
-      </w:r>
-    </w:p>
-    <w:p>
-      <w:pPr>
-        <w:pStyle w:val="Heading3"/>
-      </w:pPr>
-      <w:r>
-        <w:t>Zadanie 7</w:t>
+        <w:t>Koszt = 18 000,00 zł brutto/mc x narzut pracodawcy 1,205 = 21 690,00 zł/mc x 1,00 etatu x 6 mc (M13-M18, zadanie Z2) = 130 140,00 zł. Liczba miesięcy i wymiar etatu wynikają z zakresu prac w zadaniu Z2. Dane referencyjne dotyczą umowy o pracę, kwot brutto miesięcznie. Źródło: No Fluff Jobs, „Rynek pracy IT 2025/2026”, s. 30, tabela „Wytwarzanie i rozwój oprogramowania”, kategorie Backend i Fullstack (widełki identyczne w obu kategoriach): poziom Mid 13 000-18 000 zł, poziom Senior 18 500-25 000 zł (mediany dolnych i górnych widełek z ogłoszeń o pracy). Stanowisko obsadzane jest na poziomie Mid, dlatego przyjęto 18 000 zł, czyli górną granicę widełek Mid, o 500 zł niższą niż dolna granica Senior. Wynagrodzenie niezbędne do realizacji prac B+R. Forma zatrudnienia: umowa o pracę.</w:t>
       </w:r>
     </w:p>
     <w:p>
@@ -9327,14 +9319,14 @@
           <w:b/>
           <w:sz w:val="20"/>
         </w:rPr>
-        <w:t>AI Lead - wynagrodzenie (Z7)</w:t>
+        <w:t>Anotatorzy - wynagrodzenie (Z2)</w:t>
       </w:r>
       <w:r>
         <w:rPr>
           <w:color w:val="666666"/>
           <w:sz w:val="17"/>
         </w:rPr>
-        <w:t xml:space="preserve"> [1130 z 1500 znaków]</w:t>
+        <w:t xml:space="preserve"> [934 z 1500 znaków]</w:t>
       </w:r>
     </w:p>
     <w:p>
@@ -9346,7 +9338,15 @@
         <w:rPr>
           <w:b w:val="0"/>
         </w:rPr>
-        <w:t>Koszt = 23 000,00 zł brutto/mc x narzut pracodawcy 1,205 = 27 715,00 zł/mc x 2,85 etatomiesiąca (miesięcy pracy w przeliczeniu na pełny etat) = 78 987,75 zł. Nakład w zadaniu Z7 wynosi 3 mc (M19-M21) x 60% x 0,75 etatu + 6 mc (M22-M27) x 1/3 x 0,75 etatu = 2,85 etatomiesiąca. Udziały czasu pracy w projekcie są stałe w trzech okresach i wpisane w zakresie czynności pracownika: w M19-M21 40% na zadanie Z6 i 60% na zadanie Z7 (Z7 wymaga wcześniejszego projektu sprzętu i pierwszych egzemplarzy platformy na M22), w M22-M27 po jednej trzeciej, bo równolegle trwają architektura i optymalizacja pipeline'u (Z6), strategia kompresji i walidacja modeli (Z7) oraz protokół KPI i dane terenowe (Z9) o zbliżonym nakładzie, w M28-M30 100% na zadanie Z9. Suma udziałów w każdym miesiącu równa się 0,75 etatu, a w całym okresie M19-M30 9,00 etatomiesiąca. Stawkę brutto zweryfikowano na podstawie No Fluff Jobs „Rynek pracy IT 2025/2026”, kat. AI poziom Senior, UoP 20000-29000 (s. 33; tabela zbiorcza 19000-24000, s. 27), 23000 w środku pasma senior/lead. Wynagrodzenie niezbędne do realizacji prac B+R. Forma zatrudnienia: umowa o pracę.</w:t>
+        <w:t>Koszt = 6 000,00 zł brutto/mc x narzut pracodawcy 1,205 = 7 230,00 zł/mc x 3,00 etatu x 10 mc (M9-M18, zadanie Z2) = 216 900,00 zł. Liczba miesięcy i wymiar etatu wynikają z zakresu prac w zadaniu Z2. Dane referencyjne dotyczą umowy o pracę (stanowiska pracują na umowie zlecenia, liczonej tym samym narzutem), kwot brutto miesięcznie. Źródło: No Fluff Jobs, „Rynek pracy IT 2025/2026”, s. 31, kategoria Testing/QA, poziom Junior: 5 750-8 200 zł (mediany dolnych i górnych widełek z ogłoszeń o pracy). W raporcie nie ma stanowiska anotatora danych, więc jako najbliższy odpowiednik (praca według schematu i kontrola jakości) przyjęto Testing/QA na poziomie Junior. Przyjęto 6 000 zł, czyli dolną część widełek (250 zł powyżej dolnej granicy), co przy 168 godzinach miesięcznie odpowiada stawce około 43 zł/h brutto-brutto po doliczeniu narzutu 1,205. Wynagrodzenie niezbędne do realizacji prac B+R. Forma zatrudnienia: umowa zlecenia.</w:t>
+      </w:r>
+    </w:p>
+    <w:p>
+      <w:pPr>
+        <w:pStyle w:val="Heading3"/>
+      </w:pPr>
+      <w:r>
+        <w:t>Zadanie 6</w:t>
       </w:r>
     </w:p>
     <w:p>
@@ -9359,14 +9359,14 @@
           <w:b/>
           <w:sz w:val="20"/>
         </w:rPr>
-        <w:t>AI Senior Engineer - wynagrodzenie (Z7)</w:t>
+        <w:t>AI Lead - wynagrodzenie (Z6)</w:t>
       </w:r>
       <w:r>
         <w:rPr>
           <w:color w:val="666666"/>
           <w:sz w:val="17"/>
         </w:rPr>
-        <w:t xml:space="preserve"> [1168 z 1500 znaków]</w:t>
+        <w:t xml:space="preserve"> [1416 z 1500 znaków]</w:t>
       </w:r>
     </w:p>
     <w:p>
@@ -9378,7 +9378,7 @@
         <w:rPr>
           <w:b w:val="0"/>
         </w:rPr>
-        <w:t>Koszt = 16 500,00 zł brutto/mc x narzut pracodawcy 1,205 = 19 882,50 zł/mc x 2,85 etatomiesiąca (miesięcy pracy w przeliczeniu na pełny etat) = 56 665,12 zł. Nakład w zadaniu Z7 wynosi 3 mc (M19-M21) x 60% x 0,75 etatu + 6 mc (M22-M27) x 1/3 x 0,75 etatu = 2,85 etatomiesiąca. Udziały czasu pracy w projekcie są stałe w trzech okresach i wpisane w zakresie czynności pracownika: w M19-M21 40% na zadanie Z6 i 60% na zadanie Z7 (Z7 wymaga wcześniejszego projektu sprzętu i pierwszych egzemplarzy platformy na M22), w M22-M27 po jednej trzeciej, bo równolegle trwają integracja change detection i raport ML (Z6), implementacja kompresji i optymalizacja na platformie (Z7) oraz diagnoza przesunięcia domeny i korekty (Z9) o zbliżonym nakładzie, w M28-M30 100% na zadanie Z9. Suma udziałów w każdym miesiącu równa się 0,75 etatu, a w całym okresie M19-M30 9,00 etatomiesiąca. Stawkę brutto zweryfikowano na podstawie No Fluff Jobs „Rynek pracy IT 2025/2026”, kat. AI (s. 33): Senior 20000-29000, Mid 14000-21000, 16500 w paśmie Mid, poniżej dolnej mediany Senior (założenie konserwatywne). Wynagrodzenie niezbędne do realizacji prac B+R. Forma zatrudnienia: umowa o pracę.</w:t>
+        <w:t>Koszt = 23 000,00 zł brutto/mc x narzut pracodawcy 1,205 = 27 715,00 zł/mc x 2,40 etatomiesiąca (miesięcy pracy w przeliczeniu na pełny etat) = 66 516,00 zł. Nakład w zadaniu Z6 wynosi 3 mc (M19-M21) x 40% x 0,75 etatu + 6 mc (M22-M27) x 1/3 x 0,75 etatu = 2,40 etatomiesiąca. Udziały czasu pracy w projekcie są stałe w trzech okresach i wpisane w zakresie czynności pracownika: w M19-M21 40% na zadanie Z6 i 60% na zadanie Z7 (Z7 wymaga wcześniejszego projektu sprzętu i pierwszych egzemplarzy platformy na M22), w M22-M27 po jednej trzeciej, bo równolegle trwają architektura i optymalizacja pipeline'u (Z6), strategia kompresji i walidacja modeli (Z7) oraz protokół KPI i dane terenowe (Z9) o zbliżonym nakładzie, w M28-M30 100% na zadanie Z9. Suma udziałów w każdym miesiącu równa się 0,75 etatu, a w całym okresie M19-M30 9,00 etatomiesiąca. Dane referencyjne dotyczą umowy o pracę, kwot brutto miesięcznie. Źródło: No Fluff Jobs, „Rynek pracy IT 2025/2026”, s. 33, kategoria AI, poziom Senior: 20 000-29 000 zł (mediany dolnych i górnych widełek z ogłoszeń o pracy); kategoria AI ogółem (s. 27): 19 000-24 000 zł. W raporcie nie ma osobnego poziomu Lead, więc stanowisko odniesiono do poziomu Senior. Przyjęto 23 000 zł, czyli dolną połowę widełek Senior (środek widełek to 24 500 zł) i górną część widełek kategorii AI ogółem. Wynagrodzenie niezbędne do realizacji prac B+R. Forma zatrudnienia: umowa o pracę.</w:t>
       </w:r>
     </w:p>
     <w:p>
@@ -9391,14 +9391,14 @@
           <w:b/>
           <w:sz w:val="20"/>
         </w:rPr>
-        <w:t>Cybersecurity / AI Act Specialist - wynagrodzenie (Z7)</w:t>
+        <w:t>AI Senior Engineer - wynagrodzenie (Z6)</w:t>
       </w:r>
       <w:r>
         <w:rPr>
           <w:color w:val="666666"/>
           <w:sz w:val="17"/>
         </w:rPr>
-        <w:t xml:space="preserve"> [1153 z 1500 znaków]</w:t>
+        <w:t xml:space="preserve"> [1383 z 1500 znaków]</w:t>
       </w:r>
     </w:p>
     <w:p>
@@ -9410,7 +9410,7 @@
         <w:rPr>
           <w:b w:val="0"/>
         </w:rPr>
-        <w:t>Koszt = 21 000,00 zł brutto/mc x narzut pracodawcy 1,205 = 25 305,00 zł/mc x 1,05 etatomiesiąca (miesięcy pracy w przeliczeniu na pełny etat) = 26 570,25 zł. Nakład w zadaniu Z7 wynosi 3 mc (M19-M21) x 60% x 0,25 etatu + 6 mc (M22-M27) x 40% x 0,25 etatu = 1,05 etatomiesiąca. Udziały czasu pracy w projekcie są stałe w trzech okresach i wpisane w zakresie czynności pracownika: w M19-M21 40% na zadanie Z6 i 60% na zadanie Z7 (Z7 wymaga wcześniejszego projektu sprzętu i pierwszych egzemplarzy platformy na M22), w M22-M27 20% na Z6 (podpis kryptograficzny i łańcuch integralności), 40% na Z7 (bezpieczny rozruch, podpisywanie aktualizacji, szyfrowanie transmisji) i 40% na Z9 (testy bezpieczeństwa w terenie, rola niezależnego ewaluatora), w M28-M30 100% na zadanie Z9. Suma udziałów w każdym miesiącu równa się 0,25 etatu, a w całym okresie M19-M30 3,00 etatomiesiąca. Stawkę brutto zweryfikowano na podstawie No Fluff Jobs „Rynek pracy IT 2025/2026”, kat. Security poziom Senior, UoP 20000-28000 (s. 32; tabela zbiorcza 17000-23000, s. 27), 21000 w widełkach senior. Wynagrodzenie niezbędne do realizacji prac B+R. Forma zatrudnienia: umowa o pracę.</w:t>
+        <w:t>Koszt = 16 500,00 zł brutto/mc x narzut pracodawcy 1,205 = 19 882,50 zł/mc x 2,40 etatomiesiąca (miesięcy pracy w przeliczeniu na pełny etat) = 47 718,00 zł. Nakład w zadaniu Z6 wynosi 3 mc (M19-M21) x 40% x 0,75 etatu + 6 mc (M22-M27) x 1/3 x 0,75 etatu = 2,40 etatomiesiąca. Udziały czasu pracy w projekcie są stałe w trzech okresach i wpisane w zakresie czynności pracownika: w M19-M21 40% na zadanie Z6 i 60% na zadanie Z7 (Z7 wymaga wcześniejszego projektu sprzętu i pierwszych egzemplarzy platformy na M22), w M22-M27 po jednej trzeciej, bo równolegle trwają integracja change detection i raport ML (Z6), implementacja kompresji i optymalizacja na platformie (Z7) oraz diagnoza przesunięcia domeny i korekty (Z9) o zbliżonym nakładzie, w M28-M30 100% na zadanie Z9. Suma udziałów w każdym miesiącu równa się 0,75 etatu, a w całym okresie M19-M30 9,00 etatomiesiąca. Dane referencyjne dotyczą umowy o pracę, kwot brutto miesięcznie. Źródło: No Fluff Jobs, „Rynek pracy IT 2025/2026”, s. 33, kategoria AI, poziom Mid: 14 000-21 000 zł, poziom Senior: 20 000-29 000 zł (mediany dolnych i górnych widełek z ogłoszeń o pracy). Stanowisko obsadzane jest na poziomie Mid, dlatego przyjęto 16 500 zł, czyli dolną połowę widełek Mid (środek widełek to 17 500 zł), 3 500 zł poniżej dolnej granicy Senior. Wynagrodzenie niezbędne do realizacji prac B+R. Forma zatrudnienia: umowa o pracę.</w:t>
       </w:r>
     </w:p>
     <w:p>
@@ -9423,14 +9423,14 @@
           <w:b/>
           <w:sz w:val="20"/>
         </w:rPr>
-        <w:t>IT Specialist - wynagrodzenie (Z7)</w:t>
+        <w:t>Cybersecurity / AI Act Specialist - wynagrodzenie (Z6)</w:t>
       </w:r>
       <w:r>
         <w:rPr>
           <w:color w:val="666666"/>
           <w:sz w:val="17"/>
         </w:rPr>
-        <w:t xml:space="preserve"> [1398 z 1500 znaków]</w:t>
+        <w:t xml:space="preserve"> [1357 z 1500 znaków]</w:t>
       </w:r>
     </w:p>
     <w:p>
@@ -9442,7 +9442,7 @@
         <w:rPr>
           <w:b w:val="0"/>
         </w:rPr>
-        <w:t>Koszt = 19 000,00 zł brutto/mc x narzut pracodawcy 1,205 = 22 895,00 zł/mc x 3,80 etatomiesiąca (miesięcy pracy w przeliczeniu na pełny etat) = 87 001,00 zł. Nakład w zadaniu Z7 wynosi 3 mc (M19-M21) x 60% x 1,00 etatu + 6 mc (M22-M27) x 1/3 x 1,00 etatu = 3,80 etatomiesiąca. Udziały czasu pracy w projekcie są stałe w trzech okresach i wpisane w zakresie czynności pracownika: w M19-M21 40% na zadanie Z6 i 60% na zadanie Z7 (Z7 wymaga wcześniejszego projektu sprzętu i pierwszych egzemplarzy platformy na M22), w M22-M27 po jednej trzeciej, bo równolegle trwają pipeline, generator eFTI i integracje testowe (Z6), oprogramowanie embedded (Z7) oraz logi i pomiary w Fazie A (Z9) o zbliżonym nakładzie, w M28-M30 100% na zadanie Z9. Suma udziałów w każdym miesiącu równa się 1,00 etatu, a w całym okresie M19-M30 12,00 etatomiesiąca. Dane referencyjne dotyczą umowy o pracę, kwot brutto miesięcznie. Źródło: No Fluff Jobs, „Rynek pracy IT 2025/2026”, s. 30, tabela „Wytwarzanie i rozwój oprogramowania”, kategoria Backend, poziom Senior: 18 500-25 000 zł (mediany dolnych i górnych widełek z ogłoszeń o pracy). Kategorię Backend przyjęto jako najbliższy odpowiednik zakresu stanowiska (oprogramowanie systemowe i potoki danych). Przyjęto 19 000 zł, czyli dolną część widełek Senior (500 zł powyżej dolnej granicy). Wynagrodzenie niezbędne do realizacji prac B+R. Forma zatrudnienia: umowa o pracę.</w:t>
+        <w:t>Koszt = 21 000,00 zł brutto/mc x narzut pracodawcy 1,205 = 25 305,00 zł/mc x 0,60 etatomiesiąca (miesięcy pracy w przeliczeniu na pełny etat) = 15 183,00 zł. Nakład w zadaniu Z6 wynosi 3 mc (M19-M21) x 40% x 0,25 etatu + 6 mc (M22-M27) x 20% x 0,25 etatu = 0,60 etatomiesiąca. Udziały czasu pracy w projekcie są stałe w trzech okresach i wpisane w zakresie czynności pracownika: w M19-M21 40% na zadanie Z6 i 60% na zadanie Z7 (Z7 wymaga wcześniejszego projektu sprzętu i pierwszych egzemplarzy platformy na M22), w M22-M27 20% na Z6 (podpis kryptograficzny i łańcuch integralności), 40% na Z7 (bezpieczny rozruch, podpisywanie aktualizacji, szyfrowanie transmisji) i 40% na Z9 (testy bezpieczeństwa w terenie, rola niezależnego ewaluatora), w M28-M30 100% na zadanie Z9. Suma udziałów w każdym miesiącu równa się 0,25 etatu, a w całym okresie M19-M30 3,00 etatomiesiąca. Dane referencyjne dotyczą umowy o pracę, kwot brutto miesięcznie. Źródło: No Fluff Jobs, „Rynek pracy IT 2025/2026”, s. 32, kategoria Security, poziom Senior: 20 000-28 000 zł, poziom Mid: 14 000-17 000 zł (mediany dolnych i górnych widełek z ogłoszeń o pracy); kategoria Security ogółem (s. 27): 17 000-23 000 zł. Przyjęto 21 000 zł, czyli dolną część widełek Senior (1 000 zł powyżej dolnej granicy). Wynagrodzenie niezbędne do realizacji prac B+R. Forma zatrudnienia: umowa o pracę.</w:t>
       </w:r>
     </w:p>
     <w:p>
@@ -9455,14 +9455,14 @@
           <w:b/>
           <w:sz w:val="20"/>
         </w:rPr>
-        <w:t>IoT Specialist - wynagrodzenie (Z7)</w:t>
+        <w:t>IT Specialist - wynagrodzenie (Z6)</w:t>
       </w:r>
       <w:r>
         <w:rPr>
           <w:color w:val="666666"/>
           <w:sz w:val="17"/>
         </w:rPr>
-        <w:t xml:space="preserve"> [1233 z 1500 znaków]</w:t>
+        <w:t xml:space="preserve"> [1398 z 1500 znaków]</w:t>
       </w:r>
     </w:p>
     <w:p>
@@ -9474,7 +9474,7 @@
         <w:rPr>
           <w:b w:val="0"/>
         </w:rPr>
-        <w:t>Koszt = 15 000,00 zł brutto/mc x narzut pracodawcy 1,205 = 18 075,00 zł/mc x 2,10 etatomiesiąca (miesięcy pracy w przeliczeniu na pełny etat) = 37 957,50 zł. Nakład w zadaniu Z7 wynosi 3 mc (M19-M21) x 60% x 0,50 etatu + 6 mc (M22-M27) x 40% x 0,50 etatu = 2,10 etatomiesiąca. Udziały czasu pracy w projekcie są stałe w trzech okresach i wpisane w zakresie czynności pracownika: w M19-M21 40% na zadanie Z6 i 60% na zadanie Z7 (Z7 wymaga wcześniejszego projektu sprzętu i pierwszych egzemplarzy platformy na M22), w M22-M27 20% na Z6 (czujnik drzwi, synchronizacja GPS, agregacja historii sygnałów), 40% na Z7 (architektura sprzętowa, obudowa, testy środowiskowe, pomiar opóźnienia) i 40% na Z9 (odbiór zestawów po montażu, kalibracja, rejestracja niezawodności w terenie), w M28-M30 100% na zadanie Z9. Suma udziałów w każdym miesiącu równa się 0,50 etatu, a w całym okresie M19-M30 6,00 etatomiesiąca. Stawkę brutto zweryfikowano na podstawie No Fluff Jobs „Rynek pracy IT 2025/2026”, kat. Embedded (s. 27/35: 13000-19000, Mid 12000-17000); pomocniczo Hays „Raport płacowy 2026”, R&amp;D Engineer 13/16/18 tys. (s. 38), 15000 w widełkach kat. Embedded. Wynagrodzenie niezbędne do realizacji prac B+R. Forma zatrudnienia: umowa o pracę.</w:t>
+        <w:t>Koszt = 19 000,00 zł brutto/mc x narzut pracodawcy 1,205 = 22 895,00 zł/mc x 3,20 etatomiesiąca (miesięcy pracy w przeliczeniu na pełny etat) = 73 264,00 zł. Nakład w zadaniu Z6 wynosi 3 mc (M19-M21) x 40% x 1,00 etatu + 6 mc (M22-M27) x 1/3 x 1,00 etatu = 3,20 etatomiesiąca. Udziały czasu pracy w projekcie są stałe w trzech okresach i wpisane w zakresie czynności pracownika: w M19-M21 40% na zadanie Z6 i 60% na zadanie Z7 (Z7 wymaga wcześniejszego projektu sprzętu i pierwszych egzemplarzy platformy na M22), w M22-M27 po jednej trzeciej, bo równolegle trwają pipeline, generator eFTI i integracje testowe (Z6), oprogramowanie embedded (Z7) oraz logi i pomiary w Fazie A (Z9) o zbliżonym nakładzie, w M28-M30 100% na zadanie Z9. Suma udziałów w każdym miesiącu równa się 1,00 etatu, a w całym okresie M19-M30 12,00 etatomiesiąca. Dane referencyjne dotyczą umowy o pracę, kwot brutto miesięcznie. Źródło: No Fluff Jobs, „Rynek pracy IT 2025/2026”, s. 30, tabela „Wytwarzanie i rozwój oprogramowania”, kategoria Backend, poziom Senior: 18 500-25 000 zł (mediany dolnych i górnych widełek z ogłoszeń o pracy). Kategorię Backend przyjęto jako najbliższy odpowiednik zakresu stanowiska (oprogramowanie systemowe i potoki danych). Przyjęto 19 000 zł, czyli dolną część widełek Senior (500 zł powyżej dolnej granicy). Wynagrodzenie niezbędne do realizacji prac B+R. Forma zatrudnienia: umowa o pracę.</w:t>
       </w:r>
     </w:p>
     <w:p>
@@ -9487,14 +9487,14 @@
           <w:b/>
           <w:sz w:val="20"/>
         </w:rPr>
-        <w:t>Specjalista ds. logistyki TSL - wynagrodzenie (Z7)</w:t>
+        <w:t>IoT Specialist - wynagrodzenie (Z6)</w:t>
       </w:r>
       <w:r>
         <w:rPr>
           <w:color w:val="666666"/>
           <w:sz w:val="17"/>
         </w:rPr>
-        <w:t xml:space="preserve"> [1102 z 1500 znaków]</w:t>
+        <w:t xml:space="preserve"> [1434 z 1500 znaków]</w:t>
       </w:r>
     </w:p>
     <w:p>
@@ -9506,15 +9506,7 @@
         <w:rPr>
           <w:b w:val="0"/>
         </w:rPr>
-        <w:t>Koszt = 10 000,00 zł brutto/mc x narzut pracodawcy 1,205 = 12 050,00 zł/mc x 1,80 etatomiesiąca (miesięcy pracy w przeliczeniu na pełny etat) = 21 690,00 zł. Nakład w zadaniu Z7 wynosi 3 mc (M19-M21) x 60% x 0,50 etatu + 6 mc (M22-M27) x 30% x 0,50 etatu = 1,80 etatomiesiąca. Udziały czasu pracy w projekcie są stałe w trzech okresach i wpisane w zakresie czynności pracownika: w M19-M21 40% na zadanie Z6 i 60% na zadanie Z7 (Z7 wymaga wcześniejszego projektu sprzętu i pierwszych egzemplarzy platformy na M22), w M22-M27 20% na Z6 (interpretacja pól eFTI, ocena treści PoL i PoC), 30% na Z7 (scenariusze i progi alertów, użyteczność w kabinie) i 50% na Z9 (inspekcje ground truth od Fazy A), w M28-M30 100% na zadanie Z9. Suma udziałów w każdym miesiącu równa się 0,50 etatu, a w całym okresie M19-M30 6,00 etatomiesiąca. Stawkę brutto zweryfikowano na podstawie Hays „Raport płacowy 2026”, sekcja Logistyka i zakupy, tabela Logistyka, „Specjalista ds. Logistyki” 8000/10000/13000 (s. 40), 10000 = wartość optymalna. Wynagrodzenie niezbędne do realizacji prac B+R. Forma zatrudnienia: umowa o pracę.</w:t>
-      </w:r>
-    </w:p>
-    <w:p>
-      <w:pPr>
-        <w:pStyle w:val="Heading3"/>
-      </w:pPr>
-      <w:r>
-        <w:t>Zadanie 9</w:t>
+        <w:t>Koszt = 15 000,00 zł brutto/mc x narzut pracodawcy 1,205 = 18 075,00 zł/mc x 1,20 etatomiesiąca (miesięcy pracy w przeliczeniu na pełny etat) = 21 690,00 zł. Nakład w zadaniu Z6 wynosi 3 mc (M19-M21) x 40% x 0,50 etatu + 6 mc (M22-M27) x 20% x 0,50 etatu = 1,20 etatomiesiąca. Udziały czasu pracy w projekcie są stałe w trzech okresach i wpisane w zakresie czynności pracownika: w M19-M21 40% na zadanie Z6 i 60% na zadanie Z7 (Z7 wymaga wcześniejszego projektu sprzętu i pierwszych egzemplarzy platformy na M22), w M22-M27 20% na Z6 (czujnik drzwi, synchronizacja GPS, agregacja historii sygnałów), 40% na Z7 (architektura sprzętowa, obudowa, testy środowiskowe, pomiar opóźnienia) i 40% na Z9 (odbiór zestawów po montażu, kalibracja, rejestracja niezawodności w terenie), w M28-M30 100% na zadanie Z9. Suma udziałów w każdym miesiącu równa się 0,50 etatu, a w całym okresie M19-M30 6,00 etatomiesiąca. Dane referencyjne dotyczą umowy o pracę, kwot brutto miesięcznie. Źródło: No Fluff Jobs, „Rynek pracy IT 2025/2026”, s. 35, kategoria Embedded, poziom Mid: 12 000-17 000 zł, poziom Senior: 17 000-22 000 zł (mediany dolnych i górnych widełek z ogłoszeń o pracy); kategoria Embedded ogółem (s. 27): 13 000-19 000 zł. Stanowisko obsadzane jest na poziomie Mid, dlatego przyjęto 15 000 zł, czyli górną połowę widełek Mid (środek widełek to 14 500 zł). Wynagrodzenie niezbędne do realizacji prac B+R. Forma zatrudnienia: umowa o pracę.</w:t>
       </w:r>
     </w:p>
     <w:p>
@@ -9527,14 +9519,14 @@
           <w:b/>
           <w:sz w:val="20"/>
         </w:rPr>
-        <w:t>AI Lead - wynagrodzenie (Z9)</w:t>
+        <w:t>Specjalista ds. logistyki TSL - wynagrodzenie (Z6)</w:t>
       </w:r>
       <w:r>
         <w:rPr>
           <w:color w:val="666666"/>
           <w:sz w:val="17"/>
         </w:rPr>
-        <w:t xml:space="preserve"> [1132 z 1500 znaków]</w:t>
+        <w:t xml:space="preserve"> [1259 z 1500 znaków]</w:t>
       </w:r>
     </w:p>
     <w:p>
@@ -9546,7 +9538,7 @@
         <w:rPr>
           <w:b w:val="0"/>
         </w:rPr>
-        <w:t>Koszt = 23 000,00 zł brutto/mc x narzut pracodawcy 1,205 = 27 715,00 zł/mc x 3,75 etatomiesiąca (miesięcy pracy w przeliczeniu na pełny etat) = 103 931,25 zł. Nakład w zadaniu Z9 wynosi 6 mc (M22-M27) x 1/3 x 0,75 etatu + 3 mc (M28-M30) x 100% x 0,75 etatu = 3,75 etatomiesiąca. Udziały czasu pracy w projekcie są stałe w trzech okresach i wpisane w zakresie czynności pracownika: w M19-M21 40% na zadanie Z6 i 60% na zadanie Z7 (Z7 wymaga wcześniejszego projektu sprzętu i pierwszych egzemplarzy platformy na M22), w M22-M27 po jednej trzeciej, bo równolegle trwają architektura i optymalizacja pipeline'u (Z6), strategia kompresji i walidacja modeli (Z7) oraz protokół KPI i dane terenowe (Z9) o zbliżonym nakładzie, w M28-M30 100% na zadanie Z9. Suma udziałów w każdym miesiącu równa się 0,75 etatu, a w całym okresie M19-M30 9,00 etatomiesiąca. Stawkę brutto zweryfikowano na podstawie No Fluff Jobs „Rynek pracy IT 2025/2026”, kat. AI poziom Senior, UoP 20000-29000 (s. 33; tabela zbiorcza 19000-24000, s. 27), 23000 w środku pasma senior/lead. Wynagrodzenie niezbędne do realizacji prac B+R. Forma zatrudnienia: umowa o pracę.</w:t>
+        <w:t>Koszt = 10 000,00 zł brutto/mc x narzut pracodawcy 1,205 = 12 050,00 zł/mc x 1,20 etatomiesiąca (miesięcy pracy w przeliczeniu na pełny etat) = 14 460,00 zł. Nakład w zadaniu Z6 wynosi 3 mc (M19-M21) x 40% x 0,50 etatu + 6 mc (M22-M27) x 20% x 0,50 etatu = 1,20 etatomiesiąca. Udziały czasu pracy w projekcie są stałe w trzech okresach i wpisane w zakresie czynności pracownika: w M19-M21 40% na zadanie Z6 i 60% na zadanie Z7 (Z7 wymaga wcześniejszego projektu sprzętu i pierwszych egzemplarzy platformy na M22), w M22-M27 20% na Z6 (interpretacja pól eFTI, ocena treści PoL i PoC), 30% na Z7 (scenariusze i progi alertów, użyteczność w kabinie) i 50% na Z9 (inspekcje ground truth od Fazy A), w M28-M30 100% na zadanie Z9. Suma udziałów w każdym miesiącu równa się 0,50 etatu, a w całym okresie M19-M30 6,00 etatomiesiąca. Dane referencyjne dotyczą kwot brutto miesięcznie za pełny etat (raport nie rozróżnia form zatrudnienia). Źródło: Hays Poland, „Raport płacowy 2026”, s. 40, sekcja Logistyka, stanowisko Specjalista ds. Logistyki: Min 8 000 zł, Opt 10 000 zł (najczęściej oferowane wynagrodzenie), Max 13 000 zł. Przyjęto 10 000 zł, czyli wartość najczęściej oferowaną. Wynagrodzenie niezbędne do realizacji prac B+R. Forma zatrudnienia: umowa o pracę.</w:t>
       </w:r>
     </w:p>
     <w:p>
@@ -9559,14 +9551,14 @@
           <w:b/>
           <w:sz w:val="20"/>
         </w:rPr>
-        <w:t>AI Senior Engineer - wynagrodzenie (Z9)</w:t>
+        <w:t>Backend/Full-Stack Developer - wynagrodzenie (Z6)</w:t>
       </w:r>
       <w:r>
         <w:rPr>
           <w:color w:val="666666"/>
           <w:sz w:val="17"/>
         </w:rPr>
-        <w:t xml:space="preserve"> [1169 z 1500 znaków]</w:t>
+        <w:t xml:space="preserve"> [852 z 1500 znaków]</w:t>
       </w:r>
     </w:p>
     <w:p>
@@ -9578,7 +9570,15 @@
         <w:rPr>
           <w:b w:val="0"/>
         </w:rPr>
-        <w:t>Koszt = 16 500,00 zł brutto/mc x narzut pracodawcy 1,205 = 19 882,50 zł/mc x 3,75 etatomiesiąca (miesięcy pracy w przeliczeniu na pełny etat) = 74 559,38 zł. Nakład w zadaniu Z9 wynosi 6 mc (M22-M27) x 1/3 x 0,75 etatu + 3 mc (M28-M30) x 100% x 0,75 etatu = 3,75 etatomiesiąca. Udziały czasu pracy w projekcie są stałe w trzech okresach i wpisane w zakresie czynności pracownika: w M19-M21 40% na zadanie Z6 i 60% na zadanie Z7 (Z7 wymaga wcześniejszego projektu sprzętu i pierwszych egzemplarzy platformy na M22), w M22-M27 po jednej trzeciej, bo równolegle trwają integracja change detection i raport ML (Z6), implementacja kompresji i optymalizacja na platformie (Z7) oraz diagnoza przesunięcia domeny i korekty (Z9) o zbliżonym nakładzie, w M28-M30 100% na zadanie Z9. Suma udziałów w każdym miesiącu równa się 0,75 etatu, a w całym okresie M19-M30 9,00 etatomiesiąca. Stawkę brutto zweryfikowano na podstawie No Fluff Jobs „Rynek pracy IT 2025/2026”, kat. AI (s. 33): Senior 20000-29000, Mid 14000-21000, 16500 w paśmie Mid, poniżej dolnej mediany Senior (założenie konserwatywne). Wynagrodzenie niezbędne do realizacji prac B+R. Forma zatrudnienia: umowa o pracę.</w:t>
+        <w:t>Koszt = 18 000,00 zł brutto/mc x narzut pracodawcy 1,205 = 21 690,00 zł/mc x 1,0 etatu x 9 mc (M19-M27, zadanie Z6) = 195 210,00 zł. Liczba miesięcy wynika z zakresu prac w zadaniu: w Z6 integracje testowe, potok danych i test zgodności eFTI w czasie trwania zadania. Dane referencyjne dotyczą umowy o pracę, kwot brutto miesięcznie. Źródło: No Fluff Jobs, „Rynek pracy IT 2025/2026”, s. 30, tabela „Wytwarzanie i rozwój oprogramowania”, kategorie Backend i Fullstack (widełki identyczne w obu kategoriach): poziom Mid 13 000-18 000 zł, poziom Senior 18 500-25 000 zł (mediany dolnych i górnych widełek z ogłoszeń o pracy). Stanowisko obsadzane jest na poziomie Mid, dlatego przyjęto 18 000 zł, czyli górną granicę widełek Mid, o 500 zł niższą niż dolna granica Senior. Wynagrodzenie niezbędne do realizacji prac B+R. Forma zatrudnienia: umowa o pracę.</w:t>
+      </w:r>
+    </w:p>
+    <w:p>
+      <w:pPr>
+        <w:pStyle w:val="Heading3"/>
+      </w:pPr>
+      <w:r>
+        <w:t>Zadanie 7</w:t>
       </w:r>
     </w:p>
     <w:p>
@@ -9591,14 +9591,14 @@
           <w:b/>
           <w:sz w:val="20"/>
         </w:rPr>
-        <w:t>Cybersecurity / AI Act Specialist - wynagrodzenie (Z9)</w:t>
+        <w:t>AI Lead - wynagrodzenie (Z7)</w:t>
       </w:r>
       <w:r>
         <w:rPr>
           <w:color w:val="666666"/>
           <w:sz w:val="17"/>
         </w:rPr>
-        <w:t xml:space="preserve"> [1154 z 1500 znaków]</w:t>
+        <w:t xml:space="preserve"> [1416 z 1500 znaków]</w:t>
       </w:r>
     </w:p>
     <w:p>
@@ -9610,7 +9610,7 @@
         <w:rPr>
           <w:b w:val="0"/>
         </w:rPr>
-        <w:t>Koszt = 21 000,00 zł brutto/mc x narzut pracodawcy 1,205 = 25 305,00 zł/mc x 1,35 etatomiesiąca (miesięcy pracy w przeliczeniu na pełny etat) = 34 161,75 zł. Nakład w zadaniu Z9 wynosi 6 mc (M22-M27) x 40% x 0,25 etatu + 3 mc (M28-M30) x 100% x 0,25 etatu = 1,35 etatomiesiąca. Udziały czasu pracy w projekcie są stałe w trzech okresach i wpisane w zakresie czynności pracownika: w M19-M21 40% na zadanie Z6 i 60% na zadanie Z7 (Z7 wymaga wcześniejszego projektu sprzętu i pierwszych egzemplarzy platformy na M22), w M22-M27 20% na Z6 (podpis kryptograficzny i łańcuch integralności), 40% na Z7 (bezpieczny rozruch, podpisywanie aktualizacji, szyfrowanie transmisji) i 40% na Z9 (testy bezpieczeństwa w terenie, rola niezależnego ewaluatora), w M28-M30 100% na zadanie Z9. Suma udziałów w każdym miesiącu równa się 0,25 etatu, a w całym okresie M19-M30 3,00 etatomiesiąca. Stawkę brutto zweryfikowano na podstawie No Fluff Jobs „Rynek pracy IT 2025/2026”, kat. Security poziom Senior, UoP 20000-28000 (s. 32; tabela zbiorcza 17000-23000, s. 27), 21000 w widełkach senior. Wynagrodzenie niezbędne do realizacji prac B+R. Forma zatrudnienia: umowa o pracę.</w:t>
+        <w:t>Koszt = 23 000,00 zł brutto/mc x narzut pracodawcy 1,205 = 27 715,00 zł/mc x 2,85 etatomiesiąca (miesięcy pracy w przeliczeniu na pełny etat) = 78 987,75 zł. Nakład w zadaniu Z7 wynosi 3 mc (M19-M21) x 60% x 0,75 etatu + 6 mc (M22-M27) x 1/3 x 0,75 etatu = 2,85 etatomiesiąca. Udziały czasu pracy w projekcie są stałe w trzech okresach i wpisane w zakresie czynności pracownika: w M19-M21 40% na zadanie Z6 i 60% na zadanie Z7 (Z7 wymaga wcześniejszego projektu sprzętu i pierwszych egzemplarzy platformy na M22), w M22-M27 po jednej trzeciej, bo równolegle trwają architektura i optymalizacja pipeline'u (Z6), strategia kompresji i walidacja modeli (Z7) oraz protokół KPI i dane terenowe (Z9) o zbliżonym nakładzie, w M28-M30 100% na zadanie Z9. Suma udziałów w każdym miesiącu równa się 0,75 etatu, a w całym okresie M19-M30 9,00 etatomiesiąca. Dane referencyjne dotyczą umowy o pracę, kwot brutto miesięcznie. Źródło: No Fluff Jobs, „Rynek pracy IT 2025/2026”, s. 33, kategoria AI, poziom Senior: 20 000-29 000 zł (mediany dolnych i górnych widełek z ogłoszeń o pracy); kategoria AI ogółem (s. 27): 19 000-24 000 zł. W raporcie nie ma osobnego poziomu Lead, więc stanowisko odniesiono do poziomu Senior. Przyjęto 23 000 zł, czyli dolną połowę widełek Senior (środek widełek to 24 500 zł) i górną część widełek kategorii AI ogółem. Wynagrodzenie niezbędne do realizacji prac B+R. Forma zatrudnienia: umowa o pracę.</w:t>
       </w:r>
     </w:p>
     <w:p>
@@ -9623,14 +9623,14 @@
           <w:b/>
           <w:sz w:val="20"/>
         </w:rPr>
-        <w:t>IT Specialist - wynagrodzenie (Z9)</w:t>
+        <w:t>AI Senior Engineer - wynagrodzenie (Z7)</w:t>
       </w:r>
       <w:r>
         <w:rPr>
           <w:color w:val="666666"/>
           <w:sz w:val="17"/>
         </w:rPr>
-        <w:t xml:space="preserve"> [1400 z 1500 znaków]</w:t>
+        <w:t xml:space="preserve"> [1383 z 1500 znaków]</w:t>
       </w:r>
     </w:p>
     <w:p>
@@ -9642,7 +9642,7 @@
         <w:rPr>
           <w:b w:val="0"/>
         </w:rPr>
-        <w:t>Koszt = 19 000,00 zł brutto/mc x narzut pracodawcy 1,205 = 22 895,00 zł/mc x 5,00 etatomiesiąca (miesięcy pracy w przeliczeniu na pełny etat) = 114 475,00 zł. Nakład w zadaniu Z9 wynosi 6 mc (M22-M27) x 1/3 x 1,00 etatu + 3 mc (M28-M30) x 100% x 1,00 etatu = 5,00 etatomiesiąca. Udziały czasu pracy w projekcie są stałe w trzech okresach i wpisane w zakresie czynności pracownika: w M19-M21 40% na zadanie Z6 i 60% na zadanie Z7 (Z7 wymaga wcześniejszego projektu sprzętu i pierwszych egzemplarzy platformy na M22), w M22-M27 po jednej trzeciej, bo równolegle trwają pipeline, generator eFTI i integracje testowe (Z6), oprogramowanie embedded (Z7) oraz logi i pomiary w Fazie A (Z9) o zbliżonym nakładzie, w M28-M30 100% na zadanie Z9. Suma udziałów w każdym miesiącu równa się 1,00 etatu, a w całym okresie M19-M30 12,00 etatomiesiąca. Dane referencyjne dotyczą umowy o pracę, kwot brutto miesięcznie. Źródło: No Fluff Jobs, „Rynek pracy IT 2025/2026”, s. 30, tabela „Wytwarzanie i rozwój oprogramowania”, kategoria Backend, poziom Senior: 18 500-25 000 zł (mediany dolnych i górnych widełek z ogłoszeń o pracy). Kategorię Backend przyjęto jako najbliższy odpowiednik zakresu stanowiska (oprogramowanie systemowe i potoki danych). Przyjęto 19 000 zł, czyli dolną część widełek Senior (500 zł powyżej dolnej granicy). Wynagrodzenie niezbędne do realizacji prac B+R. Forma zatrudnienia: umowa o pracę.</w:t>
+        <w:t>Koszt = 16 500,00 zł brutto/mc x narzut pracodawcy 1,205 = 19 882,50 zł/mc x 2,85 etatomiesiąca (miesięcy pracy w przeliczeniu na pełny etat) = 56 665,12 zł. Nakład w zadaniu Z7 wynosi 3 mc (M19-M21) x 60% x 0,75 etatu + 6 mc (M22-M27) x 1/3 x 0,75 etatu = 2,85 etatomiesiąca. Udziały czasu pracy w projekcie są stałe w trzech okresach i wpisane w zakresie czynności pracownika: w M19-M21 40% na zadanie Z6 i 60% na zadanie Z7 (Z7 wymaga wcześniejszego projektu sprzętu i pierwszych egzemplarzy platformy na M22), w M22-M27 po jednej trzeciej, bo równolegle trwają integracja change detection i raport ML (Z6), implementacja kompresji i optymalizacja na platformie (Z7) oraz diagnoza przesunięcia domeny i korekty (Z9) o zbliżonym nakładzie, w M28-M30 100% na zadanie Z9. Suma udziałów w każdym miesiącu równa się 0,75 etatu, a w całym okresie M19-M30 9,00 etatomiesiąca. Dane referencyjne dotyczą umowy o pracę, kwot brutto miesięcznie. Źródło: No Fluff Jobs, „Rynek pracy IT 2025/2026”, s. 33, kategoria AI, poziom Mid: 14 000-21 000 zł, poziom Senior: 20 000-29 000 zł (mediany dolnych i górnych widełek z ogłoszeń o pracy). Stanowisko obsadzane jest na poziomie Mid, dlatego przyjęto 16 500 zł, czyli dolną połowę widełek Mid (środek widełek to 17 500 zł), 3 500 zł poniżej dolnej granicy Senior. Wynagrodzenie niezbędne do realizacji prac B+R. Forma zatrudnienia: umowa o pracę.</w:t>
       </w:r>
     </w:p>
     <w:p>
@@ -9655,14 +9655,14 @@
           <w:b/>
           <w:sz w:val="20"/>
         </w:rPr>
-        <w:t>IoT Specialist - wynagrodzenie (Z9)</w:t>
+        <w:t>Cybersecurity / AI Act Specialist - wynagrodzenie (Z7)</w:t>
       </w:r>
       <w:r>
         <w:rPr>
           <w:color w:val="666666"/>
           <w:sz w:val="17"/>
         </w:rPr>
-        <w:t xml:space="preserve"> [1234 z 1500 znaków]</w:t>
+        <w:t xml:space="preserve"> [1357 z 1500 znaków]</w:t>
       </w:r>
     </w:p>
     <w:p>
@@ -9674,7 +9674,7 @@
         <w:rPr>
           <w:b w:val="0"/>
         </w:rPr>
-        <w:t>Koszt = 15 000,00 zł brutto/mc x narzut pracodawcy 1,205 = 18 075,00 zł/mc x 2,70 etatomiesiąca (miesięcy pracy w przeliczeniu na pełny etat) = 48 802,50 zł. Nakład w zadaniu Z9 wynosi 6 mc (M22-M27) x 40% x 0,50 etatu + 3 mc (M28-M30) x 100% x 0,50 etatu = 2,70 etatomiesiąca. Udziały czasu pracy w projekcie są stałe w trzech okresach i wpisane w zakresie czynności pracownika: w M19-M21 40% na zadanie Z6 i 60% na zadanie Z7 (Z7 wymaga wcześniejszego projektu sprzętu i pierwszych egzemplarzy platformy na M22), w M22-M27 20% na Z6 (czujnik drzwi, synchronizacja GPS, agregacja historii sygnałów), 40% na Z7 (architektura sprzętowa, obudowa, testy środowiskowe, pomiar opóźnienia) i 40% na Z9 (odbiór zestawów po montażu, kalibracja, rejestracja niezawodności w terenie), w M28-M30 100% na zadanie Z9. Suma udziałów w każdym miesiącu równa się 0,50 etatu, a w całym okresie M19-M30 6,00 etatomiesiąca. Stawkę brutto zweryfikowano na podstawie No Fluff Jobs „Rynek pracy IT 2025/2026”, kat. Embedded (s. 27/35: 13000-19000, Mid 12000-17000); pomocniczo Hays „Raport płacowy 2026”, R&amp;D Engineer 13/16/18 tys. (s. 38), 15000 w widełkach kat. Embedded. Wynagrodzenie niezbędne do realizacji prac B+R. Forma zatrudnienia: umowa o pracę.</w:t>
+        <w:t>Koszt = 21 000,00 zł brutto/mc x narzut pracodawcy 1,205 = 25 305,00 zł/mc x 1,05 etatomiesiąca (miesięcy pracy w przeliczeniu na pełny etat) = 26 570,25 zł. Nakład w zadaniu Z7 wynosi 3 mc (M19-M21) x 60% x 0,25 etatu + 6 mc (M22-M27) x 40% x 0,25 etatu = 1,05 etatomiesiąca. Udziały czasu pracy w projekcie są stałe w trzech okresach i wpisane w zakresie czynności pracownika: w M19-M21 40% na zadanie Z6 i 60% na zadanie Z7 (Z7 wymaga wcześniejszego projektu sprzętu i pierwszych egzemplarzy platformy na M22), w M22-M27 20% na Z6 (podpis kryptograficzny i łańcuch integralności), 40% na Z7 (bezpieczny rozruch, podpisywanie aktualizacji, szyfrowanie transmisji) i 40% na Z9 (testy bezpieczeństwa w terenie, rola niezależnego ewaluatora), w M28-M30 100% na zadanie Z9. Suma udziałów w każdym miesiącu równa się 0,25 etatu, a w całym okresie M19-M30 3,00 etatomiesiąca. Dane referencyjne dotyczą umowy o pracę, kwot brutto miesięcznie. Źródło: No Fluff Jobs, „Rynek pracy IT 2025/2026”, s. 32, kategoria Security, poziom Senior: 20 000-28 000 zł, poziom Mid: 14 000-17 000 zł (mediany dolnych i górnych widełek z ogłoszeń o pracy); kategoria Security ogółem (s. 27): 17 000-23 000 zł. Przyjęto 21 000 zł, czyli dolną część widełek Senior (1 000 zł powyżej dolnej granicy). Wynagrodzenie niezbędne do realizacji prac B+R. Forma zatrudnienia: umowa o pracę.</w:t>
       </w:r>
     </w:p>
     <w:p>
@@ -9687,14 +9687,14 @@
           <w:b/>
           <w:sz w:val="20"/>
         </w:rPr>
-        <w:t>Specjalista ds. logistyki TSL - wynagrodzenie (Z9)</w:t>
+        <w:t>IT Specialist - wynagrodzenie (Z7)</w:t>
       </w:r>
       <w:r>
         <w:rPr>
           <w:color w:val="666666"/>
           <w:sz w:val="17"/>
         </w:rPr>
-        <w:t xml:space="preserve"> [1103 z 1500 znaków]</w:t>
+        <w:t xml:space="preserve"> [1398 z 1500 znaków]</w:t>
       </w:r>
     </w:p>
     <w:p>
@@ -9706,7 +9706,271 @@
         <w:rPr>
           <w:b w:val="0"/>
         </w:rPr>
-        <w:t>Koszt = 10 000,00 zł brutto/mc x narzut pracodawcy 1,205 = 12 050,00 zł/mc x 3,00 etatomiesiąca (miesięcy pracy w przeliczeniu na pełny etat) = 36 150,00 zł. Nakład w zadaniu Z9 wynosi 6 mc (M22-M27) x 50% x 0,50 etatu + 3 mc (M28-M30) x 100% x 0,50 etatu = 3,00 etatomiesiąca. Udziały czasu pracy w projekcie są stałe w trzech okresach i wpisane w zakresie czynności pracownika: w M19-M21 40% na zadanie Z6 i 60% na zadanie Z7 (Z7 wymaga wcześniejszego projektu sprzętu i pierwszych egzemplarzy platformy na M22), w M22-M27 20% na Z6 (interpretacja pól eFTI, ocena treści PoL i PoC), 30% na Z7 (scenariusze i progi alertów, użyteczność w kabinie) i 50% na Z9 (inspekcje ground truth od Fazy A), w M28-M30 100% na zadanie Z9. Suma udziałów w każdym miesiącu równa się 0,50 etatu, a w całym okresie M19-M30 6,00 etatomiesiąca. Stawkę brutto zweryfikowano na podstawie Hays „Raport płacowy 2026”, sekcja Logistyka i zakupy, tabela Logistyka, „Specjalista ds. Logistyki” 8000/10000/13000 (s. 40), 10000 = wartość optymalna. Wynagrodzenie niezbędne do realizacji prac B+R. Forma zatrudnienia: umowa o pracę.</w:t>
+        <w:t>Koszt = 19 000,00 zł brutto/mc x narzut pracodawcy 1,205 = 22 895,00 zł/mc x 3,80 etatomiesiąca (miesięcy pracy w przeliczeniu na pełny etat) = 87 001,00 zł. Nakład w zadaniu Z7 wynosi 3 mc (M19-M21) x 60% x 1,00 etatu + 6 mc (M22-M27) x 1/3 x 1,00 etatu = 3,80 etatomiesiąca. Udziały czasu pracy w projekcie są stałe w trzech okresach i wpisane w zakresie czynności pracownika: w M19-M21 40% na zadanie Z6 i 60% na zadanie Z7 (Z7 wymaga wcześniejszego projektu sprzętu i pierwszych egzemplarzy platformy na M22), w M22-M27 po jednej trzeciej, bo równolegle trwają pipeline, generator eFTI i integracje testowe (Z6), oprogramowanie embedded (Z7) oraz logi i pomiary w Fazie A (Z9) o zbliżonym nakładzie, w M28-M30 100% na zadanie Z9. Suma udziałów w każdym miesiącu równa się 1,00 etatu, a w całym okresie M19-M30 12,00 etatomiesiąca. Dane referencyjne dotyczą umowy o pracę, kwot brutto miesięcznie. Źródło: No Fluff Jobs, „Rynek pracy IT 2025/2026”, s. 30, tabela „Wytwarzanie i rozwój oprogramowania”, kategoria Backend, poziom Senior: 18 500-25 000 zł (mediany dolnych i górnych widełek z ogłoszeń o pracy). Kategorię Backend przyjęto jako najbliższy odpowiednik zakresu stanowiska (oprogramowanie systemowe i potoki danych). Przyjęto 19 000 zł, czyli dolną część widełek Senior (500 zł powyżej dolnej granicy). Wynagrodzenie niezbędne do realizacji prac B+R. Forma zatrudnienia: umowa o pracę.</w:t>
+      </w:r>
+    </w:p>
+    <w:p>
+      <w:pPr>
+        <w:keepNext/>
+        <w:spacing w:before="160" w:after="40"/>
+      </w:pPr>
+      <w:r>
+        <w:rPr>
+          <w:b/>
+          <w:sz w:val="20"/>
+        </w:rPr>
+        <w:t>IoT Specialist - wynagrodzenie (Z7)</w:t>
+      </w:r>
+      <w:r>
+        <w:rPr>
+          <w:color w:val="666666"/>
+          <w:sz w:val="17"/>
+        </w:rPr>
+        <w:t xml:space="preserve"> [1434 z 1500 znaków]</w:t>
+      </w:r>
+    </w:p>
+    <w:p>
+      <w:pPr>
+        <w:spacing w:after="60"/>
+        <w:shd w:val="clear" w:color="auto" w:fill="F3F3F3"/>
+      </w:pPr>
+      <w:r>
+        <w:rPr>
+          <w:b w:val="0"/>
+        </w:rPr>
+        <w:t>Koszt = 15 000,00 zł brutto/mc x narzut pracodawcy 1,205 = 18 075,00 zł/mc x 2,10 etatomiesiąca (miesięcy pracy w przeliczeniu na pełny etat) = 37 957,50 zł. Nakład w zadaniu Z7 wynosi 3 mc (M19-M21) x 60% x 0,50 etatu + 6 mc (M22-M27) x 40% x 0,50 etatu = 2,10 etatomiesiąca. Udziały czasu pracy w projekcie są stałe w trzech okresach i wpisane w zakresie czynności pracownika: w M19-M21 40% na zadanie Z6 i 60% na zadanie Z7 (Z7 wymaga wcześniejszego projektu sprzętu i pierwszych egzemplarzy platformy na M22), w M22-M27 20% na Z6 (czujnik drzwi, synchronizacja GPS, agregacja historii sygnałów), 40% na Z7 (architektura sprzętowa, obudowa, testy środowiskowe, pomiar opóźnienia) i 40% na Z9 (odbiór zestawów po montażu, kalibracja, rejestracja niezawodności w terenie), w M28-M30 100% na zadanie Z9. Suma udziałów w każdym miesiącu równa się 0,50 etatu, a w całym okresie M19-M30 6,00 etatomiesiąca. Dane referencyjne dotyczą umowy o pracę, kwot brutto miesięcznie. Źródło: No Fluff Jobs, „Rynek pracy IT 2025/2026”, s. 35, kategoria Embedded, poziom Mid: 12 000-17 000 zł, poziom Senior: 17 000-22 000 zł (mediany dolnych i górnych widełek z ogłoszeń o pracy); kategoria Embedded ogółem (s. 27): 13 000-19 000 zł. Stanowisko obsadzane jest na poziomie Mid, dlatego przyjęto 15 000 zł, czyli górną połowę widełek Mid (środek widełek to 14 500 zł). Wynagrodzenie niezbędne do realizacji prac B+R. Forma zatrudnienia: umowa o pracę.</w:t>
+      </w:r>
+    </w:p>
+    <w:p>
+      <w:pPr>
+        <w:keepNext/>
+        <w:spacing w:before="160" w:after="40"/>
+      </w:pPr>
+      <w:r>
+        <w:rPr>
+          <w:b/>
+          <w:sz w:val="20"/>
+        </w:rPr>
+        <w:t>Specjalista ds. logistyki TSL - wynagrodzenie (Z7)</w:t>
+      </w:r>
+      <w:r>
+        <w:rPr>
+          <w:color w:val="666666"/>
+          <w:sz w:val="17"/>
+        </w:rPr>
+        <w:t xml:space="preserve"> [1259 z 1500 znaków]</w:t>
+      </w:r>
+    </w:p>
+    <w:p>
+      <w:pPr>
+        <w:spacing w:after="60"/>
+        <w:shd w:val="clear" w:color="auto" w:fill="F3F3F3"/>
+      </w:pPr>
+      <w:r>
+        <w:rPr>
+          <w:b w:val="0"/>
+        </w:rPr>
+        <w:t>Koszt = 10 000,00 zł brutto/mc x narzut pracodawcy 1,205 = 12 050,00 zł/mc x 1,80 etatomiesiąca (miesięcy pracy w przeliczeniu na pełny etat) = 21 690,00 zł. Nakład w zadaniu Z7 wynosi 3 mc (M19-M21) x 60% x 0,50 etatu + 6 mc (M22-M27) x 30% x 0,50 etatu = 1,80 etatomiesiąca. Udziały czasu pracy w projekcie są stałe w trzech okresach i wpisane w zakresie czynności pracownika: w M19-M21 40% na zadanie Z6 i 60% na zadanie Z7 (Z7 wymaga wcześniejszego projektu sprzętu i pierwszych egzemplarzy platformy na M22), w M22-M27 20% na Z6 (interpretacja pól eFTI, ocena treści PoL i PoC), 30% na Z7 (scenariusze i progi alertów, użyteczność w kabinie) i 50% na Z9 (inspekcje ground truth od Fazy A), w M28-M30 100% na zadanie Z9. Suma udziałów w każdym miesiącu równa się 0,50 etatu, a w całym okresie M19-M30 6,00 etatomiesiąca. Dane referencyjne dotyczą kwot brutto miesięcznie za pełny etat (raport nie rozróżnia form zatrudnienia). Źródło: Hays Poland, „Raport płacowy 2026”, s. 40, sekcja Logistyka, stanowisko Specjalista ds. Logistyki: Min 8 000 zł, Opt 10 000 zł (najczęściej oferowane wynagrodzenie), Max 13 000 zł. Przyjęto 10 000 zł, czyli wartość najczęściej oferowaną. Wynagrodzenie niezbędne do realizacji prac B+R. Forma zatrudnienia: umowa o pracę.</w:t>
+      </w:r>
+    </w:p>
+    <w:p>
+      <w:pPr>
+        <w:pStyle w:val="Heading3"/>
+      </w:pPr>
+      <w:r>
+        <w:t>Zadanie 9</w:t>
+      </w:r>
+    </w:p>
+    <w:p>
+      <w:pPr>
+        <w:keepNext/>
+        <w:spacing w:before="160" w:after="40"/>
+      </w:pPr>
+      <w:r>
+        <w:rPr>
+          <w:b/>
+          <w:sz w:val="20"/>
+        </w:rPr>
+        <w:t>AI Lead - wynagrodzenie (Z9)</w:t>
+      </w:r>
+      <w:r>
+        <w:rPr>
+          <w:color w:val="666666"/>
+          <w:sz w:val="17"/>
+        </w:rPr>
+        <w:t xml:space="preserve"> [1418 z 1500 znaków]</w:t>
+      </w:r>
+    </w:p>
+    <w:p>
+      <w:pPr>
+        <w:spacing w:after="60"/>
+        <w:shd w:val="clear" w:color="auto" w:fill="F3F3F3"/>
+      </w:pPr>
+      <w:r>
+        <w:rPr>
+          <w:b w:val="0"/>
+        </w:rPr>
+        <w:t>Koszt = 23 000,00 zł brutto/mc x narzut pracodawcy 1,205 = 27 715,00 zł/mc x 3,75 etatomiesiąca (miesięcy pracy w przeliczeniu na pełny etat) = 103 931,25 zł. Nakład w zadaniu Z9 wynosi 6 mc (M22-M27) x 1/3 x 0,75 etatu + 3 mc (M28-M30) x 100% x 0,75 etatu = 3,75 etatomiesiąca. Udziały czasu pracy w projekcie są stałe w trzech okresach i wpisane w zakresie czynności pracownika: w M19-M21 40% na zadanie Z6 i 60% na zadanie Z7 (Z7 wymaga wcześniejszego projektu sprzętu i pierwszych egzemplarzy platformy na M22), w M22-M27 po jednej trzeciej, bo równolegle trwają architektura i optymalizacja pipeline'u (Z6), strategia kompresji i walidacja modeli (Z7) oraz protokół KPI i dane terenowe (Z9) o zbliżonym nakładzie, w M28-M30 100% na zadanie Z9. Suma udziałów w każdym miesiącu równa się 0,75 etatu, a w całym okresie M19-M30 9,00 etatomiesiąca. Dane referencyjne dotyczą umowy o pracę, kwot brutto miesięcznie. Źródło: No Fluff Jobs, „Rynek pracy IT 2025/2026”, s. 33, kategoria AI, poziom Senior: 20 000-29 000 zł (mediany dolnych i górnych widełek z ogłoszeń o pracy); kategoria AI ogółem (s. 27): 19 000-24 000 zł. W raporcie nie ma osobnego poziomu Lead, więc stanowisko odniesiono do poziomu Senior. Przyjęto 23 000 zł, czyli dolną połowę widełek Senior (środek widełek to 24 500 zł) i górną część widełek kategorii AI ogółem. Wynagrodzenie niezbędne do realizacji prac B+R. Forma zatrudnienia: umowa o pracę.</w:t>
+      </w:r>
+    </w:p>
+    <w:p>
+      <w:pPr>
+        <w:keepNext/>
+        <w:spacing w:before="160" w:after="40"/>
+      </w:pPr>
+      <w:r>
+        <w:rPr>
+          <w:b/>
+          <w:sz w:val="20"/>
+        </w:rPr>
+        <w:t>AI Senior Engineer - wynagrodzenie (Z9)</w:t>
+      </w:r>
+      <w:r>
+        <w:rPr>
+          <w:color w:val="666666"/>
+          <w:sz w:val="17"/>
+        </w:rPr>
+        <w:t xml:space="preserve"> [1384 z 1500 znaków]</w:t>
+      </w:r>
+    </w:p>
+    <w:p>
+      <w:pPr>
+        <w:spacing w:after="60"/>
+        <w:shd w:val="clear" w:color="auto" w:fill="F3F3F3"/>
+      </w:pPr>
+      <w:r>
+        <w:rPr>
+          <w:b w:val="0"/>
+        </w:rPr>
+        <w:t>Koszt = 16 500,00 zł brutto/mc x narzut pracodawcy 1,205 = 19 882,50 zł/mc x 3,75 etatomiesiąca (miesięcy pracy w przeliczeniu na pełny etat) = 74 559,38 zł. Nakład w zadaniu Z9 wynosi 6 mc (M22-M27) x 1/3 x 0,75 etatu + 3 mc (M28-M30) x 100% x 0,75 etatu = 3,75 etatomiesiąca. Udziały czasu pracy w projekcie są stałe w trzech okresach i wpisane w zakresie czynności pracownika: w M19-M21 40% na zadanie Z6 i 60% na zadanie Z7 (Z7 wymaga wcześniejszego projektu sprzętu i pierwszych egzemplarzy platformy na M22), w M22-M27 po jednej trzeciej, bo równolegle trwają integracja change detection i raport ML (Z6), implementacja kompresji i optymalizacja na platformie (Z7) oraz diagnoza przesunięcia domeny i korekty (Z9) o zbliżonym nakładzie, w M28-M30 100% na zadanie Z9. Suma udziałów w każdym miesiącu równa się 0,75 etatu, a w całym okresie M19-M30 9,00 etatomiesiąca. Dane referencyjne dotyczą umowy o pracę, kwot brutto miesięcznie. Źródło: No Fluff Jobs, „Rynek pracy IT 2025/2026”, s. 33, kategoria AI, poziom Mid: 14 000-21 000 zł, poziom Senior: 20 000-29 000 zł (mediany dolnych i górnych widełek z ogłoszeń o pracy). Stanowisko obsadzane jest na poziomie Mid, dlatego przyjęto 16 500 zł, czyli dolną połowę widełek Mid (środek widełek to 17 500 zł), 3 500 zł poniżej dolnej granicy Senior. Wynagrodzenie niezbędne do realizacji prac B+R. Forma zatrudnienia: umowa o pracę.</w:t>
+      </w:r>
+    </w:p>
+    <w:p>
+      <w:pPr>
+        <w:keepNext/>
+        <w:spacing w:before="160" w:after="40"/>
+      </w:pPr>
+      <w:r>
+        <w:rPr>
+          <w:b/>
+          <w:sz w:val="20"/>
+        </w:rPr>
+        <w:t>Cybersecurity / AI Act Specialist - wynagrodzenie (Z9)</w:t>
+      </w:r>
+      <w:r>
+        <w:rPr>
+          <w:color w:val="666666"/>
+          <w:sz w:val="17"/>
+        </w:rPr>
+        <w:t xml:space="preserve"> [1358 z 1500 znaków]</w:t>
+      </w:r>
+    </w:p>
+    <w:p>
+      <w:pPr>
+        <w:spacing w:after="60"/>
+        <w:shd w:val="clear" w:color="auto" w:fill="F3F3F3"/>
+      </w:pPr>
+      <w:r>
+        <w:rPr>
+          <w:b w:val="0"/>
+        </w:rPr>
+        <w:t>Koszt = 21 000,00 zł brutto/mc x narzut pracodawcy 1,205 = 25 305,00 zł/mc x 1,35 etatomiesiąca (miesięcy pracy w przeliczeniu na pełny etat) = 34 161,75 zł. Nakład w zadaniu Z9 wynosi 6 mc (M22-M27) x 40% x 0,25 etatu + 3 mc (M28-M30) x 100% x 0,25 etatu = 1,35 etatomiesiąca. Udziały czasu pracy w projekcie są stałe w trzech okresach i wpisane w zakresie czynności pracownika: w M19-M21 40% na zadanie Z6 i 60% na zadanie Z7 (Z7 wymaga wcześniejszego projektu sprzętu i pierwszych egzemplarzy platformy na M22), w M22-M27 20% na Z6 (podpis kryptograficzny i łańcuch integralności), 40% na Z7 (bezpieczny rozruch, podpisywanie aktualizacji, szyfrowanie transmisji) i 40% na Z9 (testy bezpieczeństwa w terenie, rola niezależnego ewaluatora), w M28-M30 100% na zadanie Z9. Suma udziałów w każdym miesiącu równa się 0,25 etatu, a w całym okresie M19-M30 3,00 etatomiesiąca. Dane referencyjne dotyczą umowy o pracę, kwot brutto miesięcznie. Źródło: No Fluff Jobs, „Rynek pracy IT 2025/2026”, s. 32, kategoria Security, poziom Senior: 20 000-28 000 zł, poziom Mid: 14 000-17 000 zł (mediany dolnych i górnych widełek z ogłoszeń o pracy); kategoria Security ogółem (s. 27): 17 000-23 000 zł. Przyjęto 21 000 zł, czyli dolną część widełek Senior (1 000 zł powyżej dolnej granicy). Wynagrodzenie niezbędne do realizacji prac B+R. Forma zatrudnienia: umowa o pracę.</w:t>
+      </w:r>
+    </w:p>
+    <w:p>
+      <w:pPr>
+        <w:keepNext/>
+        <w:spacing w:before="160" w:after="40"/>
+      </w:pPr>
+      <w:r>
+        <w:rPr>
+          <w:b/>
+          <w:sz w:val="20"/>
+        </w:rPr>
+        <w:t>IT Specialist - wynagrodzenie (Z9)</w:t>
+      </w:r>
+      <w:r>
+        <w:rPr>
+          <w:color w:val="666666"/>
+          <w:sz w:val="17"/>
+        </w:rPr>
+        <w:t xml:space="preserve"> [1400 z 1500 znaków]</w:t>
+      </w:r>
+    </w:p>
+    <w:p>
+      <w:pPr>
+        <w:spacing w:after="60"/>
+        <w:shd w:val="clear" w:color="auto" w:fill="F3F3F3"/>
+      </w:pPr>
+      <w:r>
+        <w:rPr>
+          <w:b w:val="0"/>
+        </w:rPr>
+        <w:t>Koszt = 19 000,00 zł brutto/mc x narzut pracodawcy 1,205 = 22 895,00 zł/mc x 5,00 etatomiesiąca (miesięcy pracy w przeliczeniu na pełny etat) = 114 475,00 zł. Nakład w zadaniu Z9 wynosi 6 mc (M22-M27) x 1/3 x 1,00 etatu + 3 mc (M28-M30) x 100% x 1,00 etatu = 5,00 etatomiesiąca. Udziały czasu pracy w projekcie są stałe w trzech okresach i wpisane w zakresie czynności pracownika: w M19-M21 40% na zadanie Z6 i 60% na zadanie Z7 (Z7 wymaga wcześniejszego projektu sprzętu i pierwszych egzemplarzy platformy na M22), w M22-M27 po jednej trzeciej, bo równolegle trwają pipeline, generator eFTI i integracje testowe (Z6), oprogramowanie embedded (Z7) oraz logi i pomiary w Fazie A (Z9) o zbliżonym nakładzie, w M28-M30 100% na zadanie Z9. Suma udziałów w każdym miesiącu równa się 1,00 etatu, a w całym okresie M19-M30 12,00 etatomiesiąca. Dane referencyjne dotyczą umowy o pracę, kwot brutto miesięcznie. Źródło: No Fluff Jobs, „Rynek pracy IT 2025/2026”, s. 30, tabela „Wytwarzanie i rozwój oprogramowania”, kategoria Backend, poziom Senior: 18 500-25 000 zł (mediany dolnych i górnych widełek z ogłoszeń o pracy). Kategorię Backend przyjęto jako najbliższy odpowiednik zakresu stanowiska (oprogramowanie systemowe i potoki danych). Przyjęto 19 000 zł, czyli dolną część widełek Senior (500 zł powyżej dolnej granicy). Wynagrodzenie niezbędne do realizacji prac B+R. Forma zatrudnienia: umowa o pracę.</w:t>
+      </w:r>
+    </w:p>
+    <w:p>
+      <w:pPr>
+        <w:keepNext/>
+        <w:spacing w:before="160" w:after="40"/>
+      </w:pPr>
+      <w:r>
+        <w:rPr>
+          <w:b/>
+          <w:sz w:val="20"/>
+        </w:rPr>
+        <w:t>IoT Specialist - wynagrodzenie (Z9)</w:t>
+      </w:r>
+      <w:r>
+        <w:rPr>
+          <w:color w:val="666666"/>
+          <w:sz w:val="17"/>
+        </w:rPr>
+        <w:t xml:space="preserve"> [1435 z 1500 znaków]</w:t>
+      </w:r>
+    </w:p>
+    <w:p>
+      <w:pPr>
+        <w:spacing w:after="60"/>
+        <w:shd w:val="clear" w:color="auto" w:fill="F3F3F3"/>
+      </w:pPr>
+      <w:r>
+        <w:rPr>
+          <w:b w:val="0"/>
+        </w:rPr>
+        <w:t>Koszt = 15 000,00 zł brutto/mc x narzut pracodawcy 1,205 = 18 075,00 zł/mc x 2,70 etatomiesiąca (miesięcy pracy w przeliczeniu na pełny etat) = 48 802,50 zł. Nakład w zadaniu Z9 wynosi 6 mc (M22-M27) x 40% x 0,50 etatu + 3 mc (M28-M30) x 100% x 0,50 etatu = 2,70 etatomiesiąca. Udziały czasu pracy w projekcie są stałe w trzech okresach i wpisane w zakresie czynności pracownika: w M19-M21 40% na zadanie Z6 i 60% na zadanie Z7 (Z7 wymaga wcześniejszego projektu sprzętu i pierwszych egzemplarzy platformy na M22), w M22-M27 20% na Z6 (czujnik drzwi, synchronizacja GPS, agregacja historii sygnałów), 40% na Z7 (architektura sprzętowa, obudowa, testy środowiskowe, pomiar opóźnienia) i 40% na Z9 (odbiór zestawów po montażu, kalibracja, rejestracja niezawodności w terenie), w M28-M30 100% na zadanie Z9. Suma udziałów w każdym miesiącu równa się 0,50 etatu, a w całym okresie M19-M30 6,00 etatomiesiąca. Dane referencyjne dotyczą umowy o pracę, kwot brutto miesięcznie. Źródło: No Fluff Jobs, „Rynek pracy IT 2025/2026”, s. 35, kategoria Embedded, poziom Mid: 12 000-17 000 zł, poziom Senior: 17 000-22 000 zł (mediany dolnych i górnych widełek z ogłoszeń o pracy); kategoria Embedded ogółem (s. 27): 13 000-19 000 zł. Stanowisko obsadzane jest na poziomie Mid, dlatego przyjęto 15 000 zł, czyli górną połowę widełek Mid (środek widełek to 14 500 zł). Wynagrodzenie niezbędne do realizacji prac B+R. Forma zatrudnienia: umowa o pracę.</w:t>
+      </w:r>
+    </w:p>
+    <w:p>
+      <w:pPr>
+        <w:keepNext/>
+        <w:spacing w:before="160" w:after="40"/>
+      </w:pPr>
+      <w:r>
+        <w:rPr>
+          <w:b/>
+          <w:sz w:val="20"/>
+        </w:rPr>
+        <w:t>Specjalista ds. logistyki TSL - wynagrodzenie (Z9)</w:t>
+      </w:r>
+      <w:r>
+        <w:rPr>
+          <w:color w:val="666666"/>
+          <w:sz w:val="17"/>
+        </w:rPr>
+        <w:t xml:space="preserve"> [1260 z 1500 znaków]</w:t>
+      </w:r>
+    </w:p>
+    <w:p>
+      <w:pPr>
+        <w:spacing w:after="60"/>
+        <w:shd w:val="clear" w:color="auto" w:fill="F3F3F3"/>
+      </w:pPr>
+      <w:r>
+        <w:rPr>
+          <w:b w:val="0"/>
+        </w:rPr>
+        <w:t>Koszt = 10 000,00 zł brutto/mc x narzut pracodawcy 1,205 = 12 050,00 zł/mc x 3,00 etatomiesiąca (miesięcy pracy w przeliczeniu na pełny etat) = 36 150,00 zł. Nakład w zadaniu Z9 wynosi 6 mc (M22-M27) x 50% x 0,50 etatu + 3 mc (M28-M30) x 100% x 0,50 etatu = 3,00 etatomiesiąca. Udziały czasu pracy w projekcie są stałe w trzech okresach i wpisane w zakresie czynności pracownika: w M19-M21 40% na zadanie Z6 i 60% na zadanie Z7 (Z7 wymaga wcześniejszego projektu sprzętu i pierwszych egzemplarzy platformy na M22), w M22-M27 20% na Z6 (interpretacja pól eFTI, ocena treści PoL i PoC), 30% na Z7 (scenariusze i progi alertów, użyteczność w kabinie) i 50% na Z9 (inspekcje ground truth od Fazy A), w M28-M30 100% na zadanie Z9. Suma udziałów w każdym miesiącu równa się 0,50 etatu, a w całym okresie M19-M30 6,00 etatomiesiąca. Dane referencyjne dotyczą kwot brutto miesięcznie za pełny etat (raport nie rozróżnia form zatrudnienia). Źródło: Hays Poland, „Raport płacowy 2026”, s. 40, sekcja Logistyka, stanowisko Specjalista ds. Logistyki: Min 8 000 zł, Opt 10 000 zł (najczęściej oferowane wynagrodzenie), Max 13 000 zł. Przyjęto 10 000 zł, czyli wartość najczęściej oferowaną. Wynagrodzenie niezbędne do realizacji prac B+R. Forma zatrudnienia: umowa o pracę.</w:t>
       </w:r>
     </w:p>
     <w:p>
@@ -20816,7 +21080,7 @@
                 <w:b w:val="0"/>
                 <w:sz w:val="15"/>
               </w:rPr>
-              <w:t>Raport No Fluff Jobs „Rynek pracy IT 2025/2026” i Hays „Raport płacowy 2026”: stanowiska w budżecie nie odpowiadają wprost nazwom w raportach (Backend/Full-Stack Developer, IT Specialist, AI Lead, Anotatorzy), AI Senior Engineer ma stawkę z pasma Mid, a część pozycji cytuje dwie strony i dwa zakresy (IoT: s. 27/35; AI Lead: s. 33 i s. 27).</w:t>
+              <w:t>Odniesienia do raportów No Fluff Jobs i Hays: liczby i strony zgadzają się z raportami (sprawdzone na s. 27, 30, 31, 32, 33, 35 NFJ i s. 38, 40 Hays). Niejednoznaczności opisowe: stanowiska bez wprost odpowiadającej kategorii (Backend/Full-Stack, IT Specialist, AI Lead, Anotatorzy), AI Senior Engineer ma stawkę z pasma Mid, IoT łączył dwa zakresy i Hays R&amp;D Engineer (inżynier produkcji), Hays „Opt” opisane jako „wartość optymalna”, opis „na granicy Mid/Senior” i „w środku pasma”.</w:t>
             </w:r>
           </w:p>
         </w:tc>
@@ -20834,7 +21098,7 @@
                 <w:b w:val="0"/>
                 <w:sz w:val="15"/>
               </w:rPr>
-              <w:t>Dla każdej pozycji jedno odniesienie w formacie z uwagi 35: UoP albo B2B albo godzinowa, nazwa stanowiska referencyjnego dokładnie jak w raporcie, poziom, strona, widełki, położenie stawki, przeliczenie na koszt pracodawcy. Backend: kategorie „Backend” i „Fullstack” są w raporcie osobno (s. 30), a stawka 18 000 zł to górna granica pasma Mid (Mid 13 000-18 000, Senior 18 500-25 000), więc opis „na granicy Mid/Senior” zastąpić jednoznacznym poziomem. Anotatorzy: brak takiego stanowiska w raporcie (zastępnik: QA Junior, s. 31) i forma zlecenia, więc podać stawkę godzinową brutto-brutto i liczbę godzin. Dla osób obecnie zatrudnionych (uwaga 34) dopisać relację do obecnego wynagrodzenia. Zweryfikowano na s. 30 raportu NFJ (screen od właściciela): Backend i Fullstack, UoP, Mid 13 000-18 000, Senior 18 500-25 000; kwoty to mediany dolnych i górnych widełek z ogłoszeń. Metody dla Backendu i IT Specialist przepisane. Pozostałe pozycje (AI Lead, AI Senior, cyber, IoT, TSL, Anotatorzy) czekają na screeny stron 27, 31, 32, 33, 35 i tabel Hays.</w:t>
+              <w:t>Przepisana metoda szacowania wszystkich 28 pozycji Everest11 (Z2, Z6, Z7, Z9) w formacie z uwagi 35: umowa o pracę, źródło i strona, kategoria i poziom jak w raporcie, widełki (mediany dolnych i górnych widełek z ogłoszeń), położenie stawki, przeliczenie na koszt pracodawcy; dla Anotatorów stawka godzinowa brutto-brutto (około 43 zł/h). Do decyzji właściciela: tytuł „AI Senior Engineer” przy poziomie Mid (D32). Dla osób obecnie zatrudnionych (uwaga 34) dopisać relację do obecnego wynagrodzenia.</w:t>
             </w:r>
           </w:p>
         </w:tc>

</xml_diff>

<commit_message>
D32 zatwierdzona, status zatrudnienia w metodzie szacowania, N31
Co-Authored-By: Claude Sonnet 5.5 <noreply@anthropic.com>
Claude-Session: https://claude.ai/code/session_01672WnJhixnEcarbb7uiwfx
</commit_message>
<xml_diff>
--- a/Opisy_zadan_z_kamieniami_milowymi.docx
+++ b/Opisy_zadan_z_kamieniami_milowymi.docx
@@ -9102,7 +9102,7 @@
           <w:color w:val="666666"/>
           <w:sz w:val="17"/>
         </w:rPr>
-        <w:t xml:space="preserve"> [772 z 1500 znaków]</w:t>
+        <w:t xml:space="preserve"> [932 z 1500 znaków]</w:t>
       </w:r>
     </w:p>
     <w:p>
@@ -9114,7 +9114,7 @@
         <w:rPr>
           <w:b w:val="0"/>
         </w:rPr>
-        <w:t>Koszt = 23 000,00 zł brutto/mc x narzut pracodawcy 1,205 = 27 715,00 zł/mc x 0,75 etatu x 18 mc (M1-M18, zadanie Z2) = 374 152,50 zł. Liczba miesięcy i wymiar etatu wynikają z zakresu prac w zadaniu Z2. Dane referencyjne dotyczą umowy o pracę, kwot brutto miesięcznie. Źródło: No Fluff Jobs, „Rynek pracy IT 2025/2026”, s. 33, kategoria AI, poziom Senior: 20 000-29 000 zł (mediany dolnych i górnych widełek z ogłoszeń o pracy); kategoria AI ogółem (s. 27): 19 000-24 000 zł. W raporcie nie ma osobnego poziomu Lead, więc stanowisko odniesiono do poziomu Senior. Przyjęto 23 000 zł, czyli dolną połowę widełek Senior (środek widełek to 24 500 zł) i górną część widełek kategorii AI ogółem. Wynagrodzenie niezbędne do realizacji prac B+R. Forma zatrudnienia: umowa o pracę.</w:t>
+        <w:t>Koszt = 23 000,00 zł brutto/mc x narzut pracodawcy 1,205 = 27 715,00 zł/mc x 0,75 etatu x 18 mc (M1-M18, zadanie Z2) = 374 152,50 zł. Liczba miesięcy i wymiar etatu wynikają z zakresu prac w zadaniu Z2. Dane referencyjne dotyczą umowy o pracę, kwot brutto miesięcznie. Źródło: No Fluff Jobs, „Rynek pracy IT 2025/2026”, s. 33, kategoria AI, poziom Senior: 20 000-29 000 zł (mediany dolnych i górnych widełek z ogłoszeń o pracy); kategoria AI ogółem (s. 27): 19 000-24 000 zł. W raporcie nie ma osobnego poziomu Lead, więc stanowisko odniesiono do poziomu Senior. Przyjęto 23 000 zł, czyli dolną połowę widełek Senior (środek widełek to 24 500 zł) i górną część widełek kategorii AI ogółem. Osoba nie jest pracownikiem Everest11; umowa warunkowa dotycząca zatrudnienia z 08.06.2026 (warunek: dofinansowanie), stawka wynegocjowana przy jej podpisaniu. Wynagrodzenie niezbędne do realizacji prac B+R. Forma zatrudnienia: umowa o pracę.</w:t>
       </w:r>
     </w:p>
     <w:p>
@@ -9134,7 +9134,7 @@
           <w:color w:val="666666"/>
           <w:sz w:val="17"/>
         </w:rPr>
-        <w:t xml:space="preserve"> [714 z 1500 znaków]</w:t>
+        <w:t xml:space="preserve"> [982 z 1500 znaków]</w:t>
       </w:r>
     </w:p>
     <w:p>
@@ -9146,7 +9146,7 @@
         <w:rPr>
           <w:b w:val="0"/>
         </w:rPr>
-        <w:t>Koszt = 16 500,00 zł brutto/mc x narzut pracodawcy 1,205 = 19 882,50 zł/mc x 0,75 etatu x 18 mc (M1-M18, zadanie Z2) = 268 413,75 zł. Liczba miesięcy i wymiar etatu wynikają z zakresu prac w zadaniu Z2. Dane referencyjne dotyczą umowy o pracę, kwot brutto miesięcznie. Źródło: No Fluff Jobs, „Rynek pracy IT 2025/2026”, s. 33, kategoria AI, poziom Mid: 14 000-21 000 zł, poziom Senior: 20 000-29 000 zł (mediany dolnych i górnych widełek z ogłoszeń o pracy). Stanowisko obsadzane jest na poziomie Mid, dlatego przyjęto 16 500 zł, czyli dolną połowę widełek Mid (środek widełek to 17 500 zł), 3 500 zł poniżej dolnej granicy Senior. Wynagrodzenie niezbędne do realizacji prac B+R. Forma zatrudnienia: umowa o pracę.</w:t>
+        <w:t>Koszt = 16 500,00 zł brutto/mc x narzut pracodawcy 1,205 = 19 882,50 zł/mc x 0,75 etatu x 18 mc (M1-M18, zadanie Z2) = 268 413,75 zł. Liczba miesięcy i wymiar etatu wynikają z zakresu prac w zadaniu Z2. Dane referencyjne dotyczą umowy o pracę, kwot brutto miesięcznie. Źródło: No Fluff Jobs, „Rynek pracy IT 2025/2026”, s. 33, kategoria AI, poziom Mid: 14 000-21 000 zł, poziom Senior: 20 000-29 000 zł (mediany dolnych i górnych widełek z ogłoszeń o pracy). Stanowisko obsadzane jest na poziomie Mid, dlatego przyjęto 16 500 zł, czyli dolną połowę widełek Mid (środek widełek to 17 500 zł), 3 500 zł poniżej dolnej granicy Senior. Osoba nie jest pracownikiem Everest11; umowa warunkowa dotycząca zatrudnienia z 08.06.2026 (warunek: dofinansowanie). Tytuł stanowiska odpowiada zakresowi odpowiedzialności, a stawka została wynegocjowana przy podpisaniu umowy warunkowej i mieści się w widełkach Mid. Wynagrodzenie niezbędne do realizacji prac B+R. Forma zatrudnienia: umowa o pracę.</w:t>
       </w:r>
     </w:p>
     <w:p>
@@ -9166,7 +9166,7 @@
           <w:color w:val="666666"/>
           <w:sz w:val="17"/>
         </w:rPr>
-        <w:t xml:space="preserve"> [688 z 1500 znaków]</w:t>
+        <w:t xml:space="preserve"> [848 z 1500 znaków]</w:t>
       </w:r>
     </w:p>
     <w:p>
@@ -9178,7 +9178,7 @@
         <w:rPr>
           <w:b w:val="0"/>
         </w:rPr>
-        <w:t>Koszt = 21 000,00 zł brutto/mc x narzut pracodawcy 1,205 = 25 305,00 zł/mc x 0,25 etatu x 18 mc (M1-M18, zadanie Z2) = 113 872,50 zł. Liczba miesięcy i wymiar etatu wynikają z zakresu prac w zadaniu Z2. Dane referencyjne dotyczą umowy o pracę, kwot brutto miesięcznie. Źródło: No Fluff Jobs, „Rynek pracy IT 2025/2026”, s. 32, kategoria Security, poziom Senior: 20 000-28 000 zł, poziom Mid: 14 000-17 000 zł (mediany dolnych i górnych widełek z ogłoszeń o pracy); kategoria Security ogółem (s. 27): 17 000-23 000 zł. Przyjęto 21 000 zł, czyli dolną część widełek Senior (1 000 zł powyżej dolnej granicy). Wynagrodzenie niezbędne do realizacji prac B+R. Forma zatrudnienia: umowa o pracę.</w:t>
+        <w:t>Koszt = 21 000,00 zł brutto/mc x narzut pracodawcy 1,205 = 25 305,00 zł/mc x 0,25 etatu x 18 mc (M1-M18, zadanie Z2) = 113 872,50 zł. Liczba miesięcy i wymiar etatu wynikają z zakresu prac w zadaniu Z2. Dane referencyjne dotyczą umowy o pracę, kwot brutto miesięcznie. Źródło: No Fluff Jobs, „Rynek pracy IT 2025/2026”, s. 32, kategoria Security, poziom Senior: 20 000-28 000 zł, poziom Mid: 14 000-17 000 zł (mediany dolnych i górnych widełek z ogłoszeń o pracy); kategoria Security ogółem (s. 27): 17 000-23 000 zł. Przyjęto 21 000 zł, czyli dolną część widełek Senior (1 000 zł powyżej dolnej granicy). Osoba nie jest pracownikiem Everest11; umowa warunkowa dotycząca zatrudnienia z 08.06.2026 (warunek: dofinansowanie), stawka wynegocjowana przy jej podpisaniu. Wynagrodzenie niezbędne do realizacji prac B+R. Forma zatrudnienia: umowa o pracę.</w:t>
       </w:r>
     </w:p>
     <w:p>
@@ -9198,7 +9198,7 @@
           <w:color w:val="666666"/>
           <w:sz w:val="17"/>
         </w:rPr>
-        <w:t xml:space="preserve"> [766 z 1500 znaków]</w:t>
+        <w:t xml:space="preserve"> [926 z 1500 znaków]</w:t>
       </w:r>
     </w:p>
     <w:p>
@@ -9210,7 +9210,7 @@
         <w:rPr>
           <w:b w:val="0"/>
         </w:rPr>
-        <w:t>Koszt = 19 000,00 zł brutto/mc x narzut pracodawcy 1,205 = 22 895,00 zł/mc x 1,00 etatu x 18 mc (M1-M18, zadanie Z2) = 412 110,00 zł. Liczba miesięcy i wymiar etatu wynikają z zakresu prac w zadaniu Z2. Dane referencyjne dotyczą umowy o pracę, kwot brutto miesięcznie. Źródło: No Fluff Jobs, „Rynek pracy IT 2025/2026”, s. 30, tabela „Wytwarzanie i rozwój oprogramowania”, kategoria Backend, poziom Senior: 18 500-25 000 zł (mediany dolnych i górnych widełek z ogłoszeń o pracy). Kategorię Backend przyjęto jako najbliższy odpowiednik zakresu stanowiska (oprogramowanie systemowe i potoki danych). Przyjęto 19 000 zł, czyli dolną część widełek Senior (500 zł powyżej dolnej granicy). Wynagrodzenie niezbędne do realizacji prac B+R. Forma zatrudnienia: umowa o pracę.</w:t>
+        <w:t>Koszt = 19 000,00 zł brutto/mc x narzut pracodawcy 1,205 = 22 895,00 zł/mc x 1,00 etatu x 18 mc (M1-M18, zadanie Z2) = 412 110,00 zł. Liczba miesięcy i wymiar etatu wynikają z zakresu prac w zadaniu Z2. Dane referencyjne dotyczą umowy o pracę, kwot brutto miesięcznie. Źródło: No Fluff Jobs, „Rynek pracy IT 2025/2026”, s. 30, tabela „Wytwarzanie i rozwój oprogramowania”, kategoria Backend, poziom Senior: 18 500-25 000 zł (mediany dolnych i górnych widełek z ogłoszeń o pracy). Kategorię Backend przyjęto jako najbliższy odpowiednik zakresu stanowiska (oprogramowanie systemowe i potoki danych). Przyjęto 19 000 zł, czyli dolną część widełek Senior (500 zł powyżej dolnej granicy). Osoba nie jest pracownikiem Everest11; umowa warunkowa dotycząca zatrudnienia z 08.06.2026 (warunek: dofinansowanie), stawka wynegocjowana przy jej podpisaniu. Wynagrodzenie niezbędne do realizacji prac B+R. Forma zatrudnienia: umowa o pracę.</w:t>
       </w:r>
     </w:p>
     <w:p>
@@ -9230,7 +9230,7 @@
           <w:color w:val="666666"/>
           <w:sz w:val="17"/>
         </w:rPr>
-        <w:t xml:space="preserve"> [733 z 1500 znaków]</w:t>
+        <w:t xml:space="preserve"> [893 z 1500 znaków]</w:t>
       </w:r>
     </w:p>
     <w:p>
@@ -9242,7 +9242,7 @@
         <w:rPr>
           <w:b w:val="0"/>
         </w:rPr>
-        <w:t>Koszt = 15 000,00 zł brutto/mc x narzut pracodawcy 1,205 = 18 075,00 zł/mc x 0,50 etatu x 18 mc (M1-M18, zadanie Z2) = 162 675,00 zł. Liczba miesięcy i wymiar etatu wynikają z zakresu prac w zadaniu Z2. Dane referencyjne dotyczą umowy o pracę, kwot brutto miesięcznie. Źródło: No Fluff Jobs, „Rynek pracy IT 2025/2026”, s. 35, kategoria Embedded, poziom Mid: 12 000-17 000 zł, poziom Senior: 17 000-22 000 zł (mediany dolnych i górnych widełek z ogłoszeń o pracy); kategoria Embedded ogółem (s. 27): 13 000-19 000 zł. Stanowisko obsadzane jest na poziomie Mid, dlatego przyjęto 15 000 zł, czyli górną połowę widełek Mid (środek widełek to 14 500 zł). Wynagrodzenie niezbędne do realizacji prac B+R. Forma zatrudnienia: umowa o pracę.</w:t>
+        <w:t>Koszt = 15 000,00 zł brutto/mc x narzut pracodawcy 1,205 = 18 075,00 zł/mc x 0,50 etatu x 18 mc (M1-M18, zadanie Z2) = 162 675,00 zł. Liczba miesięcy i wymiar etatu wynikają z zakresu prac w zadaniu Z2. Dane referencyjne dotyczą umowy o pracę, kwot brutto miesięcznie. Źródło: No Fluff Jobs, „Rynek pracy IT 2025/2026”, s. 35, kategoria Embedded, poziom Mid: 12 000-17 000 zł, poziom Senior: 17 000-22 000 zł (mediany dolnych i górnych widełek z ogłoszeń o pracy); kategoria Embedded ogółem (s. 27): 13 000-19 000 zł. Stanowisko obsadzane jest na poziomie Mid, dlatego przyjęto 15 000 zł, czyli górną połowę widełek Mid (środek widełek to 14 500 zł). Osoba nie jest pracownikiem Everest11; umowa warunkowa dotycząca zatrudnienia z 08.06.2026 (warunek: dofinansowanie), stawka wynegocjowana przy jej podpisaniu. Wynagrodzenie niezbędne do realizacji prac B+R. Forma zatrudnienia: umowa o pracę.</w:t>
       </w:r>
     </w:p>
     <w:p>
@@ -9262,7 +9262,7 @@
           <w:color w:val="666666"/>
           <w:sz w:val="17"/>
         </w:rPr>
-        <w:t xml:space="preserve"> [637 z 1500 znaków]</w:t>
+        <w:t xml:space="preserve"> [797 z 1500 znaków]</w:t>
       </w:r>
     </w:p>
     <w:p>
@@ -9274,7 +9274,7 @@
         <w:rPr>
           <w:b w:val="0"/>
         </w:rPr>
-        <w:t>Koszt = 10 000,00 zł brutto/mc x narzut pracodawcy 1,205 = 12 050,00 zł/mc x 0,50 etatu x 18 mc (M1-M18, zadanie Z2) = 108 450,00 zł. Liczba miesięcy i wymiar etatu wynikają z zakresu prac w zadaniu Z2. Dane referencyjne dotyczą kwot brutto miesięcznie za pełny etat (raport nie rozróżnia form zatrudnienia). Źródło: Hays Poland, „Raport płacowy 2026”, s. 40, sekcja Logistyka, stanowisko Specjalista ds. Logistyki: Min 8 000 zł, Opt 10 000 zł (najczęściej oferowane wynagrodzenie), Max 13 000 zł. Przyjęto 10 000 zł, czyli wartość najczęściej oferowaną. Wynagrodzenie niezbędne do realizacji prac B+R. Forma zatrudnienia: umowa o pracę.</w:t>
+        <w:t>Koszt = 10 000,00 zł brutto/mc x narzut pracodawcy 1,205 = 12 050,00 zł/mc x 0,50 etatu x 18 mc (M1-M18, zadanie Z2) = 108 450,00 zł. Liczba miesięcy i wymiar etatu wynikają z zakresu prac w zadaniu Z2. Dane referencyjne dotyczą kwot brutto miesięcznie za pełny etat (raport nie rozróżnia form zatrudnienia). Źródło: Hays Poland, „Raport płacowy 2026”, s. 40, sekcja Logistyka, stanowisko Specjalista ds. Logistyki: Min 8 000 zł, Opt 10 000 zł (najczęściej oferowane wynagrodzenie), Max 13 000 zł. Przyjęto 10 000 zł, czyli wartość najczęściej oferowaną. Osoba nie jest pracownikiem Everest11; umowa warunkowa dotycząca zatrudnienia z 08.06.2026 (warunek: dofinansowanie), stawka wynegocjowana przy jej podpisaniu. Wynagrodzenie niezbędne do realizacji prac B+R. Forma zatrudnienia: umowa o pracę.</w:t>
       </w:r>
     </w:p>
     <w:p>
@@ -9294,7 +9294,7 @@
           <w:color w:val="666666"/>
           <w:sz w:val="17"/>
         </w:rPr>
-        <w:t xml:space="preserve"> [787 z 1500 znaków]</w:t>
+        <w:t xml:space="preserve"> [867 z 1500 znaków]</w:t>
       </w:r>
     </w:p>
     <w:p>
@@ -9306,7 +9306,7 @@
         <w:rPr>
           <w:b w:val="0"/>
         </w:rPr>
-        <w:t>Koszt = 18 000,00 zł brutto/mc x narzut pracodawcy 1,205 = 21 690,00 zł/mc x 1,00 etatu x 6 mc (M13-M18, zadanie Z2) = 130 140,00 zł. Liczba miesięcy i wymiar etatu wynikają z zakresu prac w zadaniu Z2. Dane referencyjne dotyczą umowy o pracę, kwot brutto miesięcznie. Źródło: No Fluff Jobs, „Rynek pracy IT 2025/2026”, s. 30, tabela „Wytwarzanie i rozwój oprogramowania”, kategorie Backend i Fullstack (widełki identyczne w obu kategoriach): poziom Mid 13 000-18 000 zł, poziom Senior 18 500-25 000 zł (mediany dolnych i górnych widełek z ogłoszeń o pracy). Stanowisko obsadzane jest na poziomie Mid, dlatego przyjęto 18 000 zł, czyli górną granicę widełek Mid, o 500 zł niższą niż dolna granica Senior. Wynagrodzenie niezbędne do realizacji prac B+R. Forma zatrudnienia: umowa o pracę.</w:t>
+        <w:t>Koszt = 18 000,00 zł brutto/mc x narzut pracodawcy 1,205 = 21 690,00 zł/mc x 1,00 etatu x 6 mc (M13-M18, zadanie Z2) = 130 140,00 zł. Liczba miesięcy i wymiar etatu wynikają z zakresu prac w zadaniu Z2. Dane referencyjne dotyczą umowy o pracę, kwot brutto miesięcznie. Źródło: No Fluff Jobs, „Rynek pracy IT 2025/2026”, s. 30, tabela „Wytwarzanie i rozwój oprogramowania”, kategorie Backend i Fullstack (widełki identyczne w obu kategoriach): poziom Mid 13 000-18 000 zł, poziom Senior 18 500-25 000 zł (mediany dolnych i górnych widełek z ogłoszeń o pracy). Stanowisko obsadzane jest na poziomie Mid, dlatego przyjęto 18 000 zł, czyli górną granicę widełek Mid, o 500 zł niższą niż dolna granica Senior. Stanowisko zostanie obsadzone w drodze rekrutacji po otrzymaniu dofinansowania. Wynagrodzenie niezbędne do realizacji prac B+R. Forma zatrudnienia: umowa o pracę.</w:t>
       </w:r>
     </w:p>
     <w:p>
@@ -9326,7 +9326,7 @@
           <w:color w:val="666666"/>
           <w:sz w:val="17"/>
         </w:rPr>
-        <w:t xml:space="preserve"> [934 z 1500 znaków]</w:t>
+        <w:t xml:space="preserve"> [1014 z 1500 znaków]</w:t>
       </w:r>
     </w:p>
     <w:p>
@@ -9338,7 +9338,7 @@
         <w:rPr>
           <w:b w:val="0"/>
         </w:rPr>
-        <w:t>Koszt = 6 000,00 zł brutto/mc x narzut pracodawcy 1,205 = 7 230,00 zł/mc x 3,00 etatu x 10 mc (M9-M18, zadanie Z2) = 216 900,00 zł. Liczba miesięcy i wymiar etatu wynikają z zakresu prac w zadaniu Z2. Dane referencyjne dotyczą umowy o pracę (stanowiska pracują na umowie zlecenia, liczonej tym samym narzutem), kwot brutto miesięcznie. Źródło: No Fluff Jobs, „Rynek pracy IT 2025/2026”, s. 31, kategoria Testing/QA, poziom Junior: 5 750-8 200 zł (mediany dolnych i górnych widełek z ogłoszeń o pracy). W raporcie nie ma stanowiska anotatora danych, więc jako najbliższy odpowiednik (praca według schematu i kontrola jakości) przyjęto Testing/QA na poziomie Junior. Przyjęto 6 000 zł, czyli dolną część widełek (250 zł powyżej dolnej granicy), co przy 168 godzinach miesięcznie odpowiada stawce około 43 zł/h brutto-brutto po doliczeniu narzutu 1,205. Wynagrodzenie niezbędne do realizacji prac B+R. Forma zatrudnienia: umowa zlecenia.</w:t>
+        <w:t>Koszt = 6 000,00 zł brutto/mc x narzut pracodawcy 1,205 = 7 230,00 zł/mc x 3,00 etatu x 10 mc (M9-M18, zadanie Z2) = 216 900,00 zł. Liczba miesięcy i wymiar etatu wynikają z zakresu prac w zadaniu Z2. Dane referencyjne dotyczą umowy o pracę (stanowiska pracują na umowie zlecenia, liczonej tym samym narzutem), kwot brutto miesięcznie. Źródło: No Fluff Jobs, „Rynek pracy IT 2025/2026”, s. 31, kategoria Testing/QA, poziom Junior: 5 750-8 200 zł (mediany dolnych i górnych widełek z ogłoszeń o pracy). W raporcie nie ma stanowiska anotatora danych, więc jako najbliższy odpowiednik (praca według schematu i kontrola jakości) przyjęto Testing/QA na poziomie Junior. Przyjęto 6 000 zł, czyli dolną część widełek (250 zł powyżej dolnej granicy), co przy 168 godzinach miesięcznie odpowiada stawce około 43 zł/h brutto-brutto po doliczeniu narzutu 1,205. Stanowisko zostanie obsadzone w drodze rekrutacji po otrzymaniu dofinansowania. Wynagrodzenie niezbędne do realizacji prac B+R. Forma zatrudnienia: umowa zlecenia.</w:t>
       </w:r>
     </w:p>
     <w:p>
@@ -9366,7 +9366,7 @@
           <w:color w:val="666666"/>
           <w:sz w:val="17"/>
         </w:rPr>
-        <w:t xml:space="preserve"> [1416 z 1500 znaków]</w:t>
+        <w:t xml:space="preserve"> [1412 z 1500 znaków]</w:t>
       </w:r>
     </w:p>
     <w:p>
@@ -9378,7 +9378,7 @@
         <w:rPr>
           <w:b w:val="0"/>
         </w:rPr>
-        <w:t>Koszt = 23 000,00 zł brutto/mc x narzut pracodawcy 1,205 = 27 715,00 zł/mc x 2,40 etatomiesiąca (miesięcy pracy w przeliczeniu na pełny etat) = 66 516,00 zł. Nakład w zadaniu Z6 wynosi 3 mc (M19-M21) x 40% x 0,75 etatu + 6 mc (M22-M27) x 1/3 x 0,75 etatu = 2,40 etatomiesiąca. Udziały czasu pracy w projekcie są stałe w trzech okresach i wpisane w zakresie czynności pracownika: w M19-M21 40% na zadanie Z6 i 60% na zadanie Z7 (Z7 wymaga wcześniejszego projektu sprzętu i pierwszych egzemplarzy platformy na M22), w M22-M27 po jednej trzeciej, bo równolegle trwają architektura i optymalizacja pipeline'u (Z6), strategia kompresji i walidacja modeli (Z7) oraz protokół KPI i dane terenowe (Z9) o zbliżonym nakładzie, w M28-M30 100% na zadanie Z9. Suma udziałów w każdym miesiącu równa się 0,75 etatu, a w całym okresie M19-M30 9,00 etatomiesiąca. Dane referencyjne dotyczą umowy o pracę, kwot brutto miesięcznie. Źródło: No Fluff Jobs, „Rynek pracy IT 2025/2026”, s. 33, kategoria AI, poziom Senior: 20 000-29 000 zł (mediany dolnych i górnych widełek z ogłoszeń o pracy); kategoria AI ogółem (s. 27): 19 000-24 000 zł. W raporcie nie ma osobnego poziomu Lead, więc stanowisko odniesiono do poziomu Senior. Przyjęto 23 000 zł, czyli dolną połowę widełek Senior (środek widełek to 24 500 zł) i górną część widełek kategorii AI ogółem. Wynagrodzenie niezbędne do realizacji prac B+R. Forma zatrudnienia: umowa o pracę.</w:t>
+        <w:t>Koszt = 23 000,00 zł brutto/mc x narzut pracodawcy 1,205 = 27 715,00 zł/mc x 2,40 etatomiesiąca (miesięcy pracy w przeliczeniu na pełny etat) = 66 516,00 zł. Nakład w zadaniu Z6 wynosi 3 mc (M19-M21) x 40% x 0,75 etatu + 6 mc (M22-M27) x 1/3 x 0,75 etatu = 2,40 etatomiesiąca. Udziały czasu pracy w projekcie są stałe w trzech okresach i wpisane w zakresie czynności pracownika: w M19-M21 40% na zadanie Z6 i 60% na zadanie Z7 (Z7 wcześniej: sprzęt i pierwsze egzemplarze na M22), w M22-M27 po jednej trzeciej (równolegle: architektura pipeline'u w Z6, strategia kompresji w Z7, protokół KPI w Z9), w M28-M30 100% na zadanie Z9. Suma udziałów w każdym miesiącu równa się 0,75 etatu. Dane referencyjne dotyczą umowy o pracę, kwot brutto miesięcznie. Źródło: No Fluff Jobs, „Rynek pracy IT 2025/2026”, s. 33, kategoria AI, poziom Senior: 20 000-29 000 zł (mediany dolnych i górnych widełek z ogłoszeń o pracy); kategoria AI ogółem (s. 27): 19 000-24 000 zł. W raporcie nie ma osobnego poziomu Lead, więc stanowisko odniesiono do poziomu Senior. Przyjęto 23 000 zł, czyli dolną połowę widełek Senior (środek widełek to 24 500 zł) i górną część widełek kategorii AI ogółem. Osoba nie jest pracownikiem Everest11; umowa warunkowa dotycząca zatrudnienia z 08.06.2026 (warunek: dofinansowanie), stawka wynegocjowana przy jej podpisaniu. Wynagrodzenie niezbędne do realizacji prac B+R. Forma zatrudnienia: umowa o pracę.</w:t>
       </w:r>
     </w:p>
     <w:p>
@@ -9398,7 +9398,7 @@
           <w:color w:val="666666"/>
           <w:sz w:val="17"/>
         </w:rPr>
-        <w:t xml:space="preserve"> [1383 z 1500 znaków]</w:t>
+        <w:t xml:space="preserve"> [1473 z 1500 znaków]</w:t>
       </w:r>
     </w:p>
     <w:p>
@@ -9410,7 +9410,7 @@
         <w:rPr>
           <w:b w:val="0"/>
         </w:rPr>
-        <w:t>Koszt = 16 500,00 zł brutto/mc x narzut pracodawcy 1,205 = 19 882,50 zł/mc x 2,40 etatomiesiąca (miesięcy pracy w przeliczeniu na pełny etat) = 47 718,00 zł. Nakład w zadaniu Z6 wynosi 3 mc (M19-M21) x 40% x 0,75 etatu + 6 mc (M22-M27) x 1/3 x 0,75 etatu = 2,40 etatomiesiąca. Udziały czasu pracy w projekcie są stałe w trzech okresach i wpisane w zakresie czynności pracownika: w M19-M21 40% na zadanie Z6 i 60% na zadanie Z7 (Z7 wymaga wcześniejszego projektu sprzętu i pierwszych egzemplarzy platformy na M22), w M22-M27 po jednej trzeciej, bo równolegle trwają integracja change detection i raport ML (Z6), implementacja kompresji i optymalizacja na platformie (Z7) oraz diagnoza przesunięcia domeny i korekty (Z9) o zbliżonym nakładzie, w M28-M30 100% na zadanie Z9. Suma udziałów w każdym miesiącu równa się 0,75 etatu, a w całym okresie M19-M30 9,00 etatomiesiąca. Dane referencyjne dotyczą umowy o pracę, kwot brutto miesięcznie. Źródło: No Fluff Jobs, „Rynek pracy IT 2025/2026”, s. 33, kategoria AI, poziom Mid: 14 000-21 000 zł, poziom Senior: 20 000-29 000 zł (mediany dolnych i górnych widełek z ogłoszeń o pracy). Stanowisko obsadzane jest na poziomie Mid, dlatego przyjęto 16 500 zł, czyli dolną połowę widełek Mid (środek widełek to 17 500 zł), 3 500 zł poniżej dolnej granicy Senior. Wynagrodzenie niezbędne do realizacji prac B+R. Forma zatrudnienia: umowa o pracę.</w:t>
+        <w:t>Koszt = 16 500,00 zł brutto/mc x narzut pracodawcy 1,205 = 19 882,50 zł/mc x 2,40 etatomiesiąca (miesięcy pracy w przeliczeniu na pełny etat) = 47 718,00 zł. Nakład w zadaniu Z6 wynosi 3 mc (M19-M21) x 40% x 0,75 etatu + 6 mc (M22-M27) x 1/3 x 0,75 etatu = 2,40 etatomiesiąca. Udziały czasu pracy w projekcie są stałe w trzech okresach i wpisane w zakresie czynności pracownika: w M19-M21 40% na zadanie Z6 i 60% na zadanie Z7 (Z7 wcześniej: sprzęt i pierwsze egzemplarze na M22), w M22-M27 po jednej trzeciej (równolegle: change detection i raport ML w Z6, kompresja w Z7, diagnoza przesunięcia domeny w Z9), w M28-M30 100% na zadanie Z9. Suma udziałów w każdym miesiącu równa się 0,75 etatu. Dane referencyjne dotyczą umowy o pracę, kwot brutto miesięcznie. Źródło: No Fluff Jobs, „Rynek pracy IT 2025/2026”, s. 33, kategoria AI, poziom Mid: 14 000-21 000 zł, poziom Senior: 20 000-29 000 zł (mediany dolnych i górnych widełek z ogłoszeń o pracy). Stanowisko obsadzane jest na poziomie Mid, dlatego przyjęto 16 500 zł, czyli dolną połowę widełek Mid (środek widełek to 17 500 zł), 3 500 zł poniżej dolnej granicy Senior. Osoba nie jest pracownikiem Everest11; umowa warunkowa dotycząca zatrudnienia z 08.06.2026 (warunek: dofinansowanie). Tytuł stanowiska odpowiada zakresowi odpowiedzialności, a stawka została wynegocjowana przy podpisaniu umowy warunkowej i mieści się w widełkach Mid. Wynagrodzenie niezbędne do realizacji prac B+R. Forma zatrudnienia: umowa o pracę.</w:t>
       </w:r>
     </w:p>
     <w:p>
@@ -9430,7 +9430,7 @@
           <w:color w:val="666666"/>
           <w:sz w:val="17"/>
         </w:rPr>
-        <w:t xml:space="preserve"> [1357 z 1500 znaków]</w:t>
+        <w:t xml:space="preserve"> [1345 z 1500 znaków]</w:t>
       </w:r>
     </w:p>
     <w:p>
@@ -9442,7 +9442,7 @@
         <w:rPr>
           <w:b w:val="0"/>
         </w:rPr>
-        <w:t>Koszt = 21 000,00 zł brutto/mc x narzut pracodawcy 1,205 = 25 305,00 zł/mc x 0,60 etatomiesiąca (miesięcy pracy w przeliczeniu na pełny etat) = 15 183,00 zł. Nakład w zadaniu Z6 wynosi 3 mc (M19-M21) x 40% x 0,25 etatu + 6 mc (M22-M27) x 20% x 0,25 etatu = 0,60 etatomiesiąca. Udziały czasu pracy w projekcie są stałe w trzech okresach i wpisane w zakresie czynności pracownika: w M19-M21 40% na zadanie Z6 i 60% na zadanie Z7 (Z7 wymaga wcześniejszego projektu sprzętu i pierwszych egzemplarzy platformy na M22), w M22-M27 20% na Z6 (podpis kryptograficzny i łańcuch integralności), 40% na Z7 (bezpieczny rozruch, podpisywanie aktualizacji, szyfrowanie transmisji) i 40% na Z9 (testy bezpieczeństwa w terenie, rola niezależnego ewaluatora), w M28-M30 100% na zadanie Z9. Suma udziałów w każdym miesiącu równa się 0,25 etatu, a w całym okresie M19-M30 3,00 etatomiesiąca. Dane referencyjne dotyczą umowy o pracę, kwot brutto miesięcznie. Źródło: No Fluff Jobs, „Rynek pracy IT 2025/2026”, s. 32, kategoria Security, poziom Senior: 20 000-28 000 zł, poziom Mid: 14 000-17 000 zł (mediany dolnych i górnych widełek z ogłoszeń o pracy); kategoria Security ogółem (s. 27): 17 000-23 000 zł. Przyjęto 21 000 zł, czyli dolną część widełek Senior (1 000 zł powyżej dolnej granicy). Wynagrodzenie niezbędne do realizacji prac B+R. Forma zatrudnienia: umowa o pracę.</w:t>
+        <w:t>Koszt = 21 000,00 zł brutto/mc x narzut pracodawcy 1,205 = 25 305,00 zł/mc x 0,60 etatomiesiąca (miesięcy pracy w przeliczeniu na pełny etat) = 15 183,00 zł. Nakład w zadaniu Z6 wynosi 3 mc (M19-M21) x 40% x 0,25 etatu + 6 mc (M22-M27) x 20% x 0,25 etatu = 0,60 etatomiesiąca. Udziały czasu pracy w projekcie są stałe w trzech okresach i wpisane w zakresie czynności pracownika: w M19-M21 40% na zadanie Z6 i 60% na zadanie Z7 (Z7 wcześniej: sprzęt i pierwsze egzemplarze na M22), w M22-M27 20% na Z6 (podpis i integralność), 40% na Z7 (bezpieczny rozruch, OTA, szyfrowanie), 40% na Z9 (testy w terenie, ewaluator), w M28-M30 100% na zadanie Z9. Suma udziałów w każdym miesiącu równa się 0,25 etatu. Dane referencyjne dotyczą umowy o pracę, kwot brutto miesięcznie. Źródło: No Fluff Jobs, „Rynek pracy IT 2025/2026”, s. 32, kategoria Security, poziom Senior: 20 000-28 000 zł, poziom Mid: 14 000-17 000 zł (mediany dolnych i górnych widełek z ogłoszeń o pracy); kategoria Security ogółem (s. 27): 17 000-23 000 zł. Przyjęto 21 000 zł, czyli dolną część widełek Senior (1 000 zł powyżej dolnej granicy). Osoba nie jest pracownikiem Everest11; umowa warunkowa dotycząca zatrudnienia z 08.06.2026 (warunek: dofinansowanie), stawka wynegocjowana przy jej podpisaniu. Wynagrodzenie niezbędne do realizacji prac B+R. Forma zatrudnienia: umowa o pracę.</w:t>
       </w:r>
     </w:p>
     <w:p>
@@ -9462,7 +9462,7 @@
           <w:color w:val="666666"/>
           <w:sz w:val="17"/>
         </w:rPr>
-        <w:t xml:space="preserve"> [1398 z 1500 znaków]</w:t>
+        <w:t xml:space="preserve"> [1418 z 1500 znaków]</w:t>
       </w:r>
     </w:p>
     <w:p>
@@ -9474,7 +9474,7 @@
         <w:rPr>
           <w:b w:val="0"/>
         </w:rPr>
-        <w:t>Koszt = 19 000,00 zł brutto/mc x narzut pracodawcy 1,205 = 22 895,00 zł/mc x 3,20 etatomiesiąca (miesięcy pracy w przeliczeniu na pełny etat) = 73 264,00 zł. Nakład w zadaniu Z6 wynosi 3 mc (M19-M21) x 40% x 1,00 etatu + 6 mc (M22-M27) x 1/3 x 1,00 etatu = 3,20 etatomiesiąca. Udziały czasu pracy w projekcie są stałe w trzech okresach i wpisane w zakresie czynności pracownika: w M19-M21 40% na zadanie Z6 i 60% na zadanie Z7 (Z7 wymaga wcześniejszego projektu sprzętu i pierwszych egzemplarzy platformy na M22), w M22-M27 po jednej trzeciej, bo równolegle trwają pipeline, generator eFTI i integracje testowe (Z6), oprogramowanie embedded (Z7) oraz logi i pomiary w Fazie A (Z9) o zbliżonym nakładzie, w M28-M30 100% na zadanie Z9. Suma udziałów w każdym miesiącu równa się 1,00 etatu, a w całym okresie M19-M30 12,00 etatomiesiąca. Dane referencyjne dotyczą umowy o pracę, kwot brutto miesięcznie. Źródło: No Fluff Jobs, „Rynek pracy IT 2025/2026”, s. 30, tabela „Wytwarzanie i rozwój oprogramowania”, kategoria Backend, poziom Senior: 18 500-25 000 zł (mediany dolnych i górnych widełek z ogłoszeń o pracy). Kategorię Backend przyjęto jako najbliższy odpowiednik zakresu stanowiska (oprogramowanie systemowe i potoki danych). Przyjęto 19 000 zł, czyli dolną część widełek Senior (500 zł powyżej dolnej granicy). Wynagrodzenie niezbędne do realizacji prac B+R. Forma zatrudnienia: umowa o pracę.</w:t>
+        <w:t>Koszt = 19 000,00 zł brutto/mc x narzut pracodawcy 1,205 = 22 895,00 zł/mc x 3,20 etatomiesiąca (miesięcy pracy w przeliczeniu na pełny etat) = 73 264,00 zł. Nakład w zadaniu Z6 wynosi 3 mc (M19-M21) x 40% x 1,00 etatu + 6 mc (M22-M27) x 1/3 x 1,00 etatu = 3,20 etatomiesiąca. Udziały czasu pracy w projekcie są stałe w trzech okresach i wpisane w zakresie czynności pracownika: w M19-M21 40% na zadanie Z6 i 60% na zadanie Z7 (Z7 wcześniej: sprzęt i pierwsze egzemplarze na M22), w M22-M27 po jednej trzeciej (równolegle: pipeline i integracje testowe w Z6, oprogramowanie embedded w Z7, logi i pomiary w Z9), w M28-M30 100% na zadanie Z9. Suma udziałów w każdym miesiącu równa się 1,00 etatu. Dane referencyjne dotyczą umowy o pracę, kwot brutto miesięcznie. Źródło: No Fluff Jobs, „Rynek pracy IT 2025/2026”, s. 30, tabela „Wytwarzanie i rozwój oprogramowania”, kategoria Backend, poziom Senior: 18 500-25 000 zł (mediany dolnych i górnych widełek z ogłoszeń o pracy). Kategorię Backend przyjęto jako najbliższy odpowiednik zakresu stanowiska (oprogramowanie systemowe i potoki danych). Przyjęto 19 000 zł, czyli dolną część widełek Senior (500 zł powyżej dolnej granicy). Osoba nie jest pracownikiem Everest11; umowa warunkowa dotycząca zatrudnienia z 08.06.2026 (warunek: dofinansowanie), stawka wynegocjowana przy jej podpisaniu. Wynagrodzenie niezbędne do realizacji prac B+R. Forma zatrudnienia: umowa o pracę.</w:t>
       </w:r>
     </w:p>
     <w:p>
@@ -9494,7 +9494,7 @@
           <w:color w:val="666666"/>
           <w:sz w:val="17"/>
         </w:rPr>
-        <w:t xml:space="preserve"> [1434 z 1500 znaków]</w:t>
+        <w:t xml:space="preserve"> [1431 z 1500 znaków]</w:t>
       </w:r>
     </w:p>
     <w:p>
@@ -9506,7 +9506,7 @@
         <w:rPr>
           <w:b w:val="0"/>
         </w:rPr>
-        <w:t>Koszt = 15 000,00 zł brutto/mc x narzut pracodawcy 1,205 = 18 075,00 zł/mc x 1,20 etatomiesiąca (miesięcy pracy w przeliczeniu na pełny etat) = 21 690,00 zł. Nakład w zadaniu Z6 wynosi 3 mc (M19-M21) x 40% x 0,50 etatu + 6 mc (M22-M27) x 20% x 0,50 etatu = 1,20 etatomiesiąca. Udziały czasu pracy w projekcie są stałe w trzech okresach i wpisane w zakresie czynności pracownika: w M19-M21 40% na zadanie Z6 i 60% na zadanie Z7 (Z7 wymaga wcześniejszego projektu sprzętu i pierwszych egzemplarzy platformy na M22), w M22-M27 20% na Z6 (czujnik drzwi, synchronizacja GPS, agregacja historii sygnałów), 40% na Z7 (architektura sprzętowa, obudowa, testy środowiskowe, pomiar opóźnienia) i 40% na Z9 (odbiór zestawów po montażu, kalibracja, rejestracja niezawodności w terenie), w M28-M30 100% na zadanie Z9. Suma udziałów w każdym miesiącu równa się 0,50 etatu, a w całym okresie M19-M30 6,00 etatomiesiąca. Dane referencyjne dotyczą umowy o pracę, kwot brutto miesięcznie. Źródło: No Fluff Jobs, „Rynek pracy IT 2025/2026”, s. 35, kategoria Embedded, poziom Mid: 12 000-17 000 zł, poziom Senior: 17 000-22 000 zł (mediany dolnych i górnych widełek z ogłoszeń o pracy); kategoria Embedded ogółem (s. 27): 13 000-19 000 zł. Stanowisko obsadzane jest na poziomie Mid, dlatego przyjęto 15 000 zł, czyli górną połowę widełek Mid (środek widełek to 14 500 zł). Wynagrodzenie niezbędne do realizacji prac B+R. Forma zatrudnienia: umowa o pracę.</w:t>
+        <w:t>Koszt = 15 000,00 zł brutto/mc x narzut pracodawcy 1,205 = 18 075,00 zł/mc x 1,20 etatomiesiąca (miesięcy pracy w przeliczeniu na pełny etat) = 21 690,00 zł. Nakład w zadaniu Z6 wynosi 3 mc (M19-M21) x 40% x 0,50 etatu + 6 mc (M22-M27) x 20% x 0,50 etatu = 1,20 etatomiesiąca. Udziały czasu pracy w projekcie są stałe w trzech okresach i wpisane w zakresie czynności pracownika: w M19-M21 40% na zadanie Z6 i 60% na zadanie Z7 (Z7 wcześniej: sprzęt i pierwsze egzemplarze na M22), w M22-M27 20% na Z6 (czujnik drzwi, GPS, agregacja sygnałów), 40% na Z7 (sprzęt, obudowa, testy środowiskowe), 40% na Z9 (odbiór zestawów, kalibracja, niezawodność w terenie), w M28-M30 100% na zadanie Z9. Suma udziałów w każdym miesiącu równa się 0,50 etatu. Dane referencyjne dotyczą umowy o pracę, kwot brutto miesięcznie. Źródło: No Fluff Jobs, „Rynek pracy IT 2025/2026”, s. 35, kategoria Embedded, poziom Mid: 12 000-17 000 zł, poziom Senior: 17 000-22 000 zł (mediany dolnych i górnych widełek z ogłoszeń o pracy); kategoria Embedded ogółem (s. 27): 13 000-19 000 zł. Stanowisko obsadzane jest na poziomie Mid, dlatego przyjęto 15 000 zł, czyli górną połowę widełek Mid (środek widełek to 14 500 zł). Osoba nie jest pracownikiem Everest11; umowa warunkowa dotycząca zatrudnienia z 08.06.2026 (warunek: dofinansowanie), stawka wynegocjowana przy jej podpisaniu. Wynagrodzenie niezbędne do realizacji prac B+R. Forma zatrudnienia: umowa o pracę.</w:t>
       </w:r>
     </w:p>
     <w:p>
@@ -9526,7 +9526,7 @@
           <w:color w:val="666666"/>
           <w:sz w:val="17"/>
         </w:rPr>
-        <w:t xml:space="preserve"> [1259 z 1500 znaków]</w:t>
+        <w:t xml:space="preserve"> [1296 z 1500 znaków]</w:t>
       </w:r>
     </w:p>
     <w:p>
@@ -9538,7 +9538,7 @@
         <w:rPr>
           <w:b w:val="0"/>
         </w:rPr>
-        <w:t>Koszt = 10 000,00 zł brutto/mc x narzut pracodawcy 1,205 = 12 050,00 zł/mc x 1,20 etatomiesiąca (miesięcy pracy w przeliczeniu na pełny etat) = 14 460,00 zł. Nakład w zadaniu Z6 wynosi 3 mc (M19-M21) x 40% x 0,50 etatu + 6 mc (M22-M27) x 20% x 0,50 etatu = 1,20 etatomiesiąca. Udziały czasu pracy w projekcie są stałe w trzech okresach i wpisane w zakresie czynności pracownika: w M19-M21 40% na zadanie Z6 i 60% na zadanie Z7 (Z7 wymaga wcześniejszego projektu sprzętu i pierwszych egzemplarzy platformy na M22), w M22-M27 20% na Z6 (interpretacja pól eFTI, ocena treści PoL i PoC), 30% na Z7 (scenariusze i progi alertów, użyteczność w kabinie) i 50% na Z9 (inspekcje ground truth od Fazy A), w M28-M30 100% na zadanie Z9. Suma udziałów w każdym miesiącu równa się 0,50 etatu, a w całym okresie M19-M30 6,00 etatomiesiąca. Dane referencyjne dotyczą kwot brutto miesięcznie za pełny etat (raport nie rozróżnia form zatrudnienia). Źródło: Hays Poland, „Raport płacowy 2026”, s. 40, sekcja Logistyka, stanowisko Specjalista ds. Logistyki: Min 8 000 zł, Opt 10 000 zł (najczęściej oferowane wynagrodzenie), Max 13 000 zł. Przyjęto 10 000 zł, czyli wartość najczęściej oferowaną. Wynagrodzenie niezbędne do realizacji prac B+R. Forma zatrudnienia: umowa o pracę.</w:t>
+        <w:t>Koszt = 10 000,00 zł brutto/mc x narzut pracodawcy 1,205 = 12 050,00 zł/mc x 1,20 etatomiesiąca (miesięcy pracy w przeliczeniu na pełny etat) = 14 460,00 zł. Nakład w zadaniu Z6 wynosi 3 mc (M19-M21) x 40% x 0,50 etatu + 6 mc (M22-M27) x 20% x 0,50 etatu = 1,20 etatomiesiąca. Udziały czasu pracy w projekcie są stałe w trzech okresach i wpisane w zakresie czynności pracownika: w M19-M21 40% na zadanie Z6 i 60% na zadanie Z7 (Z7 wcześniej: sprzęt i pierwsze egzemplarze na M22), w M22-M27 20% na Z6 (pola eFTI, ocena PoL i PoC), 30% na Z7 (scenariusze i progi alertów), 50% na Z9 (inspekcje ground truth od Fazy A), w M28-M30 100% na zadanie Z9. Suma udziałów w każdym miesiącu równa się 0,50 etatu. Dane referencyjne dotyczą kwot brutto miesięcznie za pełny etat (raport nie rozróżnia form zatrudnienia). Źródło: Hays Poland, „Raport płacowy 2026”, s. 40, sekcja Logistyka, stanowisko Specjalista ds. Logistyki: Min 8 000 zł, Opt 10 000 zł (najczęściej oferowane wynagrodzenie), Max 13 000 zł. Przyjęto 10 000 zł, czyli wartość najczęściej oferowaną. Osoba nie jest pracownikiem Everest11; umowa warunkowa dotycząca zatrudnienia z 08.06.2026 (warunek: dofinansowanie), stawka wynegocjowana przy jej podpisaniu. Wynagrodzenie niezbędne do realizacji prac B+R. Forma zatrudnienia: umowa o pracę.</w:t>
       </w:r>
     </w:p>
     <w:p>
@@ -9558,7 +9558,7 @@
           <w:color w:val="666666"/>
           <w:sz w:val="17"/>
         </w:rPr>
-        <w:t xml:space="preserve"> [852 z 1500 znaków]</w:t>
+        <w:t xml:space="preserve"> [932 z 1500 znaków]</w:t>
       </w:r>
     </w:p>
     <w:p>
@@ -9570,7 +9570,7 @@
         <w:rPr>
           <w:b w:val="0"/>
         </w:rPr>
-        <w:t>Koszt = 18 000,00 zł brutto/mc x narzut pracodawcy 1,205 = 21 690,00 zł/mc x 1,0 etatu x 9 mc (M19-M27, zadanie Z6) = 195 210,00 zł. Liczba miesięcy wynika z zakresu prac w zadaniu: w Z6 integracje testowe, potok danych i test zgodności eFTI w czasie trwania zadania. Dane referencyjne dotyczą umowy o pracę, kwot brutto miesięcznie. Źródło: No Fluff Jobs, „Rynek pracy IT 2025/2026”, s. 30, tabela „Wytwarzanie i rozwój oprogramowania”, kategorie Backend i Fullstack (widełki identyczne w obu kategoriach): poziom Mid 13 000-18 000 zł, poziom Senior 18 500-25 000 zł (mediany dolnych i górnych widełek z ogłoszeń o pracy). Stanowisko obsadzane jest na poziomie Mid, dlatego przyjęto 18 000 zł, czyli górną granicę widełek Mid, o 500 zł niższą niż dolna granica Senior. Wynagrodzenie niezbędne do realizacji prac B+R. Forma zatrudnienia: umowa o pracę.</w:t>
+        <w:t>Koszt = 18 000,00 zł brutto/mc x narzut pracodawcy 1,205 = 21 690,00 zł/mc x 1,0 etatu x 9 mc (M19-M27, zadanie Z6) = 195 210,00 zł. Liczba miesięcy wynika z zakresu prac w zadaniu: w Z6 integracje testowe, potok danych i test zgodności eFTI w czasie trwania zadania. Dane referencyjne dotyczą umowy o pracę, kwot brutto miesięcznie. Źródło: No Fluff Jobs, „Rynek pracy IT 2025/2026”, s. 30, tabela „Wytwarzanie i rozwój oprogramowania”, kategorie Backend i Fullstack (widełki identyczne w obu kategoriach): poziom Mid 13 000-18 000 zł, poziom Senior 18 500-25 000 zł (mediany dolnych i górnych widełek z ogłoszeń o pracy). Stanowisko obsadzane jest na poziomie Mid, dlatego przyjęto 18 000 zł, czyli górną granicę widełek Mid, o 500 zł niższą niż dolna granica Senior. Stanowisko zostanie obsadzone w drodze rekrutacji po otrzymaniu dofinansowania. Wynagrodzenie niezbędne do realizacji prac B+R. Forma zatrudnienia: umowa o pracę.</w:t>
       </w:r>
     </w:p>
     <w:p>
@@ -9598,7 +9598,7 @@
           <w:color w:val="666666"/>
           <w:sz w:val="17"/>
         </w:rPr>
-        <w:t xml:space="preserve"> [1416 z 1500 znaków]</w:t>
+        <w:t xml:space="preserve"> [1412 z 1500 znaków]</w:t>
       </w:r>
     </w:p>
     <w:p>
@@ -9610,7 +9610,7 @@
         <w:rPr>
           <w:b w:val="0"/>
         </w:rPr>
-        <w:t>Koszt = 23 000,00 zł brutto/mc x narzut pracodawcy 1,205 = 27 715,00 zł/mc x 2,85 etatomiesiąca (miesięcy pracy w przeliczeniu na pełny etat) = 78 987,75 zł. Nakład w zadaniu Z7 wynosi 3 mc (M19-M21) x 60% x 0,75 etatu + 6 mc (M22-M27) x 1/3 x 0,75 etatu = 2,85 etatomiesiąca. Udziały czasu pracy w projekcie są stałe w trzech okresach i wpisane w zakresie czynności pracownika: w M19-M21 40% na zadanie Z6 i 60% na zadanie Z7 (Z7 wymaga wcześniejszego projektu sprzętu i pierwszych egzemplarzy platformy na M22), w M22-M27 po jednej trzeciej, bo równolegle trwają architektura i optymalizacja pipeline'u (Z6), strategia kompresji i walidacja modeli (Z7) oraz protokół KPI i dane terenowe (Z9) o zbliżonym nakładzie, w M28-M30 100% na zadanie Z9. Suma udziałów w każdym miesiącu równa się 0,75 etatu, a w całym okresie M19-M30 9,00 etatomiesiąca. Dane referencyjne dotyczą umowy o pracę, kwot brutto miesięcznie. Źródło: No Fluff Jobs, „Rynek pracy IT 2025/2026”, s. 33, kategoria AI, poziom Senior: 20 000-29 000 zł (mediany dolnych i górnych widełek z ogłoszeń o pracy); kategoria AI ogółem (s. 27): 19 000-24 000 zł. W raporcie nie ma osobnego poziomu Lead, więc stanowisko odniesiono do poziomu Senior. Przyjęto 23 000 zł, czyli dolną połowę widełek Senior (środek widełek to 24 500 zł) i górną część widełek kategorii AI ogółem. Wynagrodzenie niezbędne do realizacji prac B+R. Forma zatrudnienia: umowa o pracę.</w:t>
+        <w:t>Koszt = 23 000,00 zł brutto/mc x narzut pracodawcy 1,205 = 27 715,00 zł/mc x 2,85 etatomiesiąca (miesięcy pracy w przeliczeniu na pełny etat) = 78 987,75 zł. Nakład w zadaniu Z7 wynosi 3 mc (M19-M21) x 60% x 0,75 etatu + 6 mc (M22-M27) x 1/3 x 0,75 etatu = 2,85 etatomiesiąca. Udziały czasu pracy w projekcie są stałe w trzech okresach i wpisane w zakresie czynności pracownika: w M19-M21 40% na zadanie Z6 i 60% na zadanie Z7 (Z7 wcześniej: sprzęt i pierwsze egzemplarze na M22), w M22-M27 po jednej trzeciej (równolegle: architektura pipeline'u w Z6, strategia kompresji w Z7, protokół KPI w Z9), w M28-M30 100% na zadanie Z9. Suma udziałów w każdym miesiącu równa się 0,75 etatu. Dane referencyjne dotyczą umowy o pracę, kwot brutto miesięcznie. Źródło: No Fluff Jobs, „Rynek pracy IT 2025/2026”, s. 33, kategoria AI, poziom Senior: 20 000-29 000 zł (mediany dolnych i górnych widełek z ogłoszeń o pracy); kategoria AI ogółem (s. 27): 19 000-24 000 zł. W raporcie nie ma osobnego poziomu Lead, więc stanowisko odniesiono do poziomu Senior. Przyjęto 23 000 zł, czyli dolną połowę widełek Senior (środek widełek to 24 500 zł) i górną część widełek kategorii AI ogółem. Osoba nie jest pracownikiem Everest11; umowa warunkowa dotycząca zatrudnienia z 08.06.2026 (warunek: dofinansowanie), stawka wynegocjowana przy jej podpisaniu. Wynagrodzenie niezbędne do realizacji prac B+R. Forma zatrudnienia: umowa o pracę.</w:t>
       </w:r>
     </w:p>
     <w:p>
@@ -9630,7 +9630,7 @@
           <w:color w:val="666666"/>
           <w:sz w:val="17"/>
         </w:rPr>
-        <w:t xml:space="preserve"> [1383 z 1500 znaków]</w:t>
+        <w:t xml:space="preserve"> [1473 z 1500 znaków]</w:t>
       </w:r>
     </w:p>
     <w:p>
@@ -9642,7 +9642,7 @@
         <w:rPr>
           <w:b w:val="0"/>
         </w:rPr>
-        <w:t>Koszt = 16 500,00 zł brutto/mc x narzut pracodawcy 1,205 = 19 882,50 zł/mc x 2,85 etatomiesiąca (miesięcy pracy w przeliczeniu na pełny etat) = 56 665,12 zł. Nakład w zadaniu Z7 wynosi 3 mc (M19-M21) x 60% x 0,75 etatu + 6 mc (M22-M27) x 1/3 x 0,75 etatu = 2,85 etatomiesiąca. Udziały czasu pracy w projekcie są stałe w trzech okresach i wpisane w zakresie czynności pracownika: w M19-M21 40% na zadanie Z6 i 60% na zadanie Z7 (Z7 wymaga wcześniejszego projektu sprzętu i pierwszych egzemplarzy platformy na M22), w M22-M27 po jednej trzeciej, bo równolegle trwają integracja change detection i raport ML (Z6), implementacja kompresji i optymalizacja na platformie (Z7) oraz diagnoza przesunięcia domeny i korekty (Z9) o zbliżonym nakładzie, w M28-M30 100% na zadanie Z9. Suma udziałów w każdym miesiącu równa się 0,75 etatu, a w całym okresie M19-M30 9,00 etatomiesiąca. Dane referencyjne dotyczą umowy o pracę, kwot brutto miesięcznie. Źródło: No Fluff Jobs, „Rynek pracy IT 2025/2026”, s. 33, kategoria AI, poziom Mid: 14 000-21 000 zł, poziom Senior: 20 000-29 000 zł (mediany dolnych i górnych widełek z ogłoszeń o pracy). Stanowisko obsadzane jest na poziomie Mid, dlatego przyjęto 16 500 zł, czyli dolną połowę widełek Mid (środek widełek to 17 500 zł), 3 500 zł poniżej dolnej granicy Senior. Wynagrodzenie niezbędne do realizacji prac B+R. Forma zatrudnienia: umowa o pracę.</w:t>
+        <w:t>Koszt = 16 500,00 zł brutto/mc x narzut pracodawcy 1,205 = 19 882,50 zł/mc x 2,85 etatomiesiąca (miesięcy pracy w przeliczeniu na pełny etat) = 56 665,12 zł. Nakład w zadaniu Z7 wynosi 3 mc (M19-M21) x 60% x 0,75 etatu + 6 mc (M22-M27) x 1/3 x 0,75 etatu = 2,85 etatomiesiąca. Udziały czasu pracy w projekcie są stałe w trzech okresach i wpisane w zakresie czynności pracownika: w M19-M21 40% na zadanie Z6 i 60% na zadanie Z7 (Z7 wcześniej: sprzęt i pierwsze egzemplarze na M22), w M22-M27 po jednej trzeciej (równolegle: change detection i raport ML w Z6, kompresja w Z7, diagnoza przesunięcia domeny w Z9), w M28-M30 100% na zadanie Z9. Suma udziałów w każdym miesiącu równa się 0,75 etatu. Dane referencyjne dotyczą umowy o pracę, kwot brutto miesięcznie. Źródło: No Fluff Jobs, „Rynek pracy IT 2025/2026”, s. 33, kategoria AI, poziom Mid: 14 000-21 000 zł, poziom Senior: 20 000-29 000 zł (mediany dolnych i górnych widełek z ogłoszeń o pracy). Stanowisko obsadzane jest na poziomie Mid, dlatego przyjęto 16 500 zł, czyli dolną połowę widełek Mid (środek widełek to 17 500 zł), 3 500 zł poniżej dolnej granicy Senior. Osoba nie jest pracownikiem Everest11; umowa warunkowa dotycząca zatrudnienia z 08.06.2026 (warunek: dofinansowanie). Tytuł stanowiska odpowiada zakresowi odpowiedzialności, a stawka została wynegocjowana przy podpisaniu umowy warunkowej i mieści się w widełkach Mid. Wynagrodzenie niezbędne do realizacji prac B+R. Forma zatrudnienia: umowa o pracę.</w:t>
       </w:r>
     </w:p>
     <w:p>
@@ -9662,7 +9662,7 @@
           <w:color w:val="666666"/>
           <w:sz w:val="17"/>
         </w:rPr>
-        <w:t xml:space="preserve"> [1357 z 1500 znaków]</w:t>
+        <w:t xml:space="preserve"> [1345 z 1500 znaków]</w:t>
       </w:r>
     </w:p>
     <w:p>
@@ -9674,7 +9674,7 @@
         <w:rPr>
           <w:b w:val="0"/>
         </w:rPr>
-        <w:t>Koszt = 21 000,00 zł brutto/mc x narzut pracodawcy 1,205 = 25 305,00 zł/mc x 1,05 etatomiesiąca (miesięcy pracy w przeliczeniu na pełny etat) = 26 570,25 zł. Nakład w zadaniu Z7 wynosi 3 mc (M19-M21) x 60% x 0,25 etatu + 6 mc (M22-M27) x 40% x 0,25 etatu = 1,05 etatomiesiąca. Udziały czasu pracy w projekcie są stałe w trzech okresach i wpisane w zakresie czynności pracownika: w M19-M21 40% na zadanie Z6 i 60% na zadanie Z7 (Z7 wymaga wcześniejszego projektu sprzętu i pierwszych egzemplarzy platformy na M22), w M22-M27 20% na Z6 (podpis kryptograficzny i łańcuch integralności), 40% na Z7 (bezpieczny rozruch, podpisywanie aktualizacji, szyfrowanie transmisji) i 40% na Z9 (testy bezpieczeństwa w terenie, rola niezależnego ewaluatora), w M28-M30 100% na zadanie Z9. Suma udziałów w każdym miesiącu równa się 0,25 etatu, a w całym okresie M19-M30 3,00 etatomiesiąca. Dane referencyjne dotyczą umowy o pracę, kwot brutto miesięcznie. Źródło: No Fluff Jobs, „Rynek pracy IT 2025/2026”, s. 32, kategoria Security, poziom Senior: 20 000-28 000 zł, poziom Mid: 14 000-17 000 zł (mediany dolnych i górnych widełek z ogłoszeń o pracy); kategoria Security ogółem (s. 27): 17 000-23 000 zł. Przyjęto 21 000 zł, czyli dolną część widełek Senior (1 000 zł powyżej dolnej granicy). Wynagrodzenie niezbędne do realizacji prac B+R. Forma zatrudnienia: umowa o pracę.</w:t>
+        <w:t>Koszt = 21 000,00 zł brutto/mc x narzut pracodawcy 1,205 = 25 305,00 zł/mc x 1,05 etatomiesiąca (miesięcy pracy w przeliczeniu na pełny etat) = 26 570,25 zł. Nakład w zadaniu Z7 wynosi 3 mc (M19-M21) x 60% x 0,25 etatu + 6 mc (M22-M27) x 40% x 0,25 etatu = 1,05 etatomiesiąca. Udziały czasu pracy w projekcie są stałe w trzech okresach i wpisane w zakresie czynności pracownika: w M19-M21 40% na zadanie Z6 i 60% na zadanie Z7 (Z7 wcześniej: sprzęt i pierwsze egzemplarze na M22), w M22-M27 20% na Z6 (podpis i integralność), 40% na Z7 (bezpieczny rozruch, OTA, szyfrowanie), 40% na Z9 (testy w terenie, ewaluator), w M28-M30 100% na zadanie Z9. Suma udziałów w każdym miesiącu równa się 0,25 etatu. Dane referencyjne dotyczą umowy o pracę, kwot brutto miesięcznie. Źródło: No Fluff Jobs, „Rynek pracy IT 2025/2026”, s. 32, kategoria Security, poziom Senior: 20 000-28 000 zł, poziom Mid: 14 000-17 000 zł (mediany dolnych i górnych widełek z ogłoszeń o pracy); kategoria Security ogółem (s. 27): 17 000-23 000 zł. Przyjęto 21 000 zł, czyli dolną część widełek Senior (1 000 zł powyżej dolnej granicy). Osoba nie jest pracownikiem Everest11; umowa warunkowa dotycząca zatrudnienia z 08.06.2026 (warunek: dofinansowanie), stawka wynegocjowana przy jej podpisaniu. Wynagrodzenie niezbędne do realizacji prac B+R. Forma zatrudnienia: umowa o pracę.</w:t>
       </w:r>
     </w:p>
     <w:p>
@@ -9694,7 +9694,7 @@
           <w:color w:val="666666"/>
           <w:sz w:val="17"/>
         </w:rPr>
-        <w:t xml:space="preserve"> [1398 z 1500 znaków]</w:t>
+        <w:t xml:space="preserve"> [1418 z 1500 znaków]</w:t>
       </w:r>
     </w:p>
     <w:p>
@@ -9706,7 +9706,7 @@
         <w:rPr>
           <w:b w:val="0"/>
         </w:rPr>
-        <w:t>Koszt = 19 000,00 zł brutto/mc x narzut pracodawcy 1,205 = 22 895,00 zł/mc x 3,80 etatomiesiąca (miesięcy pracy w przeliczeniu na pełny etat) = 87 001,00 zł. Nakład w zadaniu Z7 wynosi 3 mc (M19-M21) x 60% x 1,00 etatu + 6 mc (M22-M27) x 1/3 x 1,00 etatu = 3,80 etatomiesiąca. Udziały czasu pracy w projekcie są stałe w trzech okresach i wpisane w zakresie czynności pracownika: w M19-M21 40% na zadanie Z6 i 60% na zadanie Z7 (Z7 wymaga wcześniejszego projektu sprzętu i pierwszych egzemplarzy platformy na M22), w M22-M27 po jednej trzeciej, bo równolegle trwają pipeline, generator eFTI i integracje testowe (Z6), oprogramowanie embedded (Z7) oraz logi i pomiary w Fazie A (Z9) o zbliżonym nakładzie, w M28-M30 100% na zadanie Z9. Suma udziałów w każdym miesiącu równa się 1,00 etatu, a w całym okresie M19-M30 12,00 etatomiesiąca. Dane referencyjne dotyczą umowy o pracę, kwot brutto miesięcznie. Źródło: No Fluff Jobs, „Rynek pracy IT 2025/2026”, s. 30, tabela „Wytwarzanie i rozwój oprogramowania”, kategoria Backend, poziom Senior: 18 500-25 000 zł (mediany dolnych i górnych widełek z ogłoszeń o pracy). Kategorię Backend przyjęto jako najbliższy odpowiednik zakresu stanowiska (oprogramowanie systemowe i potoki danych). Przyjęto 19 000 zł, czyli dolną część widełek Senior (500 zł powyżej dolnej granicy). Wynagrodzenie niezbędne do realizacji prac B+R. Forma zatrudnienia: umowa o pracę.</w:t>
+        <w:t>Koszt = 19 000,00 zł brutto/mc x narzut pracodawcy 1,205 = 22 895,00 zł/mc x 3,80 etatomiesiąca (miesięcy pracy w przeliczeniu na pełny etat) = 87 001,00 zł. Nakład w zadaniu Z7 wynosi 3 mc (M19-M21) x 60% x 1,00 etatu + 6 mc (M22-M27) x 1/3 x 1,00 etatu = 3,80 etatomiesiąca. Udziały czasu pracy w projekcie są stałe w trzech okresach i wpisane w zakresie czynności pracownika: w M19-M21 40% na zadanie Z6 i 60% na zadanie Z7 (Z7 wcześniej: sprzęt i pierwsze egzemplarze na M22), w M22-M27 po jednej trzeciej (równolegle: pipeline i integracje testowe w Z6, oprogramowanie embedded w Z7, logi i pomiary w Z9), w M28-M30 100% na zadanie Z9. Suma udziałów w każdym miesiącu równa się 1,00 etatu. Dane referencyjne dotyczą umowy o pracę, kwot brutto miesięcznie. Źródło: No Fluff Jobs, „Rynek pracy IT 2025/2026”, s. 30, tabela „Wytwarzanie i rozwój oprogramowania”, kategoria Backend, poziom Senior: 18 500-25 000 zł (mediany dolnych i górnych widełek z ogłoszeń o pracy). Kategorię Backend przyjęto jako najbliższy odpowiednik zakresu stanowiska (oprogramowanie systemowe i potoki danych). Przyjęto 19 000 zł, czyli dolną część widełek Senior (500 zł powyżej dolnej granicy). Osoba nie jest pracownikiem Everest11; umowa warunkowa dotycząca zatrudnienia z 08.06.2026 (warunek: dofinansowanie), stawka wynegocjowana przy jej podpisaniu. Wynagrodzenie niezbędne do realizacji prac B+R. Forma zatrudnienia: umowa o pracę.</w:t>
       </w:r>
     </w:p>
     <w:p>
@@ -9726,7 +9726,7 @@
           <w:color w:val="666666"/>
           <w:sz w:val="17"/>
         </w:rPr>
-        <w:t xml:space="preserve"> [1434 z 1500 znaków]</w:t>
+        <w:t xml:space="preserve"> [1431 z 1500 znaków]</w:t>
       </w:r>
     </w:p>
     <w:p>
@@ -9738,7 +9738,7 @@
         <w:rPr>
           <w:b w:val="0"/>
         </w:rPr>
-        <w:t>Koszt = 15 000,00 zł brutto/mc x narzut pracodawcy 1,205 = 18 075,00 zł/mc x 2,10 etatomiesiąca (miesięcy pracy w przeliczeniu na pełny etat) = 37 957,50 zł. Nakład w zadaniu Z7 wynosi 3 mc (M19-M21) x 60% x 0,50 etatu + 6 mc (M22-M27) x 40% x 0,50 etatu = 2,10 etatomiesiąca. Udziały czasu pracy w projekcie są stałe w trzech okresach i wpisane w zakresie czynności pracownika: w M19-M21 40% na zadanie Z6 i 60% na zadanie Z7 (Z7 wymaga wcześniejszego projektu sprzętu i pierwszych egzemplarzy platformy na M22), w M22-M27 20% na Z6 (czujnik drzwi, synchronizacja GPS, agregacja historii sygnałów), 40% na Z7 (architektura sprzętowa, obudowa, testy środowiskowe, pomiar opóźnienia) i 40% na Z9 (odbiór zestawów po montażu, kalibracja, rejestracja niezawodności w terenie), w M28-M30 100% na zadanie Z9. Suma udziałów w każdym miesiącu równa się 0,50 etatu, a w całym okresie M19-M30 6,00 etatomiesiąca. Dane referencyjne dotyczą umowy o pracę, kwot brutto miesięcznie. Źródło: No Fluff Jobs, „Rynek pracy IT 2025/2026”, s. 35, kategoria Embedded, poziom Mid: 12 000-17 000 zł, poziom Senior: 17 000-22 000 zł (mediany dolnych i górnych widełek z ogłoszeń o pracy); kategoria Embedded ogółem (s. 27): 13 000-19 000 zł. Stanowisko obsadzane jest na poziomie Mid, dlatego przyjęto 15 000 zł, czyli górną połowę widełek Mid (środek widełek to 14 500 zł). Wynagrodzenie niezbędne do realizacji prac B+R. Forma zatrudnienia: umowa o pracę.</w:t>
+        <w:t>Koszt = 15 000,00 zł brutto/mc x narzut pracodawcy 1,205 = 18 075,00 zł/mc x 2,10 etatomiesiąca (miesięcy pracy w przeliczeniu na pełny etat) = 37 957,50 zł. Nakład w zadaniu Z7 wynosi 3 mc (M19-M21) x 60% x 0,50 etatu + 6 mc (M22-M27) x 40% x 0,50 etatu = 2,10 etatomiesiąca. Udziały czasu pracy w projekcie są stałe w trzech okresach i wpisane w zakresie czynności pracownika: w M19-M21 40% na zadanie Z6 i 60% na zadanie Z7 (Z7 wcześniej: sprzęt i pierwsze egzemplarze na M22), w M22-M27 20% na Z6 (czujnik drzwi, GPS, agregacja sygnałów), 40% na Z7 (sprzęt, obudowa, testy środowiskowe), 40% na Z9 (odbiór zestawów, kalibracja, niezawodność w terenie), w M28-M30 100% na zadanie Z9. Suma udziałów w każdym miesiącu równa się 0,50 etatu. Dane referencyjne dotyczą umowy o pracę, kwot brutto miesięcznie. Źródło: No Fluff Jobs, „Rynek pracy IT 2025/2026”, s. 35, kategoria Embedded, poziom Mid: 12 000-17 000 zł, poziom Senior: 17 000-22 000 zł (mediany dolnych i górnych widełek z ogłoszeń o pracy); kategoria Embedded ogółem (s. 27): 13 000-19 000 zł. Stanowisko obsadzane jest na poziomie Mid, dlatego przyjęto 15 000 zł, czyli górną połowę widełek Mid (środek widełek to 14 500 zł). Osoba nie jest pracownikiem Everest11; umowa warunkowa dotycząca zatrudnienia z 08.06.2026 (warunek: dofinansowanie), stawka wynegocjowana przy jej podpisaniu. Wynagrodzenie niezbędne do realizacji prac B+R. Forma zatrudnienia: umowa o pracę.</w:t>
       </w:r>
     </w:p>
     <w:p>
@@ -9758,7 +9758,7 @@
           <w:color w:val="666666"/>
           <w:sz w:val="17"/>
         </w:rPr>
-        <w:t xml:space="preserve"> [1259 z 1500 znaków]</w:t>
+        <w:t xml:space="preserve"> [1296 z 1500 znaków]</w:t>
       </w:r>
     </w:p>
     <w:p>
@@ -9770,7 +9770,7 @@
         <w:rPr>
           <w:b w:val="0"/>
         </w:rPr>
-        <w:t>Koszt = 10 000,00 zł brutto/mc x narzut pracodawcy 1,205 = 12 050,00 zł/mc x 1,80 etatomiesiąca (miesięcy pracy w przeliczeniu na pełny etat) = 21 690,00 zł. Nakład w zadaniu Z7 wynosi 3 mc (M19-M21) x 60% x 0,50 etatu + 6 mc (M22-M27) x 30% x 0,50 etatu = 1,80 etatomiesiąca. Udziały czasu pracy w projekcie są stałe w trzech okresach i wpisane w zakresie czynności pracownika: w M19-M21 40% na zadanie Z6 i 60% na zadanie Z7 (Z7 wymaga wcześniejszego projektu sprzętu i pierwszych egzemplarzy platformy na M22), w M22-M27 20% na Z6 (interpretacja pól eFTI, ocena treści PoL i PoC), 30% na Z7 (scenariusze i progi alertów, użyteczność w kabinie) i 50% na Z9 (inspekcje ground truth od Fazy A), w M28-M30 100% na zadanie Z9. Suma udziałów w każdym miesiącu równa się 0,50 etatu, a w całym okresie M19-M30 6,00 etatomiesiąca. Dane referencyjne dotyczą kwot brutto miesięcznie za pełny etat (raport nie rozróżnia form zatrudnienia). Źródło: Hays Poland, „Raport płacowy 2026”, s. 40, sekcja Logistyka, stanowisko Specjalista ds. Logistyki: Min 8 000 zł, Opt 10 000 zł (najczęściej oferowane wynagrodzenie), Max 13 000 zł. Przyjęto 10 000 zł, czyli wartość najczęściej oferowaną. Wynagrodzenie niezbędne do realizacji prac B+R. Forma zatrudnienia: umowa o pracę.</w:t>
+        <w:t>Koszt = 10 000,00 zł brutto/mc x narzut pracodawcy 1,205 = 12 050,00 zł/mc x 1,80 etatomiesiąca (miesięcy pracy w przeliczeniu na pełny etat) = 21 690,00 zł. Nakład w zadaniu Z7 wynosi 3 mc (M19-M21) x 60% x 0,50 etatu + 6 mc (M22-M27) x 30% x 0,50 etatu = 1,80 etatomiesiąca. Udziały czasu pracy w projekcie są stałe w trzech okresach i wpisane w zakresie czynności pracownika: w M19-M21 40% na zadanie Z6 i 60% na zadanie Z7 (Z7 wcześniej: sprzęt i pierwsze egzemplarze na M22), w M22-M27 20% na Z6 (pola eFTI, ocena PoL i PoC), 30% na Z7 (scenariusze i progi alertów), 50% na Z9 (inspekcje ground truth od Fazy A), w M28-M30 100% na zadanie Z9. Suma udziałów w każdym miesiącu równa się 0,50 etatu. Dane referencyjne dotyczą kwot brutto miesięcznie za pełny etat (raport nie rozróżnia form zatrudnienia). Źródło: Hays Poland, „Raport płacowy 2026”, s. 40, sekcja Logistyka, stanowisko Specjalista ds. Logistyki: Min 8 000 zł, Opt 10 000 zł (najczęściej oferowane wynagrodzenie), Max 13 000 zł. Przyjęto 10 000 zł, czyli wartość najczęściej oferowaną. Osoba nie jest pracownikiem Everest11; umowa warunkowa dotycząca zatrudnienia z 08.06.2026 (warunek: dofinansowanie), stawka wynegocjowana przy jej podpisaniu. Wynagrodzenie niezbędne do realizacji prac B+R. Forma zatrudnienia: umowa o pracę.</w:t>
       </w:r>
     </w:p>
     <w:p>
@@ -9798,7 +9798,7 @@
           <w:color w:val="666666"/>
           <w:sz w:val="17"/>
         </w:rPr>
-        <w:t xml:space="preserve"> [1418 z 1500 znaków]</w:t>
+        <w:t xml:space="preserve"> [1414 z 1500 znaków]</w:t>
       </w:r>
     </w:p>
     <w:p>
@@ -9810,7 +9810,7 @@
         <w:rPr>
           <w:b w:val="0"/>
         </w:rPr>
-        <w:t>Koszt = 23 000,00 zł brutto/mc x narzut pracodawcy 1,205 = 27 715,00 zł/mc x 3,75 etatomiesiąca (miesięcy pracy w przeliczeniu na pełny etat) = 103 931,25 zł. Nakład w zadaniu Z9 wynosi 6 mc (M22-M27) x 1/3 x 0,75 etatu + 3 mc (M28-M30) x 100% x 0,75 etatu = 3,75 etatomiesiąca. Udziały czasu pracy w projekcie są stałe w trzech okresach i wpisane w zakresie czynności pracownika: w M19-M21 40% na zadanie Z6 i 60% na zadanie Z7 (Z7 wymaga wcześniejszego projektu sprzętu i pierwszych egzemplarzy platformy na M22), w M22-M27 po jednej trzeciej, bo równolegle trwają architektura i optymalizacja pipeline'u (Z6), strategia kompresji i walidacja modeli (Z7) oraz protokół KPI i dane terenowe (Z9) o zbliżonym nakładzie, w M28-M30 100% na zadanie Z9. Suma udziałów w każdym miesiącu równa się 0,75 etatu, a w całym okresie M19-M30 9,00 etatomiesiąca. Dane referencyjne dotyczą umowy o pracę, kwot brutto miesięcznie. Źródło: No Fluff Jobs, „Rynek pracy IT 2025/2026”, s. 33, kategoria AI, poziom Senior: 20 000-29 000 zł (mediany dolnych i górnych widełek z ogłoszeń o pracy); kategoria AI ogółem (s. 27): 19 000-24 000 zł. W raporcie nie ma osobnego poziomu Lead, więc stanowisko odniesiono do poziomu Senior. Przyjęto 23 000 zł, czyli dolną połowę widełek Senior (środek widełek to 24 500 zł) i górną część widełek kategorii AI ogółem. Wynagrodzenie niezbędne do realizacji prac B+R. Forma zatrudnienia: umowa o pracę.</w:t>
+        <w:t>Koszt = 23 000,00 zł brutto/mc x narzut pracodawcy 1,205 = 27 715,00 zł/mc x 3,75 etatomiesiąca (miesięcy pracy w przeliczeniu na pełny etat) = 103 931,25 zł. Nakład w zadaniu Z9 wynosi 6 mc (M22-M27) x 1/3 x 0,75 etatu + 3 mc (M28-M30) x 100% x 0,75 etatu = 3,75 etatomiesiąca. Udziały czasu pracy w projekcie są stałe w trzech okresach i wpisane w zakresie czynności pracownika: w M19-M21 40% na zadanie Z6 i 60% na zadanie Z7 (Z7 wcześniej: sprzęt i pierwsze egzemplarze na M22), w M22-M27 po jednej trzeciej (równolegle: architektura pipeline'u w Z6, strategia kompresji w Z7, protokół KPI w Z9), w M28-M30 100% na zadanie Z9. Suma udziałów w każdym miesiącu równa się 0,75 etatu. Dane referencyjne dotyczą umowy o pracę, kwot brutto miesięcznie. Źródło: No Fluff Jobs, „Rynek pracy IT 2025/2026”, s. 33, kategoria AI, poziom Senior: 20 000-29 000 zł (mediany dolnych i górnych widełek z ogłoszeń o pracy); kategoria AI ogółem (s. 27): 19 000-24 000 zł. W raporcie nie ma osobnego poziomu Lead, więc stanowisko odniesiono do poziomu Senior. Przyjęto 23 000 zł, czyli dolną połowę widełek Senior (środek widełek to 24 500 zł) i górną część widełek kategorii AI ogółem. Osoba nie jest pracownikiem Everest11; umowa warunkowa dotycząca zatrudnienia z 08.06.2026 (warunek: dofinansowanie), stawka wynegocjowana przy jej podpisaniu. Wynagrodzenie niezbędne do realizacji prac B+R. Forma zatrudnienia: umowa o pracę.</w:t>
       </w:r>
     </w:p>
     <w:p>
@@ -9830,7 +9830,7 @@
           <w:color w:val="666666"/>
           <w:sz w:val="17"/>
         </w:rPr>
-        <w:t xml:space="preserve"> [1384 z 1500 znaków]</w:t>
+        <w:t xml:space="preserve"> [1474 z 1500 znaków]</w:t>
       </w:r>
     </w:p>
     <w:p>
@@ -9842,7 +9842,7 @@
         <w:rPr>
           <w:b w:val="0"/>
         </w:rPr>
-        <w:t>Koszt = 16 500,00 zł brutto/mc x narzut pracodawcy 1,205 = 19 882,50 zł/mc x 3,75 etatomiesiąca (miesięcy pracy w przeliczeniu na pełny etat) = 74 559,38 zł. Nakład w zadaniu Z9 wynosi 6 mc (M22-M27) x 1/3 x 0,75 etatu + 3 mc (M28-M30) x 100% x 0,75 etatu = 3,75 etatomiesiąca. Udziały czasu pracy w projekcie są stałe w trzech okresach i wpisane w zakresie czynności pracownika: w M19-M21 40% na zadanie Z6 i 60% na zadanie Z7 (Z7 wymaga wcześniejszego projektu sprzętu i pierwszych egzemplarzy platformy na M22), w M22-M27 po jednej trzeciej, bo równolegle trwają integracja change detection i raport ML (Z6), implementacja kompresji i optymalizacja na platformie (Z7) oraz diagnoza przesunięcia domeny i korekty (Z9) o zbliżonym nakładzie, w M28-M30 100% na zadanie Z9. Suma udziałów w każdym miesiącu równa się 0,75 etatu, a w całym okresie M19-M30 9,00 etatomiesiąca. Dane referencyjne dotyczą umowy o pracę, kwot brutto miesięcznie. Źródło: No Fluff Jobs, „Rynek pracy IT 2025/2026”, s. 33, kategoria AI, poziom Mid: 14 000-21 000 zł, poziom Senior: 20 000-29 000 zł (mediany dolnych i górnych widełek z ogłoszeń o pracy). Stanowisko obsadzane jest na poziomie Mid, dlatego przyjęto 16 500 zł, czyli dolną połowę widełek Mid (środek widełek to 17 500 zł), 3 500 zł poniżej dolnej granicy Senior. Wynagrodzenie niezbędne do realizacji prac B+R. Forma zatrudnienia: umowa o pracę.</w:t>
+        <w:t>Koszt = 16 500,00 zł brutto/mc x narzut pracodawcy 1,205 = 19 882,50 zł/mc x 3,75 etatomiesiąca (miesięcy pracy w przeliczeniu na pełny etat) = 74 559,38 zł. Nakład w zadaniu Z9 wynosi 6 mc (M22-M27) x 1/3 x 0,75 etatu + 3 mc (M28-M30) x 100% x 0,75 etatu = 3,75 etatomiesiąca. Udziały czasu pracy w projekcie są stałe w trzech okresach i wpisane w zakresie czynności pracownika: w M19-M21 40% na zadanie Z6 i 60% na zadanie Z7 (Z7 wcześniej: sprzęt i pierwsze egzemplarze na M22), w M22-M27 po jednej trzeciej (równolegle: change detection i raport ML w Z6, kompresja w Z7, diagnoza przesunięcia domeny w Z9), w M28-M30 100% na zadanie Z9. Suma udziałów w każdym miesiącu równa się 0,75 etatu. Dane referencyjne dotyczą umowy o pracę, kwot brutto miesięcznie. Źródło: No Fluff Jobs, „Rynek pracy IT 2025/2026”, s. 33, kategoria AI, poziom Mid: 14 000-21 000 zł, poziom Senior: 20 000-29 000 zł (mediany dolnych i górnych widełek z ogłoszeń o pracy). Stanowisko obsadzane jest na poziomie Mid, dlatego przyjęto 16 500 zł, czyli dolną połowę widełek Mid (środek widełek to 17 500 zł), 3 500 zł poniżej dolnej granicy Senior. Osoba nie jest pracownikiem Everest11; umowa warunkowa dotycząca zatrudnienia z 08.06.2026 (warunek: dofinansowanie). Tytuł stanowiska odpowiada zakresowi odpowiedzialności, a stawka została wynegocjowana przy podpisaniu umowy warunkowej i mieści się w widełkach Mid. Wynagrodzenie niezbędne do realizacji prac B+R. Forma zatrudnienia: umowa o pracę.</w:t>
       </w:r>
     </w:p>
     <w:p>
@@ -9862,7 +9862,7 @@
           <w:color w:val="666666"/>
           <w:sz w:val="17"/>
         </w:rPr>
-        <w:t xml:space="preserve"> [1358 z 1500 znaków]</w:t>
+        <w:t xml:space="preserve"> [1346 z 1500 znaków]</w:t>
       </w:r>
     </w:p>
     <w:p>
@@ -9874,7 +9874,7 @@
         <w:rPr>
           <w:b w:val="0"/>
         </w:rPr>
-        <w:t>Koszt = 21 000,00 zł brutto/mc x narzut pracodawcy 1,205 = 25 305,00 zł/mc x 1,35 etatomiesiąca (miesięcy pracy w przeliczeniu na pełny etat) = 34 161,75 zł. Nakład w zadaniu Z9 wynosi 6 mc (M22-M27) x 40% x 0,25 etatu + 3 mc (M28-M30) x 100% x 0,25 etatu = 1,35 etatomiesiąca. Udziały czasu pracy w projekcie są stałe w trzech okresach i wpisane w zakresie czynności pracownika: w M19-M21 40% na zadanie Z6 i 60% na zadanie Z7 (Z7 wymaga wcześniejszego projektu sprzętu i pierwszych egzemplarzy platformy na M22), w M22-M27 20% na Z6 (podpis kryptograficzny i łańcuch integralności), 40% na Z7 (bezpieczny rozruch, podpisywanie aktualizacji, szyfrowanie transmisji) i 40% na Z9 (testy bezpieczeństwa w terenie, rola niezależnego ewaluatora), w M28-M30 100% na zadanie Z9. Suma udziałów w każdym miesiącu równa się 0,25 etatu, a w całym okresie M19-M30 3,00 etatomiesiąca. Dane referencyjne dotyczą umowy o pracę, kwot brutto miesięcznie. Źródło: No Fluff Jobs, „Rynek pracy IT 2025/2026”, s. 32, kategoria Security, poziom Senior: 20 000-28 000 zł, poziom Mid: 14 000-17 000 zł (mediany dolnych i górnych widełek z ogłoszeń o pracy); kategoria Security ogółem (s. 27): 17 000-23 000 zł. Przyjęto 21 000 zł, czyli dolną część widełek Senior (1 000 zł powyżej dolnej granicy). Wynagrodzenie niezbędne do realizacji prac B+R. Forma zatrudnienia: umowa o pracę.</w:t>
+        <w:t>Koszt = 21 000,00 zł brutto/mc x narzut pracodawcy 1,205 = 25 305,00 zł/mc x 1,35 etatomiesiąca (miesięcy pracy w przeliczeniu na pełny etat) = 34 161,75 zł. Nakład w zadaniu Z9 wynosi 6 mc (M22-M27) x 40% x 0,25 etatu + 3 mc (M28-M30) x 100% x 0,25 etatu = 1,35 etatomiesiąca. Udziały czasu pracy w projekcie są stałe w trzech okresach i wpisane w zakresie czynności pracownika: w M19-M21 40% na zadanie Z6 i 60% na zadanie Z7 (Z7 wcześniej: sprzęt i pierwsze egzemplarze na M22), w M22-M27 20% na Z6 (podpis i integralność), 40% na Z7 (bezpieczny rozruch, OTA, szyfrowanie), 40% na Z9 (testy w terenie, ewaluator), w M28-M30 100% na zadanie Z9. Suma udziałów w każdym miesiącu równa się 0,25 etatu. Dane referencyjne dotyczą umowy o pracę, kwot brutto miesięcznie. Źródło: No Fluff Jobs, „Rynek pracy IT 2025/2026”, s. 32, kategoria Security, poziom Senior: 20 000-28 000 zł, poziom Mid: 14 000-17 000 zł (mediany dolnych i górnych widełek z ogłoszeń o pracy); kategoria Security ogółem (s. 27): 17 000-23 000 zł. Przyjęto 21 000 zł, czyli dolną część widełek Senior (1 000 zł powyżej dolnej granicy). Osoba nie jest pracownikiem Everest11; umowa warunkowa dotycząca zatrudnienia z 08.06.2026 (warunek: dofinansowanie), stawka wynegocjowana przy jej podpisaniu. Wynagrodzenie niezbędne do realizacji prac B+R. Forma zatrudnienia: umowa o pracę.</w:t>
       </w:r>
     </w:p>
     <w:p>
@@ -9894,7 +9894,7 @@
           <w:color w:val="666666"/>
           <w:sz w:val="17"/>
         </w:rPr>
-        <w:t xml:space="preserve"> [1400 z 1500 znaków]</w:t>
+        <w:t xml:space="preserve"> [1420 z 1500 znaków]</w:t>
       </w:r>
     </w:p>
     <w:p>
@@ -9906,7 +9906,7 @@
         <w:rPr>
           <w:b w:val="0"/>
         </w:rPr>
-        <w:t>Koszt = 19 000,00 zł brutto/mc x narzut pracodawcy 1,205 = 22 895,00 zł/mc x 5,00 etatomiesiąca (miesięcy pracy w przeliczeniu na pełny etat) = 114 475,00 zł. Nakład w zadaniu Z9 wynosi 6 mc (M22-M27) x 1/3 x 1,00 etatu + 3 mc (M28-M30) x 100% x 1,00 etatu = 5,00 etatomiesiąca. Udziały czasu pracy w projekcie są stałe w trzech okresach i wpisane w zakresie czynności pracownika: w M19-M21 40% na zadanie Z6 i 60% na zadanie Z7 (Z7 wymaga wcześniejszego projektu sprzętu i pierwszych egzemplarzy platformy na M22), w M22-M27 po jednej trzeciej, bo równolegle trwają pipeline, generator eFTI i integracje testowe (Z6), oprogramowanie embedded (Z7) oraz logi i pomiary w Fazie A (Z9) o zbliżonym nakładzie, w M28-M30 100% na zadanie Z9. Suma udziałów w każdym miesiącu równa się 1,00 etatu, a w całym okresie M19-M30 12,00 etatomiesiąca. Dane referencyjne dotyczą umowy o pracę, kwot brutto miesięcznie. Źródło: No Fluff Jobs, „Rynek pracy IT 2025/2026”, s. 30, tabela „Wytwarzanie i rozwój oprogramowania”, kategoria Backend, poziom Senior: 18 500-25 000 zł (mediany dolnych i górnych widełek z ogłoszeń o pracy). Kategorię Backend przyjęto jako najbliższy odpowiednik zakresu stanowiska (oprogramowanie systemowe i potoki danych). Przyjęto 19 000 zł, czyli dolną część widełek Senior (500 zł powyżej dolnej granicy). Wynagrodzenie niezbędne do realizacji prac B+R. Forma zatrudnienia: umowa o pracę.</w:t>
+        <w:t>Koszt = 19 000,00 zł brutto/mc x narzut pracodawcy 1,205 = 22 895,00 zł/mc x 5,00 etatomiesiąca (miesięcy pracy w przeliczeniu na pełny etat) = 114 475,00 zł. Nakład w zadaniu Z9 wynosi 6 mc (M22-M27) x 1/3 x 1,00 etatu + 3 mc (M28-M30) x 100% x 1,00 etatu = 5,00 etatomiesiąca. Udziały czasu pracy w projekcie są stałe w trzech okresach i wpisane w zakresie czynności pracownika: w M19-M21 40% na zadanie Z6 i 60% na zadanie Z7 (Z7 wcześniej: sprzęt i pierwsze egzemplarze na M22), w M22-M27 po jednej trzeciej (równolegle: pipeline i integracje testowe w Z6, oprogramowanie embedded w Z7, logi i pomiary w Z9), w M28-M30 100% na zadanie Z9. Suma udziałów w każdym miesiącu równa się 1,00 etatu. Dane referencyjne dotyczą umowy o pracę, kwot brutto miesięcznie. Źródło: No Fluff Jobs, „Rynek pracy IT 2025/2026”, s. 30, tabela „Wytwarzanie i rozwój oprogramowania”, kategoria Backend, poziom Senior: 18 500-25 000 zł (mediany dolnych i górnych widełek z ogłoszeń o pracy). Kategorię Backend przyjęto jako najbliższy odpowiednik zakresu stanowiska (oprogramowanie systemowe i potoki danych). Przyjęto 19 000 zł, czyli dolną część widełek Senior (500 zł powyżej dolnej granicy). Osoba nie jest pracownikiem Everest11; umowa warunkowa dotycząca zatrudnienia z 08.06.2026 (warunek: dofinansowanie), stawka wynegocjowana przy jej podpisaniu. Wynagrodzenie niezbędne do realizacji prac B+R. Forma zatrudnienia: umowa o pracę.</w:t>
       </w:r>
     </w:p>
     <w:p>
@@ -9926,7 +9926,7 @@
           <w:color w:val="666666"/>
           <w:sz w:val="17"/>
         </w:rPr>
-        <w:t xml:space="preserve"> [1435 z 1500 znaków]</w:t>
+        <w:t xml:space="preserve"> [1432 z 1500 znaków]</w:t>
       </w:r>
     </w:p>
     <w:p>
@@ -9938,7 +9938,7 @@
         <w:rPr>
           <w:b w:val="0"/>
         </w:rPr>
-        <w:t>Koszt = 15 000,00 zł brutto/mc x narzut pracodawcy 1,205 = 18 075,00 zł/mc x 2,70 etatomiesiąca (miesięcy pracy w przeliczeniu na pełny etat) = 48 802,50 zł. Nakład w zadaniu Z9 wynosi 6 mc (M22-M27) x 40% x 0,50 etatu + 3 mc (M28-M30) x 100% x 0,50 etatu = 2,70 etatomiesiąca. Udziały czasu pracy w projekcie są stałe w trzech okresach i wpisane w zakresie czynności pracownika: w M19-M21 40% na zadanie Z6 i 60% na zadanie Z7 (Z7 wymaga wcześniejszego projektu sprzętu i pierwszych egzemplarzy platformy na M22), w M22-M27 20% na Z6 (czujnik drzwi, synchronizacja GPS, agregacja historii sygnałów), 40% na Z7 (architektura sprzętowa, obudowa, testy środowiskowe, pomiar opóźnienia) i 40% na Z9 (odbiór zestawów po montażu, kalibracja, rejestracja niezawodności w terenie), w M28-M30 100% na zadanie Z9. Suma udziałów w każdym miesiącu równa się 0,50 etatu, a w całym okresie M19-M30 6,00 etatomiesiąca. Dane referencyjne dotyczą umowy o pracę, kwot brutto miesięcznie. Źródło: No Fluff Jobs, „Rynek pracy IT 2025/2026”, s. 35, kategoria Embedded, poziom Mid: 12 000-17 000 zł, poziom Senior: 17 000-22 000 zł (mediany dolnych i górnych widełek z ogłoszeń o pracy); kategoria Embedded ogółem (s. 27): 13 000-19 000 zł. Stanowisko obsadzane jest na poziomie Mid, dlatego przyjęto 15 000 zł, czyli górną połowę widełek Mid (środek widełek to 14 500 zł). Wynagrodzenie niezbędne do realizacji prac B+R. Forma zatrudnienia: umowa o pracę.</w:t>
+        <w:t>Koszt = 15 000,00 zł brutto/mc x narzut pracodawcy 1,205 = 18 075,00 zł/mc x 2,70 etatomiesiąca (miesięcy pracy w przeliczeniu na pełny etat) = 48 802,50 zł. Nakład w zadaniu Z9 wynosi 6 mc (M22-M27) x 40% x 0,50 etatu + 3 mc (M28-M30) x 100% x 0,50 etatu = 2,70 etatomiesiąca. Udziały czasu pracy w projekcie są stałe w trzech okresach i wpisane w zakresie czynności pracownika: w M19-M21 40% na zadanie Z6 i 60% na zadanie Z7 (Z7 wcześniej: sprzęt i pierwsze egzemplarze na M22), w M22-M27 20% na Z6 (czujnik drzwi, GPS, agregacja sygnałów), 40% na Z7 (sprzęt, obudowa, testy środowiskowe), 40% na Z9 (odbiór zestawów, kalibracja, niezawodność w terenie), w M28-M30 100% na zadanie Z9. Suma udziałów w każdym miesiącu równa się 0,50 etatu. Dane referencyjne dotyczą umowy o pracę, kwot brutto miesięcznie. Źródło: No Fluff Jobs, „Rynek pracy IT 2025/2026”, s. 35, kategoria Embedded, poziom Mid: 12 000-17 000 zł, poziom Senior: 17 000-22 000 zł (mediany dolnych i górnych widełek z ogłoszeń o pracy); kategoria Embedded ogółem (s. 27): 13 000-19 000 zł. Stanowisko obsadzane jest na poziomie Mid, dlatego przyjęto 15 000 zł, czyli górną połowę widełek Mid (środek widełek to 14 500 zł). Osoba nie jest pracownikiem Everest11; umowa warunkowa dotycząca zatrudnienia z 08.06.2026 (warunek: dofinansowanie), stawka wynegocjowana przy jej podpisaniu. Wynagrodzenie niezbędne do realizacji prac B+R. Forma zatrudnienia: umowa o pracę.</w:t>
       </w:r>
     </w:p>
     <w:p>
@@ -9958,7 +9958,7 @@
           <w:color w:val="666666"/>
           <w:sz w:val="17"/>
         </w:rPr>
-        <w:t xml:space="preserve"> [1260 z 1500 znaków]</w:t>
+        <w:t xml:space="preserve"> [1297 z 1500 znaków]</w:t>
       </w:r>
     </w:p>
     <w:p>
@@ -9970,7 +9970,7 @@
         <w:rPr>
           <w:b w:val="0"/>
         </w:rPr>
-        <w:t>Koszt = 10 000,00 zł brutto/mc x narzut pracodawcy 1,205 = 12 050,00 zł/mc x 3,00 etatomiesiąca (miesięcy pracy w przeliczeniu na pełny etat) = 36 150,00 zł. Nakład w zadaniu Z9 wynosi 6 mc (M22-M27) x 50% x 0,50 etatu + 3 mc (M28-M30) x 100% x 0,50 etatu = 3,00 etatomiesiąca. Udziały czasu pracy w projekcie są stałe w trzech okresach i wpisane w zakresie czynności pracownika: w M19-M21 40% na zadanie Z6 i 60% na zadanie Z7 (Z7 wymaga wcześniejszego projektu sprzętu i pierwszych egzemplarzy platformy na M22), w M22-M27 20% na Z6 (interpretacja pól eFTI, ocena treści PoL i PoC), 30% na Z7 (scenariusze i progi alertów, użyteczność w kabinie) i 50% na Z9 (inspekcje ground truth od Fazy A), w M28-M30 100% na zadanie Z9. Suma udziałów w każdym miesiącu równa się 0,50 etatu, a w całym okresie M19-M30 6,00 etatomiesiąca. Dane referencyjne dotyczą kwot brutto miesięcznie za pełny etat (raport nie rozróżnia form zatrudnienia). Źródło: Hays Poland, „Raport płacowy 2026”, s. 40, sekcja Logistyka, stanowisko Specjalista ds. Logistyki: Min 8 000 zł, Opt 10 000 zł (najczęściej oferowane wynagrodzenie), Max 13 000 zł. Przyjęto 10 000 zł, czyli wartość najczęściej oferowaną. Wynagrodzenie niezbędne do realizacji prac B+R. Forma zatrudnienia: umowa o pracę.</w:t>
+        <w:t>Koszt = 10 000,00 zł brutto/mc x narzut pracodawcy 1,205 = 12 050,00 zł/mc x 3,00 etatomiesiąca (miesięcy pracy w przeliczeniu na pełny etat) = 36 150,00 zł. Nakład w zadaniu Z9 wynosi 6 mc (M22-M27) x 50% x 0,50 etatu + 3 mc (M28-M30) x 100% x 0,50 etatu = 3,00 etatomiesiąca. Udziały czasu pracy w projekcie są stałe w trzech okresach i wpisane w zakresie czynności pracownika: w M19-M21 40% na zadanie Z6 i 60% na zadanie Z7 (Z7 wcześniej: sprzęt i pierwsze egzemplarze na M22), w M22-M27 20% na Z6 (pola eFTI, ocena PoL i PoC), 30% na Z7 (scenariusze i progi alertów), 50% na Z9 (inspekcje ground truth od Fazy A), w M28-M30 100% na zadanie Z9. Suma udziałów w każdym miesiącu równa się 0,50 etatu. Dane referencyjne dotyczą kwot brutto miesięcznie za pełny etat (raport nie rozróżnia form zatrudnienia). Źródło: Hays Poland, „Raport płacowy 2026”, s. 40, sekcja Logistyka, stanowisko Specjalista ds. Logistyki: Min 8 000 zł, Opt 10 000 zł (najczęściej oferowane wynagrodzenie), Max 13 000 zł. Przyjęto 10 000 zł, czyli wartość najczęściej oferowaną. Osoba nie jest pracownikiem Everest11; umowa warunkowa dotycząca zatrudnienia z 08.06.2026 (warunek: dofinansowanie), stawka wynegocjowana przy jej podpisaniu. Wynagrodzenie niezbędne do realizacji prac B+R. Forma zatrudnienia: umowa o pracę.</w:t>
       </w:r>
     </w:p>
     <w:p>
@@ -9990,7 +9990,7 @@
           <w:color w:val="666666"/>
           <w:sz w:val="17"/>
         </w:rPr>
-        <w:t xml:space="preserve"> [837 z 1500 znaków]</w:t>
+        <w:t xml:space="preserve"> [917 z 1500 znaków]</w:t>
       </w:r>
     </w:p>
     <w:p>
@@ -10002,7 +10002,7 @@
         <w:rPr>
           <w:b w:val="0"/>
         </w:rPr>
-        <w:t>Koszt = 18 000,00 zł brutto/mc x narzut pracodawcy 1,205 = 21 690,00 zł/mc x 1,0 etatu x 3 mc (M28-M30, zadanie Z9) = 65 070,00 zł. Liczba miesięcy wynika z zakresu prac w zadaniu: w Z9 walidacja PoC i zgodności eFTI w terenie w Fazie B i oknie korekt. Dane referencyjne dotyczą umowy o pracę, kwot brutto miesięcznie. Źródło: No Fluff Jobs, „Rynek pracy IT 2025/2026”, s. 30, tabela „Wytwarzanie i rozwój oprogramowania”, kategorie Backend i Fullstack (widełki identyczne w obu kategoriach): poziom Mid 13 000-18 000 zł, poziom Senior 18 500-25 000 zł (mediany dolnych i górnych widełek z ogłoszeń o pracy). Stanowisko obsadzane jest na poziomie Mid, dlatego przyjęto 18 000 zł, czyli górną granicę widełek Mid, o 500 zł niższą niż dolna granica Senior. Wynagrodzenie niezbędne do realizacji prac B+R. Forma zatrudnienia: umowa o pracę.</w:t>
+        <w:t>Koszt = 18 000,00 zł brutto/mc x narzut pracodawcy 1,205 = 21 690,00 zł/mc x 1,0 etatu x 3 mc (M28-M30, zadanie Z9) = 65 070,00 zł. Liczba miesięcy wynika z zakresu prac w zadaniu: w Z9 walidacja PoC i zgodności eFTI w terenie w Fazie B i oknie korekt. Dane referencyjne dotyczą umowy o pracę, kwot brutto miesięcznie. Źródło: No Fluff Jobs, „Rynek pracy IT 2025/2026”, s. 30, tabela „Wytwarzanie i rozwój oprogramowania”, kategorie Backend i Fullstack (widełki identyczne w obu kategoriach): poziom Mid 13 000-18 000 zł, poziom Senior 18 500-25 000 zł (mediany dolnych i górnych widełek z ogłoszeń o pracy). Stanowisko obsadzane jest na poziomie Mid, dlatego przyjęto 18 000 zł, czyli górną granicę widełek Mid, o 500 zł niższą niż dolna granica Senior. Stanowisko zostanie obsadzone w drodze rekrutacji po otrzymaniu dofinansowania. Wynagrodzenie niezbędne do realizacji prac B+R. Forma zatrudnienia: umowa o pracę.</w:t>
       </w:r>
     </w:p>
     <w:p>
@@ -21117,6 +21117,116 @@
                 <w:sz w:val="15"/>
               </w:rPr>
               <w:t>K3-34, K3-35</w:t>
+            </w:r>
+          </w:p>
+        </w:tc>
+        <w:tc>
+          <w:tcPr>
+            <w:tcW w:type="dxa" w:w="737"/>
+          </w:tcPr>
+          <w:p>
+            <w:pPr>
+              <w:spacing w:after="20"/>
+            </w:pPr>
+            <w:r/>
+            <w:r>
+              <w:rPr>
+                <w:b w:val="0"/>
+                <w:sz w:val="15"/>
+              </w:rPr>
+              <w:t>WYSOKI</w:t>
+            </w:r>
+          </w:p>
+        </w:tc>
+      </w:tr>
+      <w:tr>
+        <w:tc>
+          <w:tcPr>
+            <w:tcW w:type="dxa" w:w="567"/>
+          </w:tcPr>
+          <w:p>
+            <w:pPr>
+              <w:spacing w:after="20"/>
+            </w:pPr>
+            <w:r/>
+            <w:r>
+              <w:rPr>
+                <w:b w:val="0"/>
+                <w:sz w:val="15"/>
+              </w:rPr>
+              <w:t>N31</w:t>
+            </w:r>
+          </w:p>
+        </w:tc>
+        <w:tc>
+          <w:tcPr>
+            <w:tcW w:type="dxa" w:w="1871"/>
+          </w:tcPr>
+          <w:p>
+            <w:pPr>
+              <w:spacing w:after="20"/>
+            </w:pPr>
+            <w:r/>
+            <w:r>
+              <w:rPr>
+                <w:b w:val="0"/>
+                <w:sz w:val="15"/>
+              </w:rPr>
+              <w:t>6.1 Zespół projektowy: status zatrudnienia osób Everest11 i PRz (uwagi 34, K5-1)</w:t>
+            </w:r>
+          </w:p>
+        </w:tc>
+        <w:tc>
+          <w:tcPr>
+            <w:tcW w:type="dxa" w:w="2041"/>
+          </w:tcPr>
+          <w:p>
+            <w:pPr>
+              <w:spacing w:after="20"/>
+            </w:pPr>
+            <w:r/>
+            <w:r>
+              <w:rPr>
+                <w:b w:val="0"/>
+                <w:sz w:val="15"/>
+              </w:rPr>
+              <w:t>Brak jednoznacznego statusu; pole „Status współpracy” i opis działu B+R sugerują, że część osób już pracuje u Lidera.</w:t>
+            </w:r>
+          </w:p>
+        </w:tc>
+        <w:tc>
+          <w:tcPr>
+            <w:tcW w:type="dxa" w:w="3175"/>
+          </w:tcPr>
+          <w:p>
+            <w:pPr>
+              <w:spacing w:after="20"/>
+            </w:pPr>
+            <w:r/>
+            <w:r>
+              <w:rPr>
+                <w:b w:val="0"/>
+                <w:sz w:val="15"/>
+              </w:rPr>
+              <w:t>Wpisać: żadna z osób Everest11 nie jest pracownikiem Everest11; wszystkie podpisały 08.06.2026 umowy warunkowe dotyczące zatrudnienia (warunek: otrzymanie dofinansowania); stawki wynegocjowano przy podpisaniu. Osoby PRz wykazane z imienia i nazwiska są pracownikami PRz. Dla każdej osoby termin rozpoczęcia, wymiar i sposób monitorowania limitu 276 godzin miesięcznie (K5-1).</w:t>
+            </w:r>
+          </w:p>
+        </w:tc>
+        <w:tc>
+          <w:tcPr>
+            <w:tcW w:type="dxa" w:w="1247"/>
+          </w:tcPr>
+          <w:p>
+            <w:pPr>
+              <w:spacing w:after="20"/>
+            </w:pPr>
+            <w:r/>
+            <w:r>
+              <w:rPr>
+                <w:b w:val="0"/>
+                <w:sz w:val="15"/>
+              </w:rPr>
+              <w:t>K3-34, K5-1</w:t>
             </w:r>
           </w:p>
         </w:tc>

</xml_diff>

<commit_message>
D27: Rada Konsorcjum (§ 9 umowy konsorcjum) zamiast komitetu sterującego w KM, ryzykach i trackerze
Co-Authored-By: Claude Sonnet 5.5 <noreply@anthropic.com>
Claude-Session: https://claude.ai/code/session_01672WnJhixnEcarbb7uiwfx
</commit_message>
<xml_diff>
--- a/Opisy_zadan_z_kamieniami_milowymi.docx
+++ b/Opisy_zadan_z_kamieniami_milowymi.docx
@@ -530,7 +530,7 @@
           <w:color w:val="666666"/>
           <w:sz w:val="17"/>
         </w:rPr>
-        <w:t xml:space="preserve"> [852 z 1300 znaków]</w:t>
+        <w:t xml:space="preserve"> [817 z 1300 znaków]</w:t>
       </w:r>
     </w:p>
     <w:p>
@@ -555,7 +555,7 @@
         <w:rPr>
           <w:b w:val="0"/>
         </w:rPr>
-        <w:t xml:space="preserve"> serii pomiarowych, z surowymi danymi i skryptami analizy; 3) konfiguracja z tabeli zgodności z czterema wymaganiami środowiskowymi; 4) luki w mitygacji MCI z zestawienia zapytań do baz IEEE Xplore, Scopus, Google Scholar i Google Patents z datami. Raport trafia do Everest11 jako specyfikacja sensorów dla Z2 do M6 i do PRz dla Z5. Decyzję o dalszym przebiegu podejmuje komitet sterujący: kierownik zarządzający Maciej Chrzanowski (przewodniczący), kierownik B+R i przedstawiciel PRz.</w:t>
+        <w:t xml:space="preserve"> serii pomiarowych, z surowymi danymi i skryptami analizy; 3) konfiguracja z tabeli zgodności z czterema wymaganiami środowiskowymi; 4) luki w mitygacji MCI z zestawienia zapytań do baz IEEE Xplore, Scopus, Google Scholar i Google Patents z datami. Raport trafia do Everest11 jako specyfikacja sensorów dla Z2 do M6 i do PRz dla Z5. Wynik w M9 ocenia Rada Konsorcjum (§ 9 umowy konsorcjum), a decyzję o dalszym przebiegu podejmuje Kierownik Projektu.</w:t>
       </w:r>
     </w:p>
     <w:p>
@@ -575,7 +575,7 @@
           <w:color w:val="666666"/>
           <w:sz w:val="17"/>
         </w:rPr>
-        <w:t xml:space="preserve"> [876 z 1300 znaków]</w:t>
+        <w:t xml:space="preserve"> [926 z 1300 znaków]</w:t>
       </w:r>
     </w:p>
     <w:p>
@@ -600,7 +600,7 @@
         <w:rPr>
           <w:b w:val="0"/>
         </w:rPr>
-        <w:t xml:space="preserve"> po dwóch iteracjach albo brak konfiguracji spełniającej cztery wymagania środowiskowe. O zmianie architektury sensorycznej (na przykład kamery EO ze światłem strukturalnym) albo o przerwaniu zadania decyduje komitet sterujący w M9. Odrzucenie hipotezy H2 nie jest niepowodzeniem, bo uzasadnia algorytm adaptacyjny w Z5.</w:t>
+        <w:t xml:space="preserve"> po dwóch iteracjach albo brak konfiguracji spełniającej cztery wymagania środowiskowe. Zmianę architektury sensorycznej (na przykład kamery EO ze światłem strukturalnym) albo przerwanie zadania w M9 rekomenduje Rada Konsorcjum (§ 9 umowy konsorcjum), a decyduje Kierownik Projektu. Odrzucenie hipotezy H2 nie jest niepowodzeniem, bo uzasadnia algorytm adaptacyjny w Z5.</w:t>
       </w:r>
     </w:p>
     <w:p>
@@ -1036,7 +1036,7 @@
           <w:color w:val="666666"/>
           <w:sz w:val="17"/>
         </w:rPr>
-        <w:t xml:space="preserve"> [802 z 1300 znaków]</w:t>
+        <w:t xml:space="preserve"> [858 z 1300 znaków]</w:t>
       </w:r>
     </w:p>
     <w:p>
@@ -1048,7 +1048,7 @@
         <w:rPr>
           <w:b w:val="0"/>
         </w:rPr>
-        <w:t>Odpowiada Everest11. Odbioru dokonuje kierownik B+R Damian Kordos na podstawie protokołu odbioru zbioru. PRz jako odbiorca potwierdza zgodność ze specyfikacją z Z3. Weryfikacja: 1) ZR z zestawienia zdarzeń z dokumentacją inspekcji i zdjęciami; 2) kappa z raportu zgodności trzech anotatorów (próba losowa warstwowa, ziarno w protokole) po rozstrzygnięciu rozbieżności konsensusem ze specjalistą TSL; 3) tor pomiarowy z logów rejestracji i raportu kalibracji (testy: stacjonarny co najmniej 24 h, drogowy co najmniej 500 km); 4) podział z wykazu kursów przypisanych do treningu, testu naturalnego i testu kontrolowanego, z sumami kontrolnymi, zamrożony przed startem Z4; 5) kompletność z raportu liczności klas, sezonów i typów nawierzchni. Decyzję o dalszym przebiegu podejmuje komitet sterujący w M18.</w:t>
+        <w:t>Odpowiada Everest11. Odbioru dokonuje kierownik B+R Damian Kordos na podstawie protokołu odbioru zbioru. PRz jako odbiorca potwierdza zgodność ze specyfikacją z Z3. Weryfikacja: 1) ZR z zestawienia zdarzeń z dokumentacją inspekcji i zdjęciami; 2) kappa z raportu zgodności trzech anotatorów (próba losowa warstwowa, ziarno w protokole) po rozstrzygnięciu rozbieżności konsensusem ze specjalistą TSL; 3) tor pomiarowy z logów rejestracji i raportu kalibracji (testy: stacjonarny co najmniej 24 h, drogowy co najmniej 500 km); 4) podział z wykazu kursów przypisanych do treningu, testu naturalnego i testu kontrolowanego, z sumami kontrolnymi, zamrożony przed startem Z4; 5) kompletność z raportu liczności klas, sezonów i typów nawierzchni. Wynik w M18 ocenia Rada Konsorcjum (§ 9 umowy konsorcjum), a decyzję o dalszym przebiegu podejmuje Kierownik Projektu.</w:t>
       </w:r>
     </w:p>
     <w:p>
@@ -1068,7 +1068,7 @@
           <w:color w:val="666666"/>
           <w:sz w:val="17"/>
         </w:rPr>
-        <w:t xml:space="preserve"> [710 z 1300 znaków]</w:t>
+        <w:t xml:space="preserve"> [781 z 1300 znaków]</w:t>
       </w:r>
     </w:p>
     <w:p>
@@ -1106,7 +1106,7 @@
         <w:rPr>
           <w:b w:val="0"/>
         </w:rPr>
-        <w:t xml:space="preserve"> po dwóch iteracjach reanotacji. Poniżej tych wartości komitet sterujący w M18 wstrzymuje zadanie Z4 i modyfikuje zakres. Zadanie jest krytyczne, bo bez zbioru nie powstaną modele Z4 i Z8.</w:t>
+        <w:t xml:space="preserve"> po dwóch iteracjach reanotacji. Poniżej tych wartości Rada Konsorcjum (§ 9 umowy konsorcjum) rekomenduje w M18 wstrzymanie zadania Z4 i zmianę zakresu, a decyzję podejmuje Kierownik Projektu. Zadanie jest krytyczne, bo bez zbioru nie powstaną modele Z4 i Z8.</w:t>
       </w:r>
     </w:p>
     <w:p>
@@ -1521,7 +1521,7 @@
           <w:color w:val="666666"/>
           <w:sz w:val="17"/>
         </w:rPr>
-        <w:t xml:space="preserve"> [837 z 1300 znaków]</w:t>
+        <w:t xml:space="preserve"> [893 z 1300 znaków]</w:t>
       </w:r>
     </w:p>
     <w:p>
@@ -1533,7 +1533,7 @@
         <w:rPr>
           <w:b w:val="0"/>
         </w:rPr>
-        <w:t>Odpowiada Politechnika Rzeszowska. Dokumenty zatwierdza kierownik B+R Damian Kordos, a taksonomię dodatkowo specjalista TSL Everest11 Michał Hajduk (konsultacja). Weryfikacja: 1) punkt kontrolny M10: raport zgodności kappa na próbie pilotażowej z Z2 oraz protokół przekazania taksonomii 1.0 i protokołu do Z2; 2) progi pośrednie z raportów benchmarkingu (AUC-ROC modelu ML na danych pilotażowych, mAP modelu CV na podzbiorze) z protokołem testowym; 3) kompletność z kontroli zgodności protokołu i taksonomii z wymaganą licznością, klasami i zasadami podziału. Metryki przelicza niezależnie AI Lead Everest11 Jakub Kosterna na zamrożonym zbiorze testowym. Instrukcja dopuszcza jeden kamień na zadanie, dlatego M10 jest punktem kontrolnym tego kamienia, z odrębnym protokołem. Decyzję o dalszym przebiegu podejmuje komitet sterujący w M18.</w:t>
+        <w:t>Odpowiada Politechnika Rzeszowska. Dokumenty zatwierdza kierownik B+R Damian Kordos, a taksonomię dodatkowo specjalista TSL Everest11 Michał Hajduk (konsultacja). Weryfikacja: 1) punkt kontrolny M10: raport zgodności kappa na próbie pilotażowej z Z2 oraz protokół przekazania taksonomii 1.0 i protokołu do Z2; 2) progi pośrednie z raportów benchmarkingu (AUC-ROC modelu ML na danych pilotażowych, mAP modelu CV na podzbiorze) z protokołem testowym; 3) kompletność z kontroli zgodności protokołu i taksonomii z wymaganą licznością, klasami i zasadami podziału. Metryki przelicza niezależnie AI Lead Everest11 Jakub Kosterna na zamrożonym zbiorze testowym. Instrukcja dopuszcza jeden kamień na zadanie, dlatego M10 jest punktem kontrolnym tego kamienia, z odrębnym protokołem. Wynik w M18 ocenia Rada Konsorcjum (§ 9 umowy konsorcjum), a decyzję o dalszym przebiegu podejmuje Kierownik Projektu.</w:t>
       </w:r>
     </w:p>
     <w:p>
@@ -1553,7 +1553,7 @@
           <w:color w:val="666666"/>
           <w:sz w:val="17"/>
         </w:rPr>
-        <w:t xml:space="preserve"> [745 z 1300 znaków]</w:t>
+        <w:t xml:space="preserve"> [824 z 1300 znaków]</w:t>
       </w:r>
     </w:p>
     <w:p>
@@ -1604,7 +1604,7 @@
         <w:rPr>
           <w:b w:val="0"/>
         </w:rPr>
-        <w:t xml:space="preserve"> dla wszystkich architektur. Wtedy komitet sterujący w M18 zawęża zakres (taksonomia do pasów i klinów według EN 12195, ML do 2-3 klas) albo przerywa zadanie. Zawężona taksonomia zachowuje funkcję automatycznej weryfikacji kluczowych zabezpieczeń, a wskaźniki mAP dla pominiętych klas aktualizujemy w trybie zmiany projektu.</w:t>
+        <w:t xml:space="preserve"> dla wszystkich architektur. Wtedy Rada Konsorcjum (§ 9 umowy konsorcjum) rekomenduje w M18 zawężenie zakresu (taksonomia do pasów i klinów według EN 12195, ML do 2-3 klas) albo przerwanie zadania, a decyzję podejmuje Kierownik Projektu. Zawężona taksonomia zachowuje funkcję automatycznej weryfikacji kluczowych zabezpieczeń, a wskaźniki mAP dla pominiętych klas aktualizujemy w trybie zmiany projektu.</w:t>
       </w:r>
     </w:p>
     <w:p>
@@ -2028,7 +2028,7 @@
           <w:color w:val="666666"/>
           <w:sz w:val="17"/>
         </w:rPr>
-        <w:t xml:space="preserve"> [789 z 1300 znaków]</w:t>
+        <w:t xml:space="preserve"> [845 z 1300 znaków]</w:t>
       </w:r>
     </w:p>
     <w:p>
@@ -2040,7 +2040,7 @@
         <w:rPr>
           <w:b w:val="0"/>
         </w:rPr>
-        <w:t>Odpowiada Politechnika Rzeszowska. Merytorycznej weryfikacji i odbioru dokonuje kierownik B+R Damian Kordos na podstawie protokołu testowego PRz. Niezależnie metryki przelicza AI Lead Everest11 Jakub Kosterna na zamrożonym zbiorze testowym i skrypcie ewaluacyjnym. Weryfikacja: 1) AUC-ROC z krzywych ROC dla każdej klasy z przedziałem ufności 95% i liczbą ZR w teście; 2) czułość i AUC-PR z krzywej precision-recall i macierzy pomyłek z wybranym progiem; 3) wartość bazowa z AUC detektora progowego na tym samym teście; 4) kompletność z raportu SHAP i LIME, wyniku walidacji krzyżowej i wykazu kursów w zbiorach. Model trafia do Everest11 protokołem zdawczo-odbiorczym jako wejście do Z7, a potwierdzenie terenowe wykonuje Z9. Decyzję o dalszym przebiegu podejmuje komitet sterujący w M27.</w:t>
+        <w:t>Odpowiada Politechnika Rzeszowska. Merytorycznej weryfikacji i odbioru dokonuje kierownik B+R Damian Kordos na podstawie protokołu testowego PRz. Niezależnie metryki przelicza AI Lead Everest11 Jakub Kosterna na zamrożonym zbiorze testowym i skrypcie ewaluacyjnym. Weryfikacja: 1) AUC-ROC z krzywych ROC dla każdej klasy z przedziałem ufności 95% i liczbą ZR w teście; 2) czułość i AUC-PR z krzywej precision-recall i macierzy pomyłek z wybranym progiem; 3) wartość bazowa z AUC detektora progowego na tym samym teście; 4) kompletność z raportu SHAP i LIME, wyniku walidacji krzyżowej i wykazu kursów w zbiorach. Model trafia do Everest11 protokołem zdawczo-odbiorczym jako wejście do Z7, a potwierdzenie terenowe wykonuje Z9. Wynik w M27 ocenia Rada Konsorcjum (§ 9 umowy konsorcjum), a decyzję o dalszym przebiegu podejmuje Kierownik Projektu.</w:t>
       </w:r>
     </w:p>
     <w:p>
@@ -2060,7 +2060,7 @@
           <w:color w:val="666666"/>
           <w:sz w:val="17"/>
         </w:rPr>
-        <w:t xml:space="preserve"> [868 z 1300 znaków]</w:t>
+        <w:t xml:space="preserve"> [947 z 1300 znaków]</w:t>
       </w:r>
     </w:p>
     <w:p>
@@ -2098,7 +2098,7 @@
         <w:rPr>
           <w:b w:val="0"/>
         </w:rPr>
-        <w:t>). Wtedy komitet sterujący w M27 ogranicza zakres funkcji albo przerywa zadanie modelowe, a Z7 przyjmuje model o niższych, lecz zmierzonych parametrach.</w:t>
+        <w:t>). Wtedy Rada Konsorcjum (§ 9 umowy konsorcjum) rekomenduje w M27 ograniczenie zakresu funkcji albo przerwanie zadania modelowego, a decyzję podejmuje Kierownik Projektu; Z7 przyjmuje model o niższych, lecz zmierzonych parametrach.</w:t>
       </w:r>
     </w:p>
     <w:p>
@@ -2526,7 +2526,7 @@
           <w:color w:val="666666"/>
           <w:sz w:val="17"/>
         </w:rPr>
-        <w:t xml:space="preserve"> [805 z 1300 znaków]</w:t>
+        <w:t xml:space="preserve"> [861 z 1300 znaków]</w:t>
       </w:r>
     </w:p>
     <w:p>
@@ -2538,7 +2538,7 @@
         <w:rPr>
           <w:b w:val="0"/>
         </w:rPr>
-        <w:t>Odpowiada Politechnika Rzeszowska. Merytorycznej weryfikacji i odbioru dokonuje kierownik B+R Damian Kordos na podstawie protokołu testów laboratoryjnych PRz. Niezależnie wyniki sprawdza AI Lead Everest11 Jakub Kosterna (powtórne wyliczenie z surowych logów). Weryfikacja: 1) błąd pozycji z raportu pomiarów fotogrametrycznych (mediana, percentyl 95, co najmniej 100 sekwencji); 2) przemieszczenie względne z tych samych sekwencji (różnice kolejnych klatek względem referencji); 3) redukcja RMSE z raportu badania ablacyjnego (co najmniej 200 par, z mitygacją i bez, wartość bazowa z Z1); 4) częstotliwość z logów znaczników czasu pipeline na docelowej konfiguracji. Moduł trafia do Everest11 protokołem zdawczo-odbiorczym jako wejście do Z7. Decyzję o dalszym przebiegu podejmuje komitet sterujący w M27.</w:t>
+        <w:t>Odpowiada Politechnika Rzeszowska. Merytorycznej weryfikacji i odbioru dokonuje kierownik B+R Damian Kordos na podstawie protokołu testów laboratoryjnych PRz. Niezależnie wyniki sprawdza AI Lead Everest11 Jakub Kosterna (powtórne wyliczenie z surowych logów). Weryfikacja: 1) błąd pozycji z raportu pomiarów fotogrametrycznych (mediana, percentyl 95, co najmniej 100 sekwencji); 2) przemieszczenie względne z tych samych sekwencji (różnice kolejnych klatek względem referencji); 3) redukcja RMSE z raportu badania ablacyjnego (co najmniej 200 par, z mitygacją i bez, wartość bazowa z Z1); 4) częstotliwość z logów znaczników czasu pipeline na docelowej konfiguracji. Moduł trafia do Everest11 protokołem zdawczo-odbiorczym jako wejście do Z7. Wynik w M27 ocenia Rada Konsorcjum (§ 9 umowy konsorcjum), a decyzję o dalszym przebiegu podejmuje Kierownik Projektu.</w:t>
       </w:r>
     </w:p>
     <w:p>
@@ -2558,7 +2558,7 @@
           <w:color w:val="666666"/>
           <w:sz w:val="17"/>
         </w:rPr>
-        <w:t xml:space="preserve"> [780 z 1300 znaków]</w:t>
+        <w:t xml:space="preserve"> [859 z 1300 znaków]</w:t>
       </w:r>
     </w:p>
     <w:p>
@@ -2596,7 +2596,7 @@
         <w:rPr>
           <w:b w:val="0"/>
         </w:rPr>
-        <w:t>. Wtedy komitet sterujący w M27 zawęża zakres funkcji 3D albo przerywa zadanie.</w:t>
+        <w:t>. Wtedy Rada Konsorcjum (§ 9 umowy konsorcjum) rekomenduje w M27 zawężenie zakresu funkcji 3D albo przerwanie zadania, a decyzję podejmuje Kierownik Projektu.</w:t>
       </w:r>
     </w:p>
     <w:p>
@@ -3012,7 +3012,7 @@
           <w:color w:val="666666"/>
           <w:sz w:val="17"/>
         </w:rPr>
-        <w:t xml:space="preserve"> [692 z 1300 znaków]</w:t>
+        <w:t xml:space="preserve"> [748 z 1300 znaków]</w:t>
       </w:r>
     </w:p>
     <w:p>
@@ -3024,7 +3024,7 @@
         <w:rPr>
           <w:b w:val="0"/>
         </w:rPr>
-        <w:t>Odpowiada Everest11. Odbioru dokonuje kierownik B+R Damian Kordos na podstawie protokołu testów. Weryfikacja: 1) pokrycie eFTI z raportu walidacji XSD i zestawienia pól wygenerowanych względem wykazu wszystkich pól obligatoryjnych, z oznaczeniem źródła pola (TMS albo sensory) i pól poza zakresem; 2) zgodność treści z porównania próby dokumentów z dokumentacją ground truth z Z2 (zdjęcia, protokoły inspekcji), raport zgodności dla każdego pola, wykonany skryptem; 3) czas i opóźnienie z logów systemowych z co najmniej 50 cykli; 4) kompletność z demonstracji generacji PoL i PoC, podpisu i eksportu eFTI na środowisku testowym. Decyzję o dalszym przebiegu podejmuje komitet sterujący w M27.</w:t>
+        <w:t>Odpowiada Everest11. Odbioru dokonuje kierownik B+R Damian Kordos na podstawie protokołu testów. Weryfikacja: 1) pokrycie eFTI z raportu walidacji XSD i zestawienia pól wygenerowanych względem wykazu wszystkich pól obligatoryjnych, z oznaczeniem źródła pola (TMS albo sensory) i pól poza zakresem; 2) zgodność treści z porównania próby dokumentów z dokumentacją ground truth z Z2 (zdjęcia, protokoły inspekcji), raport zgodności dla każdego pola, wykonany skryptem; 3) czas i opóźnienie z logów systemowych z co najmniej 50 cykli; 4) kompletność z demonstracji generacji PoL i PoC, podpisu i eksportu eFTI na środowisku testowym. Wynik w M27 ocenia Rada Konsorcjum (§ 9 umowy konsorcjum), a decyzję o dalszym przebiegu podejmuje Kierownik Projektu.</w:t>
       </w:r>
     </w:p>
     <w:p>
@@ -3044,7 +3044,7 @@
           <w:color w:val="666666"/>
           <w:sz w:val="17"/>
         </w:rPr>
-        <w:t xml:space="preserve"> [843 z 1300 znaków]</w:t>
+        <w:t xml:space="preserve"> [922 z 1300 znaków]</w:t>
       </w:r>
     </w:p>
     <w:p>
@@ -3095,7 +3095,7 @@
         <w:rPr>
           <w:b w:val="0"/>
         </w:rPr>
-        <w:t xml:space="preserve"> po dwóch iteracjach. Wtedy komitet sterujący w M27 ogranicza zakres funkcji dokumentacyjnych albo przerywa zadanie.</w:t>
+        <w:t xml:space="preserve"> po dwóch iteracjach. Wtedy Rada Konsorcjum (§ 9 umowy konsorcjum) rekomenduje w M27 ograniczenie zakresu funkcji dokumentacyjnych albo przerwanie zadania, a decyzję podejmuje Kierownik Projektu.</w:t>
       </w:r>
     </w:p>
     <w:p>
@@ -3498,7 +3498,7 @@
           <w:color w:val="666666"/>
           <w:sz w:val="17"/>
         </w:rPr>
-        <w:t xml:space="preserve"> [739 z 1300 znaków]</w:t>
+        <w:t xml:space="preserve"> [795 z 1300 znaków]</w:t>
       </w:r>
     </w:p>
     <w:p>
@@ -3510,7 +3510,7 @@
         <w:rPr>
           <w:b w:val="0"/>
         </w:rPr>
-        <w:t>Odpowiada Everest11. Odbioru dokonuje kierownik B+R Damian Kordos na podstawie protokołu testów embedded. PRz potwierdza udostępnienie infrastruktury badawczej. Weryfikacja: 1) opóźnienie z logu co najmniej 1000 pomiarów bez łączności (mediana, percentyl 95); 2) degradacja z raportu porównawczego FP32 i INT8 na zbiorach testowych z Z4 i Z8, przeliczonego niezależnie przez zespół PRz na zamrożonym zbiorze; 3) częstotliwość 5 Hz z logów znaczników czasu aktualizacji modelu 3D na rigu i w komorze, tą samą metodą co w Z9; 4) kompletność z raportów testów termicznych, wibracyjnych i EMC oraz karty zgodności platformy. Protokół zdawczo-odbiorczy systemu jest wejściem do Z9. Decyzję o dalszym przebiegu podejmuje komitet sterujący w M27.</w:t>
+        <w:t>Odpowiada Everest11. Odbioru dokonuje kierownik B+R Damian Kordos na podstawie protokołu testów embedded. PRz potwierdza udostępnienie infrastruktury badawczej. Weryfikacja: 1) opóźnienie z logu co najmniej 1000 pomiarów bez łączności (mediana, percentyl 95); 2) degradacja z raportu porównawczego FP32 i INT8 na zbiorach testowych z Z4 i Z8, przeliczonego niezależnie przez zespół PRz na zamrożonym zbiorze; 3) częstotliwość 5 Hz z logów znaczników czasu aktualizacji modelu 3D na rigu i w komorze, tą samą metodą co w Z9; 4) kompletność z raportów testów termicznych, wibracyjnych i EMC oraz karty zgodności platformy. Protokół zdawczo-odbiorczy systemu jest wejściem do Z9. Wynik w M27 ocenia Rada Konsorcjum (§ 9 umowy konsorcjum), a decyzję o dalszym przebiegu podejmuje Kierownik Projektu.</w:t>
       </w:r>
     </w:p>
     <w:p>
@@ -3530,7 +3530,7 @@
           <w:color w:val="666666"/>
           <w:sz w:val="17"/>
         </w:rPr>
-        <w:t xml:space="preserve"> [964 z 1300 znaków]</w:t>
+        <w:t xml:space="preserve"> [1039 z 1300 znaków]</w:t>
       </w:r>
     </w:p>
     <w:p>
@@ -3581,7 +3581,7 @@
         <w:rPr>
           <w:b w:val="0"/>
         </w:rPr>
-        <w:t xml:space="preserve"> po dwóch iteracjach. Wtedy komitet sterujący w M27 zmienia platformę lub zakres funkcji offline albo przerywa zadanie.</w:t>
+        <w:t xml:space="preserve"> po dwóch iteracjach. Wtedy Rada Konsorcjum (§ 9 umowy konsorcjum) rekomenduje w M27 zmianę platformy lub zakresu funkcji offline albo przerwanie zadania, a decyzję podejmuje Kierownik Projektu.</w:t>
       </w:r>
     </w:p>
     <w:p>
@@ -3956,7 +3956,7 @@
           <w:color w:val="666666"/>
           <w:sz w:val="17"/>
         </w:rPr>
-        <w:t xml:space="preserve"> [778 z 1300 znaków]</w:t>
+        <w:t xml:space="preserve"> [835 z 1300 znaków]</w:t>
       </w:r>
     </w:p>
     <w:p>
@@ -3968,7 +3968,7 @@
         <w:rPr>
           <w:b w:val="0"/>
         </w:rPr>
-        <w:t>Odpowiada Politechnika Rzeszowska. Merytorycznej weryfikacji i odbioru dokonuje kierownik B+R Damian Kordos na podstawie protokołu testowego PRz. Niezależnie metryki przelicza AI Lead Everest11 Jakub Kosterna na zamrożonym zbiorze testowym. Weryfikacja: 1) mAP z raportu dla każdej klasy na zbiorze co najmniej 2000 obrazów; 2) F1 change detection z porównania z etykietami referencyjnymi z Z2 na co najmniej 50 cyklach, z precyzją i czułością; 3) kompletność z dokumentacji taksonomii 2.0 i macierzy pomyłek. Modele CV trafiają do Everest11 protokołem w wersji RC do M26 (wejście do Z6, Z7 i Z9). Moduł change detection, zależny od modelu 3D z Z5, jest przekazywany w M27-M29 do walidacji w Z9. Decyzję o dalszym przebiegu podejmuje komitet sterujący w M26 (wersja RC) i w M30.</w:t>
+        <w:t>Odpowiada Politechnika Rzeszowska. Merytorycznej weryfikacji i odbioru dokonuje kierownik B+R Damian Kordos na podstawie protokołu testowego PRz. Niezależnie metryki przelicza AI Lead Everest11 Jakub Kosterna na zamrożonym zbiorze testowym. Weryfikacja: 1) mAP z raportu dla każdej klasy na zbiorze co najmniej 2000 obrazów; 2) F1 change detection z porównania z etykietami referencyjnymi z Z2 na co najmniej 50 cyklach, z precyzją i czułością; 3) kompletność z dokumentacji taksonomii 2.0 i macierzy pomyłek. Modele CV trafiają do Everest11 protokołem w wersji RC do M26 (wejście do Z6, Z7 i Z9). Moduł change detection, zależny od modelu 3D z Z5, jest przekazywany w M27-M29 do walidacji w Z9. Wyniki w M26 (wersja RC) i w M30 ocenia Rada Konsorcjum (§ 9 umowy konsorcjum), a decyzję o dalszym przebiegu podejmuje Kierownik Projektu.</w:t>
       </w:r>
     </w:p>
     <w:p>
@@ -3988,7 +3988,7 @@
           <w:color w:val="666666"/>
           <w:sz w:val="17"/>
         </w:rPr>
-        <w:t xml:space="preserve"> [871 z 1300 znaków]</w:t>
+        <w:t xml:space="preserve"> [952 z 1300 znaków]</w:t>
       </w:r>
     </w:p>
     <w:p>
@@ -4026,7 +4026,7 @@
         <w:rPr>
           <w:b w:val="0"/>
         </w:rPr>
-        <w:t xml:space="preserve"> po iteracjach. Wtedy komitet sterujący ogranicza zakres funkcji CV albo wydziela je do prac po projekcie.</w:t>
+        <w:t xml:space="preserve"> po iteracjach. Wtedy Rada Konsorcjum (§ 9 umowy konsorcjum) rekomenduje ograniczenie zakresu funkcji CV albo wydzielenie ich do prac po projekcie, a decyzję podejmuje Kierownik Projektu.</w:t>
       </w:r>
     </w:p>
     <w:p>
@@ -4564,7 +4564,7 @@
           <w:color w:val="666666"/>
           <w:sz w:val="17"/>
         </w:rPr>
-        <w:t xml:space="preserve"> [851 z 1300 znaków]</w:t>
+        <w:t xml:space="preserve"> [904 z 1300 znaków]</w:t>
       </w:r>
     </w:p>
     <w:p>
@@ -4576,7 +4576,7 @@
         <w:rPr>
           <w:b w:val="0"/>
         </w:rPr>
-        <w:t>Odpowiada Everest11. Odbioru dokonuje kierownik B+R Damian Kordos wspólnie z kierownikiem zarządzającym Maciejem Chrzanowskim. Protokołu nie podpisuje pracownik odbiorcy wdrożenia. Weryfikacja: a) AUC-ROC skryptem ewaluacyjnym zamrożonym protokołem z sumą kontrolną, uruchamianym przez osobę niezależną od Natanek Logistics i od modelowania, na danych z logu niemodyfikowalnego (append-only, podpis kryptograficzny); inspekcje ground truth są ślepe względem predykcji, ze zdjęciami ze znacznikiem czasu, a co najmniej 10% sprawdza ponownie druga osoba Everest11; b) mAP na obrazach terenowych z anotacją; c) do g) z logów systemowych i pomiarów fotogrametrycznych; h) z macierzy alertów w ujęciu kursu. PRz weryfikuje metodykę w Z8, bez prac i kosztów w Z9. Decyzję o zakończeniu, modyfikacji albo przerwaniu zadania podejmuje komitet sterujący w M30.</w:t>
+        <w:t>Odpowiada Everest11. Odbioru dokonuje kierownik B+R Damian Kordos wspólnie z kierownikiem zarządzającym Maciejem Chrzanowskim. Protokołu nie podpisuje pracownik odbiorcy wdrożenia. Weryfikacja: a) AUC-ROC skryptem ewaluacyjnym zamrożonym protokołem z sumą kontrolną, uruchamianym przez osobę niezależną od Natanek Logistics i od modelowania, na danych z logu niemodyfikowalnego (append-only, podpis kryptograficzny); inspekcje ground truth są ślepe względem predykcji, ze zdjęciami ze znacznikiem czasu, a co najmniej 10% sprawdza ponownie druga osoba Everest11; b) mAP na obrazach terenowych z anotacją; c) do g) z logów systemowych i pomiarów fotogrametrycznych; h) z macierzy alertów w ujęciu kursu. PRz weryfikuje metodykę w Z8, bez prac i kosztów w Z9. Zakończenie, modyfikację albo przerwanie zadania w M30 rekomenduje Rada Konsorcjum (§ 9 umowy konsorcjum), a decyzję podejmuje Kierownik Projektu.</w:t>
       </w:r>
     </w:p>
     <w:p>
@@ -4784,7 +4784,7 @@
           <w:color w:val="666666"/>
           <w:sz w:val="17"/>
         </w:rPr>
-        <w:t xml:space="preserve"> [1334 z 2000 znaków]</w:t>
+        <w:t xml:space="preserve"> [1452 z 2000 znaków]</w:t>
       </w:r>
     </w:p>
     <w:p>
@@ -4859,7 +4859,7 @@
         <w:rPr>
           <w:b w:val="0"/>
         </w:rPr>
-        <w:t>. Decyzję podejmuje komitet sterujący w M9 (zadanie Z1) lub w M27 (zadanie Z5): zmienia architekturę sensoryczną, na przykład na kamery EO ze światłem strukturalnym, albo przerywa zadanie.</w:t>
+        <w:t>. W M9 (zadanie Z1) lub w M27 (zadanie Z5) Rada Konsorcjum (§ 9 umowy konsorcjum) ocenia wyniki i rekomenduje zmianę architektury sensorycznej, na przykład na kamery EO ze światłem strukturalnym, albo przerwanie zadania. Decyzję podejmuje Kierownik Projektu, a zmiany w harmonogramie zgłasza do instytucji.</w:t>
       </w:r>
     </w:p>
     <w:p>
@@ -4998,7 +4998,7 @@
           <w:color w:val="666666"/>
           <w:sz w:val="17"/>
         </w:rPr>
-        <w:t xml:space="preserve"> [1683 z 2000 znaków]</w:t>
+        <w:t xml:space="preserve"> [1807 z 2000 znaków]</w:t>
       </w:r>
     </w:p>
     <w:p>
@@ -5073,7 +5073,7 @@
         <w:rPr>
           <w:b w:val="0"/>
         </w:rPr>
-        <w:t xml:space="preserve"> ZR łącznie w co najmniej 3 klasach. Decyzję podejmuje komitet sterujący w M18 (zadanie Z2) lub w M27 (zadanie Z4): ogranicza zakres funkcji albo przerywa zadanie modelowe.</w:t>
+        <w:t xml:space="preserve"> ZR łącznie w co najmniej 3 klasach. W M18 (zadanie Z2) lub w M27 (zadanie Z4) Rada Konsorcjum (§ 9 umowy konsorcjum) ocenia wyniki i rekomenduje ograniczenie zakresu funkcji albo przerwanie zadania modelowego. Decyzję podejmuje Kierownik Projektu, a zmiany w harmonogramie zgłasza do instytucji.</w:t>
       </w:r>
     </w:p>
     <w:p>
@@ -5173,7 +5173,7 @@
           <w:color w:val="666666"/>
           <w:sz w:val="17"/>
         </w:rPr>
-        <w:t xml:space="preserve"> [1329 z 2000 znaków]</w:t>
+        <w:t xml:space="preserve"> [1460 z 2000 znaków]</w:t>
       </w:r>
     </w:p>
     <w:p>
@@ -5235,7 +5235,7 @@
         <w:rPr>
           <w:b w:val="0"/>
         </w:rPr>
-        <w:t xml:space="preserve"> po iteracjach. Decyzję podejmuje komitet sterujący w M26 (wersja RC) i w M30 (końcowa): ogranicza zakres funkcji CV albo wydziela je do prac po projekcie.</w:t>
+        <w:t xml:space="preserve"> po iteracjach. W M26 (wersja RC) i w M30 (wersja końcowa) Rada Konsorcjum (§ 9 umowy konsorcjum) ocenia wyniki i rekomenduje ograniczenie zakresu funkcji CV albo wydzielenie ich do prac po projekcie. Decyzję podejmuje Kierownik Projektu, a zmiany w harmonogramie zgłasza do instytucji.</w:t>
       </w:r>
     </w:p>
     <w:p>
@@ -5335,7 +5335,7 @@
           <w:color w:val="666666"/>
           <w:sz w:val="17"/>
         </w:rPr>
-        <w:t xml:space="preserve"> [1424 z 2000 znaków]</w:t>
+        <w:t xml:space="preserve"> [1543 z 2000 znaków]</w:t>
       </w:r>
     </w:p>
     <w:p>
@@ -5410,7 +5410,7 @@
         <w:rPr>
           <w:b w:val="0"/>
         </w:rPr>
-        <w:t>. Decyzję podejmuje komitet sterujący w M27: zmienia platformę sprzętową lub zakres funkcji offline albo przerywa zadanie. Parametry sprzętowe można potwierdzić stanowiskowo, ale AUC-ROC i mAP na zdarzeniach naturalnych są niezbędne dla TRL 8.</w:t>
+        <w:t>. W M27 Rada Konsorcjum (§ 9 umowy konsorcjum) ocenia wyniki i rekomenduje zmianę platformy sprzętowej lub zakresu funkcji offline albo przerwanie zadania. Decyzję podejmuje Kierownik Projektu, a zmiany w harmonogramie zgłasza do instytucji. Parametry sprzętowe można potwierdzić stanowiskowo, ale AUC-ROC i mAP na zdarzeniach naturalnych są niezbędne dla TRL 8.</w:t>
       </w:r>
     </w:p>
     <w:p>
@@ -5698,7 +5698,7 @@
           <w:color w:val="666666"/>
           <w:sz w:val="17"/>
         </w:rPr>
-        <w:t xml:space="preserve"> [1317 z 2000 znaków]</w:t>
+        <w:t xml:space="preserve"> [1396 z 2000 znaków]</w:t>
       </w:r>
     </w:p>
     <w:p>
@@ -5734,7 +5734,7 @@
         <w:rPr>
           <w:b w:val="0"/>
         </w:rPr>
-        <w:t>Warunek no-go: model poniżej wartości minimalnych w M27. Wtedy komitet sterujący ogranicza zakres funkcji uruchamianych na platformie embedded albo przerywa zadanie Z7.</w:t>
+        <w:t>Warunek no-go: model poniżej wartości minimalnych w M27. Wtedy Rada Konsorcjum (§ 9 umowy konsorcjum) rekomenduje ograniczenie zakresu funkcji uruchamianych na platformie embedded albo przerwanie zadania Z7, a decyzję podejmuje Kierownik Projektu.</w:t>
       </w:r>
     </w:p>
     <w:p>
@@ -17648,7 +17648,7 @@
         <w:t xml:space="preserve">2. </w:t>
       </w:r>
       <w:r>
-        <w:t>Komitet sterujący: opisy kamieni zakładają organ w składzie kierownik zarządzający (przewodniczący), kierownik B+R i przedstawiciel PRz. Trzeba potwierdzić, że taki organ istnieje w umowie konsorcjum albo go tam wpisać. Alternatywa: decyzja kierownika zarządzającego po opinii kierownika B+R.</w:t>
+        <w:t>Rada Konsorcjum (§ 9 umowy konsorcjum): opisy kamieni i ryzyk odwołują się do Rady jako organu doradczego (po jednym przedstawicielu każdego członka, przewodniczy Kierownik Projektu). Rada ocenia wyniki i rekomenduje, decyzje o zmianie zakresu podejmuje Kierownik Projektu, a zmiany w harmonogramie zgłasza do instytucji. Do potwierdzenia: czy Kierownik Projektu to ten sam człowiek co kierownik zarządzający, oraz skład Rady (kto reprezentuje Everest11 i PRz).</w:t>
       </w:r>
     </w:p>
     <w:p>
@@ -20310,7 +20310,7 @@
                 <w:b w:val="0"/>
                 <w:sz w:val="15"/>
               </w:rPr>
-              <w:t>Brak komitetu sterującego i niezależnego nadzoru nad zadaniami PRz.</w:t>
+              <w:t>Brak opisu nadzoru nad zadaniami PRz i organu oceniającego kamienie milowe.</w:t>
             </w:r>
           </w:p>
         </w:tc>
@@ -20328,7 +20328,7 @@
                 <w:b w:val="0"/>
                 <w:sz w:val="15"/>
               </w:rPr>
-              <w:t>Dopisać skład i rolę komitetu (kierownik zarządzający, kierownik B+R, przedstawiciel PRz), osobę weryfikującą i odbierającą każdy KM oraz niezależne przeliczenie metryk przez AI Lead Everest11.</w:t>
+              <w:t>Dopisać Radę Konsorcjum z § 9 umowy konsorcjum (po jednym przedstawicielu każdego członka, przewodniczy Kierownik Projektu, posiedzenia co najmniej raz na 6 miesięcy, protokoły, ocena merytoryczna i formalna realizacji zadań na wniosek Kierownika Projektu, rekomendacje zmian w harmonogramie; to organ doradczy, nie decyzyjny), osobę weryfikującą i odbierającą każdy KM oraz niezależne przeliczenie metryk przez AI Lead Everest11.</w:t>
             </w:r>
           </w:p>
         </w:tc>
@@ -21645,7 +21645,7 @@
                 <w:b w:val="0"/>
                 <w:sz w:val="17"/>
               </w:rPr>
-              <w:t>852/1300</w:t>
+              <w:t>817/1300</w:t>
             </w:r>
           </w:p>
         </w:tc>
@@ -21663,7 +21663,7 @@
                 <w:b w:val="0"/>
                 <w:sz w:val="17"/>
               </w:rPr>
-              <w:t>876/1300</w:t>
+              <w:t>926/1300</w:t>
             </w:r>
           </w:p>
         </w:tc>
@@ -21791,7 +21791,7 @@
                 <w:b w:val="0"/>
                 <w:sz w:val="17"/>
               </w:rPr>
-              <w:t>802/1300</w:t>
+              <w:t>858/1300</w:t>
             </w:r>
           </w:p>
         </w:tc>
@@ -21809,7 +21809,7 @@
                 <w:b w:val="0"/>
                 <w:sz w:val="17"/>
               </w:rPr>
-              <w:t>710/1300</w:t>
+              <w:t>781/1300</w:t>
             </w:r>
           </w:p>
         </w:tc>
@@ -21937,7 +21937,7 @@
                 <w:b w:val="0"/>
                 <w:sz w:val="17"/>
               </w:rPr>
-              <w:t>837/1300</w:t>
+              <w:t>893/1300</w:t>
             </w:r>
           </w:p>
         </w:tc>
@@ -21955,7 +21955,7 @@
                 <w:b w:val="0"/>
                 <w:sz w:val="17"/>
               </w:rPr>
-              <w:t>745/1300</w:t>
+              <w:t>824/1300</w:t>
             </w:r>
           </w:p>
         </w:tc>
@@ -22083,7 +22083,7 @@
                 <w:b w:val="0"/>
                 <w:sz w:val="17"/>
               </w:rPr>
-              <w:t>789/1300</w:t>
+              <w:t>845/1300</w:t>
             </w:r>
           </w:p>
         </w:tc>
@@ -22101,7 +22101,7 @@
                 <w:b w:val="0"/>
                 <w:sz w:val="17"/>
               </w:rPr>
-              <w:t>868/1300</w:t>
+              <w:t>947/1300</w:t>
             </w:r>
           </w:p>
         </w:tc>
@@ -22229,7 +22229,7 @@
                 <w:b w:val="0"/>
                 <w:sz w:val="17"/>
               </w:rPr>
-              <w:t>805/1300</w:t>
+              <w:t>861/1300</w:t>
             </w:r>
           </w:p>
         </w:tc>
@@ -22247,7 +22247,7 @@
                 <w:b w:val="0"/>
                 <w:sz w:val="17"/>
               </w:rPr>
-              <w:t>780/1300</w:t>
+              <w:t>859/1300</w:t>
             </w:r>
           </w:p>
         </w:tc>
@@ -22375,7 +22375,7 @@
                 <w:b w:val="0"/>
                 <w:sz w:val="17"/>
               </w:rPr>
-              <w:t>692/1300</w:t>
+              <w:t>748/1300</w:t>
             </w:r>
           </w:p>
         </w:tc>
@@ -22393,7 +22393,7 @@
                 <w:b w:val="0"/>
                 <w:sz w:val="17"/>
               </w:rPr>
-              <w:t>843/1300</w:t>
+              <w:t>922/1300</w:t>
             </w:r>
           </w:p>
         </w:tc>
@@ -22521,7 +22521,7 @@
                 <w:b w:val="0"/>
                 <w:sz w:val="17"/>
               </w:rPr>
-              <w:t>739/1300</w:t>
+              <w:t>795/1300</w:t>
             </w:r>
           </w:p>
         </w:tc>
@@ -22539,7 +22539,7 @@
                 <w:b w:val="0"/>
                 <w:sz w:val="17"/>
               </w:rPr>
-              <w:t>964/1300</w:t>
+              <w:t>1039/1300</w:t>
             </w:r>
           </w:p>
         </w:tc>
@@ -22667,7 +22667,7 @@
                 <w:b w:val="0"/>
                 <w:sz w:val="17"/>
               </w:rPr>
-              <w:t>778/1300</w:t>
+              <w:t>835/1300</w:t>
             </w:r>
           </w:p>
         </w:tc>
@@ -22685,7 +22685,7 @@
                 <w:b w:val="0"/>
                 <w:sz w:val="17"/>
               </w:rPr>
-              <w:t>871/1300</w:t>
+              <w:t>952/1300</w:t>
             </w:r>
           </w:p>
         </w:tc>
@@ -22813,7 +22813,7 @@
                 <w:b w:val="0"/>
                 <w:sz w:val="17"/>
               </w:rPr>
-              <w:t>851/1300</w:t>
+              <w:t>904/1300</w:t>
             </w:r>
           </w:p>
         </w:tc>
@@ -23047,7 +23047,7 @@
                 <w:b w:val="0"/>
                 <w:sz w:val="17"/>
               </w:rPr>
-              <w:t>1334/2000</w:t>
+              <w:t>1452/2000</w:t>
             </w:r>
           </w:p>
         </w:tc>
@@ -23139,7 +23139,7 @@
                 <w:b w:val="0"/>
                 <w:sz w:val="17"/>
               </w:rPr>
-              <w:t>1683/2000</w:t>
+              <w:t>1807/2000</w:t>
             </w:r>
           </w:p>
         </w:tc>
@@ -23231,7 +23231,7 @@
                 <w:b w:val="0"/>
                 <w:sz w:val="17"/>
               </w:rPr>
-              <w:t>1329/2000</w:t>
+              <w:t>1460/2000</w:t>
             </w:r>
           </w:p>
         </w:tc>
@@ -23323,7 +23323,7 @@
                 <w:b w:val="0"/>
                 <w:sz w:val="17"/>
               </w:rPr>
-              <w:t>1424/2000</w:t>
+              <w:t>1543/2000</w:t>
             </w:r>
           </w:p>
         </w:tc>
@@ -23507,7 +23507,7 @@
                 <w:b w:val="0"/>
                 <w:sz w:val="17"/>
               </w:rPr>
-              <w:t>1317/2000</w:t>
+              <w:t>1396/2000</w:t>
             </w:r>
           </w:p>
         </w:tc>

</xml_diff>

<commit_message>
Kierownik Projektu = kierownik zarządzający, rekrutacja Backend i anotatorów potwierdzona
Co-Authored-By: Claude Sonnet 5.5 <noreply@anthropic.com>
Claude-Session: https://claude.ai/code/session_01672WnJhixnEcarbb7uiwfx
</commit_message>
<xml_diff>
--- a/Opisy_zadan_z_kamieniami_milowymi.docx
+++ b/Opisy_zadan_z_kamieniami_milowymi.docx
@@ -530,7 +530,7 @@
           <w:color w:val="666666"/>
           <w:sz w:val="17"/>
         </w:rPr>
-        <w:t xml:space="preserve"> [817 z 1300 znaków]</w:t>
+        <w:t xml:space="preserve"> [821 z 1300 znaków]</w:t>
       </w:r>
     </w:p>
     <w:p>
@@ -555,7 +555,7 @@
         <w:rPr>
           <w:b w:val="0"/>
         </w:rPr>
-        <w:t xml:space="preserve"> serii pomiarowych, z surowymi danymi i skryptami analizy; 3) konfiguracja z tabeli zgodności z czterema wymaganiami środowiskowymi; 4) luki w mitygacji MCI z zestawienia zapytań do baz IEEE Xplore, Scopus, Google Scholar i Google Patents z datami. Raport trafia do Everest11 jako specyfikacja sensorów dla Z2 do M6 i do PRz dla Z5. Wynik w M9 ocenia Rada Konsorcjum (§ 9 umowy konsorcjum), a decyzję o dalszym przebiegu podejmuje Kierownik Projektu.</w:t>
+        <w:t xml:space="preserve"> serii pomiarowych, z surowymi danymi i skryptami analizy; 3) konfiguracja z tabeli zgodności z czterema wymaganiami środowiskowymi; 4) luki w mitygacji MCI z zestawienia zapytań do baz IEEE Xplore, Scopus, Google Scholar i Google Patents z datami. Raport trafia do Everest11 jako specyfikacja sensorów dla Z2 do M6 i do PRz dla Z5. Wynik w M9 ocenia Rada Konsorcjum (§ 9 umowy konsorcjum), a decyzję o dalszym przebiegu podejmuje kierownik zarządzający.</w:t>
       </w:r>
     </w:p>
     <w:p>
@@ -575,7 +575,7 @@
           <w:color w:val="666666"/>
           <w:sz w:val="17"/>
         </w:rPr>
-        <w:t xml:space="preserve"> [926 z 1300 znaków]</w:t>
+        <w:t xml:space="preserve"> [930 z 1300 znaków]</w:t>
       </w:r>
     </w:p>
     <w:p>
@@ -600,7 +600,7 @@
         <w:rPr>
           <w:b w:val="0"/>
         </w:rPr>
-        <w:t xml:space="preserve"> po dwóch iteracjach albo brak konfiguracji spełniającej cztery wymagania środowiskowe. Zmianę architektury sensorycznej (na przykład kamery EO ze światłem strukturalnym) albo przerwanie zadania w M9 rekomenduje Rada Konsorcjum (§ 9 umowy konsorcjum), a decyduje Kierownik Projektu. Odrzucenie hipotezy H2 nie jest niepowodzeniem, bo uzasadnia algorytm adaptacyjny w Z5.</w:t>
+        <w:t xml:space="preserve"> po dwóch iteracjach albo brak konfiguracji spełniającej cztery wymagania środowiskowe. Zmianę architektury sensorycznej (na przykład kamery EO ze światłem strukturalnym) albo przerwanie zadania w M9 rekomenduje Rada Konsorcjum (§ 9 umowy konsorcjum), a decyduje kierownik zarządzający. Odrzucenie hipotezy H2 nie jest niepowodzeniem, bo uzasadnia algorytm adaptacyjny w Z5.</w:t>
       </w:r>
     </w:p>
     <w:p>
@@ -1036,7 +1036,7 @@
           <w:color w:val="666666"/>
           <w:sz w:val="17"/>
         </w:rPr>
-        <w:t xml:space="preserve"> [858 z 1300 znaków]</w:t>
+        <w:t xml:space="preserve"> [862 z 1300 znaków]</w:t>
       </w:r>
     </w:p>
     <w:p>
@@ -1048,7 +1048,7 @@
         <w:rPr>
           <w:b w:val="0"/>
         </w:rPr>
-        <w:t>Odpowiada Everest11. Odbioru dokonuje kierownik B+R Damian Kordos na podstawie protokołu odbioru zbioru. PRz jako odbiorca potwierdza zgodność ze specyfikacją z Z3. Weryfikacja: 1) ZR z zestawienia zdarzeń z dokumentacją inspekcji i zdjęciami; 2) kappa z raportu zgodności trzech anotatorów (próba losowa warstwowa, ziarno w protokole) po rozstrzygnięciu rozbieżności konsensusem ze specjalistą TSL; 3) tor pomiarowy z logów rejestracji i raportu kalibracji (testy: stacjonarny co najmniej 24 h, drogowy co najmniej 500 km); 4) podział z wykazu kursów przypisanych do treningu, testu naturalnego i testu kontrolowanego, z sumami kontrolnymi, zamrożony przed startem Z4; 5) kompletność z raportu liczności klas, sezonów i typów nawierzchni. Wynik w M18 ocenia Rada Konsorcjum (§ 9 umowy konsorcjum), a decyzję o dalszym przebiegu podejmuje Kierownik Projektu.</w:t>
+        <w:t>Odpowiada Everest11. Odbioru dokonuje kierownik B+R Damian Kordos na podstawie protokołu odbioru zbioru. PRz jako odbiorca potwierdza zgodność ze specyfikacją z Z3. Weryfikacja: 1) ZR z zestawienia zdarzeń z dokumentacją inspekcji i zdjęciami; 2) kappa z raportu zgodności trzech anotatorów (próba losowa warstwowa, ziarno w protokole) po rozstrzygnięciu rozbieżności konsensusem ze specjalistą TSL; 3) tor pomiarowy z logów rejestracji i raportu kalibracji (testy: stacjonarny co najmniej 24 h, drogowy co najmniej 500 km); 4) podział z wykazu kursów przypisanych do treningu, testu naturalnego i testu kontrolowanego, z sumami kontrolnymi, zamrożony przed startem Z4; 5) kompletność z raportu liczności klas, sezonów i typów nawierzchni. Wynik w M18 ocenia Rada Konsorcjum (§ 9 umowy konsorcjum), a decyzję o dalszym przebiegu podejmuje kierownik zarządzający.</w:t>
       </w:r>
     </w:p>
     <w:p>
@@ -1068,7 +1068,7 @@
           <w:color w:val="666666"/>
           <w:sz w:val="17"/>
         </w:rPr>
-        <w:t xml:space="preserve"> [781 z 1300 znaków]</w:t>
+        <w:t xml:space="preserve"> [785 z 1300 znaków]</w:t>
       </w:r>
     </w:p>
     <w:p>
@@ -1106,7 +1106,7 @@
         <w:rPr>
           <w:b w:val="0"/>
         </w:rPr>
-        <w:t xml:space="preserve"> po dwóch iteracjach reanotacji. Poniżej tych wartości Rada Konsorcjum (§ 9 umowy konsorcjum) rekomenduje w M18 wstrzymanie zadania Z4 i zmianę zakresu, a decyzję podejmuje Kierownik Projektu. Zadanie jest krytyczne, bo bez zbioru nie powstaną modele Z4 i Z8.</w:t>
+        <w:t xml:space="preserve"> po dwóch iteracjach reanotacji. Poniżej tych wartości Rada Konsorcjum (§ 9 umowy konsorcjum) rekomenduje w M18 wstrzymanie zadania Z4 i zmianę zakresu, a decyzję podejmuje kierownik zarządzający. Zadanie jest krytyczne, bo bez zbioru nie powstaną modele Z4 i Z8.</w:t>
       </w:r>
     </w:p>
     <w:p>
@@ -1521,7 +1521,7 @@
           <w:color w:val="666666"/>
           <w:sz w:val="17"/>
         </w:rPr>
-        <w:t xml:space="preserve"> [893 z 1300 znaków]</w:t>
+        <w:t xml:space="preserve"> [897 z 1300 znaków]</w:t>
       </w:r>
     </w:p>
     <w:p>
@@ -1533,7 +1533,7 @@
         <w:rPr>
           <w:b w:val="0"/>
         </w:rPr>
-        <w:t>Odpowiada Politechnika Rzeszowska. Dokumenty zatwierdza kierownik B+R Damian Kordos, a taksonomię dodatkowo specjalista TSL Everest11 Michał Hajduk (konsultacja). Weryfikacja: 1) punkt kontrolny M10: raport zgodności kappa na próbie pilotażowej z Z2 oraz protokół przekazania taksonomii 1.0 i protokołu do Z2; 2) progi pośrednie z raportów benchmarkingu (AUC-ROC modelu ML na danych pilotażowych, mAP modelu CV na podzbiorze) z protokołem testowym; 3) kompletność z kontroli zgodności protokołu i taksonomii z wymaganą licznością, klasami i zasadami podziału. Metryki przelicza niezależnie AI Lead Everest11 Jakub Kosterna na zamrożonym zbiorze testowym. Instrukcja dopuszcza jeden kamień na zadanie, dlatego M10 jest punktem kontrolnym tego kamienia, z odrębnym protokołem. Wynik w M18 ocenia Rada Konsorcjum (§ 9 umowy konsorcjum), a decyzję o dalszym przebiegu podejmuje Kierownik Projektu.</w:t>
+        <w:t>Odpowiada Politechnika Rzeszowska. Dokumenty zatwierdza kierownik B+R Damian Kordos, a taksonomię dodatkowo specjalista TSL Everest11 Michał Hajduk (konsultacja). Weryfikacja: 1) punkt kontrolny M10: raport zgodności kappa na próbie pilotażowej z Z2 oraz protokół przekazania taksonomii 1.0 i protokołu do Z2; 2) progi pośrednie z raportów benchmarkingu (AUC-ROC modelu ML na danych pilotażowych, mAP modelu CV na podzbiorze) z protokołem testowym; 3) kompletność z kontroli zgodności protokołu i taksonomii z wymaganą licznością, klasami i zasadami podziału. Metryki przelicza niezależnie AI Lead Everest11 Jakub Kosterna na zamrożonym zbiorze testowym. Instrukcja dopuszcza jeden kamień na zadanie, dlatego M10 jest punktem kontrolnym tego kamienia, z odrębnym protokołem. Wynik w M18 ocenia Rada Konsorcjum (§ 9 umowy konsorcjum), a decyzję o dalszym przebiegu podejmuje kierownik zarządzający.</w:t>
       </w:r>
     </w:p>
     <w:p>
@@ -1553,7 +1553,7 @@
           <w:color w:val="666666"/>
           <w:sz w:val="17"/>
         </w:rPr>
-        <w:t xml:space="preserve"> [824 z 1300 znaków]</w:t>
+        <w:t xml:space="preserve"> [828 z 1300 znaków]</w:t>
       </w:r>
     </w:p>
     <w:p>
@@ -1604,7 +1604,7 @@
         <w:rPr>
           <w:b w:val="0"/>
         </w:rPr>
-        <w:t xml:space="preserve"> dla wszystkich architektur. Wtedy Rada Konsorcjum (§ 9 umowy konsorcjum) rekomenduje w M18 zawężenie zakresu (taksonomia do pasów i klinów według EN 12195, ML do 2-3 klas) albo przerwanie zadania, a decyzję podejmuje Kierownik Projektu. Zawężona taksonomia zachowuje funkcję automatycznej weryfikacji kluczowych zabezpieczeń, a wskaźniki mAP dla pominiętych klas aktualizujemy w trybie zmiany projektu.</w:t>
+        <w:t xml:space="preserve"> dla wszystkich architektur. Wtedy Rada Konsorcjum (§ 9 umowy konsorcjum) rekomenduje w M18 zawężenie zakresu (taksonomia do pasów i klinów według EN 12195, ML do 2-3 klas) albo przerwanie zadania, a decyzję podejmuje kierownik zarządzający. Zawężona taksonomia zachowuje funkcję automatycznej weryfikacji kluczowych zabezpieczeń, a wskaźniki mAP dla pominiętych klas aktualizujemy w trybie zmiany projektu.</w:t>
       </w:r>
     </w:p>
     <w:p>
@@ -2028,7 +2028,7 @@
           <w:color w:val="666666"/>
           <w:sz w:val="17"/>
         </w:rPr>
-        <w:t xml:space="preserve"> [845 z 1300 znaków]</w:t>
+        <w:t xml:space="preserve"> [849 z 1300 znaków]</w:t>
       </w:r>
     </w:p>
     <w:p>
@@ -2040,7 +2040,7 @@
         <w:rPr>
           <w:b w:val="0"/>
         </w:rPr>
-        <w:t>Odpowiada Politechnika Rzeszowska. Merytorycznej weryfikacji i odbioru dokonuje kierownik B+R Damian Kordos na podstawie protokołu testowego PRz. Niezależnie metryki przelicza AI Lead Everest11 Jakub Kosterna na zamrożonym zbiorze testowym i skrypcie ewaluacyjnym. Weryfikacja: 1) AUC-ROC z krzywych ROC dla każdej klasy z przedziałem ufności 95% i liczbą ZR w teście; 2) czułość i AUC-PR z krzywej precision-recall i macierzy pomyłek z wybranym progiem; 3) wartość bazowa z AUC detektora progowego na tym samym teście; 4) kompletność z raportu SHAP i LIME, wyniku walidacji krzyżowej i wykazu kursów w zbiorach. Model trafia do Everest11 protokołem zdawczo-odbiorczym jako wejście do Z7, a potwierdzenie terenowe wykonuje Z9. Wynik w M27 ocenia Rada Konsorcjum (§ 9 umowy konsorcjum), a decyzję o dalszym przebiegu podejmuje Kierownik Projektu.</w:t>
+        <w:t>Odpowiada Politechnika Rzeszowska. Merytorycznej weryfikacji i odbioru dokonuje kierownik B+R Damian Kordos na podstawie protokołu testowego PRz. Niezależnie metryki przelicza AI Lead Everest11 Jakub Kosterna na zamrożonym zbiorze testowym i skrypcie ewaluacyjnym. Weryfikacja: 1) AUC-ROC z krzywych ROC dla każdej klasy z przedziałem ufności 95% i liczbą ZR w teście; 2) czułość i AUC-PR z krzywej precision-recall i macierzy pomyłek z wybranym progiem; 3) wartość bazowa z AUC detektora progowego na tym samym teście; 4) kompletność z raportu SHAP i LIME, wyniku walidacji krzyżowej i wykazu kursów w zbiorach. Model trafia do Everest11 protokołem zdawczo-odbiorczym jako wejście do Z7, a potwierdzenie terenowe wykonuje Z9. Wynik w M27 ocenia Rada Konsorcjum (§ 9 umowy konsorcjum), a decyzję o dalszym przebiegu podejmuje kierownik zarządzający.</w:t>
       </w:r>
     </w:p>
     <w:p>
@@ -2060,7 +2060,7 @@
           <w:color w:val="666666"/>
           <w:sz w:val="17"/>
         </w:rPr>
-        <w:t xml:space="preserve"> [947 z 1300 znaków]</w:t>
+        <w:t xml:space="preserve"> [951 z 1300 znaków]</w:t>
       </w:r>
     </w:p>
     <w:p>
@@ -2098,7 +2098,7 @@
         <w:rPr>
           <w:b w:val="0"/>
         </w:rPr>
-        <w:t>). Wtedy Rada Konsorcjum (§ 9 umowy konsorcjum) rekomenduje w M27 ograniczenie zakresu funkcji albo przerwanie zadania modelowego, a decyzję podejmuje Kierownik Projektu; Z7 przyjmuje model o niższych, lecz zmierzonych parametrach.</w:t>
+        <w:t>). Wtedy Rada Konsorcjum (§ 9 umowy konsorcjum) rekomenduje w M27 ograniczenie zakresu funkcji albo przerwanie zadania modelowego, a decyzję podejmuje kierownik zarządzający; Z7 przyjmuje model o niższych, lecz zmierzonych parametrach.</w:t>
       </w:r>
     </w:p>
     <w:p>
@@ -2526,7 +2526,7 @@
           <w:color w:val="666666"/>
           <w:sz w:val="17"/>
         </w:rPr>
-        <w:t xml:space="preserve"> [861 z 1300 znaków]</w:t>
+        <w:t xml:space="preserve"> [865 z 1300 znaków]</w:t>
       </w:r>
     </w:p>
     <w:p>
@@ -2538,7 +2538,7 @@
         <w:rPr>
           <w:b w:val="0"/>
         </w:rPr>
-        <w:t>Odpowiada Politechnika Rzeszowska. Merytorycznej weryfikacji i odbioru dokonuje kierownik B+R Damian Kordos na podstawie protokołu testów laboratoryjnych PRz. Niezależnie wyniki sprawdza AI Lead Everest11 Jakub Kosterna (powtórne wyliczenie z surowych logów). Weryfikacja: 1) błąd pozycji z raportu pomiarów fotogrametrycznych (mediana, percentyl 95, co najmniej 100 sekwencji); 2) przemieszczenie względne z tych samych sekwencji (różnice kolejnych klatek względem referencji); 3) redukcja RMSE z raportu badania ablacyjnego (co najmniej 200 par, z mitygacją i bez, wartość bazowa z Z1); 4) częstotliwość z logów znaczników czasu pipeline na docelowej konfiguracji. Moduł trafia do Everest11 protokołem zdawczo-odbiorczym jako wejście do Z7. Wynik w M27 ocenia Rada Konsorcjum (§ 9 umowy konsorcjum), a decyzję o dalszym przebiegu podejmuje Kierownik Projektu.</w:t>
+        <w:t>Odpowiada Politechnika Rzeszowska. Merytorycznej weryfikacji i odbioru dokonuje kierownik B+R Damian Kordos na podstawie protokołu testów laboratoryjnych PRz. Niezależnie wyniki sprawdza AI Lead Everest11 Jakub Kosterna (powtórne wyliczenie z surowych logów). Weryfikacja: 1) błąd pozycji z raportu pomiarów fotogrametrycznych (mediana, percentyl 95, co najmniej 100 sekwencji); 2) przemieszczenie względne z tych samych sekwencji (różnice kolejnych klatek względem referencji); 3) redukcja RMSE z raportu badania ablacyjnego (co najmniej 200 par, z mitygacją i bez, wartość bazowa z Z1); 4) częstotliwość z logów znaczników czasu pipeline na docelowej konfiguracji. Moduł trafia do Everest11 protokołem zdawczo-odbiorczym jako wejście do Z7. Wynik w M27 ocenia Rada Konsorcjum (§ 9 umowy konsorcjum), a decyzję o dalszym przebiegu podejmuje kierownik zarządzający.</w:t>
       </w:r>
     </w:p>
     <w:p>
@@ -2558,7 +2558,7 @@
           <w:color w:val="666666"/>
           <w:sz w:val="17"/>
         </w:rPr>
-        <w:t xml:space="preserve"> [859 z 1300 znaków]</w:t>
+        <w:t xml:space="preserve"> [863 z 1300 znaków]</w:t>
       </w:r>
     </w:p>
     <w:p>
@@ -2596,7 +2596,7 @@
         <w:rPr>
           <w:b w:val="0"/>
         </w:rPr>
-        <w:t>. Wtedy Rada Konsorcjum (§ 9 umowy konsorcjum) rekomenduje w M27 zawężenie zakresu funkcji 3D albo przerwanie zadania, a decyzję podejmuje Kierownik Projektu.</w:t>
+        <w:t>. Wtedy Rada Konsorcjum (§ 9 umowy konsorcjum) rekomenduje w M27 zawężenie zakresu funkcji 3D albo przerwanie zadania, a decyzję podejmuje kierownik zarządzający.</w:t>
       </w:r>
     </w:p>
     <w:p>
@@ -3012,7 +3012,7 @@
           <w:color w:val="666666"/>
           <w:sz w:val="17"/>
         </w:rPr>
-        <w:t xml:space="preserve"> [748 z 1300 znaków]</w:t>
+        <w:t xml:space="preserve"> [752 z 1300 znaków]</w:t>
       </w:r>
     </w:p>
     <w:p>
@@ -3024,7 +3024,7 @@
         <w:rPr>
           <w:b w:val="0"/>
         </w:rPr>
-        <w:t>Odpowiada Everest11. Odbioru dokonuje kierownik B+R Damian Kordos na podstawie protokołu testów. Weryfikacja: 1) pokrycie eFTI z raportu walidacji XSD i zestawienia pól wygenerowanych względem wykazu wszystkich pól obligatoryjnych, z oznaczeniem źródła pola (TMS albo sensory) i pól poza zakresem; 2) zgodność treści z porównania próby dokumentów z dokumentacją ground truth z Z2 (zdjęcia, protokoły inspekcji), raport zgodności dla każdego pola, wykonany skryptem; 3) czas i opóźnienie z logów systemowych z co najmniej 50 cykli; 4) kompletność z demonstracji generacji PoL i PoC, podpisu i eksportu eFTI na środowisku testowym. Wynik w M27 ocenia Rada Konsorcjum (§ 9 umowy konsorcjum), a decyzję o dalszym przebiegu podejmuje Kierownik Projektu.</w:t>
+        <w:t>Odpowiada Everest11. Odbioru dokonuje kierownik B+R Damian Kordos na podstawie protokołu testów. Weryfikacja: 1) pokrycie eFTI z raportu walidacji XSD i zestawienia pól wygenerowanych względem wykazu wszystkich pól obligatoryjnych, z oznaczeniem źródła pola (TMS albo sensory) i pól poza zakresem; 2) zgodność treści z porównania próby dokumentów z dokumentacją ground truth z Z2 (zdjęcia, protokoły inspekcji), raport zgodności dla każdego pola, wykonany skryptem; 3) czas i opóźnienie z logów systemowych z co najmniej 50 cykli; 4) kompletność z demonstracji generacji PoL i PoC, podpisu i eksportu eFTI na środowisku testowym. Wynik w M27 ocenia Rada Konsorcjum (§ 9 umowy konsorcjum), a decyzję o dalszym przebiegu podejmuje kierownik zarządzający.</w:t>
       </w:r>
     </w:p>
     <w:p>
@@ -3044,7 +3044,7 @@
           <w:color w:val="666666"/>
           <w:sz w:val="17"/>
         </w:rPr>
-        <w:t xml:space="preserve"> [922 z 1300 znaków]</w:t>
+        <w:t xml:space="preserve"> [926 z 1300 znaków]</w:t>
       </w:r>
     </w:p>
     <w:p>
@@ -3095,7 +3095,7 @@
         <w:rPr>
           <w:b w:val="0"/>
         </w:rPr>
-        <w:t xml:space="preserve"> po dwóch iteracjach. Wtedy Rada Konsorcjum (§ 9 umowy konsorcjum) rekomenduje w M27 ograniczenie zakresu funkcji dokumentacyjnych albo przerwanie zadania, a decyzję podejmuje Kierownik Projektu.</w:t>
+        <w:t xml:space="preserve"> po dwóch iteracjach. Wtedy Rada Konsorcjum (§ 9 umowy konsorcjum) rekomenduje w M27 ograniczenie zakresu funkcji dokumentacyjnych albo przerwanie zadania, a decyzję podejmuje kierownik zarządzający.</w:t>
       </w:r>
     </w:p>
     <w:p>
@@ -3498,7 +3498,7 @@
           <w:color w:val="666666"/>
           <w:sz w:val="17"/>
         </w:rPr>
-        <w:t xml:space="preserve"> [795 z 1300 znaków]</w:t>
+        <w:t xml:space="preserve"> [799 z 1300 znaków]</w:t>
       </w:r>
     </w:p>
     <w:p>
@@ -3510,7 +3510,7 @@
         <w:rPr>
           <w:b w:val="0"/>
         </w:rPr>
-        <w:t>Odpowiada Everest11. Odbioru dokonuje kierownik B+R Damian Kordos na podstawie protokołu testów embedded. PRz potwierdza udostępnienie infrastruktury badawczej. Weryfikacja: 1) opóźnienie z logu co najmniej 1000 pomiarów bez łączności (mediana, percentyl 95); 2) degradacja z raportu porównawczego FP32 i INT8 na zbiorach testowych z Z4 i Z8, przeliczonego niezależnie przez zespół PRz na zamrożonym zbiorze; 3) częstotliwość 5 Hz z logów znaczników czasu aktualizacji modelu 3D na rigu i w komorze, tą samą metodą co w Z9; 4) kompletność z raportów testów termicznych, wibracyjnych i EMC oraz karty zgodności platformy. Protokół zdawczo-odbiorczy systemu jest wejściem do Z9. Wynik w M27 ocenia Rada Konsorcjum (§ 9 umowy konsorcjum), a decyzję o dalszym przebiegu podejmuje Kierownik Projektu.</w:t>
+        <w:t>Odpowiada Everest11. Odbioru dokonuje kierownik B+R Damian Kordos na podstawie protokołu testów embedded. PRz potwierdza udostępnienie infrastruktury badawczej. Weryfikacja: 1) opóźnienie z logu co najmniej 1000 pomiarów bez łączności (mediana, percentyl 95); 2) degradacja z raportu porównawczego FP32 i INT8 na zbiorach testowych z Z4 i Z8, przeliczonego niezależnie przez zespół PRz na zamrożonym zbiorze; 3) częstotliwość 5 Hz z logów znaczników czasu aktualizacji modelu 3D na rigu i w komorze, tą samą metodą co w Z9; 4) kompletność z raportów testów termicznych, wibracyjnych i EMC oraz karty zgodności platformy. Protokół zdawczo-odbiorczy systemu jest wejściem do Z9. Wynik w M27 ocenia Rada Konsorcjum (§ 9 umowy konsorcjum), a decyzję o dalszym przebiegu podejmuje kierownik zarządzający.</w:t>
       </w:r>
     </w:p>
     <w:p>
@@ -3530,7 +3530,7 @@
           <w:color w:val="666666"/>
           <w:sz w:val="17"/>
         </w:rPr>
-        <w:t xml:space="preserve"> [1039 z 1300 znaków]</w:t>
+        <w:t xml:space="preserve"> [1043 z 1300 znaków]</w:t>
       </w:r>
     </w:p>
     <w:p>
@@ -3581,7 +3581,7 @@
         <w:rPr>
           <w:b w:val="0"/>
         </w:rPr>
-        <w:t xml:space="preserve"> po dwóch iteracjach. Wtedy Rada Konsorcjum (§ 9 umowy konsorcjum) rekomenduje w M27 zmianę platformy lub zakresu funkcji offline albo przerwanie zadania, a decyzję podejmuje Kierownik Projektu.</w:t>
+        <w:t xml:space="preserve"> po dwóch iteracjach. Wtedy Rada Konsorcjum (§ 9 umowy konsorcjum) rekomenduje w M27 zmianę platformy lub zakresu funkcji offline albo przerwanie zadania, a decyzję podejmuje kierownik zarządzający.</w:t>
       </w:r>
     </w:p>
     <w:p>
@@ -3956,7 +3956,7 @@
           <w:color w:val="666666"/>
           <w:sz w:val="17"/>
         </w:rPr>
-        <w:t xml:space="preserve"> [835 z 1300 znaków]</w:t>
+        <w:t xml:space="preserve"> [839 z 1300 znaków]</w:t>
       </w:r>
     </w:p>
     <w:p>
@@ -3968,7 +3968,7 @@
         <w:rPr>
           <w:b w:val="0"/>
         </w:rPr>
-        <w:t>Odpowiada Politechnika Rzeszowska. Merytorycznej weryfikacji i odbioru dokonuje kierownik B+R Damian Kordos na podstawie protokołu testowego PRz. Niezależnie metryki przelicza AI Lead Everest11 Jakub Kosterna na zamrożonym zbiorze testowym. Weryfikacja: 1) mAP z raportu dla każdej klasy na zbiorze co najmniej 2000 obrazów; 2) F1 change detection z porównania z etykietami referencyjnymi z Z2 na co najmniej 50 cyklach, z precyzją i czułością; 3) kompletność z dokumentacji taksonomii 2.0 i macierzy pomyłek. Modele CV trafiają do Everest11 protokołem w wersji RC do M26 (wejście do Z6, Z7 i Z9). Moduł change detection, zależny od modelu 3D z Z5, jest przekazywany w M27-M29 do walidacji w Z9. Wyniki w M26 (wersja RC) i w M30 ocenia Rada Konsorcjum (§ 9 umowy konsorcjum), a decyzję o dalszym przebiegu podejmuje Kierownik Projektu.</w:t>
+        <w:t>Odpowiada Politechnika Rzeszowska. Merytorycznej weryfikacji i odbioru dokonuje kierownik B+R Damian Kordos na podstawie protokołu testowego PRz. Niezależnie metryki przelicza AI Lead Everest11 Jakub Kosterna na zamrożonym zbiorze testowym. Weryfikacja: 1) mAP z raportu dla każdej klasy na zbiorze co najmniej 2000 obrazów; 2) F1 change detection z porównania z etykietami referencyjnymi z Z2 na co najmniej 50 cyklach, z precyzją i czułością; 3) kompletność z dokumentacji taksonomii 2.0 i macierzy pomyłek. Modele CV trafiają do Everest11 protokołem w wersji RC do M26 (wejście do Z6, Z7 i Z9). Moduł change detection, zależny od modelu 3D z Z5, jest przekazywany w M27-M29 do walidacji w Z9. Wyniki w M26 (wersja RC) i w M30 ocenia Rada Konsorcjum (§ 9 umowy konsorcjum), a decyzję o dalszym przebiegu podejmuje kierownik zarządzający.</w:t>
       </w:r>
     </w:p>
     <w:p>
@@ -3988,7 +3988,7 @@
           <w:color w:val="666666"/>
           <w:sz w:val="17"/>
         </w:rPr>
-        <w:t xml:space="preserve"> [952 z 1300 znaków]</w:t>
+        <w:t xml:space="preserve"> [956 z 1300 znaków]</w:t>
       </w:r>
     </w:p>
     <w:p>
@@ -4026,7 +4026,7 @@
         <w:rPr>
           <w:b w:val="0"/>
         </w:rPr>
-        <w:t xml:space="preserve"> po iteracjach. Wtedy Rada Konsorcjum (§ 9 umowy konsorcjum) rekomenduje ograniczenie zakresu funkcji CV albo wydzielenie ich do prac po projekcie, a decyzję podejmuje Kierownik Projektu.</w:t>
+        <w:t xml:space="preserve"> po iteracjach. Wtedy Rada Konsorcjum (§ 9 umowy konsorcjum) rekomenduje ograniczenie zakresu funkcji CV albo wydzielenie ich do prac po projekcie, a decyzję podejmuje kierownik zarządzający.</w:t>
       </w:r>
     </w:p>
     <w:p>
@@ -4564,7 +4564,7 @@
           <w:color w:val="666666"/>
           <w:sz w:val="17"/>
         </w:rPr>
-        <w:t xml:space="preserve"> [904 z 1300 znaków]</w:t>
+        <w:t xml:space="preserve"> [908 z 1300 znaków]</w:t>
       </w:r>
     </w:p>
     <w:p>
@@ -4576,7 +4576,7 @@
         <w:rPr>
           <w:b w:val="0"/>
         </w:rPr>
-        <w:t>Odpowiada Everest11. Odbioru dokonuje kierownik B+R Damian Kordos wspólnie z kierownikiem zarządzającym Maciejem Chrzanowskim. Protokołu nie podpisuje pracownik odbiorcy wdrożenia. Weryfikacja: a) AUC-ROC skryptem ewaluacyjnym zamrożonym protokołem z sumą kontrolną, uruchamianym przez osobę niezależną od Natanek Logistics i od modelowania, na danych z logu niemodyfikowalnego (append-only, podpis kryptograficzny); inspekcje ground truth są ślepe względem predykcji, ze zdjęciami ze znacznikiem czasu, a co najmniej 10% sprawdza ponownie druga osoba Everest11; b) mAP na obrazach terenowych z anotacją; c) do g) z logów systemowych i pomiarów fotogrametrycznych; h) z macierzy alertów w ujęciu kursu. PRz weryfikuje metodykę w Z8, bez prac i kosztów w Z9. Zakończenie, modyfikację albo przerwanie zadania w M30 rekomenduje Rada Konsorcjum (§ 9 umowy konsorcjum), a decyzję podejmuje Kierownik Projektu.</w:t>
+        <w:t>Odpowiada Everest11. Odbioru dokonuje kierownik B+R Damian Kordos wspólnie z kierownikiem zarządzającym Maciejem Chrzanowskim. Protokołu nie podpisuje pracownik odbiorcy wdrożenia. Weryfikacja: a) AUC-ROC skryptem ewaluacyjnym zamrożonym protokołem z sumą kontrolną, uruchamianym przez osobę niezależną od Natanek Logistics i od modelowania, na danych z logu niemodyfikowalnego (append-only, podpis kryptograficzny); inspekcje ground truth są ślepe względem predykcji, ze zdjęciami ze znacznikiem czasu, a co najmniej 10% sprawdza ponownie druga osoba Everest11; b) mAP na obrazach terenowych z anotacją; c) do g) z logów systemowych i pomiarów fotogrametrycznych; h) z macierzy alertów w ujęciu kursu. PRz weryfikuje metodykę w Z8, bez prac i kosztów w Z9. Zakończenie, modyfikację albo przerwanie zadania w M30 rekomenduje Rada Konsorcjum (§ 9 umowy konsorcjum), a decyzję podejmuje kierownik zarządzający.</w:t>
       </w:r>
     </w:p>
     <w:p>
@@ -4784,7 +4784,7 @@
           <w:color w:val="666666"/>
           <w:sz w:val="17"/>
         </w:rPr>
-        <w:t xml:space="preserve"> [1452 z 2000 znaków]</w:t>
+        <w:t xml:space="preserve"> [1456 z 2000 znaków]</w:t>
       </w:r>
     </w:p>
     <w:p>
@@ -4859,7 +4859,7 @@
         <w:rPr>
           <w:b w:val="0"/>
         </w:rPr>
-        <w:t>. W M9 (zadanie Z1) lub w M27 (zadanie Z5) Rada Konsorcjum (§ 9 umowy konsorcjum) ocenia wyniki i rekomenduje zmianę architektury sensorycznej, na przykład na kamery EO ze światłem strukturalnym, albo przerwanie zadania. Decyzję podejmuje Kierownik Projektu, a zmiany w harmonogramie zgłasza do instytucji.</w:t>
+        <w:t>. W M9 (zadanie Z1) lub w M27 (zadanie Z5) Rada Konsorcjum (§ 9 umowy konsorcjum) ocenia wyniki i rekomenduje zmianę architektury sensorycznej, na przykład na kamery EO ze światłem strukturalnym, albo przerwanie zadania. Decyzję podejmuje kierownik zarządzający, a zmiany w harmonogramie zgłasza do instytucji.</w:t>
       </w:r>
     </w:p>
     <w:p>
@@ -4998,7 +4998,7 @@
           <w:color w:val="666666"/>
           <w:sz w:val="17"/>
         </w:rPr>
-        <w:t xml:space="preserve"> [1807 z 2000 znaków]</w:t>
+        <w:t xml:space="preserve"> [1811 z 2000 znaków]</w:t>
       </w:r>
     </w:p>
     <w:p>
@@ -5073,7 +5073,7 @@
         <w:rPr>
           <w:b w:val="0"/>
         </w:rPr>
-        <w:t xml:space="preserve"> ZR łącznie w co najmniej 3 klasach. W M18 (zadanie Z2) lub w M27 (zadanie Z4) Rada Konsorcjum (§ 9 umowy konsorcjum) ocenia wyniki i rekomenduje ograniczenie zakresu funkcji albo przerwanie zadania modelowego. Decyzję podejmuje Kierownik Projektu, a zmiany w harmonogramie zgłasza do instytucji.</w:t>
+        <w:t xml:space="preserve"> ZR łącznie w co najmniej 3 klasach. W M18 (zadanie Z2) lub w M27 (zadanie Z4) Rada Konsorcjum (§ 9 umowy konsorcjum) ocenia wyniki i rekomenduje ograniczenie zakresu funkcji albo przerwanie zadania modelowego. Decyzję podejmuje kierownik zarządzający, a zmiany w harmonogramie zgłasza do instytucji.</w:t>
       </w:r>
     </w:p>
     <w:p>
@@ -5173,7 +5173,7 @@
           <w:color w:val="666666"/>
           <w:sz w:val="17"/>
         </w:rPr>
-        <w:t xml:space="preserve"> [1460 z 2000 znaków]</w:t>
+        <w:t xml:space="preserve"> [1464 z 2000 znaków]</w:t>
       </w:r>
     </w:p>
     <w:p>
@@ -5235,7 +5235,7 @@
         <w:rPr>
           <w:b w:val="0"/>
         </w:rPr>
-        <w:t xml:space="preserve"> po iteracjach. W M26 (wersja RC) i w M30 (wersja końcowa) Rada Konsorcjum (§ 9 umowy konsorcjum) ocenia wyniki i rekomenduje ograniczenie zakresu funkcji CV albo wydzielenie ich do prac po projekcie. Decyzję podejmuje Kierownik Projektu, a zmiany w harmonogramie zgłasza do instytucji.</w:t>
+        <w:t xml:space="preserve"> po iteracjach. W M26 (wersja RC) i w M30 (wersja końcowa) Rada Konsorcjum (§ 9 umowy konsorcjum) ocenia wyniki i rekomenduje ograniczenie zakresu funkcji CV albo wydzielenie ich do prac po projekcie. Decyzję podejmuje kierownik zarządzający, a zmiany w harmonogramie zgłasza do instytucji.</w:t>
       </w:r>
     </w:p>
     <w:p>
@@ -5335,7 +5335,7 @@
           <w:color w:val="666666"/>
           <w:sz w:val="17"/>
         </w:rPr>
-        <w:t xml:space="preserve"> [1543 z 2000 znaków]</w:t>
+        <w:t xml:space="preserve"> [1547 z 2000 znaków]</w:t>
       </w:r>
     </w:p>
     <w:p>
@@ -5410,7 +5410,7 @@
         <w:rPr>
           <w:b w:val="0"/>
         </w:rPr>
-        <w:t>. W M27 Rada Konsorcjum (§ 9 umowy konsorcjum) ocenia wyniki i rekomenduje zmianę platformy sprzętowej lub zakresu funkcji offline albo przerwanie zadania. Decyzję podejmuje Kierownik Projektu, a zmiany w harmonogramie zgłasza do instytucji. Parametry sprzętowe można potwierdzić stanowiskowo, ale AUC-ROC i mAP na zdarzeniach naturalnych są niezbędne dla TRL 8.</w:t>
+        <w:t>. W M27 Rada Konsorcjum (§ 9 umowy konsorcjum) ocenia wyniki i rekomenduje zmianę platformy sprzętowej lub zakresu funkcji offline albo przerwanie zadania. Decyzję podejmuje kierownik zarządzający, a zmiany w harmonogramie zgłasza do instytucji. Parametry sprzętowe można potwierdzić stanowiskowo, ale AUC-ROC i mAP na zdarzeniach naturalnych są niezbędne dla TRL 8.</w:t>
       </w:r>
     </w:p>
     <w:p>
@@ -5698,7 +5698,7 @@
           <w:color w:val="666666"/>
           <w:sz w:val="17"/>
         </w:rPr>
-        <w:t xml:space="preserve"> [1396 z 2000 znaków]</w:t>
+        <w:t xml:space="preserve"> [1400 z 2000 znaków]</w:t>
       </w:r>
     </w:p>
     <w:p>
@@ -5734,7 +5734,7 @@
         <w:rPr>
           <w:b w:val="0"/>
         </w:rPr>
-        <w:t>Warunek no-go: model poniżej wartości minimalnych w M27. Wtedy Rada Konsorcjum (§ 9 umowy konsorcjum) rekomenduje ograniczenie zakresu funkcji uruchamianych na platformie embedded albo przerwanie zadania Z7, a decyzję podejmuje Kierownik Projektu.</w:t>
+        <w:t>Warunek no-go: model poniżej wartości minimalnych w M27. Wtedy Rada Konsorcjum (§ 9 umowy konsorcjum) rekomenduje ograniczenie zakresu funkcji uruchamianych na platformie embedded albo przerwanie zadania Z7, a decyzję podejmuje kierownik zarządzający.</w:t>
       </w:r>
     </w:p>
     <w:p>
@@ -17648,7 +17648,7 @@
         <w:t xml:space="preserve">2. </w:t>
       </w:r>
       <w:r>
-        <w:t>Rada Konsorcjum (§ 9 umowy konsorcjum): opisy kamieni i ryzyk odwołują się do Rady jako organu doradczego (po jednym przedstawicielu każdego członka, przewodniczy Kierownik Projektu). Rada ocenia wyniki i rekomenduje, decyzje o zmianie zakresu podejmuje Kierownik Projektu, a zmiany w harmonogramie zgłasza do instytucji. Do potwierdzenia: czy Kierownik Projektu to ten sam człowiek co kierownik zarządzający, oraz skład Rady (kto reprezentuje Everest11 i PRz).</w:t>
+        <w:t>Rada Konsorcjum (§ 9 umowy konsorcjum): opisy kamieni i ryzyk odwołują się do Rady jako organu doradczego (po jednym przedstawicielu każdego członka, przewodniczy Kierownik Projektu, czyli kierownik zarządzający Maciej Chrzanowski). Rada ocenia wyniki i rekomenduje, decyzje o zmianie zakresu podejmuje kierownik zarządzający, a zmiany w harmonogramie zgłasza do instytucji. Do potwierdzenia: kto reprezentuje Everest11 i PRz w Radzie. Stanowiska Backend/Full-Stack i Anotatorzy obsadzamy rekrutacją po dofinansowaniu (potwierdzone).</w:t>
       </w:r>
     </w:p>
     <w:p>
@@ -21645,7 +21645,7 @@
                 <w:b w:val="0"/>
                 <w:sz w:val="17"/>
               </w:rPr>
-              <w:t>817/1300</w:t>
+              <w:t>821/1300</w:t>
             </w:r>
           </w:p>
         </w:tc>
@@ -21663,7 +21663,7 @@
                 <w:b w:val="0"/>
                 <w:sz w:val="17"/>
               </w:rPr>
-              <w:t>926/1300</w:t>
+              <w:t>930/1300</w:t>
             </w:r>
           </w:p>
         </w:tc>
@@ -21791,7 +21791,7 @@
                 <w:b w:val="0"/>
                 <w:sz w:val="17"/>
               </w:rPr>
-              <w:t>858/1300</w:t>
+              <w:t>862/1300</w:t>
             </w:r>
           </w:p>
         </w:tc>
@@ -21809,7 +21809,7 @@
                 <w:b w:val="0"/>
                 <w:sz w:val="17"/>
               </w:rPr>
-              <w:t>781/1300</w:t>
+              <w:t>785/1300</w:t>
             </w:r>
           </w:p>
         </w:tc>
@@ -21937,7 +21937,7 @@
                 <w:b w:val="0"/>
                 <w:sz w:val="17"/>
               </w:rPr>
-              <w:t>893/1300</w:t>
+              <w:t>897/1300</w:t>
             </w:r>
           </w:p>
         </w:tc>
@@ -21955,7 +21955,7 @@
                 <w:b w:val="0"/>
                 <w:sz w:val="17"/>
               </w:rPr>
-              <w:t>824/1300</w:t>
+              <w:t>828/1300</w:t>
             </w:r>
           </w:p>
         </w:tc>
@@ -22083,7 +22083,7 @@
                 <w:b w:val="0"/>
                 <w:sz w:val="17"/>
               </w:rPr>
-              <w:t>845/1300</w:t>
+              <w:t>849/1300</w:t>
             </w:r>
           </w:p>
         </w:tc>
@@ -22101,7 +22101,7 @@
                 <w:b w:val="0"/>
                 <w:sz w:val="17"/>
               </w:rPr>
-              <w:t>947/1300</w:t>
+              <w:t>951/1300</w:t>
             </w:r>
           </w:p>
         </w:tc>
@@ -22229,7 +22229,7 @@
                 <w:b w:val="0"/>
                 <w:sz w:val="17"/>
               </w:rPr>
-              <w:t>861/1300</w:t>
+              <w:t>865/1300</w:t>
             </w:r>
           </w:p>
         </w:tc>
@@ -22247,7 +22247,7 @@
                 <w:b w:val="0"/>
                 <w:sz w:val="17"/>
               </w:rPr>
-              <w:t>859/1300</w:t>
+              <w:t>863/1300</w:t>
             </w:r>
           </w:p>
         </w:tc>
@@ -22375,7 +22375,7 @@
                 <w:b w:val="0"/>
                 <w:sz w:val="17"/>
               </w:rPr>
-              <w:t>748/1300</w:t>
+              <w:t>752/1300</w:t>
             </w:r>
           </w:p>
         </w:tc>
@@ -22393,7 +22393,7 @@
                 <w:b w:val="0"/>
                 <w:sz w:val="17"/>
               </w:rPr>
-              <w:t>922/1300</w:t>
+              <w:t>926/1300</w:t>
             </w:r>
           </w:p>
         </w:tc>
@@ -22521,7 +22521,7 @@
                 <w:b w:val="0"/>
                 <w:sz w:val="17"/>
               </w:rPr>
-              <w:t>795/1300</w:t>
+              <w:t>799/1300</w:t>
             </w:r>
           </w:p>
         </w:tc>
@@ -22539,7 +22539,7 @@
                 <w:b w:val="0"/>
                 <w:sz w:val="17"/>
               </w:rPr>
-              <w:t>1039/1300</w:t>
+              <w:t>1043/1300</w:t>
             </w:r>
           </w:p>
         </w:tc>
@@ -22667,7 +22667,7 @@
                 <w:b w:val="0"/>
                 <w:sz w:val="17"/>
               </w:rPr>
-              <w:t>835/1300</w:t>
+              <w:t>839/1300</w:t>
             </w:r>
           </w:p>
         </w:tc>
@@ -22685,7 +22685,7 @@
                 <w:b w:val="0"/>
                 <w:sz w:val="17"/>
               </w:rPr>
-              <w:t>952/1300</w:t>
+              <w:t>956/1300</w:t>
             </w:r>
           </w:p>
         </w:tc>
@@ -22813,7 +22813,7 @@
                 <w:b w:val="0"/>
                 <w:sz w:val="17"/>
               </w:rPr>
-              <w:t>904/1300</w:t>
+              <w:t>908/1300</w:t>
             </w:r>
           </w:p>
         </w:tc>
@@ -23047,7 +23047,7 @@
                 <w:b w:val="0"/>
                 <w:sz w:val="17"/>
               </w:rPr>
-              <w:t>1452/2000</w:t>
+              <w:t>1456/2000</w:t>
             </w:r>
           </w:p>
         </w:tc>
@@ -23139,7 +23139,7 @@
                 <w:b w:val="0"/>
                 <w:sz w:val="17"/>
               </w:rPr>
-              <w:t>1807/2000</w:t>
+              <w:t>1811/2000</w:t>
             </w:r>
           </w:p>
         </w:tc>
@@ -23231,7 +23231,7 @@
                 <w:b w:val="0"/>
                 <w:sz w:val="17"/>
               </w:rPr>
-              <w:t>1460/2000</w:t>
+              <w:t>1464/2000</w:t>
             </w:r>
           </w:p>
         </w:tc>
@@ -23323,7 +23323,7 @@
                 <w:b w:val="0"/>
                 <w:sz w:val="17"/>
               </w:rPr>
-              <w:t>1543/2000</w:t>
+              <w:t>1547/2000</w:t>
             </w:r>
           </w:p>
         </w:tc>
@@ -23507,7 +23507,7 @@
                 <w:b w:val="0"/>
                 <w:sz w:val="17"/>
               </w:rPr>
-              <w:t>1396/2000</w:t>
+              <w:t>1400/2000</w:t>
             </w:r>
           </w:p>
         </w:tc>

</xml_diff>

<commit_message>
Nomenklatura: wyłącznie kierownik zarządzający; skład Rady poza wnioskiem
Co-Authored-By: Claude Sonnet 5.5 <noreply@anthropic.com>
Claude-Session: https://claude.ai/code/session_01672WnJhixnEcarbb7uiwfx
</commit_message>
<xml_diff>
--- a/Opisy_zadan_z_kamieniami_milowymi.docx
+++ b/Opisy_zadan_z_kamieniami_milowymi.docx
@@ -17648,7 +17648,7 @@
         <w:t xml:space="preserve">2. </w:t>
       </w:r>
       <w:r>
-        <w:t>Rada Konsorcjum (§ 9 umowy konsorcjum): opisy kamieni i ryzyk odwołują się do Rady jako organu doradczego (po jednym przedstawicielu każdego członka, przewodniczy Kierownik Projektu, czyli kierownik zarządzający Maciej Chrzanowski). Rada ocenia wyniki i rekomenduje, decyzje o zmianie zakresu podejmuje kierownik zarządzający, a zmiany w harmonogramie zgłasza do instytucji. Do potwierdzenia: kto reprezentuje Everest11 i PRz w Radzie. Stanowiska Backend/Full-Stack i Anotatorzy obsadzamy rekrutacją po dofinansowaniu (potwierdzone).</w:t>
+        <w:t>Rada Konsorcjum (§ 9 umowy konsorcjum): opisy kamieni i ryzyk odwołują się do Rady jako organu doradczego (po jednym przedstawicielu każdego członka, przewodniczy kierownik zarządzający Maciej Chrzanowski). We wniosku używamy wyłącznie nazwy „kierownik zarządzający”, zgodnie z wymaganiami konkursu. Rada ocenia wyniki i rekomenduje, decyzje o zmianie zakresu podejmuje kierownik zarządzający, a zmiany w harmonogramie zgłasza do instytucji. Skład osobowy Rady zostanie ustalony po otrzymaniu dofinansowania i nie jest wpisywany do wniosku. Stanowiska Backend/Full-Stack i Anotatorzy obsadzamy rekrutacją po dofinansowaniu (potwierdzone).</w:t>
       </w:r>
     </w:p>
     <w:p>
@@ -20328,7 +20328,7 @@
                 <w:b w:val="0"/>
                 <w:sz w:val="15"/>
               </w:rPr>
-              <w:t>Dopisać Radę Konsorcjum z § 9 umowy konsorcjum (po jednym przedstawicielu każdego członka, przewodniczy Kierownik Projektu, posiedzenia co najmniej raz na 6 miesięcy, protokoły, ocena merytoryczna i formalna realizacji zadań na wniosek Kierownika Projektu, rekomendacje zmian w harmonogramie; to organ doradczy, nie decyzyjny), osobę weryfikującą i odbierającą każdy KM oraz niezależne przeliczenie metryk przez AI Lead Everest11.</w:t>
+              <w:t>Dopisać Radę Konsorcjum z § 9 umowy konsorcjum (po jednym przedstawicielu każdego członka, przewodniczy kierownik zarządzający (we wniosku wyłącznie ta nazwa), posiedzenia co najmniej raz na 6 miesięcy, protokoły, ocena merytoryczna i formalna realizacji zadań na wniosek kierownika zarządzającego, rekomendacje zmian w harmonogramie; to organ doradczy, nie decyzyjny), osobę weryfikującą i odbierającą każdy KM oraz niezależne przeliczenie metryk przez AI Lead Everest11.</w:t>
             </w:r>
           </w:p>
         </w:tc>

</xml_diff>

<commit_message>
WP06: sekcja 6.1 zespol projektowy (K5-01..K5-11), rozdzial IT/Backend w tekstach Z2 i Z6, D37, N59-N61, T23-T24
Co-Authored-By: Claude Sonnet 5.5 <noreply@anthropic.com>
Claude-Session: https://claude.ai/code/session_01672WnJhixnEcarbb7uiwfx
</commit_message>
<xml_diff>
--- a/Opisy_zadan_z_kamieniami_milowymi.docx
+++ b/Opisy_zadan_z_kamieniami_milowymi.docx
@@ -6339,7 +6339,7 @@
           <w:color w:val="666666"/>
           <w:sz w:val="17"/>
         </w:rPr>
-        <w:t xml:space="preserve"> [613 z 1500 znaków]</w:t>
+        <w:t xml:space="preserve"> [658 z 1500 znaków]</w:t>
       </w:r>
     </w:p>
     <w:p>
@@ -6351,7 +6351,7 @@
         <w:rPr>
           <w:b w:val="0"/>
         </w:rPr>
-        <w:t>Backend/Full-Stack Developer, w wymiarze 1,0 etatu w M13-M18, zaimplementuje warstwę programową potoku akwizycji: moduły zbierania i porządkowania strumieni z różnych sensorów, zapis i przesył danych oraz strukturyzację zbioru przekazywanego do PRz. Zaangażowanie przypada na okres intensywnej akwizycji i porządkowania danych. Stanowisko jest niezbędne, aby utrzymać przepustowość i jakość potoku przy wielomiesięcznej kampanii na wielu pojazdach. Zakres stanowiska ma wyłącznie charakter badawczo-rozwojowy i nie obejmuje czynności zarządczych, kierowniczych, koordynacyjnych, administracyjnych ani nadzorczych.</w:t>
+        <w:t>Backend/Full-Stack Developer, w wymiarze 1,0 etatu w M13-M18, zaimplementuje warstwę programową potoku akwizycji: moduły zbierania i porządkowania strumieni z różnych sensorów, zapis i przesył danych według specyfikacji IT Specialist, który projektuje schemat metadanych i wersjonowanie zbioru. Zaangażowanie przypada na okres intensywnej akwizycji i porządkowania danych. Stanowisko jest niezbędne, aby utrzymać przepustowość i jakość potoku przy wielomiesięcznej kampanii na wielu pojazdach. Zakres stanowiska ma wyłącznie charakter badawczo-rozwojowy i nie obejmuje czynności zarządczych, kierowniczych, koordynacyjnych, administracyjnych ani nadzorczych.</w:t>
       </w:r>
     </w:p>
     <w:p>
@@ -6507,7 +6507,7 @@
           <w:color w:val="666666"/>
           <w:sz w:val="17"/>
         </w:rPr>
-        <w:t xml:space="preserve"> [844 z 1500 znaków]</w:t>
+        <w:t xml:space="preserve"> [907 z 1500 znaków]</w:t>
       </w:r>
     </w:p>
     <w:p>
@@ -6519,7 +6519,7 @@
         <w:rPr>
           <w:b w:val="0"/>
         </w:rPr>
-        <w:t>IT Specialist zaimplementuje pipeline PoL i PoC oraz generator dokumentów eFTI w formacie XML i JSON według reguł przekształcania zdarzeń z sensorów w pola eFTI. Wykona walidację schematem XSD oraz dwukierunkowe API z TMS i prototypowe integracje z Trans.eu, TimoCom i e-CMR w środowisku testowym, z wykorzystaniem istniejących interfejsów Everest11. Czynności integracyjne są techniczne i pomocnicze, wykonywane wyłącznie w zakresie niezbędnym do pomiaru czasu i opóźnień oraz do sprawdzenia przyjmowania dokumentów eFTI w testach na co najmniej 50 cyklach załadunek-rozładunek (cel: mediana do 30 s, opóźnienie do 2 s). Wdrożenie produkcyjne i utrzymanie nie są objęte kosztem. Zakres stanowiska ma wyłącznie charakter badawczo-rozwojowy i nie obejmuje czynności zarządczych, kierowniczych, koordynacyjnych, administracyjnych ani nadzorczych.</w:t>
+        <w:t>IT Specialist zaprojektuje kontrakty API dla Backend/Full-Stack Developera i zaimplementuje pipeline PoL i PoC oraz generator dokumentów eFTI w formacie XML i JSON według reguł przekształcania zdarzeń z sensorów w pola eFTI. Wykona walidację schematem XSD oraz dwukierunkowe API z TMS i prototypowe integracje z Trans.eu, TimoCom i e-CMR w środowisku testowym, z wykorzystaniem istniejących interfejsów Everest11. Czynności integracyjne są techniczne i pomocnicze, wykonywane wyłącznie w zakresie niezbędnym do pomiaru czasu i opóźnień oraz do sprawdzenia przyjmowania dokumentów eFTI w testach na co najmniej 50 cyklach załadunek-rozładunek (cel: mediana do 30 s, opóźnienie do 2 s). Wdrożenie produkcyjne i utrzymanie nie są objęte kosztem. Zakres stanowiska ma wyłącznie charakter badawczo-rozwojowy i nie obejmuje czynności zarządczych, kierowniczych, koordynacyjnych, administracyjnych ani nadzorczych.</w:t>
       </w:r>
     </w:p>
     <w:p>
@@ -6603,7 +6603,7 @@
           <w:color w:val="666666"/>
           <w:sz w:val="17"/>
         </w:rPr>
-        <w:t xml:space="preserve"> [802 z 1500 znaków]</w:t>
+        <w:t xml:space="preserve"> [862 z 1500 znaków]</w:t>
       </w:r>
     </w:p>
     <w:p>
@@ -6615,7 +6615,7 @@
         <w:rPr>
           <w:b w:val="0"/>
         </w:rPr>
-        <w:t>Backend/Full-Stack Developer, w wymiarze 1,0 etatu przez 9 miesięcy od M19 do M27, zbuduje strumieniowy potok danych z urządzenia embedded do pipeline'u PoL i PoC, kolejkowanie i mechanizmy zachowania spójności danych przy utracie łączności oraz przepływ danych z potoku akwizycji z zadania Z2. Wykona test zgodności wygenerowanych dokumentów eFTI z implementacją referencyjną Komisji Europejskiej i wesprze integracje testowe z TMS i platformami zewnętrznymi. Ciągłość kompetencji z zadania Z2 zapewnia spójność warstwy danych między akwizycją a generacją dokumentów. Utrzymanie integracji i wdrożenie produkcyjne nie są objęte kosztem. Zakres stanowiska ma wyłącznie charakter badawczo-rozwojowy i nie obejmuje czynności zarządczych, kierowniczych, koordynacyjnych, administracyjnych ani nadzorczych.</w:t>
+        <w:t>Backend/Full-Stack Developer, w wymiarze 1,0 etatu przez 9 miesięcy od M19 do M27, zbuduje strumieniowy potok danych z urządzenia embedded do pipeline'u PoL i PoC, kolejkowanie i mechanizmy zachowania spójności danych przy utracie łączności oraz przepływ danych z potoku akwizycji z zadania Z2, według kontraktów API zaprojektowanych przez IT Specialist. Wykona test zgodności wygenerowanych dokumentów eFTI z implementacją referencyjną Komisji Europejskiej i wesprze integracje testowe z TMS i platformami zewnętrznymi. Ciągłość kompetencji z zadania Z2 zapewnia spójność warstwy danych między akwizycją a generacją dokumentów. Utrzymanie integracji i wdrożenie produkcyjne nie są objęte kosztem. Zakres stanowiska ma wyłącznie charakter badawczo-rozwojowy i nie obejmuje czynności zarządczych, kierowniczych, koordynacyjnych, administracyjnych ani nadzorczych.</w:t>
       </w:r>
     </w:p>
     <w:p>

</xml_diff>

<commit_message>
PRz Z8: godziny 301/301/111/101/225/184/189/187 przy sumie bez zmian; Opisy zadan zaktualizowane; Z2 z demontazem; rozklad godzin i stawek podwykonawstwa Z2/Z9
Co-Authored-By: Claude Sonnet 5.5 <noreply@anthropic.com>
Claude-Session: https://claude.ai/code/session_01672WnJhixnEcarbb7uiwfx
</commit_message>
<xml_diff>
--- a/Opisy_zadan_z_kamieniami_milowymi.docx
+++ b/Opisy_zadan_z_kamieniami_milowymi.docx
@@ -3729,7 +3729,7 @@
         <w:rPr>
           <w:b w:val="0"/>
         </w:rPr>
-        <w:t>Zadanie będzie realizowane przez zespół PRz. Główny specjalista ds. computer vision, rekonstrukcji 3D, kalibracji i analizy sygnałów, w wymiarze 325 godzin, opracuje modele detekcji, segmentacji i klasyfikacji oraz change detection. Główny specjalista ds. systemów wizyjnych, percepcji 3D i integracji algorytmicznej, w wymiarze 325 godzin, zintegruje wyniki CV i change detection z modelem 3D. Specjalista ds. uczenia maszynowego, selekcji cech i predykcji ryzyka, w wymiarze 120 godzin, dobierze architektury i augmentację. Specjalista ds. modelowania matematycznego, statystyki i walidacji ilościowej, w wymiarze 110 godzin, wykona ocenę ilościową (precision, recall, F1, mAP). Młodszy specjalista ds. uczenia maszynowego, przygotowania danych eksperymentalnych i analizy wyników, w wymiarze 200 godzin, wesprze eksperymenty CV i zestawienia metryk. Specjalista ds. danych AI/CV, anotacji i analizy wyników modeli (242 godziny) opracuje zasady reanotacji i przeanalizuje klasy niejednoznaczne, specjalista ds. przetwarzania danych wielomodalnych i organizacji datasetu (200 godzin) przygotuje zbiory i dane do change detection, a specjalista ds. implementacji AI/CV, automatyzacji eksperymentów i edge AI (204 godziny) zaimplementuje eksperymenty i skrypty ewaluacyjne. Zakres prac jest wyłącznie badawczo-rozwojowy.</w:t>
+        <w:t>Zadanie będzie realizowane przez zespół PRz. Główny specjalista ds. computer vision, rekonstrukcji 3D, kalibracji i analizy sygnałów, w wymiarze 301 godzin, opracuje modele detekcji, segmentacji i klasyfikacji oraz change detection. Główny specjalista ds. systemów wizyjnych, percepcji 3D i integracji algorytmicznej, w wymiarze 301 godzin, zintegruje wyniki CV i change detection z modelem 3D. Specjalista ds. uczenia maszynowego, selekcji cech i predykcji ryzyka, w wymiarze 111 godzin, dobierze architektury i augmentację. Specjalista ds. modelowania matematycznego, statystyki i walidacji ilościowej, w wymiarze 101 godzin, wykona ocenę ilościową (precision, recall, F1, mAP). Młodszy specjalista ds. uczenia maszynowego, przygotowania danych eksperymentalnych i analizy wyników, w wymiarze 187 godzin, wesprze eksperymenty CV i zestawienia metryk. Specjalista ds. danych AI/CV, anotacji i analizy wyników modeli (225 godzin) opracuje zasady reanotacji i przeanalizuje klasy niejednoznaczne, specjalista ds. przetwarzania danych wielomodalnych i organizacji datasetu (184 godziny) przygotuje zbiory i dane do change detection, a specjalista ds. implementacji AI/CV, automatyzacji eksperymentów i edge AI (189 godzin) zaimplementuje eksperymenty i skrypty ewaluacyjne. Zakres prac jest wyłącznie badawczo-rozwojowy.</w:t>
       </w:r>
     </w:p>
     <w:p>
@@ -10392,13 +10392,14 @@
             <w:pPr>
               <w:spacing w:after="20"/>
             </w:pPr>
-            <w:r/>
+            <w:r>
+              <w:t>301</w:t>
+            </w:r>
             <w:r>
               <w:rPr>
                 <w:b w:val="0"/>
                 <w:sz w:val="16"/>
               </w:rPr>
-              <w:t>325</w:t>
             </w:r>
           </w:p>
         </w:tc>
@@ -10421,13 +10422,14 @@
             <w:pPr>
               <w:spacing w:after="20"/>
             </w:pPr>
-            <w:r/>
+            <w:r>
+              <w:t>1925 godz.</w:t>
+            </w:r>
             <w:r>
               <w:rPr>
                 <w:b w:val="0"/>
                 <w:sz w:val="16"/>
               </w:rPr>
-              <w:t>1949 godz.</w:t>
             </w:r>
           </w:p>
         </w:tc>
@@ -10564,13 +10566,14 @@
             <w:pPr>
               <w:spacing w:after="20"/>
             </w:pPr>
-            <w:r/>
+            <w:r>
+              <w:t>301</w:t>
+            </w:r>
             <w:r>
               <w:rPr>
                 <w:b w:val="0"/>
                 <w:sz w:val="16"/>
               </w:rPr>
-              <w:t>325</w:t>
             </w:r>
           </w:p>
         </w:tc>
@@ -10593,13 +10596,14 @@
             <w:pPr>
               <w:spacing w:after="20"/>
             </w:pPr>
-            <w:r/>
+            <w:r>
+              <w:t>1925 godz.</w:t>
+            </w:r>
             <w:r>
               <w:rPr>
                 <w:b w:val="0"/>
                 <w:sz w:val="16"/>
               </w:rPr>
-              <w:t>1949 godz.</w:t>
             </w:r>
           </w:p>
         </w:tc>
@@ -10736,13 +10740,14 @@
             <w:pPr>
               <w:spacing w:after="20"/>
             </w:pPr>
-            <w:r/>
+            <w:r>
+              <w:t>111</w:t>
+            </w:r>
             <w:r>
               <w:rPr>
                 <w:b w:val="0"/>
                 <w:sz w:val="16"/>
               </w:rPr>
-              <w:t>120</w:t>
             </w:r>
           </w:p>
         </w:tc>
@@ -10765,13 +10770,14 @@
             <w:pPr>
               <w:spacing w:after="20"/>
             </w:pPr>
-            <w:r/>
+            <w:r>
+              <w:t>1035 godz.</w:t>
+            </w:r>
             <w:r>
               <w:rPr>
                 <w:b w:val="0"/>
                 <w:sz w:val="16"/>
               </w:rPr>
-              <w:t>1044 godz.</w:t>
             </w:r>
           </w:p>
         </w:tc>
@@ -10908,13 +10914,14 @@
             <w:pPr>
               <w:spacing w:after="20"/>
             </w:pPr>
-            <w:r/>
+            <w:r>
+              <w:t>101</w:t>
+            </w:r>
             <w:r>
               <w:rPr>
                 <w:b w:val="0"/>
                 <w:sz w:val="16"/>
               </w:rPr>
-              <w:t>110</w:t>
             </w:r>
           </w:p>
         </w:tc>
@@ -10937,13 +10944,14 @@
             <w:pPr>
               <w:spacing w:after="20"/>
             </w:pPr>
-            <w:r/>
+            <w:r>
+              <w:t>891 godz.</w:t>
+            </w:r>
             <w:r>
               <w:rPr>
                 <w:b w:val="0"/>
                 <w:sz w:val="16"/>
               </w:rPr>
-              <w:t>900 godz.</w:t>
             </w:r>
           </w:p>
         </w:tc>
@@ -11080,13 +11088,14 @@
             <w:pPr>
               <w:spacing w:after="20"/>
             </w:pPr>
-            <w:r/>
+            <w:r>
+              <w:t>187</w:t>
+            </w:r>
             <w:r>
               <w:rPr>
                 <w:b w:val="0"/>
                 <w:sz w:val="16"/>
               </w:rPr>
-              <w:t>200</w:t>
             </w:r>
           </w:p>
         </w:tc>
@@ -11109,13 +11118,14 @@
             <w:pPr>
               <w:spacing w:after="20"/>
             </w:pPr>
-            <w:r/>
+            <w:r>
+              <w:t>827 godz.</w:t>
+            </w:r>
             <w:r>
               <w:rPr>
                 <w:b w:val="0"/>
                 <w:sz w:val="16"/>
               </w:rPr>
-              <w:t>840 godz.</w:t>
             </w:r>
           </w:p>
         </w:tc>
@@ -11252,13 +11262,14 @@
             <w:pPr>
               <w:spacing w:after="20"/>
             </w:pPr>
-            <w:r/>
+            <w:r>
+              <w:t>225</w:t>
+            </w:r>
             <w:r>
               <w:rPr>
                 <w:b w:val="0"/>
                 <w:sz w:val="16"/>
               </w:rPr>
-              <w:t>242</w:t>
             </w:r>
           </w:p>
         </w:tc>
@@ -11281,13 +11292,14 @@
             <w:pPr>
               <w:spacing w:after="20"/>
             </w:pPr>
-            <w:r/>
+            <w:r>
+              <w:t>923 godz.</w:t>
+            </w:r>
             <w:r>
               <w:rPr>
                 <w:b w:val="0"/>
                 <w:sz w:val="16"/>
               </w:rPr>
-              <w:t>940 godz.</w:t>
             </w:r>
           </w:p>
         </w:tc>
@@ -11424,13 +11436,14 @@
             <w:pPr>
               <w:spacing w:after="20"/>
             </w:pPr>
-            <w:r/>
+            <w:r>
+              <w:t>184</w:t>
+            </w:r>
             <w:r>
               <w:rPr>
                 <w:b w:val="0"/>
                 <w:sz w:val="16"/>
               </w:rPr>
-              <w:t>200</w:t>
             </w:r>
           </w:p>
         </w:tc>
@@ -11453,13 +11466,14 @@
             <w:pPr>
               <w:spacing w:after="20"/>
             </w:pPr>
-            <w:r/>
+            <w:r>
+              <w:t>852 godz.</w:t>
+            </w:r>
             <w:r>
               <w:rPr>
                 <w:b w:val="0"/>
                 <w:sz w:val="16"/>
               </w:rPr>
-              <w:t>868 godz.</w:t>
             </w:r>
           </w:p>
         </w:tc>
@@ -11596,13 +11610,14 @@
             <w:pPr>
               <w:spacing w:after="20"/>
             </w:pPr>
-            <w:r/>
+            <w:r>
+              <w:t>189</w:t>
+            </w:r>
             <w:r>
               <w:rPr>
                 <w:b w:val="0"/>
                 <w:sz w:val="16"/>
               </w:rPr>
-              <w:t>204</w:t>
             </w:r>
           </w:p>
         </w:tc>
@@ -11625,13 +11640,14 @@
             <w:pPr>
               <w:spacing w:after="20"/>
             </w:pPr>
-            <w:r/>
+            <w:r>
+              <w:t>861 godz.</w:t>
+            </w:r>
             <w:r>
               <w:rPr>
                 <w:b w:val="0"/>
                 <w:sz w:val="16"/>
               </w:rPr>
-              <w:t>876 godz.</w:t>
             </w:r>
           </w:p>
         </w:tc>

</xml_diff>

<commit_message>
Po odpowiedziach wlascicielki i odpisie KRS: usuniete 'ponad 50 aktywnych kontrahentow', R12 i Z9 ze skala zaleznosci od Natanek Logistics, komentarze modelu (Finansowanie K6-12, Przychody, Koszty, Oplacalnosc, Kapital pracujacy), D47-D49, N83-N84
Co-Authored-By: Claude Sonnet 5.5 <noreply@anthropic.com>
Claude-Session: https://claude.ai/code/session_01672WnJhixnEcarbb7uiwfx
</commit_message>
<xml_diff>
--- a/Opisy_zadan_z_kamieniami_milowymi.docx
+++ b/Opisy_zadan_z_kamieniami_milowymi.docx
@@ -4303,7 +4303,7 @@
         <w:rPr>
           <w:b w:val="0"/>
         </w:rPr>
-        <w:t>Niezależność wyników zapewnia procedura, ponieważ zadanie ma jednego wykonawcę. Inspekcję ground truth poprowadzi specjalista TSL w trybie ślepym względem predykcji, według protokołu z zadania Z3, ze zdjęciami ze znacznikiem czasu; nie będzie on oceniał trafności alertów ani podpisywał odbioru. Alerty i predykcje będą zapisywane automatycznie w logu niemodyfikowalnym (append-only, podpis kryptograficzny), a przed Fazą B wersje modeli i skrypt ewaluacyjny zostaną zamrożone protokołem z sumą kontrolną. Ewaluację uruchomi osoba bez powiązań z Natanek Logistics i bez udziału w modelowaniu, czyli specjalista ds. cyberbezpieczeństwa, a wyniki powstaną automatycznie ze skryptu. Co najmniej 10% inspekcji zostanie powtórnie zweryfikowane na podstawie zdjęć przez drugą osobę Everest11. Protokół odbioru podpiszą kierownik B+R i kierownik zarządzający, a nie pracownik odbiorcy wdrożenia. PRz zweryfikuje metodykę walidacji i zamrożony skrypt w zadaniu Z8 (odbiór metodyczny) i nie ma w zadaniu Z9 ani prac, ani kosztów.</w:t>
+        <w:t>Niezależność wyników zapewnia procedura, ponieważ zadanie ma jednego wykonawcę. Inspekcję ground truth poprowadzi specjalista TSL w trybie ślepym względem predykcji, według protokołu z zadania Z3, ze zdjęciami ze znacznikiem czasu; nie będzie on oceniał trafności alertów ani podpisywał odbioru. Alerty i predykcje będą zapisywane automatycznie w logu niemodyfikowalnym (append-only, podpis kryptograficzny), a przed Fazą B wersje modeli i skrypt ewaluacyjny zostaną zamrożone protokołem z sumą kontrolną. Ewaluację uruchomi osoba bez powiązań z Natanek Logistics i bez udziału w modelowaniu, czyli specjalista ds. cyberbezpieczeństwa, a wyniki powstaną automatycznie ze skryptu. Co najmniej 10% inspekcji zostanie powtórnie zweryfikowane na podstawie zdjęć przez drugą osobę Everest11. Protokół odbioru podpiszą kierownik B+R i kierownik zarządzający, a nie pracownik odbiorcy wdrożenia. PRz zweryfikuje metodykę walidacji i zamrożony skrypt w zadaniu Z8 (odbiór metodyczny) i nie ma w zadaniu Z9 ani prac, ani kosztów. Natanek Logistics jest też głównym dostawcą usług transportowych Everest11 (ok. 95% zakupów usług), dlatego procedura nie opiera się na ocenie ani deklaracjach pracowników tego podmiotu.</w:t>
       </w:r>
     </w:p>
     <w:p>
@@ -6051,7 +6051,7 @@
           <w:color w:val="666666"/>
           <w:sz w:val="17"/>
         </w:rPr>
-        <w:t xml:space="preserve"> [739 z 2000 znaków]</w:t>
+        <w:t xml:space="preserve"> [1183 z 2000 znaków]</w:t>
       </w:r>
     </w:p>
     <w:p>
@@ -6063,7 +6063,7 @@
         <w:rPr>
           <w:b w:val="0"/>
         </w:rPr>
-        <w:t>Ryzyko dotyczy całego okresu realizacji i wdrożenia. Po wejściu Inwestora (Zbigniew Natanek, do 20% udziałów Everest11) transakcje Everest11 z podmiotami Inwestora, w szczególności z Natanek Logistics (udostępnienie floty testowej, kontrakty sprzedażowe CargoDT), mogą zostać zakwestionowane jako niezgodne z warunkami rynkowymi. Dotyczy to przepisów o podmiotach powiązanych (próg 25% udziałów), zasad pomocy publicznej i racjonalności wydatków. Natanek Logistics jest jednym z trzech niezależnych, potwierdzonych klientów (listy intencyjne), co ogranicza skalę zależności. Prawdopodobieństwo jest niskie. Skutkiem byłoby zakwestionowanie wydatków lub przychodów, opóźnienie rozliczeń i ryzyko reputacyjne. Ryzyko nie wpływa na prace B+R.</w:t>
+        <w:t>Ryzyko dotyczy całego okresu realizacji i wdrożenia. Natanek Logistics jest powiązany z przyszłym Inwestorem (Zbigniew Natanek obejmie do 20% udziałów Everest11) i jednocześnie jest głównym dostawcą usług Everest11: ok. 95% zakupów usług, czyli ok. 13,4 mln zł w 2025 r. i ok. 8,4 mln zł w pierwszym półroczu 2026 r., to usługi transportowe od tego podmiotu. Natanek Logistics udostępni też flotę testową w Z9 i jest jednym z trzech operatorów, którzy podpisali listy intencyjne na zakup CargoDT (20 z 50 naczep). Transakcje z tym podmiotem mogą zostać zakwestionowane jako niezgodne z warunkami rynkowymi (przepisy CIT o podmiotach powiązanych, próg 25% udziałów, zasady pomocy publicznej i racjonalność wydatków), a duża zależność od jednego dostawcy zwiększa skutki takiego zakwestionowania albo zakłócenia współpracy. Prawdopodobieństwo: niskie do średniego. Wpływ: kwestionowanie wydatków lub przychodów, opóźnienie rozliczeń, ryzyko reputacyjne i ryzyko ciągłości usług transportowych. Zakupy usług transportowych dotyczą zwykłej działalności przewozowej Everest11 i nie są kosztami kwalifikowalnymi projektu. Wpływ na prace B+R: ograniczony do dostępności floty testowej w Z9.</w:t>
       </w:r>
     </w:p>
     <w:p>
@@ -6083,7 +6083,7 @@
           <w:color w:val="666666"/>
           <w:sz w:val="17"/>
         </w:rPr>
-        <w:t xml:space="preserve"> [873 z 2000 znaków]</w:t>
+        <w:t xml:space="preserve"> [1332 z 2000 znaków]</w:t>
       </w:r>
     </w:p>
     <w:p>
@@ -6095,7 +6095,7 @@
         <w:rPr>
           <w:b w:val="0"/>
         </w:rPr>
-        <w:t>Ryzyko ograniczamy czterema działaniami. Wszystkie transakcje z podmiotami powiązanymi z Inwestorem zawieramy na warunkach rynkowych, weryfikowanych tą samą metodą, którą stosujemy do cen rynkowych praw majątkowych między konsorcjantami: rozeznaniem rynku, niezależną wyceną albo negocjacjami w warunkach pełnej konkurencji. Umowę partnerską dotyczącą floty testowej dokumentujemy odniesieniem do porównywalnych ofert rynkowych (koszty wynajmu floty u innych podmiotów) i wpisujemy do rejestru transakcji. Formalnie ustalamy, czy Everest11 i Natanek Logistics są powiązane w rozumieniu przepisów o podatku dochodowym (próg 25% udziałów, a Inwestor ma najwyżej 20%), a niezależnie od wyniku dokumentujemy warunki rynkowe transakcji. Niezależność walidacji zabezpiecza ścieżka audytu z zadania Z9 i dywersyfikacja floty (R11). Ocena transakcji jest prowadzona raz na kwartał.</w:t>
+        <w:t>Ryzyko ograniczamy pięcioma działaniami. Po pierwsze, skala zależności jest ujawniona i monitorowana: udział Natanek Logistics w zakupach usług Everest11 jest raportowany raz na kwartał w ocenie transakcji, a Everest11 utrzymuje alternatywnych dostawców usług transportowych spośród dotychczasowych dostawców spedycyjno-logistycznych i zwiększa ich udział, jeśli ceny Natanek Logistics odbiegają od rynkowych. Po drugie, wszystkie transakcje z podmiotami powiązanymi z Inwestorem zawieramy na warunkach rynkowych, weryfikowanych tą samą metodą, którą stosujemy do cen rynkowych praw majątkowych między konsorcjantami: rozeznaniem rynku (porównaniem ofert innych przewoźników), niezależną wyceną albo negocjacjami w warunkach pełnej konkurencji. Po trzecie, umowę partnerską dotyczącą floty testowej dokumentujemy odniesieniem do porównywalnych ofert rynkowych (koszty wynajmu floty u innych podmiotów) i wpisujemy do rejestru transakcji. Po czwarte, formalnie ustalamy, czy Everest11 i Natanek Logistics są powiązane w rozumieniu przepisów o podatku dochodowym (próg 25% udziałów, a Inwestor obejmie najwyżej 20%), a niezależnie od wyniku dokumentujemy warunki rynkowe transakcji. Po piąte, niezależność walidacji zabezpiecza ścieżka audytu z zadania Z9 i dywersyfikacja floty (R11). Ocena transakcji jest prowadzona raz na kwartał.</w:t>
       </w:r>
     </w:p>
     <w:p>

</xml_diff>

<commit_message>
Pliki zamkniete przywrocone, zestawienie zmian do LSI; model: harmonogram platnosci K6-14 skorygowany, tekst K6-12 bez 6,3 mln, dopisek Koszty (BOM i etaty), tajemnica umowy Amazon; dokument K6 cz. 2.5, 4.9, 5.3, 7, 8; D50-D53, T46-T48, N85
Co-Authored-By: Claude Sonnet 5.5 <noreply@anthropic.com>
Claude-Session: https://claude.ai/code/session_01672WnJhixnEcarbb7uiwfx
</commit_message>
<xml_diff>
--- a/Opisy_zadan_z_kamieniami_milowymi.docx
+++ b/Opisy_zadan_z_kamieniami_milowymi.docx
@@ -4303,7 +4303,7 @@
         <w:rPr>
           <w:b w:val="0"/>
         </w:rPr>
-        <w:t>Niezależność wyników zapewnia procedura, ponieważ zadanie ma jednego wykonawcę. Inspekcję ground truth poprowadzi specjalista TSL w trybie ślepym względem predykcji, według protokołu z zadania Z3, ze zdjęciami ze znacznikiem czasu; nie będzie on oceniał trafności alertów ani podpisywał odbioru. Alerty i predykcje będą zapisywane automatycznie w logu niemodyfikowalnym (append-only, podpis kryptograficzny), a przed Fazą B wersje modeli i skrypt ewaluacyjny zostaną zamrożone protokołem z sumą kontrolną. Ewaluację uruchomi osoba bez powiązań z Natanek Logistics i bez udziału w modelowaniu, czyli specjalista ds. cyberbezpieczeństwa, a wyniki powstaną automatycznie ze skryptu. Co najmniej 10% inspekcji zostanie powtórnie zweryfikowane na podstawie zdjęć przez drugą osobę Everest11. Protokół odbioru podpiszą kierownik B+R i kierownik zarządzający, a nie pracownik odbiorcy wdrożenia. PRz zweryfikuje metodykę walidacji i zamrożony skrypt w zadaniu Z8 (odbiór metodyczny) i nie ma w zadaniu Z9 ani prac, ani kosztów. Natanek Logistics jest też głównym dostawcą usług transportowych Everest11 (ok. 95% zakupów usług), dlatego procedura nie opiera się na ocenie ani deklaracjach pracowników tego podmiotu.</w:t>
+        <w:t>Niezależność wyników zapewnia procedura, ponieważ zadanie ma jednego wykonawcę. Inspekcję ground truth poprowadzi specjalista TSL w trybie ślepym względem predykcji, według protokołu z zadania Z3, ze zdjęciami ze znacznikiem czasu; nie będzie on oceniał trafności alertów ani podpisywał odbioru. Alerty i predykcje będą zapisywane automatycznie w logu niemodyfikowalnym (append-only, podpis kryptograficzny), a przed Fazą B wersje modeli i skrypt ewaluacyjny zostaną zamrożone protokołem z sumą kontrolną. Ewaluację uruchomi osoba bez powiązań z Natanek Logistics i bez udziału w modelowaniu, czyli specjalista ds. cyberbezpieczeństwa, a wyniki powstaną automatycznie ze skryptu. Co najmniej 10% inspekcji zostanie powtórnie zweryfikowane na podstawie zdjęć przez drugą osobę Everest11. Protokół odbioru podpiszą kierownik B+R i kierownik zarządzający, a nie pracownik odbiorcy wdrożenia. PRz zweryfikuje metodykę walidacji i zamrożony skrypt w zadaniu Z8 (odbiór metodyczny) i nie ma w zadaniu Z9 ani prac, ani kosztów.</w:t>
       </w:r>
     </w:p>
     <w:p>
@@ -6051,7 +6051,7 @@
           <w:color w:val="666666"/>
           <w:sz w:val="17"/>
         </w:rPr>
-        <w:t xml:space="preserve"> [1183 z 2000 znaków]</w:t>
+        <w:t xml:space="preserve"> [739 z 2000 znaków]</w:t>
       </w:r>
     </w:p>
     <w:p>
@@ -6063,7 +6063,7 @@
         <w:rPr>
           <w:b w:val="0"/>
         </w:rPr>
-        <w:t>Ryzyko dotyczy całego okresu realizacji i wdrożenia. Natanek Logistics jest powiązany z przyszłym Inwestorem (Zbigniew Natanek obejmie do 20% udziałów Everest11) i jednocześnie jest głównym dostawcą usług Everest11: ok. 95% zakupów usług, czyli ok. 13,4 mln zł w 2025 r. i ok. 8,4 mln zł w pierwszym półroczu 2026 r., to usługi transportowe od tego podmiotu. Natanek Logistics udostępni też flotę testową w Z9 i jest jednym z trzech operatorów, którzy podpisali listy intencyjne na zakup CargoDT (20 z 50 naczep). Transakcje z tym podmiotem mogą zostać zakwestionowane jako niezgodne z warunkami rynkowymi (przepisy CIT o podmiotach powiązanych, próg 25% udziałów, zasady pomocy publicznej i racjonalność wydatków), a duża zależność od jednego dostawcy zwiększa skutki takiego zakwestionowania albo zakłócenia współpracy. Prawdopodobieństwo: niskie do średniego. Wpływ: kwestionowanie wydatków lub przychodów, opóźnienie rozliczeń, ryzyko reputacyjne i ryzyko ciągłości usług transportowych. Zakupy usług transportowych dotyczą zwykłej działalności przewozowej Everest11 i nie są kosztami kwalifikowalnymi projektu. Wpływ na prace B+R: ograniczony do dostępności floty testowej w Z9.</w:t>
+        <w:t>Ryzyko dotyczy całego okresu realizacji i wdrożenia. Po wejściu Inwestora (Zbigniew Natanek, do 20% udziałów Everest11) transakcje Everest11 z podmiotami Inwestora, w szczególności z Natanek Logistics (udostępnienie floty testowej, kontrakty sprzedażowe CargoDT), mogą zostać zakwestionowane jako niezgodne z warunkami rynkowymi. Dotyczy to przepisów o podmiotach powiązanych (próg 25% udziałów), zasad pomocy publicznej i racjonalności wydatków. Natanek Logistics jest jednym z trzech niezależnych, potwierdzonych klientów (listy intencyjne), co ogranicza skalę zależności. Prawdopodobieństwo jest niskie. Skutkiem byłoby zakwestionowanie wydatków lub przychodów, opóźnienie rozliczeń i ryzyko reputacyjne. Ryzyko nie wpływa na prace B+R.</w:t>
       </w:r>
     </w:p>
     <w:p>
@@ -6083,7 +6083,7 @@
           <w:color w:val="666666"/>
           <w:sz w:val="17"/>
         </w:rPr>
-        <w:t xml:space="preserve"> [1332 z 2000 znaków]</w:t>
+        <w:t xml:space="preserve"> [873 z 2000 znaków]</w:t>
       </w:r>
     </w:p>
     <w:p>
@@ -6095,7 +6095,7 @@
         <w:rPr>
           <w:b w:val="0"/>
         </w:rPr>
-        <w:t>Ryzyko ograniczamy pięcioma działaniami. Po pierwsze, skala zależności jest ujawniona i monitorowana: udział Natanek Logistics w zakupach usług Everest11 jest raportowany raz na kwartał w ocenie transakcji, a Everest11 utrzymuje alternatywnych dostawców usług transportowych spośród dotychczasowych dostawców spedycyjno-logistycznych i zwiększa ich udział, jeśli ceny Natanek Logistics odbiegają od rynkowych. Po drugie, wszystkie transakcje z podmiotami powiązanymi z Inwestorem zawieramy na warunkach rynkowych, weryfikowanych tą samą metodą, którą stosujemy do cen rynkowych praw majątkowych między konsorcjantami: rozeznaniem rynku (porównaniem ofert innych przewoźników), niezależną wyceną albo negocjacjami w warunkach pełnej konkurencji. Po trzecie, umowę partnerską dotyczącą floty testowej dokumentujemy odniesieniem do porównywalnych ofert rynkowych (koszty wynajmu floty u innych podmiotów) i wpisujemy do rejestru transakcji. Po czwarte, formalnie ustalamy, czy Everest11 i Natanek Logistics są powiązane w rozumieniu przepisów o podatku dochodowym (próg 25% udziałów, a Inwestor obejmie najwyżej 20%), a niezależnie od wyniku dokumentujemy warunki rynkowe transakcji. Po piąte, niezależność walidacji zabezpiecza ścieżka audytu z zadania Z9 i dywersyfikacja floty (R11). Ocena transakcji jest prowadzona raz na kwartał.</w:t>
+        <w:t>Ryzyko ograniczamy czterema działaniami. Wszystkie transakcje z podmiotami powiązanymi z Inwestorem zawieramy na warunkach rynkowych, weryfikowanych tą samą metodą, którą stosujemy do cen rynkowych praw majątkowych między konsorcjantami: rozeznaniem rynku, niezależną wyceną albo negocjacjami w warunkach pełnej konkurencji. Umowę partnerską dotyczącą floty testowej dokumentujemy odniesieniem do porównywalnych ofert rynkowych (koszty wynajmu floty u innych podmiotów) i wpisujemy do rejestru transakcji. Formalnie ustalamy, czy Everest11 i Natanek Logistics są powiązane w rozumieniu przepisów o podatku dochodowym (próg 25% udziałów, a Inwestor ma najwyżej 20%), a niezależnie od wyniku dokumentujemy warunki rynkowe transakcji. Niezależność walidacji zabezpiecza ścieżka audytu z zadania Z9 i dywersyfikacja floty (R11). Ocena transakcji jest prowadzona raz na kwartał.</w:t>
       </w:r>
     </w:p>
     <w:p>

</xml_diff>